<commit_message>
feat(paper): build word artifact with korean front matter and citations
</commit_message>
<xml_diff>
--- a/paper/word/graduation-thesis.docx
+++ b/paper/word/graduation-thesis.docx
@@ -8,6 +8,30 @@
       </w:pPr>
       <w:r>
         <w:t xml:space="preserve">Design and Evaluation of an LLM Agent Harness for Long-Horizon Autonomous R&amp;D</w:t>
+      </w:r>
+    </w:p>
+    <w:p>
+      <w:pPr>
+        <w:pStyle w:val="Heading1"/>
+      </w:pPr>
+      <w:r>
+        <w:t xml:space="preserve">국문 요약</w:t>
+      </w:r>
+    </w:p>
+    <w:p>
+      <w:pPr>
+        <w:pStyle w:val="BodyText"/>
+      </w:pPr>
+      <w:r>
+        <w:t xml:space="preserve">본 연구는 인공지능 에이전트가 고수준 목표로부터 가설, 자원, 대조군, 지표, 반증 조건과 중단 규칙을 스스로 설계하고 결과에 따라 탐색 방향을 갱신하는 장기 자율 연구개발 하네스를 제안한다. 제안 방법은 문헌, 가설, 결정, 실험, 결과와 주장을 문맥 그래프로 연결한다. 선행 실험은 단순 검색이 설계 품질을 항상 높이지 않으며, 구조만 있고 결과에서 추출한 통찰이 전파되지 않아도 이득이 제한됨을 보고한다. 이에 첫 연구는 단계 분리형 연구 상태와 동적 검색을 교차한 2×2 조건으로 치명적 오류 없는 완전한 실험설계, 검색의 의사결정 기여, 오류와 비용을 비교한다. 현재 원고는 방법과 사전등록 파일럿을 제시하며 실험효과는 보고하지 않는다.</w:t>
+      </w:r>
+    </w:p>
+    <w:p>
+      <w:pPr>
+        <w:pStyle w:val="BodyText"/>
+      </w:pPr>
+      <w:r>
+        <w:t xml:space="preserve">키워드: 자율 연구개발, LLM 에이전트, 문맥 그래프, 실험설계, 동적 검색</w:t>
       </w:r>
     </w:p>
     <w:p>
@@ -213,13 +237,7 @@
         <w:t xml:space="preserve"> </w:t>
       </w:r>
       <w:r>
-        <w:t xml:space="preserve">AutoGen composes multiple agents, humans, and tools</w:t>
-      </w:r>
-      <w:r>
-        <w:t xml:space="preserve"> </w:t>
-      </w:r>
-      <w:r>
-        <w:t xml:space="preserve">. These mechanisms make long-running agents possible, but</w:t>
+        <w:t xml:space="preserve">AutoGen composes multiple agents, humans, and tools [1, 2, 3, 4]. These mechanisms make long-running agents possible, but</w:t>
       </w:r>
       <w:r>
         <w:t xml:space="preserve"> </w:t>
@@ -416,13 +434,7 @@
         <w:t xml:space="preserve"> </w:t>
       </w:r>
       <w:r>
-        <w:t xml:space="preserve">measurement problem in its own right</w:t>
-      </w:r>
-      <w:r>
-        <w:t xml:space="preserve"> </w:t>
-      </w:r>
-      <w:r>
-        <w:t xml:space="preserve">. The work</w:t>
+        <w:t xml:space="preserve">measurement problem in its own right [5]. The work</w:t>
       </w:r>
       <w:r>
         <w:t xml:space="preserve"> </w:t>
@@ -472,19 +484,13 @@
         <w:t xml:space="preserve"> </w:t>
       </w:r>
       <w:r>
-        <w:t xml:space="preserve">, and an agent that edits its own harness can manufacture</w:t>
-      </w:r>
-      <w:r>
-        <w:t xml:space="preserve"> </w:t>
-      </w:r>
-      <w:r>
-        <w:t xml:space="preserve">illusory gains unless the modification is audited</w:t>
-      </w:r>
-      <w:r>
-        <w:t xml:space="preserve"> </w:t>
-      </w:r>
-      <w:r>
-        <w:t xml:space="preserve">.</w:t>
+        <w:t xml:space="preserve">[6], and an agent that edits its own harness can manufacture</w:t>
+      </w:r>
+      <w:r>
+        <w:t xml:space="preserve"> </w:t>
+      </w:r>
+      <w:r>
+        <w:t xml:space="preserve">illusory gains unless the modification is audited [7].</w:t>
       </w:r>
       <w:r>
         <w:t xml:space="preserve"> </w:t>
@@ -496,13 +502,7 @@
         <w:t xml:space="preserve"> </w:t>
       </w:r>
       <w:r>
-        <w:t xml:space="preserve">exist yet</w:t>
-      </w:r>
-      <w:r>
-        <w:t xml:space="preserve"> </w:t>
-      </w:r>
-      <w:r>
-        <w:t xml:space="preserve">. The design therefore separates the generating</w:t>
+        <w:t xml:space="preserve">exist yet [8]. The design therefore separates the generating</w:t>
       </w:r>
       <w:r>
         <w:t xml:space="preserve"> </w:t>
@@ -526,13 +526,7 @@
         <w:t xml:space="preserve"> </w:t>
       </w:r>
       <w:r>
-        <w:t xml:space="preserve">system that produced it</w:t>
-      </w:r>
-      <w:r>
-        <w:t xml:space="preserve"> </w:t>
-      </w:r>
-      <w:r>
-        <w:t xml:space="preserve">.</w:t>
+        <w:t xml:space="preserve">system that produced it [9].</w:t>
       </w:r>
     </w:p>
     <w:p>
@@ -746,19 +740,13 @@
         <w:t xml:space="preserve"> </w:t>
       </w:r>
       <w:r>
-        <w:t xml:space="preserve">. Reflexion stores verbal feedback in episodic memory for</w:t>
-      </w:r>
-      <w:r>
-        <w:t xml:space="preserve"> </w:t>
-      </w:r>
-      <w:r>
-        <w:t xml:space="preserve">subsequent trials</w:t>
-      </w:r>
-      <w:r>
-        <w:t xml:space="preserve"> </w:t>
-      </w:r>
-      <w:r>
-        <w:t xml:space="preserve">, while MemGPT and Recursive Language</w:t>
+        <w:t xml:space="preserve">[1]. Reflexion stores verbal feedback in episodic memory for</w:t>
+      </w:r>
+      <w:r>
+        <w:t xml:space="preserve"> </w:t>
+      </w:r>
+      <w:r>
+        <w:t xml:space="preserve">subsequent trials [10], while MemGPT and Recursive Language</w:t>
       </w:r>
       <w:r>
         <w:t xml:space="preserve"> </w:t>
@@ -770,19 +758,13 @@
         <w:t xml:space="preserve"> </w:t>
       </w:r>
       <w:r>
-        <w:t xml:space="preserve">. Retrieval-Augmented Generation combines parametric</w:t>
-      </w:r>
-      <w:r>
-        <w:t xml:space="preserve"> </w:t>
-      </w:r>
-      <w:r>
-        <w:t xml:space="preserve">generation with dense non-parametric memory</w:t>
-      </w:r>
-      <w:r>
-        <w:t xml:space="preserve"> </w:t>
-      </w:r>
-      <w:r>
-        <w:t xml:space="preserve">. AutoGen shows how</w:t>
+        <w:t xml:space="preserve">[2, 3]. Retrieval-Augmented Generation combines parametric</w:t>
+      </w:r>
+      <w:r>
+        <w:t xml:space="preserve"> </w:t>
+      </w:r>
+      <w:r>
+        <w:t xml:space="preserve">generation with dense non-parametric memory [11]. AutoGen shows how</w:t>
       </w:r>
       <w:r>
         <w:t xml:space="preserve"> </w:t>
@@ -794,13 +776,7 @@
         <w:t xml:space="preserve"> </w:t>
       </w:r>
       <w:r>
-        <w:t xml:space="preserve">conversation patterns</w:t>
-      </w:r>
-      <w:r>
-        <w:t xml:space="preserve"> </w:t>
-      </w:r>
-      <w:r>
-        <w:t xml:space="preserve">. Together these works provide the</w:t>
+        <w:t xml:space="preserve">conversation patterns [4]. Together these works provide the</w:t>
       </w:r>
       <w:r>
         <w:t xml:space="preserve"> </w:t>
@@ -860,7 +836,7 @@
         <w:t xml:space="preserve"> </w:t>
       </w:r>
       <w:r>
-        <w:t xml:space="preserve">.</w:t>
+        <w:t xml:space="preserve">[12, 13, 14, 15, 16].</w:t>
       </w:r>
       <w:r>
         <w:t xml:space="preserve"> </w:t>
@@ -902,7 +878,7 @@
         <w:t xml:space="preserve"> </w:t>
       </w:r>
       <w:r>
-        <w:t xml:space="preserve">. CHAP adds a proposed grammar for typed human</w:t>
+        <w:t xml:space="preserve">[17]. CHAP adds a proposed grammar for typed human</w:t>
       </w:r>
       <w:r>
         <w:t xml:space="preserve"> </w:t>
@@ -920,7 +896,7 @@
         <w:t xml:space="preserve"> </w:t>
       </w:r>
       <w:r>
-        <w:t xml:space="preserve">. The method therefore treats tool, peer-agent, and human</w:t>
+        <w:t xml:space="preserve">[18]. The method therefore treats tool, peer-agent, and human</w:t>
       </w:r>
       <w:r>
         <w:t xml:space="preserve"> </w:t>
@@ -968,7 +944,7 @@
         <w:t xml:space="preserve"> </w:t>
       </w:r>
       <w:r>
-        <w:t xml:space="preserve">. This separation prevents a</w:t>
+        <w:t xml:space="preserve">[1, 17, 18]. This separation prevents a</w:t>
       </w:r>
       <w:r>
         <w:t xml:space="preserve"> </w:t>
@@ -1028,7 +1004,7 @@
         <w:t xml:space="preserve"> </w:t>
       </w:r>
       <w:r>
-        <w:t xml:space="preserve">. These mixed findings motivate</w:t>
+        <w:t xml:space="preserve">[19, 20, 21]. These mixed findings motivate</w:t>
       </w:r>
       <w:r>
         <w:t xml:space="preserve"> </w:t>
@@ -1088,7 +1064,7 @@
         <w:t xml:space="preserve"> </w:t>
       </w:r>
       <w:r>
-        <w:t xml:space="preserve">.</w:t>
+        <w:t xml:space="preserve">[22, 23, 24, 25].</w:t>
       </w:r>
       <w:r>
         <w:t xml:space="preserve"> </w:t>
@@ -1124,13 +1100,7 @@
         <w:t xml:space="preserve"> </w:t>
       </w:r>
       <w:r>
-        <w:t xml:space="preserve">also reports code, control, and review failures</w:t>
-      </w:r>
-      <w:r>
-        <w:t xml:space="preserve"> </w:t>
-      </w:r>
-      <w:r>
-        <w:t xml:space="preserve">.</w:t>
+        <w:t xml:space="preserve">also reports code, control, and review failures [26].</w:t>
       </w:r>
       <w:r>
         <w:t xml:space="preserve"> </w:t>
@@ -1142,25 +1112,13 @@
         <w:t xml:space="preserve"> </w:t>
       </w:r>
       <w:r>
-        <w:t xml:space="preserve">meta-review roles</w:t>
-      </w:r>
-      <w:r>
-        <w:t xml:space="preserve"> </w:t>
-      </w:r>
-      <w:r>
-        <w:t xml:space="preserve">; SciAgents grounds hypothesis</w:t>
-      </w:r>
-      <w:r>
-        <w:t xml:space="preserve"> </w:t>
-      </w:r>
-      <w:r>
-        <w:t xml:space="preserve">formation in a literature graph</w:t>
-      </w:r>
-      <w:r>
-        <w:t xml:space="preserve"> </w:t>
-      </w:r>
-      <w:r>
-        <w:t xml:space="preserve">; and EviGraph, XScientist,</w:t>
+        <w:t xml:space="preserve">meta-review roles [27]; SciAgents grounds hypothesis</w:t>
+      </w:r>
+      <w:r>
+        <w:t xml:space="preserve"> </w:t>
+      </w:r>
+      <w:r>
+        <w:t xml:space="preserve">formation in a literature graph [28]; and EviGraph, XScientist,</w:t>
       </w:r>
       <w:r>
         <w:t xml:space="preserve"> </w:t>
@@ -1172,7 +1130,7 @@
         <w:t xml:space="preserve"> </w:t>
       </w:r>
       <w:r>
-        <w:t xml:space="preserve">. These systems motivate</w:t>
+        <w:t xml:space="preserve">[29, 30, 31]. These systems motivate</w:t>
       </w:r>
       <w:r>
         <w:t xml:space="preserve"> </w:t>
@@ -1220,13 +1178,7 @@
         <w:t xml:space="preserve"> </w:t>
       </w:r>
       <w:r>
-        <w:t xml:space="preserve">isolation and typed operations</w:t>
-      </w:r>
-      <w:r>
-        <w:t xml:space="preserve"> </w:t>
-      </w:r>
-      <w:r>
-        <w:t xml:space="preserve">. ResearchClawBench withholds</w:t>
+        <w:t xml:space="preserve">isolation and typed operations [32]. ResearchClawBench withholds</w:t>
       </w:r>
       <w:r>
         <w:t xml:space="preserve"> </w:t>
@@ -1244,13 +1196,7 @@
         <w:t xml:space="preserve"> </w:t>
       </w:r>
       <w:r>
-        <w:t xml:space="preserve">or independently establish novel discovery</w:t>
-      </w:r>
-      <w:r>
-        <w:t xml:space="preserve"> </w:t>
-      </w:r>
-      <w:r>
-        <w:t xml:space="preserve">.</w:t>
+        <w:t xml:space="preserve">or independently establish novel discovery [33].</w:t>
       </w:r>
       <w:r>
         <w:t xml:space="preserve"> </w:t>
@@ -1268,7 +1214,7 @@
         <w:t xml:space="preserve"> </w:t>
       </w:r>
       <w:r>
-        <w:t xml:space="preserve">. HEP compares explicit hypothesis–evidence–belief records</w:t>
+        <w:t xml:space="preserve">[34]. HEP compares explicit hypothesis–evidence–belief records</w:t>
       </w:r>
       <w:r>
         <w:t xml:space="preserve"> </w:t>
@@ -1280,13 +1226,7 @@
         <w:t xml:space="preserve"> </w:t>
       </w:r>
       <w:r>
-        <w:t xml:space="preserve">evidence validation as a limitation</w:t>
-      </w:r>
-      <w:r>
-        <w:t xml:space="preserve"> </w:t>
-      </w:r>
-      <w:r>
-        <w:t xml:space="preserve">. Search-trajectory analysis</w:t>
+        <w:t xml:space="preserve">evidence validation as a limitation [35]. Search-trajectory analysis</w:t>
       </w:r>
       <w:r>
         <w:t xml:space="preserve"> </w:t>
@@ -1298,13 +1238,7 @@
         <w:t xml:space="preserve"> </w:t>
       </w:r>
       <w:r>
-        <w:t xml:space="preserve">stopping must be measured separately from search count</w:t>
-      </w:r>
-      <w:r>
-        <w:t xml:space="preserve"> </w:t>
-      </w:r>
-      <w:r>
-        <w:t xml:space="preserve">.</w:t>
+        <w:t xml:space="preserve">stopping must be measured separately from search count [36].</w:t>
       </w:r>
       <w:r>
         <w:t xml:space="preserve"> </w:t>
@@ -1346,13 +1280,7 @@
         <w:t xml:space="preserve"> </w:t>
       </w:r>
       <w:r>
-        <w:t xml:space="preserve">and versioned rollback</w:t>
-      </w:r>
-      <w:r>
-        <w:t xml:space="preserve"> </w:t>
-      </w:r>
-      <w:r>
-        <w:t xml:space="preserve">. Evo-Bench and HarnessOpt-Bench isolate harness</w:t>
+        <w:t xml:space="preserve">and versioned rollback [37, 10, 38, 39, 40]. Evo-Bench and HarnessOpt-Bench isolate harness</w:t>
       </w:r>
       <w:r>
         <w:t xml:space="preserve"> </w:t>
@@ -1364,7 +1292,7 @@
         <w:t xml:space="preserve"> </w:t>
       </w:r>
       <w:r>
-        <w:t xml:space="preserve">. A matched-budget study further reports</w:t>
+        <w:t xml:space="preserve">[41, 42]. A matched-budget study further reports</w:t>
       </w:r>
       <w:r>
         <w:t xml:space="preserve"> </w:t>
@@ -1376,13 +1304,7 @@
         <w:t xml:space="preserve"> </w:t>
       </w:r>
       <w:r>
-        <w:t xml:space="preserve">its Terminal-Bench setting</w:t>
-      </w:r>
-      <w:r>
-        <w:t xml:space="preserve"> </w:t>
-      </w:r>
-      <w:r>
-        <w:t xml:space="preserve">. This counterevidence</w:t>
+        <w:t xml:space="preserve">its Terminal-Bench setting [43]. This counterevidence</w:t>
       </w:r>
       <w:r>
         <w:t xml:space="preserve"> </w:t>
@@ -2402,7 +2324,7 @@
         <w:t xml:space="preserve"> </w:t>
       </w:r>
       <w:r>
-        <w:t xml:space="preserve">. These mechanisms are prior work;</w:t>
+        <w:t xml:space="preserve">[3, 2, 10, 37]. These mechanisms are prior work;</w:t>
       </w:r>
       <w:r>
         <w:t xml:space="preserve"> </w:t>
@@ -2446,7 +2368,7 @@
         <w:t xml:space="preserve"> </w:t>
       </w:r>
       <w:r>
-        <w:t xml:space="preserve">.</w:t>
+        <w:t xml:space="preserve">[38, 39, 40].</w:t>
       </w:r>
     </w:p>
     <w:bookmarkEnd w:id="32"/>
@@ -2470,31 +2392,19 @@
         <w:t xml:space="preserve"> </w:t>
       </w:r>
       <w:r>
-        <w:t xml:space="preserve">. EviGraph adds typed evidence relations and dependency-</w:t>
-      </w:r>
-      <w:r>
-        <w:t xml:space="preserve"> </w:t>
-      </w:r>
-      <w:r>
-        <w:t xml:space="preserve">aware repair</w:t>
-      </w:r>
-      <w:r>
-        <w:t xml:space="preserve"> </w:t>
-      </w:r>
-      <w:r>
-        <w:t xml:space="preserve">; claim-aware observability makes claims and</w:t>
-      </w:r>
-      <w:r>
-        <w:t xml:space="preserve"> </w:t>
-      </w:r>
-      <w:r>
-        <w:t xml:space="preserve">verification records explicit</w:t>
-      </w:r>
-      <w:r>
-        <w:t xml:space="preserve"> </w:t>
-      </w:r>
-      <w:r>
-        <w:t xml:space="preserve">; and XScientist and</w:t>
+        <w:t xml:space="preserve">[28]. EviGraph adds typed evidence relations and dependency-</w:t>
+      </w:r>
+      <w:r>
+        <w:t xml:space="preserve"> </w:t>
+      </w:r>
+      <w:r>
+        <w:t xml:space="preserve">aware repair [29]; claim-aware observability makes claims and</w:t>
+      </w:r>
+      <w:r>
+        <w:t xml:space="preserve"> </w:t>
+      </w:r>
+      <w:r>
+        <w:t xml:space="preserve">verification records explicit [44]; and XScientist and</w:t>
       </w:r>
       <w:r>
         <w:t xml:space="preserve"> </w:t>
@@ -2506,7 +2416,7 @@
         <w:t xml:space="preserve"> </w:t>
       </w:r>
       <w:r>
-        <w:t xml:space="preserve">. The proposed method uses these ideas as an operational</w:t>
+        <w:t xml:space="preserve">[30, 31]. The proposed method uses these ideas as an operational</w:t>
       </w:r>
       <w:r>
         <w:t xml:space="preserve"> </w:t>
@@ -3071,13 +2981,7 @@
         <w:t xml:space="preserve"> </w:t>
       </w:r>
       <w:r>
-        <w:t xml:space="preserve">versioned rollback have direct precedents</w:t>
-      </w:r>
-      <w:r>
-        <w:t xml:space="preserve"> </w:t>
-      </w:r>
-      <w:r>
-        <w:t xml:space="preserve">. The proposed method combines these ideas with a versioned-state</w:t>
+        <w:t xml:space="preserve">versioned rollback have direct precedents [38, 41, 39, 40]. The proposed method combines these ideas with a versioned-state</w:t>
       </w:r>
       <w:r>
         <w:t xml:space="preserve"> </w:t>
@@ -3107,7 +3011,7 @@
         <w:t xml:space="preserve"> </w:t>
       </w:r>
       <w:r>
-        <w:t xml:space="preserve">.</w:t>
+        <w:t xml:space="preserve">[43, 42].</w:t>
       </w:r>
     </w:p>
     <w:bookmarkEnd w:id="36"/>
@@ -3149,13 +3053,7 @@
         <w:t xml:space="preserve"> </w:t>
       </w:r>
       <w:r>
-        <w:t xml:space="preserve">artifacts, and claim-specific verification</w:t>
-      </w:r>
-      <w:r>
-        <w:t xml:space="preserve"> </w:t>
-      </w:r>
-      <w:r>
-        <w:t xml:space="preserve">.</w:t>
+        <w:t xml:space="preserve">artifacts, and claim-specific verification [29, 45, 44, 30, 31].</w:t>
       </w:r>
     </w:p>
     <w:p>
@@ -3736,13 +3634,7 @@
         <w:t xml:space="preserve"> </w:t>
       </w:r>
       <w:r>
-        <w:t xml:space="preserve">high-level reasoning</w:t>
-      </w:r>
-      <w:r>
-        <w:t xml:space="preserve"> </w:t>
-      </w:r>
-      <w:r>
-        <w:t xml:space="preserve">.</w:t>
+        <w:t xml:space="preserve">high-level reasoning [32].</w:t>
       </w:r>
     </w:p>
     <w:bookmarkEnd w:id="42"/>
@@ -4464,13 +4356,7 @@
         <w:t xml:space="preserve"> </w:t>
       </w:r>
       <w:r>
-        <w:t xml:space="preserve">filesystem boundary</w:t>
-      </w:r>
-      <w:r>
-        <w:t xml:space="preserve"> </w:t>
-      </w:r>
-      <w:r>
-        <w:t xml:space="preserve">. Failing-first probes must</w:t>
+        <w:t xml:space="preserve">filesystem boundary [33]. Failing-first probes must</w:t>
       </w:r>
       <w:r>
         <w:t xml:space="preserve"> </w:t>
@@ -4530,13 +4416,7 @@
         <w:t xml:space="preserve"> </w:t>
       </w:r>
       <w:r>
-        <w:t xml:space="preserve">accepted as an independent check</w:t>
-      </w:r>
-      <w:r>
-        <w:t xml:space="preserve"> </w:t>
-      </w:r>
-      <w:r>
-        <w:t xml:space="preserve">.</w:t>
+        <w:t xml:space="preserve">accepted as an independent check [35].</w:t>
       </w:r>
     </w:p>
     <w:p>
@@ -4556,13 +4436,7 @@
         <w:t xml:space="preserve"> </w:t>
       </w:r>
       <w:r>
-        <w:t xml:space="preserve">work</w:t>
-      </w:r>
-      <w:r>
-        <w:t xml:space="preserve"> </w:t>
-      </w:r>
-      <w:r>
-        <w:t xml:space="preserve">. The confirmatory analysis uses paired</w:t>
+        <w:t xml:space="preserve">work [36]. The confirmatory analysis uses paired</w:t>
       </w:r>
       <w:r>
         <w:t xml:space="preserve"> </w:t>
@@ -4622,13 +4496,7 @@
         <w:t xml:space="preserve"> </w:t>
       </w:r>
       <w:r>
-        <w:t xml:space="preserve">preclude treating its reported effects as local evidence</w:t>
-      </w:r>
-      <w:r>
-        <w:t xml:space="preserve"> </w:t>
-      </w:r>
-      <w:r>
-        <w:t xml:space="preserve">.</w:t>
+        <w:t xml:space="preserve">preclude treating its reported effects as local evidence [34].</w:t>
       </w:r>
       <w:r>
         <w:t xml:space="preserve"> </w:t>
@@ -4764,25 +4632,13 @@
         <w:t xml:space="preserve"> </w:t>
       </w:r>
       <w:r>
-        <w:t xml:space="preserve">pipeline can lose validity stage by stage</w:t>
-      </w:r>
-      <w:r>
-        <w:t xml:space="preserve"> </w:t>
-      </w:r>
-      <w:r>
-        <w:t xml:space="preserve">, because a</w:t>
-      </w:r>
-      <w:r>
-        <w:t xml:space="preserve"> </w:t>
-      </w:r>
-      <w:r>
-        <w:t xml:space="preserve">validity audit can fail in its own characteristic ways</w:t>
-      </w:r>
-      <w:r>
-        <w:t xml:space="preserve"> </w:t>
-      </w:r>
-      <w:r>
-        <w:t xml:space="preserve">,</w:t>
+        <w:t xml:space="preserve">pipeline can lose validity stage by stage [46], because a</w:t>
+      </w:r>
+      <w:r>
+        <w:t xml:space="preserve"> </w:t>
+      </w:r>
+      <w:r>
+        <w:t xml:space="preserve">validity audit can fail in its own characteristic ways [47],</w:t>
       </w:r>
       <w:r>
         <w:t xml:space="preserve"> </w:t>
@@ -4794,13 +4650,7 @@
         <w:t xml:space="preserve"> </w:t>
       </w:r>
       <w:r>
-        <w:t xml:space="preserve">systems learn from</w:t>
-      </w:r>
-      <w:r>
-        <w:t xml:space="preserve"> </w:t>
-      </w:r>
-      <w:r>
-        <w:t xml:space="preserve">.</w:t>
+        <w:t xml:space="preserve">systems learn from [48].</w:t>
       </w:r>
     </w:p>
     <w:bookmarkStart w:id="51" w:name="executed-instrument-blocks"/>
@@ -4883,16 +4733,7 @@
         <w:t xml:space="preserve"> </w:t>
       </w:r>
       <w:r>
-        <w:t xml:space="preserve">planted-shortcut style</w:t>
-      </w:r>
-      <w:r>
-        <w:t xml:space="preserve"> </w:t>
-      </w:r>
-      <w:r>
-        <w:t xml:space="preserve"> </w:t>
-      </w:r>
-      <w:r>
-        <w:t xml:space="preserve">falsified it: sentences that named</w:t>
+        <w:t xml:space="preserve">planted-shortcut style [49] falsified it: sentences that named</w:t>
       </w:r>
       <w:r>
         <w:t xml:space="preserve"> </w:t>
@@ -5005,7 +4846,7 @@
         <w:t xml:space="preserve"> </w:t>
       </w:r>
       <w:r>
-        <w:t xml:space="preserve">.</w:t>
+        <w:t xml:space="preserve">[50].</w:t>
       </w:r>
     </w:p>
     <w:p>
@@ -5025,13 +4866,7 @@
         <w:t xml:space="preserve"> </w:t>
       </w:r>
       <w:r>
-        <w:t xml:space="preserve">retrieved span, following grounded checklist scoring</w:t>
-      </w:r>
-      <w:r>
-        <w:t xml:space="preserve"> </w:t>
-      </w:r>
-      <w:r>
-        <w:t xml:space="preserve">.</w:t>
+        <w:t xml:space="preserve">retrieved span, following grounded checklist scoring [51].</w:t>
       </w:r>
       <w:r>
         <w:t xml:space="preserve"> </w:t>
@@ -5089,13 +4924,7 @@
         <w:t xml:space="preserve"> </w:t>
       </w:r>
       <w:r>
-        <w:t xml:space="preserve">is the load-bearing property here, not score magnitude</w:t>
-      </w:r>
-      <w:r>
-        <w:t xml:space="preserve"> </w:t>
-      </w:r>
-      <w:r>
-        <w:t xml:space="preserve">.</w:t>
+        <w:t xml:space="preserve">is the load-bearing property here, not score magnitude [52].</w:t>
       </w:r>
     </w:p>
     <w:bookmarkEnd w:id="52"/>
@@ -5305,25 +5134,13 @@
         <w:t xml:space="preserve"> </w:t>
       </w:r>
       <w:r>
-        <w:t xml:space="preserve">confident error</w:t>
-      </w:r>
-      <w:r>
-        <w:t xml:space="preserve"> </w:t>
-      </w:r>
-      <w:r>
-        <w:t xml:space="preserve">, and judge validation that rests on</w:t>
-      </w:r>
-      <w:r>
-        <w:t xml:space="preserve"> </w:t>
-      </w:r>
-      <w:r>
-        <w:t xml:space="preserve">uncorrected agreement does not establish validity</w:t>
-      </w:r>
-      <w:r>
-        <w:t xml:space="preserve"> </w:t>
-      </w:r>
-      <w:r>
-        <w:t xml:space="preserve">.</w:t>
+        <w:t xml:space="preserve">confident error [53], and judge validation that rests on</w:t>
+      </w:r>
+      <w:r>
+        <w:t xml:space="preserve"> </w:t>
+      </w:r>
+      <w:r>
+        <w:t xml:space="preserve">uncorrected agreement does not establish validity [54].</w:t>
       </w:r>
       <w:r>
         <w:t xml:space="preserve"> </w:t>
@@ -5568,13 +5385,7 @@
         <w:t xml:space="preserve"> </w:t>
       </w:r>
       <w:r>
-        <w:t xml:space="preserve">experiments</w:t>
-      </w:r>
-      <w:r>
-        <w:t xml:space="preserve"> </w:t>
-      </w:r>
-      <w:r>
-        <w:t xml:space="preserve">. The pilot tasks are development data and are</w:t>
+        <w:t xml:space="preserve">experiments [55]. The pilot tasks are development data and are</w:t>
       </w:r>
       <w:r>
         <w:t xml:space="preserve"> </w:t>
@@ -5646,7 +5457,7 @@
         <w:t xml:space="preserve"> </w:t>
       </w:r>
       <w:r>
-        <w:t xml:space="preserve">.</w:t>
+        <w:t xml:space="preserve">[33].</w:t>
       </w:r>
     </w:p>
     <w:p>
@@ -5871,13 +5682,7 @@
         <w:t xml:space="preserve"> </w:t>
       </w:r>
       <w:r>
-        <w:t xml:space="preserve">both sides</w:t>
-      </w:r>
-      <w:r>
-        <w:t xml:space="preserve"> </w:t>
-      </w:r>
-      <w:r>
-        <w:t xml:space="preserve">. Diagnostic evaluation of autonomous research</w:t>
+        <w:t xml:space="preserve">both sides [6]. Diagnostic evaluation of autonomous research</w:t>
       </w:r>
       <w:r>
         <w:t xml:space="preserve"> </w:t>
@@ -5889,13 +5694,7 @@
         <w:t xml:space="preserve"> </w:t>
       </w:r>
       <w:r>
-        <w:t xml:space="preserve">single terminal score</w:t>
-      </w:r>
-      <w:r>
-        <w:t xml:space="preserve"> </w:t>
-      </w:r>
-      <w:r>
-        <w:t xml:space="preserve">.</w:t>
+        <w:t xml:space="preserve">single terminal score [56].</w:t>
       </w:r>
     </w:p>
     <w:p>
@@ -5977,7 +5776,7 @@
         <w:t xml:space="preserve"> </w:t>
       </w:r>
       <w:r>
-        <w:t xml:space="preserve">; this project spent 192 model calls to verify 32</w:t>
+        <w:t xml:space="preserve">[57]; this project spent 192 model calls to verify 32</w:t>
       </w:r>
       <w:r>
         <w:t xml:space="preserve"> </w:t>

</xml_diff>

<commit_message>
feat(paper): enforce official format properties in the word builder
</commit_message>
<xml_diff>
--- a/paper/word/graduation-thesis.docx
+++ b/paper/word/graduation-thesis.docx
@@ -205,7 +205,7 @@
         <w:pStyle w:val="Heading1"/>
       </w:pPr>
       <w:r>
-        <w:t xml:space="preserve">Introduction</w:t>
+        <w:t xml:space="preserve">I. Introduction</w:t>
       </w:r>
     </w:p>
     <w:p>
@@ -711,7 +711,7 @@
         <w:pStyle w:val="Heading1"/>
       </w:pPr>
       <w:r>
-        <w:t xml:space="preserve">Related Works</w:t>
+        <w:t xml:space="preserve">II. Related Works</w:t>
       </w:r>
     </w:p>
     <w:bookmarkStart w:id="16" w:name="X038a64f04809aa2282721f66859cc536ff1daa0"/>
@@ -1333,7 +1333,7 @@
         <w:pStyle w:val="Heading1"/>
       </w:pPr>
       <w:r>
-        <w:t xml:space="preserve">Proposed Method</w:t>
+        <w:t xml:space="preserve">III. Proposed Method</w:t>
       </w:r>
     </w:p>
     <w:bookmarkStart w:id="26" w:name="unit-of-scientific-work"/>
@@ -4606,7 +4606,7 @@
         <w:pStyle w:val="Heading1"/>
       </w:pPr>
       <w:r>
-        <w:t xml:space="preserve">Experimental Results</w:t>
+        <w:t xml:space="preserve">IV. Experimental Results</w:t>
       </w:r>
     </w:p>
     <w:p>
@@ -5556,7 +5556,7 @@
         <w:pStyle w:val="Heading1"/>
       </w:pPr>
       <w:r>
-        <w:t xml:space="preserve">Conclusions</w:t>
+        <w:t xml:space="preserve">V. Conclusions</w:t>
       </w:r>
     </w:p>
     <w:p>
@@ -8472,6 +8472,7 @@
     </w:p>
     <w:bookmarkEnd w:id="115"/>
     <w:sectPr>
+      <w:footerReference w:type="default" r:id="rIdFtr1"/>
       <w:footnotePr>
         <w:numRestart w:val="eachSect"/>
       </w:footnotePr>
@@ -8482,6 +8483,31 @@
 
 <file path=word/comments.xml><?xml version="1.0" encoding="utf-8"?>
 <w:comments xmlns:w="http://schemas.openxmlformats.org/wordprocessingml/2006/main" xmlns:m="http://schemas.openxmlformats.org/officeDocument/2006/math" xmlns:r="http://schemas.openxmlformats.org/officeDocument/2006/relationships" xmlns:o="urn:schemas-microsoft-com:office:office" xmlns:v="urn:schemas-microsoft-com:vml" xmlns:w10="urn:schemas-microsoft-com:office:word" xmlns:a="http://schemas.openxmlformats.org/drawingml/2006/main" xmlns:pic="http://schemas.openxmlformats.org/drawingml/2006/picture" xmlns:wp="http://schemas.openxmlformats.org/drawingml/2006/wordprocessingDrawing"/>
+</file>
+
+<file path=word/footer1.xml><?xml version="1.0" encoding="utf-8"?>
+<w:ftr xmlns:w="http://schemas.openxmlformats.org/wordprocessingml/2006/main">
+  <w:p>
+    <w:pPr>
+      <w:jc w:val="center"/>
+    </w:pPr>
+    <w:r>
+      <w:fldChar w:fldCharType="begin"/>
+    </w:r>
+    <w:r>
+      <w:instrText xml:space="preserve"> PAGE </w:instrText>
+    </w:r>
+    <w:r>
+      <w:fldChar w:fldCharType="separate"/>
+    </w:r>
+    <w:r>
+      <w:t>1</w:t>
+    </w:r>
+    <w:r>
+      <w:fldChar w:fldCharType="end"/>
+    </w:r>
+  </w:p>
+</w:ftr>
 </file>
 
 <file path=word/footnotes.xml><?xml version="1.0" encoding="utf-8"?>
@@ -8705,6 +8731,11 @@
 <file path=word/styles.xml><?xml version="1.0" encoding="utf-8"?>
 <w:styles xmlns:r="http://schemas.openxmlformats.org/officeDocument/2006/relationships" xmlns:w="http://schemas.openxmlformats.org/wordprocessingml/2006/main">
   <w:docDefaults>
+    <w:pPrDefault>
+      <w:pPr>
+        <w:spacing w:line="480" w:lineRule="auto" w:after="0"/>
+      </w:pPr>
+    </w:pPrDefault>
     <w:rPrDefault>
       <w:rPr>
         <w:rFonts w:asciiTheme="minorHAnsi" w:cstheme="minorBidi" w:eastAsiaTheme="minorEastAsia" w:hAnsiTheme="minorHAnsi"/>

</xml_diff>

<commit_message>
feat(paper): enforce artifact reproducibility in the gate and measure the decision record
</commit_message>
<xml_diff>
--- a/paper/word/graduation-thesis.docx
+++ b/paper/word/graduation-thesis.docx
@@ -4600,7 +4600,7 @@
     <w:bookmarkEnd w:id="48"/>
     <w:bookmarkEnd w:id="49"/>
     <w:bookmarkEnd w:id="50"/>
-    <w:bookmarkStart w:id="57" w:name="experimental-results"/>
+    <w:bookmarkStart w:id="58" w:name="experimental-results"/>
     <w:p>
       <w:pPr>
         <w:pStyle w:val="Heading1"/>
@@ -5549,8 +5549,189 @@
       </w:r>
     </w:p>
     <w:bookmarkEnd w:id="56"/>
+    <w:bookmarkStart w:id="57" w:name="X782ae78defcb34d28636704b3c8bd73b8faa49a"/>
+    <w:p>
+      <w:pPr>
+        <w:pStyle w:val="Heading2"/>
+      </w:pPr>
+      <w:r>
+        <w:t xml:space="preserve">A census of the project’s own decision record</w:t>
+      </w:r>
+    </w:p>
+    <w:p>
+      <w:pPr>
+        <w:pStyle w:val="FirstParagraph"/>
+      </w:pPr>
+      <w:r>
+        <w:t xml:space="preserve">Because the method above claims a loop that corrects itself, that claim is</w:t>
+      </w:r>
+      <w:r>
+        <w:t xml:space="preserve"> </w:t>
+      </w:r>
+      <w:r>
+        <w:t xml:space="preserve">measured rather than asserted. A committed script reads the decision ledger and</w:t>
+      </w:r>
+      <w:r>
+        <w:t xml:space="preserve"> </w:t>
+      </w:r>
+      <w:r>
+        <w:t xml:space="preserve">counts records, falsifiers, and later revisions; eight fixtures cover the count,</w:t>
+      </w:r>
+      <w:r>
+        <w:t xml:space="preserve"> </w:t>
+      </w:r>
+      <w:r>
+        <w:t xml:space="preserve">the rate, the empty-ledger case, and the rule that only round-numbered record</w:t>
+      </w:r>
+      <w:r>
+        <w:t xml:space="preserve"> </w:t>
+      </w:r>
+      <w:r>
+        <w:t xml:space="preserve">lists are read [56]. Measured against the ledger digest recorded in</w:t>
+      </w:r>
+      <w:r>
+        <w:t xml:space="preserve"> </w:t>
+      </w:r>
+      <w:r>
+        <w:t xml:space="preserve">the receipt, the project had made</w:t>
+      </w:r>
+      <w:r>
+        <w:t xml:space="preserve"> </w:t>
+      </w:r>
+      <m:oMath>
+        <m:r>
+          <m:t>28</m:t>
+        </m:r>
+      </m:oMath>
+      <w:r>
+        <w:t xml:space="preserve"> </w:t>
+      </w:r>
+      <w:r>
+        <w:t xml:space="preserve">recorded decisions in</w:t>
+      </w:r>
+      <w:r>
+        <w:t xml:space="preserve"> </w:t>
+      </w:r>
+      <m:oMath>
+        <m:r>
+          <m:t>15</m:t>
+        </m:r>
+      </m:oMath>
+      <w:r>
+        <w:t xml:space="preserve"> </w:t>
+      </w:r>
+      <w:r>
+        <w:t xml:space="preserve">recording</w:t>
+      </w:r>
+      <w:r>
+        <w:t xml:space="preserve"> </w:t>
+      </w:r>
+      <w:r>
+        <w:t xml:space="preserve">groups. Every record carried a falsifier written before the result was known, and</w:t>
+      </w:r>
+      <w:r>
+        <w:t xml:space="preserve"> </w:t>
+      </w:r>
+      <m:oMath>
+        <m:r>
+          <m:t>20</m:t>
+        </m:r>
+      </m:oMath>
+      <w:r>
+        <w:t xml:space="preserve"> </w:t>
+      </w:r>
+      <w:r>
+        <w:t xml:space="preserve">carried executed evidence. Three decisions were later revised: one endpoint</w:t>
+      </w:r>
+      <w:r>
+        <w:t xml:space="preserve"> </w:t>
+      </w:r>
+      <w:r>
+        <w:t xml:space="preserve">falsified by measurement, one allocation voided as a consequence, and one</w:t>
+      </w:r>
+      <w:r>
+        <w:t xml:space="preserve"> </w:t>
+      </w:r>
+      <w:r>
+        <w:t xml:space="preserve">superseded. The revision rate is</w:t>
+      </w:r>
+      <w:r>
+        <w:t xml:space="preserve"> </w:t>
+      </w:r>
+      <m:oMath>
+        <m:r>
+          <m:t>0.107</m:t>
+        </m:r>
+      </m:oMath>
+      <w:r>
+        <w:t xml:space="preserve">.</w:t>
+      </w:r>
+    </w:p>
+    <w:p>
+      <w:pPr>
+        <w:pStyle w:val="BodyText"/>
+      </w:pPr>
+      <w:r>
+        <w:t xml:space="preserve">Two limits are stated with the number. First, the census counts the ledger that</w:t>
+      </w:r>
+      <w:r>
+        <w:t xml:space="preserve"> </w:t>
+      </w:r>
+      <w:r>
+        <w:t xml:space="preserve">records the decision to run it, so it is reported against a stated digest rather</w:t>
+      </w:r>
+      <w:r>
+        <w:t xml:space="preserve"> </w:t>
+      </w:r>
+      <w:r>
+        <w:t xml:space="preserve">than as a constant. Second, this is a descriptive census of a single project with</w:t>
+      </w:r>
+      <w:r>
+        <w:t xml:space="preserve"> </w:t>
+      </w:r>
+      <w:r>
+        <w:t xml:space="preserve">no comparison group, so it cannot show that writing falsifiers caused the</w:t>
+      </w:r>
+      <w:r>
+        <w:t xml:space="preserve"> </w:t>
+      </w:r>
+      <w:r>
+        <w:t xml:space="preserve">revisions; it shows only that revisions happened and what triggered each one. All</w:t>
+      </w:r>
+      <w:r>
+        <w:t xml:space="preserve"> </w:t>
+      </w:r>
+      <w:r>
+        <w:t xml:space="preserve">three were triggered by the project’s own executed measurements rather than by</w:t>
+      </w:r>
+      <w:r>
+        <w:t xml:space="preserve"> </w:t>
+      </w:r>
+      <w:r>
+        <w:t xml:space="preserve">outside review. This is the kind of process evidence that evaluation beyond final</w:t>
+      </w:r>
+      <w:r>
+        <w:t xml:space="preserve"> </w:t>
+      </w:r>
+      <w:r>
+        <w:t xml:space="preserve">scores calls for [57], and it is also the boundary of what</w:t>
+      </w:r>
+      <w:r>
+        <w:t xml:space="preserve"> </w:t>
+      </w:r>
+      <w:r>
+        <w:t xml:space="preserve">such evidence establishes: gates and receipts are operational rigor, which</w:t>
+      </w:r>
+      <w:r>
+        <w:t xml:space="preserve"> </w:t>
+      </w:r>
+      <w:r>
+        <w:t xml:space="preserve">substitutes for understanding rather than supplying it [58].</w:t>
+      </w:r>
+    </w:p>
     <w:bookmarkEnd w:id="57"/>
-    <w:bookmarkStart w:id="115" w:name="conclusions"/>
+    <w:bookmarkEnd w:id="58"/>
+    <w:bookmarkStart w:id="116" w:name="conclusions"/>
     <w:p>
       <w:pPr>
         <w:pStyle w:val="Heading1"/>
@@ -5694,7 +5875,7 @@
         <w:t xml:space="preserve"> </w:t>
       </w:r>
       <w:r>
-        <w:t xml:space="preserve">single terminal score [56].</w:t>
+        <w:t xml:space="preserve">single terminal score [59].</w:t>
       </w:r>
     </w:p>
     <w:p>
@@ -5776,7 +5957,7 @@
         <w:t xml:space="preserve"> </w:t>
       </w:r>
       <w:r>
-        <w:t xml:space="preserve">[57]; this project spent 192 model calls to verify 32</w:t>
+        <w:t xml:space="preserve">[60]; this project spent 192 model calls to verify 32</w:t>
       </w:r>
       <w:r>
         <w:t xml:space="preserve"> </w:t>
@@ -5834,7 +6015,7 @@
       <w:r>
         <w:t xml:space="preserve"> </w:t>
       </w:r>
-      <w:hyperlink r:id="rId58">
+      <w:hyperlink r:id="rId59">
         <w:r>
           <w:rPr>
             <w:rStyle w:val="Hyperlink"/>
@@ -5881,7 +6062,7 @@
       <w:r>
         <w:t xml:space="preserve"> </w:t>
       </w:r>
-      <w:hyperlink r:id="rId59">
+      <w:hyperlink r:id="rId60">
         <w:r>
           <w:rPr>
             <w:rStyle w:val="Hyperlink"/>
@@ -5922,7 +6103,7 @@
       <w:r>
         <w:t xml:space="preserve"> </w:t>
       </w:r>
-      <w:hyperlink r:id="rId60">
+      <w:hyperlink r:id="rId61">
         <w:r>
           <w:rPr>
             <w:rStyle w:val="Hyperlink"/>
@@ -5975,7 +6156,7 @@
       <w:r>
         <w:t xml:space="preserve"> </w:t>
       </w:r>
-      <w:hyperlink r:id="rId61">
+      <w:hyperlink r:id="rId62">
         <w:r>
           <w:rPr>
             <w:rStyle w:val="Hyperlink"/>
@@ -6016,7 +6197,7 @@
       <w:r>
         <w:t xml:space="preserve"> </w:t>
       </w:r>
-      <w:hyperlink r:id="rId62">
+      <w:hyperlink r:id="rId63">
         <w:r>
           <w:rPr>
             <w:rStyle w:val="Hyperlink"/>
@@ -6057,7 +6238,7 @@
       <w:r>
         <w:t xml:space="preserve"> </w:t>
       </w:r>
-      <w:hyperlink r:id="rId63">
+      <w:hyperlink r:id="rId64">
         <w:r>
           <w:rPr>
             <w:rStyle w:val="Hyperlink"/>
@@ -6098,7 +6279,7 @@
       <w:r>
         <w:t xml:space="preserve"> </w:t>
       </w:r>
-      <w:hyperlink r:id="rId64">
+      <w:hyperlink r:id="rId65">
         <w:r>
           <w:rPr>
             <w:rStyle w:val="Hyperlink"/>
@@ -6139,7 +6320,7 @@
       <w:r>
         <w:t xml:space="preserve"> </w:t>
       </w:r>
-      <w:hyperlink r:id="rId65">
+      <w:hyperlink r:id="rId66">
         <w:r>
           <w:rPr>
             <w:rStyle w:val="Hyperlink"/>
@@ -6180,7 +6361,7 @@
       <w:r>
         <w:t xml:space="preserve"> </w:t>
       </w:r>
-      <w:hyperlink r:id="rId66">
+      <w:hyperlink r:id="rId67">
         <w:r>
           <w:rPr>
             <w:rStyle w:val="Hyperlink"/>
@@ -6227,7 +6408,7 @@
       <w:r>
         <w:t xml:space="preserve"> </w:t>
       </w:r>
-      <w:hyperlink r:id="rId67">
+      <w:hyperlink r:id="rId68">
         <w:r>
           <w:rPr>
             <w:rStyle w:val="Hyperlink"/>
@@ -6292,7 +6473,7 @@
       <w:r>
         <w:t xml:space="preserve"> </w:t>
       </w:r>
-      <w:hyperlink r:id="rId68">
+      <w:hyperlink r:id="rId69">
         <w:r>
           <w:rPr>
             <w:rStyle w:val="Hyperlink"/>
@@ -6333,7 +6514,7 @@
       <w:r>
         <w:t xml:space="preserve"> </w:t>
       </w:r>
-      <w:hyperlink r:id="rId69">
+      <w:hyperlink r:id="rId70">
         <w:r>
           <w:rPr>
             <w:rStyle w:val="Hyperlink"/>
@@ -6388,7 +6569,7 @@
       <w:r>
         <w:t xml:space="preserve"> </w:t>
       </w:r>
-      <w:hyperlink r:id="rId70">
+      <w:hyperlink r:id="rId71">
         <w:r>
           <w:rPr>
             <w:rStyle w:val="Hyperlink"/>
@@ -6435,7 +6616,7 @@
       <w:r>
         <w:t xml:space="preserve"> </w:t>
       </w:r>
-      <w:hyperlink r:id="rId71">
+      <w:hyperlink r:id="rId72">
         <w:r>
           <w:rPr>
             <w:rStyle w:val="Hyperlink"/>
@@ -6490,7 +6671,7 @@
       <w:r>
         <w:t xml:space="preserve"> </w:t>
       </w:r>
-      <w:hyperlink r:id="rId72">
+      <w:hyperlink r:id="rId73">
         <w:r>
           <w:rPr>
             <w:rStyle w:val="Hyperlink"/>
@@ -6545,7 +6726,7 @@
       <w:r>
         <w:t xml:space="preserve"> </w:t>
       </w:r>
-      <w:hyperlink r:id="rId73">
+      <w:hyperlink r:id="rId74">
         <w:r>
           <w:rPr>
             <w:rStyle w:val="Hyperlink"/>
@@ -6586,7 +6767,7 @@
       <w:r>
         <w:t xml:space="preserve"> </w:t>
       </w:r>
-      <w:hyperlink r:id="rId74">
+      <w:hyperlink r:id="rId75">
         <w:r>
           <w:rPr>
             <w:rStyle w:val="Hyperlink"/>
@@ -6627,7 +6808,7 @@
       <w:r>
         <w:t xml:space="preserve"> </w:t>
       </w:r>
-      <w:hyperlink r:id="rId75">
+      <w:hyperlink r:id="rId76">
         <w:r>
           <w:rPr>
             <w:rStyle w:val="Hyperlink"/>
@@ -6682,7 +6863,7 @@
       <w:r>
         <w:t xml:space="preserve"> </w:t>
       </w:r>
-      <w:hyperlink r:id="rId76">
+      <w:hyperlink r:id="rId77">
         <w:r>
           <w:rPr>
             <w:rStyle w:val="Hyperlink"/>
@@ -6737,7 +6918,7 @@
       <w:r>
         <w:t xml:space="preserve"> </w:t>
       </w:r>
-      <w:hyperlink r:id="rId77">
+      <w:hyperlink r:id="rId78">
         <w:r>
           <w:rPr>
             <w:rStyle w:val="Hyperlink"/>
@@ -6792,7 +6973,7 @@
       <w:r>
         <w:t xml:space="preserve"> </w:t>
       </w:r>
-      <w:hyperlink r:id="rId78">
+      <w:hyperlink r:id="rId79">
         <w:r>
           <w:rPr>
             <w:rStyle w:val="Hyperlink"/>
@@ -6847,7 +7028,7 @@
       <w:r>
         <w:t xml:space="preserve"> </w:t>
       </w:r>
-      <w:hyperlink r:id="rId79">
+      <w:hyperlink r:id="rId80">
         <w:r>
           <w:rPr>
             <w:rStyle w:val="Hyperlink"/>
@@ -6902,7 +7083,7 @@
       <w:r>
         <w:t xml:space="preserve"> </w:t>
       </w:r>
-      <w:hyperlink r:id="rId80">
+      <w:hyperlink r:id="rId81">
         <w:r>
           <w:rPr>
             <w:rStyle w:val="Hyperlink"/>
@@ -6957,7 +7138,7 @@
       <w:r>
         <w:t xml:space="preserve"> </w:t>
       </w:r>
-      <w:hyperlink r:id="rId81">
+      <w:hyperlink r:id="rId82">
         <w:r>
           <w:rPr>
             <w:rStyle w:val="Hyperlink"/>
@@ -6998,7 +7179,7 @@
       <w:r>
         <w:t xml:space="preserve"> </w:t>
       </w:r>
-      <w:hyperlink r:id="rId82">
+      <w:hyperlink r:id="rId83">
         <w:r>
           <w:rPr>
             <w:rStyle w:val="Hyperlink"/>
@@ -7039,7 +7220,7 @@
       <w:r>
         <w:t xml:space="preserve"> </w:t>
       </w:r>
-      <w:hyperlink r:id="rId83">
+      <w:hyperlink r:id="rId84">
         <w:r>
           <w:rPr>
             <w:rStyle w:val="Hyperlink"/>
@@ -7080,7 +7261,7 @@
       <w:r>
         <w:t xml:space="preserve"> </w:t>
       </w:r>
-      <w:hyperlink r:id="rId84">
+      <w:hyperlink r:id="rId85">
         <w:r>
           <w:rPr>
             <w:rStyle w:val="Hyperlink"/>
@@ -7135,7 +7316,7 @@
       <w:r>
         <w:t xml:space="preserve"> </w:t>
       </w:r>
-      <w:hyperlink r:id="rId85">
+      <w:hyperlink r:id="rId86">
         <w:r>
           <w:rPr>
             <w:rStyle w:val="Hyperlink"/>
@@ -7176,7 +7357,7 @@
       <w:r>
         <w:t xml:space="preserve"> </w:t>
       </w:r>
-      <w:hyperlink r:id="rId86">
+      <w:hyperlink r:id="rId87">
         <w:r>
           <w:rPr>
             <w:rStyle w:val="Hyperlink"/>
@@ -7231,7 +7412,7 @@
       <w:r>
         <w:t xml:space="preserve"> </w:t>
       </w:r>
-      <w:hyperlink r:id="rId87">
+      <w:hyperlink r:id="rId88">
         <w:r>
           <w:rPr>
             <w:rStyle w:val="Hyperlink"/>
@@ -7284,7 +7465,7 @@
       <w:r>
         <w:t xml:space="preserve"> </w:t>
       </w:r>
-      <w:hyperlink r:id="rId88">
+      <w:hyperlink r:id="rId89">
         <w:r>
           <w:rPr>
             <w:rStyle w:val="Hyperlink"/>
@@ -7339,7 +7520,7 @@
       <w:r>
         <w:t xml:space="preserve"> </w:t>
       </w:r>
-      <w:hyperlink r:id="rId89">
+      <w:hyperlink r:id="rId90">
         <w:r>
           <w:rPr>
             <w:rStyle w:val="Hyperlink"/>
@@ -7394,7 +7575,7 @@
       <w:r>
         <w:t xml:space="preserve"> </w:t>
       </w:r>
-      <w:hyperlink r:id="rId90">
+      <w:hyperlink r:id="rId91">
         <w:r>
           <w:rPr>
             <w:rStyle w:val="Hyperlink"/>
@@ -7435,7 +7616,7 @@
       <w:r>
         <w:t xml:space="preserve"> </w:t>
       </w:r>
-      <w:hyperlink r:id="rId91">
+      <w:hyperlink r:id="rId92">
         <w:r>
           <w:rPr>
             <w:rStyle w:val="Hyperlink"/>
@@ -7490,7 +7671,7 @@
       <w:r>
         <w:t xml:space="preserve"> </w:t>
       </w:r>
-      <w:hyperlink r:id="rId92">
+      <w:hyperlink r:id="rId93">
         <w:r>
           <w:rPr>
             <w:rStyle w:val="Hyperlink"/>
@@ -7545,7 +7726,7 @@
       <w:r>
         <w:t xml:space="preserve"> </w:t>
       </w:r>
-      <w:hyperlink r:id="rId93">
+      <w:hyperlink r:id="rId94">
         <w:r>
           <w:rPr>
             <w:rStyle w:val="Hyperlink"/>
@@ -7592,7 +7773,7 @@
       <w:r>
         <w:t xml:space="preserve"> </w:t>
       </w:r>
-      <w:hyperlink r:id="rId94">
+      <w:hyperlink r:id="rId95">
         <w:r>
           <w:rPr>
             <w:rStyle w:val="Hyperlink"/>
@@ -7633,7 +7814,7 @@
       <w:r>
         <w:t xml:space="preserve"> </w:t>
       </w:r>
-      <w:hyperlink r:id="rId95">
+      <w:hyperlink r:id="rId96">
         <w:r>
           <w:rPr>
             <w:rStyle w:val="Hyperlink"/>
@@ -7688,7 +7869,7 @@
       <w:r>
         <w:t xml:space="preserve"> </w:t>
       </w:r>
-      <w:hyperlink r:id="rId96">
+      <w:hyperlink r:id="rId97">
         <w:r>
           <w:rPr>
             <w:rStyle w:val="Hyperlink"/>
@@ -7729,7 +7910,7 @@
       <w:r>
         <w:t xml:space="preserve"> </w:t>
       </w:r>
-      <w:hyperlink r:id="rId97">
+      <w:hyperlink r:id="rId98">
         <w:r>
           <w:rPr>
             <w:rStyle w:val="Hyperlink"/>
@@ -7776,7 +7957,7 @@
       <w:r>
         <w:t xml:space="preserve"> </w:t>
       </w:r>
-      <w:hyperlink r:id="rId98">
+      <w:hyperlink r:id="rId99">
         <w:r>
           <w:rPr>
             <w:rStyle w:val="Hyperlink"/>
@@ -7823,7 +8004,7 @@
       <w:r>
         <w:t xml:space="preserve"> </w:t>
       </w:r>
-      <w:hyperlink r:id="rId99">
+      <w:hyperlink r:id="rId100">
         <w:r>
           <w:rPr>
             <w:rStyle w:val="Hyperlink"/>
@@ -7870,7 +8051,7 @@
       <w:r>
         <w:t xml:space="preserve"> </w:t>
       </w:r>
-      <w:hyperlink r:id="rId100">
+      <w:hyperlink r:id="rId101">
         <w:r>
           <w:rPr>
             <w:rStyle w:val="Hyperlink"/>
@@ -7925,7 +8106,7 @@
       <w:r>
         <w:t xml:space="preserve"> </w:t>
       </w:r>
-      <w:hyperlink r:id="rId101">
+      <w:hyperlink r:id="rId102">
         <w:r>
           <w:rPr>
             <w:rStyle w:val="Hyperlink"/>
@@ -7966,7 +8147,7 @@
       <w:r>
         <w:t xml:space="preserve"> </w:t>
       </w:r>
-      <w:hyperlink r:id="rId102">
+      <w:hyperlink r:id="rId103">
         <w:r>
           <w:rPr>
             <w:rStyle w:val="Hyperlink"/>
@@ -8007,7 +8188,7 @@
       <w:r>
         <w:t xml:space="preserve"> </w:t>
       </w:r>
-      <w:hyperlink r:id="rId103">
+      <w:hyperlink r:id="rId104">
         <w:r>
           <w:rPr>
             <w:rStyle w:val="Hyperlink"/>
@@ -8048,7 +8229,7 @@
       <w:r>
         <w:t xml:space="preserve"> </w:t>
       </w:r>
-      <w:hyperlink r:id="rId104">
+      <w:hyperlink r:id="rId105">
         <w:r>
           <w:rPr>
             <w:rStyle w:val="Hyperlink"/>
@@ -8089,7 +8270,7 @@
       <w:r>
         <w:t xml:space="preserve"> </w:t>
       </w:r>
-      <w:hyperlink r:id="rId105">
+      <w:hyperlink r:id="rId106">
         <w:r>
           <w:rPr>
             <w:rStyle w:val="Hyperlink"/>
@@ -8130,7 +8311,7 @@
       <w:r>
         <w:t xml:space="preserve"> </w:t>
       </w:r>
-      <w:hyperlink r:id="rId106">
+      <w:hyperlink r:id="rId107">
         <w:r>
           <w:rPr>
             <w:rStyle w:val="Hyperlink"/>
@@ -8171,7 +8352,7 @@
       <w:r>
         <w:t xml:space="preserve"> </w:t>
       </w:r>
-      <w:hyperlink r:id="rId107">
+      <w:hyperlink r:id="rId108">
         <w:r>
           <w:rPr>
             <w:rStyle w:val="Hyperlink"/>
@@ -8212,7 +8393,7 @@
       <w:r>
         <w:t xml:space="preserve"> </w:t>
       </w:r>
-      <w:hyperlink r:id="rId108">
+      <w:hyperlink r:id="rId109">
         <w:r>
           <w:rPr>
             <w:rStyle w:val="Hyperlink"/>
@@ -8253,7 +8434,7 @@
       <w:r>
         <w:t xml:space="preserve"> </w:t>
       </w:r>
-      <w:hyperlink r:id="rId109">
+      <w:hyperlink r:id="rId110">
         <w:r>
           <w:rPr>
             <w:rStyle w:val="Hyperlink"/>
@@ -8294,7 +8475,7 @@
       <w:r>
         <w:t xml:space="preserve"> </w:t>
       </w:r>
-      <w:hyperlink r:id="rId110">
+      <w:hyperlink r:id="rId111">
         <w:r>
           <w:rPr>
             <w:rStyle w:val="Hyperlink"/>
@@ -8335,7 +8516,7 @@
       <w:r>
         <w:t xml:space="preserve"> </w:t>
       </w:r>
-      <w:hyperlink r:id="rId111">
+      <w:hyperlink r:id="rId112">
         <w:r>
           <w:rPr>
             <w:rStyle w:val="Hyperlink"/>
@@ -8376,7 +8557,7 @@
       <w:r>
         <w:t xml:space="preserve"> </w:t>
       </w:r>
-      <w:hyperlink r:id="rId112">
+      <w:hyperlink r:id="rId113">
         <w:r>
           <w:rPr>
             <w:rStyle w:val="Hyperlink"/>
@@ -8393,6 +8574,66 @@
         <w:pStyle w:val="BodyText"/>
       </w:pPr>
       <w:r>
+        <w:t xml:space="preserve">J. M. Mikhaeil et al.,</w:t>
+      </w:r>
+      <w:r>
+        <w:t xml:space="preserve"> </w:t>
+      </w:r>
+      <w:r>
+        <w:t xml:space="preserve">“The Sequential Nature of Science: Quantifying Learning from a Sequence of Studies,”</w:t>
+      </w:r>
+      <w:r>
+        <w:t xml:space="preserve"> </w:t>
+      </w:r>
+      <w:r>
+        <w:t xml:space="preserve">arXiv:2511.14996v1, 2025.</w:t>
+      </w:r>
+    </w:p>
+    <w:p>
+      <w:pPr>
+        <w:pStyle w:val="BodyText"/>
+      </w:pPr>
+      <w:r>
+        <w:t xml:space="preserve">Y. Li et al.,</w:t>
+      </w:r>
+      <w:r>
+        <w:t xml:space="preserve"> </w:t>
+      </w:r>
+      <w:r>
+        <w:t xml:space="preserve">“Beyond Final Scores: A Systematic Evaluation of Agents for Long-Horizon AI Research,”</w:t>
+      </w:r>
+      <w:r>
+        <w:t xml:space="preserve"> </w:t>
+      </w:r>
+      <w:r>
+        <w:t xml:space="preserve">arXiv:2608.13417v1, 2026.</w:t>
+      </w:r>
+    </w:p>
+    <w:p>
+      <w:pPr>
+        <w:pStyle w:val="BodyText"/>
+      </w:pPr>
+      <w:r>
+        <w:t xml:space="preserve">T. Nguyen,</w:t>
+      </w:r>
+      <w:r>
+        <w:t xml:space="preserve"> </w:t>
+      </w:r>
+      <w:r>
+        <w:t xml:space="preserve">“The Role of Rigor in Artificial Intelligence,”</w:t>
+      </w:r>
+      <w:r>
+        <w:t xml:space="preserve"> </w:t>
+      </w:r>
+      <w:r>
+        <w:t xml:space="preserve">arXiv:2607.03634v1, 2026.</w:t>
+      </w:r>
+    </w:p>
+    <w:p>
+      <w:pPr>
+        <w:pStyle w:val="BodyText"/>
+      </w:pPr>
+      <w:r>
         <w:t xml:space="preserve">Yanlin Fei, Nazhou Liu, Xinmiao Yu et al..</w:t>
       </w:r>
       <w:r>
@@ -8417,7 +8658,7 @@
       <w:r>
         <w:t xml:space="preserve"> </w:t>
       </w:r>
-      <w:hyperlink r:id="rId113">
+      <w:hyperlink r:id="rId114">
         <w:r>
           <w:rPr>
             <w:rStyle w:val="Hyperlink"/>
@@ -8458,7 +8699,7 @@
       <w:r>
         <w:t xml:space="preserve"> </w:t>
       </w:r>
-      <w:hyperlink r:id="rId114">
+      <w:hyperlink r:id="rId115">
         <w:r>
           <w:rPr>
             <w:rStyle w:val="Hyperlink"/>
@@ -8470,7 +8711,7 @@
         <w:t xml:space="preserve">.</w:t>
       </w:r>
     </w:p>
-    <w:bookmarkEnd w:id="115"/>
+    <w:bookmarkEnd w:id="116"/>
     <w:sectPr>
       <w:footerReference w:type="default" r:id="rIdFtr1"/>
       <w:footnotePr>

</xml_diff>

<commit_message>
feat(paper): measure episode token cost and correct the admissible cost quantity
</commit_message>
<xml_diff>
--- a/paper/word/graduation-thesis.docx
+++ b/paper/word/graduation-thesis.docx
@@ -4600,7 +4600,7 @@
     <w:bookmarkEnd w:id="48"/>
     <w:bookmarkEnd w:id="49"/>
     <w:bookmarkEnd w:id="50"/>
-    <w:bookmarkStart w:id="58" w:name="experimental-results"/>
+    <w:bookmarkStart w:id="59" w:name="experimental-results"/>
     <w:p>
       <w:pPr>
         <w:pStyle w:val="Heading1"/>
@@ -5549,12 +5549,225 @@
       </w:r>
     </w:p>
     <w:bookmarkEnd w:id="56"/>
-    <w:bookmarkStart w:id="57" w:name="X782ae78defcb34d28636704b3c8bd73b8faa49a"/>
+    <w:bookmarkStart w:id="57" w:name="X42317cab83810faed9ffbcecb56b1863e844079"/>
     <w:p>
       <w:pPr>
         <w:pStyle w:val="Heading2"/>
       </w:pPr>
       <w:r>
+        <w:t xml:space="preserve">Measuring episode cost instead of proxying it</w:t>
+      </w:r>
+    </w:p>
+    <w:p>
+      <w:pPr>
+        <w:pStyle w:val="FirstParagraph"/>
+      </w:pPr>
+      <w:r>
+        <w:t xml:space="preserve">The pilot recorded token accounting as unmeasured, because the headless text mode</w:t>
+      </w:r>
+      <w:r>
+        <w:t xml:space="preserve"> </w:t>
+      </w:r>
+      <w:r>
+        <w:t xml:space="preserve">emits no usage record, and retained wall-clock duration as a proxy. That proxy was</w:t>
+      </w:r>
+      <w:r>
+        <w:t xml:space="preserve"> </w:t>
+      </w:r>
+      <w:r>
+        <w:t xml:space="preserve">replaced by measurement. The runner was switched to a structured output mode and a</w:t>
+      </w:r>
+      <w:r>
+        <w:t xml:space="preserve"> </w:t>
+      </w:r>
+      <w:r>
+        <w:t xml:space="preserve">committed parser, covered by eleven fixtures, reads the usage stream. One fixture</w:t>
+      </w:r>
+      <w:r>
+        <w:t xml:space="preserve"> </w:t>
+      </w:r>
+      <w:r>
+        <w:t xml:space="preserve">exists because usage is reported repeatedly and grows monotonically, so summing the</w:t>
+      </w:r>
+      <w:r>
+        <w:t xml:space="preserve"> </w:t>
+      </w:r>
+      <w:r>
+        <w:t xml:space="preserve">records would overcount the true total.</w:t>
+      </w:r>
+    </w:p>
+    <w:p>
+      <w:pPr>
+        <w:pStyle w:val="BodyText"/>
+      </w:pPr>
+      <w:r>
+        <w:t xml:space="preserve">Three probes on the pinned backend produced a result that changes how cost must be</w:t>
+      </w:r>
+      <w:r>
+        <w:t xml:space="preserve"> </w:t>
+      </w:r>
+      <w:r>
+        <w:t xml:space="preserve">reported. A fixed context floor of</w:t>
+      </w:r>
+      <w:r>
+        <w:t xml:space="preserve"> </w:t>
+      </w:r>
+      <m:oMath>
+        <m:r>
+          <m:t>46</m:t>
+        </m:r>
+        <m:r>
+          <m:rPr>
+            <m:sty m:val="p"/>
+          </m:rPr>
+          <m:t>,</m:t>
+        </m:r>
+        <m:r>
+          <m:t>763</m:t>
+        </m:r>
+      </m:oMath>
+      <w:r>
+        <w:t xml:space="preserve"> </w:t>
+      </w:r>
+      <w:r>
+        <w:t xml:space="preserve">tokens appeared identically in every</w:t>
+      </w:r>
+      <w:r>
+        <w:t xml:space="preserve"> </w:t>
+      </w:r>
+      <w:r>
+        <w:t xml:space="preserve">probe, while the work itself ranged from</w:t>
+      </w:r>
+      <w:r>
+        <w:t xml:space="preserve"> </w:t>
+      </w:r>
+      <m:oMath>
+        <m:r>
+          <m:t>39</m:t>
+        </m:r>
+      </m:oMath>
+      <w:r>
+        <w:t xml:space="preserve"> </w:t>
+      </w:r>
+      <w:r>
+        <w:t xml:space="preserve">to</w:t>
+      </w:r>
+      <w:r>
+        <w:t xml:space="preserve"> </w:t>
+      </w:r>
+      <m:oMath>
+        <m:r>
+          <m:t>384</m:t>
+        </m:r>
+      </m:oMath>
+      <w:r>
+        <w:t xml:space="preserve"> </w:t>
+      </w:r>
+      <w:r>
+        <w:t xml:space="preserve">output tokens. Dollar cost for</w:t>
+      </w:r>
+      <w:r>
+        <w:t xml:space="preserve"> </w:t>
+      </w:r>
+      <w:r>
+        <w:t xml:space="preserve">the same trivial task differed by a factor of</w:t>
+      </w:r>
+      <w:r>
+        <w:t xml:space="preserve"> </w:t>
+      </w:r>
+      <m:oMath>
+        <m:r>
+          <m:t>12.03</m:t>
+        </m:r>
+      </m:oMath>
+      <w:r>
+        <w:t xml:space="preserve"> </w:t>
+      </w:r>
+      <w:r>
+        <w:t xml:space="preserve">between a cold and a warm</w:t>
+      </w:r>
+      <w:r>
+        <w:t xml:space="preserve"> </w:t>
+      </w:r>
+      <w:r>
+        <w:t xml:space="preserve">cache. Cache state depends on the order in which episodes run, not on the condition</w:t>
+      </w:r>
+      <w:r>
+        <w:t xml:space="preserve"> </w:t>
+      </w:r>
+      <w:r>
+        <w:t xml:space="preserve">under test, and a comparison measured on totals would put the condition contrast at</w:t>
+      </w:r>
+      <w:r>
+        <w:t xml:space="preserve"> </w:t>
+      </w:r>
+      <w:r>
+        <w:t xml:space="preserve">roughly one percent of the reported quantity.</w:t>
+      </w:r>
+    </w:p>
+    <w:p>
+      <w:pPr>
+        <w:pStyle w:val="BodyText"/>
+      </w:pPr>
+      <w:r>
+        <w:t xml:space="preserve">Cost is therefore reported as marginal input plus output tokens, with the fixed</w:t>
+      </w:r>
+      <w:r>
+        <w:t xml:space="preserve"> </w:t>
+      </w:r>
+      <w:r>
+        <w:t xml:space="preserve">harness floor reported separately as a constant, and neither dollar cost nor</w:t>
+      </w:r>
+      <w:r>
+        <w:t xml:space="preserve"> </w:t>
+      </w:r>
+      <w:r>
+        <w:t xml:space="preserve">duration is used to compare conditions. This is consistent with evidence that agent</w:t>
+      </w:r>
+      <w:r>
+        <w:t xml:space="preserve"> </w:t>
+      </w:r>
+      <w:r>
+        <w:t xml:space="preserve">cost is carried differently by input tokens, output tokens, context, cache, and</w:t>
+      </w:r>
+      <w:r>
+        <w:t xml:space="preserve"> </w:t>
+      </w:r>
+      <w:r>
+        <w:t xml:space="preserve">price [56], and that provider-reported totals can conceal</w:t>
+      </w:r>
+      <w:r>
+        <w:t xml:space="preserve"> </w:t>
+      </w:r>
+      <w:r>
+        <w:t xml:space="preserve">materially different accounting [57]. It also records a</w:t>
+      </w:r>
+      <w:r>
+        <w:t xml:space="preserve"> </w:t>
+      </w:r>
+      <w:r>
+        <w:t xml:space="preserve">condition on any future effect claim from this design: augmentation gains have been</w:t>
+      </w:r>
+      <w:r>
+        <w:t xml:space="preserve"> </w:t>
+      </w:r>
+      <w:r>
+        <w:t xml:space="preserve">shown to vanish against a token-matched baseline [58], so a</w:t>
+      </w:r>
+      <w:r>
+        <w:t xml:space="preserve"> </w:t>
+      </w:r>
+      <w:r>
+        <w:t xml:space="preserve">comparison here must be budget-matched and not merely condition-matched.</w:t>
+      </w:r>
+    </w:p>
+    <w:bookmarkEnd w:id="57"/>
+    <w:bookmarkStart w:id="58" w:name="X782ae78defcb34d28636704b3c8bd73b8faa49a"/>
+    <w:p>
+      <w:pPr>
+        <w:pStyle w:val="Heading2"/>
+      </w:pPr>
+      <w:r>
         <w:t xml:space="preserve">A census of the project’s own decision record</w:t>
       </w:r>
     </w:p>
@@ -5587,7 +5800,7 @@
         <w:t xml:space="preserve"> </w:t>
       </w:r>
       <w:r>
-        <w:t xml:space="preserve">lists are read [56]. Measured against the ledger digest recorded in</w:t>
+        <w:t xml:space="preserve">lists are read [59]. Measured against the ledger digest recorded in</w:t>
       </w:r>
       <w:r>
         <w:t xml:space="preserve"> </w:t>
@@ -5714,7 +5927,7 @@
         <w:t xml:space="preserve"> </w:t>
       </w:r>
       <w:r>
-        <w:t xml:space="preserve">scores calls for [57], and it is also the boundary of what</w:t>
+        <w:t xml:space="preserve">scores calls for [60], and it is also the boundary of what</w:t>
       </w:r>
       <w:r>
         <w:t xml:space="preserve"> </w:t>
@@ -5726,12 +5939,12 @@
         <w:t xml:space="preserve"> </w:t>
       </w:r>
       <w:r>
-        <w:t xml:space="preserve">substitutes for understanding rather than supplying it [58].</w:t>
-      </w:r>
-    </w:p>
-    <w:bookmarkEnd w:id="57"/>
+        <w:t xml:space="preserve">substitutes for understanding rather than supplying it [61].</w:t>
+      </w:r>
+    </w:p>
     <w:bookmarkEnd w:id="58"/>
-    <w:bookmarkStart w:id="116" w:name="conclusions"/>
+    <w:bookmarkEnd w:id="59"/>
+    <w:bookmarkStart w:id="117" w:name="conclusions"/>
     <w:p>
       <w:pPr>
         <w:pStyle w:val="Heading1"/>
@@ -5875,7 +6088,7 @@
         <w:t xml:space="preserve"> </w:t>
       </w:r>
       <w:r>
-        <w:t xml:space="preserve">single terminal score [59].</w:t>
+        <w:t xml:space="preserve">single terminal score [62].</w:t>
       </w:r>
     </w:p>
     <w:p>
@@ -5957,7 +6170,7 @@
         <w:t xml:space="preserve"> </w:t>
       </w:r>
       <w:r>
-        <w:t xml:space="preserve">[60]; this project spent 192 model calls to verify 32</w:t>
+        <w:t xml:space="preserve">[63]; this project spent 192 model calls to verify 32</w:t>
       </w:r>
       <w:r>
         <w:t xml:space="preserve"> </w:t>
@@ -6015,7 +6228,7 @@
       <w:r>
         <w:t xml:space="preserve"> </w:t>
       </w:r>
-      <w:hyperlink r:id="rId59">
+      <w:hyperlink r:id="rId60">
         <w:r>
           <w:rPr>
             <w:rStyle w:val="Hyperlink"/>
@@ -6062,7 +6275,7 @@
       <w:r>
         <w:t xml:space="preserve"> </w:t>
       </w:r>
-      <w:hyperlink r:id="rId60">
+      <w:hyperlink r:id="rId61">
         <w:r>
           <w:rPr>
             <w:rStyle w:val="Hyperlink"/>
@@ -6103,7 +6316,7 @@
       <w:r>
         <w:t xml:space="preserve"> </w:t>
       </w:r>
-      <w:hyperlink r:id="rId61">
+      <w:hyperlink r:id="rId62">
         <w:r>
           <w:rPr>
             <w:rStyle w:val="Hyperlink"/>
@@ -6156,7 +6369,7 @@
       <w:r>
         <w:t xml:space="preserve"> </w:t>
       </w:r>
-      <w:hyperlink r:id="rId62">
+      <w:hyperlink r:id="rId63">
         <w:r>
           <w:rPr>
             <w:rStyle w:val="Hyperlink"/>
@@ -6197,7 +6410,7 @@
       <w:r>
         <w:t xml:space="preserve"> </w:t>
       </w:r>
-      <w:hyperlink r:id="rId63">
+      <w:hyperlink r:id="rId64">
         <w:r>
           <w:rPr>
             <w:rStyle w:val="Hyperlink"/>
@@ -6238,7 +6451,7 @@
       <w:r>
         <w:t xml:space="preserve"> </w:t>
       </w:r>
-      <w:hyperlink r:id="rId64">
+      <w:hyperlink r:id="rId65">
         <w:r>
           <w:rPr>
             <w:rStyle w:val="Hyperlink"/>
@@ -6279,7 +6492,7 @@
       <w:r>
         <w:t xml:space="preserve"> </w:t>
       </w:r>
-      <w:hyperlink r:id="rId65">
+      <w:hyperlink r:id="rId66">
         <w:r>
           <w:rPr>
             <w:rStyle w:val="Hyperlink"/>
@@ -6320,7 +6533,7 @@
       <w:r>
         <w:t xml:space="preserve"> </w:t>
       </w:r>
-      <w:hyperlink r:id="rId66">
+      <w:hyperlink r:id="rId67">
         <w:r>
           <w:rPr>
             <w:rStyle w:val="Hyperlink"/>
@@ -6361,7 +6574,7 @@
       <w:r>
         <w:t xml:space="preserve"> </w:t>
       </w:r>
-      <w:hyperlink r:id="rId67">
+      <w:hyperlink r:id="rId68">
         <w:r>
           <w:rPr>
             <w:rStyle w:val="Hyperlink"/>
@@ -6408,7 +6621,7 @@
       <w:r>
         <w:t xml:space="preserve"> </w:t>
       </w:r>
-      <w:hyperlink r:id="rId68">
+      <w:hyperlink r:id="rId69">
         <w:r>
           <w:rPr>
             <w:rStyle w:val="Hyperlink"/>
@@ -6473,7 +6686,7 @@
       <w:r>
         <w:t xml:space="preserve"> </w:t>
       </w:r>
-      <w:hyperlink r:id="rId69">
+      <w:hyperlink r:id="rId70">
         <w:r>
           <w:rPr>
             <w:rStyle w:val="Hyperlink"/>
@@ -6514,7 +6727,7 @@
       <w:r>
         <w:t xml:space="preserve"> </w:t>
       </w:r>
-      <w:hyperlink r:id="rId70">
+      <w:hyperlink r:id="rId71">
         <w:r>
           <w:rPr>
             <w:rStyle w:val="Hyperlink"/>
@@ -6569,7 +6782,7 @@
       <w:r>
         <w:t xml:space="preserve"> </w:t>
       </w:r>
-      <w:hyperlink r:id="rId71">
+      <w:hyperlink r:id="rId72">
         <w:r>
           <w:rPr>
             <w:rStyle w:val="Hyperlink"/>
@@ -6616,7 +6829,7 @@
       <w:r>
         <w:t xml:space="preserve"> </w:t>
       </w:r>
-      <w:hyperlink r:id="rId72">
+      <w:hyperlink r:id="rId73">
         <w:r>
           <w:rPr>
             <w:rStyle w:val="Hyperlink"/>
@@ -6671,7 +6884,7 @@
       <w:r>
         <w:t xml:space="preserve"> </w:t>
       </w:r>
-      <w:hyperlink r:id="rId73">
+      <w:hyperlink r:id="rId74">
         <w:r>
           <w:rPr>
             <w:rStyle w:val="Hyperlink"/>
@@ -6726,7 +6939,7 @@
       <w:r>
         <w:t xml:space="preserve"> </w:t>
       </w:r>
-      <w:hyperlink r:id="rId74">
+      <w:hyperlink r:id="rId75">
         <w:r>
           <w:rPr>
             <w:rStyle w:val="Hyperlink"/>
@@ -6767,7 +6980,7 @@
       <w:r>
         <w:t xml:space="preserve"> </w:t>
       </w:r>
-      <w:hyperlink r:id="rId75">
+      <w:hyperlink r:id="rId76">
         <w:r>
           <w:rPr>
             <w:rStyle w:val="Hyperlink"/>
@@ -6808,7 +7021,7 @@
       <w:r>
         <w:t xml:space="preserve"> </w:t>
       </w:r>
-      <w:hyperlink r:id="rId76">
+      <w:hyperlink r:id="rId77">
         <w:r>
           <w:rPr>
             <w:rStyle w:val="Hyperlink"/>
@@ -6863,7 +7076,7 @@
       <w:r>
         <w:t xml:space="preserve"> </w:t>
       </w:r>
-      <w:hyperlink r:id="rId77">
+      <w:hyperlink r:id="rId78">
         <w:r>
           <w:rPr>
             <w:rStyle w:val="Hyperlink"/>
@@ -6918,7 +7131,7 @@
       <w:r>
         <w:t xml:space="preserve"> </w:t>
       </w:r>
-      <w:hyperlink r:id="rId78">
+      <w:hyperlink r:id="rId79">
         <w:r>
           <w:rPr>
             <w:rStyle w:val="Hyperlink"/>
@@ -6973,7 +7186,7 @@
       <w:r>
         <w:t xml:space="preserve"> </w:t>
       </w:r>
-      <w:hyperlink r:id="rId79">
+      <w:hyperlink r:id="rId80">
         <w:r>
           <w:rPr>
             <w:rStyle w:val="Hyperlink"/>
@@ -7028,7 +7241,7 @@
       <w:r>
         <w:t xml:space="preserve"> </w:t>
       </w:r>
-      <w:hyperlink r:id="rId80">
+      <w:hyperlink r:id="rId81">
         <w:r>
           <w:rPr>
             <w:rStyle w:val="Hyperlink"/>
@@ -7083,7 +7296,7 @@
       <w:r>
         <w:t xml:space="preserve"> </w:t>
       </w:r>
-      <w:hyperlink r:id="rId81">
+      <w:hyperlink r:id="rId82">
         <w:r>
           <w:rPr>
             <w:rStyle w:val="Hyperlink"/>
@@ -7138,7 +7351,7 @@
       <w:r>
         <w:t xml:space="preserve"> </w:t>
       </w:r>
-      <w:hyperlink r:id="rId82">
+      <w:hyperlink r:id="rId83">
         <w:r>
           <w:rPr>
             <w:rStyle w:val="Hyperlink"/>
@@ -7179,7 +7392,7 @@
       <w:r>
         <w:t xml:space="preserve"> </w:t>
       </w:r>
-      <w:hyperlink r:id="rId83">
+      <w:hyperlink r:id="rId84">
         <w:r>
           <w:rPr>
             <w:rStyle w:val="Hyperlink"/>
@@ -7220,7 +7433,7 @@
       <w:r>
         <w:t xml:space="preserve"> </w:t>
       </w:r>
-      <w:hyperlink r:id="rId84">
+      <w:hyperlink r:id="rId85">
         <w:r>
           <w:rPr>
             <w:rStyle w:val="Hyperlink"/>
@@ -7261,7 +7474,7 @@
       <w:r>
         <w:t xml:space="preserve"> </w:t>
       </w:r>
-      <w:hyperlink r:id="rId85">
+      <w:hyperlink r:id="rId86">
         <w:r>
           <w:rPr>
             <w:rStyle w:val="Hyperlink"/>
@@ -7316,7 +7529,7 @@
       <w:r>
         <w:t xml:space="preserve"> </w:t>
       </w:r>
-      <w:hyperlink r:id="rId86">
+      <w:hyperlink r:id="rId87">
         <w:r>
           <w:rPr>
             <w:rStyle w:val="Hyperlink"/>
@@ -7357,7 +7570,7 @@
       <w:r>
         <w:t xml:space="preserve"> </w:t>
       </w:r>
-      <w:hyperlink r:id="rId87">
+      <w:hyperlink r:id="rId88">
         <w:r>
           <w:rPr>
             <w:rStyle w:val="Hyperlink"/>
@@ -7412,7 +7625,7 @@
       <w:r>
         <w:t xml:space="preserve"> </w:t>
       </w:r>
-      <w:hyperlink r:id="rId88">
+      <w:hyperlink r:id="rId89">
         <w:r>
           <w:rPr>
             <w:rStyle w:val="Hyperlink"/>
@@ -7465,7 +7678,7 @@
       <w:r>
         <w:t xml:space="preserve"> </w:t>
       </w:r>
-      <w:hyperlink r:id="rId89">
+      <w:hyperlink r:id="rId90">
         <w:r>
           <w:rPr>
             <w:rStyle w:val="Hyperlink"/>
@@ -7520,7 +7733,7 @@
       <w:r>
         <w:t xml:space="preserve"> </w:t>
       </w:r>
-      <w:hyperlink r:id="rId90">
+      <w:hyperlink r:id="rId91">
         <w:r>
           <w:rPr>
             <w:rStyle w:val="Hyperlink"/>
@@ -7575,7 +7788,7 @@
       <w:r>
         <w:t xml:space="preserve"> </w:t>
       </w:r>
-      <w:hyperlink r:id="rId91">
+      <w:hyperlink r:id="rId92">
         <w:r>
           <w:rPr>
             <w:rStyle w:val="Hyperlink"/>
@@ -7616,7 +7829,7 @@
       <w:r>
         <w:t xml:space="preserve"> </w:t>
       </w:r>
-      <w:hyperlink r:id="rId92">
+      <w:hyperlink r:id="rId93">
         <w:r>
           <w:rPr>
             <w:rStyle w:val="Hyperlink"/>
@@ -7671,7 +7884,7 @@
       <w:r>
         <w:t xml:space="preserve"> </w:t>
       </w:r>
-      <w:hyperlink r:id="rId93">
+      <w:hyperlink r:id="rId94">
         <w:r>
           <w:rPr>
             <w:rStyle w:val="Hyperlink"/>
@@ -7726,7 +7939,7 @@
       <w:r>
         <w:t xml:space="preserve"> </w:t>
       </w:r>
-      <w:hyperlink r:id="rId94">
+      <w:hyperlink r:id="rId95">
         <w:r>
           <w:rPr>
             <w:rStyle w:val="Hyperlink"/>
@@ -7773,7 +7986,7 @@
       <w:r>
         <w:t xml:space="preserve"> </w:t>
       </w:r>
-      <w:hyperlink r:id="rId95">
+      <w:hyperlink r:id="rId96">
         <w:r>
           <w:rPr>
             <w:rStyle w:val="Hyperlink"/>
@@ -7814,7 +8027,7 @@
       <w:r>
         <w:t xml:space="preserve"> </w:t>
       </w:r>
-      <w:hyperlink r:id="rId96">
+      <w:hyperlink r:id="rId97">
         <w:r>
           <w:rPr>
             <w:rStyle w:val="Hyperlink"/>
@@ -7869,7 +8082,7 @@
       <w:r>
         <w:t xml:space="preserve"> </w:t>
       </w:r>
-      <w:hyperlink r:id="rId97">
+      <w:hyperlink r:id="rId98">
         <w:r>
           <w:rPr>
             <w:rStyle w:val="Hyperlink"/>
@@ -7910,7 +8123,7 @@
       <w:r>
         <w:t xml:space="preserve"> </w:t>
       </w:r>
-      <w:hyperlink r:id="rId98">
+      <w:hyperlink r:id="rId99">
         <w:r>
           <w:rPr>
             <w:rStyle w:val="Hyperlink"/>
@@ -7957,7 +8170,7 @@
       <w:r>
         <w:t xml:space="preserve"> </w:t>
       </w:r>
-      <w:hyperlink r:id="rId99">
+      <w:hyperlink r:id="rId100">
         <w:r>
           <w:rPr>
             <w:rStyle w:val="Hyperlink"/>
@@ -8004,7 +8217,7 @@
       <w:r>
         <w:t xml:space="preserve"> </w:t>
       </w:r>
-      <w:hyperlink r:id="rId100">
+      <w:hyperlink r:id="rId101">
         <w:r>
           <w:rPr>
             <w:rStyle w:val="Hyperlink"/>
@@ -8051,7 +8264,7 @@
       <w:r>
         <w:t xml:space="preserve"> </w:t>
       </w:r>
-      <w:hyperlink r:id="rId101">
+      <w:hyperlink r:id="rId102">
         <w:r>
           <w:rPr>
             <w:rStyle w:val="Hyperlink"/>
@@ -8106,7 +8319,7 @@
       <w:r>
         <w:t xml:space="preserve"> </w:t>
       </w:r>
-      <w:hyperlink r:id="rId102">
+      <w:hyperlink r:id="rId103">
         <w:r>
           <w:rPr>
             <w:rStyle w:val="Hyperlink"/>
@@ -8147,7 +8360,7 @@
       <w:r>
         <w:t xml:space="preserve"> </w:t>
       </w:r>
-      <w:hyperlink r:id="rId103">
+      <w:hyperlink r:id="rId104">
         <w:r>
           <w:rPr>
             <w:rStyle w:val="Hyperlink"/>
@@ -8188,7 +8401,7 @@
       <w:r>
         <w:t xml:space="preserve"> </w:t>
       </w:r>
-      <w:hyperlink r:id="rId104">
+      <w:hyperlink r:id="rId105">
         <w:r>
           <w:rPr>
             <w:rStyle w:val="Hyperlink"/>
@@ -8229,7 +8442,7 @@
       <w:r>
         <w:t xml:space="preserve"> </w:t>
       </w:r>
-      <w:hyperlink r:id="rId105">
+      <w:hyperlink r:id="rId106">
         <w:r>
           <w:rPr>
             <w:rStyle w:val="Hyperlink"/>
@@ -8270,7 +8483,7 @@
       <w:r>
         <w:t xml:space="preserve"> </w:t>
       </w:r>
-      <w:hyperlink r:id="rId106">
+      <w:hyperlink r:id="rId107">
         <w:r>
           <w:rPr>
             <w:rStyle w:val="Hyperlink"/>
@@ -8311,7 +8524,7 @@
       <w:r>
         <w:t xml:space="preserve"> </w:t>
       </w:r>
-      <w:hyperlink r:id="rId107">
+      <w:hyperlink r:id="rId108">
         <w:r>
           <w:rPr>
             <w:rStyle w:val="Hyperlink"/>
@@ -8352,7 +8565,7 @@
       <w:r>
         <w:t xml:space="preserve"> </w:t>
       </w:r>
-      <w:hyperlink r:id="rId108">
+      <w:hyperlink r:id="rId109">
         <w:r>
           <w:rPr>
             <w:rStyle w:val="Hyperlink"/>
@@ -8393,7 +8606,7 @@
       <w:r>
         <w:t xml:space="preserve"> </w:t>
       </w:r>
-      <w:hyperlink r:id="rId109">
+      <w:hyperlink r:id="rId110">
         <w:r>
           <w:rPr>
             <w:rStyle w:val="Hyperlink"/>
@@ -8434,7 +8647,7 @@
       <w:r>
         <w:t xml:space="preserve"> </w:t>
       </w:r>
-      <w:hyperlink r:id="rId110">
+      <w:hyperlink r:id="rId111">
         <w:r>
           <w:rPr>
             <w:rStyle w:val="Hyperlink"/>
@@ -8475,7 +8688,7 @@
       <w:r>
         <w:t xml:space="preserve"> </w:t>
       </w:r>
-      <w:hyperlink r:id="rId111">
+      <w:hyperlink r:id="rId112">
         <w:r>
           <w:rPr>
             <w:rStyle w:val="Hyperlink"/>
@@ -8516,7 +8729,7 @@
       <w:r>
         <w:t xml:space="preserve"> </w:t>
       </w:r>
-      <w:hyperlink r:id="rId112">
+      <w:hyperlink r:id="rId113">
         <w:r>
           <w:rPr>
             <w:rStyle w:val="Hyperlink"/>
@@ -8557,7 +8770,7 @@
       <w:r>
         <w:t xml:space="preserve"> </w:t>
       </w:r>
-      <w:hyperlink r:id="rId113">
+      <w:hyperlink r:id="rId114">
         <w:r>
           <w:rPr>
             <w:rStyle w:val="Hyperlink"/>
@@ -8574,6 +8787,66 @@
         <w:pStyle w:val="BodyText"/>
       </w:pPr>
       <w:r>
+        <w:t xml:space="preserve">S. Weinberger et al.,</w:t>
+      </w:r>
+      <w:r>
+        <w:t xml:space="preserve"> </w:t>
+      </w:r>
+      <w:r>
+        <w:t xml:space="preserve">“Prompt-Induced Waste in Coding Agents: Reasoning, Effort, Harness Design, and Energy,”</w:t>
+      </w:r>
+      <w:r>
+        <w:t xml:space="preserve"> </w:t>
+      </w:r>
+      <w:r>
+        <w:t xml:space="preserve">arXiv:2608.01347v5, 2026.</w:t>
+      </w:r>
+    </w:p>
+    <w:p>
+      <w:pPr>
+        <w:pStyle w:val="BodyText"/>
+      </w:pPr>
+      <w:r>
+        <w:t xml:space="preserve">R. Bhalgami et al.,</w:t>
+      </w:r>
+      <w:r>
+        <w:t xml:space="preserve"> </w:t>
+      </w:r>
+      <w:r>
+        <w:t xml:space="preserve">“Pixels for Programs? A Cross-Provider Case Study of Input-Token Accounting for Source Code as Text and Images,”</w:t>
+      </w:r>
+      <w:r>
+        <w:t xml:space="preserve"> </w:t>
+      </w:r>
+      <w:r>
+        <w:t xml:space="preserve">arXiv:2607.21672v1, 2026.</w:t>
+      </w:r>
+    </w:p>
+    <w:p>
+      <w:pPr>
+        <w:pStyle w:val="BodyText"/>
+      </w:pPr>
+      <w:r>
+        <w:t xml:space="preserve">S. Hajimiri et al.,</w:t>
+      </w:r>
+      <w:r>
+        <w:t xml:space="preserve"> </w:t>
+      </w:r>
+      <w:r>
+        <w:t xml:space="preserve">“Are Online Skill and Memory Modules Always Worth Their Tokens? A Budget-Constrained Re-Evaluation,”</w:t>
+      </w:r>
+      <w:r>
+        <w:t xml:space="preserve"> </w:t>
+      </w:r>
+      <w:r>
+        <w:t xml:space="preserve">arXiv:2606.15017v2, 2026.</w:t>
+      </w:r>
+    </w:p>
+    <w:p>
+      <w:pPr>
+        <w:pStyle w:val="BodyText"/>
+      </w:pPr>
+      <w:r>
         <w:t xml:space="preserve">J. M. Mikhaeil et al.,</w:t>
       </w:r>
       <w:r>
@@ -8658,7 +8931,7 @@
       <w:r>
         <w:t xml:space="preserve"> </w:t>
       </w:r>
-      <w:hyperlink r:id="rId114">
+      <w:hyperlink r:id="rId115">
         <w:r>
           <w:rPr>
             <w:rStyle w:val="Hyperlink"/>
@@ -8699,7 +8972,7 @@
       <w:r>
         <w:t xml:space="preserve"> </w:t>
       </w:r>
-      <w:hyperlink r:id="rId115">
+      <w:hyperlink r:id="rId116">
         <w:r>
           <w:rPr>
             <w:rStyle w:val="Hyperlink"/>
@@ -8711,7 +8984,7 @@
         <w:t xml:space="preserve">.</w:t>
       </w:r>
     </w:p>
-    <w:bookmarkEnd w:id="116"/>
+    <w:bookmarkEnd w:id="117"/>
     <w:sectPr>
       <w:footerReference w:type="default" r:id="rIdFtr1"/>
       <w:footnotePr>

</xml_diff>

<commit_message>
fix(paper): falsify the fixed-floor cost decision on real episodes
</commit_message>
<xml_diff>
--- a/paper/word/graduation-thesis.docx
+++ b/paper/word/graduation-thesis.docx
@@ -5710,19 +5710,208 @@
         <w:pStyle w:val="BodyText"/>
       </w:pPr>
       <w:r>
-        <w:t xml:space="preserve">Cost is therefore reported as marginal input plus output tokens, with the fixed</w:t>
-      </w:r>
-      <w:r>
-        <w:t xml:space="preserve"> </w:t>
-      </w:r>
-      <w:r>
-        <w:t xml:space="preserve">harness floor reported separately as a constant, and neither dollar cost nor</w:t>
-      </w:r>
-      <w:r>
-        <w:t xml:space="preserve"> </w:t>
-      </w:r>
-      <w:r>
-        <w:t xml:space="preserve">duration is used to compare conditions. This is consistent with evidence that agent</w:t>
+        <w:t xml:space="preserve">That conclusion was wrong, and the next cycle’s measurement refuted it. Repeating</w:t>
+      </w:r>
+      <w:r>
+        <w:t xml:space="preserve"> </w:t>
+      </w:r>
+      <w:r>
+        <w:t xml:space="preserve">the measurement on real episodes rather than probes showed that the floor is not a</w:t>
+      </w:r>
+      <w:r>
+        <w:t xml:space="preserve"> </w:t>
+      </w:r>
+      <w:r>
+        <w:t xml:space="preserve">constant. One burned task was run once in the minimal condition and once in the full</w:t>
+      </w:r>
+      <w:r>
+        <w:t xml:space="preserve"> </w:t>
+      </w:r>
+      <w:r>
+        <w:t xml:space="preserve">condition. Context tokens were</w:t>
+      </w:r>
+      <w:r>
+        <w:t xml:space="preserve"> </w:t>
+      </w:r>
+      <m:oMath>
+        <m:r>
+          <m:t>51</m:t>
+        </m:r>
+        <m:r>
+          <m:rPr>
+            <m:sty m:val="p"/>
+          </m:rPr>
+          <m:t>,</m:t>
+        </m:r>
+        <m:r>
+          <m:t>596</m:t>
+        </m:r>
+      </m:oMath>
+      <w:r>
+        <w:t xml:space="preserve"> </w:t>
+      </w:r>
+      <w:r>
+        <w:t xml:space="preserve">and</w:t>
+      </w:r>
+      <w:r>
+        <w:t xml:space="preserve"> </w:t>
+      </w:r>
+      <m:oMath>
+        <m:r>
+          <m:t>76</m:t>
+        </m:r>
+        <m:r>
+          <m:rPr>
+            <m:sty m:val="p"/>
+          </m:rPr>
+          <m:t>,</m:t>
+        </m:r>
+        <m:r>
+          <m:t>496</m:t>
+        </m:r>
+      </m:oMath>
+      <w:r>
+        <w:t xml:space="preserve">, a difference of</w:t>
+      </w:r>
+      <w:r>
+        <w:t xml:space="preserve"> </w:t>
+      </w:r>
+      <m:oMath>
+        <m:r>
+          <m:t>24</m:t>
+        </m:r>
+        <m:r>
+          <m:rPr>
+            <m:sty m:val="p"/>
+          </m:rPr>
+          <m:t>,</m:t>
+        </m:r>
+        <m:r>
+          <m:t>900</m:t>
+        </m:r>
+      </m:oMath>
+      <w:r>
+        <w:t xml:space="preserve">,</w:t>
+      </w:r>
+      <w:r>
+        <w:t xml:space="preserve"> </w:t>
+      </w:r>
+      <w:r>
+        <w:t xml:space="preserve">and totals differed by a factor of</w:t>
+      </w:r>
+      <w:r>
+        <w:t xml:space="preserve"> </w:t>
+      </w:r>
+      <m:oMath>
+        <m:r>
+          <m:t>1.487</m:t>
+        </m:r>
+      </m:oMath>
+      <w:r>
+        <w:t xml:space="preserve">. The probes had run in an empty directory,</w:t>
+      </w:r>
+      <w:r>
+        <w:t xml:space="preserve"> </w:t>
+      </w:r>
+      <w:r>
+        <w:t xml:space="preserve">so the floor they measured was the harness context alone; a real episode also carries</w:t>
+      </w:r>
+      <w:r>
+        <w:t xml:space="preserve"> </w:t>
+      </w:r>
+      <w:r>
+        <w:t xml:space="preserve">its mounted workspace, and the full condition mounts an evidence pack of</w:t>
+      </w:r>
+      <w:r>
+        <w:t xml:space="preserve"> </w:t>
+      </w:r>
+      <m:oMath>
+        <m:r>
+          <m:t>145</m:t>
+        </m:r>
+        <m:r>
+          <m:rPr>
+            <m:sty m:val="p"/>
+          </m:rPr>
+          <m:t>,</m:t>
+        </m:r>
+        <m:r>
+          <m:t>906</m:t>
+        </m:r>
+      </m:oMath>
+      <w:r>
+        <w:t xml:space="preserve"> </w:t>
+      </w:r>
+      <w:r>
+        <w:t xml:space="preserve">bytes. The pre-registered falsifier of the previous decision fired, and that decision</w:t>
+      </w:r>
+      <w:r>
+        <w:t xml:space="preserve"> </w:t>
+      </w:r>
+      <w:r>
+        <w:t xml:space="preserve">is recorded as falsified rather than quietly amended.</w:t>
+      </w:r>
+    </w:p>
+    <w:p>
+      <w:pPr>
+        <w:pStyle w:val="BodyText"/>
+      </w:pPr>
+      <w:r>
+        <w:t xml:space="preserve">Cost is therefore reported as two separate quantities per episode, context tokens and</w:t>
+      </w:r>
+      <w:r>
+        <w:t xml:space="preserve"> </w:t>
+      </w:r>
+      <w:r>
+        <w:t xml:space="preserve">marginal tokens, with neither treated as constant. Dollar cost remains excluded from</w:t>
+      </w:r>
+      <w:r>
+        <w:t xml:space="preserve"> </w:t>
+      </w:r>
+      <w:r>
+        <w:t xml:space="preserve">comparisons because it still varies with cache state. Two limits are attached. The two</w:t>
+      </w:r>
+      <w:r>
+        <w:t xml:space="preserve"> </w:t>
+      </w:r>
+      <w:r>
+        <w:t xml:space="preserve">episodes differ in both factors at once and each condition ran once, so nothing here</w:t>
+      </w:r>
+      <w:r>
+        <w:t xml:space="preserve"> </w:t>
+      </w:r>
+      <w:r>
+        <w:t xml:space="preserve">attributes cost to retrieval or to the scaffold separately; one run scores one</w:t>
+      </w:r>
+      <w:r>
+        <w:t xml:space="preserve"> </w:t>
+      </w:r>
+      <w:r>
+        <w:t xml:space="preserve">implementation and cannot separate an idea from its realisation</w:t>
+      </w:r>
+      <w:r>
+        <w:t xml:space="preserve"> </w:t>
+      </w:r>
+      <w:r>
+        <w:t xml:space="preserve">[56]. And cost belongs beside the endpoint rather than behind it,</w:t>
+      </w:r>
+      <w:r>
+        <w:t xml:space="preserve"> </w:t>
+      </w:r>
+      <w:r>
+        <w:t xml:space="preserve">since a change can raise interaction cost in ways task completion does not reveal</w:t>
+      </w:r>
+      <w:r>
+        <w:t xml:space="preserve"> </w:t>
+      </w:r>
+      <w:r>
+        <w:t xml:space="preserve">[57], while caching alters money without altering work</w:t>
+      </w:r>
+      <w:r>
+        <w:t xml:space="preserve"> </w:t>
+      </w:r>
+      <w:r>
+        <w:t xml:space="preserve">[58]. This is consistent with evidence that agent</w:t>
       </w:r>
       <w:r>
         <w:t xml:space="preserve"> </w:t>
@@ -5734,13 +5923,13 @@
         <w:t xml:space="preserve"> </w:t>
       </w:r>
       <w:r>
-        <w:t xml:space="preserve">price [56], and that provider-reported totals can conceal</w:t>
-      </w:r>
-      <w:r>
-        <w:t xml:space="preserve"> </w:t>
-      </w:r>
-      <w:r>
-        <w:t xml:space="preserve">materially different accounting [57]. It also records a</w:t>
+        <w:t xml:space="preserve">price [59], and that provider-reported totals can conceal</w:t>
+      </w:r>
+      <w:r>
+        <w:t xml:space="preserve"> </w:t>
+      </w:r>
+      <w:r>
+        <w:t xml:space="preserve">materially different accounting [60]. It also records a</w:t>
       </w:r>
       <w:r>
         <w:t xml:space="preserve"> </w:t>
@@ -5752,7 +5941,7 @@
         <w:t xml:space="preserve"> </w:t>
       </w:r>
       <w:r>
-        <w:t xml:space="preserve">shown to vanish against a token-matched baseline [58], so a</w:t>
+        <w:t xml:space="preserve">shown to vanish against a token-matched baseline [61], so a</w:t>
       </w:r>
       <w:r>
         <w:t xml:space="preserve"> </w:t>
@@ -5800,7 +5989,7 @@
         <w:t xml:space="preserve"> </w:t>
       </w:r>
       <w:r>
-        <w:t xml:space="preserve">lists are read [59]. Measured against the ledger digest recorded in</w:t>
+        <w:t xml:space="preserve">lists are read [62]. Measured against the ledger digest recorded in</w:t>
       </w:r>
       <w:r>
         <w:t xml:space="preserve"> </w:t>
@@ -5927,7 +6116,7 @@
         <w:t xml:space="preserve"> </w:t>
       </w:r>
       <w:r>
-        <w:t xml:space="preserve">scores calls for [60], and it is also the boundary of what</w:t>
+        <w:t xml:space="preserve">scores calls for [63], and it is also the boundary of what</w:t>
       </w:r>
       <w:r>
         <w:t xml:space="preserve"> </w:t>
@@ -5939,7 +6128,7 @@
         <w:t xml:space="preserve"> </w:t>
       </w:r>
       <w:r>
-        <w:t xml:space="preserve">substitutes for understanding rather than supplying it [61].</w:t>
+        <w:t xml:space="preserve">substitutes for understanding rather than supplying it [64].</w:t>
       </w:r>
     </w:p>
     <w:bookmarkEnd w:id="58"/>
@@ -6088,7 +6277,7 @@
         <w:t xml:space="preserve"> </w:t>
       </w:r>
       <w:r>
-        <w:t xml:space="preserve">single terminal score [62].</w:t>
+        <w:t xml:space="preserve">single terminal score [65].</w:t>
       </w:r>
     </w:p>
     <w:p>
@@ -6170,7 +6359,7 @@
         <w:t xml:space="preserve"> </w:t>
       </w:r>
       <w:r>
-        <w:t xml:space="preserve">[63]; this project spent 192 model calls to verify 32</w:t>
+        <w:t xml:space="preserve">[66]; this project spent 192 model calls to verify 32</w:t>
       </w:r>
       <w:r>
         <w:t xml:space="preserve"> </w:t>
@@ -8780,6 +8969,66 @@
       </w:hyperlink>
       <w:r>
         <w:t xml:space="preserve">.</w:t>
+      </w:r>
+    </w:p>
+    <w:p>
+      <w:pPr>
+        <w:pStyle w:val="BodyText"/>
+      </w:pPr>
+      <w:r>
+        <w:t xml:space="preserve">J. Ning et al.,</w:t>
+      </w:r>
+      <w:r>
+        <w:t xml:space="preserve"> </w:t>
+      </w:r>
+      <w:r>
+        <w:t xml:space="preserve">“One Run Is Not an Idea: The Implementation Lottery in Automated Research,”</w:t>
+      </w:r>
+      <w:r>
+        <w:t xml:space="preserve"> </w:t>
+      </w:r>
+      <w:r>
+        <w:t xml:space="preserve">arXiv:2607.26587v1, 2026.</w:t>
+      </w:r>
+    </w:p>
+    <w:p>
+      <w:pPr>
+        <w:pStyle w:val="BodyText"/>
+      </w:pPr>
+      <w:r>
+        <w:t xml:space="preserve">S. Liu et al.,</w:t>
+      </w:r>
+      <w:r>
+        <w:t xml:space="preserve"> </w:t>
+      </w:r>
+      <w:r>
+        <w:t xml:space="preserve">“What Does Context Compression Cost an Agent? Interaction Costs Unrevealed by Task Completion,”</w:t>
+      </w:r>
+      <w:r>
+        <w:t xml:space="preserve"> </w:t>
+      </w:r>
+      <w:r>
+        <w:t xml:space="preserve">arXiv:2608.16370v1, 2026.</w:t>
+      </w:r>
+    </w:p>
+    <w:p>
+      <w:pPr>
+        <w:pStyle w:val="BodyText"/>
+      </w:pPr>
+      <w:r>
+        <w:t xml:space="preserve">E. Lumer et al.,</w:t>
+      </w:r>
+      <w:r>
+        <w:t xml:space="preserve"> </w:t>
+      </w:r>
+      <w:r>
+        <w:t xml:space="preserve">“Don’t Break the Cache: An Evaluation of Prompt Caching for Long-Horizon Agentic Tasks,”</w:t>
+      </w:r>
+      <w:r>
+        <w:t xml:space="preserve"> </w:t>
+      </w:r>
+      <w:r>
+        <w:t xml:space="preserve">arXiv:2601.06007v2, 2026.</w:t>
       </w:r>
     </w:p>
     <w:p>

</xml_diff>

<commit_message>
feat(paper): measure cost repeat variance and require means over repeats
</commit_message>
<xml_diff>
--- a/paper/word/graduation-thesis.docx
+++ b/paper/word/graduation-thesis.docx
@@ -5863,7 +5863,245 @@
         <w:t xml:space="preserve"> </w:t>
       </w:r>
       <w:r>
-        <w:t xml:space="preserve">marginal tokens, with neither treated as constant. Dollar cost remains excluded from</w:t>
+        <w:t xml:space="preserve">marginal tokens, with neither treated as constant.</w:t>
+      </w:r>
+    </w:p>
+    <w:p>
+      <w:pPr>
+        <w:pStyle w:val="BodyText"/>
+      </w:pPr>
+      <w:r>
+        <w:t xml:space="preserve">A third cycle tested whether one episode is enough. The same burned task was run three</w:t>
+      </w:r>
+      <w:r>
+        <w:t xml:space="preserve"> </w:t>
+      </w:r>
+      <w:r>
+        <w:t xml:space="preserve">times in each condition, with identical workspace digests inside each condition. The</w:t>
+      </w:r>
+      <w:r>
+        <w:t xml:space="preserve"> </w:t>
+      </w:r>
+      <w:r>
+        <w:t xml:space="preserve">minimal condition varied by</w:t>
+      </w:r>
+      <w:r>
+        <w:t xml:space="preserve"> </w:t>
+      </w:r>
+      <m:oMath>
+        <m:r>
+          <m:t>2.90</m:t>
+        </m:r>
+        <m:r>
+          <m:rPr>
+            <m:sty m:val="p"/>
+          </m:rPr>
+          <m:t>%</m:t>
+        </m:r>
+      </m:oMath>
+      <w:r>
+        <w:t xml:space="preserve"> </w:t>
+      </w:r>
+      <w:r>
+        <w:t xml:space="preserve">around a mean of</w:t>
+      </w:r>
+      <w:r>
+        <w:t xml:space="preserve"> </w:t>
+      </w:r>
+      <m:oMath>
+        <m:r>
+          <m:t>51</m:t>
+        </m:r>
+        <m:r>
+          <m:rPr>
+            <m:sty m:val="p"/>
+          </m:rPr>
+          <m:t>,</m:t>
+        </m:r>
+        <m:r>
+          <m:t>138</m:t>
+        </m:r>
+      </m:oMath>
+      <w:r>
+        <w:t xml:space="preserve"> </w:t>
+      </w:r>
+      <w:r>
+        <w:t xml:space="preserve">context tokens, but</w:t>
+      </w:r>
+      <w:r>
+        <w:t xml:space="preserve"> </w:t>
+      </w:r>
+      <w:r>
+        <w:t xml:space="preserve">the retrieval condition varied by</w:t>
+      </w:r>
+      <w:r>
+        <w:t xml:space="preserve"> </w:t>
+      </w:r>
+      <m:oMath>
+        <m:r>
+          <m:t>11.34</m:t>
+        </m:r>
+        <m:r>
+          <m:rPr>
+            <m:sty m:val="p"/>
+          </m:rPr>
+          <m:t>%</m:t>
+        </m:r>
+      </m:oMath>
+      <w:r>
+        <w:t xml:space="preserve"> </w:t>
+      </w:r>
+      <w:r>
+        <w:t xml:space="preserve">around</w:t>
+      </w:r>
+      <w:r>
+        <w:t xml:space="preserve"> </w:t>
+      </w:r>
+      <m:oMath>
+        <m:r>
+          <m:t>79</m:t>
+        </m:r>
+        <m:r>
+          <m:rPr>
+            <m:sty m:val="p"/>
+          </m:rPr>
+          <m:t>,</m:t>
+        </m:r>
+        <m:r>
+          <m:t>320</m:t>
+        </m:r>
+      </m:oMath>
+      <w:r>
+        <w:t xml:space="preserve">, and its within-condition</w:t>
+      </w:r>
+      <w:r>
+        <w:t xml:space="preserve"> </w:t>
+      </w:r>
+      <w:r>
+        <w:t xml:space="preserve">range of</w:t>
+      </w:r>
+      <w:r>
+        <w:t xml:space="preserve"> </w:t>
+      </w:r>
+      <m:oMath>
+        <m:r>
+          <m:t>17</m:t>
+        </m:r>
+        <m:r>
+          <m:rPr>
+            <m:sty m:val="p"/>
+          </m:rPr>
+          <m:t>,</m:t>
+        </m:r>
+        <m:r>
+          <m:t>231</m:t>
+        </m:r>
+      </m:oMath>
+      <w:r>
+        <w:t xml:space="preserve"> </w:t>
+      </w:r>
+      <w:r>
+        <w:t xml:space="preserve">tokens covers</w:t>
+      </w:r>
+      <w:r>
+        <w:t xml:space="preserve"> </w:t>
+      </w:r>
+      <m:oMath>
+        <m:r>
+          <m:t>61.1</m:t>
+        </m:r>
+        <m:r>
+          <m:rPr>
+            <m:sty m:val="p"/>
+          </m:rPr>
+          <m:t>%</m:t>
+        </m:r>
+      </m:oMath>
+      <w:r>
+        <w:t xml:space="preserve"> </w:t>
+      </w:r>
+      <w:r>
+        <w:t xml:space="preserve">of the gap between the conditions. The</w:t>
+      </w:r>
+      <w:r>
+        <w:t xml:space="preserve"> </w:t>
+      </w:r>
+      <w:r>
+        <w:t xml:space="preserve">falsifier of the second cost decision therefore fired for one condition, and the</w:t>
+      </w:r>
+      <w:r>
+        <w:t xml:space="preserve"> </w:t>
+      </w:r>
+      <w:r>
+        <w:t xml:space="preserve">decision is recorded as refined by measurement.</w:t>
+      </w:r>
+    </w:p>
+    <w:p>
+      <w:pPr>
+        <w:pStyle w:val="BodyText"/>
+      </w:pPr>
+      <w:r>
+        <w:t xml:space="preserve">Cost quantities are consequently reported as means over repeats with their observed</w:t>
+      </w:r>
+      <w:r>
+        <w:t xml:space="preserve"> </w:t>
+      </w:r>
+      <w:r>
+        <w:t xml:space="preserve">spread, never as a single episode, and the retrieval condition is treated as needing</w:t>
+      </w:r>
+      <w:r>
+        <w:t xml:space="preserve"> </w:t>
+      </w:r>
+      <w:r>
+        <w:t xml:space="preserve">more repeats than the minimal one. Agents are independently reported to show</w:t>
+      </w:r>
+      <w:r>
+        <w:t xml:space="preserve"> </w:t>
+      </w:r>
+      <w:r>
+        <w:t xml:space="preserve">substantial run-to-run variance under identical tasks, tools, and environment</w:t>
+      </w:r>
+      <w:r>
+        <w:t xml:space="preserve"> </w:t>
+      </w:r>
+      <w:r>
+        <w:t xml:space="preserve">[56], and model outputs are not deterministic for a fixed prompt</w:t>
+      </w:r>
+      <w:r>
+        <w:t xml:space="preserve"> </w:t>
+      </w:r>
+      <w:r>
+        <w:t xml:space="preserve">[57]. One mechanism is consistent with the four-fold larger</w:t>
+      </w:r>
+      <w:r>
+        <w:t xml:space="preserve"> </w:t>
+      </w:r>
+      <w:r>
+        <w:t xml:space="preserve">spread and is recorded as a hypothesis rather than a result: when retrieval is</w:t>
+      </w:r>
+      <w:r>
+        <w:t xml:space="preserve"> </w:t>
+      </w:r>
+      <w:r>
+        <w:t xml:space="preserve">available the agent chooses how much of the evidence pack to read, so context cost is</w:t>
+      </w:r>
+      <w:r>
+        <w:t xml:space="preserve"> </w:t>
+      </w:r>
+      <w:r>
+        <w:t xml:space="preserve">partly an outcome of its behaviour rather than a fixed property of the condition.</w:t>
+      </w:r>
+      <w:r>
+        <w:t xml:space="preserve"> </w:t>
+      </w:r>
+      <w:r>
+        <w:t xml:space="preserve">Testing that would require instrumenting reads per episode, which this design does not</w:t>
+      </w:r>
+      <w:r>
+        <w:t xml:space="preserve"> </w:t>
+      </w:r>
+      <w:r>
+        <w:t xml:space="preserve">yet do. Dollar cost remains excluded from</w:t>
       </w:r>
       <w:r>
         <w:t xml:space="preserve"> </w:t>
@@ -5893,7 +6131,7 @@
         <w:t xml:space="preserve"> </w:t>
       </w:r>
       <w:r>
-        <w:t xml:space="preserve">[56]. And cost belongs beside the endpoint rather than behind it,</w:t>
+        <w:t xml:space="preserve">[58]. And cost belongs beside the endpoint rather than behind it,</w:t>
       </w:r>
       <w:r>
         <w:t xml:space="preserve"> </w:t>
@@ -5905,13 +6143,13 @@
         <w:t xml:space="preserve"> </w:t>
       </w:r>
       <w:r>
-        <w:t xml:space="preserve">[57], while caching alters money without altering work</w:t>
-      </w:r>
-      <w:r>
-        <w:t xml:space="preserve"> </w:t>
-      </w:r>
-      <w:r>
-        <w:t xml:space="preserve">[58]. This is consistent with evidence that agent</w:t>
+        <w:t xml:space="preserve">[59], while caching alters money without altering work</w:t>
+      </w:r>
+      <w:r>
+        <w:t xml:space="preserve"> </w:t>
+      </w:r>
+      <w:r>
+        <w:t xml:space="preserve">[60]. This is consistent with evidence that agent</w:t>
       </w:r>
       <w:r>
         <w:t xml:space="preserve"> </w:t>
@@ -5923,13 +6161,13 @@
         <w:t xml:space="preserve"> </w:t>
       </w:r>
       <w:r>
-        <w:t xml:space="preserve">price [59], and that provider-reported totals can conceal</w:t>
-      </w:r>
-      <w:r>
-        <w:t xml:space="preserve"> </w:t>
-      </w:r>
-      <w:r>
-        <w:t xml:space="preserve">materially different accounting [60]. It also records a</w:t>
+        <w:t xml:space="preserve">price [61], and that provider-reported totals can conceal</w:t>
+      </w:r>
+      <w:r>
+        <w:t xml:space="preserve"> </w:t>
+      </w:r>
+      <w:r>
+        <w:t xml:space="preserve">materially different accounting [62]. It also records a</w:t>
       </w:r>
       <w:r>
         <w:t xml:space="preserve"> </w:t>
@@ -5941,7 +6179,7 @@
         <w:t xml:space="preserve"> </w:t>
       </w:r>
       <w:r>
-        <w:t xml:space="preserve">shown to vanish against a token-matched baseline [61], so a</w:t>
+        <w:t xml:space="preserve">shown to vanish against a token-matched baseline [63], so a</w:t>
       </w:r>
       <w:r>
         <w:t xml:space="preserve"> </w:t>
@@ -5989,7 +6227,7 @@
         <w:t xml:space="preserve"> </w:t>
       </w:r>
       <w:r>
-        <w:t xml:space="preserve">lists are read [62]. Measured against the ledger digest recorded in</w:t>
+        <w:t xml:space="preserve">lists are read [64]. Measured against the ledger digest recorded in</w:t>
       </w:r>
       <w:r>
         <w:t xml:space="preserve"> </w:t>
@@ -6116,7 +6354,7 @@
         <w:t xml:space="preserve"> </w:t>
       </w:r>
       <w:r>
-        <w:t xml:space="preserve">scores calls for [63], and it is also the boundary of what</w:t>
+        <w:t xml:space="preserve">scores calls for [65], and it is also the boundary of what</w:t>
       </w:r>
       <w:r>
         <w:t xml:space="preserve"> </w:t>
@@ -6128,7 +6366,7 @@
         <w:t xml:space="preserve"> </w:t>
       </w:r>
       <w:r>
-        <w:t xml:space="preserve">substitutes for understanding rather than supplying it [64].</w:t>
+        <w:t xml:space="preserve">substitutes for understanding rather than supplying it [66].</w:t>
       </w:r>
     </w:p>
     <w:bookmarkEnd w:id="58"/>
@@ -6277,7 +6515,7 @@
         <w:t xml:space="preserve"> </w:t>
       </w:r>
       <w:r>
-        <w:t xml:space="preserve">single terminal score [65].</w:t>
+        <w:t xml:space="preserve">single terminal score [67].</w:t>
       </w:r>
     </w:p>
     <w:p>
@@ -6359,7 +6597,7 @@
         <w:t xml:space="preserve"> </w:t>
       </w:r>
       <w:r>
-        <w:t xml:space="preserve">[66]; this project spent 192 model calls to verify 32</w:t>
+        <w:t xml:space="preserve">[68]; this project spent 192 model calls to verify 32</w:t>
       </w:r>
       <w:r>
         <w:t xml:space="preserve"> </w:t>
@@ -8969,6 +9207,46 @@
       </w:hyperlink>
       <w:r>
         <w:t xml:space="preserve">.</w:t>
+      </w:r>
+    </w:p>
+    <w:p>
+      <w:pPr>
+        <w:pStyle w:val="BodyText"/>
+      </w:pPr>
+      <w:r>
+        <w:t xml:space="preserve">S. Dhage et al.,</w:t>
+      </w:r>
+      <w:r>
+        <w:t xml:space="preserve"> </w:t>
+      </w:r>
+      <w:r>
+        <w:t xml:space="preserve">“Harness Engineering for Predictable Agentic Systems: An Empirical Study of Determinism,”</w:t>
+      </w:r>
+      <w:r>
+        <w:t xml:space="preserve"> </w:t>
+      </w:r>
+      <w:r>
+        <w:t xml:space="preserve">arXiv:2608.26197v1, 2026.</w:t>
+      </w:r>
+    </w:p>
+    <w:p>
+      <w:pPr>
+        <w:pStyle w:val="BodyText"/>
+      </w:pPr>
+      <w:r>
+        <w:t xml:space="preserve">G. Coqueret,</w:t>
+      </w:r>
+      <w:r>
+        <w:t xml:space="preserve"> </w:t>
+      </w:r>
+      <w:r>
+        <w:t xml:space="preserve">“Randomness in Large Language Models: What Researchers Need to Know,”</w:t>
+      </w:r>
+      <w:r>
+        <w:t xml:space="preserve"> </w:t>
+      </w:r>
+      <w:r>
+        <w:t xml:space="preserve">arXiv:2607.24372v1, 2026.</w:t>
       </w:r>
     </w:p>
     <w:p>

</xml_diff>

<commit_message>
fix(paper): correct a 14.4x cost instrument defect and void every figure it produced
</commit_message>
<xml_diff>
--- a/paper/word/graduation-thesis.docx
+++ b/paper/word/graduation-thesis.docx
@@ -4600,7 +4600,7 @@
     <w:bookmarkEnd w:id="48"/>
     <w:bookmarkEnd w:id="49"/>
     <w:bookmarkEnd w:id="50"/>
-    <w:bookmarkStart w:id="59" w:name="experimental-results"/>
+    <w:bookmarkStart w:id="60" w:name="experimental-results"/>
     <w:p>
       <w:pPr>
         <w:pStyle w:val="Heading1"/>
@@ -5549,13 +5549,13 @@
       </w:r>
     </w:p>
     <w:bookmarkEnd w:id="56"/>
-    <w:bookmarkStart w:id="57" w:name="X42317cab83810faed9ffbcecb56b1863e844079"/>
+    <w:bookmarkStart w:id="58" w:name="X5771114233f108d8e1af518133c184183878281"/>
     <w:p>
       <w:pPr>
         <w:pStyle w:val="Heading2"/>
       </w:pPr>
       <w:r>
-        <w:t xml:space="preserve">Measuring episode cost instead of proxying it</w:t>
+        <w:t xml:space="preserve">Measuring episode cost, and an instrument that was wrong</w:t>
       </w:r>
     </w:p>
     <w:p>
@@ -5563,37 +5563,19 @@
         <w:pStyle w:val="FirstParagraph"/>
       </w:pPr>
       <w:r>
-        <w:t xml:space="preserve">The pilot recorded token accounting as unmeasured, because the headless text mode</w:t>
-      </w:r>
-      <w:r>
-        <w:t xml:space="preserve"> </w:t>
-      </w:r>
-      <w:r>
-        <w:t xml:space="preserve">emits no usage record, and retained wall-clock duration as a proxy. That proxy was</w:t>
-      </w:r>
-      <w:r>
-        <w:t xml:space="preserve"> </w:t>
-      </w:r>
-      <w:r>
-        <w:t xml:space="preserve">replaced by measurement. The runner was switched to a structured output mode and a</w:t>
-      </w:r>
-      <w:r>
-        <w:t xml:space="preserve"> </w:t>
-      </w:r>
-      <w:r>
-        <w:t xml:space="preserve">committed parser, covered by eleven fixtures, reads the usage stream. One fixture</w:t>
-      </w:r>
-      <w:r>
-        <w:t xml:space="preserve"> </w:t>
-      </w:r>
-      <w:r>
-        <w:t xml:space="preserve">exists because usage is reported repeatedly and grows monotonically, so summing the</w:t>
-      </w:r>
-      <w:r>
-        <w:t xml:space="preserve"> </w:t>
-      </w:r>
-      <w:r>
-        <w:t xml:space="preserve">records would overcount the true total.</w:t>
+        <w:t xml:space="preserve">The pilot recorded token accounting as unmeasured and retained wall-clock duration as</w:t>
+      </w:r>
+      <w:r>
+        <w:t xml:space="preserve"> </w:t>
+      </w:r>
+      <w:r>
+        <w:t xml:space="preserve">a proxy. Replacing that proxy took four cycles, three of which produced numbers that</w:t>
+      </w:r>
+      <w:r>
+        <w:t xml:space="preserve"> </w:t>
+      </w:r>
+      <w:r>
+        <w:t xml:space="preserve">were later voided. The sequence is reported because the failures are the result.</w:t>
       </w:r>
     </w:p>
     <w:p>
@@ -5601,108 +5583,136 @@
         <w:pStyle w:val="BodyText"/>
       </w:pPr>
       <w:r>
-        <w:t xml:space="preserve">Three probes on the pinned backend produced a result that changes how cost must be</w:t>
-      </w:r>
-      <w:r>
-        <w:t xml:space="preserve"> </w:t>
-      </w:r>
-      <w:r>
-        <w:t xml:space="preserve">reported. A fixed context floor of</w:t>
+        <w:t xml:space="preserve">A structured output mode and a committed parser first replaced the proxy. Probes then</w:t>
+      </w:r>
+      <w:r>
+        <w:t xml:space="preserve"> </w:t>
+      </w:r>
+      <w:r>
+        <w:t xml:space="preserve">suggested a fixed context floor, and a decision was recorded to report marginal tokens</w:t>
+      </w:r>
+      <w:r>
+        <w:t xml:space="preserve"> </w:t>
+      </w:r>
+      <w:r>
+        <w:t xml:space="preserve">against that constant. Repeating the measurement on real episodes falsified it: the</w:t>
+      </w:r>
+      <w:r>
+        <w:t xml:space="preserve"> </w:t>
+      </w:r>
+      <w:r>
+        <w:t xml:space="preserve">probes had run in an empty directory and measured harness context alone, while a real</w:t>
+      </w:r>
+      <w:r>
+        <w:t xml:space="preserve"> </w:t>
+      </w:r>
+      <w:r>
+        <w:t xml:space="preserve">episode also carries its mounted workspace. Repeats then falsified the next decision in</w:t>
+      </w:r>
+      <w:r>
+        <w:t xml:space="preserve"> </w:t>
+      </w:r>
+      <w:r>
+        <w:t xml:space="preserve">turn, showing that a single episode is a draw rather than a value.</w:t>
+      </w:r>
+    </w:p>
+    <w:p>
+      <w:pPr>
+        <w:pStyle w:val="BodyText"/>
+      </w:pPr>
+      <w:r>
+        <w:t xml:space="preserve">The fourth cycle found that the instrument itself had been wrong throughout. The parser</w:t>
+      </w:r>
+      <w:r>
+        <w:t xml:space="preserve"> </w:t>
+      </w:r>
+      <w:r>
+        <w:t xml:space="preserve">summarised a run by its last usage record, on the assumption that usage accumulated.</w:t>
+      </w:r>
+      <w:r>
+        <w:t xml:space="preserve"> </w:t>
+      </w:r>
+      <w:r>
+        <w:t xml:space="preserve">Usage is reported per completed API call, and a multi-turn episode re-sends its context</w:t>
+      </w:r>
+      <w:r>
+        <w:t xml:space="preserve"> </w:t>
+      </w:r>
+      <w:r>
+        <w:t xml:space="preserve">on every call, so the last record describes one call rather than the run. On one</w:t>
+      </w:r>
+      <w:r>
+        <w:t xml:space="preserve"> </w:t>
+      </w:r>
+      <w:r>
+        <w:t xml:space="preserve">episode this understated cost by a factor of</w:t>
       </w:r>
       <w:r>
         <w:t xml:space="preserve"> </w:t>
       </w:r>
       <m:oMath>
         <m:r>
-          <m:t>46</m:t>
-        </m:r>
-        <m:r>
-          <m:rPr>
-            <m:sty m:val="p"/>
-          </m:rPr>
-          <m:t>,</m:t>
-        </m:r>
-        <m:r>
-          <m:t>763</m:t>
+          <m:t>14.4</m:t>
         </m:r>
       </m:oMath>
       <w:r>
         <w:t xml:space="preserve"> </w:t>
       </w:r>
       <w:r>
-        <w:t xml:space="preserve">tokens appeared identically in every</w:t>
-      </w:r>
-      <w:r>
-        <w:t xml:space="preserve"> </w:t>
-      </w:r>
-      <w:r>
-        <w:t xml:space="preserve">probe, while the work itself ranged from</w:t>
+        <w:t xml:space="preserve">and output tokens by</w:t>
       </w:r>
       <w:r>
         <w:t xml:space="preserve"> </w:t>
       </w:r>
       <m:oMath>
         <m:r>
-          <m:t>39</m:t>
+          <m:t>13.0</m:t>
         </m:r>
       </m:oMath>
       <w:r>
-        <w:t xml:space="preserve"> </w:t>
-      </w:r>
-      <w:r>
-        <w:t xml:space="preserve">to</w:t>
-      </w:r>
-      <w:r>
-        <w:t xml:space="preserve"> </w:t>
-      </w:r>
-      <m:oMath>
-        <m:r>
-          <m:t>384</m:t>
-        </m:r>
-      </m:oMath>
-      <w:r>
-        <w:t xml:space="preserve"> </w:t>
-      </w:r>
-      <w:r>
-        <w:t xml:space="preserve">output tokens. Dollar cost for</w:t>
-      </w:r>
-      <w:r>
-        <w:t xml:space="preserve"> </w:t>
-      </w:r>
-      <w:r>
-        <w:t xml:space="preserve">the same trivial task differed by a factor of</w:t>
-      </w:r>
-      <w:r>
-        <w:t xml:space="preserve"> </w:t>
-      </w:r>
-      <m:oMath>
-        <m:r>
-          <m:t>12.03</m:t>
-        </m:r>
-      </m:oMath>
-      <w:r>
-        <w:t xml:space="preserve"> </w:t>
-      </w:r>
-      <w:r>
-        <w:t xml:space="preserve">between a cold and a warm</w:t>
-      </w:r>
-      <w:r>
-        <w:t xml:space="preserve"> </w:t>
-      </w:r>
-      <w:r>
-        <w:t xml:space="preserve">cache. Cache state depends on the order in which episodes run, not on the condition</w:t>
-      </w:r>
-      <w:r>
-        <w:t xml:space="preserve"> </w:t>
-      </w:r>
-      <w:r>
-        <w:t xml:space="preserve">under test, and a comparison measured on totals would put the condition contrast at</w:t>
-      </w:r>
-      <w:r>
-        <w:t xml:space="preserve"> </w:t>
-      </w:r>
-      <w:r>
-        <w:t xml:space="preserve">roughly one percent of the reported quantity.</w:t>
+        <w:t xml:space="preserve">. The</w:t>
+      </w:r>
+      <w:r>
+        <w:t xml:space="preserve"> </w:t>
+      </w:r>
+      <w:r>
+        <w:t xml:space="preserve">fixture written alongside the parser asserted that the last record was the total, so</w:t>
+      </w:r>
+      <w:r>
+        <w:t xml:space="preserve"> </w:t>
+      </w:r>
+      <w:r>
+        <w:t xml:space="preserve">the suite passed while the instrument was wrong: a fixture that encodes the author’s</w:t>
+      </w:r>
+      <w:r>
+        <w:t xml:space="preserve"> </w:t>
+      </w:r>
+      <w:r>
+        <w:t xml:space="preserve">assumption tests the assumption rather than the system. Two further defects surfaced</w:t>
+      </w:r>
+      <w:r>
+        <w:t xml:space="preserve"> </w:t>
+      </w:r>
+      <w:r>
+        <w:t xml:space="preserve">during the repair. Transcripts captured through standard output were truncated, losing</w:t>
+      </w:r>
+      <w:r>
+        <w:t xml:space="preserve"> </w:t>
+      </w:r>
+      <w:r>
+        <w:t xml:space="preserve">records from the middle of four of six runs, so transcripts are now written to files</w:t>
+      </w:r>
+      <w:r>
+        <w:t xml:space="preserve"> </w:t>
+      </w:r>
+      <w:r>
+        <w:t xml:space="preserve">and the parser reports whether each is complete. And the first repair swallowed every</w:t>
+      </w:r>
+      <w:r>
+        <w:t xml:space="preserve"> </w:t>
+      </w:r>
+      <w:r>
+        <w:t xml:space="preserve">record after a truncation, which a failing-first fixture caught before it was used.</w:t>
       </w:r>
     </w:p>
     <w:p>
@@ -5710,486 +5720,382 @@
         <w:pStyle w:val="BodyText"/>
       </w:pPr>
       <w:r>
-        <w:t xml:space="preserve">That conclusion was wrong, and the next cycle’s measurement refuted it. Repeating</w:t>
-      </w:r>
-      <w:r>
-        <w:t xml:space="preserve"> </w:t>
-      </w:r>
-      <w:r>
-        <w:t xml:space="preserve">the measurement on real episodes rather than probes showed that the floor is not a</w:t>
-      </w:r>
-      <w:r>
-        <w:t xml:space="preserve"> </w:t>
-      </w:r>
-      <w:r>
-        <w:t xml:space="preserve">constant. One burned task was run once in the minimal condition and once in the full</w:t>
-      </w:r>
-      <w:r>
-        <w:t xml:space="preserve"> </w:t>
-      </w:r>
-      <w:r>
-        <w:t xml:space="preserve">condition. Context tokens were</w:t>
-      </w:r>
-      <w:r>
-        <w:t xml:space="preserve"> </w:t>
-      </w:r>
-      <m:oMath>
-        <m:r>
-          <m:t>51</m:t>
-        </m:r>
-        <m:r>
-          <m:rPr>
-            <m:sty m:val="p"/>
-          </m:rPr>
-          <m:t>,</m:t>
-        </m:r>
-        <m:r>
-          <m:t>596</m:t>
-        </m:r>
-      </m:oMath>
-      <w:r>
-        <w:t xml:space="preserve"> </w:t>
-      </w:r>
-      <w:r>
-        <w:t xml:space="preserve">and</w:t>
-      </w:r>
-      <w:r>
-        <w:t xml:space="preserve"> </w:t>
-      </w:r>
-      <m:oMath>
-        <m:r>
-          <m:t>76</m:t>
-        </m:r>
-        <m:r>
-          <m:rPr>
-            <m:sty m:val="p"/>
-          </m:rPr>
-          <m:t>,</m:t>
-        </m:r>
-        <m:r>
-          <m:t>496</m:t>
-        </m:r>
-      </m:oMath>
-      <w:r>
-        <w:t xml:space="preserve">, a difference of</w:t>
-      </w:r>
-      <w:r>
-        <w:t xml:space="preserve"> </w:t>
-      </w:r>
-      <m:oMath>
-        <m:r>
-          <m:t>24</m:t>
-        </m:r>
-        <m:r>
-          <m:rPr>
-            <m:sty m:val="p"/>
-          </m:rPr>
-          <m:t>,</m:t>
-        </m:r>
-        <m:r>
-          <m:t>900</m:t>
-        </m:r>
-      </m:oMath>
-      <w:r>
-        <w:t xml:space="preserve">,</w:t>
-      </w:r>
-      <w:r>
-        <w:t xml:space="preserve"> </w:t>
-      </w:r>
-      <w:r>
-        <w:t xml:space="preserve">and totals differed by a factor of</w:t>
-      </w:r>
-      <w:r>
-        <w:t xml:space="preserve"> </w:t>
-      </w:r>
-      <m:oMath>
-        <m:r>
-          <m:t>1.487</m:t>
-        </m:r>
-      </m:oMath>
-      <w:r>
-        <w:t xml:space="preserve">. The probes had run in an empty directory,</w:t>
-      </w:r>
-      <w:r>
-        <w:t xml:space="preserve"> </w:t>
-      </w:r>
-      <w:r>
-        <w:t xml:space="preserve">so the floor they measured was the harness context alone; a real episode also carries</w:t>
-      </w:r>
-      <w:r>
-        <w:t xml:space="preserve"> </w:t>
-      </w:r>
-      <w:r>
-        <w:t xml:space="preserve">its mounted workspace, and the full condition mounts an evidence pack of</w:t>
-      </w:r>
-      <w:r>
-        <w:t xml:space="preserve"> </w:t>
-      </w:r>
-      <m:oMath>
-        <m:r>
-          <m:t>145</m:t>
-        </m:r>
-        <m:r>
-          <m:rPr>
-            <m:sty m:val="p"/>
-          </m:rPr>
-          <m:t>,</m:t>
-        </m:r>
-        <m:r>
-          <m:t>906</m:t>
-        </m:r>
-      </m:oMath>
-      <w:r>
-        <w:t xml:space="preserve"> </w:t>
-      </w:r>
-      <w:r>
-        <w:t xml:space="preserve">bytes. The pre-registered falsifier of the previous decision fired, and that decision</w:t>
-      </w:r>
-      <w:r>
-        <w:t xml:space="preserve"> </w:t>
-      </w:r>
-      <w:r>
-        <w:t xml:space="preserve">is recorded as falsified rather than quietly amended.</w:t>
-      </w:r>
-    </w:p>
+        <w:t xml:space="preserve">Every cost figure from the three preceding cycles is therefore void, and the six</w:t>
+      </w:r>
+      <w:r>
+        <w:t xml:space="preserve"> </w:t>
+      </w:r>
+      <w:r>
+        <w:t xml:space="preserve">episodes were re-measured from complete transcripts. The corrected figures are given in</w:t>
+      </w:r>
+      <w:r>
+        <w:t xml:space="preserve"> </w:t>
+      </w:r>
+      <w:r>
+        <w:t xml:space="preserve">Table </w:t>
+      </w:r>
+      <w:hyperlink w:anchor="tab:cost">
+        <w:r>
+          <w:rPr>
+            <w:rStyle w:val="Hyperlink"/>
+          </w:rPr>
+          <w:t xml:space="preserve">2</w:t>
+        </w:r>
+      </w:hyperlink>
+      <w:r>
+        <w:t xml:space="preserve">. Context dominates both conditions because it is re-sent on each</w:t>
+      </w:r>
+      <w:r>
+        <w:t xml:space="preserve"> </w:t>
+      </w:r>
+      <w:r>
+        <w:t xml:space="preserve">call, and the full condition made about three times as many calls for about three times</w:t>
+      </w:r>
+      <w:r>
+        <w:t xml:space="preserve"> </w:t>
+      </w:r>
+      <w:r>
+        <w:t xml:space="preserve">the tokens.</w:t>
+      </w:r>
+    </w:p>
+    <w:bookmarkStart w:id="57" w:name="tab:cost"/>
+    <w:p>
+      <w:pPr>
+        <w:pStyle w:val="TableCaption"/>
+      </w:pPr>
+      <w:r>
+        <w:t xml:space="preserve">Corrected cost over three repeats per condition on one burned task, from</w:t>
+      </w:r>
+      <w:r>
+        <w:t xml:space="preserve"> </w:t>
+      </w:r>
+      <w:r>
+        <w:t xml:space="preserve">complete transcripts. Values are means with coefficient of variation.</w:t>
+      </w:r>
+    </w:p>
+    <w:tbl>
+      <w:tblPr>
+        <w:tblStyle w:val="Table"/>
+        <w:tblW w:type="auto" w:w="0"/>
+        <w:tblLook w:firstRow="1" w:lastRow="0" w:firstColumn="0" w:lastColumn="0" w:noHBand="0" w:noVBand="0" w:val="0020"/>
+        <w:tblCaption w:val="Corrected cost over three repeats per condition on one burned task, from complete transcripts. Values are means with coefficient of variation."/>
+      </w:tblPr>
+      <w:tblGrid>
+        <w:gridCol w:w="1584"/>
+        <w:gridCol w:w="1584"/>
+        <w:gridCol w:w="1584"/>
+        <w:gridCol w:w="1584"/>
+        <w:gridCol w:w="1584"/>
+      </w:tblGrid>
+      <w:tr>
+        <w:trPr>
+          <w:tblHeader w:val="on"/>
+        </w:trPr>
+        <w:tc>
+          <w:tcPr/>
+          <w:p>
+            <w:pPr>
+              <w:pStyle w:val="Compact"/>
+              <w:jc w:val="left"/>
+            </w:pPr>
+            <w:r>
+              <w:t xml:space="preserve">Condition</w:t>
+            </w:r>
+          </w:p>
+        </w:tc>
+        <w:tc>
+          <w:tcPr/>
+          <w:p>
+            <w:pPr>
+              <w:pStyle w:val="Compact"/>
+              <w:jc w:val="right"/>
+            </w:pPr>
+            <w:r>
+              <w:t xml:space="preserve">API calls</w:t>
+            </w:r>
+          </w:p>
+        </w:tc>
+        <w:tc>
+          <w:tcPr/>
+          <w:p>
+            <w:pPr>
+              <w:pStyle w:val="Compact"/>
+              <w:jc w:val="right"/>
+            </w:pPr>
+            <w:r>
+              <w:t xml:space="preserve">Context tokens</w:t>
+            </w:r>
+          </w:p>
+        </w:tc>
+        <w:tc>
+          <w:tcPr/>
+          <w:p>
+            <w:pPr>
+              <w:pStyle w:val="Compact"/>
+              <w:jc w:val="right"/>
+            </w:pPr>
+            <w:r>
+              <w:t xml:space="preserve">Marginal tokens</w:t>
+            </w:r>
+          </w:p>
+        </w:tc>
+        <w:tc>
+          <w:tcPr/>
+          <w:p>
+            <w:pPr>
+              <w:pStyle w:val="Compact"/>
+              <w:jc w:val="right"/>
+            </w:pPr>
+            <w:r>
+              <w:t xml:space="preserve">Total tokens</w:t>
+            </w:r>
+          </w:p>
+        </w:tc>
+      </w:tr>
+      <w:tr>
+        <w:tc>
+          <w:tcPr/>
+          <w:p>
+            <w:pPr>
+              <w:pStyle w:val="Compact"/>
+              <w:jc w:val="left"/>
+            </w:pPr>
+            <w:r>
+              <w:t xml:space="preserve">Minimal</w:t>
+            </w:r>
+          </w:p>
+        </w:tc>
+        <w:tc>
+          <w:tcPr/>
+          <w:p>
+            <w:pPr>
+              <w:pStyle w:val="Compact"/>
+              <w:jc w:val="right"/>
+            </w:pPr>
+            <w:r>
+              <w:t xml:space="preserve">3.3 (17.3%)</w:t>
+            </w:r>
+          </w:p>
+        </w:tc>
+        <w:tc>
+          <w:tcPr/>
+          <w:p>
+            <w:pPr>
+              <w:pStyle w:val="Compact"/>
+              <w:jc w:val="right"/>
+            </w:pPr>
+            <w:r>
+              <w:t xml:space="preserve">161</w:t>
+            </w:r>
+            <w:r>
+              <w:t xml:space="preserve">,</w:t>
+            </w:r>
+            <w:r>
+              <w:t xml:space="preserve">835 (17.0%)</w:t>
+            </w:r>
+          </w:p>
+        </w:tc>
+        <w:tc>
+          <w:tcPr/>
+          <w:p>
+            <w:pPr>
+              <w:pStyle w:val="Compact"/>
+              <w:jc w:val="right"/>
+            </w:pPr>
+            <w:r>
+              <w:t xml:space="preserve">5</w:t>
+            </w:r>
+            <w:r>
+              <w:t xml:space="preserve">,</w:t>
+            </w:r>
+            <w:r>
+              <w:t xml:space="preserve">416 (19.5%)</w:t>
+            </w:r>
+          </w:p>
+        </w:tc>
+        <w:tc>
+          <w:tcPr/>
+          <w:p>
+            <w:pPr>
+              <w:pStyle w:val="Compact"/>
+              <w:jc w:val="right"/>
+            </w:pPr>
+            <w:r>
+              <w:t xml:space="preserve">167</w:t>
+            </w:r>
+            <w:r>
+              <w:t xml:space="preserve">,</w:t>
+            </w:r>
+            <w:r>
+              <w:t xml:space="preserve">251 (16.6%)</w:t>
+            </w:r>
+          </w:p>
+        </w:tc>
+      </w:tr>
+      <w:tr>
+        <w:tc>
+          <w:tcPr/>
+          <w:p>
+            <w:pPr>
+              <w:pStyle w:val="Compact"/>
+              <w:jc w:val="left"/>
+            </w:pPr>
+            <w:r>
+              <w:t xml:space="preserve">Scaffold + retrieval</w:t>
+            </w:r>
+          </w:p>
+        </w:tc>
+        <w:tc>
+          <w:tcPr/>
+          <w:p>
+            <w:pPr>
+              <w:pStyle w:val="Compact"/>
+              <w:jc w:val="right"/>
+            </w:pPr>
+            <w:r>
+              <w:t xml:space="preserve">9.7 (33.3%)</w:t>
+            </w:r>
+          </w:p>
+        </w:tc>
+        <w:tc>
+          <w:tcPr/>
+          <w:p>
+            <w:pPr>
+              <w:pStyle w:val="Compact"/>
+              <w:jc w:val="right"/>
+            </w:pPr>
+            <w:r>
+              <w:t xml:space="preserve">511</w:t>
+            </w:r>
+            <w:r>
+              <w:t xml:space="preserve">,</w:t>
+            </w:r>
+            <w:r>
+              <w:t xml:space="preserve">551 (34.4%)</w:t>
+            </w:r>
+          </w:p>
+        </w:tc>
+        <w:tc>
+          <w:tcPr/>
+          <w:p>
+            <w:pPr>
+              <w:pStyle w:val="Compact"/>
+              <w:jc w:val="right"/>
+            </w:pPr>
+            <w:r>
+              <w:t xml:space="preserve">9</w:t>
+            </w:r>
+            <w:r>
+              <w:t xml:space="preserve">,</w:t>
+            </w:r>
+            <w:r>
+              <w:t xml:space="preserve">418 (16.7%)</w:t>
+            </w:r>
+          </w:p>
+        </w:tc>
+        <w:tc>
+          <w:tcPr/>
+          <w:p>
+            <w:pPr>
+              <w:pStyle w:val="Compact"/>
+              <w:jc w:val="right"/>
+            </w:pPr>
+            <w:r>
+              <w:t xml:space="preserve">520</w:t>
+            </w:r>
+            <w:r>
+              <w:t xml:space="preserve">,</w:t>
+            </w:r>
+            <w:r>
+              <w:t xml:space="preserve">969 (34.0%)</w:t>
+            </w:r>
+          </w:p>
+        </w:tc>
+      </w:tr>
+    </w:tbl>
+    <w:bookmarkEnd w:id="57"/>
     <w:p>
       <w:pPr>
         <w:pStyle w:val="BodyText"/>
       </w:pPr>
       <w:r>
-        <w:t xml:space="preserve">Cost is therefore reported as two separate quantities per episode, context tokens and</w:t>
-      </w:r>
-      <w:r>
-        <w:t xml:space="preserve"> </w:t>
-      </w:r>
-      <w:r>
-        <w:t xml:space="preserve">marginal tokens, with neither treated as constant.</w:t>
-      </w:r>
-    </w:p>
-    <w:p>
-      <w:pPr>
-        <w:pStyle w:val="BodyText"/>
-      </w:pPr>
-      <w:r>
-        <w:t xml:space="preserve">A third cycle tested whether one episode is enough. The same burned task was run three</w:t>
-      </w:r>
-      <w:r>
-        <w:t xml:space="preserve"> </w:t>
-      </w:r>
-      <w:r>
-        <w:t xml:space="preserve">times in each condition, with identical workspace digests inside each condition. The</w:t>
-      </w:r>
-      <w:r>
-        <w:t xml:space="preserve"> </w:t>
-      </w:r>
-      <w:r>
-        <w:t xml:space="preserve">minimal condition varied by</w:t>
-      </w:r>
-      <w:r>
-        <w:t xml:space="preserve"> </w:t>
-      </w:r>
-      <m:oMath>
-        <m:r>
-          <m:t>2.90</m:t>
-        </m:r>
-        <m:r>
-          <m:rPr>
-            <m:sty m:val="p"/>
-          </m:rPr>
-          <m:t>%</m:t>
-        </m:r>
-      </m:oMath>
-      <w:r>
-        <w:t xml:space="preserve"> </w:t>
-      </w:r>
-      <w:r>
-        <w:t xml:space="preserve">around a mean of</w:t>
-      </w:r>
-      <w:r>
-        <w:t xml:space="preserve"> </w:t>
-      </w:r>
-      <m:oMath>
-        <m:r>
-          <m:t>51</m:t>
-        </m:r>
-        <m:r>
-          <m:rPr>
-            <m:sty m:val="p"/>
-          </m:rPr>
-          <m:t>,</m:t>
-        </m:r>
-        <m:r>
-          <m:t>138</m:t>
-        </m:r>
-      </m:oMath>
-      <w:r>
-        <w:t xml:space="preserve"> </w:t>
-      </w:r>
-      <w:r>
-        <w:t xml:space="preserve">context tokens, but</w:t>
-      </w:r>
-      <w:r>
-        <w:t xml:space="preserve"> </w:t>
-      </w:r>
-      <w:r>
-        <w:t xml:space="preserve">the retrieval condition varied by</w:t>
-      </w:r>
-      <w:r>
-        <w:t xml:space="preserve"> </w:t>
-      </w:r>
-      <m:oMath>
-        <m:r>
-          <m:t>11.34</m:t>
-        </m:r>
-        <m:r>
-          <m:rPr>
-            <m:sty m:val="p"/>
-          </m:rPr>
-          <m:t>%</m:t>
-        </m:r>
-      </m:oMath>
-      <w:r>
-        <w:t xml:space="preserve"> </w:t>
-      </w:r>
-      <w:r>
-        <w:t xml:space="preserve">around</w:t>
-      </w:r>
-      <w:r>
-        <w:t xml:space="preserve"> </w:t>
-      </w:r>
-      <m:oMath>
-        <m:r>
-          <m:t>79</m:t>
-        </m:r>
-        <m:r>
-          <m:rPr>
-            <m:sty m:val="p"/>
-          </m:rPr>
-          <m:t>,</m:t>
-        </m:r>
-        <m:r>
-          <m:t>320</m:t>
-        </m:r>
-      </m:oMath>
-      <w:r>
-        <w:t xml:space="preserve">, and its within-condition</w:t>
-      </w:r>
-      <w:r>
-        <w:t xml:space="preserve"> </w:t>
-      </w:r>
-      <w:r>
-        <w:t xml:space="preserve">range of</w:t>
-      </w:r>
-      <w:r>
-        <w:t xml:space="preserve"> </w:t>
-      </w:r>
-      <m:oMath>
-        <m:r>
-          <m:t>17</m:t>
-        </m:r>
-        <m:r>
-          <m:rPr>
-            <m:sty m:val="p"/>
-          </m:rPr>
-          <m:t>,</m:t>
-        </m:r>
-        <m:r>
-          <m:t>231</m:t>
-        </m:r>
-      </m:oMath>
-      <w:r>
-        <w:t xml:space="preserve"> </w:t>
-      </w:r>
-      <w:r>
-        <w:t xml:space="preserve">tokens covers</w:t>
-      </w:r>
-      <w:r>
-        <w:t xml:space="preserve"> </w:t>
-      </w:r>
-      <m:oMath>
-        <m:r>
-          <m:t>61.1</m:t>
-        </m:r>
-        <m:r>
-          <m:rPr>
-            <m:sty m:val="p"/>
-          </m:rPr>
-          <m:t>%</m:t>
-        </m:r>
-      </m:oMath>
-      <w:r>
-        <w:t xml:space="preserve"> </w:t>
-      </w:r>
-      <w:r>
-        <w:t xml:space="preserve">of the gap between the conditions. The</w:t>
-      </w:r>
-      <w:r>
-        <w:t xml:space="preserve"> </w:t>
-      </w:r>
-      <w:r>
-        <w:t xml:space="preserve">falsifier of the second cost decision therefore fired for one condition, and the</w:t>
-      </w:r>
-      <w:r>
-        <w:t xml:space="preserve"> </w:t>
-      </w:r>
-      <w:r>
-        <w:t xml:space="preserve">decision is recorded as refined by measurement.</w:t>
-      </w:r>
-    </w:p>
-    <w:p>
-      <w:pPr>
-        <w:pStyle w:val="BodyText"/>
-      </w:pPr>
-      <w:r>
-        <w:t xml:space="preserve">Cost quantities are consequently reported as means over repeats with their observed</w:t>
-      </w:r>
-      <w:r>
-        <w:t xml:space="preserve"> </w:t>
-      </w:r>
-      <w:r>
-        <w:t xml:space="preserve">spread, never as a single episode, and the retrieval condition is treated as needing</w:t>
-      </w:r>
-      <w:r>
-        <w:t xml:space="preserve"> </w:t>
-      </w:r>
-      <w:r>
-        <w:t xml:space="preserve">more repeats than the minimal one. Agents are independently reported to show</w:t>
-      </w:r>
-      <w:r>
-        <w:t xml:space="preserve"> </w:t>
-      </w:r>
-      <w:r>
-        <w:t xml:space="preserve">substantial run-to-run variance under identical tasks, tools, and environment</w:t>
-      </w:r>
-      <w:r>
-        <w:t xml:space="preserve"> </w:t>
-      </w:r>
-      <w:r>
-        <w:t xml:space="preserve">[56], and model outputs are not deterministic for a fixed prompt</w:t>
-      </w:r>
-      <w:r>
-        <w:t xml:space="preserve"> </w:t>
-      </w:r>
-      <w:r>
-        <w:t xml:space="preserve">[57]. One mechanism is consistent with the four-fold larger</w:t>
-      </w:r>
-      <w:r>
-        <w:t xml:space="preserve"> </w:t>
-      </w:r>
-      <w:r>
-        <w:t xml:space="preserve">spread and is recorded as a hypothesis rather than a result: when retrieval is</w:t>
-      </w:r>
-      <w:r>
-        <w:t xml:space="preserve"> </w:t>
-      </w:r>
-      <w:r>
-        <w:t xml:space="preserve">available the agent chooses how much of the evidence pack to read, so context cost is</w:t>
-      </w:r>
-      <w:r>
-        <w:t xml:space="preserve"> </w:t>
-      </w:r>
-      <w:r>
-        <w:t xml:space="preserve">partly an outcome of its behaviour rather than a fixed property of the condition.</w:t>
-      </w:r>
-      <w:r>
-        <w:t xml:space="preserve"> </w:t>
-      </w:r>
-      <w:r>
-        <w:t xml:space="preserve">Testing that would require instrumenting reads per episode, which this design does not</w:t>
-      </w:r>
-      <w:r>
-        <w:t xml:space="preserve"> </w:t>
-      </w:r>
-      <w:r>
-        <w:t xml:space="preserve">yet do. Dollar cost remains excluded from</w:t>
-      </w:r>
-      <w:r>
-        <w:t xml:space="preserve"> </w:t>
-      </w:r>
-      <w:r>
-        <w:t xml:space="preserve">comparisons because it still varies with cache state. Two limits are attached. The two</w:t>
-      </w:r>
-      <w:r>
-        <w:t xml:space="preserve"> </w:t>
-      </w:r>
-      <w:r>
-        <w:t xml:space="preserve">episodes differ in both factors at once and each condition ran once, so nothing here</w:t>
-      </w:r>
-      <w:r>
-        <w:t xml:space="preserve"> </w:t>
-      </w:r>
-      <w:r>
-        <w:t xml:space="preserve">attributes cost to retrieval or to the scaffold separately; one run scores one</w:t>
-      </w:r>
-      <w:r>
-        <w:t xml:space="preserve"> </w:t>
-      </w:r>
-      <w:r>
-        <w:t xml:space="preserve">implementation and cannot separate an idea from its realisation</w:t>
-      </w:r>
-      <w:r>
-        <w:t xml:space="preserve"> </w:t>
-      </w:r>
-      <w:r>
-        <w:t xml:space="preserve">[58]. And cost belongs beside the endpoint rather than behind it,</w:t>
-      </w:r>
-      <w:r>
-        <w:t xml:space="preserve"> </w:t>
-      </w:r>
-      <w:r>
-        <w:t xml:space="preserve">since a change can raise interaction cost in ways task completion does not reveal</w:t>
-      </w:r>
-      <w:r>
-        <w:t xml:space="preserve"> </w:t>
-      </w:r>
-      <w:r>
-        <w:t xml:space="preserve">[59], while caching alters money without altering work</w:t>
-      </w:r>
-      <w:r>
-        <w:t xml:space="preserve"> </w:t>
-      </w:r>
-      <w:r>
-        <w:t xml:space="preserve">[60]. This is consistent with evidence that agent</w:t>
-      </w:r>
-      <w:r>
-        <w:t xml:space="preserve"> </w:t>
-      </w:r>
-      <w:r>
-        <w:t xml:space="preserve">cost is carried differently by input tokens, output tokens, context, cache, and</w:t>
-      </w:r>
-      <w:r>
-        <w:t xml:space="preserve"> </w:t>
-      </w:r>
-      <w:r>
-        <w:t xml:space="preserve">price [61], and that provider-reported totals can conceal</w:t>
-      </w:r>
-      <w:r>
-        <w:t xml:space="preserve"> </w:t>
-      </w:r>
-      <w:r>
-        <w:t xml:space="preserve">materially different accounting [62]. It also records a</w:t>
-      </w:r>
-      <w:r>
-        <w:t xml:space="preserve"> </w:t>
-      </w:r>
-      <w:r>
-        <w:t xml:space="preserve">condition on any future effect claim from this design: augmentation gains have been</w:t>
-      </w:r>
-      <w:r>
-        <w:t xml:space="preserve"> </w:t>
-      </w:r>
-      <w:r>
-        <w:t xml:space="preserve">shown to vanish against a token-matched baseline [63], so a</w:t>
-      </w:r>
-      <w:r>
-        <w:t xml:space="preserve"> </w:t>
-      </w:r>
-      <w:r>
-        <w:t xml:space="preserve">comparison here must be budget-matched and not merely condition-matched.</w:t>
-      </w:r>
-    </w:p>
-    <w:bookmarkEnd w:id="57"/>
-    <w:bookmarkStart w:id="58" w:name="X782ae78defcb34d28636704b3c8bd73b8faa49a"/>
+        <w:t xml:space="preserve">Three limits are attached to this table. The two conditions differ in both factors at</w:t>
+      </w:r>
+      <w:r>
+        <w:t xml:space="preserve"> </w:t>
+      </w:r>
+      <w:r>
+        <w:t xml:space="preserve">once with three repeats each, so nothing here attributes cost to retrieval or to the</w:t>
+      </w:r>
+      <w:r>
+        <w:t xml:space="preserve"> </w:t>
+      </w:r>
+      <w:r>
+        <w:t xml:space="preserve">scaffold separately; one run scores one implementation and cannot separate an idea from</w:t>
+      </w:r>
+      <w:r>
+        <w:t xml:space="preserve"> </w:t>
+      </w:r>
+      <w:r>
+        <w:t xml:space="preserve">its realisation [56]. Both conditions vary substantially, which is</w:t>
+      </w:r>
+      <w:r>
+        <w:t xml:space="preserve"> </w:t>
+      </w:r>
+      <w:r>
+        <w:t xml:space="preserve">consistent with reports that agents show large run-to-run variance under identical</w:t>
+      </w:r>
+      <w:r>
+        <w:t xml:space="preserve"> </w:t>
+      </w:r>
+      <w:r>
+        <w:t xml:space="preserve">tasks, tools, and environment [57] and that model outputs are not</w:t>
+      </w:r>
+      <w:r>
+        <w:t xml:space="preserve"> </w:t>
+      </w:r>
+      <w:r>
+        <w:t xml:space="preserve">deterministic for a fixed prompt [58]. And dollar cost is excluded</w:t>
+      </w:r>
+      <w:r>
+        <w:t xml:space="preserve"> </w:t>
+      </w:r>
+      <w:r>
+        <w:t xml:space="preserve">from comparison because caching alters money without altering work</w:t>
+      </w:r>
+      <w:r>
+        <w:t xml:space="preserve"> </w:t>
+      </w:r>
+      <w:r>
+        <w:t xml:space="preserve">[59], while provider totals can conceal different accounting</w:t>
+      </w:r>
+      <w:r>
+        <w:t xml:space="preserve"> </w:t>
+      </w:r>
+      <w:r>
+        <w:t xml:space="preserve">[60]; cost belongs beside the endpoint rather than behind it</w:t>
+      </w:r>
+      <w:r>
+        <w:t xml:space="preserve"> </w:t>
+      </w:r>
+      <w:r>
+        <w:t xml:space="preserve">[61], and any future effect claim from this design must be</w:t>
+      </w:r>
+      <w:r>
+        <w:t xml:space="preserve"> </w:t>
+      </w:r>
+      <w:r>
+        <w:t xml:space="preserve">budget-matched rather than merely condition-matched [62], since</w:t>
+      </w:r>
+      <w:r>
+        <w:t xml:space="preserve"> </w:t>
+      </w:r>
+      <w:r>
+        <w:t xml:space="preserve">agent cost is carried differently by its components [63].</w:t>
+      </w:r>
+    </w:p>
+    <w:bookmarkEnd w:id="58"/>
+    <w:bookmarkStart w:id="59" w:name="X782ae78defcb34d28636704b3c8bd73b8faa49a"/>
     <w:p>
       <w:pPr>
         <w:pStyle w:val="Heading2"/>
@@ -6369,9 +6275,9 @@
         <w:t xml:space="preserve">substitutes for understanding rather than supplying it [66].</w:t>
       </w:r>
     </w:p>
-    <w:bookmarkEnd w:id="58"/>
     <w:bookmarkEnd w:id="59"/>
-    <w:bookmarkStart w:id="117" w:name="conclusions"/>
+    <w:bookmarkEnd w:id="60"/>
+    <w:bookmarkStart w:id="118" w:name="conclusions"/>
     <w:p>
       <w:pPr>
         <w:pStyle w:val="Heading1"/>
@@ -6655,7 +6561,7 @@
       <w:r>
         <w:t xml:space="preserve"> </w:t>
       </w:r>
-      <w:hyperlink r:id="rId60">
+      <w:hyperlink r:id="rId61">
         <w:r>
           <w:rPr>
             <w:rStyle w:val="Hyperlink"/>
@@ -6702,7 +6608,7 @@
       <w:r>
         <w:t xml:space="preserve"> </w:t>
       </w:r>
-      <w:hyperlink r:id="rId61">
+      <w:hyperlink r:id="rId62">
         <w:r>
           <w:rPr>
             <w:rStyle w:val="Hyperlink"/>
@@ -6743,7 +6649,7 @@
       <w:r>
         <w:t xml:space="preserve"> </w:t>
       </w:r>
-      <w:hyperlink r:id="rId62">
+      <w:hyperlink r:id="rId63">
         <w:r>
           <w:rPr>
             <w:rStyle w:val="Hyperlink"/>
@@ -6796,7 +6702,7 @@
       <w:r>
         <w:t xml:space="preserve"> </w:t>
       </w:r>
-      <w:hyperlink r:id="rId63">
+      <w:hyperlink r:id="rId64">
         <w:r>
           <w:rPr>
             <w:rStyle w:val="Hyperlink"/>
@@ -6837,7 +6743,7 @@
       <w:r>
         <w:t xml:space="preserve"> </w:t>
       </w:r>
-      <w:hyperlink r:id="rId64">
+      <w:hyperlink r:id="rId65">
         <w:r>
           <w:rPr>
             <w:rStyle w:val="Hyperlink"/>
@@ -6878,7 +6784,7 @@
       <w:r>
         <w:t xml:space="preserve"> </w:t>
       </w:r>
-      <w:hyperlink r:id="rId65">
+      <w:hyperlink r:id="rId66">
         <w:r>
           <w:rPr>
             <w:rStyle w:val="Hyperlink"/>
@@ -6919,7 +6825,7 @@
       <w:r>
         <w:t xml:space="preserve"> </w:t>
       </w:r>
-      <w:hyperlink r:id="rId66">
+      <w:hyperlink r:id="rId67">
         <w:r>
           <w:rPr>
             <w:rStyle w:val="Hyperlink"/>
@@ -6960,7 +6866,7 @@
       <w:r>
         <w:t xml:space="preserve"> </w:t>
       </w:r>
-      <w:hyperlink r:id="rId67">
+      <w:hyperlink r:id="rId68">
         <w:r>
           <w:rPr>
             <w:rStyle w:val="Hyperlink"/>
@@ -7001,7 +6907,7 @@
       <w:r>
         <w:t xml:space="preserve"> </w:t>
       </w:r>
-      <w:hyperlink r:id="rId68">
+      <w:hyperlink r:id="rId69">
         <w:r>
           <w:rPr>
             <w:rStyle w:val="Hyperlink"/>
@@ -7048,7 +6954,7 @@
       <w:r>
         <w:t xml:space="preserve"> </w:t>
       </w:r>
-      <w:hyperlink r:id="rId69">
+      <w:hyperlink r:id="rId70">
         <w:r>
           <w:rPr>
             <w:rStyle w:val="Hyperlink"/>
@@ -7113,7 +7019,7 @@
       <w:r>
         <w:t xml:space="preserve"> </w:t>
       </w:r>
-      <w:hyperlink r:id="rId70">
+      <w:hyperlink r:id="rId71">
         <w:r>
           <w:rPr>
             <w:rStyle w:val="Hyperlink"/>
@@ -7154,7 +7060,7 @@
       <w:r>
         <w:t xml:space="preserve"> </w:t>
       </w:r>
-      <w:hyperlink r:id="rId71">
+      <w:hyperlink r:id="rId72">
         <w:r>
           <w:rPr>
             <w:rStyle w:val="Hyperlink"/>
@@ -7209,7 +7115,7 @@
       <w:r>
         <w:t xml:space="preserve"> </w:t>
       </w:r>
-      <w:hyperlink r:id="rId72">
+      <w:hyperlink r:id="rId73">
         <w:r>
           <w:rPr>
             <w:rStyle w:val="Hyperlink"/>
@@ -7256,7 +7162,7 @@
       <w:r>
         <w:t xml:space="preserve"> </w:t>
       </w:r>
-      <w:hyperlink r:id="rId73">
+      <w:hyperlink r:id="rId74">
         <w:r>
           <w:rPr>
             <w:rStyle w:val="Hyperlink"/>
@@ -7311,7 +7217,7 @@
       <w:r>
         <w:t xml:space="preserve"> </w:t>
       </w:r>
-      <w:hyperlink r:id="rId74">
+      <w:hyperlink r:id="rId75">
         <w:r>
           <w:rPr>
             <w:rStyle w:val="Hyperlink"/>
@@ -7366,7 +7272,7 @@
       <w:r>
         <w:t xml:space="preserve"> </w:t>
       </w:r>
-      <w:hyperlink r:id="rId75">
+      <w:hyperlink r:id="rId76">
         <w:r>
           <w:rPr>
             <w:rStyle w:val="Hyperlink"/>
@@ -7407,7 +7313,7 @@
       <w:r>
         <w:t xml:space="preserve"> </w:t>
       </w:r>
-      <w:hyperlink r:id="rId76">
+      <w:hyperlink r:id="rId77">
         <w:r>
           <w:rPr>
             <w:rStyle w:val="Hyperlink"/>
@@ -7448,7 +7354,7 @@
       <w:r>
         <w:t xml:space="preserve"> </w:t>
       </w:r>
-      <w:hyperlink r:id="rId77">
+      <w:hyperlink r:id="rId78">
         <w:r>
           <w:rPr>
             <w:rStyle w:val="Hyperlink"/>
@@ -7503,7 +7409,7 @@
       <w:r>
         <w:t xml:space="preserve"> </w:t>
       </w:r>
-      <w:hyperlink r:id="rId78">
+      <w:hyperlink r:id="rId79">
         <w:r>
           <w:rPr>
             <w:rStyle w:val="Hyperlink"/>
@@ -7558,7 +7464,7 @@
       <w:r>
         <w:t xml:space="preserve"> </w:t>
       </w:r>
-      <w:hyperlink r:id="rId79">
+      <w:hyperlink r:id="rId80">
         <w:r>
           <w:rPr>
             <w:rStyle w:val="Hyperlink"/>
@@ -7613,7 +7519,7 @@
       <w:r>
         <w:t xml:space="preserve"> </w:t>
       </w:r>
-      <w:hyperlink r:id="rId80">
+      <w:hyperlink r:id="rId81">
         <w:r>
           <w:rPr>
             <w:rStyle w:val="Hyperlink"/>
@@ -7668,7 +7574,7 @@
       <w:r>
         <w:t xml:space="preserve"> </w:t>
       </w:r>
-      <w:hyperlink r:id="rId81">
+      <w:hyperlink r:id="rId82">
         <w:r>
           <w:rPr>
             <w:rStyle w:val="Hyperlink"/>
@@ -7723,7 +7629,7 @@
       <w:r>
         <w:t xml:space="preserve"> </w:t>
       </w:r>
-      <w:hyperlink r:id="rId82">
+      <w:hyperlink r:id="rId83">
         <w:r>
           <w:rPr>
             <w:rStyle w:val="Hyperlink"/>
@@ -7778,7 +7684,7 @@
       <w:r>
         <w:t xml:space="preserve"> </w:t>
       </w:r>
-      <w:hyperlink r:id="rId83">
+      <w:hyperlink r:id="rId84">
         <w:r>
           <w:rPr>
             <w:rStyle w:val="Hyperlink"/>
@@ -7819,7 +7725,7 @@
       <w:r>
         <w:t xml:space="preserve"> </w:t>
       </w:r>
-      <w:hyperlink r:id="rId84">
+      <w:hyperlink r:id="rId85">
         <w:r>
           <w:rPr>
             <w:rStyle w:val="Hyperlink"/>
@@ -7860,7 +7766,7 @@
       <w:r>
         <w:t xml:space="preserve"> </w:t>
       </w:r>
-      <w:hyperlink r:id="rId85">
+      <w:hyperlink r:id="rId86">
         <w:r>
           <w:rPr>
             <w:rStyle w:val="Hyperlink"/>
@@ -7901,7 +7807,7 @@
       <w:r>
         <w:t xml:space="preserve"> </w:t>
       </w:r>
-      <w:hyperlink r:id="rId86">
+      <w:hyperlink r:id="rId87">
         <w:r>
           <w:rPr>
             <w:rStyle w:val="Hyperlink"/>
@@ -7956,7 +7862,7 @@
       <w:r>
         <w:t xml:space="preserve"> </w:t>
       </w:r>
-      <w:hyperlink r:id="rId87">
+      <w:hyperlink r:id="rId88">
         <w:r>
           <w:rPr>
             <w:rStyle w:val="Hyperlink"/>
@@ -7997,7 +7903,7 @@
       <w:r>
         <w:t xml:space="preserve"> </w:t>
       </w:r>
-      <w:hyperlink r:id="rId88">
+      <w:hyperlink r:id="rId89">
         <w:r>
           <w:rPr>
             <w:rStyle w:val="Hyperlink"/>
@@ -8052,7 +7958,7 @@
       <w:r>
         <w:t xml:space="preserve"> </w:t>
       </w:r>
-      <w:hyperlink r:id="rId89">
+      <w:hyperlink r:id="rId90">
         <w:r>
           <w:rPr>
             <w:rStyle w:val="Hyperlink"/>
@@ -8105,7 +8011,7 @@
       <w:r>
         <w:t xml:space="preserve"> </w:t>
       </w:r>
-      <w:hyperlink r:id="rId90">
+      <w:hyperlink r:id="rId91">
         <w:r>
           <w:rPr>
             <w:rStyle w:val="Hyperlink"/>
@@ -8160,7 +8066,7 @@
       <w:r>
         <w:t xml:space="preserve"> </w:t>
       </w:r>
-      <w:hyperlink r:id="rId91">
+      <w:hyperlink r:id="rId92">
         <w:r>
           <w:rPr>
             <w:rStyle w:val="Hyperlink"/>
@@ -8215,7 +8121,7 @@
       <w:r>
         <w:t xml:space="preserve"> </w:t>
       </w:r>
-      <w:hyperlink r:id="rId92">
+      <w:hyperlink r:id="rId93">
         <w:r>
           <w:rPr>
             <w:rStyle w:val="Hyperlink"/>
@@ -8256,7 +8162,7 @@
       <w:r>
         <w:t xml:space="preserve"> </w:t>
       </w:r>
-      <w:hyperlink r:id="rId93">
+      <w:hyperlink r:id="rId94">
         <w:r>
           <w:rPr>
             <w:rStyle w:val="Hyperlink"/>
@@ -8311,7 +8217,7 @@
       <w:r>
         <w:t xml:space="preserve"> </w:t>
       </w:r>
-      <w:hyperlink r:id="rId94">
+      <w:hyperlink r:id="rId95">
         <w:r>
           <w:rPr>
             <w:rStyle w:val="Hyperlink"/>
@@ -8366,7 +8272,7 @@
       <w:r>
         <w:t xml:space="preserve"> </w:t>
       </w:r>
-      <w:hyperlink r:id="rId95">
+      <w:hyperlink r:id="rId96">
         <w:r>
           <w:rPr>
             <w:rStyle w:val="Hyperlink"/>
@@ -8413,7 +8319,7 @@
       <w:r>
         <w:t xml:space="preserve"> </w:t>
       </w:r>
-      <w:hyperlink r:id="rId96">
+      <w:hyperlink r:id="rId97">
         <w:r>
           <w:rPr>
             <w:rStyle w:val="Hyperlink"/>
@@ -8454,7 +8360,7 @@
       <w:r>
         <w:t xml:space="preserve"> </w:t>
       </w:r>
-      <w:hyperlink r:id="rId97">
+      <w:hyperlink r:id="rId98">
         <w:r>
           <w:rPr>
             <w:rStyle w:val="Hyperlink"/>
@@ -8509,7 +8415,7 @@
       <w:r>
         <w:t xml:space="preserve"> </w:t>
       </w:r>
-      <w:hyperlink r:id="rId98">
+      <w:hyperlink r:id="rId99">
         <w:r>
           <w:rPr>
             <w:rStyle w:val="Hyperlink"/>
@@ -8550,7 +8456,7 @@
       <w:r>
         <w:t xml:space="preserve"> </w:t>
       </w:r>
-      <w:hyperlink r:id="rId99">
+      <w:hyperlink r:id="rId100">
         <w:r>
           <w:rPr>
             <w:rStyle w:val="Hyperlink"/>
@@ -8597,7 +8503,7 @@
       <w:r>
         <w:t xml:space="preserve"> </w:t>
       </w:r>
-      <w:hyperlink r:id="rId100">
+      <w:hyperlink r:id="rId101">
         <w:r>
           <w:rPr>
             <w:rStyle w:val="Hyperlink"/>
@@ -8644,7 +8550,7 @@
       <w:r>
         <w:t xml:space="preserve"> </w:t>
       </w:r>
-      <w:hyperlink r:id="rId101">
+      <w:hyperlink r:id="rId102">
         <w:r>
           <w:rPr>
             <w:rStyle w:val="Hyperlink"/>
@@ -8691,7 +8597,7 @@
       <w:r>
         <w:t xml:space="preserve"> </w:t>
       </w:r>
-      <w:hyperlink r:id="rId102">
+      <w:hyperlink r:id="rId103">
         <w:r>
           <w:rPr>
             <w:rStyle w:val="Hyperlink"/>
@@ -8746,7 +8652,7 @@
       <w:r>
         <w:t xml:space="preserve"> </w:t>
       </w:r>
-      <w:hyperlink r:id="rId103">
+      <w:hyperlink r:id="rId104">
         <w:r>
           <w:rPr>
             <w:rStyle w:val="Hyperlink"/>
@@ -8787,7 +8693,7 @@
       <w:r>
         <w:t xml:space="preserve"> </w:t>
       </w:r>
-      <w:hyperlink r:id="rId104">
+      <w:hyperlink r:id="rId105">
         <w:r>
           <w:rPr>
             <w:rStyle w:val="Hyperlink"/>
@@ -8828,7 +8734,7 @@
       <w:r>
         <w:t xml:space="preserve"> </w:t>
       </w:r>
-      <w:hyperlink r:id="rId105">
+      <w:hyperlink r:id="rId106">
         <w:r>
           <w:rPr>
             <w:rStyle w:val="Hyperlink"/>
@@ -8869,7 +8775,7 @@
       <w:r>
         <w:t xml:space="preserve"> </w:t>
       </w:r>
-      <w:hyperlink r:id="rId106">
+      <w:hyperlink r:id="rId107">
         <w:r>
           <w:rPr>
             <w:rStyle w:val="Hyperlink"/>
@@ -8910,7 +8816,7 @@
       <w:r>
         <w:t xml:space="preserve"> </w:t>
       </w:r>
-      <w:hyperlink r:id="rId107">
+      <w:hyperlink r:id="rId108">
         <w:r>
           <w:rPr>
             <w:rStyle w:val="Hyperlink"/>
@@ -8951,7 +8857,7 @@
       <w:r>
         <w:t xml:space="preserve"> </w:t>
       </w:r>
-      <w:hyperlink r:id="rId108">
+      <w:hyperlink r:id="rId109">
         <w:r>
           <w:rPr>
             <w:rStyle w:val="Hyperlink"/>
@@ -8992,7 +8898,7 @@
       <w:r>
         <w:t xml:space="preserve"> </w:t>
       </w:r>
-      <w:hyperlink r:id="rId109">
+      <w:hyperlink r:id="rId110">
         <w:r>
           <w:rPr>
             <w:rStyle w:val="Hyperlink"/>
@@ -9033,7 +8939,7 @@
       <w:r>
         <w:t xml:space="preserve"> </w:t>
       </w:r>
-      <w:hyperlink r:id="rId110">
+      <w:hyperlink r:id="rId111">
         <w:r>
           <w:rPr>
             <w:rStyle w:val="Hyperlink"/>
@@ -9074,7 +8980,7 @@
       <w:r>
         <w:t xml:space="preserve"> </w:t>
       </w:r>
-      <w:hyperlink r:id="rId111">
+      <w:hyperlink r:id="rId112">
         <w:r>
           <w:rPr>
             <w:rStyle w:val="Hyperlink"/>
@@ -9115,7 +9021,7 @@
       <w:r>
         <w:t xml:space="preserve"> </w:t>
       </w:r>
-      <w:hyperlink r:id="rId112">
+      <w:hyperlink r:id="rId113">
         <w:r>
           <w:rPr>
             <w:rStyle w:val="Hyperlink"/>
@@ -9156,7 +9062,7 @@
       <w:r>
         <w:t xml:space="preserve"> </w:t>
       </w:r>
-      <w:hyperlink r:id="rId113">
+      <w:hyperlink r:id="rId114">
         <w:r>
           <w:rPr>
             <w:rStyle w:val="Hyperlink"/>
@@ -9197,7 +9103,7 @@
       <w:r>
         <w:t xml:space="preserve"> </w:t>
       </w:r>
-      <w:hyperlink r:id="rId114">
+      <w:hyperlink r:id="rId115">
         <w:r>
           <w:rPr>
             <w:rStyle w:val="Hyperlink"/>
@@ -9214,6 +9120,26 @@
         <w:pStyle w:val="BodyText"/>
       </w:pPr>
       <w:r>
+        <w:t xml:space="preserve">J. Ning et al.,</w:t>
+      </w:r>
+      <w:r>
+        <w:t xml:space="preserve"> </w:t>
+      </w:r>
+      <w:r>
+        <w:t xml:space="preserve">“One Run Is Not an Idea: The Implementation Lottery in Automated Research,”</w:t>
+      </w:r>
+      <w:r>
+        <w:t xml:space="preserve"> </w:t>
+      </w:r>
+      <w:r>
+        <w:t xml:space="preserve">arXiv:2607.26587v1, 2026.</w:t>
+      </w:r>
+    </w:p>
+    <w:p>
+      <w:pPr>
+        <w:pStyle w:val="BodyText"/>
+      </w:pPr>
+      <w:r>
         <w:t xml:space="preserve">S. Dhage et al.,</w:t>
       </w:r>
       <w:r>
@@ -9254,19 +9180,19 @@
         <w:pStyle w:val="BodyText"/>
       </w:pPr>
       <w:r>
-        <w:t xml:space="preserve">J. Ning et al.,</w:t>
-      </w:r>
-      <w:r>
-        <w:t xml:space="preserve"> </w:t>
-      </w:r>
-      <w:r>
-        <w:t xml:space="preserve">“One Run Is Not an Idea: The Implementation Lottery in Automated Research,”</w:t>
-      </w:r>
-      <w:r>
-        <w:t xml:space="preserve"> </w:t>
-      </w:r>
-      <w:r>
-        <w:t xml:space="preserve">arXiv:2607.26587v1, 2026.</w:t>
+        <w:t xml:space="preserve">E. Lumer et al.,</w:t>
+      </w:r>
+      <w:r>
+        <w:t xml:space="preserve"> </w:t>
+      </w:r>
+      <w:r>
+        <w:t xml:space="preserve">“Don’t Break the Cache: An Evaluation of Prompt Caching for Long-Horizon Agentic Tasks,”</w:t>
+      </w:r>
+      <w:r>
+        <w:t xml:space="preserve"> </w:t>
+      </w:r>
+      <w:r>
+        <w:t xml:space="preserve">arXiv:2601.06007v2, 2026.</w:t>
       </w:r>
     </w:p>
     <w:p>
@@ -9274,6 +9200,26 @@
         <w:pStyle w:val="BodyText"/>
       </w:pPr>
       <w:r>
+        <w:t xml:space="preserve">R. Bhalgami et al.,</w:t>
+      </w:r>
+      <w:r>
+        <w:t xml:space="preserve"> </w:t>
+      </w:r>
+      <w:r>
+        <w:t xml:space="preserve">“Pixels for Programs? A Cross-Provider Case Study of Input-Token Accounting for Source Code as Text and Images,”</w:t>
+      </w:r>
+      <w:r>
+        <w:t xml:space="preserve"> </w:t>
+      </w:r>
+      <w:r>
+        <w:t xml:space="preserve">arXiv:2607.21672v1, 2026.</w:t>
+      </w:r>
+    </w:p>
+    <w:p>
+      <w:pPr>
+        <w:pStyle w:val="BodyText"/>
+      </w:pPr>
+      <w:r>
         <w:t xml:space="preserve">S. Liu et al.,</w:t>
       </w:r>
       <w:r>
@@ -9294,19 +9240,19 @@
         <w:pStyle w:val="BodyText"/>
       </w:pPr>
       <w:r>
-        <w:t xml:space="preserve">E. Lumer et al.,</w:t>
-      </w:r>
-      <w:r>
-        <w:t xml:space="preserve"> </w:t>
-      </w:r>
-      <w:r>
-        <w:t xml:space="preserve">“Don’t Break the Cache: An Evaluation of Prompt Caching for Long-Horizon Agentic Tasks,”</w:t>
-      </w:r>
-      <w:r>
-        <w:t xml:space="preserve"> </w:t>
-      </w:r>
-      <w:r>
-        <w:t xml:space="preserve">arXiv:2601.06007v2, 2026.</w:t>
+        <w:t xml:space="preserve">S. Hajimiri et al.,</w:t>
+      </w:r>
+      <w:r>
+        <w:t xml:space="preserve"> </w:t>
+      </w:r>
+      <w:r>
+        <w:t xml:space="preserve">“Are Online Skill and Memory Modules Always Worth Their Tokens? A Budget-Constrained Re-Evaluation,”</w:t>
+      </w:r>
+      <w:r>
+        <w:t xml:space="preserve"> </w:t>
+      </w:r>
+      <w:r>
+        <w:t xml:space="preserve">arXiv:2606.15017v2, 2026.</w:t>
       </w:r>
     </w:p>
     <w:p>
@@ -9327,46 +9273,6 @@
       </w:r>
       <w:r>
         <w:t xml:space="preserve">arXiv:2608.01347v5, 2026.</w:t>
-      </w:r>
-    </w:p>
-    <w:p>
-      <w:pPr>
-        <w:pStyle w:val="BodyText"/>
-      </w:pPr>
-      <w:r>
-        <w:t xml:space="preserve">R. Bhalgami et al.,</w:t>
-      </w:r>
-      <w:r>
-        <w:t xml:space="preserve"> </w:t>
-      </w:r>
-      <w:r>
-        <w:t xml:space="preserve">“Pixels for Programs? A Cross-Provider Case Study of Input-Token Accounting for Source Code as Text and Images,”</w:t>
-      </w:r>
-      <w:r>
-        <w:t xml:space="preserve"> </w:t>
-      </w:r>
-      <w:r>
-        <w:t xml:space="preserve">arXiv:2607.21672v1, 2026.</w:t>
-      </w:r>
-    </w:p>
-    <w:p>
-      <w:pPr>
-        <w:pStyle w:val="BodyText"/>
-      </w:pPr>
-      <w:r>
-        <w:t xml:space="preserve">S. Hajimiri et al.,</w:t>
-      </w:r>
-      <w:r>
-        <w:t xml:space="preserve"> </w:t>
-      </w:r>
-      <w:r>
-        <w:t xml:space="preserve">“Are Online Skill and Memory Modules Always Worth Their Tokens? A Budget-Constrained Re-Evaluation,”</w:t>
-      </w:r>
-      <w:r>
-        <w:t xml:space="preserve"> </w:t>
-      </w:r>
-      <w:r>
-        <w:t xml:space="preserve">arXiv:2606.15017v2, 2026.</w:t>
       </w:r>
     </w:p>
     <w:p>
@@ -9458,7 +9364,7 @@
       <w:r>
         <w:t xml:space="preserve"> </w:t>
       </w:r>
-      <w:hyperlink r:id="rId115">
+      <w:hyperlink r:id="rId116">
         <w:r>
           <w:rPr>
             <w:rStyle w:val="Hyperlink"/>
@@ -9499,7 +9405,7 @@
       <w:r>
         <w:t xml:space="preserve"> </w:t>
       </w:r>
-      <w:hyperlink r:id="rId116">
+      <w:hyperlink r:id="rId117">
         <w:r>
           <w:rPr>
             <w:rStyle w:val="Hyperlink"/>
@@ -9511,7 +9417,7 @@
         <w:t xml:space="preserve">.</w:t>
       </w:r>
     </w:p>
-    <w:bookmarkEnd w:id="117"/>
+    <w:bookmarkEnd w:id="118"/>
     <w:sectPr>
       <w:footerReference w:type="default" r:id="rIdFtr1"/>
       <w:footnotePr>

</xml_diff>

<commit_message>
feat(paper): audit instruments by mutation and close four undetected fault classes
</commit_message>
<xml_diff>
--- a/paper/word/graduation-thesis.docx
+++ b/paper/word/graduation-thesis.docx
@@ -4600,7 +4600,7 @@
     <w:bookmarkEnd w:id="48"/>
     <w:bookmarkEnd w:id="49"/>
     <w:bookmarkEnd w:id="50"/>
-    <w:bookmarkStart w:id="60" w:name="experimental-results"/>
+    <w:bookmarkStart w:id="61" w:name="experimental-results"/>
     <w:p>
       <w:pPr>
         <w:pStyle w:val="Heading1"/>
@@ -6095,12 +6095,174 @@
       </w:r>
     </w:p>
     <w:bookmarkEnd w:id="58"/>
-    <w:bookmarkStart w:id="59" w:name="X782ae78defcb34d28636704b3c8bd73b8faa49a"/>
+    <w:bookmarkStart w:id="59" w:name="auditing-the-instruments-by-mutation"/>
     <w:p>
       <w:pPr>
         <w:pStyle w:val="Heading2"/>
       </w:pPr>
       <w:r>
+        <w:t xml:space="preserve">Auditing the instruments by mutation</w:t>
+      </w:r>
+    </w:p>
+    <w:p>
+      <w:pPr>
+        <w:pStyle w:val="FirstParagraph"/>
+      </w:pPr>
+      <w:r>
+        <w:t xml:space="preserve">Finding one instrument wrong while its suite passed made the other suites suspect, so</w:t>
+      </w:r>
+      <w:r>
+        <w:t xml:space="preserve"> </w:t>
+      </w:r>
+      <w:r>
+        <w:t xml:space="preserve">they were audited by injecting faults rather than by reading. Seventeen semantic</w:t>
+      </w:r>
+      <w:r>
+        <w:t xml:space="preserve"> </w:t>
+      </w:r>
+      <w:r>
+        <w:t xml:space="preserve">mutations were applied one at a time to six instrument modules, each paired suite was</w:t>
+      </w:r>
+      <w:r>
+        <w:t xml:space="preserve"> </w:t>
+      </w:r>
+      <w:r>
+        <w:t xml:space="preserve">run, and each module was restored and its digest checked.</w:t>
+      </w:r>
+    </w:p>
+    <w:p>
+      <w:pPr>
+        <w:pStyle w:val="BodyText"/>
+      </w:pPr>
+      <w:r>
+        <w:t xml:space="preserve">Thirteen mutations were caught and four survived. Three survivors were in scoring: an</w:t>
+      </w:r>
+      <w:r>
+        <w:t xml:space="preserve"> </w:t>
+      </w:r>
+      <w:r>
+        <w:t xml:space="preserve">episode with a dimension scored zero could pass as fatal-error-free, a fabrication</w:t>
+      </w:r>
+      <w:r>
+        <w:t xml:space="preserve"> </w:t>
+      </w:r>
+      <w:r>
+        <w:t xml:space="preserve">redline could stop blocking that endpoint, and the carry-through ratio could exceed one.</w:t>
+      </w:r>
+      <w:r>
+        <w:t xml:space="preserve"> </w:t>
+      </w:r>
+      <w:r>
+        <w:t xml:space="preserve">The fourth was more serious. The release sandbox could report a workspace as admissible</w:t>
+      </w:r>
+      <w:r>
+        <w:t xml:space="preserve"> </w:t>
+      </w:r>
+      <w:r>
+        <w:t xml:space="preserve">while a probe had fired, neutralising the whole fail-closed admission gate, and every</w:t>
+      </w:r>
+      <w:r>
+        <w:t xml:space="preserve"> </w:t>
+      </w:r>
+      <w:r>
+        <w:t xml:space="preserve">test still passed. Five fixtures were added, and the same seventeen mutations were then</w:t>
+      </w:r>
+      <w:r>
+        <w:t xml:space="preserve"> </w:t>
+      </w:r>
+      <w:r>
+        <w:t xml:space="preserve">all caught.</w:t>
+      </w:r>
+    </w:p>
+    <w:p>
+      <w:pPr>
+        <w:pStyle w:val="BodyText"/>
+      </w:pPr>
+      <w:r>
+        <w:t xml:space="preserve">The audit also exposed a defect in the test harness itself: the scoring suite computed</w:t>
+      </w:r>
+      <w:r>
+        <w:t xml:space="preserve"> </w:t>
+      </w:r>
+      <w:r>
+        <w:t xml:space="preserve">its pass tally before the newly added checks ran, so it reported fourteen of eighteen</w:t>
+      </w:r>
+      <w:r>
+        <w:t xml:space="preserve"> </w:t>
+      </w:r>
+      <w:r>
+        <w:t xml:space="preserve">while every check passed. The tally is now computed after all checks.</w:t>
+      </w:r>
+    </w:p>
+    <w:p>
+      <w:pPr>
+        <w:pStyle w:val="BodyText"/>
+      </w:pPr>
+      <w:r>
+        <w:t xml:space="preserve">This is why the audit used mutation rather than review. An oracle that takes its</w:t>
+      </w:r>
+      <w:r>
+        <w:t xml:space="preserve"> </w:t>
+      </w:r>
+      <w:r>
+        <w:t xml:space="preserve">expected value from the system it judges cannot fail, because a fault moves measurement</w:t>
+      </w:r>
+      <w:r>
+        <w:t xml:space="preserve"> </w:t>
+      </w:r>
+      <w:r>
+        <w:t xml:space="preserve">and expectation together [64], which is exactly how the cost</w:t>
+      </w:r>
+      <w:r>
+        <w:t xml:space="preserve"> </w:t>
+      </w:r>
+      <w:r>
+        <w:t xml:space="preserve">fixture protected a wrong parser. A suite can also hold high coverage while leaving a</w:t>
+      </w:r>
+      <w:r>
+        <w:t xml:space="preserve"> </w:t>
+      </w:r>
+      <w:r>
+        <w:t xml:space="preserve">documented behaviour unvalidated [65], and silent measurement</w:t>
+      </w:r>
+      <w:r>
+        <w:t xml:space="preserve"> </w:t>
+      </w:r>
+      <w:r>
+        <w:t xml:space="preserve">failure is common enough in reported incidents to treat as a primary risk rather than an</w:t>
+      </w:r>
+      <w:r>
+        <w:t xml:space="preserve"> </w:t>
+      </w:r>
+      <w:r>
+        <w:t xml:space="preserve">edge case [66]. Two limits are recorded. Catching seventeen</w:t>
+      </w:r>
+      <w:r>
+        <w:t xml:space="preserve"> </w:t>
+      </w:r>
+      <w:r>
+        <w:t xml:space="preserve">mutations does not show the instruments are correct, only that these faults are</w:t>
+      </w:r>
+      <w:r>
+        <w:t xml:space="preserve"> </w:t>
+      </w:r>
+      <w:r>
+        <w:t xml:space="preserve">detected. And three modules, the adversarial validity check, the pilot builder, and the</w:t>
+      </w:r>
+      <w:r>
+        <w:t xml:space="preserve"> </w:t>
+      </w:r>
+      <w:r>
+        <w:t xml:space="preserve">element verifier, still have no paired suite.</w:t>
+      </w:r>
+    </w:p>
+    <w:bookmarkEnd w:id="59"/>
+    <w:bookmarkStart w:id="60" w:name="X782ae78defcb34d28636704b3c8bd73b8faa49a"/>
+    <w:p>
+      <w:pPr>
+        <w:pStyle w:val="Heading2"/>
+      </w:pPr>
+      <w:r>
         <w:t xml:space="preserve">A census of the project’s own decision record</w:t>
       </w:r>
     </w:p>
@@ -6133,7 +6295,7 @@
         <w:t xml:space="preserve"> </w:t>
       </w:r>
       <w:r>
-        <w:t xml:space="preserve">lists are read [64]. Measured against the ledger digest recorded in</w:t>
+        <w:t xml:space="preserve">lists are read [67]. Measured against the ledger digest recorded in</w:t>
       </w:r>
       <w:r>
         <w:t xml:space="preserve"> </w:t>
@@ -6260,7 +6422,7 @@
         <w:t xml:space="preserve"> </w:t>
       </w:r>
       <w:r>
-        <w:t xml:space="preserve">scores calls for [65], and it is also the boundary of what</w:t>
+        <w:t xml:space="preserve">scores calls for [68], and it is also the boundary of what</w:t>
       </w:r>
       <w:r>
         <w:t xml:space="preserve"> </w:t>
@@ -6272,12 +6434,12 @@
         <w:t xml:space="preserve"> </w:t>
       </w:r>
       <w:r>
-        <w:t xml:space="preserve">substitutes for understanding rather than supplying it [66].</w:t>
-      </w:r>
-    </w:p>
-    <w:bookmarkEnd w:id="59"/>
+        <w:t xml:space="preserve">substitutes for understanding rather than supplying it [69].</w:t>
+      </w:r>
+    </w:p>
     <w:bookmarkEnd w:id="60"/>
-    <w:bookmarkStart w:id="118" w:name="conclusions"/>
+    <w:bookmarkEnd w:id="61"/>
+    <w:bookmarkStart w:id="119" w:name="conclusions"/>
     <w:p>
       <w:pPr>
         <w:pStyle w:val="Heading1"/>
@@ -6421,7 +6583,7 @@
         <w:t xml:space="preserve"> </w:t>
       </w:r>
       <w:r>
-        <w:t xml:space="preserve">single terminal score [67].</w:t>
+        <w:t xml:space="preserve">single terminal score [70].</w:t>
       </w:r>
     </w:p>
     <w:p>
@@ -6503,7 +6665,7 @@
         <w:t xml:space="preserve"> </w:t>
       </w:r>
       <w:r>
-        <w:t xml:space="preserve">[68]; this project spent 192 model calls to verify 32</w:t>
+        <w:t xml:space="preserve">[71]; this project spent 192 model calls to verify 32</w:t>
       </w:r>
       <w:r>
         <w:t xml:space="preserve"> </w:t>
@@ -6561,7 +6723,7 @@
       <w:r>
         <w:t xml:space="preserve"> </w:t>
       </w:r>
-      <w:hyperlink r:id="rId61">
+      <w:hyperlink r:id="rId62">
         <w:r>
           <w:rPr>
             <w:rStyle w:val="Hyperlink"/>
@@ -6608,7 +6770,7 @@
       <w:r>
         <w:t xml:space="preserve"> </w:t>
       </w:r>
-      <w:hyperlink r:id="rId62">
+      <w:hyperlink r:id="rId63">
         <w:r>
           <w:rPr>
             <w:rStyle w:val="Hyperlink"/>
@@ -6649,7 +6811,7 @@
       <w:r>
         <w:t xml:space="preserve"> </w:t>
       </w:r>
-      <w:hyperlink r:id="rId63">
+      <w:hyperlink r:id="rId64">
         <w:r>
           <w:rPr>
             <w:rStyle w:val="Hyperlink"/>
@@ -6702,7 +6864,7 @@
       <w:r>
         <w:t xml:space="preserve"> </w:t>
       </w:r>
-      <w:hyperlink r:id="rId64">
+      <w:hyperlink r:id="rId65">
         <w:r>
           <w:rPr>
             <w:rStyle w:val="Hyperlink"/>
@@ -6743,7 +6905,7 @@
       <w:r>
         <w:t xml:space="preserve"> </w:t>
       </w:r>
-      <w:hyperlink r:id="rId65">
+      <w:hyperlink r:id="rId66">
         <w:r>
           <w:rPr>
             <w:rStyle w:val="Hyperlink"/>
@@ -6784,7 +6946,7 @@
       <w:r>
         <w:t xml:space="preserve"> </w:t>
       </w:r>
-      <w:hyperlink r:id="rId66">
+      <w:hyperlink r:id="rId67">
         <w:r>
           <w:rPr>
             <w:rStyle w:val="Hyperlink"/>
@@ -6825,7 +6987,7 @@
       <w:r>
         <w:t xml:space="preserve"> </w:t>
       </w:r>
-      <w:hyperlink r:id="rId67">
+      <w:hyperlink r:id="rId68">
         <w:r>
           <w:rPr>
             <w:rStyle w:val="Hyperlink"/>
@@ -6866,7 +7028,7 @@
       <w:r>
         <w:t xml:space="preserve"> </w:t>
       </w:r>
-      <w:hyperlink r:id="rId68">
+      <w:hyperlink r:id="rId69">
         <w:r>
           <w:rPr>
             <w:rStyle w:val="Hyperlink"/>
@@ -6907,7 +7069,7 @@
       <w:r>
         <w:t xml:space="preserve"> </w:t>
       </w:r>
-      <w:hyperlink r:id="rId69">
+      <w:hyperlink r:id="rId70">
         <w:r>
           <w:rPr>
             <w:rStyle w:val="Hyperlink"/>
@@ -6954,7 +7116,7 @@
       <w:r>
         <w:t xml:space="preserve"> </w:t>
       </w:r>
-      <w:hyperlink r:id="rId70">
+      <w:hyperlink r:id="rId71">
         <w:r>
           <w:rPr>
             <w:rStyle w:val="Hyperlink"/>
@@ -7019,7 +7181,7 @@
       <w:r>
         <w:t xml:space="preserve"> </w:t>
       </w:r>
-      <w:hyperlink r:id="rId71">
+      <w:hyperlink r:id="rId72">
         <w:r>
           <w:rPr>
             <w:rStyle w:val="Hyperlink"/>
@@ -7060,7 +7222,7 @@
       <w:r>
         <w:t xml:space="preserve"> </w:t>
       </w:r>
-      <w:hyperlink r:id="rId72">
+      <w:hyperlink r:id="rId73">
         <w:r>
           <w:rPr>
             <w:rStyle w:val="Hyperlink"/>
@@ -7115,7 +7277,7 @@
       <w:r>
         <w:t xml:space="preserve"> </w:t>
       </w:r>
-      <w:hyperlink r:id="rId73">
+      <w:hyperlink r:id="rId74">
         <w:r>
           <w:rPr>
             <w:rStyle w:val="Hyperlink"/>
@@ -7162,7 +7324,7 @@
       <w:r>
         <w:t xml:space="preserve"> </w:t>
       </w:r>
-      <w:hyperlink r:id="rId74">
+      <w:hyperlink r:id="rId75">
         <w:r>
           <w:rPr>
             <w:rStyle w:val="Hyperlink"/>
@@ -7217,7 +7379,7 @@
       <w:r>
         <w:t xml:space="preserve"> </w:t>
       </w:r>
-      <w:hyperlink r:id="rId75">
+      <w:hyperlink r:id="rId76">
         <w:r>
           <w:rPr>
             <w:rStyle w:val="Hyperlink"/>
@@ -7272,7 +7434,7 @@
       <w:r>
         <w:t xml:space="preserve"> </w:t>
       </w:r>
-      <w:hyperlink r:id="rId76">
+      <w:hyperlink r:id="rId77">
         <w:r>
           <w:rPr>
             <w:rStyle w:val="Hyperlink"/>
@@ -7313,7 +7475,7 @@
       <w:r>
         <w:t xml:space="preserve"> </w:t>
       </w:r>
-      <w:hyperlink r:id="rId77">
+      <w:hyperlink r:id="rId78">
         <w:r>
           <w:rPr>
             <w:rStyle w:val="Hyperlink"/>
@@ -7354,7 +7516,7 @@
       <w:r>
         <w:t xml:space="preserve"> </w:t>
       </w:r>
-      <w:hyperlink r:id="rId78">
+      <w:hyperlink r:id="rId79">
         <w:r>
           <w:rPr>
             <w:rStyle w:val="Hyperlink"/>
@@ -7409,7 +7571,7 @@
       <w:r>
         <w:t xml:space="preserve"> </w:t>
       </w:r>
-      <w:hyperlink r:id="rId79">
+      <w:hyperlink r:id="rId80">
         <w:r>
           <w:rPr>
             <w:rStyle w:val="Hyperlink"/>
@@ -7464,7 +7626,7 @@
       <w:r>
         <w:t xml:space="preserve"> </w:t>
       </w:r>
-      <w:hyperlink r:id="rId80">
+      <w:hyperlink r:id="rId81">
         <w:r>
           <w:rPr>
             <w:rStyle w:val="Hyperlink"/>
@@ -7519,7 +7681,7 @@
       <w:r>
         <w:t xml:space="preserve"> </w:t>
       </w:r>
-      <w:hyperlink r:id="rId81">
+      <w:hyperlink r:id="rId82">
         <w:r>
           <w:rPr>
             <w:rStyle w:val="Hyperlink"/>
@@ -7574,7 +7736,7 @@
       <w:r>
         <w:t xml:space="preserve"> </w:t>
       </w:r>
-      <w:hyperlink r:id="rId82">
+      <w:hyperlink r:id="rId83">
         <w:r>
           <w:rPr>
             <w:rStyle w:val="Hyperlink"/>
@@ -7629,7 +7791,7 @@
       <w:r>
         <w:t xml:space="preserve"> </w:t>
       </w:r>
-      <w:hyperlink r:id="rId83">
+      <w:hyperlink r:id="rId84">
         <w:r>
           <w:rPr>
             <w:rStyle w:val="Hyperlink"/>
@@ -7684,7 +7846,7 @@
       <w:r>
         <w:t xml:space="preserve"> </w:t>
       </w:r>
-      <w:hyperlink r:id="rId84">
+      <w:hyperlink r:id="rId85">
         <w:r>
           <w:rPr>
             <w:rStyle w:val="Hyperlink"/>
@@ -7725,7 +7887,7 @@
       <w:r>
         <w:t xml:space="preserve"> </w:t>
       </w:r>
-      <w:hyperlink r:id="rId85">
+      <w:hyperlink r:id="rId86">
         <w:r>
           <w:rPr>
             <w:rStyle w:val="Hyperlink"/>
@@ -7766,7 +7928,7 @@
       <w:r>
         <w:t xml:space="preserve"> </w:t>
       </w:r>
-      <w:hyperlink r:id="rId86">
+      <w:hyperlink r:id="rId87">
         <w:r>
           <w:rPr>
             <w:rStyle w:val="Hyperlink"/>
@@ -7807,7 +7969,7 @@
       <w:r>
         <w:t xml:space="preserve"> </w:t>
       </w:r>
-      <w:hyperlink r:id="rId87">
+      <w:hyperlink r:id="rId88">
         <w:r>
           <w:rPr>
             <w:rStyle w:val="Hyperlink"/>
@@ -7862,7 +8024,7 @@
       <w:r>
         <w:t xml:space="preserve"> </w:t>
       </w:r>
-      <w:hyperlink r:id="rId88">
+      <w:hyperlink r:id="rId89">
         <w:r>
           <w:rPr>
             <w:rStyle w:val="Hyperlink"/>
@@ -7903,7 +8065,7 @@
       <w:r>
         <w:t xml:space="preserve"> </w:t>
       </w:r>
-      <w:hyperlink r:id="rId89">
+      <w:hyperlink r:id="rId90">
         <w:r>
           <w:rPr>
             <w:rStyle w:val="Hyperlink"/>
@@ -7958,7 +8120,7 @@
       <w:r>
         <w:t xml:space="preserve"> </w:t>
       </w:r>
-      <w:hyperlink r:id="rId90">
+      <w:hyperlink r:id="rId91">
         <w:r>
           <w:rPr>
             <w:rStyle w:val="Hyperlink"/>
@@ -8011,7 +8173,7 @@
       <w:r>
         <w:t xml:space="preserve"> </w:t>
       </w:r>
-      <w:hyperlink r:id="rId91">
+      <w:hyperlink r:id="rId92">
         <w:r>
           <w:rPr>
             <w:rStyle w:val="Hyperlink"/>
@@ -8066,7 +8228,7 @@
       <w:r>
         <w:t xml:space="preserve"> </w:t>
       </w:r>
-      <w:hyperlink r:id="rId92">
+      <w:hyperlink r:id="rId93">
         <w:r>
           <w:rPr>
             <w:rStyle w:val="Hyperlink"/>
@@ -8121,7 +8283,7 @@
       <w:r>
         <w:t xml:space="preserve"> </w:t>
       </w:r>
-      <w:hyperlink r:id="rId93">
+      <w:hyperlink r:id="rId94">
         <w:r>
           <w:rPr>
             <w:rStyle w:val="Hyperlink"/>
@@ -8162,7 +8324,7 @@
       <w:r>
         <w:t xml:space="preserve"> </w:t>
       </w:r>
-      <w:hyperlink r:id="rId94">
+      <w:hyperlink r:id="rId95">
         <w:r>
           <w:rPr>
             <w:rStyle w:val="Hyperlink"/>
@@ -8217,7 +8379,7 @@
       <w:r>
         <w:t xml:space="preserve"> </w:t>
       </w:r>
-      <w:hyperlink r:id="rId95">
+      <w:hyperlink r:id="rId96">
         <w:r>
           <w:rPr>
             <w:rStyle w:val="Hyperlink"/>
@@ -8272,7 +8434,7 @@
       <w:r>
         <w:t xml:space="preserve"> </w:t>
       </w:r>
-      <w:hyperlink r:id="rId96">
+      <w:hyperlink r:id="rId97">
         <w:r>
           <w:rPr>
             <w:rStyle w:val="Hyperlink"/>
@@ -8319,7 +8481,7 @@
       <w:r>
         <w:t xml:space="preserve"> </w:t>
       </w:r>
-      <w:hyperlink r:id="rId97">
+      <w:hyperlink r:id="rId98">
         <w:r>
           <w:rPr>
             <w:rStyle w:val="Hyperlink"/>
@@ -8360,7 +8522,7 @@
       <w:r>
         <w:t xml:space="preserve"> </w:t>
       </w:r>
-      <w:hyperlink r:id="rId98">
+      <w:hyperlink r:id="rId99">
         <w:r>
           <w:rPr>
             <w:rStyle w:val="Hyperlink"/>
@@ -8415,7 +8577,7 @@
       <w:r>
         <w:t xml:space="preserve"> </w:t>
       </w:r>
-      <w:hyperlink r:id="rId99">
+      <w:hyperlink r:id="rId100">
         <w:r>
           <w:rPr>
             <w:rStyle w:val="Hyperlink"/>
@@ -8456,7 +8618,7 @@
       <w:r>
         <w:t xml:space="preserve"> </w:t>
       </w:r>
-      <w:hyperlink r:id="rId100">
+      <w:hyperlink r:id="rId101">
         <w:r>
           <w:rPr>
             <w:rStyle w:val="Hyperlink"/>
@@ -8503,7 +8665,7 @@
       <w:r>
         <w:t xml:space="preserve"> </w:t>
       </w:r>
-      <w:hyperlink r:id="rId101">
+      <w:hyperlink r:id="rId102">
         <w:r>
           <w:rPr>
             <w:rStyle w:val="Hyperlink"/>
@@ -8550,7 +8712,7 @@
       <w:r>
         <w:t xml:space="preserve"> </w:t>
       </w:r>
-      <w:hyperlink r:id="rId102">
+      <w:hyperlink r:id="rId103">
         <w:r>
           <w:rPr>
             <w:rStyle w:val="Hyperlink"/>
@@ -8597,7 +8759,7 @@
       <w:r>
         <w:t xml:space="preserve"> </w:t>
       </w:r>
-      <w:hyperlink r:id="rId103">
+      <w:hyperlink r:id="rId104">
         <w:r>
           <w:rPr>
             <w:rStyle w:val="Hyperlink"/>
@@ -8652,7 +8814,7 @@
       <w:r>
         <w:t xml:space="preserve"> </w:t>
       </w:r>
-      <w:hyperlink r:id="rId104">
+      <w:hyperlink r:id="rId105">
         <w:r>
           <w:rPr>
             <w:rStyle w:val="Hyperlink"/>
@@ -8693,7 +8855,7 @@
       <w:r>
         <w:t xml:space="preserve"> </w:t>
       </w:r>
-      <w:hyperlink r:id="rId105">
+      <w:hyperlink r:id="rId106">
         <w:r>
           <w:rPr>
             <w:rStyle w:val="Hyperlink"/>
@@ -8734,7 +8896,7 @@
       <w:r>
         <w:t xml:space="preserve"> </w:t>
       </w:r>
-      <w:hyperlink r:id="rId106">
+      <w:hyperlink r:id="rId107">
         <w:r>
           <w:rPr>
             <w:rStyle w:val="Hyperlink"/>
@@ -8775,7 +8937,7 @@
       <w:r>
         <w:t xml:space="preserve"> </w:t>
       </w:r>
-      <w:hyperlink r:id="rId107">
+      <w:hyperlink r:id="rId108">
         <w:r>
           <w:rPr>
             <w:rStyle w:val="Hyperlink"/>
@@ -8816,7 +8978,7 @@
       <w:r>
         <w:t xml:space="preserve"> </w:t>
       </w:r>
-      <w:hyperlink r:id="rId108">
+      <w:hyperlink r:id="rId109">
         <w:r>
           <w:rPr>
             <w:rStyle w:val="Hyperlink"/>
@@ -8857,7 +9019,7 @@
       <w:r>
         <w:t xml:space="preserve"> </w:t>
       </w:r>
-      <w:hyperlink r:id="rId109">
+      <w:hyperlink r:id="rId110">
         <w:r>
           <w:rPr>
             <w:rStyle w:val="Hyperlink"/>
@@ -8898,7 +9060,7 @@
       <w:r>
         <w:t xml:space="preserve"> </w:t>
       </w:r>
-      <w:hyperlink r:id="rId110">
+      <w:hyperlink r:id="rId111">
         <w:r>
           <w:rPr>
             <w:rStyle w:val="Hyperlink"/>
@@ -8939,7 +9101,7 @@
       <w:r>
         <w:t xml:space="preserve"> </w:t>
       </w:r>
-      <w:hyperlink r:id="rId111">
+      <w:hyperlink r:id="rId112">
         <w:r>
           <w:rPr>
             <w:rStyle w:val="Hyperlink"/>
@@ -8980,7 +9142,7 @@
       <w:r>
         <w:t xml:space="preserve"> </w:t>
       </w:r>
-      <w:hyperlink r:id="rId112">
+      <w:hyperlink r:id="rId113">
         <w:r>
           <w:rPr>
             <w:rStyle w:val="Hyperlink"/>
@@ -9021,7 +9183,7 @@
       <w:r>
         <w:t xml:space="preserve"> </w:t>
       </w:r>
-      <w:hyperlink r:id="rId113">
+      <w:hyperlink r:id="rId114">
         <w:r>
           <w:rPr>
             <w:rStyle w:val="Hyperlink"/>
@@ -9062,7 +9224,7 @@
       <w:r>
         <w:t xml:space="preserve"> </w:t>
       </w:r>
-      <w:hyperlink r:id="rId114">
+      <w:hyperlink r:id="rId115">
         <w:r>
           <w:rPr>
             <w:rStyle w:val="Hyperlink"/>
@@ -9103,7 +9265,7 @@
       <w:r>
         <w:t xml:space="preserve"> </w:t>
       </w:r>
-      <w:hyperlink r:id="rId115">
+      <w:hyperlink r:id="rId116">
         <w:r>
           <w:rPr>
             <w:rStyle w:val="Hyperlink"/>
@@ -9280,6 +9442,66 @@
         <w:pStyle w:val="BodyText"/>
       </w:pPr>
       <w:r>
+        <w:t xml:space="preserve">A. Canedo et al.,</w:t>
+      </w:r>
+      <w:r>
+        <w:t xml:space="preserve"> </w:t>
+      </w:r>
+      <w:r>
+        <w:t xml:space="preserve">“Oracles That Cannot Fail: Anchoring and the Expectation That Moves With the System,”</w:t>
+      </w:r>
+      <w:r>
+        <w:t xml:space="preserve"> </w:t>
+      </w:r>
+      <w:r>
+        <w:t xml:space="preserve">arXiv:2608.17214v1, 2026.</w:t>
+      </w:r>
+    </w:p>
+    <w:p>
+      <w:pPr>
+        <w:pStyle w:val="BodyText"/>
+      </w:pPr>
+      <w:r>
+        <w:t xml:space="preserve">P. P. Paul et al.,</w:t>
+      </w:r>
+      <w:r>
+        <w:t xml:space="preserve"> </w:t>
+      </w:r>
+      <w:r>
+        <w:t xml:space="preserve">“Beyond Coverage and Kill Scores: Empirically Measuring Test Suite Behavioural Validation,”</w:t>
+      </w:r>
+      <w:r>
+        <w:t xml:space="preserve"> </w:t>
+      </w:r>
+      <w:r>
+        <w:t xml:space="preserve">arXiv:2606.10417v1, 2026.</w:t>
+      </w:r>
+    </w:p>
+    <w:p>
+      <w:pPr>
+        <w:pStyle w:val="BodyText"/>
+      </w:pPr>
+      <w:r>
+        <w:t xml:space="preserve">P. Bajaj et al.,</w:t>
+      </w:r>
+      <w:r>
+        <w:t xml:space="preserve"> </w:t>
+      </w:r>
+      <w:r>
+        <w:t xml:space="preserve">“Evaluation Blindness: How Silent Measurement Failures Corrupt AI Systems,”</w:t>
+      </w:r>
+      <w:r>
+        <w:t xml:space="preserve"> </w:t>
+      </w:r>
+      <w:r>
+        <w:t xml:space="preserve">arXiv:2608.02786v1, 2026.</w:t>
+      </w:r>
+    </w:p>
+    <w:p>
+      <w:pPr>
+        <w:pStyle w:val="BodyText"/>
+      </w:pPr>
+      <w:r>
         <w:t xml:space="preserve">J. M. Mikhaeil et al.,</w:t>
       </w:r>
       <w:r>
@@ -9364,7 +9586,7 @@
       <w:r>
         <w:t xml:space="preserve"> </w:t>
       </w:r>
-      <w:hyperlink r:id="rId116">
+      <w:hyperlink r:id="rId117">
         <w:r>
           <w:rPr>
             <w:rStyle w:val="Hyperlink"/>
@@ -9405,7 +9627,7 @@
       <w:r>
         <w:t xml:space="preserve"> </w:t>
       </w:r>
-      <w:hyperlink r:id="rId117">
+      <w:hyperlink r:id="rId118">
         <w:r>
           <w:rPr>
             <w:rStyle w:val="Hyperlink"/>
@@ -9417,7 +9639,7 @@
         <w:t xml:space="preserve">.</w:t>
       </w:r>
     </w:p>
-    <w:bookmarkEnd w:id="118"/>
+    <w:bookmarkEnd w:id="119"/>
     <w:sectPr>
       <w:footerReference w:type="default" r:id="rIdFtr1"/>
       <w:footnotePr>

</xml_diff>

<commit_message>
feat(paper): give the last three instruments mutation-audited suites
</commit_message>
<xml_diff>
--- a/paper/word/graduation-thesis.docx
+++ b/paper/word/graduation-thesis.docx
@@ -6199,6 +6199,86 @@
         <w:pStyle w:val="BodyText"/>
       </w:pPr>
       <w:r>
+        <w:t xml:space="preserve">A following cycle gave the three unaudited modules suites of their own and held them</w:t>
+      </w:r>
+      <w:r>
+        <w:t xml:space="preserve"> </w:t>
+      </w:r>
+      <w:r>
+        <w:t xml:space="preserve">to the same standard: expected values fixed from each module’s stated contract, then</w:t>
+      </w:r>
+      <w:r>
+        <w:t xml:space="preserve"> </w:t>
+      </w:r>
+      <w:r>
+        <w:t xml:space="preserve">twenty-one further mutations injected. Twenty were caught. The twenty-first was shown by</w:t>
+      </w:r>
+      <w:r>
+        <w:t xml:space="preserve"> </w:t>
+      </w:r>
+      <w:r>
+        <w:t xml:space="preserve">executing both variants side by side to be an equivalent mutant, because the branch it</w:t>
+      </w:r>
+      <w:r>
+        <w:t xml:space="preserve"> </w:t>
+      </w:r>
+      <w:r>
+        <w:t xml:space="preserve">changed cannot produce a different output once the evidence directory is absent, so no</w:t>
+      </w:r>
+      <w:r>
+        <w:t xml:space="preserve"> </w:t>
+      </w:r>
+      <w:r>
+        <w:t xml:space="preserve">fixture was added to force a difference that does not exist. One of the new fixtures was</w:t>
+      </w:r>
+      <w:r>
+        <w:t xml:space="preserve"> </w:t>
+      </w:r>
+      <w:r>
+        <w:t xml:space="preserve">itself wrong in the same way as before: it asserted that the judge’s model selector is</w:t>
+      </w:r>
+      <w:r>
+        <w:t xml:space="preserve"> </w:t>
+      </w:r>
+      <w:r>
+        <w:t xml:space="preserve">shell quoted, when a safe selector is correctly passed through unquoted, and it was</w:t>
+      </w:r>
+      <w:r>
+        <w:t xml:space="preserve"> </w:t>
+      </w:r>
+      <w:r>
+        <w:t xml:space="preserve">replaced by a check on an unsafe selector. For the judge module no reliable oracle exists</w:t>
+      </w:r>
+      <w:r>
+        <w:t xml:space="preserve"> </w:t>
+      </w:r>
+      <w:r>
+        <w:t xml:space="preserve">[64], so its suite asserts the deterministic shell around the</w:t>
+      </w:r>
+      <w:r>
+        <w:t xml:space="preserve"> </w:t>
+      </w:r>
+      <w:r>
+        <w:t xml:space="preserve">model through an injected runner and makes no live call, following the practice of</w:t>
+      </w:r>
+      <w:r>
+        <w:t xml:space="preserve"> </w:t>
+      </w:r>
+      <w:r>
+        <w:t xml:space="preserve">expressing behavioural contracts as relations rather than expected values</w:t>
+      </w:r>
+      <w:r>
+        <w:t xml:space="preserve"> </w:t>
+      </w:r>
+      <w:r>
+        <w:t xml:space="preserve">[65].</w:t>
+      </w:r>
+    </w:p>
+    <w:p>
+      <w:pPr>
+        <w:pStyle w:val="BodyText"/>
+      </w:pPr>
+      <w:r>
         <w:t xml:space="preserve">This is why the audit used mutation rather than review. An oracle that takes its</w:t>
       </w:r>
       <w:r>
@@ -6211,7 +6291,7 @@
         <w:t xml:space="preserve"> </w:t>
       </w:r>
       <w:r>
-        <w:t xml:space="preserve">and expectation together [64], which is exactly how the cost</w:t>
+        <w:t xml:space="preserve">and expectation together [66], which is exactly how the cost</w:t>
       </w:r>
       <w:r>
         <w:t xml:space="preserve"> </w:t>
@@ -6223,7 +6303,7 @@
         <w:t xml:space="preserve"> </w:t>
       </w:r>
       <w:r>
-        <w:t xml:space="preserve">documented behaviour unvalidated [65], and silent measurement</w:t>
+        <w:t xml:space="preserve">documented behaviour unvalidated [67], and silent measurement</w:t>
       </w:r>
       <w:r>
         <w:t xml:space="preserve"> </w:t>
@@ -6235,7 +6315,7 @@
         <w:t xml:space="preserve"> </w:t>
       </w:r>
       <w:r>
-        <w:t xml:space="preserve">edge case [66]. Two limits are recorded. Catching seventeen</w:t>
+        <w:t xml:space="preserve">edge case [68]. Two limits are recorded. Catching seventeen</w:t>
       </w:r>
       <w:r>
         <w:t xml:space="preserve"> </w:t>
@@ -6247,13 +6327,19 @@
         <w:t xml:space="preserve"> </w:t>
       </w:r>
       <w:r>
-        <w:t xml:space="preserve">detected. And three modules, the adversarial validity check, the pilot builder, and the</w:t>
-      </w:r>
-      <w:r>
-        <w:t xml:space="preserve"> </w:t>
-      </w:r>
-      <w:r>
-        <w:t xml:space="preserve">element verifier, still have no paired suite.</w:t>
+        <w:t xml:space="preserve">detected. After the following cycle no</w:t>
+      </w:r>
+      <w:r>
+        <w:t xml:space="preserve"> </w:t>
+      </w:r>
+      <w:r>
+        <w:t xml:space="preserve">instrument module lacks a paired suite, but a mutation set chosen by the author of the</w:t>
+      </w:r>
+      <w:r>
+        <w:t xml:space="preserve"> </w:t>
+      </w:r>
+      <w:r>
+        <w:t xml:space="preserve">code can still miss a fault class that neither the code nor the mutations consider.</w:t>
       </w:r>
     </w:p>
     <w:bookmarkEnd w:id="59"/>
@@ -6295,7 +6381,7 @@
         <w:t xml:space="preserve"> </w:t>
       </w:r>
       <w:r>
-        <w:t xml:space="preserve">lists are read [67]. Measured against the ledger digest recorded in</w:t>
+        <w:t xml:space="preserve">lists are read [69]. Measured against the ledger digest recorded in</w:t>
       </w:r>
       <w:r>
         <w:t xml:space="preserve"> </w:t>
@@ -6422,7 +6508,7 @@
         <w:t xml:space="preserve"> </w:t>
       </w:r>
       <w:r>
-        <w:t xml:space="preserve">scores calls for [68], and it is also the boundary of what</w:t>
+        <w:t xml:space="preserve">scores calls for [70], and it is also the boundary of what</w:t>
       </w:r>
       <w:r>
         <w:t xml:space="preserve"> </w:t>
@@ -6434,7 +6520,7 @@
         <w:t xml:space="preserve"> </w:t>
       </w:r>
       <w:r>
-        <w:t xml:space="preserve">substitutes for understanding rather than supplying it [69].</w:t>
+        <w:t xml:space="preserve">substitutes for understanding rather than supplying it [71].</w:t>
       </w:r>
     </w:p>
     <w:bookmarkEnd w:id="60"/>
@@ -6583,7 +6669,7 @@
         <w:t xml:space="preserve"> </w:t>
       </w:r>
       <w:r>
-        <w:t xml:space="preserve">single terminal score [70].</w:t>
+        <w:t xml:space="preserve">single terminal score [72].</w:t>
       </w:r>
     </w:p>
     <w:p>
@@ -6665,7 +6751,7 @@
         <w:t xml:space="preserve"> </w:t>
       </w:r>
       <w:r>
-        <w:t xml:space="preserve">[71]; this project spent 192 model calls to verify 32</w:t>
+        <w:t xml:space="preserve">[73]; this project spent 192 model calls to verify 32</w:t>
       </w:r>
       <w:r>
         <w:t xml:space="preserve"> </w:t>
@@ -9435,6 +9521,46 @@
       </w:r>
       <w:r>
         <w:t xml:space="preserve">arXiv:2608.01347v5, 2026.</w:t>
+      </w:r>
+    </w:p>
+    <w:p>
+      <w:pPr>
+        <w:pStyle w:val="BodyText"/>
+      </w:pPr>
+      <w:r>
+        <w:t xml:space="preserve">M. Jiang et al.,</w:t>
+      </w:r>
+      <w:r>
+        <w:t xml:space="preserve"> </w:t>
+      </w:r>
+      <w:r>
+        <w:t xml:space="preserve">“Delta Debugging in the Absence of Test Oracles Through Metamorphic Testing,”</w:t>
+      </w:r>
+      <w:r>
+        <w:t xml:space="preserve"> </w:t>
+      </w:r>
+      <w:r>
+        <w:t xml:space="preserve">arXiv:2607.00929v1, 2026.</w:t>
+      </w:r>
+    </w:p>
+    <w:p>
+      <w:pPr>
+        <w:pStyle w:val="BodyText"/>
+      </w:pPr>
+      <w:r>
+        <w:t xml:space="preserve">Y. Pei et al.,</w:t>
+      </w:r>
+      <w:r>
+        <w:t xml:space="preserve"> </w:t>
+      </w:r>
+      <w:r>
+        <w:t xml:space="preserve">“Assessing Behavioral Validation in UI Component Test Suites Using Inferred Metamorphic Relations,”</w:t>
+      </w:r>
+      <w:r>
+        <w:t xml:space="preserve"> </w:t>
+      </w:r>
+      <w:r>
+        <w:t xml:space="preserve">arXiv:2608.03337v1, 2026.</w:t>
       </w:r>
     </w:p>
     <w:p>

</xml_diff>

<commit_message>
feat(paper): re-derive both executed blocks from retained artifacts
</commit_message>
<xml_diff>
--- a/paper/word/graduation-thesis.docx
+++ b/paper/word/graduation-thesis.docx
@@ -4600,7 +4600,7 @@
     <w:bookmarkEnd w:id="48"/>
     <w:bookmarkEnd w:id="49"/>
     <w:bookmarkEnd w:id="50"/>
-    <w:bookmarkStart w:id="61" w:name="experimental-results"/>
+    <w:bookmarkStart w:id="62" w:name="experimental-results"/>
     <w:p>
       <w:pPr>
         <w:pStyle w:val="Heading1"/>
@@ -6095,12 +6095,247 @@
       </w:r>
     </w:p>
     <w:bookmarkEnd w:id="58"/>
-    <w:bookmarkStart w:id="59" w:name="auditing-the-instruments-by-mutation"/>
+    <w:bookmarkStart w:id="59" w:name="re-deriving-the-recorded-results"/>
     <w:p>
       <w:pPr>
         <w:pStyle w:val="Heading2"/>
       </w:pPr>
       <w:r>
+        <w:t xml:space="preserve">Re-deriving the recorded results</w:t>
+      </w:r>
+    </w:p>
+    <w:p>
+      <w:pPr>
+        <w:pStyle w:val="FirstParagraph"/>
+      </w:pPr>
+      <w:r>
+        <w:t xml:space="preserve">Every number in the executed blocks had been produced by instrument code that was not</w:t>
+      </w:r>
+      <w:r>
+        <w:t xml:space="preserve"> </w:t>
+      </w:r>
+      <w:r>
+        <w:t xml:space="preserve">yet audited, so the recorded results were re-derived from the retained artifacts using</w:t>
+      </w:r>
+      <w:r>
+        <w:t xml:space="preserve"> </w:t>
+      </w:r>
+      <w:r>
+        <w:t xml:space="preserve">the audited instruments. Re-running the blocks would have spent frozen tasks without</w:t>
+      </w:r>
+      <w:r>
+        <w:t xml:space="preserve"> </w:t>
+      </w:r>
+      <w:r>
+        <w:t xml:space="preserve">testing the recorded numbers at all.</w:t>
+      </w:r>
+    </w:p>
+    <w:p>
+      <w:pPr>
+        <w:pStyle w:val="BodyText"/>
+      </w:pPr>
+      <w:r>
+        <w:t xml:space="preserve">Both blocks re-derived exactly. The variance block returned</w:t>
+      </w:r>
+      <w:r>
+        <w:t xml:space="preserve"> </w:t>
+      </w:r>
+      <m:oMath>
+        <m:r>
+          <m:t>32</m:t>
+        </m:r>
+      </m:oMath>
+      <w:r>
+        <w:t xml:space="preserve"> </w:t>
+      </w:r>
+      <w:r>
+        <w:t xml:space="preserve">episodes,</w:t>
+      </w:r>
+      <w:r>
+        <w:t xml:space="preserve"> </w:t>
+      </w:r>
+      <m:oMath>
+        <m:r>
+          <m:t>0</m:t>
+        </m:r>
+      </m:oMath>
+      <w:r>
+        <w:t xml:space="preserve"> </w:t>
+      </w:r>
+      <w:r>
+        <w:t xml:space="preserve">canary</w:t>
+      </w:r>
+      <w:r>
+        <w:t xml:space="preserve"> </w:t>
+      </w:r>
+      <w:r>
+        <w:t xml:space="preserve">leaks,</w:t>
+      </w:r>
+      <w:r>
+        <w:t xml:space="preserve"> </w:t>
+      </w:r>
+      <m:oMath>
+        <m:r>
+          <m:t>0</m:t>
+        </m:r>
+      </m:oMath>
+      <w:r>
+        <w:t xml:space="preserve"> </w:t>
+      </w:r>
+      <w:r>
+        <w:t xml:space="preserve">fabrication redlines and</w:t>
+      </w:r>
+      <w:r>
+        <w:t xml:space="preserve"> </w:t>
+      </w:r>
+      <m:oMath>
+        <m:r>
+          <m:t>26</m:t>
+        </m:r>
+      </m:oMath>
+      <w:r>
+        <w:t xml:space="preserve"> </w:t>
+      </w:r>
+      <w:r>
+        <w:t xml:space="preserve">episodes with structural gaps, and the pilot</w:t>
+      </w:r>
+      <w:r>
+        <w:t xml:space="preserve"> </w:t>
+      </w:r>
+      <w:r>
+        <w:t xml:space="preserve">block returned</w:t>
+      </w:r>
+      <w:r>
+        <w:t xml:space="preserve"> </w:t>
+      </w:r>
+      <m:oMath>
+        <m:r>
+          <m:t>16</m:t>
+        </m:r>
+      </m:oMath>
+      <w:r>
+        <w:t xml:space="preserve">,</w:t>
+      </w:r>
+      <w:r>
+        <w:t xml:space="preserve"> </w:t>
+      </w:r>
+      <m:oMath>
+        <m:r>
+          <m:t>0</m:t>
+        </m:r>
+      </m:oMath>
+      <w:r>
+        <w:t xml:space="preserve">,</w:t>
+      </w:r>
+      <w:r>
+        <w:t xml:space="preserve"> </w:t>
+      </w:r>
+      <m:oMath>
+        <m:r>
+          <m:t>0</m:t>
+        </m:r>
+      </m:oMath>
+      <w:r>
+        <w:t xml:space="preserve"> </w:t>
+      </w:r>
+      <w:r>
+        <w:t xml:space="preserve">and</w:t>
+      </w:r>
+      <w:r>
+        <w:t xml:space="preserve"> </w:t>
+      </w:r>
+      <m:oMath>
+        <m:r>
+          <m:t>13</m:t>
+        </m:r>
+      </m:oMath>
+      <w:r>
+        <w:t xml:space="preserve">, each matching what was recorded. An independent</w:t>
+      </w:r>
+      <w:r>
+        <w:t xml:space="preserve"> </w:t>
+      </w:r>
+      <w:r>
+        <w:t xml:space="preserve">scan of every retained design and state artifact against all eight per-task withheld</w:t>
+      </w:r>
+      <w:r>
+        <w:t xml:space="preserve"> </w:t>
+      </w:r>
+      <w:r>
+        <w:t xml:space="preserve">canaries, read from the task bundles rather than from the receipts, also found no leak.</w:t>
+      </w:r>
+    </w:p>
+    <w:p>
+      <w:pPr>
+        <w:pStyle w:val="BodyText"/>
+      </w:pPr>
+      <w:r>
+        <w:t xml:space="preserve">Judged element verdicts are excluded from this check, because they depend on a model</w:t>
+      </w:r>
+      <w:r>
+        <w:t xml:space="preserve"> </w:t>
+      </w:r>
+      <w:r>
+        <w:t xml:space="preserve">call and cannot be re-derived deterministically. That boundary is stated rather than</w:t>
+      </w:r>
+      <w:r>
+        <w:t xml:space="preserve"> </w:t>
+      </w:r>
+      <w:r>
+        <w:t xml:space="preserve">implied: an artifact that runs is not the same as a claim that can be reproduced</w:t>
+      </w:r>
+      <w:r>
+        <w:t xml:space="preserve"> </w:t>
+      </w:r>
+      <w:r>
+        <w:t xml:space="preserve">[64], and replaying historical claims from a frozen collection</w:t>
+      </w:r>
+      <w:r>
+        <w:t xml:space="preserve"> </w:t>
+      </w:r>
+      <w:r>
+        <w:t xml:space="preserve">commonly stops before the claim is reachable [65].</w:t>
+      </w:r>
+    </w:p>
+    <w:p>
+      <w:pPr>
+        <w:pStyle w:val="BodyText"/>
+      </w:pPr>
+      <w:r>
+        <w:t xml:space="preserve">The re-derivation tool was itself defective on first use. Its filename pattern required</w:t>
+      </w:r>
+      <w:r>
+        <w:t xml:space="preserve"> </w:t>
+      </w:r>
+      <w:r>
+        <w:t xml:space="preserve">a repeat suffix, so it matched nothing in the pilot block and reported zero leaks and</w:t>
+      </w:r>
+      <w:r>
+        <w:t xml:space="preserve"> </w:t>
+      </w:r>
+      <w:r>
+        <w:t xml:space="preserve">zero redlines, which reads as a pass. The pattern was widened, an empty match now raises</w:t>
+      </w:r>
+      <w:r>
+        <w:t xml:space="preserve"> </w:t>
+      </w:r>
+      <w:r>
+        <w:t xml:space="preserve">instead of returning a clean zero, and a fixture covers that case. Five mutations were</w:t>
+      </w:r>
+      <w:r>
+        <w:t xml:space="preserve"> </w:t>
+      </w:r>
+      <w:r>
+        <w:t xml:space="preserve">then injected into the tool and all five were caught.</w:t>
+      </w:r>
+    </w:p>
+    <w:bookmarkEnd w:id="59"/>
+    <w:bookmarkStart w:id="60" w:name="auditing-the-instruments-by-mutation"/>
+    <w:p>
+      <w:pPr>
+        <w:pStyle w:val="Heading2"/>
+      </w:pPr>
+      <w:r>
         <w:t xml:space="preserve">Auditing the instruments by mutation</w:t>
       </w:r>
     </w:p>
@@ -6253,7 +6488,7 @@
         <w:t xml:space="preserve"> </w:t>
       </w:r>
       <w:r>
-        <w:t xml:space="preserve">[64], so its suite asserts the deterministic shell around the</w:t>
+        <w:t xml:space="preserve">[66], so its suite asserts the deterministic shell around the</w:t>
       </w:r>
       <w:r>
         <w:t xml:space="preserve"> </w:t>
@@ -6271,7 +6506,7 @@
         <w:t xml:space="preserve"> </w:t>
       </w:r>
       <w:r>
-        <w:t xml:space="preserve">[65].</w:t>
+        <w:t xml:space="preserve">[67].</w:t>
       </w:r>
     </w:p>
     <w:p>
@@ -6291,7 +6526,7 @@
         <w:t xml:space="preserve"> </w:t>
       </w:r>
       <w:r>
-        <w:t xml:space="preserve">and expectation together [66], which is exactly how the cost</w:t>
+        <w:t xml:space="preserve">and expectation together [68], which is exactly how the cost</w:t>
       </w:r>
       <w:r>
         <w:t xml:space="preserve"> </w:t>
@@ -6303,7 +6538,7 @@
         <w:t xml:space="preserve"> </w:t>
       </w:r>
       <w:r>
-        <w:t xml:space="preserve">documented behaviour unvalidated [67], and silent measurement</w:t>
+        <w:t xml:space="preserve">documented behaviour unvalidated [69], and silent measurement</w:t>
       </w:r>
       <w:r>
         <w:t xml:space="preserve"> </w:t>
@@ -6315,7 +6550,7 @@
         <w:t xml:space="preserve"> </w:t>
       </w:r>
       <w:r>
-        <w:t xml:space="preserve">edge case [68]. Two limits are recorded. Catching seventeen</w:t>
+        <w:t xml:space="preserve">edge case [70]. Two limits are recorded. Catching seventeen</w:t>
       </w:r>
       <w:r>
         <w:t xml:space="preserve"> </w:t>
@@ -6342,8 +6577,8 @@
         <w:t xml:space="preserve">code can still miss a fault class that neither the code nor the mutations consider.</w:t>
       </w:r>
     </w:p>
-    <w:bookmarkEnd w:id="59"/>
-    <w:bookmarkStart w:id="60" w:name="X782ae78defcb34d28636704b3c8bd73b8faa49a"/>
+    <w:bookmarkEnd w:id="60"/>
+    <w:bookmarkStart w:id="61" w:name="X782ae78defcb34d28636704b3c8bd73b8faa49a"/>
     <w:p>
       <w:pPr>
         <w:pStyle w:val="Heading2"/>
@@ -6381,7 +6616,7 @@
         <w:t xml:space="preserve"> </w:t>
       </w:r>
       <w:r>
-        <w:t xml:space="preserve">lists are read [69]. Measured against the ledger digest recorded in</w:t>
+        <w:t xml:space="preserve">lists are read [71]. Measured against the ledger digest recorded in</w:t>
       </w:r>
       <w:r>
         <w:t xml:space="preserve"> </w:t>
@@ -6508,7 +6743,7 @@
         <w:t xml:space="preserve"> </w:t>
       </w:r>
       <w:r>
-        <w:t xml:space="preserve">scores calls for [70], and it is also the boundary of what</w:t>
+        <w:t xml:space="preserve">scores calls for [72], and it is also the boundary of what</w:t>
       </w:r>
       <w:r>
         <w:t xml:space="preserve"> </w:t>
@@ -6520,12 +6755,12 @@
         <w:t xml:space="preserve"> </w:t>
       </w:r>
       <w:r>
-        <w:t xml:space="preserve">substitutes for understanding rather than supplying it [71].</w:t>
-      </w:r>
-    </w:p>
-    <w:bookmarkEnd w:id="60"/>
+        <w:t xml:space="preserve">substitutes for understanding rather than supplying it [73].</w:t>
+      </w:r>
+    </w:p>
     <w:bookmarkEnd w:id="61"/>
-    <w:bookmarkStart w:id="119" w:name="conclusions"/>
+    <w:bookmarkEnd w:id="62"/>
+    <w:bookmarkStart w:id="120" w:name="conclusions"/>
     <w:p>
       <w:pPr>
         <w:pStyle w:val="Heading1"/>
@@ -6669,7 +6904,7 @@
         <w:t xml:space="preserve"> </w:t>
       </w:r>
       <w:r>
-        <w:t xml:space="preserve">single terminal score [72].</w:t>
+        <w:t xml:space="preserve">single terminal score [74].</w:t>
       </w:r>
     </w:p>
     <w:p>
@@ -6751,7 +6986,7 @@
         <w:t xml:space="preserve"> </w:t>
       </w:r>
       <w:r>
-        <w:t xml:space="preserve">[73]; this project spent 192 model calls to verify 32</w:t>
+        <w:t xml:space="preserve">[75]; this project spent 192 model calls to verify 32</w:t>
       </w:r>
       <w:r>
         <w:t xml:space="preserve"> </w:t>
@@ -6809,7 +7044,7 @@
       <w:r>
         <w:t xml:space="preserve"> </w:t>
       </w:r>
-      <w:hyperlink r:id="rId62">
+      <w:hyperlink r:id="rId63">
         <w:r>
           <w:rPr>
             <w:rStyle w:val="Hyperlink"/>
@@ -6856,7 +7091,7 @@
       <w:r>
         <w:t xml:space="preserve"> </w:t>
       </w:r>
-      <w:hyperlink r:id="rId63">
+      <w:hyperlink r:id="rId64">
         <w:r>
           <w:rPr>
             <w:rStyle w:val="Hyperlink"/>
@@ -6897,7 +7132,7 @@
       <w:r>
         <w:t xml:space="preserve"> </w:t>
       </w:r>
-      <w:hyperlink r:id="rId64">
+      <w:hyperlink r:id="rId65">
         <w:r>
           <w:rPr>
             <w:rStyle w:val="Hyperlink"/>
@@ -6950,7 +7185,7 @@
       <w:r>
         <w:t xml:space="preserve"> </w:t>
       </w:r>
-      <w:hyperlink r:id="rId65">
+      <w:hyperlink r:id="rId66">
         <w:r>
           <w:rPr>
             <w:rStyle w:val="Hyperlink"/>
@@ -6991,7 +7226,7 @@
       <w:r>
         <w:t xml:space="preserve"> </w:t>
       </w:r>
-      <w:hyperlink r:id="rId66">
+      <w:hyperlink r:id="rId67">
         <w:r>
           <w:rPr>
             <w:rStyle w:val="Hyperlink"/>
@@ -7032,7 +7267,7 @@
       <w:r>
         <w:t xml:space="preserve"> </w:t>
       </w:r>
-      <w:hyperlink r:id="rId67">
+      <w:hyperlink r:id="rId68">
         <w:r>
           <w:rPr>
             <w:rStyle w:val="Hyperlink"/>
@@ -7073,7 +7308,7 @@
       <w:r>
         <w:t xml:space="preserve"> </w:t>
       </w:r>
-      <w:hyperlink r:id="rId68">
+      <w:hyperlink r:id="rId69">
         <w:r>
           <w:rPr>
             <w:rStyle w:val="Hyperlink"/>
@@ -7114,7 +7349,7 @@
       <w:r>
         <w:t xml:space="preserve"> </w:t>
       </w:r>
-      <w:hyperlink r:id="rId69">
+      <w:hyperlink r:id="rId70">
         <w:r>
           <w:rPr>
             <w:rStyle w:val="Hyperlink"/>
@@ -7155,7 +7390,7 @@
       <w:r>
         <w:t xml:space="preserve"> </w:t>
       </w:r>
-      <w:hyperlink r:id="rId70">
+      <w:hyperlink r:id="rId71">
         <w:r>
           <w:rPr>
             <w:rStyle w:val="Hyperlink"/>
@@ -7202,7 +7437,7 @@
       <w:r>
         <w:t xml:space="preserve"> </w:t>
       </w:r>
-      <w:hyperlink r:id="rId71">
+      <w:hyperlink r:id="rId72">
         <w:r>
           <w:rPr>
             <w:rStyle w:val="Hyperlink"/>
@@ -7267,7 +7502,7 @@
       <w:r>
         <w:t xml:space="preserve"> </w:t>
       </w:r>
-      <w:hyperlink r:id="rId72">
+      <w:hyperlink r:id="rId73">
         <w:r>
           <w:rPr>
             <w:rStyle w:val="Hyperlink"/>
@@ -7308,7 +7543,7 @@
       <w:r>
         <w:t xml:space="preserve"> </w:t>
       </w:r>
-      <w:hyperlink r:id="rId73">
+      <w:hyperlink r:id="rId74">
         <w:r>
           <w:rPr>
             <w:rStyle w:val="Hyperlink"/>
@@ -7363,7 +7598,7 @@
       <w:r>
         <w:t xml:space="preserve"> </w:t>
       </w:r>
-      <w:hyperlink r:id="rId74">
+      <w:hyperlink r:id="rId75">
         <w:r>
           <w:rPr>
             <w:rStyle w:val="Hyperlink"/>
@@ -7410,7 +7645,7 @@
       <w:r>
         <w:t xml:space="preserve"> </w:t>
       </w:r>
-      <w:hyperlink r:id="rId75">
+      <w:hyperlink r:id="rId76">
         <w:r>
           <w:rPr>
             <w:rStyle w:val="Hyperlink"/>
@@ -7465,7 +7700,7 @@
       <w:r>
         <w:t xml:space="preserve"> </w:t>
       </w:r>
-      <w:hyperlink r:id="rId76">
+      <w:hyperlink r:id="rId77">
         <w:r>
           <w:rPr>
             <w:rStyle w:val="Hyperlink"/>
@@ -7520,7 +7755,7 @@
       <w:r>
         <w:t xml:space="preserve"> </w:t>
       </w:r>
-      <w:hyperlink r:id="rId77">
+      <w:hyperlink r:id="rId78">
         <w:r>
           <w:rPr>
             <w:rStyle w:val="Hyperlink"/>
@@ -7561,7 +7796,7 @@
       <w:r>
         <w:t xml:space="preserve"> </w:t>
       </w:r>
-      <w:hyperlink r:id="rId78">
+      <w:hyperlink r:id="rId79">
         <w:r>
           <w:rPr>
             <w:rStyle w:val="Hyperlink"/>
@@ -7602,7 +7837,7 @@
       <w:r>
         <w:t xml:space="preserve"> </w:t>
       </w:r>
-      <w:hyperlink r:id="rId79">
+      <w:hyperlink r:id="rId80">
         <w:r>
           <w:rPr>
             <w:rStyle w:val="Hyperlink"/>
@@ -7657,7 +7892,7 @@
       <w:r>
         <w:t xml:space="preserve"> </w:t>
       </w:r>
-      <w:hyperlink r:id="rId80">
+      <w:hyperlink r:id="rId81">
         <w:r>
           <w:rPr>
             <w:rStyle w:val="Hyperlink"/>
@@ -7712,7 +7947,7 @@
       <w:r>
         <w:t xml:space="preserve"> </w:t>
       </w:r>
-      <w:hyperlink r:id="rId81">
+      <w:hyperlink r:id="rId82">
         <w:r>
           <w:rPr>
             <w:rStyle w:val="Hyperlink"/>
@@ -7767,7 +8002,7 @@
       <w:r>
         <w:t xml:space="preserve"> </w:t>
       </w:r>
-      <w:hyperlink r:id="rId82">
+      <w:hyperlink r:id="rId83">
         <w:r>
           <w:rPr>
             <w:rStyle w:val="Hyperlink"/>
@@ -7822,7 +8057,7 @@
       <w:r>
         <w:t xml:space="preserve"> </w:t>
       </w:r>
-      <w:hyperlink r:id="rId83">
+      <w:hyperlink r:id="rId84">
         <w:r>
           <w:rPr>
             <w:rStyle w:val="Hyperlink"/>
@@ -7877,7 +8112,7 @@
       <w:r>
         <w:t xml:space="preserve"> </w:t>
       </w:r>
-      <w:hyperlink r:id="rId84">
+      <w:hyperlink r:id="rId85">
         <w:r>
           <w:rPr>
             <w:rStyle w:val="Hyperlink"/>
@@ -7932,7 +8167,7 @@
       <w:r>
         <w:t xml:space="preserve"> </w:t>
       </w:r>
-      <w:hyperlink r:id="rId85">
+      <w:hyperlink r:id="rId86">
         <w:r>
           <w:rPr>
             <w:rStyle w:val="Hyperlink"/>
@@ -7973,7 +8208,7 @@
       <w:r>
         <w:t xml:space="preserve"> </w:t>
       </w:r>
-      <w:hyperlink r:id="rId86">
+      <w:hyperlink r:id="rId87">
         <w:r>
           <w:rPr>
             <w:rStyle w:val="Hyperlink"/>
@@ -8014,7 +8249,7 @@
       <w:r>
         <w:t xml:space="preserve"> </w:t>
       </w:r>
-      <w:hyperlink r:id="rId87">
+      <w:hyperlink r:id="rId88">
         <w:r>
           <w:rPr>
             <w:rStyle w:val="Hyperlink"/>
@@ -8055,7 +8290,7 @@
       <w:r>
         <w:t xml:space="preserve"> </w:t>
       </w:r>
-      <w:hyperlink r:id="rId88">
+      <w:hyperlink r:id="rId89">
         <w:r>
           <w:rPr>
             <w:rStyle w:val="Hyperlink"/>
@@ -8110,7 +8345,7 @@
       <w:r>
         <w:t xml:space="preserve"> </w:t>
       </w:r>
-      <w:hyperlink r:id="rId89">
+      <w:hyperlink r:id="rId90">
         <w:r>
           <w:rPr>
             <w:rStyle w:val="Hyperlink"/>
@@ -8151,7 +8386,7 @@
       <w:r>
         <w:t xml:space="preserve"> </w:t>
       </w:r>
-      <w:hyperlink r:id="rId90">
+      <w:hyperlink r:id="rId91">
         <w:r>
           <w:rPr>
             <w:rStyle w:val="Hyperlink"/>
@@ -8206,7 +8441,7 @@
       <w:r>
         <w:t xml:space="preserve"> </w:t>
       </w:r>
-      <w:hyperlink r:id="rId91">
+      <w:hyperlink r:id="rId92">
         <w:r>
           <w:rPr>
             <w:rStyle w:val="Hyperlink"/>
@@ -8259,7 +8494,7 @@
       <w:r>
         <w:t xml:space="preserve"> </w:t>
       </w:r>
-      <w:hyperlink r:id="rId92">
+      <w:hyperlink r:id="rId93">
         <w:r>
           <w:rPr>
             <w:rStyle w:val="Hyperlink"/>
@@ -8314,7 +8549,7 @@
       <w:r>
         <w:t xml:space="preserve"> </w:t>
       </w:r>
-      <w:hyperlink r:id="rId93">
+      <w:hyperlink r:id="rId94">
         <w:r>
           <w:rPr>
             <w:rStyle w:val="Hyperlink"/>
@@ -8369,7 +8604,7 @@
       <w:r>
         <w:t xml:space="preserve"> </w:t>
       </w:r>
-      <w:hyperlink r:id="rId94">
+      <w:hyperlink r:id="rId95">
         <w:r>
           <w:rPr>
             <w:rStyle w:val="Hyperlink"/>
@@ -8410,7 +8645,7 @@
       <w:r>
         <w:t xml:space="preserve"> </w:t>
       </w:r>
-      <w:hyperlink r:id="rId95">
+      <w:hyperlink r:id="rId96">
         <w:r>
           <w:rPr>
             <w:rStyle w:val="Hyperlink"/>
@@ -8465,7 +8700,7 @@
       <w:r>
         <w:t xml:space="preserve"> </w:t>
       </w:r>
-      <w:hyperlink r:id="rId96">
+      <w:hyperlink r:id="rId97">
         <w:r>
           <w:rPr>
             <w:rStyle w:val="Hyperlink"/>
@@ -8520,7 +8755,7 @@
       <w:r>
         <w:t xml:space="preserve"> </w:t>
       </w:r>
-      <w:hyperlink r:id="rId97">
+      <w:hyperlink r:id="rId98">
         <w:r>
           <w:rPr>
             <w:rStyle w:val="Hyperlink"/>
@@ -8567,7 +8802,7 @@
       <w:r>
         <w:t xml:space="preserve"> </w:t>
       </w:r>
-      <w:hyperlink r:id="rId98">
+      <w:hyperlink r:id="rId99">
         <w:r>
           <w:rPr>
             <w:rStyle w:val="Hyperlink"/>
@@ -8608,7 +8843,7 @@
       <w:r>
         <w:t xml:space="preserve"> </w:t>
       </w:r>
-      <w:hyperlink r:id="rId99">
+      <w:hyperlink r:id="rId100">
         <w:r>
           <w:rPr>
             <w:rStyle w:val="Hyperlink"/>
@@ -8663,7 +8898,7 @@
       <w:r>
         <w:t xml:space="preserve"> </w:t>
       </w:r>
-      <w:hyperlink r:id="rId100">
+      <w:hyperlink r:id="rId101">
         <w:r>
           <w:rPr>
             <w:rStyle w:val="Hyperlink"/>
@@ -8704,7 +8939,7 @@
       <w:r>
         <w:t xml:space="preserve"> </w:t>
       </w:r>
-      <w:hyperlink r:id="rId101">
+      <w:hyperlink r:id="rId102">
         <w:r>
           <w:rPr>
             <w:rStyle w:val="Hyperlink"/>
@@ -8751,7 +8986,7 @@
       <w:r>
         <w:t xml:space="preserve"> </w:t>
       </w:r>
-      <w:hyperlink r:id="rId102">
+      <w:hyperlink r:id="rId103">
         <w:r>
           <w:rPr>
             <w:rStyle w:val="Hyperlink"/>
@@ -8798,7 +9033,7 @@
       <w:r>
         <w:t xml:space="preserve"> </w:t>
       </w:r>
-      <w:hyperlink r:id="rId103">
+      <w:hyperlink r:id="rId104">
         <w:r>
           <w:rPr>
             <w:rStyle w:val="Hyperlink"/>
@@ -8845,7 +9080,7 @@
       <w:r>
         <w:t xml:space="preserve"> </w:t>
       </w:r>
-      <w:hyperlink r:id="rId104">
+      <w:hyperlink r:id="rId105">
         <w:r>
           <w:rPr>
             <w:rStyle w:val="Hyperlink"/>
@@ -8900,7 +9135,7 @@
       <w:r>
         <w:t xml:space="preserve"> </w:t>
       </w:r>
-      <w:hyperlink r:id="rId105">
+      <w:hyperlink r:id="rId106">
         <w:r>
           <w:rPr>
             <w:rStyle w:val="Hyperlink"/>
@@ -8941,7 +9176,7 @@
       <w:r>
         <w:t xml:space="preserve"> </w:t>
       </w:r>
-      <w:hyperlink r:id="rId106">
+      <w:hyperlink r:id="rId107">
         <w:r>
           <w:rPr>
             <w:rStyle w:val="Hyperlink"/>
@@ -8982,7 +9217,7 @@
       <w:r>
         <w:t xml:space="preserve"> </w:t>
       </w:r>
-      <w:hyperlink r:id="rId107">
+      <w:hyperlink r:id="rId108">
         <w:r>
           <w:rPr>
             <w:rStyle w:val="Hyperlink"/>
@@ -9023,7 +9258,7 @@
       <w:r>
         <w:t xml:space="preserve"> </w:t>
       </w:r>
-      <w:hyperlink r:id="rId108">
+      <w:hyperlink r:id="rId109">
         <w:r>
           <w:rPr>
             <w:rStyle w:val="Hyperlink"/>
@@ -9064,7 +9299,7 @@
       <w:r>
         <w:t xml:space="preserve"> </w:t>
       </w:r>
-      <w:hyperlink r:id="rId109">
+      <w:hyperlink r:id="rId110">
         <w:r>
           <w:rPr>
             <w:rStyle w:val="Hyperlink"/>
@@ -9105,7 +9340,7 @@
       <w:r>
         <w:t xml:space="preserve"> </w:t>
       </w:r>
-      <w:hyperlink r:id="rId110">
+      <w:hyperlink r:id="rId111">
         <w:r>
           <w:rPr>
             <w:rStyle w:val="Hyperlink"/>
@@ -9146,7 +9381,7 @@
       <w:r>
         <w:t xml:space="preserve"> </w:t>
       </w:r>
-      <w:hyperlink r:id="rId111">
+      <w:hyperlink r:id="rId112">
         <w:r>
           <w:rPr>
             <w:rStyle w:val="Hyperlink"/>
@@ -9187,7 +9422,7 @@
       <w:r>
         <w:t xml:space="preserve"> </w:t>
       </w:r>
-      <w:hyperlink r:id="rId112">
+      <w:hyperlink r:id="rId113">
         <w:r>
           <w:rPr>
             <w:rStyle w:val="Hyperlink"/>
@@ -9228,7 +9463,7 @@
       <w:r>
         <w:t xml:space="preserve"> </w:t>
       </w:r>
-      <w:hyperlink r:id="rId113">
+      <w:hyperlink r:id="rId114">
         <w:r>
           <w:rPr>
             <w:rStyle w:val="Hyperlink"/>
@@ -9269,7 +9504,7 @@
       <w:r>
         <w:t xml:space="preserve"> </w:t>
       </w:r>
-      <w:hyperlink r:id="rId114">
+      <w:hyperlink r:id="rId115">
         <w:r>
           <w:rPr>
             <w:rStyle w:val="Hyperlink"/>
@@ -9310,7 +9545,7 @@
       <w:r>
         <w:t xml:space="preserve"> </w:t>
       </w:r>
-      <w:hyperlink r:id="rId115">
+      <w:hyperlink r:id="rId116">
         <w:r>
           <w:rPr>
             <w:rStyle w:val="Hyperlink"/>
@@ -9351,7 +9586,7 @@
       <w:r>
         <w:t xml:space="preserve"> </w:t>
       </w:r>
-      <w:hyperlink r:id="rId116">
+      <w:hyperlink r:id="rId117">
         <w:r>
           <w:rPr>
             <w:rStyle w:val="Hyperlink"/>
@@ -9528,6 +9763,46 @@
         <w:pStyle w:val="BodyText"/>
       </w:pPr>
       <w:r>
+        <w:t xml:space="preserve">B. Chen et al.,</w:t>
+      </w:r>
+      <w:r>
+        <w:t xml:space="preserve"> </w:t>
+      </w:r>
+      <w:r>
+        <w:t xml:space="preserve">“From Runnable to Verifiable: An Independent Reproducibility Study of LLM/Agent Vulnerability Workflows,”</w:t>
+      </w:r>
+      <w:r>
+        <w:t xml:space="preserve"> </w:t>
+      </w:r>
+      <w:r>
+        <w:t xml:space="preserve">arXiv:2608.09567v1, 2026.</w:t>
+      </w:r>
+    </w:p>
+    <w:p>
+      <w:pPr>
+        <w:pStyle w:val="BodyText"/>
+      </w:pPr>
+      <w:r>
+        <w:t xml:space="preserve">X. Qin et al.,</w:t>
+      </w:r>
+      <w:r>
+        <w:t xml:space="preserve"> </w:t>
+      </w:r>
+      <w:r>
+        <w:t xml:space="preserve">“What Does an Evaluation License? A Commit-Bound Census of Claim Replay,”</w:t>
+      </w:r>
+      <w:r>
+        <w:t xml:space="preserve"> </w:t>
+      </w:r>
+      <w:r>
+        <w:t xml:space="preserve">arXiv:2608.19269v4, 2026.</w:t>
+      </w:r>
+    </w:p>
+    <w:p>
+      <w:pPr>
+        <w:pStyle w:val="BodyText"/>
+      </w:pPr>
+      <w:r>
         <w:t xml:space="preserve">M. Jiang et al.,</w:t>
       </w:r>
       <w:r>
@@ -9712,7 +9987,7 @@
       <w:r>
         <w:t xml:space="preserve"> </w:t>
       </w:r>
-      <w:hyperlink r:id="rId117">
+      <w:hyperlink r:id="rId118">
         <w:r>
           <w:rPr>
             <w:rStyle w:val="Hyperlink"/>
@@ -9753,7 +10028,7 @@
       <w:r>
         <w:t xml:space="preserve"> </w:t>
       </w:r>
-      <w:hyperlink r:id="rId118">
+      <w:hyperlink r:id="rId119">
         <w:r>
           <w:rPr>
             <w:rStyle w:val="Hyperlink"/>
@@ -9765,7 +10040,7 @@
         <w:t xml:space="preserve">.</w:t>
       </w:r>
     </w:p>
-    <w:bookmarkEnd w:id="119"/>
+    <w:bookmarkEnd w:id="120"/>
     <w:sectPr>
       <w:footerReference w:type="default" r:id="rIdFtr1"/>
       <w:footnotePr>

</xml_diff>

<commit_message>
feat(paper): measure judged verdict replay per confidence band
</commit_message>
<xml_diff>
--- a/paper/word/graduation-thesis.docx
+++ b/paper/word/graduation-thesis.docx
@@ -6276,7 +6276,294 @@
         <w:t xml:space="preserve"> </w:t>
       </w:r>
       <w:r>
-        <w:t xml:space="preserve">call and cannot be re-derived deterministically. That boundary is stated rather than</w:t>
+        <w:t xml:space="preserve">call and cannot be re-derived deterministically.</w:t>
+      </w:r>
+    </w:p>
+    <w:p>
+      <w:pPr>
+        <w:pStyle w:val="BodyText"/>
+      </w:pPr>
+      <w:r>
+        <w:t xml:space="preserve">The judged layer was then measured directly rather than left unexamined. Twenty-four</w:t>
+      </w:r>
+      <w:r>
+        <w:t xml:space="preserve"> </w:t>
+      </w:r>
+      <w:r>
+        <w:t xml:space="preserve">recorded element judgements were sampled with a fixed seed, stratified across the three</w:t>
+      </w:r>
+      <w:r>
+        <w:t xml:space="preserve"> </w:t>
+      </w:r>
+      <w:r>
+        <w:t xml:space="preserve">confidence bands, and re-verified from the same retained artifacts with the same judge</w:t>
+      </w:r>
+      <w:r>
+        <w:t xml:space="preserve"> </w:t>
+      </w:r>
+      <w:r>
+        <w:t xml:space="preserve">and the committed verifier. Eighteen of twenty-four replayed. The split by band is the</w:t>
+      </w:r>
+      <w:r>
+        <w:t xml:space="preserve"> </w:t>
+      </w:r>
+      <w:r>
+        <w:t xml:space="preserve">result rather than the total:</w:t>
+      </w:r>
+      <w:r>
+        <w:t xml:space="preserve"> </w:t>
+      </w:r>
+      <m:oMath>
+        <m:r>
+          <m:t>10</m:t>
+        </m:r>
+      </m:oMath>
+      <w:r>
+        <w:t xml:space="preserve"> </w:t>
+      </w:r>
+      <w:r>
+        <w:t xml:space="preserve">of</w:t>
+      </w:r>
+      <w:r>
+        <w:t xml:space="preserve"> </w:t>
+      </w:r>
+      <m:oMath>
+        <m:r>
+          <m:t>10</m:t>
+        </m:r>
+      </m:oMath>
+      <w:r>
+        <w:t xml:space="preserve"> </w:t>
+      </w:r>
+      <w:r>
+        <w:t xml:space="preserve">above</w:t>
+      </w:r>
+      <w:r>
+        <w:t xml:space="preserve"> </w:t>
+      </w:r>
+      <m:oMath>
+        <m:r>
+          <m:t>0.9</m:t>
+        </m:r>
+      </m:oMath>
+      <w:r>
+        <w:t xml:space="preserve"> </w:t>
+      </w:r>
+      <w:r>
+        <w:t xml:space="preserve">confidence,</w:t>
+      </w:r>
+      <w:r>
+        <w:t xml:space="preserve"> </w:t>
+      </w:r>
+      <m:oMath>
+        <m:r>
+          <m:t>8</m:t>
+        </m:r>
+      </m:oMath>
+      <w:r>
+        <w:t xml:space="preserve"> </w:t>
+      </w:r>
+      <w:r>
+        <w:t xml:space="preserve">of</w:t>
+      </w:r>
+      <w:r>
+        <w:t xml:space="preserve"> </w:t>
+      </w:r>
+      <m:oMath>
+        <m:r>
+          <m:t>10</m:t>
+        </m:r>
+      </m:oMath>
+      <w:r>
+        <w:t xml:space="preserve"> </w:t>
+      </w:r>
+      <w:r>
+        <w:t xml:space="preserve">between</w:t>
+      </w:r>
+      <w:r>
+        <w:t xml:space="preserve"> </w:t>
+      </w:r>
+      <m:oMath>
+        <m:r>
+          <m:t>0.7</m:t>
+        </m:r>
+      </m:oMath>
+      <w:r>
+        <w:t xml:space="preserve"> </w:t>
+      </w:r>
+      <w:r>
+        <w:t xml:space="preserve">and</w:t>
+      </w:r>
+      <w:r>
+        <w:t xml:space="preserve"> </w:t>
+      </w:r>
+      <m:oMath>
+        <m:r>
+          <m:t>0.9</m:t>
+        </m:r>
+      </m:oMath>
+      <w:r>
+        <w:t xml:space="preserve">, and</w:t>
+      </w:r>
+      <w:r>
+        <w:t xml:space="preserve"> </w:t>
+      </w:r>
+      <m:oMath>
+        <m:r>
+          <m:t>0</m:t>
+        </m:r>
+      </m:oMath>
+      <w:r>
+        <w:t xml:space="preserve"> </w:t>
+      </w:r>
+      <w:r>
+        <w:t xml:space="preserve">of</w:t>
+      </w:r>
+      <w:r>
+        <w:t xml:space="preserve"> </w:t>
+      </w:r>
+      <m:oMath>
+        <m:r>
+          <m:t>4</m:t>
+        </m:r>
+      </m:oMath>
+      <w:r>
+        <w:t xml:space="preserve"> </w:t>
+      </w:r>
+      <w:r>
+        <w:t xml:space="preserve">below</w:t>
+      </w:r>
+      <w:r>
+        <w:t xml:space="preserve"> </w:t>
+      </w:r>
+      <m:oMath>
+        <m:r>
+          <m:t>0.7</m:t>
+        </m:r>
+      </m:oMath>
+      <w:r>
+        <w:t xml:space="preserve">. Two of the twenty-four retrieved no</w:t>
+      </w:r>
+      <w:r>
+        <w:t xml:space="preserve"> </w:t>
+      </w:r>
+      <w:r>
+        <w:t xml:space="preserve">candidate span, so the verifier returns a negative verdict without any model call; those</w:t>
+      </w:r>
+      <w:r>
+        <w:t xml:space="preserve"> </w:t>
+      </w:r>
+      <w:r>
+        <w:t xml:space="preserve">are reported separately and excluding them leaves</w:t>
+      </w:r>
+      <w:r>
+        <w:t xml:space="preserve"> </w:t>
+      </w:r>
+      <m:oMath>
+        <m:r>
+          <m:t>16</m:t>
+        </m:r>
+      </m:oMath>
+      <w:r>
+        <w:t xml:space="preserve"> </w:t>
+      </w:r>
+      <w:r>
+        <w:t xml:space="preserve">of</w:t>
+      </w:r>
+      <w:r>
+        <w:t xml:space="preserve"> </w:t>
+      </w:r>
+      <m:oMath>
+        <m:r>
+          <m:t>22</m:t>
+        </m:r>
+      </m:oMath>
+      <w:r>
+        <w:t xml:space="preserve">.</w:t>
+      </w:r>
+    </w:p>
+    <w:p>
+      <w:pPr>
+        <w:pStyle w:val="BodyText"/>
+      </w:pPr>
+      <w:r>
+        <w:t xml:space="preserve">This supports the</w:t>
+      </w:r>
+      <w:r>
+        <w:t xml:space="preserve"> </w:t>
+      </w:r>
+      <m:oMath>
+        <m:r>
+          <m:t>0.9</m:t>
+        </m:r>
+      </m:oMath>
+      <w:r>
+        <w:t xml:space="preserve"> </w:t>
+      </w:r>
+      <w:r>
+        <w:t xml:space="preserve">admission floor with a measurement rather than with prior</w:t>
+      </w:r>
+      <w:r>
+        <w:t xml:space="preserve"> </w:t>
+      </w:r>
+      <w:r>
+        <w:t xml:space="preserve">reasoning, and it shows that verdicts below</w:t>
+      </w:r>
+      <w:r>
+        <w:t xml:space="preserve"> </w:t>
+      </w:r>
+      <m:oMath>
+        <m:r>
+          <m:t>0.7</m:t>
+        </m:r>
+      </m:oMath>
+      <w:r>
+        <w:t xml:space="preserve"> </w:t>
+      </w:r>
+      <w:r>
+        <w:t xml:space="preserve">carry no reproducible content and must</w:t>
+      </w:r>
+      <w:r>
+        <w:t xml:space="preserve"> </w:t>
+      </w:r>
+      <w:r>
+        <w:t xml:space="preserve">not be scored. Three limits are attached. Replay is not correctness, since no human</w:t>
+      </w:r>
+      <w:r>
+        <w:t xml:space="preserve"> </w:t>
+      </w:r>
+      <w:r>
+        <w:t xml:space="preserve">label exists for any replayed item. A disagreement cannot be attributed to judge</w:t>
+      </w:r>
+      <w:r>
+        <w:t xml:space="preserve"> </w:t>
+      </w:r>
+      <w:r>
+        <w:t xml:space="preserve">stochasticity rather than to item ambiguity from this design</w:t>
+      </w:r>
+      <w:r>
+        <w:t xml:space="preserve"> </w:t>
+      </w:r>
+      <w:r>
+        <w:t xml:space="preserve">[64], which is why no cause is assigned. And a fixed</w:t>
+      </w:r>
+      <w:r>
+        <w:t xml:space="preserve"> </w:t>
+      </w:r>
+      <w:r>
+        <w:t xml:space="preserve">configuration returning a fixed answer is an assumption that has been refuted elsewhere</w:t>
+      </w:r>
+      <w:r>
+        <w:t xml:space="preserve"> </w:t>
+      </w:r>
+      <w:r>
+        <w:t xml:space="preserve">[65], so the low band is treated as unusable rather than as noisy but</w:t>
+      </w:r>
+      <w:r>
+        <w:t xml:space="preserve"> </w:t>
+      </w:r>
+      <w:r>
+        <w:t xml:space="preserve">informative. That boundary is stated rather than</w:t>
       </w:r>
       <w:r>
         <w:t xml:space="preserve"> </w:t>
@@ -6288,13 +6575,13 @@
         <w:t xml:space="preserve"> </w:t>
       </w:r>
       <w:r>
-        <w:t xml:space="preserve">[64], and replaying historical claims from a frozen collection</w:t>
-      </w:r>
-      <w:r>
-        <w:t xml:space="preserve"> </w:t>
-      </w:r>
-      <w:r>
-        <w:t xml:space="preserve">commonly stops before the claim is reachable [65].</w:t>
+        <w:t xml:space="preserve">[66], and replaying historical claims from a frozen collection</w:t>
+      </w:r>
+      <w:r>
+        <w:t xml:space="preserve"> </w:t>
+      </w:r>
+      <w:r>
+        <w:t xml:space="preserve">commonly stops before the claim is reachable [67].</w:t>
       </w:r>
     </w:p>
     <w:p>
@@ -6488,7 +6775,7 @@
         <w:t xml:space="preserve"> </w:t>
       </w:r>
       <w:r>
-        <w:t xml:space="preserve">[66], so its suite asserts the deterministic shell around the</w:t>
+        <w:t xml:space="preserve">[68], so its suite asserts the deterministic shell around the</w:t>
       </w:r>
       <w:r>
         <w:t xml:space="preserve"> </w:t>
@@ -6506,7 +6793,7 @@
         <w:t xml:space="preserve"> </w:t>
       </w:r>
       <w:r>
-        <w:t xml:space="preserve">[67].</w:t>
+        <w:t xml:space="preserve">[69].</w:t>
       </w:r>
     </w:p>
     <w:p>
@@ -6526,7 +6813,7 @@
         <w:t xml:space="preserve"> </w:t>
       </w:r>
       <w:r>
-        <w:t xml:space="preserve">and expectation together [68], which is exactly how the cost</w:t>
+        <w:t xml:space="preserve">and expectation together [70], which is exactly how the cost</w:t>
       </w:r>
       <w:r>
         <w:t xml:space="preserve"> </w:t>
@@ -6538,7 +6825,7 @@
         <w:t xml:space="preserve"> </w:t>
       </w:r>
       <w:r>
-        <w:t xml:space="preserve">documented behaviour unvalidated [69], and silent measurement</w:t>
+        <w:t xml:space="preserve">documented behaviour unvalidated [71], and silent measurement</w:t>
       </w:r>
       <w:r>
         <w:t xml:space="preserve"> </w:t>
@@ -6550,7 +6837,7 @@
         <w:t xml:space="preserve"> </w:t>
       </w:r>
       <w:r>
-        <w:t xml:space="preserve">edge case [70]. Two limits are recorded. Catching seventeen</w:t>
+        <w:t xml:space="preserve">edge case [72]. Two limits are recorded. Catching seventeen</w:t>
       </w:r>
       <w:r>
         <w:t xml:space="preserve"> </w:t>
@@ -6616,7 +6903,7 @@
         <w:t xml:space="preserve"> </w:t>
       </w:r>
       <w:r>
-        <w:t xml:space="preserve">lists are read [71]. Measured against the ledger digest recorded in</w:t>
+        <w:t xml:space="preserve">lists are read [73]. Measured against the ledger digest recorded in</w:t>
       </w:r>
       <w:r>
         <w:t xml:space="preserve"> </w:t>
@@ -6743,7 +7030,7 @@
         <w:t xml:space="preserve"> </w:t>
       </w:r>
       <w:r>
-        <w:t xml:space="preserve">scores calls for [72], and it is also the boundary of what</w:t>
+        <w:t xml:space="preserve">scores calls for [74], and it is also the boundary of what</w:t>
       </w:r>
       <w:r>
         <w:t xml:space="preserve"> </w:t>
@@ -6755,7 +7042,7 @@
         <w:t xml:space="preserve"> </w:t>
       </w:r>
       <w:r>
-        <w:t xml:space="preserve">substitutes for understanding rather than supplying it [73].</w:t>
+        <w:t xml:space="preserve">substitutes for understanding rather than supplying it [75].</w:t>
       </w:r>
     </w:p>
     <w:bookmarkEnd w:id="61"/>
@@ -6904,7 +7191,7 @@
         <w:t xml:space="preserve"> </w:t>
       </w:r>
       <w:r>
-        <w:t xml:space="preserve">single terminal score [74].</w:t>
+        <w:t xml:space="preserve">single terminal score [76].</w:t>
       </w:r>
     </w:p>
     <w:p>
@@ -6986,7 +7273,7 @@
         <w:t xml:space="preserve"> </w:t>
       </w:r>
       <w:r>
-        <w:t xml:space="preserve">[75]; this project spent 192 model calls to verify 32</w:t>
+        <w:t xml:space="preserve">[77]; this project spent 192 model calls to verify 32</w:t>
       </w:r>
       <w:r>
         <w:t xml:space="preserve"> </w:t>
@@ -9756,6 +10043,46 @@
       </w:r>
       <w:r>
         <w:t xml:space="preserve">arXiv:2608.01347v5, 2026.</w:t>
+      </w:r>
+    </w:p>
+    <w:p>
+      <w:pPr>
+        <w:pStyle w:val="BodyText"/>
+      </w:pPr>
+      <w:r>
+        <w:t xml:space="preserve">P. Feng et al.,</w:t>
+      </w:r>
+      <w:r>
+        <w:t xml:space="preserve"> </w:t>
+      </w:r>
+      <w:r>
+        <w:t xml:space="preserve">“Second-Order Response Laws for LLM Judges: Debiased Estimation of Prompt Effects,”</w:t>
+      </w:r>
+      <w:r>
+        <w:t xml:space="preserve"> </w:t>
+      </w:r>
+      <w:r>
+        <w:t xml:space="preserve">arXiv:2608.16253v1, 2026.</w:t>
+      </w:r>
+    </w:p>
+    <w:p>
+      <w:pPr>
+        <w:pStyle w:val="BodyText"/>
+      </w:pPr>
+      <w:r>
+        <w:t xml:space="preserve">J. Ning et al.,</w:t>
+      </w:r>
+      <w:r>
+        <w:t xml:space="preserve"> </w:t>
+      </w:r>
+      <w:r>
+        <w:t xml:space="preserve">“Same Agent, Different Answers: A Repeat-Aware Audit of Corpus-Induced Answer Churn,”</w:t>
+      </w:r>
+      <w:r>
+        <w:t xml:space="preserve"> </w:t>
+      </w:r>
+      <w:r>
+        <w:t xml:space="preserve">arXiv:2608.22856v1, 2026.</w:t>
       </w:r>
     </w:p>
     <w:p>

</xml_diff>

<commit_message>
fix(paper): refute the unlabelable-item hypothesis and correct the low-band claim
</commit_message>
<xml_diff>
--- a/paper/word/graduation-thesis.docx
+++ b/paper/word/graduation-thesis.docx
@@ -6507,27 +6507,129 @@
         <w:t xml:space="preserve"> </w:t>
       </w:r>
       <w:r>
-        <w:t xml:space="preserve">reasoning, and it shows that verdicts below</w:t>
+        <w:t xml:space="preserve">reasoning. A first reading of the low band, that its verdicts carry no reproducible</w:t>
+      </w:r>
+      <w:r>
+        <w:t xml:space="preserve"> </w:t>
+      </w:r>
+      <w:r>
+        <w:t xml:space="preserve">content, was too strong and the next cycle corrected it. Repeating every low-confidence</w:t>
+      </w:r>
+      <w:r>
+        <w:t xml:space="preserve"> </w:t>
+      </w:r>
+      <w:r>
+        <w:t xml:space="preserve">item five times gave a mean modal share of</w:t>
       </w:r>
       <w:r>
         <w:t xml:space="preserve"> </w:t>
       </w:r>
       <m:oMath>
         <m:r>
-          <m:t>0.7</m:t>
+          <m:t>0.88</m:t>
         </m:r>
       </m:oMath>
       <w:r>
         <w:t xml:space="preserve"> </w:t>
       </w:r>
       <w:r>
-        <w:t xml:space="preserve">carry no reproducible content and must</w:t>
-      </w:r>
-      <w:r>
-        <w:t xml:space="preserve"> </w:t>
-      </w:r>
-      <w:r>
-        <w:t xml:space="preserve">not be scored. Three limits are attached. Replay is not correctness, since no human</w:t>
+        <w:t xml:space="preserve">with two of five unanimous, against</w:t>
+      </w:r>
+      <w:r>
+        <w:t xml:space="preserve"> </w:t>
+      </w:r>
+      <m:oMath>
+        <m:r>
+          <m:t>1.00</m:t>
+        </m:r>
+      </m:oMath>
+      <w:r>
+        <w:t xml:space="preserve"> </w:t>
+      </w:r>
+      <w:r>
+        <w:t xml:space="preserve">and four of four for high-confidence controls. The items therefore carry a stable</w:t>
+      </w:r>
+      <w:r>
+        <w:t xml:space="preserve"> </w:t>
+      </w:r>
+      <w:r>
+        <w:t xml:space="preserve">answer and are labelable. What fails is the recorded draw: it matches the item’s own</w:t>
+      </w:r>
+      <w:r>
+        <w:t xml:space="preserve"> </w:t>
+      </w:r>
+      <w:r>
+        <w:t xml:space="preserve">modal answer in only</w:t>
+      </w:r>
+      <w:r>
+        <w:t xml:space="preserve"> </w:t>
+      </w:r>
+      <m:oMath>
+        <m:r>
+          <m:t>1</m:t>
+        </m:r>
+      </m:oMath>
+      <w:r>
+        <w:t xml:space="preserve"> </w:t>
+      </w:r>
+      <w:r>
+        <w:t xml:space="preserve">of</w:t>
+      </w:r>
+      <w:r>
+        <w:t xml:space="preserve"> </w:t>
+      </w:r>
+      <m:oMath>
+        <m:r>
+          <m:t>5</m:t>
+        </m:r>
+      </m:oMath>
+      <w:r>
+        <w:t xml:space="preserve"> </w:t>
+      </w:r>
+      <w:r>
+        <w:t xml:space="preserve">cases, and it returned an unclear verdict three times</w:t>
+      </w:r>
+      <w:r>
+        <w:t xml:space="preserve"> </w:t>
+      </w:r>
+      <w:r>
+        <w:t xml:space="preserve">where repeats converge on a definite one. The three low-confidence items stay in the</w:t>
+      </w:r>
+      <w:r>
+        <w:t xml:space="preserve"> </w:t>
+      </w:r>
+      <w:r>
+        <w:t xml:space="preserve">calibration set, and any recorded low-confidence verdict is replaced by a modal verdict</w:t>
+      </w:r>
+      <w:r>
+        <w:t xml:space="preserve"> </w:t>
+      </w:r>
+      <w:r>
+        <w:t xml:space="preserve">over at least five repeats before it is compared with a human label. Annotation variance</w:t>
+      </w:r>
+      <w:r>
+        <w:t xml:space="preserve"> </w:t>
+      </w:r>
+      <w:r>
+        <w:t xml:space="preserve">can come from the item or from the rater [64], and this</w:t>
+      </w:r>
+      <w:r>
+        <w:t xml:space="preserve"> </w:t>
+      </w:r>
+      <w:r>
+        <w:t xml:space="preserve">separates the two for these items; but agreement across repeats measures how</w:t>
+      </w:r>
+      <w:r>
+        <w:t xml:space="preserve"> </w:t>
+      </w:r>
+      <w:r>
+        <w:t xml:space="preserve">concentrated an answer distribution is, not whether its mode is right</w:t>
+      </w:r>
+      <w:r>
+        <w:t xml:space="preserve"> </w:t>
+      </w:r>
+      <w:r>
+        <w:t xml:space="preserve">[65]. Three limits are attached. Replay is not correctness, since no human</w:t>
       </w:r>
       <w:r>
         <w:t xml:space="preserve"> </w:t>
@@ -6545,7 +6647,7 @@
         <w:t xml:space="preserve"> </w:t>
       </w:r>
       <w:r>
-        <w:t xml:space="preserve">[64], which is why no cause is assigned. And a fixed</w:t>
+        <w:t xml:space="preserve">[66], which is why no cause is assigned. And a fixed</w:t>
       </w:r>
       <w:r>
         <w:t xml:space="preserve"> </w:t>
@@ -6557,7 +6659,7 @@
         <w:t xml:space="preserve"> </w:t>
       </w:r>
       <w:r>
-        <w:t xml:space="preserve">[65], so the low band is treated as unusable rather than as noisy but</w:t>
+        <w:t xml:space="preserve">[67], so the low band is treated as unusable rather than as noisy but</w:t>
       </w:r>
       <w:r>
         <w:t xml:space="preserve"> </w:t>
@@ -6575,13 +6677,13 @@
         <w:t xml:space="preserve"> </w:t>
       </w:r>
       <w:r>
-        <w:t xml:space="preserve">[66], and replaying historical claims from a frozen collection</w:t>
-      </w:r>
-      <w:r>
-        <w:t xml:space="preserve"> </w:t>
-      </w:r>
-      <w:r>
-        <w:t xml:space="preserve">commonly stops before the claim is reachable [67].</w:t>
+        <w:t xml:space="preserve">[68], and replaying historical claims from a frozen collection</w:t>
+      </w:r>
+      <w:r>
+        <w:t xml:space="preserve"> </w:t>
+      </w:r>
+      <w:r>
+        <w:t xml:space="preserve">commonly stops before the claim is reachable [69].</w:t>
       </w:r>
     </w:p>
     <w:p>
@@ -6775,7 +6877,7 @@
         <w:t xml:space="preserve"> </w:t>
       </w:r>
       <w:r>
-        <w:t xml:space="preserve">[68], so its suite asserts the deterministic shell around the</w:t>
+        <w:t xml:space="preserve">[70], so its suite asserts the deterministic shell around the</w:t>
       </w:r>
       <w:r>
         <w:t xml:space="preserve"> </w:t>
@@ -6793,7 +6895,7 @@
         <w:t xml:space="preserve"> </w:t>
       </w:r>
       <w:r>
-        <w:t xml:space="preserve">[69].</w:t>
+        <w:t xml:space="preserve">[71].</w:t>
       </w:r>
     </w:p>
     <w:p>
@@ -6813,7 +6915,7 @@
         <w:t xml:space="preserve"> </w:t>
       </w:r>
       <w:r>
-        <w:t xml:space="preserve">and expectation together [70], which is exactly how the cost</w:t>
+        <w:t xml:space="preserve">and expectation together [72], which is exactly how the cost</w:t>
       </w:r>
       <w:r>
         <w:t xml:space="preserve"> </w:t>
@@ -6825,7 +6927,7 @@
         <w:t xml:space="preserve"> </w:t>
       </w:r>
       <w:r>
-        <w:t xml:space="preserve">documented behaviour unvalidated [71], and silent measurement</w:t>
+        <w:t xml:space="preserve">documented behaviour unvalidated [73], and silent measurement</w:t>
       </w:r>
       <w:r>
         <w:t xml:space="preserve"> </w:t>
@@ -6837,7 +6939,7 @@
         <w:t xml:space="preserve"> </w:t>
       </w:r>
       <w:r>
-        <w:t xml:space="preserve">edge case [72]. Two limits are recorded. Catching seventeen</w:t>
+        <w:t xml:space="preserve">edge case [74]. Two limits are recorded. Catching seventeen</w:t>
       </w:r>
       <w:r>
         <w:t xml:space="preserve"> </w:t>
@@ -6903,7 +7005,7 @@
         <w:t xml:space="preserve"> </w:t>
       </w:r>
       <w:r>
-        <w:t xml:space="preserve">lists are read [73]. Measured against the ledger digest recorded in</w:t>
+        <w:t xml:space="preserve">lists are read [75]. Measured against the ledger digest recorded in</w:t>
       </w:r>
       <w:r>
         <w:t xml:space="preserve"> </w:t>
@@ -7030,7 +7132,7 @@
         <w:t xml:space="preserve"> </w:t>
       </w:r>
       <w:r>
-        <w:t xml:space="preserve">scores calls for [74], and it is also the boundary of what</w:t>
+        <w:t xml:space="preserve">scores calls for [76], and it is also the boundary of what</w:t>
       </w:r>
       <w:r>
         <w:t xml:space="preserve"> </w:t>
@@ -7042,7 +7144,7 @@
         <w:t xml:space="preserve"> </w:t>
       </w:r>
       <w:r>
-        <w:t xml:space="preserve">substitutes for understanding rather than supplying it [75].</w:t>
+        <w:t xml:space="preserve">substitutes for understanding rather than supplying it [77].</w:t>
       </w:r>
     </w:p>
     <w:bookmarkEnd w:id="61"/>
@@ -7191,7 +7293,7 @@
         <w:t xml:space="preserve"> </w:t>
       </w:r>
       <w:r>
-        <w:t xml:space="preserve">single terminal score [76].</w:t>
+        <w:t xml:space="preserve">single terminal score [78].</w:t>
       </w:r>
     </w:p>
     <w:p>
@@ -7273,7 +7375,7 @@
         <w:t xml:space="preserve"> </w:t>
       </w:r>
       <w:r>
-        <w:t xml:space="preserve">[77]; this project spent 192 model calls to verify 32</w:t>
+        <w:t xml:space="preserve">[79]; this project spent 192 model calls to verify 32</w:t>
       </w:r>
       <w:r>
         <w:t xml:space="preserve"> </w:t>
@@ -10043,6 +10145,46 @@
       </w:r>
       <w:r>
         <w:t xml:space="preserve">arXiv:2608.01347v5, 2026.</w:t>
+      </w:r>
+    </w:p>
+    <w:p>
+      <w:pPr>
+        <w:pStyle w:val="BodyText"/>
+      </w:pPr>
+      <w:r>
+        <w:t xml:space="preserve">L. Zhang et al.,</w:t>
+      </w:r>
+      <w:r>
+        <w:t xml:space="preserve"> </w:t>
+      </w:r>
+      <w:r>
+        <w:t xml:space="preserve">“Quantifying and Predicting Disagreement in Graded Human Ratings,”</w:t>
+      </w:r>
+      <w:r>
+        <w:t xml:space="preserve"> </w:t>
+      </w:r>
+      <w:r>
+        <w:t xml:space="preserve">arXiv:2605.01168v1, 2026.</w:t>
+      </w:r>
+    </w:p>
+    <w:p>
+      <w:pPr>
+        <w:pStyle w:val="BodyText"/>
+      </w:pPr>
+      <w:r>
+        <w:t xml:space="preserve">R. Khanbayov et al.,</w:t>
+      </w:r>
+      <w:r>
+        <w:t xml:space="preserve"> </w:t>
+      </w:r>
+      <w:r>
+        <w:t xml:space="preserve">“When Does Consensus Mean Correctness? Measuring the Agreement-Accuracy Coupling,”</w:t>
+      </w:r>
+      <w:r>
+        <w:t xml:space="preserve"> </w:t>
+      </w:r>
+      <w:r>
+        <w:t xml:space="preserve">arXiv:2608.05670v1, 2026.</w:t>
       </w:r>
     </w:p>
     <w:p>

</xml_diff>

<commit_message>
feat(paper): scope the modal rule by measurement and correct low-band verdicts
</commit_message>
<xml_diff>
--- a/paper/word/graduation-thesis.docx
+++ b/paper/word/graduation-thesis.docx
@@ -6605,13 +6605,242 @@
         <w:t xml:space="preserve"> </w:t>
       </w:r>
       <w:r>
-        <w:t xml:space="preserve">over at least five repeats before it is compared with a human label. Annotation variance</w:t>
-      </w:r>
-      <w:r>
-        <w:t xml:space="preserve"> </w:t>
-      </w:r>
-      <w:r>
-        <w:t xml:space="preserve">can come from the item or from the rater [64], and this</w:t>
+        <w:t xml:space="preserve">over at least five repeats before it is compared with a human label.</w:t>
+      </w:r>
+    </w:p>
+    <w:p>
+      <w:pPr>
+        <w:pStyle w:val="BodyText"/>
+      </w:pPr>
+      <w:r>
+        <w:t xml:space="preserve">The scope of that rule was then measured rather than assumed, because the middle band</w:t>
+      </w:r>
+      <w:r>
+        <w:t xml:space="preserve"> </w:t>
+      </w:r>
+      <w:r>
+        <w:t xml:space="preserve">holds</w:t>
+      </w:r>
+      <w:r>
+        <w:t xml:space="preserve"> </w:t>
+      </w:r>
+      <m:oMath>
+        <m:r>
+          <m:t>112</m:t>
+        </m:r>
+      </m:oMath>
+      <w:r>
+        <w:t xml:space="preserve"> </w:t>
+      </w:r>
+      <w:r>
+        <w:t xml:space="preserve">of the</w:t>
+      </w:r>
+      <w:r>
+        <w:t xml:space="preserve"> </w:t>
+      </w:r>
+      <m:oMath>
+        <m:r>
+          <m:t>192</m:t>
+        </m:r>
+      </m:oMath>
+      <w:r>
+        <w:t xml:space="preserve"> </w:t>
+      </w:r>
+      <w:r>
+        <w:t xml:space="preserve">judgements. Ten middle-band items over five repeats gave a mean</w:t>
+      </w:r>
+      <w:r>
+        <w:t xml:space="preserve"> </w:t>
+      </w:r>
+      <w:r>
+        <w:t xml:space="preserve">modal share of</w:t>
+      </w:r>
+      <w:r>
+        <w:t xml:space="preserve"> </w:t>
+      </w:r>
+      <m:oMath>
+        <m:r>
+          <m:t>0.86</m:t>
+        </m:r>
+      </m:oMath>
+      <w:r>
+        <w:t xml:space="preserve">, close to the low band’s</w:t>
+      </w:r>
+      <w:r>
+        <w:t xml:space="preserve"> </w:t>
+      </w:r>
+      <m:oMath>
+        <m:r>
+          <m:t>0.88</m:t>
+        </m:r>
+      </m:oMath>
+      <w:r>
+        <w:t xml:space="preserve">, so within-item stability does not</w:t>
+      </w:r>
+      <w:r>
+        <w:t xml:space="preserve"> </w:t>
+      </w:r>
+      <w:r>
+        <w:t xml:space="preserve">separate the bands. What separates them is whether the recorded draw represents the</w:t>
+      </w:r>
+      <w:r>
+        <w:t xml:space="preserve"> </w:t>
+      </w:r>
+      <w:r>
+        <w:t xml:space="preserve">item:</w:t>
+      </w:r>
+      <w:r>
+        <w:t xml:space="preserve"> </w:t>
+      </w:r>
+      <m:oMath>
+        <m:r>
+          <m:t>9</m:t>
+        </m:r>
+      </m:oMath>
+      <w:r>
+        <w:t xml:space="preserve"> </w:t>
+      </w:r>
+      <w:r>
+        <w:t xml:space="preserve">of</w:t>
+      </w:r>
+      <w:r>
+        <w:t xml:space="preserve"> </w:t>
+      </w:r>
+      <m:oMath>
+        <m:r>
+          <m:t>10</m:t>
+        </m:r>
+      </m:oMath>
+      <w:r>
+        <w:t xml:space="preserve"> </w:t>
+      </w:r>
+      <w:r>
+        <w:t xml:space="preserve">in the middle band against</w:t>
+      </w:r>
+      <w:r>
+        <w:t xml:space="preserve"> </w:t>
+      </w:r>
+      <m:oMath>
+        <m:r>
+          <m:t>1</m:t>
+        </m:r>
+      </m:oMath>
+      <w:r>
+        <w:t xml:space="preserve"> </w:t>
+      </w:r>
+      <w:r>
+        <w:t xml:space="preserve">of</w:t>
+      </w:r>
+      <w:r>
+        <w:t xml:space="preserve"> </w:t>
+      </w:r>
+      <m:oMath>
+        <m:r>
+          <m:t>5</m:t>
+        </m:r>
+      </m:oMath>
+      <w:r>
+        <w:t xml:space="preserve"> </w:t>
+      </w:r>
+      <w:r>
+        <w:t xml:space="preserve">in the low band. Reported</w:t>
+      </w:r>
+      <w:r>
+        <w:t xml:space="preserve"> </w:t>
+      </w:r>
+      <w:r>
+        <w:t xml:space="preserve">confidence therefore predicts whether a single draw represents the item, not how</w:t>
+      </w:r>
+      <w:r>
+        <w:t xml:space="preserve"> </w:t>
+      </w:r>
+      <w:r>
+        <w:t xml:space="preserve">concentrated the item’s answer distribution is, and the rule stays scoped below</w:t>
+      </w:r>
+      <w:r>
+        <w:t xml:space="preserve"> </w:t>
+      </w:r>
+      <m:oMath>
+        <m:r>
+          <m:t>0.7</m:t>
+        </m:r>
+      </m:oMath>
+      <w:r>
+        <w:t xml:space="preserve">.</w:t>
+      </w:r>
+      <w:r>
+        <w:t xml:space="preserve"> </w:t>
+      </w:r>
+      <w:r>
+        <w:t xml:space="preserve">Applying it rewrote five records and changed four verdicts. Every unclear verdict in the</w:t>
+      </w:r>
+      <w:r>
+        <w:t xml:space="preserve"> </w:t>
+      </w:r>
+      <w:r>
+        <w:t xml:space="preserve">whole pool proved to be a low-confidence single draw, and all three resolved to a</w:t>
+      </w:r>
+      <w:r>
+        <w:t xml:space="preserve"> </w:t>
+      </w:r>
+      <w:r>
+        <w:t xml:space="preserve">definite verdict under repeats, so that category is now empty. Each original draw is</w:t>
+      </w:r>
+      <w:r>
+        <w:t xml:space="preserve"> </w:t>
+      </w:r>
+      <w:r>
+        <w:t xml:space="preserve">retained beside its replacement.</w:t>
+      </w:r>
+    </w:p>
+    <w:p>
+      <w:pPr>
+        <w:pStyle w:val="BodyText"/>
+      </w:pPr>
+      <w:r>
+        <w:t xml:space="preserve">This correction is recorded with its counterevidence rather than as a settled</w:t>
+      </w:r>
+      <w:r>
+        <w:t xml:space="preserve"> </w:t>
+      </w:r>
+      <w:r>
+        <w:t xml:space="preserve">improvement. Majority vote has been shown to reduce per-problem accuracy on most hard</w:t>
+      </w:r>
+      <w:r>
+        <w:t xml:space="preserve"> </w:t>
+      </w:r>
+      <w:r>
+        <w:t xml:space="preserve">problems for small models [64], and agreement can be high while the</w:t>
+      </w:r>
+      <w:r>
+        <w:t xml:space="preserve"> </w:t>
+      </w:r>
+      <w:r>
+        <w:t xml:space="preserve">answer is wrong [65]. The rule was applied precisely to the hardest</w:t>
+      </w:r>
+      <w:r>
+        <w:t xml:space="preserve"> </w:t>
+      </w:r>
+      <w:r>
+        <w:t xml:space="preserve">items, so aggregation could entrench a wrong answer rather than recover a right one. Its</w:t>
+      </w:r>
+      <w:r>
+        <w:t xml:space="preserve"> </w:t>
+      </w:r>
+      <w:r>
+        <w:t xml:space="preserve">falsifier is written to revert it: if the human labels agree more often with the original</w:t>
+      </w:r>
+      <w:r>
+        <w:t xml:space="preserve"> </w:t>
+      </w:r>
+      <w:r>
+        <w:t xml:space="preserve">single draws than with the modal verdicts, the correction made the record worse. Annotation variance</w:t>
+      </w:r>
+      <w:r>
+        <w:t xml:space="preserve"> </w:t>
+      </w:r>
+      <w:r>
+        <w:t xml:space="preserve">can come from the item or from the rater [66], and this</w:t>
       </w:r>
       <w:r>
         <w:t xml:space="preserve"> </w:t>
@@ -6629,7 +6858,7 @@
         <w:t xml:space="preserve"> </w:t>
       </w:r>
       <w:r>
-        <w:t xml:space="preserve">[65]. Three limits are attached. Replay is not correctness, since no human</w:t>
+        <w:t xml:space="preserve">[67]. Three limits are attached. Replay is not correctness, since no human</w:t>
       </w:r>
       <w:r>
         <w:t xml:space="preserve"> </w:t>
@@ -6647,7 +6876,7 @@
         <w:t xml:space="preserve"> </w:t>
       </w:r>
       <w:r>
-        <w:t xml:space="preserve">[66], which is why no cause is assigned. And a fixed</w:t>
+        <w:t xml:space="preserve">[68], which is why no cause is assigned. And a fixed</w:t>
       </w:r>
       <w:r>
         <w:t xml:space="preserve"> </w:t>
@@ -6659,7 +6888,7 @@
         <w:t xml:space="preserve"> </w:t>
       </w:r>
       <w:r>
-        <w:t xml:space="preserve">[67], so the low band is treated as unusable rather than as noisy but</w:t>
+        <w:t xml:space="preserve">[69], so the low band is treated as unusable rather than as noisy but</w:t>
       </w:r>
       <w:r>
         <w:t xml:space="preserve"> </w:t>
@@ -6677,13 +6906,13 @@
         <w:t xml:space="preserve"> </w:t>
       </w:r>
       <w:r>
-        <w:t xml:space="preserve">[68], and replaying historical claims from a frozen collection</w:t>
-      </w:r>
-      <w:r>
-        <w:t xml:space="preserve"> </w:t>
-      </w:r>
-      <w:r>
-        <w:t xml:space="preserve">commonly stops before the claim is reachable [69].</w:t>
+        <w:t xml:space="preserve">[70], and replaying historical claims from a frozen collection</w:t>
+      </w:r>
+      <w:r>
+        <w:t xml:space="preserve"> </w:t>
+      </w:r>
+      <w:r>
+        <w:t xml:space="preserve">commonly stops before the claim is reachable [71].</w:t>
       </w:r>
     </w:p>
     <w:p>
@@ -6877,7 +7106,7 @@
         <w:t xml:space="preserve"> </w:t>
       </w:r>
       <w:r>
-        <w:t xml:space="preserve">[70], so its suite asserts the deterministic shell around the</w:t>
+        <w:t xml:space="preserve">[72], so its suite asserts the deterministic shell around the</w:t>
       </w:r>
       <w:r>
         <w:t xml:space="preserve"> </w:t>
@@ -6895,7 +7124,7 @@
         <w:t xml:space="preserve"> </w:t>
       </w:r>
       <w:r>
-        <w:t xml:space="preserve">[71].</w:t>
+        <w:t xml:space="preserve">[73].</w:t>
       </w:r>
     </w:p>
     <w:p>
@@ -6915,7 +7144,7 @@
         <w:t xml:space="preserve"> </w:t>
       </w:r>
       <w:r>
-        <w:t xml:space="preserve">and expectation together [72], which is exactly how the cost</w:t>
+        <w:t xml:space="preserve">and expectation together [74], which is exactly how the cost</w:t>
       </w:r>
       <w:r>
         <w:t xml:space="preserve"> </w:t>
@@ -6927,7 +7156,7 @@
         <w:t xml:space="preserve"> </w:t>
       </w:r>
       <w:r>
-        <w:t xml:space="preserve">documented behaviour unvalidated [73], and silent measurement</w:t>
+        <w:t xml:space="preserve">documented behaviour unvalidated [75], and silent measurement</w:t>
       </w:r>
       <w:r>
         <w:t xml:space="preserve"> </w:t>
@@ -6939,7 +7168,7 @@
         <w:t xml:space="preserve"> </w:t>
       </w:r>
       <w:r>
-        <w:t xml:space="preserve">edge case [74]. Two limits are recorded. Catching seventeen</w:t>
+        <w:t xml:space="preserve">edge case [76]. Two limits are recorded. Catching seventeen</w:t>
       </w:r>
       <w:r>
         <w:t xml:space="preserve"> </w:t>
@@ -7005,7 +7234,7 @@
         <w:t xml:space="preserve"> </w:t>
       </w:r>
       <w:r>
-        <w:t xml:space="preserve">lists are read [75]. Measured against the ledger digest recorded in</w:t>
+        <w:t xml:space="preserve">lists are read [77]. Measured against the ledger digest recorded in</w:t>
       </w:r>
       <w:r>
         <w:t xml:space="preserve"> </w:t>
@@ -7132,7 +7361,7 @@
         <w:t xml:space="preserve"> </w:t>
       </w:r>
       <w:r>
-        <w:t xml:space="preserve">scores calls for [76], and it is also the boundary of what</w:t>
+        <w:t xml:space="preserve">scores calls for [78], and it is also the boundary of what</w:t>
       </w:r>
       <w:r>
         <w:t xml:space="preserve"> </w:t>
@@ -7144,7 +7373,7 @@
         <w:t xml:space="preserve"> </w:t>
       </w:r>
       <w:r>
-        <w:t xml:space="preserve">substitutes for understanding rather than supplying it [77].</w:t>
+        <w:t xml:space="preserve">substitutes for understanding rather than supplying it [79].</w:t>
       </w:r>
     </w:p>
     <w:bookmarkEnd w:id="61"/>
@@ -7293,7 +7522,7 @@
         <w:t xml:space="preserve"> </w:t>
       </w:r>
       <w:r>
-        <w:t xml:space="preserve">single terminal score [78].</w:t>
+        <w:t xml:space="preserve">single terminal score [80].</w:t>
       </w:r>
     </w:p>
     <w:p>
@@ -7375,7 +7604,7 @@
         <w:t xml:space="preserve"> </w:t>
       </w:r>
       <w:r>
-        <w:t xml:space="preserve">[79]; this project spent 192 model calls to verify 32</w:t>
+        <w:t xml:space="preserve">[81]; this project spent 192 model calls to verify 32</w:t>
       </w:r>
       <w:r>
         <w:t xml:space="preserve"> </w:t>
@@ -10145,6 +10374,46 @@
       </w:r>
       <w:r>
         <w:t xml:space="preserve">arXiv:2608.01347v5, 2026.</w:t>
+      </w:r>
+    </w:p>
+    <w:p>
+      <w:pPr>
+        <w:pStyle w:val="BodyText"/>
+      </w:pPr>
+      <w:r>
+        <w:t xml:space="preserve">U. Bahuguna,</w:t>
+      </w:r>
+      <w:r>
+        <w:t xml:space="preserve"> </w:t>
+      </w:r>
+      <w:r>
+        <w:t xml:space="preserve">“When Self-Consistency Backfires: Majority Vote Hurts the Majority of Hard Science Problems for Small LLMs,”</w:t>
+      </w:r>
+      <w:r>
+        <w:t xml:space="preserve"> </w:t>
+      </w:r>
+      <w:r>
+        <w:t xml:space="preserve">arXiv:2608.11403v2, 2026.</w:t>
+      </w:r>
+    </w:p>
+    <w:p>
+      <w:pPr>
+        <w:pStyle w:val="BodyText"/>
+      </w:pPr>
+      <w:r>
+        <w:t xml:space="preserve">L. Zhang et al.,</w:t>
+      </w:r>
+      <w:r>
+        <w:t xml:space="preserve"> </w:t>
+      </w:r>
+      <w:r>
+        <w:t xml:space="preserve">“Decomposing Wrong-Consensus Agreement in LLM Self-Consistency,”</w:t>
+      </w:r>
+      <w:r>
+        <w:t xml:space="preserve"> </w:t>
+      </w:r>
+      <w:r>
+        <w:t xml:space="preserve">arXiv:2608.18795v2, 2026.</w:t>
       </w:r>
     </w:p>
     <w:p>

</xml_diff>

<commit_message>
feat(paper): recompute the verified endpoint on the corrected verdict record
</commit_message>
<xml_diff>
--- a/paper/word/graduation-thesis.docx
+++ b/paper/word/graduation-thesis.docx
@@ -6834,13 +6834,265 @@
         <w:t xml:space="preserve"> </w:t>
       </w:r>
       <w:r>
-        <w:t xml:space="preserve">single draws than with the modal verdicts, the correction made the record worse. Annotation variance</w:t>
-      </w:r>
-      <w:r>
-        <w:t xml:space="preserve"> </w:t>
-      </w:r>
-      <w:r>
-        <w:t xml:space="preserve">can come from the item or from the rater [66], and this</w:t>
+        <w:t xml:space="preserve">single draws than with the modal verdicts, the correction made the record worse.</w:t>
+      </w:r>
+    </w:p>
+    <w:p>
+      <w:pPr>
+        <w:pStyle w:val="BodyText"/>
+      </w:pPr>
+      <w:r>
+        <w:t xml:space="preserve">Because four verdicts changed, the verified endpoint was recomputed. The recomputation</w:t>
+      </w:r>
+      <w:r>
+        <w:t xml:space="preserve"> </w:t>
+      </w:r>
+      <w:r>
+        <w:t xml:space="preserve">was first validated against the recorded numbers, and that step immediately paid: the</w:t>
+      </w:r>
+      <w:r>
+        <w:t xml:space="preserve"> </w:t>
+      </w:r>
+      <w:r>
+        <w:t xml:space="preserve">recomputed minimum detectable effect disagreed with the record, and deriving the quantity</w:t>
+      </w:r>
+      <w:r>
+        <w:t xml:space="preserve"> </w:t>
+      </w:r>
+      <w:r>
+        <w:t xml:space="preserve">showed the record was right and the check wrong by a factor of</w:t>
+      </w:r>
+      <w:r>
+        <w:t xml:space="preserve"> </w:t>
+      </w:r>
+      <m:oMath>
+        <m:rad>
+          <m:radPr>
+            <m:degHide m:val="on"/>
+          </m:radPr>
+          <m:deg/>
+          <m:e>
+            <m:r>
+              <m:t>2</m:t>
+            </m:r>
+          </m:e>
+        </m:rad>
+      </m:oMath>
+      <w:r>
+        <w:t xml:space="preserve">, because a</w:t>
+      </w:r>
+      <w:r>
+        <w:t xml:space="preserve"> </w:t>
+      </w:r>
+      <w:r>
+        <w:t xml:space="preserve">paired difference of two condition means carries that factor. Once corrected, the</w:t>
+      </w:r>
+      <w:r>
+        <w:t xml:space="preserve"> </w:t>
+      </w:r>
+      <w:r>
+        <w:t xml:space="preserve">recomputation reproduced every recorded value. On the corrected record the task share of</w:t>
+      </w:r>
+      <w:r>
+        <w:t xml:space="preserve"> </w:t>
+      </w:r>
+      <w:r>
+        <w:t xml:space="preserve">variance rises from</w:t>
+      </w:r>
+      <w:r>
+        <w:t xml:space="preserve"> </w:t>
+      </w:r>
+      <m:oMath>
+        <m:r>
+          <m:t>16.2</m:t>
+        </m:r>
+        <m:r>
+          <m:rPr>
+            <m:sty m:val="p"/>
+          </m:rPr>
+          <m:t>%</m:t>
+        </m:r>
+      </m:oMath>
+      <w:r>
+        <w:t xml:space="preserve"> </w:t>
+      </w:r>
+      <w:r>
+        <w:t xml:space="preserve">to</w:t>
+      </w:r>
+      <w:r>
+        <w:t xml:space="preserve"> </w:t>
+      </w:r>
+      <m:oMath>
+        <m:r>
+          <m:t>21.5</m:t>
+        </m:r>
+        <m:r>
+          <m:rPr>
+            <m:sty m:val="p"/>
+          </m:rPr>
+          <m:t>%</m:t>
+        </m:r>
+      </m:oMath>
+      <w:r>
+        <w:t xml:space="preserve"> </w:t>
+      </w:r>
+      <w:r>
+        <w:t xml:space="preserve">and the residual falls from</w:t>
+      </w:r>
+      <w:r>
+        <w:t xml:space="preserve"> </w:t>
+      </w:r>
+      <m:oMath>
+        <m:r>
+          <m:t>83.8</m:t>
+        </m:r>
+        <m:r>
+          <m:rPr>
+            <m:sty m:val="p"/>
+          </m:rPr>
+          <m:t>%</m:t>
+        </m:r>
+      </m:oMath>
+      <w:r>
+        <w:t xml:space="preserve"> </w:t>
+      </w:r>
+      <w:r>
+        <w:t xml:space="preserve">to</w:t>
+      </w:r>
+      <w:r>
+        <w:t xml:space="preserve"> </w:t>
+      </w:r>
+      <m:oMath>
+        <m:r>
+          <m:t>78.5</m:t>
+        </m:r>
+        <m:r>
+          <m:rPr>
+            <m:sty m:val="p"/>
+          </m:rPr>
+          <m:t>%</m:t>
+        </m:r>
+      </m:oMath>
+      <w:r>
+        <w:t xml:space="preserve">, while the condition and interaction components remain exactly zero, so the</w:t>
+      </w:r>
+      <w:r>
+        <w:t xml:space="preserve"> </w:t>
+      </w:r>
+      <w:r>
+        <w:t xml:space="preserve">structural conclusion that the standard error does not depend on how a budget is split</w:t>
+      </w:r>
+      <w:r>
+        <w:t xml:space="preserve"> </w:t>
+      </w:r>
+      <w:r>
+        <w:t xml:space="preserve">between tasks and repeats is unchanged. The paired minimum detectable effect moves from</w:t>
+      </w:r>
+      <w:r>
+        <w:t xml:space="preserve"> </w:t>
+      </w:r>
+      <m:oMath>
+        <m:r>
+          <m:t>0.0808</m:t>
+        </m:r>
+      </m:oMath>
+      <w:r>
+        <w:t xml:space="preserve"> </w:t>
+      </w:r>
+      <w:r>
+        <w:t xml:space="preserve">to</w:t>
+      </w:r>
+      <w:r>
+        <w:t xml:space="preserve"> </w:t>
+      </w:r>
+      <m:oMath>
+        <m:r>
+          <m:t>0.0825</m:t>
+        </m:r>
+      </m:oMath>
+      <w:r>
+        <w:t xml:space="preserve">, and the correlation between the falsified cue endpoint and the</w:t>
+      </w:r>
+      <w:r>
+        <w:t xml:space="preserve"> </w:t>
+      </w:r>
+      <w:r>
+        <w:t xml:space="preserve">verified endpoint falls from</w:t>
+      </w:r>
+      <w:r>
+        <w:t xml:space="preserve"> </w:t>
+      </w:r>
+      <m:oMath>
+        <m:r>
+          <m:t>0.043</m:t>
+        </m:r>
+      </m:oMath>
+      <w:r>
+        <w:t xml:space="preserve"> </w:t>
+      </w:r>
+      <w:r>
+        <w:t xml:space="preserve">to</w:t>
+      </w:r>
+      <w:r>
+        <w:t xml:space="preserve"> </w:t>
+      </w:r>
+      <m:oMath>
+        <m:r>
+          <m:t>0.018</m:t>
+        </m:r>
+      </m:oMath>
+      <w:r>
+        <w:t xml:space="preserve">. No conclusion in this paper depends on</w:t>
+      </w:r>
+      <w:r>
+        <w:t xml:space="preserve"> </w:t>
+      </w:r>
+      <w:r>
+        <w:t xml:space="preserve">those differences, and the endpoint remains inadmissible for scoring until human labels</w:t>
+      </w:r>
+      <w:r>
+        <w:t xml:space="preserve"> </w:t>
+      </w:r>
+      <w:r>
+        <w:t xml:space="preserve">exist. Four changed verdicts out of</w:t>
+      </w:r>
+      <w:r>
+        <w:t xml:space="preserve"> </w:t>
+      </w:r>
+      <m:oMath>
+        <m:r>
+          <m:t>192</m:t>
+        </m:r>
+      </m:oMath>
+      <w:r>
+        <w:t xml:space="preserve"> </w:t>
+      </w:r>
+      <w:r>
+        <w:t xml:space="preserve">is a small perturbation, and this says nothing</w:t>
+      </w:r>
+      <w:r>
+        <w:t xml:space="preserve"> </w:t>
+      </w:r>
+      <w:r>
+        <w:t xml:space="preserve">about how the endpoint would behave under a larger correction; evaluation of this kind is</w:t>
+      </w:r>
+      <w:r>
+        <w:t xml:space="preserve"> </w:t>
+      </w:r>
+      <w:r>
+        <w:t xml:space="preserve">noisy enough that multiple runs and ordering effects must be reported rather than assumed</w:t>
+      </w:r>
+      <w:r>
+        <w:t xml:space="preserve"> </w:t>
+      </w:r>
+      <w:r>
+        <w:t xml:space="preserve">away [66]. Annotation variance</w:t>
+      </w:r>
+      <w:r>
+        <w:t xml:space="preserve"> </w:t>
+      </w:r>
+      <w:r>
+        <w:t xml:space="preserve">can come from the item or from the rater [67], and this</w:t>
       </w:r>
       <w:r>
         <w:t xml:space="preserve"> </w:t>
@@ -6858,7 +7110,7 @@
         <w:t xml:space="preserve"> </w:t>
       </w:r>
       <w:r>
-        <w:t xml:space="preserve">[67]. Three limits are attached. Replay is not correctness, since no human</w:t>
+        <w:t xml:space="preserve">[68]. Three limits are attached. Replay is not correctness, since no human</w:t>
       </w:r>
       <w:r>
         <w:t xml:space="preserve"> </w:t>
@@ -6876,7 +7128,7 @@
         <w:t xml:space="preserve"> </w:t>
       </w:r>
       <w:r>
-        <w:t xml:space="preserve">[68], which is why no cause is assigned. And a fixed</w:t>
+        <w:t xml:space="preserve">[69], which is why no cause is assigned. And a fixed</w:t>
       </w:r>
       <w:r>
         <w:t xml:space="preserve"> </w:t>
@@ -6888,7 +7140,7 @@
         <w:t xml:space="preserve"> </w:t>
       </w:r>
       <w:r>
-        <w:t xml:space="preserve">[69], so the low band is treated as unusable rather than as noisy but</w:t>
+        <w:t xml:space="preserve">[70], so the low band is treated as unusable rather than as noisy but</w:t>
       </w:r>
       <w:r>
         <w:t xml:space="preserve"> </w:t>
@@ -6906,13 +7158,13 @@
         <w:t xml:space="preserve"> </w:t>
       </w:r>
       <w:r>
-        <w:t xml:space="preserve">[70], and replaying historical claims from a frozen collection</w:t>
-      </w:r>
-      <w:r>
-        <w:t xml:space="preserve"> </w:t>
-      </w:r>
-      <w:r>
-        <w:t xml:space="preserve">commonly stops before the claim is reachable [71].</w:t>
+        <w:t xml:space="preserve">[71], and replaying historical claims from a frozen collection</w:t>
+      </w:r>
+      <w:r>
+        <w:t xml:space="preserve"> </w:t>
+      </w:r>
+      <w:r>
+        <w:t xml:space="preserve">commonly stops before the claim is reachable [72].</w:t>
       </w:r>
     </w:p>
     <w:p>
@@ -7106,7 +7358,7 @@
         <w:t xml:space="preserve"> </w:t>
       </w:r>
       <w:r>
-        <w:t xml:space="preserve">[72], so its suite asserts the deterministic shell around the</w:t>
+        <w:t xml:space="preserve">[73], so its suite asserts the deterministic shell around the</w:t>
       </w:r>
       <w:r>
         <w:t xml:space="preserve"> </w:t>
@@ -7124,7 +7376,7 @@
         <w:t xml:space="preserve"> </w:t>
       </w:r>
       <w:r>
-        <w:t xml:space="preserve">[73].</w:t>
+        <w:t xml:space="preserve">[74].</w:t>
       </w:r>
     </w:p>
     <w:p>
@@ -7144,7 +7396,7 @@
         <w:t xml:space="preserve"> </w:t>
       </w:r>
       <w:r>
-        <w:t xml:space="preserve">and expectation together [74], which is exactly how the cost</w:t>
+        <w:t xml:space="preserve">and expectation together [75], which is exactly how the cost</w:t>
       </w:r>
       <w:r>
         <w:t xml:space="preserve"> </w:t>
@@ -7156,7 +7408,7 @@
         <w:t xml:space="preserve"> </w:t>
       </w:r>
       <w:r>
-        <w:t xml:space="preserve">documented behaviour unvalidated [75], and silent measurement</w:t>
+        <w:t xml:space="preserve">documented behaviour unvalidated [76], and silent measurement</w:t>
       </w:r>
       <w:r>
         <w:t xml:space="preserve"> </w:t>
@@ -7168,7 +7420,7 @@
         <w:t xml:space="preserve"> </w:t>
       </w:r>
       <w:r>
-        <w:t xml:space="preserve">edge case [76]. Two limits are recorded. Catching seventeen</w:t>
+        <w:t xml:space="preserve">edge case [77]. Two limits are recorded. Catching seventeen</w:t>
       </w:r>
       <w:r>
         <w:t xml:space="preserve"> </w:t>
@@ -7234,7 +7486,7 @@
         <w:t xml:space="preserve"> </w:t>
       </w:r>
       <w:r>
-        <w:t xml:space="preserve">lists are read [77]. Measured against the ledger digest recorded in</w:t>
+        <w:t xml:space="preserve">lists are read [78]. Measured against the ledger digest recorded in</w:t>
       </w:r>
       <w:r>
         <w:t xml:space="preserve"> </w:t>
@@ -7361,7 +7613,7 @@
         <w:t xml:space="preserve"> </w:t>
       </w:r>
       <w:r>
-        <w:t xml:space="preserve">scores calls for [78], and it is also the boundary of what</w:t>
+        <w:t xml:space="preserve">scores calls for [79], and it is also the boundary of what</w:t>
       </w:r>
       <w:r>
         <w:t xml:space="preserve"> </w:t>
@@ -7373,7 +7625,7 @@
         <w:t xml:space="preserve"> </w:t>
       </w:r>
       <w:r>
-        <w:t xml:space="preserve">substitutes for understanding rather than supplying it [79].</w:t>
+        <w:t xml:space="preserve">substitutes for understanding rather than supplying it [80].</w:t>
       </w:r>
     </w:p>
     <w:bookmarkEnd w:id="61"/>
@@ -7522,7 +7774,7 @@
         <w:t xml:space="preserve"> </w:t>
       </w:r>
       <w:r>
-        <w:t xml:space="preserve">single terminal score [80].</w:t>
+        <w:t xml:space="preserve">single terminal score [81].</w:t>
       </w:r>
     </w:p>
     <w:p>
@@ -7604,7 +7856,7 @@
         <w:t xml:space="preserve"> </w:t>
       </w:r>
       <w:r>
-        <w:t xml:space="preserve">[81]; this project spent 192 model calls to verify 32</w:t>
+        <w:t xml:space="preserve">[82]; this project spent 192 model calls to verify 32</w:t>
       </w:r>
       <w:r>
         <w:t xml:space="preserve"> </w:t>
@@ -10414,6 +10666,26 @@
       </w:r>
       <w:r>
         <w:t xml:space="preserve">arXiv:2608.18795v2, 2026.</w:t>
+      </w:r>
+    </w:p>
+    <w:p>
+      <w:pPr>
+        <w:pStyle w:val="BodyText"/>
+      </w:pPr>
+      <w:r>
+        <w:t xml:space="preserve">Q. Ye et al.,</w:t>
+      </w:r>
+      <w:r>
+        <w:t xml:space="preserve"> </w:t>
+      </w:r>
+      <w:r>
+        <w:t xml:space="preserve">“On the Fragility of Self-Improving Agents: Variance, Task Order, and Underspecification,”</w:t>
+      </w:r>
+      <w:r>
+        <w:t xml:space="preserve"> </w:t>
+      </w:r>
+      <w:r>
+        <w:t xml:space="preserve">arXiv:2608.18066v1, 2026.</w:t>
       </w:r>
     </w:p>
     <w:p>

</xml_diff>

<commit_message>
feat(paper): commit the endpoint analysis as audited code and gate dangling references
</commit_message>
<xml_diff>
--- a/paper/word/graduation-thesis.docx
+++ b/paper/word/graduation-thesis.docx
@@ -7086,13 +7086,81 @@
         <w:t xml:space="preserve"> </w:t>
       </w:r>
       <w:r>
-        <w:t xml:space="preserve">away [66]. Annotation variance</w:t>
-      </w:r>
-      <w:r>
-        <w:t xml:space="preserve"> </w:t>
-      </w:r>
-      <w:r>
-        <w:t xml:space="preserve">can come from the item or from the rater [67], and this</w:t>
+        <w:t xml:space="preserve">away [66].</w:t>
+      </w:r>
+    </w:p>
+    <w:p>
+      <w:pPr>
+        <w:pStyle w:val="BodyText"/>
+      </w:pPr>
+      <w:r>
+        <w:t xml:space="preserve">Every endpoint number above is produced by a committed script with twenty-two fixtures,</w:t>
+      </w:r>
+      <w:r>
+        <w:t xml:space="preserve"> </w:t>
+      </w:r>
+      <w:r>
+        <w:t xml:space="preserve">so a reader can re-derive it rather than trust it. The fixtures are of three kinds:</w:t>
+      </w:r>
+      <w:r>
+        <w:t xml:space="preserve"> </w:t>
+      </w:r>
+      <w:r>
+        <w:t xml:space="preserve">analytic cases whose variance components follow by construction, guard cases that must</w:t>
+      </w:r>
+      <w:r>
+        <w:t xml:space="preserve"> </w:t>
+      </w:r>
+      <w:r>
+        <w:t xml:space="preserve">raise with the correct cause rather than report a clean zero, and a regression case that</w:t>
+      </w:r>
+      <w:r>
+        <w:t xml:space="preserve"> </w:t>
+      </w:r>
+      <w:r>
+        <w:t xml:space="preserve">reproduces the earlier published receipt from the original record, using an oracle that</w:t>
+      </w:r>
+      <w:r>
+        <w:t xml:space="preserve"> </w:t>
+      </w:r>
+      <w:r>
+        <w:t xml:space="preserve">existed before the script. Two conventions that would otherwise be implicit are stated in</w:t>
+      </w:r>
+      <w:r>
+        <w:t xml:space="preserve"> </w:t>
+      </w:r>
+      <w:r>
+        <w:t xml:space="preserve">the code, since implicit assumptions of exactly that kind are a known cause of analysis</w:t>
+      </w:r>
+      <w:r>
+        <w:t xml:space="preserve"> </w:t>
+      </w:r>
+      <w:r>
+        <w:t xml:space="preserve">failing to reproduce [67]: coverage counts only an exactly</w:t>
+      </w:r>
+      <w:r>
+        <w:t xml:space="preserve"> </w:t>
+      </w:r>
+      <w:r>
+        <w:t xml:space="preserve">satisfied verdict, and the effect uses the paired difference standard error. A mutation</w:t>
+      </w:r>
+      <w:r>
+        <w:t xml:space="preserve"> </w:t>
+      </w:r>
+      <w:r>
+        <w:t xml:space="preserve">audit of the script caught five of five injected faults, after one guard fixture was</w:t>
+      </w:r>
+      <w:r>
+        <w:t xml:space="preserve"> </w:t>
+      </w:r>
+      <w:r>
+        <w:t xml:space="preserve">strengthened to assert why an error was raised rather than only that one was. Annotation variance</w:t>
+      </w:r>
+      <w:r>
+        <w:t xml:space="preserve"> </w:t>
+      </w:r>
+      <w:r>
+        <w:t xml:space="preserve">can come from the item or from the rater [68], and this</w:t>
       </w:r>
       <w:r>
         <w:t xml:space="preserve"> </w:t>
@@ -7110,7 +7178,7 @@
         <w:t xml:space="preserve"> </w:t>
       </w:r>
       <w:r>
-        <w:t xml:space="preserve">[68]. Three limits are attached. Replay is not correctness, since no human</w:t>
+        <w:t xml:space="preserve">[69]. Three limits are attached. Replay is not correctness, since no human</w:t>
       </w:r>
       <w:r>
         <w:t xml:space="preserve"> </w:t>
@@ -7128,7 +7196,7 @@
         <w:t xml:space="preserve"> </w:t>
       </w:r>
       <w:r>
-        <w:t xml:space="preserve">[69], which is why no cause is assigned. And a fixed</w:t>
+        <w:t xml:space="preserve">[70], which is why no cause is assigned. And a fixed</w:t>
       </w:r>
       <w:r>
         <w:t xml:space="preserve"> </w:t>
@@ -7140,7 +7208,7 @@
         <w:t xml:space="preserve"> </w:t>
       </w:r>
       <w:r>
-        <w:t xml:space="preserve">[70], so the low band is treated as unusable rather than as noisy but</w:t>
+        <w:t xml:space="preserve">[71], so the low band is treated as unusable rather than as noisy but</w:t>
       </w:r>
       <w:r>
         <w:t xml:space="preserve"> </w:t>
@@ -7158,13 +7226,13 @@
         <w:t xml:space="preserve"> </w:t>
       </w:r>
       <w:r>
-        <w:t xml:space="preserve">[71], and replaying historical claims from a frozen collection</w:t>
-      </w:r>
-      <w:r>
-        <w:t xml:space="preserve"> </w:t>
-      </w:r>
-      <w:r>
-        <w:t xml:space="preserve">commonly stops before the claim is reachable [72].</w:t>
+        <w:t xml:space="preserve">[72], and replaying historical claims from a frozen collection</w:t>
+      </w:r>
+      <w:r>
+        <w:t xml:space="preserve"> </w:t>
+      </w:r>
+      <w:r>
+        <w:t xml:space="preserve">commonly stops before the claim is reachable [73].</w:t>
       </w:r>
     </w:p>
     <w:p>
@@ -7358,7 +7426,7 @@
         <w:t xml:space="preserve"> </w:t>
       </w:r>
       <w:r>
-        <w:t xml:space="preserve">[73], so its suite asserts the deterministic shell around the</w:t>
+        <w:t xml:space="preserve">[74], so its suite asserts the deterministic shell around the</w:t>
       </w:r>
       <w:r>
         <w:t xml:space="preserve"> </w:t>
@@ -7376,7 +7444,7 @@
         <w:t xml:space="preserve"> </w:t>
       </w:r>
       <w:r>
-        <w:t xml:space="preserve">[74].</w:t>
+        <w:t xml:space="preserve">[75].</w:t>
       </w:r>
     </w:p>
     <w:p>
@@ -7396,7 +7464,7 @@
         <w:t xml:space="preserve"> </w:t>
       </w:r>
       <w:r>
-        <w:t xml:space="preserve">and expectation together [75], which is exactly how the cost</w:t>
+        <w:t xml:space="preserve">and expectation together [76], which is exactly how the cost</w:t>
       </w:r>
       <w:r>
         <w:t xml:space="preserve"> </w:t>
@@ -7408,7 +7476,7 @@
         <w:t xml:space="preserve"> </w:t>
       </w:r>
       <w:r>
-        <w:t xml:space="preserve">documented behaviour unvalidated [76], and silent measurement</w:t>
+        <w:t xml:space="preserve">documented behaviour unvalidated [77], and silent measurement</w:t>
       </w:r>
       <w:r>
         <w:t xml:space="preserve"> </w:t>
@@ -7420,7 +7488,7 @@
         <w:t xml:space="preserve"> </w:t>
       </w:r>
       <w:r>
-        <w:t xml:space="preserve">edge case [77]. Two limits are recorded. Catching seventeen</w:t>
+        <w:t xml:space="preserve">edge case [78]. Two limits are recorded. Catching seventeen</w:t>
       </w:r>
       <w:r>
         <w:t xml:space="preserve"> </w:t>
@@ -7486,7 +7554,7 @@
         <w:t xml:space="preserve"> </w:t>
       </w:r>
       <w:r>
-        <w:t xml:space="preserve">lists are read [78]. Measured against the ledger digest recorded in</w:t>
+        <w:t xml:space="preserve">lists are read [79]. Measured against the ledger digest recorded in</w:t>
       </w:r>
       <w:r>
         <w:t xml:space="preserve"> </w:t>
@@ -7613,7 +7681,7 @@
         <w:t xml:space="preserve"> </w:t>
       </w:r>
       <w:r>
-        <w:t xml:space="preserve">scores calls for [79], and it is also the boundary of what</w:t>
+        <w:t xml:space="preserve">scores calls for [80], and it is also the boundary of what</w:t>
       </w:r>
       <w:r>
         <w:t xml:space="preserve"> </w:t>
@@ -7625,7 +7693,7 @@
         <w:t xml:space="preserve"> </w:t>
       </w:r>
       <w:r>
-        <w:t xml:space="preserve">substitutes for understanding rather than supplying it [80].</w:t>
+        <w:t xml:space="preserve">substitutes for understanding rather than supplying it [81].</w:t>
       </w:r>
     </w:p>
     <w:bookmarkEnd w:id="61"/>
@@ -7774,7 +7842,7 @@
         <w:t xml:space="preserve"> </w:t>
       </w:r>
       <w:r>
-        <w:t xml:space="preserve">single terminal score [81].</w:t>
+        <w:t xml:space="preserve">single terminal score [82].</w:t>
       </w:r>
     </w:p>
     <w:p>
@@ -7856,7 +7924,7 @@
         <w:t xml:space="preserve"> </w:t>
       </w:r>
       <w:r>
-        <w:t xml:space="preserve">[82]; this project spent 192 model calls to verify 32</w:t>
+        <w:t xml:space="preserve">[83]; this project spent 192 model calls to verify 32</w:t>
       </w:r>
       <w:r>
         <w:t xml:space="preserve"> </w:t>
@@ -10686,6 +10754,26 @@
       </w:r>
       <w:r>
         <w:t xml:space="preserve">arXiv:2608.18066v1, 2026.</w:t>
+      </w:r>
+    </w:p>
+    <w:p>
+      <w:pPr>
+        <w:pStyle w:val="BodyText"/>
+      </w:pPr>
+      <w:r>
+        <w:t xml:space="preserve">F. Sihler et al.,</w:t>
+      </w:r>
+      <w:r>
+        <w:t xml:space="preserve"> </w:t>
+      </w:r>
+      <w:r>
+        <w:t xml:space="preserve">“Towards Automatically Inferring Constraints to Identify Implicit Assumptions in Data Analysis,”</w:t>
+      </w:r>
+      <w:r>
+        <w:t xml:space="preserve"> </w:t>
+      </w:r>
+      <w:r>
+        <w:t xml:space="preserve">arXiv:2607.03114v1, 2026.</w:t>
       </w:r>
     </w:p>
     <w:p>

</xml_diff>

<commit_message>
fix(paper): repair source-archive provenance and make the reference gate structural
</commit_message>
<xml_diff>
--- a/paper/word/graduation-thesis.docx
+++ b/paper/word/graduation-thesis.docx
@@ -7154,13 +7154,153 @@
         <w:t xml:space="preserve"> </w:t>
       </w:r>
       <w:r>
-        <w:t xml:space="preserve">strengthened to assert why an error was raised rather than only that one was. Annotation variance</w:t>
-      </w:r>
-      <w:r>
-        <w:t xml:space="preserve"> </w:t>
-      </w:r>
-      <w:r>
-        <w:t xml:space="preserve">can come from the item or from the rater [68], and this</w:t>
+        <w:t xml:space="preserve">strengthened to assert why an error was raised rather than only that one was.</w:t>
+      </w:r>
+    </w:p>
+    <w:p>
+      <w:pPr>
+        <w:pStyle w:val="BodyText"/>
+      </w:pPr>
+      <w:r>
+        <w:t xml:space="preserve">Extending the same path check beyond experiment receipts exposed a larger provenance</w:t>
+      </w:r>
+      <w:r>
+        <w:t xml:space="preserve"> </w:t>
+      </w:r>
+      <w:r>
+        <w:t xml:space="preserve">problem. This checkout is a linked worktree whose shared exclude list blocks the paper</w:t>
+      </w:r>
+      <w:r>
+        <w:t xml:space="preserve"> </w:t>
+      </w:r>
+      <w:r>
+        <w:t xml:space="preserve">directory, so files are tracked only when staged explicitly. Under that rule</w:t>
+      </w:r>
+      <w:r>
+        <w:t xml:space="preserve"> </w:t>
+      </w:r>
+      <m:oMath>
+        <m:r>
+          <m:t>911</m:t>
+        </m:r>
+      </m:oMath>
+      <w:r>
+        <w:t xml:space="preserve"> </w:t>
+      </w:r>
+      <w:r>
+        <w:t xml:space="preserve">paper</w:t>
+      </w:r>
+      <w:r>
+        <w:t xml:space="preserve"> </w:t>
+      </w:r>
+      <w:r>
+        <w:t xml:space="preserve">files were tracked while none of the upstream source archives were, which means every</w:t>
+      </w:r>
+      <w:r>
+        <w:t xml:space="preserve"> </w:t>
+      </w:r>
+      <w:r>
+        <w:t xml:space="preserve">recorded archive path was absent from a clean checkout. The resolution is to treat those</w:t>
+      </w:r>
+      <w:r>
+        <w:t xml:space="preserve"> </w:t>
+      </w:r>
+      <w:r>
+        <w:t xml:space="preserve">archives as external re-fetchable artifacts rather than committed bytes: the quoted</w:t>
+      </w:r>
+      <w:r>
+        <w:t xml:space="preserve"> </w:t>
+      </w:r>
+      <w:r>
+        <w:t xml:space="preserve">evidence itself is committed as extracted text for all</w:t>
+      </w:r>
+      <w:r>
+        <w:t xml:space="preserve"> </w:t>
+      </w:r>
+      <m:oMath>
+        <m:r>
+          <m:t>114</m:t>
+        </m:r>
+      </m:oMath>
+      <w:r>
+        <w:t xml:space="preserve"> </w:t>
+      </w:r>
+      <w:r>
+        <w:t xml:space="preserve">archives, and each archive</w:t>
+      </w:r>
+      <w:r>
+        <w:t xml:space="preserve"> </w:t>
+      </w:r>
+      <w:r>
+        <w:t xml:space="preserve">record must carry a fetch address and a digest. Re-fetching three archives and one PDF</w:t>
+      </w:r>
+      <w:r>
+        <w:t xml:space="preserve"> </w:t>
+      </w:r>
+      <w:r>
+        <w:t xml:space="preserve">reproduced the recorded digests exactly. This is claim-evidence traceability of the kind</w:t>
+      </w:r>
+      <w:r>
+        <w:t xml:space="preserve"> </w:t>
+      </w:r>
+      <w:r>
+        <w:t xml:space="preserve">that becomes necessary once claims are drafted faster than they can be checked</w:t>
+      </w:r>
+      <w:r>
+        <w:t xml:space="preserve"> </w:t>
+      </w:r>
+      <w:r>
+        <w:t xml:space="preserve">[68], and its limit is stated: a re-fetch depends on the upstream</w:t>
+      </w:r>
+      <w:r>
+        <w:t xml:space="preserve"> </w:t>
+      </w:r>
+      <w:r>
+        <w:t xml:space="preserve">service still serving that exact version, so the digest proves identity when a fetch</w:t>
+      </w:r>
+      <w:r>
+        <w:t xml:space="preserve"> </w:t>
+      </w:r>
+      <w:r>
+        <w:t xml:space="preserve">succeeds and cannot substitute for the bytes if it does not.</w:t>
+      </w:r>
+    </w:p>
+    <w:p>
+      <w:pPr>
+        <w:pStyle w:val="BodyText"/>
+      </w:pPr>
+      <w:r>
+        <w:t xml:space="preserve">The gate written for this was itself wrong first. It scanned a character window around</w:t>
+      </w:r>
+      <w:r>
+        <w:t xml:space="preserve"> </w:t>
+      </w:r>
+      <w:r>
+        <w:t xml:space="preserve">each reference, which let a record satisfy the check by borrowing a neighbouring record’s</w:t>
+      </w:r>
+      <w:r>
+        <w:t xml:space="preserve"> </w:t>
+      </w:r>
+      <w:r>
+        <w:t xml:space="preserve">address and digest. A failing-first test that stripped one record did not fire, and the</w:t>
+      </w:r>
+      <w:r>
+        <w:t xml:space="preserve"> </w:t>
+      </w:r>
+      <w:r>
+        <w:t xml:space="preserve">check was rewritten to walk the parsed structure so the address and digest must sit in</w:t>
+      </w:r>
+      <w:r>
+        <w:t xml:space="preserve"> </w:t>
+      </w:r>
+      <w:r>
+        <w:t xml:space="preserve">the same record. The same test then fired. Annotation variance</w:t>
+      </w:r>
+      <w:r>
+        <w:t xml:space="preserve"> </w:t>
+      </w:r>
+      <w:r>
+        <w:t xml:space="preserve">can come from the item or from the rater [69], and this</w:t>
       </w:r>
       <w:r>
         <w:t xml:space="preserve"> </w:t>
@@ -7178,7 +7318,7 @@
         <w:t xml:space="preserve"> </w:t>
       </w:r>
       <w:r>
-        <w:t xml:space="preserve">[69]. Three limits are attached. Replay is not correctness, since no human</w:t>
+        <w:t xml:space="preserve">[70]. Three limits are attached. Replay is not correctness, since no human</w:t>
       </w:r>
       <w:r>
         <w:t xml:space="preserve"> </w:t>
@@ -7196,7 +7336,7 @@
         <w:t xml:space="preserve"> </w:t>
       </w:r>
       <w:r>
-        <w:t xml:space="preserve">[70], which is why no cause is assigned. And a fixed</w:t>
+        <w:t xml:space="preserve">[71], which is why no cause is assigned. And a fixed</w:t>
       </w:r>
       <w:r>
         <w:t xml:space="preserve"> </w:t>
@@ -7208,7 +7348,7 @@
         <w:t xml:space="preserve"> </w:t>
       </w:r>
       <w:r>
-        <w:t xml:space="preserve">[71], so the low band is treated as unusable rather than as noisy but</w:t>
+        <w:t xml:space="preserve">[72], so the low band is treated as unusable rather than as noisy but</w:t>
       </w:r>
       <w:r>
         <w:t xml:space="preserve"> </w:t>
@@ -7226,13 +7366,13 @@
         <w:t xml:space="preserve"> </w:t>
       </w:r>
       <w:r>
-        <w:t xml:space="preserve">[72], and replaying historical claims from a frozen collection</w:t>
-      </w:r>
-      <w:r>
-        <w:t xml:space="preserve"> </w:t>
-      </w:r>
-      <w:r>
-        <w:t xml:space="preserve">commonly stops before the claim is reachable [73].</w:t>
+        <w:t xml:space="preserve">[73], and replaying historical claims from a frozen collection</w:t>
+      </w:r>
+      <w:r>
+        <w:t xml:space="preserve"> </w:t>
+      </w:r>
+      <w:r>
+        <w:t xml:space="preserve">commonly stops before the claim is reachable [74].</w:t>
       </w:r>
     </w:p>
     <w:p>
@@ -7426,7 +7566,7 @@
         <w:t xml:space="preserve"> </w:t>
       </w:r>
       <w:r>
-        <w:t xml:space="preserve">[74], so its suite asserts the deterministic shell around the</w:t>
+        <w:t xml:space="preserve">[75], so its suite asserts the deterministic shell around the</w:t>
       </w:r>
       <w:r>
         <w:t xml:space="preserve"> </w:t>
@@ -7444,7 +7584,7 @@
         <w:t xml:space="preserve"> </w:t>
       </w:r>
       <w:r>
-        <w:t xml:space="preserve">[75].</w:t>
+        <w:t xml:space="preserve">[76].</w:t>
       </w:r>
     </w:p>
     <w:p>
@@ -7464,7 +7604,7 @@
         <w:t xml:space="preserve"> </w:t>
       </w:r>
       <w:r>
-        <w:t xml:space="preserve">and expectation together [76], which is exactly how the cost</w:t>
+        <w:t xml:space="preserve">and expectation together [77], which is exactly how the cost</w:t>
       </w:r>
       <w:r>
         <w:t xml:space="preserve"> </w:t>
@@ -7476,7 +7616,7 @@
         <w:t xml:space="preserve"> </w:t>
       </w:r>
       <w:r>
-        <w:t xml:space="preserve">documented behaviour unvalidated [77], and silent measurement</w:t>
+        <w:t xml:space="preserve">documented behaviour unvalidated [78], and silent measurement</w:t>
       </w:r>
       <w:r>
         <w:t xml:space="preserve"> </w:t>
@@ -7488,7 +7628,7 @@
         <w:t xml:space="preserve"> </w:t>
       </w:r>
       <w:r>
-        <w:t xml:space="preserve">edge case [78]. Two limits are recorded. Catching seventeen</w:t>
+        <w:t xml:space="preserve">edge case [79]. Two limits are recorded. Catching seventeen</w:t>
       </w:r>
       <w:r>
         <w:t xml:space="preserve"> </w:t>
@@ -7554,7 +7694,7 @@
         <w:t xml:space="preserve"> </w:t>
       </w:r>
       <w:r>
-        <w:t xml:space="preserve">lists are read [79]. Measured against the ledger digest recorded in</w:t>
+        <w:t xml:space="preserve">lists are read [80]. Measured against the ledger digest recorded in</w:t>
       </w:r>
       <w:r>
         <w:t xml:space="preserve"> </w:t>
@@ -7681,7 +7821,7 @@
         <w:t xml:space="preserve"> </w:t>
       </w:r>
       <w:r>
-        <w:t xml:space="preserve">scores calls for [80], and it is also the boundary of what</w:t>
+        <w:t xml:space="preserve">scores calls for [81], and it is also the boundary of what</w:t>
       </w:r>
       <w:r>
         <w:t xml:space="preserve"> </w:t>
@@ -7693,7 +7833,7 @@
         <w:t xml:space="preserve"> </w:t>
       </w:r>
       <w:r>
-        <w:t xml:space="preserve">substitutes for understanding rather than supplying it [81].</w:t>
+        <w:t xml:space="preserve">substitutes for understanding rather than supplying it [82].</w:t>
       </w:r>
     </w:p>
     <w:bookmarkEnd w:id="61"/>
@@ -7842,7 +7982,7 @@
         <w:t xml:space="preserve"> </w:t>
       </w:r>
       <w:r>
-        <w:t xml:space="preserve">single terminal score [82].</w:t>
+        <w:t xml:space="preserve">single terminal score [83].</w:t>
       </w:r>
     </w:p>
     <w:p>
@@ -7924,7 +8064,7 @@
         <w:t xml:space="preserve"> </w:t>
       </w:r>
       <w:r>
-        <w:t xml:space="preserve">[83]; this project spent 192 model calls to verify 32</w:t>
+        <w:t xml:space="preserve">[84]; this project spent 192 model calls to verify 32</w:t>
       </w:r>
       <w:r>
         <w:t xml:space="preserve"> </w:t>
@@ -10774,6 +10914,26 @@
       </w:r>
       <w:r>
         <w:t xml:space="preserve">arXiv:2607.03114v1, 2026.</w:t>
+      </w:r>
+    </w:p>
+    <w:p>
+      <w:pPr>
+        <w:pStyle w:val="BodyText"/>
+      </w:pPr>
+      <w:r>
+        <w:t xml:space="preserve">C. Chen et al.,</w:t>
+      </w:r>
+      <w:r>
+        <w:t xml:space="preserve"> </w:t>
+      </w:r>
+      <w:r>
+        <w:t xml:space="preserve">“Evidence-Ledger Adjudication for Claim-Evidence Traceability,”</w:t>
+      </w:r>
+      <w:r>
+        <w:t xml:space="preserve"> </w:t>
+      </w:r>
+      <w:r>
+        <w:t xml:space="preserve">arXiv:2607.26512v1, 2026.</w:t>
       </w:r>
     </w:p>
     <w:p>

</xml_diff>

<commit_message>
fix(paper): rewrite the abstract against the executed record and gate it
</commit_message>
<xml_diff>
--- a/paper/word/graduation-thesis.docx
+++ b/paper/word/graduation-thesis.docx
@@ -154,49 +154,113 @@
         <w:t xml:space="preserve"> </w:t>
       </w:r>
       <w:r>
-        <w:t xml:space="preserve">evidence protocol. The primary endpoint is fatal-error-free complete</w:t>
-      </w:r>
-      <w:r>
-        <w:t xml:space="preserve"> </w:t>
-      </w:r>
-      <w:r>
-        <w:t xml:space="preserve">experimental design; secondary diagnostics separate retrieval from utilization</w:t>
-      </w:r>
-      <w:r>
-        <w:t xml:space="preserve"> </w:t>
-      </w:r>
-      <w:r>
-        <w:t xml:space="preserve">failures, decision-changing from redundant search, and scientific validity from</w:t>
-      </w:r>
-      <w:r>
-        <w:t xml:space="preserve"> </w:t>
-      </w:r>
-      <w:r>
-        <w:t xml:space="preserve">resource use. A 16-episode instrument pilot is specified only to validate hidden</w:t>
-      </w:r>
-      <w:r>
-        <w:t xml:space="preserve"> </w:t>
-      </w:r>
-      <w:r>
-        <w:t xml:space="preserve">task release, matched budgets, scoring independence, and logging before sample-</w:t>
-      </w:r>
-      <w:r>
-        <w:t xml:space="preserve"> </w:t>
-      </w:r>
-      <w:r>
-        <w:t xml:space="preserve">size planning. The pilot and confirmatory study have not been executed. This</w:t>
-      </w:r>
-      <w:r>
-        <w:t xml:space="preserve"> </w:t>
-      </w:r>
-      <w:r>
-        <w:t xml:space="preserve">revision reports no local efficacy estimate, harness-performance result, or</w:t>
-      </w:r>
-      <w:r>
-        <w:t xml:space="preserve"> </w:t>
-      </w:r>
-      <w:r>
-        <w:t xml:space="preserve">field-instance outcome.</w:t>
+        <w:t xml:space="preserve">evidence protocol.</w:t>
+      </w:r>
+    </w:p>
+    <w:p>
+      <w:pPr>
+        <w:pStyle w:val="Abstract"/>
+      </w:pPr>
+      <w:r>
+        <w:t xml:space="preserve">The study did not reach a treatment effect. It reached the prior question of</w:t>
+      </w:r>
+      <w:r>
+        <w:t xml:space="preserve"> </w:t>
+      </w:r>
+      <w:r>
+        <w:t xml:space="preserve">whether its own instruments can be trusted, and the reported result is that</w:t>
+      </w:r>
+      <w:r>
+        <w:t xml:space="preserve"> </w:t>
+      </w:r>
+      <w:r>
+        <w:t xml:space="preserve">several could not. A 16-episode instrument pilot, a 32-episode variance block</w:t>
+      </w:r>
+      <w:r>
+        <w:t xml:space="preserve"> </w:t>
+      </w:r>
+      <w:r>
+        <w:t xml:space="preserve">and a verification pass producing 192 element judgements were executed. The</w:t>
+      </w:r>
+      <w:r>
+        <w:t xml:space="preserve"> </w:t>
+      </w:r>
+      <w:r>
+        <w:t xml:space="preserve">first primary endpoint, reference-anchored cue coverage, was falsified by its own</w:t>
+      </w:r>
+      <w:r>
+        <w:t xml:space="preserve"> </w:t>
+      </w:r>
+      <w:r>
+        <w:t xml:space="preserve">preregistered adversarial test at a false-positive rate of 0.969 and replaced by</w:t>
+      </w:r>
+      <w:r>
+        <w:t xml:space="preserve"> </w:t>
+      </w:r>
+      <w:r>
+        <w:t xml:space="preserve">retrieval plus verification. A cost instrument was later found to understate one</w:t>
+      </w:r>
+      <w:r>
+        <w:t xml:space="preserve"> </w:t>
+      </w:r>
+      <w:r>
+        <w:t xml:space="preserve">episode by a factor of 14.4 while its own fixture asserted the wrong behaviour, so</w:t>
+      </w:r>
+      <w:r>
+        <w:t xml:space="preserve"> </w:t>
+      </w:r>
+      <w:r>
+        <w:t xml:space="preserve">every cost figure it had produced was voided and re-measured. A mutation audit of</w:t>
+      </w:r>
+      <w:r>
+        <w:t xml:space="preserve"> </w:t>
+      </w:r>
+      <w:r>
+        <w:t xml:space="preserve">the nine measuring instruments found four fault classes that no test detected,</w:t>
+      </w:r>
+      <w:r>
+        <w:t xml:space="preserve"> </w:t>
+      </w:r>
+      <w:r>
+        <w:t xml:space="preserve">including one that let a fail-closed sandbox report a workspace admissible while a</w:t>
+      </w:r>
+      <w:r>
+        <w:t xml:space="preserve"> </w:t>
+      </w:r>
+      <w:r>
+        <w:t xml:space="preserve">probe had fired. Of 28 recorded decisions, every one carries a falsifier written</w:t>
+      </w:r>
+      <w:r>
+        <w:t xml:space="preserve"> </w:t>
+      </w:r>
+      <w:r>
+        <w:t xml:space="preserve">before its result, and revisions are reported rather than quietly applied.</w:t>
+      </w:r>
+    </w:p>
+    <w:p>
+      <w:pPr>
+        <w:pStyle w:val="Abstract"/>
+      </w:pPr>
+      <w:r>
+        <w:t xml:space="preserve">This thesis therefore reports no local efficacy estimate, harness-performance</w:t>
+      </w:r>
+      <w:r>
+        <w:t xml:space="preserve"> </w:t>
+      </w:r>
+      <w:r>
+        <w:t xml:space="preserve">result, or field-instance outcome. Judged scoring remains inadmissible until a</w:t>
+      </w:r>
+      <w:r>
+        <w:t xml:space="preserve"> </w:t>
+      </w:r>
+      <w:r>
+        <w:t xml:space="preserve">human-anchored calibration set exists, and the contribution is the instrument</w:t>
+      </w:r>
+      <w:r>
+        <w:t xml:space="preserve"> </w:t>
+      </w:r>
+      <w:r>
+        <w:t xml:space="preserve">discipline and its recorded failures rather than a measured effect.</w:t>
       </w:r>
     </w:p>
     <w:bookmarkStart w:id="15" w:name="introduction"/>
@@ -7270,6 +7334,86 @@
         <w:pStyle w:val="BodyText"/>
       </w:pPr>
       <w:r>
+        <w:t xml:space="preserve">A last consistency check turned on the document itself. The abstract still asserted</w:t>
+      </w:r>
+      <w:r>
+        <w:t xml:space="preserve"> </w:t>
+      </w:r>
+      <w:r>
+        <w:t xml:space="preserve">that the pilot and confirmatory study had not been executed, while the conclusions of</w:t>
+      </w:r>
+      <w:r>
+        <w:t xml:space="preserve"> </w:t>
+      </w:r>
+      <w:r>
+        <w:t xml:space="preserve">the same document reported three executed blocks, and it named the endpoint that had</w:t>
+      </w:r>
+      <w:r>
+        <w:t xml:space="preserve"> </w:t>
+      </w:r>
+      <w:r>
+        <w:t xml:space="preserve">since been falsified. A summary can drift away from the results it summarises in the</w:t>
+      </w:r>
+      <w:r>
+        <w:t xml:space="preserve"> </w:t>
+      </w:r>
+      <w:r>
+        <w:t xml:space="preserve">same way that generated statistical prose drifts numerical values and inverts effect</w:t>
+      </w:r>
+      <w:r>
+        <w:t xml:space="preserve"> </w:t>
+      </w:r>
+      <w:r>
+        <w:t xml:space="preserve">directions [45], so the repair is mechanical rather than editorial.</w:t>
+      </w:r>
+      <w:r>
+        <w:t xml:space="preserve"> </w:t>
+      </w:r>
+      <w:r>
+        <w:t xml:space="preserve">The abstract was rewritten against the executed record, and six checks now forbid</w:t>
+      </w:r>
+      <w:r>
+        <w:t xml:space="preserve"> </w:t>
+      </w:r>
+      <w:r>
+        <w:t xml:space="preserve">non-execution phrasing while executed receipts exist and read the headline counts from</w:t>
+      </w:r>
+      <w:r>
+        <w:t xml:space="preserve"> </w:t>
+      </w:r>
+      <w:r>
+        <w:t xml:space="preserve">those receipts rather than from the prose, which is claim verification against a</w:t>
+      </w:r>
+      <w:r>
+        <w:t xml:space="preserve"> </w:t>
+      </w:r>
+      <w:r>
+        <w:t xml:space="preserve">recorded evidence source [69]. Three failing-first mutations all</w:t>
+      </w:r>
+      <w:r>
+        <w:t xml:space="preserve"> </w:t>
+      </w:r>
+      <w:r>
+        <w:t xml:space="preserve">fired: reintroducing the non-execution claim, removing the pilot episode count, and</w:t>
+      </w:r>
+      <w:r>
+        <w:t xml:space="preserve"> </w:t>
+      </w:r>
+      <w:r>
+        <w:t xml:space="preserve">altering the reported false-positive rate. The gate checks only the numbers it is given,</w:t>
+      </w:r>
+      <w:r>
+        <w:t xml:space="preserve"> </w:t>
+      </w:r>
+      <w:r>
+        <w:t xml:space="preserve">so an unbound new claim would still pass.</w:t>
+      </w:r>
+    </w:p>
+    <w:p>
+      <w:pPr>
+        <w:pStyle w:val="BodyText"/>
+      </w:pPr>
+      <w:r>
         <w:t xml:space="preserve">The gate written for this was itself wrong first. It scanned a character window around</w:t>
       </w:r>
       <w:r>
@@ -7300,7 +7444,7 @@
         <w:t xml:space="preserve"> </w:t>
       </w:r>
       <w:r>
-        <w:t xml:space="preserve">can come from the item or from the rater [69], and this</w:t>
+        <w:t xml:space="preserve">can come from the item or from the rater [70], and this</w:t>
       </w:r>
       <w:r>
         <w:t xml:space="preserve"> </w:t>
@@ -7318,7 +7462,7 @@
         <w:t xml:space="preserve"> </w:t>
       </w:r>
       <w:r>
-        <w:t xml:space="preserve">[70]. Three limits are attached. Replay is not correctness, since no human</w:t>
+        <w:t xml:space="preserve">[71]. Three limits are attached. Replay is not correctness, since no human</w:t>
       </w:r>
       <w:r>
         <w:t xml:space="preserve"> </w:t>
@@ -7336,7 +7480,7 @@
         <w:t xml:space="preserve"> </w:t>
       </w:r>
       <w:r>
-        <w:t xml:space="preserve">[71], which is why no cause is assigned. And a fixed</w:t>
+        <w:t xml:space="preserve">[72], which is why no cause is assigned. And a fixed</w:t>
       </w:r>
       <w:r>
         <w:t xml:space="preserve"> </w:t>
@@ -7348,7 +7492,7 @@
         <w:t xml:space="preserve"> </w:t>
       </w:r>
       <w:r>
-        <w:t xml:space="preserve">[72], so the low band is treated as unusable rather than as noisy but</w:t>
+        <w:t xml:space="preserve">[73], so the low band is treated as unusable rather than as noisy but</w:t>
       </w:r>
       <w:r>
         <w:t xml:space="preserve"> </w:t>
@@ -7366,13 +7510,13 @@
         <w:t xml:space="preserve"> </w:t>
       </w:r>
       <w:r>
-        <w:t xml:space="preserve">[73], and replaying historical claims from a frozen collection</w:t>
-      </w:r>
-      <w:r>
-        <w:t xml:space="preserve"> </w:t>
-      </w:r>
-      <w:r>
-        <w:t xml:space="preserve">commonly stops before the claim is reachable [74].</w:t>
+        <w:t xml:space="preserve">[74], and replaying historical claims from a frozen collection</w:t>
+      </w:r>
+      <w:r>
+        <w:t xml:space="preserve"> </w:t>
+      </w:r>
+      <w:r>
+        <w:t xml:space="preserve">commonly stops before the claim is reachable [75].</w:t>
       </w:r>
     </w:p>
     <w:p>
@@ -7566,7 +7710,7 @@
         <w:t xml:space="preserve"> </w:t>
       </w:r>
       <w:r>
-        <w:t xml:space="preserve">[75], so its suite asserts the deterministic shell around the</w:t>
+        <w:t xml:space="preserve">[76], so its suite asserts the deterministic shell around the</w:t>
       </w:r>
       <w:r>
         <w:t xml:space="preserve"> </w:t>
@@ -7584,7 +7728,7 @@
         <w:t xml:space="preserve"> </w:t>
       </w:r>
       <w:r>
-        <w:t xml:space="preserve">[76].</w:t>
+        <w:t xml:space="preserve">[77].</w:t>
       </w:r>
     </w:p>
     <w:p>
@@ -7604,7 +7748,7 @@
         <w:t xml:space="preserve"> </w:t>
       </w:r>
       <w:r>
-        <w:t xml:space="preserve">and expectation together [77], which is exactly how the cost</w:t>
+        <w:t xml:space="preserve">and expectation together [78], which is exactly how the cost</w:t>
       </w:r>
       <w:r>
         <w:t xml:space="preserve"> </w:t>
@@ -7616,7 +7760,7 @@
         <w:t xml:space="preserve"> </w:t>
       </w:r>
       <w:r>
-        <w:t xml:space="preserve">documented behaviour unvalidated [78], and silent measurement</w:t>
+        <w:t xml:space="preserve">documented behaviour unvalidated [79], and silent measurement</w:t>
       </w:r>
       <w:r>
         <w:t xml:space="preserve"> </w:t>
@@ -7628,7 +7772,7 @@
         <w:t xml:space="preserve"> </w:t>
       </w:r>
       <w:r>
-        <w:t xml:space="preserve">edge case [79]. Two limits are recorded. Catching seventeen</w:t>
+        <w:t xml:space="preserve">edge case [80]. Two limits are recorded. Catching seventeen</w:t>
       </w:r>
       <w:r>
         <w:t xml:space="preserve"> </w:t>
@@ -7694,7 +7838,7 @@
         <w:t xml:space="preserve"> </w:t>
       </w:r>
       <w:r>
-        <w:t xml:space="preserve">lists are read [80]. Measured against the ledger digest recorded in</w:t>
+        <w:t xml:space="preserve">lists are read [81]. Measured against the ledger digest recorded in</w:t>
       </w:r>
       <w:r>
         <w:t xml:space="preserve"> </w:t>
@@ -7821,7 +7965,7 @@
         <w:t xml:space="preserve"> </w:t>
       </w:r>
       <w:r>
-        <w:t xml:space="preserve">scores calls for [81], and it is also the boundary of what</w:t>
+        <w:t xml:space="preserve">scores calls for [82], and it is also the boundary of what</w:t>
       </w:r>
       <w:r>
         <w:t xml:space="preserve"> </w:t>
@@ -7833,7 +7977,7 @@
         <w:t xml:space="preserve"> </w:t>
       </w:r>
       <w:r>
-        <w:t xml:space="preserve">substitutes for understanding rather than supplying it [82].</w:t>
+        <w:t xml:space="preserve">substitutes for understanding rather than supplying it [83].</w:t>
       </w:r>
     </w:p>
     <w:bookmarkEnd w:id="61"/>
@@ -7982,7 +8126,7 @@
         <w:t xml:space="preserve"> </w:t>
       </w:r>
       <w:r>
-        <w:t xml:space="preserve">single terminal score [83].</w:t>
+        <w:t xml:space="preserve">single terminal score [84].</w:t>
       </w:r>
     </w:p>
     <w:p>
@@ -8064,7 +8208,7 @@
         <w:t xml:space="preserve"> </w:t>
       </w:r>
       <w:r>
-        <w:t xml:space="preserve">[84]; this project spent 192 model calls to verify 32</w:t>
+        <w:t xml:space="preserve">[85]; this project spent 192 model calls to verify 32</w:t>
       </w:r>
       <w:r>
         <w:t xml:space="preserve"> </w:t>
@@ -10934,6 +11078,26 @@
       </w:r>
       <w:r>
         <w:t xml:space="preserve">arXiv:2607.26512v1, 2026.</w:t>
+      </w:r>
+    </w:p>
+    <w:p>
+      <w:pPr>
+        <w:pStyle w:val="BodyText"/>
+      </w:pPr>
+      <w:r>
+        <w:t xml:space="preserve">V. Venktesh et al.,</w:t>
+      </w:r>
+      <w:r>
+        <w:t xml:space="preserve"> </w:t>
+      </w:r>
+      <w:r>
+        <w:t xml:space="preserve">“A Benchmark for Open-Domain Numerical Fact-Checking Enhanced by Claim Decomposition,”</w:t>
+      </w:r>
+      <w:r>
+        <w:t xml:space="preserve"> </w:t>
+      </w:r>
+      <w:r>
+        <w:t xml:space="preserve">arXiv:2510.22055v1, 2026.</w:t>
       </w:r>
     </w:p>
     <w:p>

</xml_diff>

<commit_message>
feat(paper): reject the loose numeric matcher and bind headline claims two-sidedly
</commit_message>
<xml_diff>
--- a/paper/word/graduation-thesis.docx
+++ b/paper/word/graduation-thesis.docx
@@ -7400,13 +7400,147 @@
         <w:t xml:space="preserve"> </w:t>
       </w:r>
       <w:r>
-        <w:t xml:space="preserve">altering the reported false-positive rate. The gate checks only the numbers it is given,</w:t>
-      </w:r>
-      <w:r>
-        <w:t xml:space="preserve"> </w:t>
-      </w:r>
-      <w:r>
-        <w:t xml:space="preserve">so an unbound new claim would still pass.</w:t>
+        <w:t xml:space="preserve">altering the reported false-positive rate. The same treatment was then extended from the abstract to the body, and the first</w:t>
+      </w:r>
+      <w:r>
+        <w:t xml:space="preserve"> </w:t>
+      </w:r>
+      <w:r>
+        <w:t xml:space="preserve">attempt at it failed its own validity test. A matcher compared every number in the body</w:t>
+      </w:r>
+      <w:r>
+        <w:t xml:space="preserve"> </w:t>
+      </w:r>
+      <w:r>
+        <w:t xml:space="preserve">against all</w:t>
+      </w:r>
+      <w:r>
+        <w:t xml:space="preserve"> </w:t>
+      </w:r>
+      <m:oMath>
+        <m:r>
+          <m:t>396</m:t>
+        </m:r>
+      </m:oMath>
+      <w:r>
+        <w:t xml:space="preserve"> </w:t>
+      </w:r>
+      <w:r>
+        <w:t xml:space="preserve">numeric values in the experiment receipts, allowing a factor of one</w:t>
+      </w:r>
+      <w:r>
+        <w:t xml:space="preserve"> </w:t>
+      </w:r>
+      <w:r>
+        <w:t xml:space="preserve">hundred either way, and reported that</w:t>
+      </w:r>
+      <w:r>
+        <w:t xml:space="preserve"> </w:t>
+      </w:r>
+      <m:oMath>
+        <m:r>
+          <m:t>66</m:t>
+        </m:r>
+      </m:oMath>
+      <w:r>
+        <w:t xml:space="preserve"> </w:t>
+      </w:r>
+      <w:r>
+        <w:t xml:space="preserve">of</w:t>
+      </w:r>
+      <w:r>
+        <w:t xml:space="preserve"> </w:t>
+      </w:r>
+      <m:oMath>
+        <m:r>
+          <m:t>66</m:t>
+        </m:r>
+      </m:oMath>
+      <w:r>
+        <w:t xml:space="preserve"> </w:t>
+      </w:r>
+      <w:r>
+        <w:t xml:space="preserve">matched. Feeding random numbers of the</w:t>
+      </w:r>
+      <w:r>
+        <w:t xml:space="preserve"> </w:t>
+      </w:r>
+      <w:r>
+        <w:t xml:space="preserve">same shape to that matcher showed it accepts</w:t>
+      </w:r>
+      <w:r>
+        <w:t xml:space="preserve"> </w:t>
+      </w:r>
+      <m:oMath>
+        <m:r>
+          <m:t>82.5</m:t>
+        </m:r>
+        <m:r>
+          <m:rPr>
+            <m:sty m:val="p"/>
+          </m:rPr>
+          <m:t>%</m:t>
+        </m:r>
+      </m:oMath>
+      <w:r>
+        <w:t xml:space="preserve"> </w:t>
+      </w:r>
+      <w:r>
+        <w:t xml:space="preserve">of them, so the perfect score</w:t>
+      </w:r>
+      <w:r>
+        <w:t xml:space="preserve"> </w:t>
+      </w:r>
+      <w:r>
+        <w:t xml:space="preserve">mostly measured how permissive the test was. This is the defect that falsified the cue</w:t>
+      </w:r>
+      <w:r>
+        <w:t xml:space="preserve"> </w:t>
+      </w:r>
+      <w:r>
+        <w:t xml:space="preserve">endpoint earlier in exactly the same form, and the same remedy applies: the matcher was</w:t>
+      </w:r>
+      <w:r>
+        <w:t xml:space="preserve"> </w:t>
+      </w:r>
+      <w:r>
+        <w:t xml:space="preserve">rejected as a certificate and replaced by explicit two-sided binding, in which a bound</w:t>
+      </w:r>
+      <w:r>
+        <w:t xml:space="preserve"> </w:t>
+      </w:r>
+      <w:r>
+        <w:t xml:space="preserve">number names a receipt and a path, the rendered form must appear in the body, and the</w:t>
+      </w:r>
+      <w:r>
+        <w:t xml:space="preserve"> </w:t>
+      </w:r>
+      <w:r>
+        <w:t xml:space="preserve">receipt must still hold the bound value. Editing either side alone now fails, which two</w:t>
+      </w:r>
+      <w:r>
+        <w:t xml:space="preserve"> </w:t>
+      </w:r>
+      <w:r>
+        <w:t xml:space="preserve">failing-first mutations confirm. Fifteen checks bind the headline numbers; the remaining</w:t>
+      </w:r>
+      <w:r>
+        <w:t xml:space="preserve"> </w:t>
+      </w:r>
+      <w:r>
+        <w:t xml:space="preserve">body numbers are not individually bound, so the guarantee is partial and is reported as</w:t>
+      </w:r>
+      <w:r>
+        <w:t xml:space="preserve"> </w:t>
+      </w:r>
+      <w:r>
+        <w:t xml:space="preserve">partial. Without such binding a reported number carries no indication of how it was</w:t>
+      </w:r>
+      <w:r>
+        <w:t xml:space="preserve"> </w:t>
+      </w:r>
+      <w:r>
+        <w:t xml:space="preserve">produced [70].</w:t>
       </w:r>
     </w:p>
     <w:p>
@@ -7444,7 +7578,7 @@
         <w:t xml:space="preserve"> </w:t>
       </w:r>
       <w:r>
-        <w:t xml:space="preserve">can come from the item or from the rater [70], and this</w:t>
+        <w:t xml:space="preserve">can come from the item or from the rater [71], and this</w:t>
       </w:r>
       <w:r>
         <w:t xml:space="preserve"> </w:t>
@@ -7462,7 +7596,7 @@
         <w:t xml:space="preserve"> </w:t>
       </w:r>
       <w:r>
-        <w:t xml:space="preserve">[71]. Three limits are attached. Replay is not correctness, since no human</w:t>
+        <w:t xml:space="preserve">[72]. Three limits are attached. Replay is not correctness, since no human</w:t>
       </w:r>
       <w:r>
         <w:t xml:space="preserve"> </w:t>
@@ -7480,7 +7614,7 @@
         <w:t xml:space="preserve"> </w:t>
       </w:r>
       <w:r>
-        <w:t xml:space="preserve">[72], which is why no cause is assigned. And a fixed</w:t>
+        <w:t xml:space="preserve">[73], which is why no cause is assigned. And a fixed</w:t>
       </w:r>
       <w:r>
         <w:t xml:space="preserve"> </w:t>
@@ -7492,7 +7626,7 @@
         <w:t xml:space="preserve"> </w:t>
       </w:r>
       <w:r>
-        <w:t xml:space="preserve">[73], so the low band is treated as unusable rather than as noisy but</w:t>
+        <w:t xml:space="preserve">[74], so the low band is treated as unusable rather than as noisy but</w:t>
       </w:r>
       <w:r>
         <w:t xml:space="preserve"> </w:t>
@@ -7510,13 +7644,13 @@
         <w:t xml:space="preserve"> </w:t>
       </w:r>
       <w:r>
-        <w:t xml:space="preserve">[74], and replaying historical claims from a frozen collection</w:t>
-      </w:r>
-      <w:r>
-        <w:t xml:space="preserve"> </w:t>
-      </w:r>
-      <w:r>
-        <w:t xml:space="preserve">commonly stops before the claim is reachable [75].</w:t>
+        <w:t xml:space="preserve">[75], and replaying historical claims from a frozen collection</w:t>
+      </w:r>
+      <w:r>
+        <w:t xml:space="preserve"> </w:t>
+      </w:r>
+      <w:r>
+        <w:t xml:space="preserve">commonly stops before the claim is reachable [76].</w:t>
       </w:r>
     </w:p>
     <w:p>
@@ -7710,7 +7844,7 @@
         <w:t xml:space="preserve"> </w:t>
       </w:r>
       <w:r>
-        <w:t xml:space="preserve">[76], so its suite asserts the deterministic shell around the</w:t>
+        <w:t xml:space="preserve">[77], so its suite asserts the deterministic shell around the</w:t>
       </w:r>
       <w:r>
         <w:t xml:space="preserve"> </w:t>
@@ -7728,7 +7862,7 @@
         <w:t xml:space="preserve"> </w:t>
       </w:r>
       <w:r>
-        <w:t xml:space="preserve">[77].</w:t>
+        <w:t xml:space="preserve">[78].</w:t>
       </w:r>
     </w:p>
     <w:p>
@@ -7748,7 +7882,7 @@
         <w:t xml:space="preserve"> </w:t>
       </w:r>
       <w:r>
-        <w:t xml:space="preserve">and expectation together [78], which is exactly how the cost</w:t>
+        <w:t xml:space="preserve">and expectation together [79], which is exactly how the cost</w:t>
       </w:r>
       <w:r>
         <w:t xml:space="preserve"> </w:t>
@@ -7760,7 +7894,7 @@
         <w:t xml:space="preserve"> </w:t>
       </w:r>
       <w:r>
-        <w:t xml:space="preserve">documented behaviour unvalidated [79], and silent measurement</w:t>
+        <w:t xml:space="preserve">documented behaviour unvalidated [80], and silent measurement</w:t>
       </w:r>
       <w:r>
         <w:t xml:space="preserve"> </w:t>
@@ -7772,7 +7906,7 @@
         <w:t xml:space="preserve"> </w:t>
       </w:r>
       <w:r>
-        <w:t xml:space="preserve">edge case [80]. Two limits are recorded. Catching seventeen</w:t>
+        <w:t xml:space="preserve">edge case [81]. Two limits are recorded. Catching seventeen</w:t>
       </w:r>
       <w:r>
         <w:t xml:space="preserve"> </w:t>
@@ -7838,7 +7972,7 @@
         <w:t xml:space="preserve"> </w:t>
       </w:r>
       <w:r>
-        <w:t xml:space="preserve">lists are read [81]. Measured against the ledger digest recorded in</w:t>
+        <w:t xml:space="preserve">lists are read [82]. Measured against the ledger digest recorded in</w:t>
       </w:r>
       <w:r>
         <w:t xml:space="preserve"> </w:t>
@@ -7965,7 +8099,7 @@
         <w:t xml:space="preserve"> </w:t>
       </w:r>
       <w:r>
-        <w:t xml:space="preserve">scores calls for [82], and it is also the boundary of what</w:t>
+        <w:t xml:space="preserve">scores calls for [83], and it is also the boundary of what</w:t>
       </w:r>
       <w:r>
         <w:t xml:space="preserve"> </w:t>
@@ -7977,7 +8111,7 @@
         <w:t xml:space="preserve"> </w:t>
       </w:r>
       <w:r>
-        <w:t xml:space="preserve">substitutes for understanding rather than supplying it [83].</w:t>
+        <w:t xml:space="preserve">substitutes for understanding rather than supplying it [84].</w:t>
       </w:r>
     </w:p>
     <w:bookmarkEnd w:id="61"/>
@@ -8126,7 +8260,7 @@
         <w:t xml:space="preserve"> </w:t>
       </w:r>
       <w:r>
-        <w:t xml:space="preserve">single terminal score [84].</w:t>
+        <w:t xml:space="preserve">single terminal score [85].</w:t>
       </w:r>
     </w:p>
     <w:p>
@@ -8208,7 +8342,7 @@
         <w:t xml:space="preserve"> </w:t>
       </w:r>
       <w:r>
-        <w:t xml:space="preserve">[85]; this project spent 192 model calls to verify 32</w:t>
+        <w:t xml:space="preserve">[86]; this project spent 192 model calls to verify 32</w:t>
       </w:r>
       <w:r>
         <w:t xml:space="preserve"> </w:t>
@@ -11098,6 +11232,26 @@
       </w:r>
       <w:r>
         <w:t xml:space="preserve">arXiv:2510.22055v1, 2026.</w:t>
+      </w:r>
+    </w:p>
+    <w:p>
+      <w:pPr>
+        <w:pStyle w:val="BodyText"/>
+      </w:pPr>
+      <w:r>
+        <w:t xml:space="preserve">Y. Lin et al.,</w:t>
+      </w:r>
+      <w:r>
+        <w:t xml:space="preserve"> </w:t>
+      </w:r>
+      <w:r>
+        <w:t xml:space="preserve">“Bolt-on, Verifiable Provenance for LLM-Powered Data Processing,”</w:t>
+      </w:r>
+      <w:r>
+        <w:t xml:space="preserve"> </w:t>
+      </w:r>
+      <w:r>
+        <w:t xml:space="preserve">arXiv:2608.25210v2, 2026.</w:t>
       </w:r>
     </w:p>
     <w:p>

</xml_diff>

<commit_message>
feat(paper): extend two-sided claim bindings to 29 checks
</commit_message>
<xml_diff>
--- a/paper/word/graduation-thesis.docx
+++ b/paper/word/graduation-thesis.docx
@@ -7522,25 +7522,73 @@
         <w:t xml:space="preserve"> </w:t>
       </w:r>
       <w:r>
-        <w:t xml:space="preserve">failing-first mutations confirm. Fifteen checks bind the headline numbers; the remaining</w:t>
-      </w:r>
-      <w:r>
-        <w:t xml:space="preserve"> </w:t>
-      </w:r>
-      <w:r>
-        <w:t xml:space="preserve">body numbers are not individually bound, so the guarantee is partial and is reported as</w:t>
-      </w:r>
-      <w:r>
-        <w:t xml:space="preserve"> </w:t>
-      </w:r>
-      <w:r>
-        <w:t xml:space="preserve">partial. Without such binding a reported number carries no indication of how it was</w:t>
-      </w:r>
-      <w:r>
-        <w:t xml:space="preserve"> </w:t>
-      </w:r>
-      <w:r>
-        <w:t xml:space="preserve">produced [70].</w:t>
+        <w:t xml:space="preserve">failing-first mutations confirm. The bindings were then extended from fifteen checks to</w:t>
+      </w:r>
+      <w:r>
+        <w:t xml:space="preserve"> </w:t>
+      </w:r>
+      <w:r>
+        <w:t xml:space="preserve">twenty-nine, covering every reported figure in the results. Two candidate bindings were</w:t>
+      </w:r>
+      <w:r>
+        <w:t xml:space="preserve"> </w:t>
+      </w:r>
+      <w:r>
+        <w:t xml:space="preserve">rejected rather than forced: one resolved to an episode list instead of a count and was</w:t>
+      </w:r>
+      <w:r>
+        <w:t xml:space="preserve"> </w:t>
+      </w:r>
+      <w:r>
+        <w:t xml:space="preserve">rebound to a receipt that records the count, and one had no receipt field at all and would</w:t>
+      </w:r>
+      <w:r>
+        <w:t xml:space="preserve"> </w:t>
+      </w:r>
+      <w:r>
+        <w:t xml:space="preserve">have required a wide tolerance around a different number to appear bound. Widening a</w:t>
+      </w:r>
+      <w:r>
+        <w:t xml:space="preserve"> </w:t>
+      </w:r>
+      <w:r>
+        <w:t xml:space="preserve">tolerance to raise coverage is how a check stops checking, in the same way a fidelity</w:t>
+      </w:r>
+      <w:r>
+        <w:t xml:space="preserve"> </w:t>
+      </w:r>
+      <w:r>
+        <w:t xml:space="preserve">check can pass while the source document was never opened</w:t>
+      </w:r>
+      <w:r>
+        <w:t xml:space="preserve"> </w:t>
+      </w:r>
+      <w:r>
+        <w:t xml:space="preserve">[70]. Design constants and configuration ceilings remain</w:t>
+      </w:r>
+      <w:r>
+        <w:t xml:space="preserve"> </w:t>
+      </w:r>
+      <w:r>
+        <w:t xml:space="preserve">unbound because no receipt records them, so the guarantee is partial and sound rather than</w:t>
+      </w:r>
+      <w:r>
+        <w:t xml:space="preserve"> </w:t>
+      </w:r>
+      <w:r>
+        <w:t xml:space="preserve">complete and loose, which is the same trade regression verification makes when it declines</w:t>
+      </w:r>
+      <w:r>
+        <w:t xml:space="preserve"> </w:t>
+      </w:r>
+      <w:r>
+        <w:t xml:space="preserve">to re-verify everything [71]. Without such binding a reported number carries no indication of how it was</w:t>
+      </w:r>
+      <w:r>
+        <w:t xml:space="preserve"> </w:t>
+      </w:r>
+      <w:r>
+        <w:t xml:space="preserve">produced [72].</w:t>
       </w:r>
     </w:p>
     <w:p>
@@ -7578,7 +7626,7 @@
         <w:t xml:space="preserve"> </w:t>
       </w:r>
       <w:r>
-        <w:t xml:space="preserve">can come from the item or from the rater [71], and this</w:t>
+        <w:t xml:space="preserve">can come from the item or from the rater [73], and this</w:t>
       </w:r>
       <w:r>
         <w:t xml:space="preserve"> </w:t>
@@ -7596,7 +7644,7 @@
         <w:t xml:space="preserve"> </w:t>
       </w:r>
       <w:r>
-        <w:t xml:space="preserve">[72]. Three limits are attached. Replay is not correctness, since no human</w:t>
+        <w:t xml:space="preserve">[74]. Three limits are attached. Replay is not correctness, since no human</w:t>
       </w:r>
       <w:r>
         <w:t xml:space="preserve"> </w:t>
@@ -7614,7 +7662,7 @@
         <w:t xml:space="preserve"> </w:t>
       </w:r>
       <w:r>
-        <w:t xml:space="preserve">[73], which is why no cause is assigned. And a fixed</w:t>
+        <w:t xml:space="preserve">[75], which is why no cause is assigned. And a fixed</w:t>
       </w:r>
       <w:r>
         <w:t xml:space="preserve"> </w:t>
@@ -7626,7 +7674,7 @@
         <w:t xml:space="preserve"> </w:t>
       </w:r>
       <w:r>
-        <w:t xml:space="preserve">[74], so the low band is treated as unusable rather than as noisy but</w:t>
+        <w:t xml:space="preserve">[76], so the low band is treated as unusable rather than as noisy but</w:t>
       </w:r>
       <w:r>
         <w:t xml:space="preserve"> </w:t>
@@ -7644,13 +7692,13 @@
         <w:t xml:space="preserve"> </w:t>
       </w:r>
       <w:r>
-        <w:t xml:space="preserve">[75], and replaying historical claims from a frozen collection</w:t>
-      </w:r>
-      <w:r>
-        <w:t xml:space="preserve"> </w:t>
-      </w:r>
-      <w:r>
-        <w:t xml:space="preserve">commonly stops before the claim is reachable [76].</w:t>
+        <w:t xml:space="preserve">[77], and replaying historical claims from a frozen collection</w:t>
+      </w:r>
+      <w:r>
+        <w:t xml:space="preserve"> </w:t>
+      </w:r>
+      <w:r>
+        <w:t xml:space="preserve">commonly stops before the claim is reachable [78].</w:t>
       </w:r>
     </w:p>
     <w:p>
@@ -7844,7 +7892,7 @@
         <w:t xml:space="preserve"> </w:t>
       </w:r>
       <w:r>
-        <w:t xml:space="preserve">[77], so its suite asserts the deterministic shell around the</w:t>
+        <w:t xml:space="preserve">[79], so its suite asserts the deterministic shell around the</w:t>
       </w:r>
       <w:r>
         <w:t xml:space="preserve"> </w:t>
@@ -7862,7 +7910,7 @@
         <w:t xml:space="preserve"> </w:t>
       </w:r>
       <w:r>
-        <w:t xml:space="preserve">[78].</w:t>
+        <w:t xml:space="preserve">[80].</w:t>
       </w:r>
     </w:p>
     <w:p>
@@ -7882,7 +7930,7 @@
         <w:t xml:space="preserve"> </w:t>
       </w:r>
       <w:r>
-        <w:t xml:space="preserve">and expectation together [79], which is exactly how the cost</w:t>
+        <w:t xml:space="preserve">and expectation together [81], which is exactly how the cost</w:t>
       </w:r>
       <w:r>
         <w:t xml:space="preserve"> </w:t>
@@ -7894,7 +7942,7 @@
         <w:t xml:space="preserve"> </w:t>
       </w:r>
       <w:r>
-        <w:t xml:space="preserve">documented behaviour unvalidated [80], and silent measurement</w:t>
+        <w:t xml:space="preserve">documented behaviour unvalidated [82], and silent measurement</w:t>
       </w:r>
       <w:r>
         <w:t xml:space="preserve"> </w:t>
@@ -7906,7 +7954,7 @@
         <w:t xml:space="preserve"> </w:t>
       </w:r>
       <w:r>
-        <w:t xml:space="preserve">edge case [81]. Two limits are recorded. Catching seventeen</w:t>
+        <w:t xml:space="preserve">edge case [83]. Two limits are recorded. Catching seventeen</w:t>
       </w:r>
       <w:r>
         <w:t xml:space="preserve"> </w:t>
@@ -7972,7 +8020,7 @@
         <w:t xml:space="preserve"> </w:t>
       </w:r>
       <w:r>
-        <w:t xml:space="preserve">lists are read [82]. Measured against the ledger digest recorded in</w:t>
+        <w:t xml:space="preserve">lists are read [84]. Measured against the ledger digest recorded in</w:t>
       </w:r>
       <w:r>
         <w:t xml:space="preserve"> </w:t>
@@ -8099,7 +8147,7 @@
         <w:t xml:space="preserve"> </w:t>
       </w:r>
       <w:r>
-        <w:t xml:space="preserve">scores calls for [83], and it is also the boundary of what</w:t>
+        <w:t xml:space="preserve">scores calls for [85], and it is also the boundary of what</w:t>
       </w:r>
       <w:r>
         <w:t xml:space="preserve"> </w:t>
@@ -8111,7 +8159,7 @@
         <w:t xml:space="preserve"> </w:t>
       </w:r>
       <w:r>
-        <w:t xml:space="preserve">substitutes for understanding rather than supplying it [84].</w:t>
+        <w:t xml:space="preserve">substitutes for understanding rather than supplying it [86].</w:t>
       </w:r>
     </w:p>
     <w:bookmarkEnd w:id="61"/>
@@ -8260,7 +8308,7 @@
         <w:t xml:space="preserve"> </w:t>
       </w:r>
       <w:r>
-        <w:t xml:space="preserve">single terminal score [85].</w:t>
+        <w:t xml:space="preserve">single terminal score [87].</w:t>
       </w:r>
     </w:p>
     <w:p>
@@ -8342,7 +8390,7 @@
         <w:t xml:space="preserve"> </w:t>
       </w:r>
       <w:r>
-        <w:t xml:space="preserve">[86]; this project spent 192 model calls to verify 32</w:t>
+        <w:t xml:space="preserve">[88]; this project spent 192 model calls to verify 32</w:t>
       </w:r>
       <w:r>
         <w:t xml:space="preserve"> </w:t>
@@ -11232,6 +11280,46 @@
       </w:r>
       <w:r>
         <w:t xml:space="preserve">arXiv:2510.22055v1, 2026.</w:t>
+      </w:r>
+    </w:p>
+    <w:p>
+      <w:pPr>
+        <w:pStyle w:val="BodyText"/>
+      </w:pPr>
+      <w:r>
+        <w:t xml:space="preserve">Q. Ye et al.,</w:t>
+      </w:r>
+      <w:r>
+        <w:t xml:space="preserve"> </w:t>
+      </w:r>
+      <w:r>
+        <w:t xml:space="preserve">“Fidelity Is Not Enough: Dispatch-Level Instrumentation for Agentic Data Extraction,”</w:t>
+      </w:r>
+      <w:r>
+        <w:t xml:space="preserve"> </w:t>
+      </w:r>
+      <w:r>
+        <w:t xml:space="preserve">arXiv:2608.28439v1, 2026.</w:t>
+      </w:r>
+    </w:p>
+    <w:p>
+      <w:pPr>
+        <w:pStyle w:val="BodyText"/>
+      </w:pPr>
+      <w:r>
+        <w:t xml:space="preserve">Y. Charalambous et al.,</w:t>
+      </w:r>
+      <w:r>
+        <w:t xml:space="preserve"> </w:t>
+      </w:r>
+      <w:r>
+        <w:t xml:space="preserve">“Partial Contracts Suffice: Sound, LLM-Inferred Regression Verification,”</w:t>
+      </w:r>
+      <w:r>
+        <w:t xml:space="preserve"> </w:t>
+      </w:r>
+      <w:r>
+        <w:t xml:space="preserve">arXiv:2607.10291v1, 2026.</w:t>
       </w:r>
     </w:p>
     <w:p>

</xml_diff>

<commit_message>
fix(paper): derive design constants and correct unenforced ceiling claims
</commit_message>
<xml_diff>
--- a/paper/word/graduation-thesis.docx
+++ b/paper/word/graduation-thesis.docx
@@ -3587,25 +3587,66 @@
         <w:pStyle w:val="FirstParagraph"/>
       </w:pPr>
       <w:r>
-        <w:t xml:space="preserve">All conditions use the same model revision, high-level task information, output</w:t>
-      </w:r>
-      <w:r>
-        <w:t xml:space="preserve"> </w:t>
-      </w:r>
-      <w:r>
-        <w:t xml:space="preserve">schema, 32,000-token ceiling, 12 tool-call ceiling, 45-minute wall time, clean-</w:t>
-      </w:r>
-      <w:r>
-        <w:t xml:space="preserve"> </w:t>
-      </w:r>
-      <w:r>
-        <w:t xml:space="preserve">session policy, machine class, and zero target-evaluation queries during</w:t>
-      </w:r>
-      <w:r>
-        <w:t xml:space="preserve"> </w:t>
-      </w:r>
-      <w:r>
-        <w:t xml:space="preserve">treatment. Only the two declared factors may differ. Search results consume</w:t>
+        <w:t xml:space="preserve">The confirmatory protocol holds the model revision, high-level task information,</w:t>
+      </w:r>
+      <w:r>
+        <w:t xml:space="preserve"> </w:t>
+      </w:r>
+      <w:r>
+        <w:t xml:space="preserve">output schema, clean-session policy, machine class and zero target-evaluation queries</w:t>
+      </w:r>
+      <w:r>
+        <w:t xml:space="preserve"> </w:t>
+      </w:r>
+      <w:r>
+        <w:t xml:space="preserve">constant across conditions, and specifies a token ceiling, a tool-call ceiling and a wall</w:t>
+      </w:r>
+      <w:r>
+        <w:t xml:space="preserve"> </w:t>
+      </w:r>
+      <w:r>
+        <w:t xml:space="preserve">time. Those three ceilings were specified but never enforced in any executed block, and</w:t>
+      </w:r>
+      <w:r>
+        <w:t xml:space="preserve"> </w:t>
+      </w:r>
+      <w:r>
+        <w:t xml:space="preserve">saying otherwise would credit machinery that did no work: the builder that produced every</w:t>
+      </w:r>
+      <w:r>
+        <w:t xml:space="preserve"> </w:t>
+      </w:r>
+      <w:r>
+        <w:t xml:space="preserve">executed episode emits no ceiling fields, the runner only type-checks that a configuration</w:t>
+      </w:r>
+      <w:r>
+        <w:t xml:space="preserve"> </w:t>
+      </w:r>
+      <w:r>
+        <w:t xml:space="preserve">declares them, and no executed receipt records a token ceiling. What the executed blocks</w:t>
+      </w:r>
+      <w:r>
+        <w:t xml:space="preserve"> </w:t>
+      </w:r>
+      <w:r>
+        <w:t xml:space="preserve">actually applied was the pinned invocation at a fixed reasoning level with a</w:t>
+      </w:r>
+      <w:r>
+        <w:t xml:space="preserve"> </w:t>
+      </w:r>
+      <m:oMath>
+        <m:r>
+          <m:t>900</m:t>
+        </m:r>
+      </m:oMath>
+      <w:r>
+        <w:t xml:space="preserve">-second</w:t>
+      </w:r>
+      <w:r>
+        <w:t xml:space="preserve"> </w:t>
+      </w:r>
+      <w:r>
+        <w:t xml:space="preserve">wall-clock limit and no token or call ceiling. Only the two declared factors may differ. Search results consume</w:t>
       </w:r>
       <w:r>
         <w:t xml:space="preserve"> </w:t>

</xml_diff>

<commit_message>
feat(paper): enforce episode ceilings at admission and withdraw the untestable one
</commit_message>
<xml_diff>
--- a/paper/word/graduation-thesis.docx
+++ b/paper/word/graduation-thesis.docx
@@ -3646,7 +3646,158 @@
         <w:t xml:space="preserve"> </w:t>
       </w:r>
       <w:r>
-        <w:t xml:space="preserve">wall-clock limit and no token or call ceiling. Only the two declared factors may differ. Search results consume</w:t>
+        <w:t xml:space="preserve">wall-clock limit and no token or call ceiling. The ceilings were then given a meaning and a</w:t>
+      </w:r>
+      <w:r>
+        <w:t xml:space="preserve"> </w:t>
+      </w:r>
+      <w:r>
+        <w:t xml:space="preserve">consequence rather than deleted. A provider call cannot be capped from outside, so they</w:t>
+      </w:r>
+      <w:r>
+        <w:t xml:space="preserve"> </w:t>
+      </w:r>
+      <w:r>
+        <w:t xml:space="preserve">are enforced at scoring admission against measured usage by a committed module that</w:t>
+      </w:r>
+      <w:r>
+        <w:t xml:space="preserve"> </w:t>
+      </w:r>
+      <w:r>
+        <w:t xml:space="preserve">requires the quantity to be named and treats an unmeasured quantity as a violation rather</w:t>
+      </w:r>
+      <w:r>
+        <w:t xml:space="preserve"> </w:t>
+      </w:r>
+      <w:r>
+        <w:t xml:space="preserve">than a pass; sixteen fixtures hold it and five injected faults were caught.</w:t>
+      </w:r>
+    </w:p>
+    <w:p>
+      <w:pPr>
+        <w:pStyle w:val="BodyText"/>
+      </w:pPr>
+      <w:r>
+        <w:t xml:space="preserve">Applying the declared figure of</w:t>
+      </w:r>
+      <w:r>
+        <w:t xml:space="preserve"> </w:t>
+      </w:r>
+      <m:oMath>
+        <m:r>
+          <m:t>32</m:t>
+        </m:r>
+        <m:r>
+          <m:rPr>
+            <m:sty m:val="p"/>
+          </m:rPr>
+          <m:t>,</m:t>
+        </m:r>
+        <m:r>
+          <m:t>000</m:t>
+        </m:r>
+      </m:oMath>
+      <w:r>
+        <w:t xml:space="preserve"> </w:t>
+      </w:r>
+      <w:r>
+        <w:t xml:space="preserve">to the six episodes with complete measured</w:t>
+      </w:r>
+      <w:r>
+        <w:t xml:space="preserve"> </w:t>
+      </w:r>
+      <w:r>
+        <w:t xml:space="preserve">usage showed that the number had no truth value on its own. Read as a total-token limit,</w:t>
+      </w:r>
+      <w:r>
+        <w:t xml:space="preserve"> </w:t>
+      </w:r>
+      <w:r>
+        <w:t xml:space="preserve">every episode was inadmissible, exceeding it by between</w:t>
+      </w:r>
+      <w:r>
+        <w:t xml:space="preserve"> </w:t>
+      </w:r>
+      <m:oMath>
+        <m:r>
+          <m:t>4.7</m:t>
+        </m:r>
+      </m:oMath>
+      <w:r>
+        <w:t xml:space="preserve"> </w:t>
+      </w:r>
+      <w:r>
+        <w:t xml:space="preserve">and</w:t>
+      </w:r>
+      <w:r>
+        <w:t xml:space="preserve"> </w:t>
+      </w:r>
+      <m:oMath>
+        <m:r>
+          <m:t>20.3</m:t>
+        </m:r>
+      </m:oMath>
+      <w:r>
+        <w:t xml:space="preserve"> </w:t>
+      </w:r>
+      <w:r>
+        <w:t xml:space="preserve">times. Read as a</w:t>
+      </w:r>
+      <w:r>
+        <w:t xml:space="preserve"> </w:t>
+      </w:r>
+      <w:r>
+        <w:t xml:space="preserve">marginal-token limit, every episode passed, with a maximum of</w:t>
+      </w:r>
+      <w:r>
+        <w:t xml:space="preserve"> </w:t>
+      </w:r>
+      <m:oMath>
+        <m:r>
+          <m:t>10</m:t>
+        </m:r>
+        <m:r>
+          <m:rPr>
+            <m:sty m:val="p"/>
+          </m:rPr>
+          <m:t>,</m:t>
+        </m:r>
+        <m:r>
+          <m:t>957</m:t>
+        </m:r>
+      </m:oMath>
+      <w:r>
+        <w:t xml:space="preserve">. The verdict is</w:t>
+      </w:r>
+      <w:r>
+        <w:t xml:space="preserve"> </w:t>
+      </w:r>
+      <w:r>
+        <w:t xml:space="preserve">decided entirely by a quantity the protocol never named. The total-token ceiling is</w:t>
+      </w:r>
+      <w:r>
+        <w:t xml:space="preserve"> </w:t>
+      </w:r>
+      <w:r>
+        <w:t xml:space="preserve">therefore withdrawn until it can be set from a measured distribution on the confirmatory</w:t>
+      </w:r>
+      <w:r>
+        <w:t xml:space="preserve"> </w:t>
+      </w:r>
+      <w:r>
+        <w:t xml:space="preserve">task set, rather than replaced with a guess, and the marginal-token, call and wall-clock</w:t>
+      </w:r>
+      <w:r>
+        <w:t xml:space="preserve"> </w:t>
+      </w:r>
+      <w:r>
+        <w:t xml:space="preserve">ceilings are retained because measurement supports them. These maxima come from six</w:t>
+      </w:r>
+      <w:r>
+        <w:t xml:space="preserve"> </w:t>
+      </w:r>
+      <w:r>
+        <w:t xml:space="preserve">episodes on one burned task and would not generalise. Only the two declared factors may differ. Search results consume</w:t>
       </w:r>
       <w:r>
         <w:t xml:space="preserve"> </w:t>

</xml_diff>

<commit_message>
feat(paper): refuse scoring for episodes that violate or cannot show compliance
</commit_message>
<xml_diff>
--- a/paper/word/graduation-thesis.docx
+++ b/paper/word/graduation-thesis.docx
@@ -3797,7 +3797,85 @@
         <w:t xml:space="preserve"> </w:t>
       </w:r>
       <w:r>
-        <w:t xml:space="preserve">episodes on one burned task and would not generalise. Only the two declared factors may differ. Search results consume</w:t>
+        <w:t xml:space="preserve">episodes on one burned task and would not generalise. Enforcement was then moved into the</w:t>
+      </w:r>
+      <w:r>
+        <w:t xml:space="preserve"> </w:t>
+      </w:r>
+      <w:r>
+        <w:t xml:space="preserve">admission path so a violation cannot reach the scorer at all. The runner records the</w:t>
+      </w:r>
+      <w:r>
+        <w:t xml:space="preserve"> </w:t>
+      </w:r>
+      <w:r>
+        <w:t xml:space="preserve">ceilings a configuration declares, translated into the quantities the enforcer measures,</w:t>
+      </w:r>
+      <w:r>
+        <w:t xml:space="preserve"> </w:t>
+      </w:r>
+      <w:r>
+        <w:t xml:space="preserve">and scoring is refused for five distinct reasons: the episode did not execute, a</w:t>
+      </w:r>
+      <w:r>
+        <w:t xml:space="preserve"> </w:t>
+      </w:r>
+      <w:r>
+        <w:t xml:space="preserve">pre-launch probe fired, its usage is unmeasured so compliance cannot be shown, it declares</w:t>
+      </w:r>
+      <w:r>
+        <w:t xml:space="preserve"> </w:t>
+      </w:r>
+      <w:r>
+        <w:t xml:space="preserve">no ceiling at all, or it exceeds one. A ceiling given as a non-integer is dropped at</w:t>
+      </w:r>
+      <w:r>
+        <w:t xml:space="preserve"> </w:t>
+      </w:r>
+      <w:r>
+        <w:t xml:space="preserve">translation rather than trusted, which makes the episode inadmissible for lack of a</w:t>
+      </w:r>
+      <w:r>
+        <w:t xml:space="preserve"> </w:t>
+      </w:r>
+      <w:r>
+        <w:t xml:space="preserve">declared limit. Seventeen checks hold this and six of six injected faults were caught,</w:t>
+      </w:r>
+      <w:r>
+        <w:t xml:space="preserve"> </w:t>
+      </w:r>
+      <w:r>
+        <w:t xml:space="preserve">after one fixture was rewritten: its not-executed case was being blocked by a different</w:t>
+      </w:r>
+      <w:r>
+        <w:t xml:space="preserve"> </w:t>
+      </w:r>
+      <w:r>
+        <w:t xml:space="preserve">guard, so removing the execution-status check still passed. This matters because control</w:t>
+      </w:r>
+      <w:r>
+        <w:t xml:space="preserve"> </w:t>
+      </w:r>
+      <w:r>
+        <w:t xml:space="preserve">primitives whose names imply a barrier do not always stop anything</w:t>
+      </w:r>
+      <w:r>
+        <w:t xml:space="preserve"> </w:t>
+      </w:r>
+      <w:r>
+        <w:t xml:space="preserve">[46], and because judging each request in isolation cannot catch</w:t>
+      </w:r>
+      <w:r>
+        <w:t xml:space="preserve"> </w:t>
+      </w:r>
+      <w:r>
+        <w:t xml:space="preserve">a pattern that only appears across a run [47]. All six measured</w:t>
+      </w:r>
+      <w:r>
+        <w:t xml:space="preserve"> </w:t>
+      </w:r>
+      <w:r>
+        <w:t xml:space="preserve">episodes are scorable under the retained ceilings. Only the two declared factors may differ. Search results consume</w:t>
       </w:r>
       <w:r>
         <w:t xml:space="preserve"> </w:t>
@@ -4888,13 +4966,13 @@
         <w:t xml:space="preserve"> </w:t>
       </w:r>
       <w:r>
-        <w:t xml:space="preserve">pipeline can lose validity stage by stage [46], because a</w:t>
-      </w:r>
-      <w:r>
-        <w:t xml:space="preserve"> </w:t>
-      </w:r>
-      <w:r>
-        <w:t xml:space="preserve">validity audit can fail in its own characteristic ways [47],</w:t>
+        <w:t xml:space="preserve">pipeline can lose validity stage by stage [48], because a</w:t>
+      </w:r>
+      <w:r>
+        <w:t xml:space="preserve"> </w:t>
+      </w:r>
+      <w:r>
+        <w:t xml:space="preserve">validity audit can fail in its own characteristic ways [49],</w:t>
       </w:r>
       <w:r>
         <w:t xml:space="preserve"> </w:t>
@@ -4906,7 +4984,7 @@
         <w:t xml:space="preserve"> </w:t>
       </w:r>
       <w:r>
-        <w:t xml:space="preserve">systems learn from [48].</w:t>
+        <w:t xml:space="preserve">systems learn from [50].</w:t>
       </w:r>
     </w:p>
     <w:bookmarkStart w:id="51" w:name="executed-instrument-blocks"/>
@@ -4989,7 +5067,7 @@
         <w:t xml:space="preserve"> </w:t>
       </w:r>
       <w:r>
-        <w:t xml:space="preserve">planted-shortcut style [49] falsified it: sentences that named</w:t>
+        <w:t xml:space="preserve">planted-shortcut style [51] falsified it: sentences that named</w:t>
       </w:r>
       <w:r>
         <w:t xml:space="preserve"> </w:t>
@@ -5102,7 +5180,7 @@
         <w:t xml:space="preserve"> </w:t>
       </w:r>
       <w:r>
-        <w:t xml:space="preserve">[50].</w:t>
+        <w:t xml:space="preserve">[52].</w:t>
       </w:r>
     </w:p>
     <w:p>
@@ -5122,7 +5200,7 @@
         <w:t xml:space="preserve"> </w:t>
       </w:r>
       <w:r>
-        <w:t xml:space="preserve">retrieved span, following grounded checklist scoring [51].</w:t>
+        <w:t xml:space="preserve">retrieved span, following grounded checklist scoring [53].</w:t>
       </w:r>
       <w:r>
         <w:t xml:space="preserve"> </w:t>
@@ -5180,7 +5258,7 @@
         <w:t xml:space="preserve"> </w:t>
       </w:r>
       <w:r>
-        <w:t xml:space="preserve">is the load-bearing property here, not score magnitude [52].</w:t>
+        <w:t xml:space="preserve">is the load-bearing property here, not score magnitude [54].</w:t>
       </w:r>
     </w:p>
     <w:bookmarkEnd w:id="52"/>
@@ -5390,13 +5468,13 @@
         <w:t xml:space="preserve"> </w:t>
       </w:r>
       <w:r>
-        <w:t xml:space="preserve">confident error [53], and judge validation that rests on</w:t>
-      </w:r>
-      <w:r>
-        <w:t xml:space="preserve"> </w:t>
-      </w:r>
-      <w:r>
-        <w:t xml:space="preserve">uncorrected agreement does not establish validity [54].</w:t>
+        <w:t xml:space="preserve">confident error [55], and judge validation that rests on</w:t>
+      </w:r>
+      <w:r>
+        <w:t xml:space="preserve"> </w:t>
+      </w:r>
+      <w:r>
+        <w:t xml:space="preserve">uncorrected agreement does not establish validity [56].</w:t>
       </w:r>
       <w:r>
         <w:t xml:space="preserve"> </w:t>
@@ -5641,7 +5719,7 @@
         <w:t xml:space="preserve"> </w:t>
       </w:r>
       <w:r>
-        <w:t xml:space="preserve">experiments [55]. The pilot tasks are development data and are</w:t>
+        <w:t xml:space="preserve">experiments [57]. The pilot tasks are development data and are</w:t>
       </w:r>
       <w:r>
         <w:t xml:space="preserve"> </w:t>
@@ -6293,7 +6371,7 @@
         <w:t xml:space="preserve"> </w:t>
       </w:r>
       <w:r>
-        <w:t xml:space="preserve">its realisation [56]. Both conditions vary substantially, which is</w:t>
+        <w:t xml:space="preserve">its realisation [58]. Both conditions vary substantially, which is</w:t>
       </w:r>
       <w:r>
         <w:t xml:space="preserve"> </w:t>
@@ -6305,13 +6383,13 @@
         <w:t xml:space="preserve"> </w:t>
       </w:r>
       <w:r>
-        <w:t xml:space="preserve">tasks, tools, and environment [57] and that model outputs are not</w:t>
-      </w:r>
-      <w:r>
-        <w:t xml:space="preserve"> </w:t>
-      </w:r>
-      <w:r>
-        <w:t xml:space="preserve">deterministic for a fixed prompt [58]. And dollar cost is excluded</w:t>
+        <w:t xml:space="preserve">tasks, tools, and environment [59] and that model outputs are not</w:t>
+      </w:r>
+      <w:r>
+        <w:t xml:space="preserve"> </w:t>
+      </w:r>
+      <w:r>
+        <w:t xml:space="preserve">deterministic for a fixed prompt [60]. And dollar cost is excluded</w:t>
       </w:r>
       <w:r>
         <w:t xml:space="preserve"> </w:t>
@@ -6323,31 +6401,31 @@
         <w:t xml:space="preserve"> </w:t>
       </w:r>
       <w:r>
-        <w:t xml:space="preserve">[59], while provider totals can conceal different accounting</w:t>
-      </w:r>
-      <w:r>
-        <w:t xml:space="preserve"> </w:t>
-      </w:r>
-      <w:r>
-        <w:t xml:space="preserve">[60]; cost belongs beside the endpoint rather than behind it</w:t>
-      </w:r>
-      <w:r>
-        <w:t xml:space="preserve"> </w:t>
-      </w:r>
-      <w:r>
-        <w:t xml:space="preserve">[61], and any future effect claim from this design must be</w:t>
-      </w:r>
-      <w:r>
-        <w:t xml:space="preserve"> </w:t>
-      </w:r>
-      <w:r>
-        <w:t xml:space="preserve">budget-matched rather than merely condition-matched [62], since</w:t>
-      </w:r>
-      <w:r>
-        <w:t xml:space="preserve"> </w:t>
-      </w:r>
-      <w:r>
-        <w:t xml:space="preserve">agent cost is carried differently by its components [63].</w:t>
+        <w:t xml:space="preserve">[61], while provider totals can conceal different accounting</w:t>
+      </w:r>
+      <w:r>
+        <w:t xml:space="preserve"> </w:t>
+      </w:r>
+      <w:r>
+        <w:t xml:space="preserve">[62]; cost belongs beside the endpoint rather than behind it</w:t>
+      </w:r>
+      <w:r>
+        <w:t xml:space="preserve"> </w:t>
+      </w:r>
+      <w:r>
+        <w:t xml:space="preserve">[63], and any future effect claim from this design must be</w:t>
+      </w:r>
+      <w:r>
+        <w:t xml:space="preserve"> </w:t>
+      </w:r>
+      <w:r>
+        <w:t xml:space="preserve">budget-matched rather than merely condition-matched [64], since</w:t>
+      </w:r>
+      <w:r>
+        <w:t xml:space="preserve"> </w:t>
+      </w:r>
+      <w:r>
+        <w:t xml:space="preserve">agent cost is carried differently by its components [65].</w:t>
       </w:r>
     </w:p>
     <w:bookmarkEnd w:id="58"/>
@@ -7066,13 +7144,13 @@
         <w:t xml:space="preserve"> </w:t>
       </w:r>
       <w:r>
-        <w:t xml:space="preserve">problems for small models [64], and agreement can be high while the</w:t>
-      </w:r>
-      <w:r>
-        <w:t xml:space="preserve"> </w:t>
-      </w:r>
-      <w:r>
-        <w:t xml:space="preserve">answer is wrong [65]. The rule was applied precisely to the hardest</w:t>
+        <w:t xml:space="preserve">problems for small models [66], and agreement can be high while the</w:t>
+      </w:r>
+      <w:r>
+        <w:t xml:space="preserve"> </w:t>
+      </w:r>
+      <w:r>
+        <w:t xml:space="preserve">answer is wrong [67]. The rule was applied precisely to the hardest</w:t>
       </w:r>
       <w:r>
         <w:t xml:space="preserve"> </w:t>
@@ -7342,7 +7420,7 @@
         <w:t xml:space="preserve"> </w:t>
       </w:r>
       <w:r>
-        <w:t xml:space="preserve">away [66].</w:t>
+        <w:t xml:space="preserve">away [68].</w:t>
       </w:r>
     </w:p>
     <w:p>
@@ -7392,7 +7470,7 @@
         <w:t xml:space="preserve"> </w:t>
       </w:r>
       <w:r>
-        <w:t xml:space="preserve">failing to reproduce [67]: coverage counts only an exactly</w:t>
+        <w:t xml:space="preserve">failing to reproduce [69]: coverage counts only an exactly</w:t>
       </w:r>
       <w:r>
         <w:t xml:space="preserve"> </w:t>
@@ -7506,7 +7584,7 @@
         <w:t xml:space="preserve"> </w:t>
       </w:r>
       <w:r>
-        <w:t xml:space="preserve">[68], and its limit is stated: a re-fetch depends on the upstream</w:t>
+        <w:t xml:space="preserve">[70], and its limit is stated: a re-fetch depends on the upstream</w:t>
       </w:r>
       <w:r>
         <w:t xml:space="preserve"> </w:t>
@@ -7580,7 +7658,7 @@
         <w:t xml:space="preserve"> </w:t>
       </w:r>
       <w:r>
-        <w:t xml:space="preserve">recorded evidence source [69]. Three failing-first mutations all</w:t>
+        <w:t xml:space="preserve">recorded evidence source [71]. Three failing-first mutations all</w:t>
       </w:r>
       <w:r>
         <w:t xml:space="preserve"> </w:t>
@@ -7756,7 +7834,7 @@
         <w:t xml:space="preserve"> </w:t>
       </w:r>
       <w:r>
-        <w:t xml:space="preserve">[70]. Design constants and configuration ceilings remain</w:t>
+        <w:t xml:space="preserve">[72]. Design constants and configuration ceilings remain</w:t>
       </w:r>
       <w:r>
         <w:t xml:space="preserve"> </w:t>
@@ -7774,13 +7852,13 @@
         <w:t xml:space="preserve"> </w:t>
       </w:r>
       <w:r>
-        <w:t xml:space="preserve">to re-verify everything [71]. Without such binding a reported number carries no indication of how it was</w:t>
-      </w:r>
-      <w:r>
-        <w:t xml:space="preserve"> </w:t>
-      </w:r>
-      <w:r>
-        <w:t xml:space="preserve">produced [72].</w:t>
+        <w:t xml:space="preserve">to re-verify everything [73]. Without such binding a reported number carries no indication of how it was</w:t>
+      </w:r>
+      <w:r>
+        <w:t xml:space="preserve"> </w:t>
+      </w:r>
+      <w:r>
+        <w:t xml:space="preserve">produced [74].</w:t>
       </w:r>
     </w:p>
     <w:p>
@@ -7818,7 +7896,7 @@
         <w:t xml:space="preserve"> </w:t>
       </w:r>
       <w:r>
-        <w:t xml:space="preserve">can come from the item or from the rater [73], and this</w:t>
+        <w:t xml:space="preserve">can come from the item or from the rater [75], and this</w:t>
       </w:r>
       <w:r>
         <w:t xml:space="preserve"> </w:t>
@@ -7836,7 +7914,7 @@
         <w:t xml:space="preserve"> </w:t>
       </w:r>
       <w:r>
-        <w:t xml:space="preserve">[74]. Three limits are attached. Replay is not correctness, since no human</w:t>
+        <w:t xml:space="preserve">[76]. Three limits are attached. Replay is not correctness, since no human</w:t>
       </w:r>
       <w:r>
         <w:t xml:space="preserve"> </w:t>
@@ -7854,7 +7932,7 @@
         <w:t xml:space="preserve"> </w:t>
       </w:r>
       <w:r>
-        <w:t xml:space="preserve">[75], which is why no cause is assigned. And a fixed</w:t>
+        <w:t xml:space="preserve">[77], which is why no cause is assigned. And a fixed</w:t>
       </w:r>
       <w:r>
         <w:t xml:space="preserve"> </w:t>
@@ -7866,7 +7944,7 @@
         <w:t xml:space="preserve"> </w:t>
       </w:r>
       <w:r>
-        <w:t xml:space="preserve">[76], so the low band is treated as unusable rather than as noisy but</w:t>
+        <w:t xml:space="preserve">[78], so the low band is treated as unusable rather than as noisy but</w:t>
       </w:r>
       <w:r>
         <w:t xml:space="preserve"> </w:t>
@@ -7884,13 +7962,13 @@
         <w:t xml:space="preserve"> </w:t>
       </w:r>
       <w:r>
-        <w:t xml:space="preserve">[77], and replaying historical claims from a frozen collection</w:t>
-      </w:r>
-      <w:r>
-        <w:t xml:space="preserve"> </w:t>
-      </w:r>
-      <w:r>
-        <w:t xml:space="preserve">commonly stops before the claim is reachable [78].</w:t>
+        <w:t xml:space="preserve">[79], and replaying historical claims from a frozen collection</w:t>
+      </w:r>
+      <w:r>
+        <w:t xml:space="preserve"> </w:t>
+      </w:r>
+      <w:r>
+        <w:t xml:space="preserve">commonly stops before the claim is reachable [80].</w:t>
       </w:r>
     </w:p>
     <w:p>
@@ -8084,7 +8162,7 @@
         <w:t xml:space="preserve"> </w:t>
       </w:r>
       <w:r>
-        <w:t xml:space="preserve">[79], so its suite asserts the deterministic shell around the</w:t>
+        <w:t xml:space="preserve">[81], so its suite asserts the deterministic shell around the</w:t>
       </w:r>
       <w:r>
         <w:t xml:space="preserve"> </w:t>
@@ -8102,7 +8180,7 @@
         <w:t xml:space="preserve"> </w:t>
       </w:r>
       <w:r>
-        <w:t xml:space="preserve">[80].</w:t>
+        <w:t xml:space="preserve">[82].</w:t>
       </w:r>
     </w:p>
     <w:p>
@@ -8122,7 +8200,7 @@
         <w:t xml:space="preserve"> </w:t>
       </w:r>
       <w:r>
-        <w:t xml:space="preserve">and expectation together [81], which is exactly how the cost</w:t>
+        <w:t xml:space="preserve">and expectation together [83], which is exactly how the cost</w:t>
       </w:r>
       <w:r>
         <w:t xml:space="preserve"> </w:t>
@@ -8134,7 +8212,7 @@
         <w:t xml:space="preserve"> </w:t>
       </w:r>
       <w:r>
-        <w:t xml:space="preserve">documented behaviour unvalidated [82], and silent measurement</w:t>
+        <w:t xml:space="preserve">documented behaviour unvalidated [84], and silent measurement</w:t>
       </w:r>
       <w:r>
         <w:t xml:space="preserve"> </w:t>
@@ -8146,7 +8224,7 @@
         <w:t xml:space="preserve"> </w:t>
       </w:r>
       <w:r>
-        <w:t xml:space="preserve">edge case [83]. Two limits are recorded. Catching seventeen</w:t>
+        <w:t xml:space="preserve">edge case [85]. Two limits are recorded. Catching seventeen</w:t>
       </w:r>
       <w:r>
         <w:t xml:space="preserve"> </w:t>
@@ -8212,7 +8290,7 @@
         <w:t xml:space="preserve"> </w:t>
       </w:r>
       <w:r>
-        <w:t xml:space="preserve">lists are read [84]. Measured against the ledger digest recorded in</w:t>
+        <w:t xml:space="preserve">lists are read [86]. Measured against the ledger digest recorded in</w:t>
       </w:r>
       <w:r>
         <w:t xml:space="preserve"> </w:t>
@@ -8339,7 +8417,7 @@
         <w:t xml:space="preserve"> </w:t>
       </w:r>
       <w:r>
-        <w:t xml:space="preserve">scores calls for [85], and it is also the boundary of what</w:t>
+        <w:t xml:space="preserve">scores calls for [87], and it is also the boundary of what</w:t>
       </w:r>
       <w:r>
         <w:t xml:space="preserve"> </w:t>
@@ -8351,7 +8429,7 @@
         <w:t xml:space="preserve"> </w:t>
       </w:r>
       <w:r>
-        <w:t xml:space="preserve">substitutes for understanding rather than supplying it [86].</w:t>
+        <w:t xml:space="preserve">substitutes for understanding rather than supplying it [88].</w:t>
       </w:r>
     </w:p>
     <w:bookmarkEnd w:id="61"/>
@@ -8500,7 +8578,7 @@
         <w:t xml:space="preserve"> </w:t>
       </w:r>
       <w:r>
-        <w:t xml:space="preserve">single terminal score [87].</w:t>
+        <w:t xml:space="preserve">single terminal score [89].</w:t>
       </w:r>
     </w:p>
     <w:p>
@@ -8582,7 +8660,7 @@
         <w:t xml:space="preserve"> </w:t>
       </w:r>
       <w:r>
-        <w:t xml:space="preserve">[88]; this project spent 192 model calls to verify 32</w:t>
+        <w:t xml:space="preserve">[90]; this project spent 192 model calls to verify 32</w:t>
       </w:r>
       <w:r>
         <w:t xml:space="preserve"> </w:t>
@@ -10782,6 +10860,46 @@
       </w:hyperlink>
       <w:r>
         <w:t xml:space="preserve">.</w:t>
+      </w:r>
+    </w:p>
+    <w:p>
+      <w:pPr>
+        <w:pStyle w:val="BodyText"/>
+      </w:pPr>
+      <w:r>
+        <w:t xml:space="preserve">S. Khan et al.,</w:t>
+      </w:r>
+      <w:r>
+        <w:t xml:space="preserve"> </w:t>
+      </w:r>
+      <w:r>
+        <w:t xml:space="preserve">“Stop Means Stop: Measuring and Repairing the Enforcement Gap in Agent Control Primitives,”</w:t>
+      </w:r>
+      <w:r>
+        <w:t xml:space="preserve"> </w:t>
+      </w:r>
+      <w:r>
+        <w:t xml:space="preserve">arXiv:2607.14166v3, 2026.</w:t>
+      </w:r>
+    </w:p>
+    <w:p>
+      <w:pPr>
+        <w:pStyle w:val="BodyText"/>
+      </w:pPr>
+      <w:r>
+        <w:t xml:space="preserve">M. Fernandez et al.,</w:t>
+      </w:r>
+      <w:r>
+        <w:t xml:space="preserve"> </w:t>
+      </w:r>
+      <w:r>
+        <w:t xml:space="preserve">“Agent Control Protocol: Admission Control for Agent Actions,”</w:t>
+      </w:r>
+      <w:r>
+        <w:t xml:space="preserve"> </w:t>
+      </w:r>
+      <w:r>
+        <w:t xml:space="preserve">arXiv:2603.18829v10, 2026.</w:t>
       </w:r>
     </w:p>
     <w:p>

</xml_diff>

<commit_message>
feat(paper): apply the admission rule retrospectively without exemption
</commit_message>
<xml_diff>
--- a/paper/word/graduation-thesis.docx
+++ b/paper/word/graduation-thesis.docx
@@ -3875,7 +3875,119 @@
         <w:t xml:space="preserve"> </w:t>
       </w:r>
       <w:r>
-        <w:t xml:space="preserve">episodes are scorable under the retained ceilings. Only the two declared factors may differ. Search results consume</w:t>
+        <w:t xml:space="preserve">episodes are scorable under the retained ceilings.</w:t>
+      </w:r>
+    </w:p>
+    <w:p>
+      <w:pPr>
+        <w:pStyle w:val="BodyText"/>
+      </w:pPr>
+      <w:r>
+        <w:t xml:space="preserve">The rule was then applied to the episodes that motivated it, without exemption, because</w:t>
+      </w:r>
+      <w:r>
+        <w:t xml:space="preserve"> </w:t>
+      </w:r>
+      <w:r>
+        <w:t xml:space="preserve">exempting that data is how a rule becomes ceremonial. Of the</w:t>
+      </w:r>
+      <w:r>
+        <w:t xml:space="preserve"> </w:t>
+      </w:r>
+      <m:oMath>
+        <m:r>
+          <m:t>48</m:t>
+        </m:r>
+      </m:oMath>
+      <w:r>
+        <w:t xml:space="preserve"> </w:t>
+      </w:r>
+      <w:r>
+        <w:t xml:space="preserve">episodes in the pilot</w:t>
+      </w:r>
+      <w:r>
+        <w:t xml:space="preserve"> </w:t>
+      </w:r>
+      <w:r>
+        <w:t xml:space="preserve">and variance blocks, none is scorable, for a single reason: their usage was never</w:t>
+      </w:r>
+      <w:r>
+        <w:t xml:space="preserve"> </w:t>
+      </w:r>
+      <w:r>
+        <w:t xml:space="preserve">measured, so compliance cannot be shown. Only the six episodes executed in structured</w:t>
+      </w:r>
+      <w:r>
+        <w:t xml:space="preserve"> </w:t>
+      </w:r>
+      <w:r>
+        <w:t xml:space="preserve">output mode pass. Nothing is retracted by this, because no score or effect was ever</w:t>
+      </w:r>
+      <w:r>
+        <w:t xml:space="preserve"> </w:t>
+      </w:r>
+      <w:r>
+        <w:t xml:space="preserve">claimed from those blocks and judged scoring was already inadmissible pending</w:t>
+      </w:r>
+      <w:r>
+        <w:t xml:space="preserve"> </w:t>
+      </w:r>
+      <w:r>
+        <w:t xml:space="preserve">calibration, so the rule supplies a second independent reason rather than overturning a</w:t>
+      </w:r>
+      <w:r>
+        <w:t xml:space="preserve"> </w:t>
+      </w:r>
+      <w:r>
+        <w:t xml:space="preserve">claim. What it does change is the status of the variance components and of the allocation</w:t>
+      </w:r>
+      <w:r>
+        <w:t xml:space="preserve"> </w:t>
+      </w:r>
+      <w:r>
+        <w:t xml:space="preserve">and minimum detectable effect derived from them: those are design-planning inputs taken</w:t>
+      </w:r>
+      <w:r>
+        <w:t xml:space="preserve"> </w:t>
+      </w:r>
+      <w:r>
+        <w:t xml:space="preserve">from episodes that would not be admitted today, and they are labelled provisional. Every</w:t>
+      </w:r>
+      <w:r>
+        <w:t xml:space="preserve"> </w:t>
+      </w:r>
+      <w:r>
+        <w:t xml:space="preserve">confirmatory episode must therefore be executed with its usage measured, and the</w:t>
+      </w:r>
+      <w:r>
+        <w:t xml:space="preserve"> </w:t>
+      </w:r>
+      <w:r>
+        <w:t xml:space="preserve">confirmatory block must re-derive its own allocation rather than inherit these numbers.</w:t>
+      </w:r>
+      <w:r>
+        <w:t xml:space="preserve"> </w:t>
+      </w:r>
+      <w:r>
+        <w:t xml:space="preserve">The wider difficulty is that open-ended research tasks have no singular ground truth</w:t>
+      </w:r>
+      <w:r>
+        <w:t xml:space="preserve"> </w:t>
+      </w:r>
+      <w:r>
+        <w:t xml:space="preserve">[48] and harness improvement normally assumes validation</w:t>
+      </w:r>
+      <w:r>
+        <w:t xml:space="preserve"> </w:t>
+      </w:r>
+      <w:r>
+        <w:t xml:space="preserve">labels that are hard to obtain in deployment [49], which is why</w:t>
+      </w:r>
+      <w:r>
+        <w:t xml:space="preserve"> </w:t>
+      </w:r>
+      <w:r>
+        <w:t xml:space="preserve">admission here rests on measurable compliance rather than on outcome correctness. Only the two declared factors may differ. Search results consume</w:t>
       </w:r>
       <w:r>
         <w:t xml:space="preserve"> </w:t>
@@ -4966,13 +5078,13 @@
         <w:t xml:space="preserve"> </w:t>
       </w:r>
       <w:r>
-        <w:t xml:space="preserve">pipeline can lose validity stage by stage [48], because a</w:t>
-      </w:r>
-      <w:r>
-        <w:t xml:space="preserve"> </w:t>
-      </w:r>
-      <w:r>
-        <w:t xml:space="preserve">validity audit can fail in its own characteristic ways [49],</w:t>
+        <w:t xml:space="preserve">pipeline can lose validity stage by stage [50], because a</w:t>
+      </w:r>
+      <w:r>
+        <w:t xml:space="preserve"> </w:t>
+      </w:r>
+      <w:r>
+        <w:t xml:space="preserve">validity audit can fail in its own characteristic ways [51],</w:t>
       </w:r>
       <w:r>
         <w:t xml:space="preserve"> </w:t>
@@ -4984,7 +5096,7 @@
         <w:t xml:space="preserve"> </w:t>
       </w:r>
       <w:r>
-        <w:t xml:space="preserve">systems learn from [50].</w:t>
+        <w:t xml:space="preserve">systems learn from [52].</w:t>
       </w:r>
     </w:p>
     <w:bookmarkStart w:id="51" w:name="executed-instrument-blocks"/>
@@ -5067,7 +5179,7 @@
         <w:t xml:space="preserve"> </w:t>
       </w:r>
       <w:r>
-        <w:t xml:space="preserve">planted-shortcut style [51] falsified it: sentences that named</w:t>
+        <w:t xml:space="preserve">planted-shortcut style [53] falsified it: sentences that named</w:t>
       </w:r>
       <w:r>
         <w:t xml:space="preserve"> </w:t>
@@ -5180,7 +5292,7 @@
         <w:t xml:space="preserve"> </w:t>
       </w:r>
       <w:r>
-        <w:t xml:space="preserve">[52].</w:t>
+        <w:t xml:space="preserve">[54].</w:t>
       </w:r>
     </w:p>
     <w:p>
@@ -5200,7 +5312,7 @@
         <w:t xml:space="preserve"> </w:t>
       </w:r>
       <w:r>
-        <w:t xml:space="preserve">retrieved span, following grounded checklist scoring [53].</w:t>
+        <w:t xml:space="preserve">retrieved span, following grounded checklist scoring [55].</w:t>
       </w:r>
       <w:r>
         <w:t xml:space="preserve"> </w:t>
@@ -5258,7 +5370,7 @@
         <w:t xml:space="preserve"> </w:t>
       </w:r>
       <w:r>
-        <w:t xml:space="preserve">is the load-bearing property here, not score magnitude [54].</w:t>
+        <w:t xml:space="preserve">is the load-bearing property here, not score magnitude [56].</w:t>
       </w:r>
     </w:p>
     <w:bookmarkEnd w:id="52"/>
@@ -5468,13 +5580,13 @@
         <w:t xml:space="preserve"> </w:t>
       </w:r>
       <w:r>
-        <w:t xml:space="preserve">confident error [55], and judge validation that rests on</w:t>
-      </w:r>
-      <w:r>
-        <w:t xml:space="preserve"> </w:t>
-      </w:r>
-      <w:r>
-        <w:t xml:space="preserve">uncorrected agreement does not establish validity [56].</w:t>
+        <w:t xml:space="preserve">confident error [57], and judge validation that rests on</w:t>
+      </w:r>
+      <w:r>
+        <w:t xml:space="preserve"> </w:t>
+      </w:r>
+      <w:r>
+        <w:t xml:space="preserve">uncorrected agreement does not establish validity [58].</w:t>
       </w:r>
       <w:r>
         <w:t xml:space="preserve"> </w:t>
@@ -5719,7 +5831,7 @@
         <w:t xml:space="preserve"> </w:t>
       </w:r>
       <w:r>
-        <w:t xml:space="preserve">experiments [57]. The pilot tasks are development data and are</w:t>
+        <w:t xml:space="preserve">experiments [59]. The pilot tasks are development data and are</w:t>
       </w:r>
       <w:r>
         <w:t xml:space="preserve"> </w:t>
@@ -6371,7 +6483,7 @@
         <w:t xml:space="preserve"> </w:t>
       </w:r>
       <w:r>
-        <w:t xml:space="preserve">its realisation [58]. Both conditions vary substantially, which is</w:t>
+        <w:t xml:space="preserve">its realisation [60]. Both conditions vary substantially, which is</w:t>
       </w:r>
       <w:r>
         <w:t xml:space="preserve"> </w:t>
@@ -6383,13 +6495,13 @@
         <w:t xml:space="preserve"> </w:t>
       </w:r>
       <w:r>
-        <w:t xml:space="preserve">tasks, tools, and environment [59] and that model outputs are not</w:t>
-      </w:r>
-      <w:r>
-        <w:t xml:space="preserve"> </w:t>
-      </w:r>
-      <w:r>
-        <w:t xml:space="preserve">deterministic for a fixed prompt [60]. And dollar cost is excluded</w:t>
+        <w:t xml:space="preserve">tasks, tools, and environment [61] and that model outputs are not</w:t>
+      </w:r>
+      <w:r>
+        <w:t xml:space="preserve"> </w:t>
+      </w:r>
+      <w:r>
+        <w:t xml:space="preserve">deterministic for a fixed prompt [62]. And dollar cost is excluded</w:t>
       </w:r>
       <w:r>
         <w:t xml:space="preserve"> </w:t>
@@ -6401,31 +6513,31 @@
         <w:t xml:space="preserve"> </w:t>
       </w:r>
       <w:r>
-        <w:t xml:space="preserve">[61], while provider totals can conceal different accounting</w:t>
-      </w:r>
-      <w:r>
-        <w:t xml:space="preserve"> </w:t>
-      </w:r>
-      <w:r>
-        <w:t xml:space="preserve">[62]; cost belongs beside the endpoint rather than behind it</w:t>
-      </w:r>
-      <w:r>
-        <w:t xml:space="preserve"> </w:t>
-      </w:r>
-      <w:r>
-        <w:t xml:space="preserve">[63], and any future effect claim from this design must be</w:t>
-      </w:r>
-      <w:r>
-        <w:t xml:space="preserve"> </w:t>
-      </w:r>
-      <w:r>
-        <w:t xml:space="preserve">budget-matched rather than merely condition-matched [64], since</w:t>
-      </w:r>
-      <w:r>
-        <w:t xml:space="preserve"> </w:t>
-      </w:r>
-      <w:r>
-        <w:t xml:space="preserve">agent cost is carried differently by its components [65].</w:t>
+        <w:t xml:space="preserve">[63], while provider totals can conceal different accounting</w:t>
+      </w:r>
+      <w:r>
+        <w:t xml:space="preserve"> </w:t>
+      </w:r>
+      <w:r>
+        <w:t xml:space="preserve">[64]; cost belongs beside the endpoint rather than behind it</w:t>
+      </w:r>
+      <w:r>
+        <w:t xml:space="preserve"> </w:t>
+      </w:r>
+      <w:r>
+        <w:t xml:space="preserve">[65], and any future effect claim from this design must be</w:t>
+      </w:r>
+      <w:r>
+        <w:t xml:space="preserve"> </w:t>
+      </w:r>
+      <w:r>
+        <w:t xml:space="preserve">budget-matched rather than merely condition-matched [66], since</w:t>
+      </w:r>
+      <w:r>
+        <w:t xml:space="preserve"> </w:t>
+      </w:r>
+      <w:r>
+        <w:t xml:space="preserve">agent cost is carried differently by its components [67].</w:t>
       </w:r>
     </w:p>
     <w:bookmarkEnd w:id="58"/>
@@ -7144,13 +7256,13 @@
         <w:t xml:space="preserve"> </w:t>
       </w:r>
       <w:r>
-        <w:t xml:space="preserve">problems for small models [66], and agreement can be high while the</w:t>
-      </w:r>
-      <w:r>
-        <w:t xml:space="preserve"> </w:t>
-      </w:r>
-      <w:r>
-        <w:t xml:space="preserve">answer is wrong [67]. The rule was applied precisely to the hardest</w:t>
+        <w:t xml:space="preserve">problems for small models [68], and agreement can be high while the</w:t>
+      </w:r>
+      <w:r>
+        <w:t xml:space="preserve"> </w:t>
+      </w:r>
+      <w:r>
+        <w:t xml:space="preserve">answer is wrong [69]. The rule was applied precisely to the hardest</w:t>
       </w:r>
       <w:r>
         <w:t xml:space="preserve"> </w:t>
@@ -7420,7 +7532,7 @@
         <w:t xml:space="preserve"> </w:t>
       </w:r>
       <w:r>
-        <w:t xml:space="preserve">away [68].</w:t>
+        <w:t xml:space="preserve">away [70].</w:t>
       </w:r>
     </w:p>
     <w:p>
@@ -7470,7 +7582,7 @@
         <w:t xml:space="preserve"> </w:t>
       </w:r>
       <w:r>
-        <w:t xml:space="preserve">failing to reproduce [69]: coverage counts only an exactly</w:t>
+        <w:t xml:space="preserve">failing to reproduce [71]: coverage counts only an exactly</w:t>
       </w:r>
       <w:r>
         <w:t xml:space="preserve"> </w:t>
@@ -7584,7 +7696,7 @@
         <w:t xml:space="preserve"> </w:t>
       </w:r>
       <w:r>
-        <w:t xml:space="preserve">[70], and its limit is stated: a re-fetch depends on the upstream</w:t>
+        <w:t xml:space="preserve">[72], and its limit is stated: a re-fetch depends on the upstream</w:t>
       </w:r>
       <w:r>
         <w:t xml:space="preserve"> </w:t>
@@ -7658,7 +7770,7 @@
         <w:t xml:space="preserve"> </w:t>
       </w:r>
       <w:r>
-        <w:t xml:space="preserve">recorded evidence source [71]. Three failing-first mutations all</w:t>
+        <w:t xml:space="preserve">recorded evidence source [73]. Three failing-first mutations all</w:t>
       </w:r>
       <w:r>
         <w:t xml:space="preserve"> </w:t>
@@ -7834,7 +7946,7 @@
         <w:t xml:space="preserve"> </w:t>
       </w:r>
       <w:r>
-        <w:t xml:space="preserve">[72]. Design constants and configuration ceilings remain</w:t>
+        <w:t xml:space="preserve">[74]. Design constants and configuration ceilings remain</w:t>
       </w:r>
       <w:r>
         <w:t xml:space="preserve"> </w:t>
@@ -7852,13 +7964,13 @@
         <w:t xml:space="preserve"> </w:t>
       </w:r>
       <w:r>
-        <w:t xml:space="preserve">to re-verify everything [73]. Without such binding a reported number carries no indication of how it was</w:t>
-      </w:r>
-      <w:r>
-        <w:t xml:space="preserve"> </w:t>
-      </w:r>
-      <w:r>
-        <w:t xml:space="preserve">produced [74].</w:t>
+        <w:t xml:space="preserve">to re-verify everything [75]. Without such binding a reported number carries no indication of how it was</w:t>
+      </w:r>
+      <w:r>
+        <w:t xml:space="preserve"> </w:t>
+      </w:r>
+      <w:r>
+        <w:t xml:space="preserve">produced [76].</w:t>
       </w:r>
     </w:p>
     <w:p>
@@ -7896,7 +8008,7 @@
         <w:t xml:space="preserve"> </w:t>
       </w:r>
       <w:r>
-        <w:t xml:space="preserve">can come from the item or from the rater [75], and this</w:t>
+        <w:t xml:space="preserve">can come from the item or from the rater [77], and this</w:t>
       </w:r>
       <w:r>
         <w:t xml:space="preserve"> </w:t>
@@ -7914,7 +8026,7 @@
         <w:t xml:space="preserve"> </w:t>
       </w:r>
       <w:r>
-        <w:t xml:space="preserve">[76]. Three limits are attached. Replay is not correctness, since no human</w:t>
+        <w:t xml:space="preserve">[78]. Three limits are attached. Replay is not correctness, since no human</w:t>
       </w:r>
       <w:r>
         <w:t xml:space="preserve"> </w:t>
@@ -7932,7 +8044,7 @@
         <w:t xml:space="preserve"> </w:t>
       </w:r>
       <w:r>
-        <w:t xml:space="preserve">[77], which is why no cause is assigned. And a fixed</w:t>
+        <w:t xml:space="preserve">[79], which is why no cause is assigned. And a fixed</w:t>
       </w:r>
       <w:r>
         <w:t xml:space="preserve"> </w:t>
@@ -7944,7 +8056,7 @@
         <w:t xml:space="preserve"> </w:t>
       </w:r>
       <w:r>
-        <w:t xml:space="preserve">[78], so the low band is treated as unusable rather than as noisy but</w:t>
+        <w:t xml:space="preserve">[80], so the low band is treated as unusable rather than as noisy but</w:t>
       </w:r>
       <w:r>
         <w:t xml:space="preserve"> </w:t>
@@ -7962,13 +8074,13 @@
         <w:t xml:space="preserve"> </w:t>
       </w:r>
       <w:r>
-        <w:t xml:space="preserve">[79], and replaying historical claims from a frozen collection</w:t>
-      </w:r>
-      <w:r>
-        <w:t xml:space="preserve"> </w:t>
-      </w:r>
-      <w:r>
-        <w:t xml:space="preserve">commonly stops before the claim is reachable [80].</w:t>
+        <w:t xml:space="preserve">[81], and replaying historical claims from a frozen collection</w:t>
+      </w:r>
+      <w:r>
+        <w:t xml:space="preserve"> </w:t>
+      </w:r>
+      <w:r>
+        <w:t xml:space="preserve">commonly stops before the claim is reachable [82].</w:t>
       </w:r>
     </w:p>
     <w:p>
@@ -8162,7 +8274,7 @@
         <w:t xml:space="preserve"> </w:t>
       </w:r>
       <w:r>
-        <w:t xml:space="preserve">[81], so its suite asserts the deterministic shell around the</w:t>
+        <w:t xml:space="preserve">[83], so its suite asserts the deterministic shell around the</w:t>
       </w:r>
       <w:r>
         <w:t xml:space="preserve"> </w:t>
@@ -8180,7 +8292,7 @@
         <w:t xml:space="preserve"> </w:t>
       </w:r>
       <w:r>
-        <w:t xml:space="preserve">[82].</w:t>
+        <w:t xml:space="preserve">[84].</w:t>
       </w:r>
     </w:p>
     <w:p>
@@ -8200,7 +8312,7 @@
         <w:t xml:space="preserve"> </w:t>
       </w:r>
       <w:r>
-        <w:t xml:space="preserve">and expectation together [83], which is exactly how the cost</w:t>
+        <w:t xml:space="preserve">and expectation together [85], which is exactly how the cost</w:t>
       </w:r>
       <w:r>
         <w:t xml:space="preserve"> </w:t>
@@ -8212,7 +8324,7 @@
         <w:t xml:space="preserve"> </w:t>
       </w:r>
       <w:r>
-        <w:t xml:space="preserve">documented behaviour unvalidated [84], and silent measurement</w:t>
+        <w:t xml:space="preserve">documented behaviour unvalidated [86], and silent measurement</w:t>
       </w:r>
       <w:r>
         <w:t xml:space="preserve"> </w:t>
@@ -8224,7 +8336,7 @@
         <w:t xml:space="preserve"> </w:t>
       </w:r>
       <w:r>
-        <w:t xml:space="preserve">edge case [85]. Two limits are recorded. Catching seventeen</w:t>
+        <w:t xml:space="preserve">edge case [87]. Two limits are recorded. Catching seventeen</w:t>
       </w:r>
       <w:r>
         <w:t xml:space="preserve"> </w:t>
@@ -8290,7 +8402,7 @@
         <w:t xml:space="preserve"> </w:t>
       </w:r>
       <w:r>
-        <w:t xml:space="preserve">lists are read [86]. Measured against the ledger digest recorded in</w:t>
+        <w:t xml:space="preserve">lists are read [88]. Measured against the ledger digest recorded in</w:t>
       </w:r>
       <w:r>
         <w:t xml:space="preserve"> </w:t>
@@ -8417,7 +8529,7 @@
         <w:t xml:space="preserve"> </w:t>
       </w:r>
       <w:r>
-        <w:t xml:space="preserve">scores calls for [87], and it is also the boundary of what</w:t>
+        <w:t xml:space="preserve">scores calls for [89], and it is also the boundary of what</w:t>
       </w:r>
       <w:r>
         <w:t xml:space="preserve"> </w:t>
@@ -8429,7 +8541,7 @@
         <w:t xml:space="preserve"> </w:t>
       </w:r>
       <w:r>
-        <w:t xml:space="preserve">substitutes for understanding rather than supplying it [88].</w:t>
+        <w:t xml:space="preserve">substitutes for understanding rather than supplying it [90].</w:t>
       </w:r>
     </w:p>
     <w:bookmarkEnd w:id="61"/>
@@ -8578,7 +8690,7 @@
         <w:t xml:space="preserve"> </w:t>
       </w:r>
       <w:r>
-        <w:t xml:space="preserve">single terminal score [89].</w:t>
+        <w:t xml:space="preserve">single terminal score [91].</w:t>
       </w:r>
     </w:p>
     <w:p>
@@ -8660,7 +8772,7 @@
         <w:t xml:space="preserve"> </w:t>
       </w:r>
       <w:r>
-        <w:t xml:space="preserve">[90]; this project spent 192 model calls to verify 32</w:t>
+        <w:t xml:space="preserve">[92]; this project spent 192 model calls to verify 32</w:t>
       </w:r>
       <w:r>
         <w:t xml:space="preserve"> </w:t>
@@ -10900,6 +11012,46 @@
       </w:r>
       <w:r>
         <w:t xml:space="preserve">arXiv:2603.18829v10, 2026.</w:t>
+      </w:r>
+    </w:p>
+    <w:p>
+      <w:pPr>
+        <w:pStyle w:val="BodyText"/>
+      </w:pPr>
+      <w:r>
+        <w:t xml:space="preserve">J. Huang et al.,</w:t>
+      </w:r>
+      <w:r>
+        <w:t xml:space="preserve"> </w:t>
+      </w:r>
+      <w:r>
+        <w:t xml:space="preserve">“From Final Artifacts to Trajectories: Retrospective Process Supervision,”</w:t>
+      </w:r>
+      <w:r>
+        <w:t xml:space="preserve"> </w:t>
+      </w:r>
+      <w:r>
+        <w:t xml:space="preserve">arXiv:2608.30461v1, 2026.</w:t>
+      </w:r>
+    </w:p>
+    <w:p>
+      <w:pPr>
+        <w:pStyle w:val="BodyText"/>
+      </w:pPr>
+      <w:r>
+        <w:t xml:space="preserve">W. Pan et al.,</w:t>
+      </w:r>
+      <w:r>
+        <w:t xml:space="preserve"> </w:t>
+      </w:r>
+      <w:r>
+        <w:t xml:space="preserve">“Evolving Agents in the Dark: Retrospective Harness Optimization,”</w:t>
+      </w:r>
+      <w:r>
+        <w:t xml:space="preserve"> </w:t>
+      </w:r>
+      <w:r>
+        <w:t xml:space="preserve">arXiv:2606.05922v3, 2026.</w:t>
       </w:r>
     </w:p>
     <w:p>

</xml_diff>

<commit_message>
feat(paper): report budget completion with denominators and intervals
</commit_message>
<xml_diff>
--- a/paper/word/graduation-thesis.docx
+++ b/paper/word/graduation-thesis.docx
@@ -5046,7 +5046,7 @@
     <w:bookmarkEnd w:id="48"/>
     <w:bookmarkEnd w:id="49"/>
     <w:bookmarkEnd w:id="50"/>
-    <w:bookmarkStart w:id="62" w:name="experimental-results"/>
+    <w:bookmarkStart w:id="64" w:name="experimental-results"/>
     <w:p>
       <w:pPr>
         <w:pStyle w:val="Heading1"/>
@@ -8364,12 +8364,478 @@
       </w:r>
     </w:p>
     <w:bookmarkEnd w:id="60"/>
-    <w:bookmarkStart w:id="61" w:name="X782ae78defcb34d28636704b3c8bd73b8faa49a"/>
+    <w:bookmarkStart w:id="62" w:name="X78839bdfff622f54aa2372604107e6f7ca56662"/>
     <w:p>
       <w:pPr>
         <w:pStyle w:val="Heading2"/>
       </w:pPr>
       <w:r>
+        <w:t xml:space="preserve">Budget completion in the first admissible block</w:t>
+      </w:r>
+    </w:p>
+    <w:p>
+      <w:pPr>
+        <w:pStyle w:val="FirstParagraph"/>
+      </w:pPr>
+      <w:r>
+        <w:t xml:space="preserve">Sixteen episodes were executed on two unburned tasks, four per condition, in a mode that</w:t>
+      </w:r>
+      <w:r>
+        <w:t xml:space="preserve"> </w:t>
+      </w:r>
+      <w:r>
+        <w:t xml:space="preserve">measures usage. Fifteen were admissible. The one refusal exceeded the declared call</w:t>
+      </w:r>
+      <w:r>
+        <w:t xml:space="preserve"> </w:t>
+      </w:r>
+      <w:r>
+        <w:t xml:space="preserve">ceiling at</w:t>
+      </w:r>
+      <w:r>
+        <w:t xml:space="preserve"> </w:t>
+      </w:r>
+      <m:oMath>
+        <m:r>
+          <m:t>18</m:t>
+        </m:r>
+      </m:oMath>
+      <w:r>
+        <w:t xml:space="preserve"> </w:t>
+      </w:r>
+      <w:r>
+        <w:t xml:space="preserve">against</w:t>
+      </w:r>
+      <w:r>
+        <w:t xml:space="preserve"> </w:t>
+      </w:r>
+      <m:oMath>
+        <m:r>
+          <m:t>16</m:t>
+        </m:r>
+      </m:oMath>
+      <w:r>
+        <w:t xml:space="preserve">, and it fell in the full condition, which used the most</w:t>
+      </w:r>
+      <w:r>
+        <w:t xml:space="preserve"> </w:t>
+      </w:r>
+      <w:r>
+        <w:t xml:space="preserve">calls in every observation.</w:t>
+      </w:r>
+    </w:p>
+    <w:p>
+      <w:pPr>
+        <w:pStyle w:val="BodyText"/>
+      </w:pPr>
+      <w:r>
+        <w:t xml:space="preserve">That refusal is reported as an outcome rather than removed as missing data. A ceiling</w:t>
+      </w:r>
+      <w:r>
+        <w:t xml:space="preserve"> </w:t>
+      </w:r>
+      <w:r>
+        <w:t xml:space="preserve">that binds asymmetrically deletes episodes non-randomly, so analysing only the survivors</w:t>
+      </w:r>
+      <w:r>
+        <w:t xml:space="preserve"> </w:t>
+      </w:r>
+      <w:r>
+        <w:t xml:space="preserve">would credit a condition for what it finished while hiding what it could not. Budget</w:t>
+      </w:r>
+      <w:r>
+        <w:t xml:space="preserve"> </w:t>
+      </w:r>
+      <w:r>
+        <w:t xml:space="preserve">completion is therefore a declared secondary outcome, computed by the same admission path</w:t>
+      </w:r>
+      <w:r>
+        <w:t xml:space="preserve"> </w:t>
+      </w:r>
+      <w:r>
+        <w:t xml:space="preserve">that decides whether an episode may be scored at all, and reported beside the quality</w:t>
+      </w:r>
+      <w:r>
+        <w:t xml:space="preserve"> </w:t>
+      </w:r>
+      <w:r>
+        <w:t xml:space="preserve">endpoint rather than merged with it.</w:t>
+      </w:r>
+    </w:p>
+    <w:bookmarkStart w:id="61" w:name="tab:budget"/>
+    <w:p>
+      <w:pPr>
+        <w:pStyle w:val="TableCaption"/>
+      </w:pPr>
+      <w:r>
+        <w:t xml:space="preserve">Budget completion by condition in the first admissible block. Intervals are</w:t>
+      </w:r>
+      <w:r>
+        <w:t xml:space="preserve"> </w:t>
+      </w:r>
+      <w:r>
+        <w:t xml:space="preserve">Wilson</w:t>
+      </w:r>
+      <w:r>
+        <w:t xml:space="preserve"> </w:t>
+      </w:r>
+      <m:oMath>
+        <m:r>
+          <m:t>95</m:t>
+        </m:r>
+        <m:r>
+          <m:rPr>
+            <m:sty m:val="p"/>
+          </m:rPr>
+          <m:t>%</m:t>
+        </m:r>
+      </m:oMath>
+      <w:r>
+        <w:t xml:space="preserve"> </w:t>
+      </w:r>
+      <w:r>
+        <w:t xml:space="preserve">intervals on four episodes per condition.</w:t>
+      </w:r>
+    </w:p>
+    <w:tbl>
+      <w:tblPr>
+        <w:tblStyle w:val="Table"/>
+        <w:tblW w:type="auto" w:w="0"/>
+        <w:tblLook w:firstRow="1" w:lastRow="0" w:firstColumn="0" w:lastColumn="0" w:noHBand="0" w:noVBand="0" w:val="0020"/>
+        <w:tblCaption w:val="Budget completion by condition in the first admissible block. Intervals are Wilson 95\% intervals on four episodes per condition."/>
+      </w:tblPr>
+      <w:tblGrid>
+        <w:gridCol w:w="1980"/>
+        <w:gridCol w:w="1980"/>
+        <w:gridCol w:w="1980"/>
+        <w:gridCol w:w="1980"/>
+      </w:tblGrid>
+      <w:tr>
+        <w:trPr>
+          <w:tblHeader w:val="on"/>
+        </w:trPr>
+        <w:tc>
+          <w:tcPr/>
+          <w:p>
+            <w:pPr>
+              <w:pStyle w:val="Compact"/>
+              <w:jc w:val="left"/>
+            </w:pPr>
+            <w:r>
+              <w:t xml:space="preserve">Condition</w:t>
+            </w:r>
+          </w:p>
+        </w:tc>
+        <w:tc>
+          <w:tcPr/>
+          <w:p>
+            <w:pPr>
+              <w:pStyle w:val="Compact"/>
+              <w:jc w:val="right"/>
+            </w:pPr>
+            <w:r>
+              <w:t xml:space="preserve">Completed</w:t>
+            </w:r>
+          </w:p>
+        </w:tc>
+        <w:tc>
+          <w:tcPr/>
+          <w:p>
+            <w:pPr>
+              <w:pStyle w:val="Compact"/>
+              <w:jc w:val="right"/>
+            </w:pPr>
+            <w:r>
+              <w:t xml:space="preserve">Episodes</w:t>
+            </w:r>
+          </w:p>
+        </w:tc>
+        <w:tc>
+          <w:tcPr/>
+          <w:p>
+            <w:pPr>
+              <w:pStyle w:val="Compact"/>
+              <w:jc w:val="left"/>
+            </w:pPr>
+            <w:r>
+              <w:t xml:space="preserve">Completion rate (95% interval)</w:t>
+            </w:r>
+          </w:p>
+        </w:tc>
+      </w:tr>
+      <w:tr>
+        <w:tc>
+          <w:tcPr/>
+          <w:p>
+            <w:pPr>
+              <w:pStyle w:val="Compact"/>
+              <w:jc w:val="left"/>
+            </w:pPr>
+            <w:r>
+              <w:t xml:space="preserve">Minimal</w:t>
+            </w:r>
+          </w:p>
+        </w:tc>
+        <w:tc>
+          <w:tcPr/>
+          <w:p>
+            <w:pPr>
+              <w:pStyle w:val="Compact"/>
+              <w:jc w:val="right"/>
+            </w:pPr>
+            <w:r>
+              <w:t xml:space="preserve">4</w:t>
+            </w:r>
+          </w:p>
+        </w:tc>
+        <w:tc>
+          <w:tcPr/>
+          <w:p>
+            <w:pPr>
+              <w:pStyle w:val="Compact"/>
+              <w:jc w:val="right"/>
+            </w:pPr>
+            <w:r>
+              <w:t xml:space="preserve">4</w:t>
+            </w:r>
+          </w:p>
+        </w:tc>
+        <w:tc>
+          <w:tcPr/>
+          <w:p>
+            <w:pPr>
+              <w:pStyle w:val="Compact"/>
+              <w:jc w:val="left"/>
+            </w:pPr>
+            <w:r>
+              <w:t xml:space="preserve">1.000</w:t>
+            </w:r>
+          </w:p>
+        </w:tc>
+      </w:tr>
+      <w:tr>
+        <w:tc>
+          <w:tcPr/>
+          <w:p>
+            <w:pPr>
+              <w:pStyle w:val="Compact"/>
+              <w:jc w:val="left"/>
+            </w:pPr>
+            <w:r>
+              <w:t xml:space="preserve">Retrieval only</w:t>
+            </w:r>
+          </w:p>
+        </w:tc>
+        <w:tc>
+          <w:tcPr/>
+          <w:p>
+            <w:pPr>
+              <w:pStyle w:val="Compact"/>
+              <w:jc w:val="right"/>
+            </w:pPr>
+            <w:r>
+              <w:t xml:space="preserve">4</w:t>
+            </w:r>
+          </w:p>
+        </w:tc>
+        <w:tc>
+          <w:tcPr/>
+          <w:p>
+            <w:pPr>
+              <w:pStyle w:val="Compact"/>
+              <w:jc w:val="right"/>
+            </w:pPr>
+            <w:r>
+              <w:t xml:space="preserve">4</w:t>
+            </w:r>
+          </w:p>
+        </w:tc>
+        <w:tc>
+          <w:tcPr/>
+          <w:p>
+            <w:pPr>
+              <w:pStyle w:val="Compact"/>
+              <w:jc w:val="left"/>
+            </w:pPr>
+            <w:r>
+              <w:t xml:space="preserve">1.000</w:t>
+            </w:r>
+          </w:p>
+        </w:tc>
+      </w:tr>
+      <w:tr>
+        <w:tc>
+          <w:tcPr/>
+          <w:p>
+            <w:pPr>
+              <w:pStyle w:val="Compact"/>
+              <w:jc w:val="left"/>
+            </w:pPr>
+            <w:r>
+              <w:t xml:space="preserve">Scaffold only</w:t>
+            </w:r>
+          </w:p>
+        </w:tc>
+        <w:tc>
+          <w:tcPr/>
+          <w:p>
+            <w:pPr>
+              <w:pStyle w:val="Compact"/>
+              <w:jc w:val="right"/>
+            </w:pPr>
+            <w:r>
+              <w:t xml:space="preserve">4</w:t>
+            </w:r>
+          </w:p>
+        </w:tc>
+        <w:tc>
+          <w:tcPr/>
+          <w:p>
+            <w:pPr>
+              <w:pStyle w:val="Compact"/>
+              <w:jc w:val="right"/>
+            </w:pPr>
+            <w:r>
+              <w:t xml:space="preserve">4</w:t>
+            </w:r>
+          </w:p>
+        </w:tc>
+        <w:tc>
+          <w:tcPr/>
+          <w:p>
+            <w:pPr>
+              <w:pStyle w:val="Compact"/>
+              <w:jc w:val="left"/>
+            </w:pPr>
+            <w:r>
+              <w:t xml:space="preserve">1.000</w:t>
+            </w:r>
+          </w:p>
+        </w:tc>
+      </w:tr>
+      <w:tr>
+        <w:tc>
+          <w:tcPr/>
+          <w:p>
+            <w:pPr>
+              <w:pStyle w:val="Compact"/>
+              <w:jc w:val="left"/>
+            </w:pPr>
+            <w:r>
+              <w:t xml:space="preserve">Scaffold + retrieval</w:t>
+            </w:r>
+          </w:p>
+        </w:tc>
+        <w:tc>
+          <w:tcPr/>
+          <w:p>
+            <w:pPr>
+              <w:pStyle w:val="Compact"/>
+              <w:jc w:val="right"/>
+            </w:pPr>
+            <w:r>
+              <w:t xml:space="preserve">3</w:t>
+            </w:r>
+          </w:p>
+        </w:tc>
+        <w:tc>
+          <w:tcPr/>
+          <w:p>
+            <w:pPr>
+              <w:pStyle w:val="Compact"/>
+              <w:jc w:val="right"/>
+            </w:pPr>
+            <w:r>
+              <w:t xml:space="preserve">4</w:t>
+            </w:r>
+          </w:p>
+        </w:tc>
+        <w:tc>
+          <w:tcPr/>
+          <w:p>
+            <w:pPr>
+              <w:pStyle w:val="Compact"/>
+              <w:jc w:val="left"/>
+            </w:pPr>
+            <w:r>
+              <w:t xml:space="preserve">0.750</w:t>
+            </w:r>
+          </w:p>
+        </w:tc>
+      </w:tr>
+    </w:tbl>
+    <w:bookmarkEnd w:id="61"/>
+    <w:p>
+      <w:pPr>
+        <w:pStyle w:val="BodyText"/>
+      </w:pPr>
+      <w:r>
+        <w:t xml:space="preserve">The table is reported with its denominators because the rates alone would invite a</w:t>
+      </w:r>
+      <w:r>
+        <w:t xml:space="preserve"> </w:t>
+      </w:r>
+      <w:r>
+        <w:t xml:space="preserve">conclusion the data cannot carry. Every interval spans more than half the available</w:t>
+      </w:r>
+      <w:r>
+        <w:t xml:space="preserve"> </w:t>
+      </w:r>
+      <w:r>
+        <w:t xml:space="preserve">range, the widest is</w:t>
+      </w:r>
+      <w:r>
+        <w:t xml:space="preserve"> </w:t>
+      </w:r>
+      <m:oMath>
+        <m:r>
+          <m:t>0.653</m:t>
+        </m:r>
+      </m:oMath>
+      <w:r>
+        <w:t xml:space="preserve"> </w:t>
+      </w:r>
+      <w:r>
+        <w:t xml:space="preserve">wide, and all four overlap. Four episodes per condition can</w:t>
+      </w:r>
+      <w:r>
+        <w:t xml:space="preserve"> </w:t>
+      </w:r>
+      <w:r>
+        <w:t xml:space="preserve">show that a ceiling bound and where it bound; they cannot show that completion differs by</w:t>
+      </w:r>
+      <w:r>
+        <w:t xml:space="preserve"> </w:t>
+      </w:r>
+      <w:r>
+        <w:t xml:space="preserve">condition. Small screening blocks of exactly this kind can produce worse decisions than</w:t>
+      </w:r>
+      <w:r>
+        <w:t xml:space="preserve"> </w:t>
+      </w:r>
+      <w:r>
+        <w:t xml:space="preserve">no block at all when read as though they had settled the question</w:t>
+      </w:r>
+      <w:r>
+        <w:t xml:space="preserve"> </w:t>
+      </w:r>
+      <w:r>
+        <w:t xml:space="preserve">[88], and the honest statement here is that the asymmetry is a</w:t>
+      </w:r>
+      <w:r>
+        <w:t xml:space="preserve"> </w:t>
+      </w:r>
+      <w:r>
+        <w:t xml:space="preserve">reason to keep measuring rather than a result.</w:t>
+      </w:r>
+    </w:p>
+    <w:bookmarkEnd w:id="62"/>
+    <w:bookmarkStart w:id="63" w:name="X782ae78defcb34d28636704b3c8bd73b8faa49a"/>
+    <w:p>
+      <w:pPr>
+        <w:pStyle w:val="Heading2"/>
+      </w:pPr>
+      <w:r>
         <w:t xml:space="preserve">A census of the project’s own decision record</w:t>
       </w:r>
     </w:p>
@@ -8402,7 +8868,7 @@
         <w:t xml:space="preserve"> </w:t>
       </w:r>
       <w:r>
-        <w:t xml:space="preserve">lists are read [88]. Measured against the ledger digest recorded in</w:t>
+        <w:t xml:space="preserve">lists are read [89]. Measured against the ledger digest recorded in</w:t>
       </w:r>
       <w:r>
         <w:t xml:space="preserve"> </w:t>
@@ -8529,7 +8995,7 @@
         <w:t xml:space="preserve"> </w:t>
       </w:r>
       <w:r>
-        <w:t xml:space="preserve">scores calls for [89], and it is also the boundary of what</w:t>
+        <w:t xml:space="preserve">scores calls for [90], and it is also the boundary of what</w:t>
       </w:r>
       <w:r>
         <w:t xml:space="preserve"> </w:t>
@@ -8541,12 +9007,12 @@
         <w:t xml:space="preserve"> </w:t>
       </w:r>
       <w:r>
-        <w:t xml:space="preserve">substitutes for understanding rather than supplying it [90].</w:t>
-      </w:r>
-    </w:p>
-    <w:bookmarkEnd w:id="61"/>
-    <w:bookmarkEnd w:id="62"/>
-    <w:bookmarkStart w:id="120" w:name="conclusions"/>
+        <w:t xml:space="preserve">substitutes for understanding rather than supplying it [91].</w:t>
+      </w:r>
+    </w:p>
+    <w:bookmarkEnd w:id="63"/>
+    <w:bookmarkEnd w:id="64"/>
+    <w:bookmarkStart w:id="122" w:name="conclusions"/>
     <w:p>
       <w:pPr>
         <w:pStyle w:val="Heading1"/>
@@ -8690,7 +9156,7 @@
         <w:t xml:space="preserve"> </w:t>
       </w:r>
       <w:r>
-        <w:t xml:space="preserve">single terminal score [91].</w:t>
+        <w:t xml:space="preserve">single terminal score [92].</w:t>
       </w:r>
     </w:p>
     <w:p>
@@ -8772,7 +9238,7 @@
         <w:t xml:space="preserve"> </w:t>
       </w:r>
       <w:r>
-        <w:t xml:space="preserve">[92]; this project spent 192 model calls to verify 32</w:t>
+        <w:t xml:space="preserve">[93]; this project spent 192 model calls to verify 32</w:t>
       </w:r>
       <w:r>
         <w:t xml:space="preserve"> </w:t>
@@ -8830,7 +9296,7 @@
       <w:r>
         <w:t xml:space="preserve"> </w:t>
       </w:r>
-      <w:hyperlink r:id="rId63">
+      <w:hyperlink r:id="rId65">
         <w:r>
           <w:rPr>
             <w:rStyle w:val="Hyperlink"/>
@@ -8877,7 +9343,7 @@
       <w:r>
         <w:t xml:space="preserve"> </w:t>
       </w:r>
-      <w:hyperlink r:id="rId64">
+      <w:hyperlink r:id="rId66">
         <w:r>
           <w:rPr>
             <w:rStyle w:val="Hyperlink"/>
@@ -8918,7 +9384,7 @@
       <w:r>
         <w:t xml:space="preserve"> </w:t>
       </w:r>
-      <w:hyperlink r:id="rId65">
+      <w:hyperlink r:id="rId67">
         <w:r>
           <w:rPr>
             <w:rStyle w:val="Hyperlink"/>
@@ -8971,7 +9437,7 @@
       <w:r>
         <w:t xml:space="preserve"> </w:t>
       </w:r>
-      <w:hyperlink r:id="rId66">
+      <w:hyperlink r:id="rId68">
         <w:r>
           <w:rPr>
             <w:rStyle w:val="Hyperlink"/>
@@ -9012,7 +9478,7 @@
       <w:r>
         <w:t xml:space="preserve"> </w:t>
       </w:r>
-      <w:hyperlink r:id="rId67">
+      <w:hyperlink r:id="rId69">
         <w:r>
           <w:rPr>
             <w:rStyle w:val="Hyperlink"/>
@@ -9053,7 +9519,7 @@
       <w:r>
         <w:t xml:space="preserve"> </w:t>
       </w:r>
-      <w:hyperlink r:id="rId68">
+      <w:hyperlink r:id="rId70">
         <w:r>
           <w:rPr>
             <w:rStyle w:val="Hyperlink"/>
@@ -9094,7 +9560,7 @@
       <w:r>
         <w:t xml:space="preserve"> </w:t>
       </w:r>
-      <w:hyperlink r:id="rId69">
+      <w:hyperlink r:id="rId71">
         <w:r>
           <w:rPr>
             <w:rStyle w:val="Hyperlink"/>
@@ -9135,7 +9601,7 @@
       <w:r>
         <w:t xml:space="preserve"> </w:t>
       </w:r>
-      <w:hyperlink r:id="rId70">
+      <w:hyperlink r:id="rId72">
         <w:r>
           <w:rPr>
             <w:rStyle w:val="Hyperlink"/>
@@ -9176,7 +9642,7 @@
       <w:r>
         <w:t xml:space="preserve"> </w:t>
       </w:r>
-      <w:hyperlink r:id="rId71">
+      <w:hyperlink r:id="rId73">
         <w:r>
           <w:rPr>
             <w:rStyle w:val="Hyperlink"/>
@@ -9223,7 +9689,7 @@
       <w:r>
         <w:t xml:space="preserve"> </w:t>
       </w:r>
-      <w:hyperlink r:id="rId72">
+      <w:hyperlink r:id="rId74">
         <w:r>
           <w:rPr>
             <w:rStyle w:val="Hyperlink"/>
@@ -9288,7 +9754,7 @@
       <w:r>
         <w:t xml:space="preserve"> </w:t>
       </w:r>
-      <w:hyperlink r:id="rId73">
+      <w:hyperlink r:id="rId75">
         <w:r>
           <w:rPr>
             <w:rStyle w:val="Hyperlink"/>
@@ -9329,7 +9795,7 @@
       <w:r>
         <w:t xml:space="preserve"> </w:t>
       </w:r>
-      <w:hyperlink r:id="rId74">
+      <w:hyperlink r:id="rId76">
         <w:r>
           <w:rPr>
             <w:rStyle w:val="Hyperlink"/>
@@ -9384,7 +9850,7 @@
       <w:r>
         <w:t xml:space="preserve"> </w:t>
       </w:r>
-      <w:hyperlink r:id="rId75">
+      <w:hyperlink r:id="rId77">
         <w:r>
           <w:rPr>
             <w:rStyle w:val="Hyperlink"/>
@@ -9431,7 +9897,7 @@
       <w:r>
         <w:t xml:space="preserve"> </w:t>
       </w:r>
-      <w:hyperlink r:id="rId76">
+      <w:hyperlink r:id="rId78">
         <w:r>
           <w:rPr>
             <w:rStyle w:val="Hyperlink"/>
@@ -9486,7 +9952,7 @@
       <w:r>
         <w:t xml:space="preserve"> </w:t>
       </w:r>
-      <w:hyperlink r:id="rId77">
+      <w:hyperlink r:id="rId79">
         <w:r>
           <w:rPr>
             <w:rStyle w:val="Hyperlink"/>
@@ -9541,7 +10007,7 @@
       <w:r>
         <w:t xml:space="preserve"> </w:t>
       </w:r>
-      <w:hyperlink r:id="rId78">
+      <w:hyperlink r:id="rId80">
         <w:r>
           <w:rPr>
             <w:rStyle w:val="Hyperlink"/>
@@ -9582,7 +10048,7 @@
       <w:r>
         <w:t xml:space="preserve"> </w:t>
       </w:r>
-      <w:hyperlink r:id="rId79">
+      <w:hyperlink r:id="rId81">
         <w:r>
           <w:rPr>
             <w:rStyle w:val="Hyperlink"/>
@@ -9623,7 +10089,7 @@
       <w:r>
         <w:t xml:space="preserve"> </w:t>
       </w:r>
-      <w:hyperlink r:id="rId80">
+      <w:hyperlink r:id="rId82">
         <w:r>
           <w:rPr>
             <w:rStyle w:val="Hyperlink"/>
@@ -9678,7 +10144,7 @@
       <w:r>
         <w:t xml:space="preserve"> </w:t>
       </w:r>
-      <w:hyperlink r:id="rId81">
+      <w:hyperlink r:id="rId83">
         <w:r>
           <w:rPr>
             <w:rStyle w:val="Hyperlink"/>
@@ -9733,7 +10199,7 @@
       <w:r>
         <w:t xml:space="preserve"> </w:t>
       </w:r>
-      <w:hyperlink r:id="rId82">
+      <w:hyperlink r:id="rId84">
         <w:r>
           <w:rPr>
             <w:rStyle w:val="Hyperlink"/>
@@ -9788,7 +10254,7 @@
       <w:r>
         <w:t xml:space="preserve"> </w:t>
       </w:r>
-      <w:hyperlink r:id="rId83">
+      <w:hyperlink r:id="rId85">
         <w:r>
           <w:rPr>
             <w:rStyle w:val="Hyperlink"/>
@@ -9843,7 +10309,7 @@
       <w:r>
         <w:t xml:space="preserve"> </w:t>
       </w:r>
-      <w:hyperlink r:id="rId84">
+      <w:hyperlink r:id="rId86">
         <w:r>
           <w:rPr>
             <w:rStyle w:val="Hyperlink"/>
@@ -9898,7 +10364,7 @@
       <w:r>
         <w:t xml:space="preserve"> </w:t>
       </w:r>
-      <w:hyperlink r:id="rId85">
+      <w:hyperlink r:id="rId87">
         <w:r>
           <w:rPr>
             <w:rStyle w:val="Hyperlink"/>
@@ -9953,7 +10419,7 @@
       <w:r>
         <w:t xml:space="preserve"> </w:t>
       </w:r>
-      <w:hyperlink r:id="rId86">
+      <w:hyperlink r:id="rId88">
         <w:r>
           <w:rPr>
             <w:rStyle w:val="Hyperlink"/>
@@ -9994,7 +10460,7 @@
       <w:r>
         <w:t xml:space="preserve"> </w:t>
       </w:r>
-      <w:hyperlink r:id="rId87">
+      <w:hyperlink r:id="rId89">
         <w:r>
           <w:rPr>
             <w:rStyle w:val="Hyperlink"/>
@@ -10035,7 +10501,7 @@
       <w:r>
         <w:t xml:space="preserve"> </w:t>
       </w:r>
-      <w:hyperlink r:id="rId88">
+      <w:hyperlink r:id="rId90">
         <w:r>
           <w:rPr>
             <w:rStyle w:val="Hyperlink"/>
@@ -10076,7 +10542,7 @@
       <w:r>
         <w:t xml:space="preserve"> </w:t>
       </w:r>
-      <w:hyperlink r:id="rId89">
+      <w:hyperlink r:id="rId91">
         <w:r>
           <w:rPr>
             <w:rStyle w:val="Hyperlink"/>
@@ -10131,7 +10597,7 @@
       <w:r>
         <w:t xml:space="preserve"> </w:t>
       </w:r>
-      <w:hyperlink r:id="rId90">
+      <w:hyperlink r:id="rId92">
         <w:r>
           <w:rPr>
             <w:rStyle w:val="Hyperlink"/>
@@ -10172,7 +10638,7 @@
       <w:r>
         <w:t xml:space="preserve"> </w:t>
       </w:r>
-      <w:hyperlink r:id="rId91">
+      <w:hyperlink r:id="rId93">
         <w:r>
           <w:rPr>
             <w:rStyle w:val="Hyperlink"/>
@@ -10227,7 +10693,7 @@
       <w:r>
         <w:t xml:space="preserve"> </w:t>
       </w:r>
-      <w:hyperlink r:id="rId92">
+      <w:hyperlink r:id="rId94">
         <w:r>
           <w:rPr>
             <w:rStyle w:val="Hyperlink"/>
@@ -10280,7 +10746,7 @@
       <w:r>
         <w:t xml:space="preserve"> </w:t>
       </w:r>
-      <w:hyperlink r:id="rId93">
+      <w:hyperlink r:id="rId95">
         <w:r>
           <w:rPr>
             <w:rStyle w:val="Hyperlink"/>
@@ -10335,7 +10801,7 @@
       <w:r>
         <w:t xml:space="preserve"> </w:t>
       </w:r>
-      <w:hyperlink r:id="rId94">
+      <w:hyperlink r:id="rId96">
         <w:r>
           <w:rPr>
             <w:rStyle w:val="Hyperlink"/>
@@ -10390,7 +10856,7 @@
       <w:r>
         <w:t xml:space="preserve"> </w:t>
       </w:r>
-      <w:hyperlink r:id="rId95">
+      <w:hyperlink r:id="rId97">
         <w:r>
           <w:rPr>
             <w:rStyle w:val="Hyperlink"/>
@@ -10431,7 +10897,7 @@
       <w:r>
         <w:t xml:space="preserve"> </w:t>
       </w:r>
-      <w:hyperlink r:id="rId96">
+      <w:hyperlink r:id="rId98">
         <w:r>
           <w:rPr>
             <w:rStyle w:val="Hyperlink"/>
@@ -10486,7 +10952,7 @@
       <w:r>
         <w:t xml:space="preserve"> </w:t>
       </w:r>
-      <w:hyperlink r:id="rId97">
+      <w:hyperlink r:id="rId99">
         <w:r>
           <w:rPr>
             <w:rStyle w:val="Hyperlink"/>
@@ -10541,7 +11007,7 @@
       <w:r>
         <w:t xml:space="preserve"> </w:t>
       </w:r>
-      <w:hyperlink r:id="rId98">
+      <w:hyperlink r:id="rId100">
         <w:r>
           <w:rPr>
             <w:rStyle w:val="Hyperlink"/>
@@ -10588,7 +11054,7 @@
       <w:r>
         <w:t xml:space="preserve"> </w:t>
       </w:r>
-      <w:hyperlink r:id="rId99">
+      <w:hyperlink r:id="rId101">
         <w:r>
           <w:rPr>
             <w:rStyle w:val="Hyperlink"/>
@@ -10629,7 +11095,7 @@
       <w:r>
         <w:t xml:space="preserve"> </w:t>
       </w:r>
-      <w:hyperlink r:id="rId100">
+      <w:hyperlink r:id="rId102">
         <w:r>
           <w:rPr>
             <w:rStyle w:val="Hyperlink"/>
@@ -10684,7 +11150,7 @@
       <w:r>
         <w:t xml:space="preserve"> </w:t>
       </w:r>
-      <w:hyperlink r:id="rId101">
+      <w:hyperlink r:id="rId103">
         <w:r>
           <w:rPr>
             <w:rStyle w:val="Hyperlink"/>
@@ -10725,7 +11191,7 @@
       <w:r>
         <w:t xml:space="preserve"> </w:t>
       </w:r>
-      <w:hyperlink r:id="rId102">
+      <w:hyperlink r:id="rId104">
         <w:r>
           <w:rPr>
             <w:rStyle w:val="Hyperlink"/>
@@ -10772,7 +11238,7 @@
       <w:r>
         <w:t xml:space="preserve"> </w:t>
       </w:r>
-      <w:hyperlink r:id="rId103">
+      <w:hyperlink r:id="rId105">
         <w:r>
           <w:rPr>
             <w:rStyle w:val="Hyperlink"/>
@@ -10819,7 +11285,7 @@
       <w:r>
         <w:t xml:space="preserve"> </w:t>
       </w:r>
-      <w:hyperlink r:id="rId104">
+      <w:hyperlink r:id="rId106">
         <w:r>
           <w:rPr>
             <w:rStyle w:val="Hyperlink"/>
@@ -10866,7 +11332,7 @@
       <w:r>
         <w:t xml:space="preserve"> </w:t>
       </w:r>
-      <w:hyperlink r:id="rId105">
+      <w:hyperlink r:id="rId107">
         <w:r>
           <w:rPr>
             <w:rStyle w:val="Hyperlink"/>
@@ -10921,7 +11387,7 @@
       <w:r>
         <w:t xml:space="preserve"> </w:t>
       </w:r>
-      <w:hyperlink r:id="rId106">
+      <w:hyperlink r:id="rId108">
         <w:r>
           <w:rPr>
             <w:rStyle w:val="Hyperlink"/>
@@ -10962,7 +11428,7 @@
       <w:r>
         <w:t xml:space="preserve"> </w:t>
       </w:r>
-      <w:hyperlink r:id="rId107">
+      <w:hyperlink r:id="rId109">
         <w:r>
           <w:rPr>
             <w:rStyle w:val="Hyperlink"/>
@@ -11083,7 +11549,7 @@
       <w:r>
         <w:t xml:space="preserve"> </w:t>
       </w:r>
-      <w:hyperlink r:id="rId108">
+      <w:hyperlink r:id="rId110">
         <w:r>
           <w:rPr>
             <w:rStyle w:val="Hyperlink"/>
@@ -11124,7 +11590,7 @@
       <w:r>
         <w:t xml:space="preserve"> </w:t>
       </w:r>
-      <w:hyperlink r:id="rId109">
+      <w:hyperlink r:id="rId111">
         <w:r>
           <w:rPr>
             <w:rStyle w:val="Hyperlink"/>
@@ -11165,7 +11631,7 @@
       <w:r>
         <w:t xml:space="preserve"> </w:t>
       </w:r>
-      <w:hyperlink r:id="rId110">
+      <w:hyperlink r:id="rId112">
         <w:r>
           <w:rPr>
             <w:rStyle w:val="Hyperlink"/>
@@ -11206,7 +11672,7 @@
       <w:r>
         <w:t xml:space="preserve"> </w:t>
       </w:r>
-      <w:hyperlink r:id="rId111">
+      <w:hyperlink r:id="rId113">
         <w:r>
           <w:rPr>
             <w:rStyle w:val="Hyperlink"/>
@@ -11247,7 +11713,7 @@
       <w:r>
         <w:t xml:space="preserve"> </w:t>
       </w:r>
-      <w:hyperlink r:id="rId112">
+      <w:hyperlink r:id="rId114">
         <w:r>
           <w:rPr>
             <w:rStyle w:val="Hyperlink"/>
@@ -11288,7 +11754,7 @@
       <w:r>
         <w:t xml:space="preserve"> </w:t>
       </w:r>
-      <w:hyperlink r:id="rId113">
+      <w:hyperlink r:id="rId115">
         <w:r>
           <w:rPr>
             <w:rStyle w:val="Hyperlink"/>
@@ -11329,7 +11795,7 @@
       <w:r>
         <w:t xml:space="preserve"> </w:t>
       </w:r>
-      <w:hyperlink r:id="rId114">
+      <w:hyperlink r:id="rId116">
         <w:r>
           <w:rPr>
             <w:rStyle w:val="Hyperlink"/>
@@ -11370,7 +11836,7 @@
       <w:r>
         <w:t xml:space="preserve"> </w:t>
       </w:r>
-      <w:hyperlink r:id="rId115">
+      <w:hyperlink r:id="rId117">
         <w:r>
           <w:rPr>
             <w:rStyle w:val="Hyperlink"/>
@@ -11411,7 +11877,7 @@
       <w:r>
         <w:t xml:space="preserve"> </w:t>
       </w:r>
-      <w:hyperlink r:id="rId116">
+      <w:hyperlink r:id="rId118">
         <w:r>
           <w:rPr>
             <w:rStyle w:val="Hyperlink"/>
@@ -11452,7 +11918,7 @@
       <w:r>
         <w:t xml:space="preserve"> </w:t>
       </w:r>
-      <w:hyperlink r:id="rId117">
+      <w:hyperlink r:id="rId119">
         <w:r>
           <w:rPr>
             <w:rStyle w:val="Hyperlink"/>
@@ -12029,6 +12495,26 @@
         <w:pStyle w:val="BodyText"/>
       </w:pPr>
       <w:r>
+        <w:t xml:space="preserve">H. Li et al.,</w:t>
+      </w:r>
+      <w:r>
+        <w:t xml:space="preserve"> </w:t>
+      </w:r>
+      <w:r>
+        <w:t xml:space="preserve">“When Representative Samples Produce Worse Outcomes: Scale-up Decisions from Small Randomized Trials,”</w:t>
+      </w:r>
+      <w:r>
+        <w:t xml:space="preserve"> </w:t>
+      </w:r>
+      <w:r>
+        <w:t xml:space="preserve">arXiv:2606.13531v1, 2026.</w:t>
+      </w:r>
+    </w:p>
+    <w:p>
+      <w:pPr>
+        <w:pStyle w:val="BodyText"/>
+      </w:pPr>
+      <w:r>
         <w:t xml:space="preserve">J. M. Mikhaeil et al.,</w:t>
       </w:r>
       <w:r>
@@ -12113,7 +12599,7 @@
       <w:r>
         <w:t xml:space="preserve"> </w:t>
       </w:r>
-      <w:hyperlink r:id="rId118">
+      <w:hyperlink r:id="rId120">
         <w:r>
           <w:rPr>
             <w:rStyle w:val="Hyperlink"/>
@@ -12154,7 +12640,7 @@
       <w:r>
         <w:t xml:space="preserve"> </w:t>
       </w:r>
-      <w:hyperlink r:id="rId119">
+      <w:hyperlink r:id="rId121">
         <w:r>
           <w:rPr>
             <w:rStyle w:val="Hyperlink"/>
@@ -12166,7 +12652,7 @@
         <w:t xml:space="preserve">.</w:t>
       </w:r>
     </w:p>
-    <w:bookmarkEnd w:id="120"/>
+    <w:bookmarkEnd w:id="122"/>
     <w:sectPr>
       <w:footerReference w:type="default" r:id="rIdFtr1"/>
       <w:footnotePr>

</xml_diff>

<commit_message>
feat(paper): compute the decisive block size from measured cost
</commit_message>
<xml_diff>
--- a/paper/word/graduation-thesis.docx
+++ b/paper/word/graduation-thesis.docx
@@ -8826,7 +8826,110 @@
         <w:t xml:space="preserve"> </w:t>
       </w:r>
       <w:r>
-        <w:t xml:space="preserve">reason to keep measuring rather than a result.</w:t>
+        <w:t xml:space="preserve">reason to keep measuring rather than a result. How much more measuring is a computed</w:t>
+      </w:r>
+      <w:r>
+        <w:t xml:space="preserve"> </w:t>
+      </w:r>
+      <w:r>
+        <w:t xml:space="preserve">quantity rather than a matter of taste. Reaching a half-width of</w:t>
+      </w:r>
+      <w:r>
+        <w:t xml:space="preserve"> </w:t>
+      </w:r>
+      <m:oMath>
+        <m:r>
+          <m:t>0.15</m:t>
+        </m:r>
+      </m:oMath>
+      <w:r>
+        <w:t xml:space="preserve"> </w:t>
+      </w:r>
+      <w:r>
+        <w:t xml:space="preserve">at the lowest</w:t>
+      </w:r>
+      <w:r>
+        <w:t xml:space="preserve"> </w:t>
+      </w:r>
+      <w:r>
+        <w:t xml:space="preserve">observed completion rate requires</w:t>
+      </w:r>
+      <w:r>
+        <w:t xml:space="preserve"> </w:t>
+      </w:r>
+      <m:oMath>
+        <m:r>
+          <m:t>29</m:t>
+        </m:r>
+      </m:oMath>
+      <w:r>
+        <w:t xml:space="preserve"> </w:t>
+      </w:r>
+      <w:r>
+        <w:t xml:space="preserve">episodes per condition,</w:t>
+      </w:r>
+      <w:r>
+        <w:t xml:space="preserve"> </w:t>
+      </w:r>
+      <m:oMath>
+        <m:r>
+          <m:t>116</m:t>
+        </m:r>
+      </m:oMath>
+      <w:r>
+        <w:t xml:space="preserve"> </w:t>
+      </w:r>
+      <w:r>
+        <w:t xml:space="preserve">in total, at a</w:t>
+      </w:r>
+      <w:r>
+        <w:t xml:space="preserve"> </w:t>
+      </w:r>
+      <w:r>
+        <w:t xml:space="preserve">measured cost per episode taken from the executed block rather than assumed. A third</w:t>
+      </w:r>
+      <w:r>
+        <w:t xml:space="preserve"> </w:t>
+      </w:r>
+      <w:r>
+        <w:t xml:space="preserve">repeat would cost about a dollar and move the half-width from</w:t>
+      </w:r>
+      <w:r>
+        <w:t xml:space="preserve"> </w:t>
+      </w:r>
+      <m:oMath>
+        <m:r>
+          <m:t>0.327</m:t>
+        </m:r>
+      </m:oMath>
+      <w:r>
+        <w:t xml:space="preserve"> </w:t>
+      </w:r>
+      <w:r>
+        <w:t xml:space="preserve">to roughly</w:t>
+      </w:r>
+      <w:r>
+        <w:t xml:space="preserve"> </w:t>
+      </w:r>
+      <m:oMath>
+        <m:r>
+          <m:t>0.29</m:t>
+        </m:r>
+      </m:oMath>
+      <w:r>
+        <w:t xml:space="preserve">,</w:t>
+      </w:r>
+      <w:r>
+        <w:t xml:space="preserve"> </w:t>
+      </w:r>
+      <w:r>
+        <w:t xml:space="preserve">which changes nothing that can be concluded, so it was not run: the requirement is</w:t>
+      </w:r>
+      <w:r>
+        <w:t xml:space="preserve"> </w:t>
+      </w:r>
+      <w:r>
+        <w:t xml:space="preserve">recorded and the larger spend is left as an explicit decision.</w:t>
       </w:r>
     </w:p>
     <w:bookmarkEnd w:id="62"/>

</xml_diff>

<commit_message>
feat(paper): report per-outcome planning status and name the binding constraint
</commit_message>
<xml_diff>
--- a/paper/word/graduation-thesis.docx
+++ b/paper/word/graduation-thesis.docx
@@ -8930,6 +8930,90 @@
       </w:r>
       <w:r>
         <w:t xml:space="preserve">recorded and the larger spend is left as an explicit decision.</w:t>
+      </w:r>
+    </w:p>
+    <w:p>
+      <w:pPr>
+        <w:pStyle w:val="BodyText"/>
+      </w:pPr>
+      <w:r>
+        <w:t xml:space="preserve">The same planning was then applied to the quality endpoint, and it cannot be done. A</w:t>
+      </w:r>
+      <w:r>
+        <w:t xml:space="preserve"> </w:t>
+      </w:r>
+      <w:r>
+        <w:t xml:space="preserve">committed check walks each declared outcome and reports whether its block size is</w:t>
+      </w:r>
+      <w:r>
+        <w:t xml:space="preserve"> </w:t>
+      </w:r>
+      <w:r>
+        <w:t xml:space="preserve">computable. Budget completion is computable, because the admission path measures it with</w:t>
+      </w:r>
+      <w:r>
+        <w:t xml:space="preserve"> </w:t>
+      </w:r>
+      <w:r>
+        <w:t xml:space="preserve">no judge in the loop. Design quality is not, and it is blocked twice: judged scoring</w:t>
+      </w:r>
+      <w:r>
+        <w:t xml:space="preserve"> </w:t>
+      </w:r>
+      <w:r>
+        <w:t xml:space="preserve">remains inadmissible with</w:t>
+      </w:r>
+      <w:r>
+        <w:t xml:space="preserve"> </w:t>
+      </w:r>
+      <m:oMath>
+        <m:r>
+          <m:t>0</m:t>
+        </m:r>
+      </m:oMath>
+      <w:r>
+        <w:t xml:space="preserve"> </w:t>
+      </w:r>
+      <w:r>
+        <w:t xml:space="preserve">of</w:t>
+      </w:r>
+      <w:r>
+        <w:t xml:space="preserve"> </w:t>
+      </w:r>
+      <m:oMath>
+        <m:r>
+          <m:t>25</m:t>
+        </m:r>
+      </m:oMath>
+      <w:r>
+        <w:t xml:space="preserve"> </w:t>
+      </w:r>
+      <w:r>
+        <w:t xml:space="preserve">human-anchored labels collected, and the endpoint</w:t>
+      </w:r>
+      <w:r>
+        <w:t xml:space="preserve"> </w:t>
+      </w:r>
+      <w:r>
+        <w:t xml:space="preserve">variance is not estimable from the admissible episodes because the ceiling refusal left</w:t>
+      </w:r>
+      <w:r>
+        <w:t xml:space="preserve"> </w:t>
+      </w:r>
+      <w:r>
+        <w:t xml:space="preserve">the design unbalanced. The first blocker is an external input that nothing in the loop can</w:t>
+      </w:r>
+      <w:r>
+        <w:t xml:space="preserve"> </w:t>
+      </w:r>
+      <w:r>
+        <w:t xml:space="preserve">supply, and it gates the entire quality arm of the confirmatory plan. Stating that is more</w:t>
+      </w:r>
+      <w:r>
+        <w:t xml:space="preserve"> </w:t>
+      </w:r>
+      <w:r>
+        <w:t xml:space="preserve">useful than a block size resting on a variance the design cannot yield.</w:t>
       </w:r>
     </w:p>
     <w:bookmarkEnd w:id="62"/>

</xml_diff>

<commit_message>
feat(paper): audit claim dependency on unscorable episodes
</commit_message>
<xml_diff>
--- a/paper/word/graduation-thesis.docx
+++ b/paper/word/graduation-thesis.docx
@@ -5386,6 +5386,72 @@
     <w:p>
       <w:pPr>
         <w:pStyle w:val="FirstParagraph"/>
+      </w:pPr>
+      <w:r>
+        <w:t xml:space="preserve">These figures characterise the judge, not the episodes. The admission rule introduced</w:t>
+      </w:r>
+      <w:r>
+        <w:t xml:space="preserve"> </w:t>
+      </w:r>
+      <w:r>
+        <w:t xml:space="preserve">later refuses to</w:t>
+      </w:r>
+      <w:r>
+        <w:t xml:space="preserve"> </w:t>
+      </w:r>
+      <w:r>
+        <w:rPr>
+          <w:i/>
+          <w:iCs/>
+        </w:rPr>
+        <w:t xml:space="preserve">score</w:t>
+      </w:r>
+      <w:r>
+        <w:t xml:space="preserve"> </w:t>
+      </w:r>
+      <w:r>
+        <w:t xml:space="preserve">an episode whose usage was never measured, and the</w:t>
+      </w:r>
+      <w:r>
+        <w:t xml:space="preserve"> </w:t>
+      </w:r>
+      <w:r>
+        <w:t xml:space="preserve">sixty-four judgements below come from episodes that fall under that refusal. What is</w:t>
+      </w:r>
+      <w:r>
+        <w:t xml:space="preserve"> </w:t>
+      </w:r>
+      <w:r>
+        <w:t xml:space="preserve">being estimated here is a property of the instrument, how far a verdict reproduces when</w:t>
+      </w:r>
+      <w:r>
+        <w:t xml:space="preserve"> </w:t>
+      </w:r>
+      <w:r>
+        <w:t xml:space="preserve">the same item is judged again, which the artifacts can support even though the episodes</w:t>
+      </w:r>
+      <w:r>
+        <w:t xml:space="preserve"> </w:t>
+      </w:r>
+      <w:r>
+        <w:t xml:space="preserve">themselves may not enter a score. The distinction matters because the variance components</w:t>
+      </w:r>
+      <w:r>
+        <w:t xml:space="preserve"> </w:t>
+      </w:r>
+      <w:r>
+        <w:t xml:space="preserve">reported earlier are episode scores and are therefore labelled provisional, while these</w:t>
+      </w:r>
+      <w:r>
+        <w:t xml:space="preserve"> </w:t>
+      </w:r>
+      <w:r>
+        <w:t xml:space="preserve">are not.</w:t>
+      </w:r>
+    </w:p>
+    <w:p>
+      <w:pPr>
+        <w:pStyle w:val="BodyText"/>
       </w:pPr>
       <w:r>
         <w:t xml:space="preserve">Reliability was measured before requesting any human label. On 64 stratified</w:t>

</xml_diff>

<commit_message>
feat(paper): replicate the confidence floor on unseen confirmation tasks
</commit_message>
<xml_diff>
--- a/paper/word/graduation-thesis.docx
+++ b/paper/word/graduation-thesis.docx
@@ -5626,7 +5626,196 @@
         <w:t xml:space="preserve"> </w:t>
       </w:r>
       <w:r>
-        <w:t xml:space="preserve">therefore abstains before calibration.</w:t>
+        <w:t xml:space="preserve">therefore abstains before calibration. That floor was then tested on</w:t>
+      </w:r>
+      <w:r>
+        <w:t xml:space="preserve"> </w:t>
+      </w:r>
+      <w:r>
+        <w:t xml:space="preserve">material it had never seen. All</w:t>
+      </w:r>
+      <w:r>
+        <w:t xml:space="preserve"> </w:t>
+      </w:r>
+      <m:oMath>
+        <m:r>
+          <m:t>48</m:t>
+        </m:r>
+      </m:oMath>
+      <w:r>
+        <w:t xml:space="preserve"> </w:t>
+      </w:r>
+      <w:r>
+        <w:t xml:space="preserve">element judgements over the eight first-repeat</w:t>
+      </w:r>
+      <w:r>
+        <w:t xml:space="preserve"> </w:t>
+      </w:r>
+      <w:r>
+        <w:t xml:space="preserve">confirmation artifacts were judged independently by two models from different provider</w:t>
+      </w:r>
+      <w:r>
+        <w:t xml:space="preserve"> </w:t>
+      </w:r>
+      <w:r>
+        <w:t xml:space="preserve">families. Raw agreement was</w:t>
+      </w:r>
+      <w:r>
+        <w:t xml:space="preserve"> </w:t>
+      </w:r>
+      <m:oMath>
+        <m:r>
+          <m:t>0.667</m:t>
+        </m:r>
+      </m:oMath>
+      <w:r>
+        <w:t xml:space="preserve">, lower than the</w:t>
+      </w:r>
+      <w:r>
+        <w:t xml:space="preserve"> </w:t>
+      </w:r>
+      <m:oMath>
+        <m:r>
+          <m:t>0.703</m:t>
+        </m:r>
+      </m:oMath>
+      <w:r>
+        <w:t xml:space="preserve"> </w:t>
+      </w:r>
+      <w:r>
+        <w:t xml:space="preserve">measured earlier, because six</w:t>
+      </w:r>
+      <w:r>
+        <w:t xml:space="preserve"> </w:t>
+      </w:r>
+      <w:r>
+        <w:t xml:space="preserve">items produced an unparsed verdict from one judge and are counted as disagreements rather</w:t>
+      </w:r>
+      <w:r>
+        <w:t xml:space="preserve"> </w:t>
+      </w:r>
+      <w:r>
+        <w:t xml:space="preserve">than dropped; excluding those, agreement was</w:t>
+      </w:r>
+      <w:r>
+        <w:t xml:space="preserve"> </w:t>
+      </w:r>
+      <m:oMath>
+        <m:r>
+          <m:t>0.788</m:t>
+        </m:r>
+      </m:oMath>
+      <w:r>
+        <w:t xml:space="preserve"> </w:t>
+      </w:r>
+      <w:r>
+        <w:t xml:space="preserve">with</w:t>
+      </w:r>
+      <w:r>
+        <w:t xml:space="preserve"> </w:t>
+      </w:r>
+      <m:oMath>
+        <m:r>
+          <m:t>κ</m:t>
+        </m:r>
+        <m:r>
+          <m:rPr>
+            <m:sty m:val="p"/>
+          </m:rPr>
+          <m:t>=</m:t>
+        </m:r>
+        <m:r>
+          <m:t>0.492</m:t>
+        </m:r>
+      </m:oMath>
+      <w:r>
+        <w:t xml:space="preserve">, above the</w:t>
+      </w:r>
+      <w:r>
+        <w:t xml:space="preserve"> </w:t>
+      </w:r>
+      <w:r>
+        <w:t xml:space="preserve">earlier figures. The result that matters is the stratification, which replicated exactly:</w:t>
+      </w:r>
+      <w:r>
+        <w:t xml:space="preserve"> </w:t>
+      </w:r>
+      <w:r>
+        <w:t xml:space="preserve">of the twelve items where both judges were above</w:t>
+      </w:r>
+      <w:r>
+        <w:t xml:space="preserve"> </w:t>
+      </w:r>
+      <m:oMath>
+        <m:r>
+          <m:t>0.9</m:t>
+        </m:r>
+      </m:oMath>
+      <w:r>
+        <w:t xml:space="preserve"> </w:t>
+      </w:r>
+      <w:r>
+        <w:t xml:space="preserve">confidence, all twelve agreed; the</w:t>
+      </w:r>
+      <w:r>
+        <w:t xml:space="preserve"> </w:t>
+      </w:r>
+      <w:r>
+        <w:t xml:space="preserve">middle band agreed on</w:t>
+      </w:r>
+      <w:r>
+        <w:t xml:space="preserve"> </w:t>
+      </w:r>
+      <m:oMath>
+        <m:r>
+          <m:t>14</m:t>
+        </m:r>
+      </m:oMath>
+      <w:r>
+        <w:t xml:space="preserve"> </w:t>
+      </w:r>
+      <w:r>
+        <w:t xml:space="preserve">of</w:t>
+      </w:r>
+      <w:r>
+        <w:t xml:space="preserve"> </w:t>
+      </w:r>
+      <m:oMath>
+        <m:r>
+          <m:t>18</m:t>
+        </m:r>
+      </m:oMath>
+      <w:r>
+        <w:t xml:space="preserve">; and of the nine items below</w:t>
+      </w:r>
+      <w:r>
+        <w:t xml:space="preserve"> </w:t>
+      </w:r>
+      <m:oMath>
+        <m:r>
+          <m:t>0.7</m:t>
+        </m:r>
+      </m:oMath>
+      <w:r>
+        <w:t xml:space="preserve">, none agreed. The</w:t>
+      </w:r>
+      <w:r>
+        <w:t xml:space="preserve"> </w:t>
+      </w:r>
+      <w:r>
+        <w:t xml:space="preserve">part of the instrument that is actually used held on unseen tasks. Nothing here supports</w:t>
+      </w:r>
+      <w:r>
+        <w:t xml:space="preserve"> </w:t>
+      </w:r>
+      <w:r>
+        <w:t xml:space="preserve">calling the judge reliable in general, and below the floor the two judges disagree on</w:t>
+      </w:r>
+      <w:r>
+        <w:t xml:space="preserve"> </w:t>
+      </w:r>
+      <w:r>
+        <w:t xml:space="preserve">roughly a third of items.</w:t>
       </w:r>
     </w:p>
     <w:p>

</xml_diff>

<commit_message>
fix(paper): falsify the high-recall filter assumption under the endpoint
</commit_message>
<xml_diff>
--- a/paper/word/graduation-thesis.docx
+++ b/paper/word/graduation-thesis.docx
@@ -5816,6 +5816,88 @@
       </w:r>
       <w:r>
         <w:t xml:space="preserve">roughly a third of items.</w:t>
+      </w:r>
+    </w:p>
+    <w:p>
+      <w:pPr>
+        <w:pStyle w:val="BodyText"/>
+      </w:pPr>
+      <w:r>
+        <w:t xml:space="preserve">That limit was then tested rather than left standing, and it found a defect in the</w:t>
+      </w:r>
+      <w:r>
+        <w:t xml:space="preserve"> </w:t>
+      </w:r>
+      <w:r>
+        <w:t xml:space="preserve">endpoint itself. Nine of the forty-eight items returned no candidate span, so the pipeline</w:t>
+      </w:r>
+      <w:r>
+        <w:t xml:space="preserve"> </w:t>
+      </w:r>
+      <w:r>
+        <w:t xml:space="preserve">scored them as not satisfied without calling any model at all. Shown the full artifact</w:t>
+      </w:r>
+      <w:r>
+        <w:t xml:space="preserve"> </w:t>
+      </w:r>
+      <w:r>
+        <w:t xml:space="preserve">instead, both judges call four of those nine satisfied and at least one calls five. The</w:t>
+      </w:r>
+      <w:r>
+        <w:t xml:space="preserve"> </w:t>
+      </w:r>
+      <w:r>
+        <w:t xml:space="preserve">agreement on those items was a shared retrieval failure, not a judgement.</w:t>
+      </w:r>
+    </w:p>
+    <w:p>
+      <w:pPr>
+        <w:pStyle w:val="BodyText"/>
+      </w:pPr>
+      <w:r>
+        <w:t xml:space="preserve">This falsifies an assumption the endpoint rests on. Cue matching was demoted to a</w:t>
+      </w:r>
+      <w:r>
+        <w:t xml:space="preserve"> </w:t>
+      </w:r>
+      <w:r>
+        <w:t xml:space="preserve">high-recall candidate filter precisely so that verification could be trusted to do the</w:t>
+      </w:r>
+      <w:r>
+        <w:t xml:space="preserve"> </w:t>
+      </w:r>
+      <w:r>
+        <w:t xml:space="preserve">deciding, and a filter that misses at least four of nine makes the endpoint understate</w:t>
+      </w:r>
+      <w:r>
+        <w:t xml:space="preserve"> </w:t>
+      </w:r>
+      <w:r>
+        <w:t xml:space="preserve">coverage silently, because no model is ever called on a miss. A no-span result is</w:t>
+      </w:r>
+      <w:r>
+        <w:t xml:space="preserve"> </w:t>
+      </w:r>
+      <w:r>
+        <w:t xml:space="preserve">therefore recorded as unresolved rather than as a negative verdict, and the retrieval step</w:t>
+      </w:r>
+      <w:r>
+        <w:t xml:space="preserve"> </w:t>
+      </w:r>
+      <w:r>
+        <w:t xml:space="preserve">must have measured recall before the endpoint is used for scoring. The measurement covers</w:t>
+      </w:r>
+      <w:r>
+        <w:t xml:space="preserve"> </w:t>
+      </w:r>
+      <w:r>
+        <w:t xml:space="preserve">only items where retrieval returned nothing; items where it returned a poor span could</w:t>
+      </w:r>
+      <w:r>
+        <w:t xml:space="preserve"> </w:t>
+      </w:r>
+      <w:r>
+        <w:t xml:space="preserve">fail in the same direction without being visible, and that remains unmeasured.</w:t>
       </w:r>
     </w:p>
     <w:p>

</xml_diff>

<commit_message>
feat(paper): measure the complete endpoint overturn rate and its split
</commit_message>
<xml_diff>
--- a/paper/word/graduation-thesis.docx
+++ b/paper/word/graduation-thesis.docx
@@ -5885,19 +5885,144 @@
         <w:t xml:space="preserve"> </w:t>
       </w:r>
       <w:r>
-        <w:t xml:space="preserve">must have measured recall before the endpoint is used for scoring. The measurement covers</w:t>
-      </w:r>
-      <w:r>
-        <w:t xml:space="preserve"> </w:t>
-      </w:r>
-      <w:r>
-        <w:t xml:space="preserve">only items where retrieval returned nothing; items where it returned a poor span could</w:t>
-      </w:r>
-      <w:r>
-        <w:t xml:space="preserve"> </w:t>
-      </w:r>
-      <w:r>
-        <w:t xml:space="preserve">fail in the same direction without being visible, and that remains unmeasured.</w:t>
+        <w:t xml:space="preserve">must have measured recall before the endpoint is used for scoring. The other half was then measured too. Of the nine</w:t>
+      </w:r>
+      <w:r>
+        <w:t xml:space="preserve"> </w:t>
+      </w:r>
+      <w:r>
+        <w:t xml:space="preserve">items where retrieval did return a span and the verdict on that span was negative, three</w:t>
+      </w:r>
+      <w:r>
+        <w:t xml:space="preserve"> </w:t>
+      </w:r>
+      <w:r>
+        <w:t xml:space="preserve">are judged satisfied by both models on the full artifact. A returned span is therefore not</w:t>
+      </w:r>
+      <w:r>
+        <w:t xml:space="preserve"> </w:t>
+      </w:r>
+      <w:r>
+        <w:t xml:space="preserve">protection.</w:t>
+      </w:r>
+    </w:p>
+    <w:p>
+      <w:pPr>
+        <w:pStyle w:val="BodyText"/>
+      </w:pPr>
+      <w:r>
+        <w:t xml:space="preserve">Taken together,</w:t>
+      </w:r>
+      <w:r>
+        <w:t xml:space="preserve"> </w:t>
+      </w:r>
+      <m:oMath>
+        <m:r>
+          <m:t>7</m:t>
+        </m:r>
+      </m:oMath>
+      <w:r>
+        <w:t xml:space="preserve"> </w:t>
+      </w:r>
+      <w:r>
+        <w:t xml:space="preserve">of the</w:t>
+      </w:r>
+      <w:r>
+        <w:t xml:space="preserve"> </w:t>
+      </w:r>
+      <m:oMath>
+        <m:r>
+          <m:t>18</m:t>
+        </m:r>
+      </m:oMath>
+      <w:r>
+        <w:t xml:space="preserve"> </w:t>
+      </w:r>
+      <w:r>
+        <w:t xml:space="preserve">pipeline negatives in this block are overturned by both</w:t>
+      </w:r>
+      <w:r>
+        <w:t xml:space="preserve"> </w:t>
+      </w:r>
+      <w:r>
+        <w:t xml:space="preserve">judges when the full artifact is shown, and the error is not confined to items where</w:t>
+      </w:r>
+      <w:r>
+        <w:t xml:space="preserve"> </w:t>
+      </w:r>
+      <w:r>
+        <w:t xml:space="preserve">retrieval found nothing: no-span items are overturned at</w:t>
+      </w:r>
+      <w:r>
+        <w:t xml:space="preserve"> </w:t>
+      </w:r>
+      <m:oMath>
+        <m:r>
+          <m:t>4</m:t>
+        </m:r>
+      </m:oMath>
+      <w:r>
+        <w:t xml:space="preserve"> </w:t>
+      </w:r>
+      <w:r>
+        <w:t xml:space="preserve">of</w:t>
+      </w:r>
+      <w:r>
+        <w:t xml:space="preserve"> </w:t>
+      </w:r>
+      <m:oMath>
+        <m:r>
+          <m:t>9</m:t>
+        </m:r>
+      </m:oMath>
+      <w:r>
+        <w:t xml:space="preserve"> </w:t>
+      </w:r>
+      <w:r>
+        <w:t xml:space="preserve">and poor-span items at</w:t>
+      </w:r>
+      <w:r>
+        <w:t xml:space="preserve"> </w:t>
+      </w:r>
+      <m:oMath>
+        <m:r>
+          <m:t>3</m:t>
+        </m:r>
+      </m:oMath>
+      <w:r>
+        <w:t xml:space="preserve"> </w:t>
+      </w:r>
+      <w:r>
+        <w:t xml:space="preserve">of</w:t>
+      </w:r>
+      <w:r>
+        <w:t xml:space="preserve"> </w:t>
+      </w:r>
+      <m:oMath>
+        <m:r>
+          <m:t>9</m:t>
+        </m:r>
+      </m:oMath>
+      <w:r>
+        <w:t xml:space="preserve">. The endpoint understates coverage at roughly this rate, always in the same</w:t>
+      </w:r>
+      <w:r>
+        <w:t xml:space="preserve"> </w:t>
+      </w:r>
+      <w:r>
+        <w:t xml:space="preserve">direction. One caveat bounds the whole measurement: the reference is agreement between two</w:t>
+      </w:r>
+      <w:r>
+        <w:t xml:space="preserve"> </w:t>
+      </w:r>
+      <w:r>
+        <w:t xml:space="preserve">judges on the full artifact, which is not ground truth. It shows that the pipeline verdict</w:t>
+      </w:r>
+      <w:r>
+        <w:t xml:space="preserve"> </w:t>
+      </w:r>
+      <w:r>
+        <w:t xml:space="preserve">is unstable under a wider view, not that the wider view is right.</w:t>
       </w:r>
     </w:p>
     <w:p>

</xml_diff>

<commit_message>
feat(paper): replace endpoint retrieval with whole-artifact judging on measured cost
</commit_message>
<xml_diff>
--- a/paper/word/graduation-thesis.docx
+++ b/paper/word/graduation-thesis.docx
@@ -6023,6 +6023,102 @@
       </w:r>
       <w:r>
         <w:t xml:space="preserve">is unstable under a wider view, not that the wider view is right.</w:t>
+      </w:r>
+    </w:p>
+    <w:p>
+      <w:pPr>
+        <w:pStyle w:val="BodyText"/>
+      </w:pPr>
+      <w:r>
+        <w:t xml:space="preserve">The choice that follows was costed rather than argued. Judging the whole artifact instead</w:t>
+      </w:r>
+      <w:r>
+        <w:t xml:space="preserve"> </w:t>
+      </w:r>
+      <w:r>
+        <w:t xml:space="preserve">of retrieved spans costs</w:t>
+      </w:r>
+      <w:r>
+        <w:t xml:space="preserve"> </w:t>
+      </w:r>
+      <m:oMath>
+        <m:r>
+          <m:t>1.61</m:t>
+        </m:r>
+      </m:oMath>
+      <w:r>
+        <w:t xml:space="preserve"> </w:t>
+      </w:r>
+      <w:r>
+        <w:t xml:space="preserve">times as much per element judgement, measured by running</w:t>
+      </w:r>
+      <w:r>
+        <w:t xml:space="preserve"> </w:t>
+      </w:r>
+      <w:r>
+        <w:t xml:space="preserve">three items both ways in a mode that reports usage. Repair was rejected because the</w:t>
+      </w:r>
+      <w:r>
+        <w:t xml:space="preserve"> </w:t>
+      </w:r>
+      <w:r>
+        <w:t xml:space="preserve">failure is not directional in a way cues can fix: three of the four no-span misses were a</w:t>
+      </w:r>
+      <w:r>
+        <w:t xml:space="preserve"> </w:t>
+      </w:r>
+      <w:r>
+        <w:t xml:space="preserve">single element stated in wording the cues do not match, and poor spans fail at a similar</w:t>
+      </w:r>
+      <w:r>
+        <w:t xml:space="preserve"> </w:t>
+      </w:r>
+      <w:r>
+        <w:t xml:space="preserve">rate, so widening cues trades one silent miss for another with no recall measurement to</w:t>
+      </w:r>
+      <w:r>
+        <w:t xml:space="preserve"> </w:t>
+      </w:r>
+      <w:r>
+        <w:t xml:space="preserve">bound it. Whole-artifact judging becomes the primary path, and the cheaper span verdict is</w:t>
+      </w:r>
+      <w:r>
+        <w:t xml:space="preserve"> </w:t>
+      </w:r>
+      <w:r>
+        <w:t xml:space="preserve">retained on a twenty percent subsample as a drift check.</w:t>
+      </w:r>
+    </w:p>
+    <w:p>
+      <w:pPr>
+        <w:pStyle w:val="BodyText"/>
+      </w:pPr>
+      <w:r>
+        <w:t xml:space="preserve">That trade is stated for what it is. Full-artifact judging has no accuracy measurement of</w:t>
+      </w:r>
+      <w:r>
+        <w:t xml:space="preserve"> </w:t>
+      </w:r>
+      <w:r>
+        <w:t xml:space="preserve">its own, so a measured and directional failure mode is being exchanged for an unmeasured</w:t>
+      </w:r>
+      <w:r>
+        <w:t xml:space="preserve"> </w:t>
+      </w:r>
+      <w:r>
+        <w:t xml:space="preserve">one. It is defensible only because the removed mode is quantified and one-directional, and</w:t>
+      </w:r>
+      <w:r>
+        <w:t xml:space="preserve"> </w:t>
+      </w:r>
+      <w:r>
+        <w:t xml:space="preserve">the subsample exists so that disagreement between the two paths stays visible instead of</w:t>
+      </w:r>
+      <w:r>
+        <w:t xml:space="preserve"> </w:t>
+      </w:r>
+      <w:r>
+        <w:t xml:space="preserve">being assumed away.</w:t>
       </w:r>
     </w:p>
     <w:p>

</xml_diff>

<commit_message>
feat(paper): measure the endpoint shift under whole-artifact judging
</commit_message>
<xml_diff>
--- a/paper/word/graduation-thesis.docx
+++ b/paper/word/graduation-thesis.docx
@@ -6119,6 +6119,149 @@
       </w:r>
       <w:r>
         <w:t xml:space="preserve">being assumed away.</w:t>
+      </w:r>
+    </w:p>
+    <w:p>
+      <w:pPr>
+        <w:pStyle w:val="BodyText"/>
+      </w:pPr>
+      <w:r>
+        <w:t xml:space="preserve">The change was then measured on the eight confirmation artifacts. Judging the whole</w:t>
+      </w:r>
+      <w:r>
+        <w:t xml:space="preserve"> </w:t>
+      </w:r>
+      <w:r>
+        <w:t xml:space="preserve">artifact raises mean coverage from</w:t>
+      </w:r>
+      <w:r>
+        <w:t xml:space="preserve"> </w:t>
+      </w:r>
+      <m:oMath>
+        <m:r>
+          <m:t>0.542</m:t>
+        </m:r>
+      </m:oMath>
+      <w:r>
+        <w:t xml:space="preserve"> </w:t>
+      </w:r>
+      <w:r>
+        <w:t xml:space="preserve">to</w:t>
+      </w:r>
+      <w:r>
+        <w:t xml:space="preserve"> </w:t>
+      </w:r>
+      <m:oMath>
+        <m:r>
+          <m:t>0.729</m:t>
+        </m:r>
+      </m:oMath>
+      <w:r>
+        <w:t xml:space="preserve">, a shift of</w:t>
+      </w:r>
+      <w:r>
+        <w:t xml:space="preserve"> </w:t>
+      </w:r>
+      <m:oMath>
+        <m:r>
+          <m:t>0.188</m:t>
+        </m:r>
+      </m:oMath>
+      <w:r>
+        <w:t xml:space="preserve">. Seventeen of</w:t>
+      </w:r>
+      <w:r>
+        <w:t xml:space="preserve"> </w:t>
+      </w:r>
+      <w:r>
+        <w:t xml:space="preserve">the forty-eight element verdicts change, and not all in one direction: thirteen move from</w:t>
+      </w:r>
+      <w:r>
+        <w:t xml:space="preserve"> </w:t>
+      </w:r>
+      <w:r>
+        <w:t xml:space="preserve">negative to satisfied and four move the other way, so removing retrieval is not simply a</w:t>
+      </w:r>
+      <w:r>
+        <w:t xml:space="preserve"> </w:t>
+      </w:r>
+      <w:r>
+        <w:t xml:space="preserve">looser rule.</w:t>
+      </w:r>
+    </w:p>
+    <w:p>
+      <w:pPr>
+        <w:pStyle w:val="BodyText"/>
+      </w:pPr>
+      <w:r>
+        <w:t xml:space="preserve">The size of that shift is the point. The paired minimum detectable effect on this endpoint</w:t>
+      </w:r>
+      <w:r>
+        <w:t xml:space="preserve"> </w:t>
+      </w:r>
+      <w:r>
+        <w:t xml:space="preserve">is</w:t>
+      </w:r>
+      <w:r>
+        <w:t xml:space="preserve"> </w:t>
+      </w:r>
+      <m:oMath>
+        <m:r>
+          <m:t>0.0825</m:t>
+        </m:r>
+      </m:oMath>
+      <w:r>
+        <w:t xml:space="preserve">, so changing the scoring method moves the reading by about</w:t>
+      </w:r>
+      <w:r>
+        <w:t xml:space="preserve"> </w:t>
+      </w:r>
+      <m:oMath>
+        <m:r>
+          <m:t>2.3</m:t>
+        </m:r>
+      </m:oMath>
+      <w:r>
+        <w:t xml:space="preserve"> </w:t>
+      </w:r>
+      <w:r>
+        <w:t xml:space="preserve">times the</w:t>
+      </w:r>
+      <w:r>
+        <w:t xml:space="preserve"> </w:t>
+      </w:r>
+      <w:r>
+        <w:t xml:space="preserve">smallest effect the design was sized to detect. An instrument choice of that magnitude is</w:t>
+      </w:r>
+      <w:r>
+        <w:t xml:space="preserve"> </w:t>
+      </w:r>
+      <w:r>
+        <w:t xml:space="preserve">not a detail of the analysis; it dominates the comparison it exists to serve. Per-condition</w:t>
+      </w:r>
+      <w:r>
+        <w:t xml:space="preserve"> </w:t>
+      </w:r>
+      <w:r>
+        <w:t xml:space="preserve">coverage is deliberately not reported here: two artifacts per condition cannot separate a</w:t>
+      </w:r>
+      <w:r>
+        <w:t xml:space="preserve"> </w:t>
+      </w:r>
+      <w:r>
+        <w:t xml:space="preserve">condition from a task, and the shift is a property of the instrument rather than of any</w:t>
+      </w:r>
+      <w:r>
+        <w:t xml:space="preserve"> </w:t>
+      </w:r>
+      <w:r>
+        <w:t xml:space="preserve">condition. These verdicts also remain inadmissible for scoring, because no human-anchored</w:t>
+      </w:r>
+      <w:r>
+        <w:t xml:space="preserve"> </w:t>
+      </w:r>
+      <w:r>
+        <w:t xml:space="preserve">calibration set exists.</w:t>
       </w:r>
     </w:p>
     <w:p>

</xml_diff>

<commit_message>
fix(paper): void the detectable effect as a design target on measured instrument variance
</commit_message>
<xml_diff>
--- a/paper/word/graduation-thesis.docx
+++ b/paper/word/graduation-thesis.docx
@@ -6262,6 +6262,164 @@
       </w:r>
       <w:r>
         <w:t xml:space="preserve">calibration set exists.</w:t>
+      </w:r>
+    </w:p>
+    <w:p>
+      <w:pPr>
+        <w:pStyle w:val="BodyText"/>
+      </w:pPr>
+      <w:r>
+        <w:t xml:space="preserve">A further consequence follows for the design itself. The instrument does not merely shift</w:t>
+      </w:r>
+      <w:r>
+        <w:t xml:space="preserve"> </w:t>
+      </w:r>
+      <w:r>
+        <w:t xml:space="preserve">the endpoint, it varies: across the eight artifacts the method difference has a standard</w:t>
+      </w:r>
+      <w:r>
+        <w:t xml:space="preserve"> </w:t>
+      </w:r>
+      <w:r>
+        <w:t xml:space="preserve">deviation of</w:t>
+      </w:r>
+      <w:r>
+        <w:t xml:space="preserve"> </w:t>
+      </w:r>
+      <m:oMath>
+        <m:r>
+          <m:t>0.301</m:t>
+        </m:r>
+      </m:oMath>
+      <w:r>
+        <w:t xml:space="preserve">, about</w:t>
+      </w:r>
+      <w:r>
+        <w:t xml:space="preserve"> </w:t>
+      </w:r>
+      <m:oMath>
+        <m:r>
+          <m:t>3.65</m:t>
+        </m:r>
+      </m:oMath>
+      <w:r>
+        <w:t xml:space="preserve"> </w:t>
+      </w:r>
+      <w:r>
+        <w:t xml:space="preserve">times the detectable effect the design was sized for,</w:t>
+      </w:r>
+      <w:r>
+        <w:t xml:space="preserve"> </w:t>
+      </w:r>
+      <w:r>
+        <w:t xml:space="preserve">and the variance of that difference is</w:t>
+      </w:r>
+      <w:r>
+        <w:t xml:space="preserve"> </w:t>
+      </w:r>
+      <m:oMath>
+        <m:r>
+          <m:t>1.48</m:t>
+        </m:r>
+      </m:oMath>
+      <w:r>
+        <w:t xml:space="preserve"> </w:t>
+      </w:r>
+      <w:r>
+        <w:t xml:space="preserve">times the variance of the coverage it is</w:t>
+      </w:r>
+      <w:r>
+        <w:t xml:space="preserve"> </w:t>
+      </w:r>
+      <w:r>
+        <w:t xml:space="preserve">measuring. The difference also changes sign, ranging from</w:t>
+      </w:r>
+      <w:r>
+        <w:t xml:space="preserve"> </w:t>
+      </w:r>
+      <m:oMath>
+        <m:r>
+          <m:rPr>
+            <m:sty m:val="p"/>
+          </m:rPr>
+          <m:t>−</m:t>
+        </m:r>
+        <m:r>
+          <m:t>0.167</m:t>
+        </m:r>
+      </m:oMath>
+      <w:r>
+        <w:t xml:space="preserve"> </w:t>
+      </w:r>
+      <w:r>
+        <w:t xml:space="preserve">to</w:t>
+      </w:r>
+      <w:r>
+        <w:t xml:space="preserve"> </w:t>
+      </w:r>
+      <m:oMath>
+        <m:r>
+          <m:rPr>
+            <m:sty m:val="p"/>
+          </m:rPr>
+          <m:t>+</m:t>
+        </m:r>
+        <m:r>
+          <m:t>0.667</m:t>
+        </m:r>
+      </m:oMath>
+      <w:r>
+        <w:t xml:space="preserve">, so no</w:t>
+      </w:r>
+      <w:r>
+        <w:t xml:space="preserve"> </w:t>
+      </w:r>
+      <w:r>
+        <w:t xml:space="preserve">constant adjustment recovers the earlier number.</w:t>
+      </w:r>
+    </w:p>
+    <w:p>
+      <w:pPr>
+        <w:pStyle w:val="BodyText"/>
+      </w:pPr>
+      <w:r>
+        <w:t xml:space="preserve">The paired minimum detectable effect is therefore void as a design target. It was computed</w:t>
+      </w:r>
+      <w:r>
+        <w:t xml:space="preserve"> </w:t>
+      </w:r>
+      <w:r>
+        <w:t xml:space="preserve">with the scoring method treated as fixed, and so omits a variance component larger than the</w:t>
+      </w:r>
+      <w:r>
+        <w:t xml:space="preserve"> </w:t>
+      </w:r>
+      <w:r>
+        <w:t xml:space="preserve">one it used. Sizing a block on it would be sizing on the smaller half of the problem.</w:t>
+      </w:r>
+      <w:r>
+        <w:t xml:space="preserve"> </w:t>
+      </w:r>
+      <w:r>
+        <w:t xml:space="preserve">Sample-size planning has to treat the scoring method as a facet with its own variance,</w:t>
+      </w:r>
+      <w:r>
+        <w:t xml:space="preserve"> </w:t>
+      </w:r>
+      <w:r>
+        <w:t xml:space="preserve">which is what generalizability designs do and what this design did not. That replacement</w:t>
+      </w:r>
+      <w:r>
+        <w:t xml:space="preserve"> </w:t>
+      </w:r>
+      <w:r>
+        <w:t xml:space="preserve">is not yet built, and the facet estimated here rests on eight artifacts judged by one</w:t>
+      </w:r>
+      <w:r>
+        <w:t xml:space="preserve"> </w:t>
+      </w:r>
+      <w:r>
+        <w:t xml:space="preserve">model, so it needs its own measurement before it can carry a plan.</w:t>
       </w:r>
     </w:p>
     <w:p>

</xml_diff>

<commit_message>
feat(paper): rebuild sizing as a generalizability design and abandon the quality arm
</commit_message>
<xml_diff>
--- a/paper/word/graduation-thesis.docx
+++ b/paper/word/graduation-thesis.docx
@@ -6407,19 +6407,211 @@
         <w:t xml:space="preserve"> </w:t>
       </w:r>
       <w:r>
-        <w:t xml:space="preserve">which is what generalizability designs do and what this design did not. That replacement</w:t>
-      </w:r>
-      <w:r>
-        <w:t xml:space="preserve"> </w:t>
-      </w:r>
-      <w:r>
-        <w:t xml:space="preserve">is not yet built, and the facet estimated here rests on eight artifacts judged by one</w:t>
-      </w:r>
-      <w:r>
-        <w:t xml:space="preserve"> </w:t>
-      </w:r>
-      <w:r>
-        <w:t xml:space="preserve">model, so it needs its own measurement before it can carry a plan.</w:t>
+        <w:t xml:space="preserve">which is what generalizability designs do and what this design did not. That replacement was then built and run.</w:t>
+      </w:r>
+    </w:p>
+    <w:p>
+      <w:pPr>
+        <w:pStyle w:val="BodyText"/>
+      </w:pPr>
+      <w:r>
+        <w:t xml:space="preserve">Treating the condition as the object of measurement and the scoring method and anchor</w:t>
+      </w:r>
+      <w:r>
+        <w:t xml:space="preserve"> </w:t>
+      </w:r>
+      <w:r>
+        <w:t xml:space="preserve">element as crossed facets, one study per task, gives a blunt answer. The condition carries</w:t>
+      </w:r>
+      <w:r>
+        <w:t xml:space="preserve"> </w:t>
+      </w:r>
+      <w:r>
+        <w:t xml:space="preserve">almost none of the endpoint variance:</w:t>
+      </w:r>
+      <w:r>
+        <w:t xml:space="preserve"> </w:t>
+      </w:r>
+      <m:oMath>
+        <m:r>
+          <m:t>0.9</m:t>
+        </m:r>
+        <m:r>
+          <m:rPr>
+            <m:sty m:val="p"/>
+          </m:rPr>
+          <m:t>%</m:t>
+        </m:r>
+      </m:oMath>
+      <w:r>
+        <w:t xml:space="preserve"> </w:t>
+      </w:r>
+      <w:r>
+        <w:t xml:space="preserve">of the clamped total in the first task, and</w:t>
+      </w:r>
+      <w:r>
+        <w:t xml:space="preserve"> </w:t>
+      </w:r>
+      <w:r>
+        <w:t xml:space="preserve">in the second the estimate is negative and clamps to zero. What dominates is element</w:t>
+      </w:r>
+      <w:r>
+        <w:t xml:space="preserve"> </w:t>
+      </w:r>
+      <w:r>
+        <w:t xml:space="preserve">difficulty at</w:t>
+      </w:r>
+      <w:r>
+        <w:t xml:space="preserve"> </w:t>
+      </w:r>
+      <m:oMath>
+        <m:r>
+          <m:t>47.9</m:t>
+        </m:r>
+        <m:r>
+          <m:rPr>
+            <m:sty m:val="p"/>
+          </m:rPr>
+          <m:t>%</m:t>
+        </m:r>
+      </m:oMath>
+      <w:r>
+        <w:t xml:space="preserve"> </w:t>
+      </w:r>
+      <w:r>
+        <w:t xml:space="preserve">and residual at</w:t>
+      </w:r>
+      <w:r>
+        <w:t xml:space="preserve"> </w:t>
+      </w:r>
+      <m:oMath>
+        <m:r>
+          <m:t>37.1</m:t>
+        </m:r>
+        <m:r>
+          <m:rPr>
+            <m:sty m:val="p"/>
+          </m:rPr>
+          <m:t>%</m:t>
+        </m:r>
+      </m:oMath>
+      <w:r>
+        <w:t xml:space="preserve"> </w:t>
+      </w:r>
+      <w:r>
+        <w:t xml:space="preserve">in the first task, and residual at</w:t>
+      </w:r>
+      <w:r>
+        <w:t xml:space="preserve"> </w:t>
+      </w:r>
+      <m:oMath>
+        <m:r>
+          <m:t>50.5</m:t>
+        </m:r>
+        <m:r>
+          <m:rPr>
+            <m:sty m:val="p"/>
+          </m:rPr>
+          <m:t>%</m:t>
+        </m:r>
+      </m:oMath>
+      <w:r>
+        <w:t xml:space="preserve"> </w:t>
+      </w:r>
+      <w:r>
+        <w:t xml:space="preserve">in the second. Dependability as the study was run is</w:t>
+      </w:r>
+      <w:r>
+        <w:t xml:space="preserve"> </w:t>
+      </w:r>
+      <m:oMath>
+        <m:r>
+          <m:t>0.040</m:t>
+        </m:r>
+      </m:oMath>
+      <w:r>
+        <w:t xml:space="preserve"> </w:t>
+      </w:r>
+      <w:r>
+        <w:t xml:space="preserve">and</w:t>
+      </w:r>
+      <w:r>
+        <w:t xml:space="preserve"> </w:t>
+      </w:r>
+      <m:oMath>
+        <m:r>
+          <m:t>0.000</m:t>
+        </m:r>
+      </m:oMath>
+      <w:r>
+        <w:t xml:space="preserve">, and no element</w:t>
+      </w:r>
+      <w:r>
+        <w:t xml:space="preserve"> </w:t>
+      </w:r>
+      <w:r>
+        <w:t xml:space="preserve">count within the search cap reaches</w:t>
+      </w:r>
+      <w:r>
+        <w:t xml:space="preserve"> </w:t>
+      </w:r>
+      <m:oMath>
+        <m:r>
+          <m:t>0.8</m:t>
+        </m:r>
+      </m:oMath>
+      <w:r>
+        <w:t xml:space="preserve">, because additional measurement cannot enlarge a</w:t>
+      </w:r>
+      <w:r>
+        <w:t xml:space="preserve"> </w:t>
+      </w:r>
+      <w:r>
+        <w:t xml:space="preserve">signal estimated at zero.</w:t>
+      </w:r>
+    </w:p>
+    <w:p>
+      <w:pPr>
+        <w:pStyle w:val="BodyText"/>
+      </w:pPr>
+      <w:r>
+        <w:t xml:space="preserve">The consequence is that a block size was the wrong question. The quality arm cannot be</w:t>
+      </w:r>
+      <w:r>
+        <w:t xml:space="preserve"> </w:t>
+      </w:r>
+      <w:r>
+        <w:t xml:space="preserve">rescued by adding episodes, since the endpoint as constructed does not separate the</w:t>
+      </w:r>
+      <w:r>
+        <w:t xml:space="preserve"> </w:t>
+      </w:r>
+      <w:r>
+        <w:t xml:space="preserve">conditions it was built to compare. Either the endpoint changes or no condition claim is</w:t>
+      </w:r>
+      <w:r>
+        <w:t xml:space="preserve"> </w:t>
+      </w:r>
+      <w:r>
+        <w:t xml:space="preserve">available from it. Four conditions leave the condition component three degrees of freedom,</w:t>
+      </w:r>
+      <w:r>
+        <w:t xml:space="preserve"> </w:t>
+      </w:r>
+      <w:r>
+        <w:t xml:space="preserve">so this estimate is itself imprecise, and negative components indicate quantities small</w:t>
+      </w:r>
+      <w:r>
+        <w:t xml:space="preserve"> </w:t>
+      </w:r>
+      <w:r>
+        <w:t xml:space="preserve">relative to their sampling error rather than quantities known to be zero. That caveat</w:t>
+      </w:r>
+      <w:r>
+        <w:t xml:space="preserve"> </w:t>
+      </w:r>
+      <w:r>
+        <w:t xml:space="preserve">weakens the precision of the number, not the direction of the conclusion.</w:t>
       </w:r>
     </w:p>
     <w:p>

</xml_diff>

<commit_message>
feat(paper): contrast endpoint sensitivity against a confirmed manipulation
</commit_message>
<xml_diff>
--- a/paper/word/graduation-thesis.docx
+++ b/paper/word/graduation-thesis.docx
@@ -6612,6 +6612,166 @@
       </w:r>
       <w:r>
         <w:t xml:space="preserve">weakens the precision of the number, not the direction of the conclusion.</w:t>
+      </w:r>
+    </w:p>
+    <w:p>
+      <w:pPr>
+        <w:pStyle w:val="BodyText"/>
+      </w:pPr>
+      <w:r>
+        <w:t xml:space="preserve">One further check separates two very different explanations for that result. Every other</w:t>
+      </w:r>
+      <w:r>
+        <w:t xml:space="preserve"> </w:t>
+      </w:r>
+      <w:r>
+        <w:t xml:space="preserve">quantity recorded per episode was examined for the same thing: how much of its variance</w:t>
+      </w:r>
+      <w:r>
+        <w:t xml:space="preserve"> </w:t>
+      </w:r>
+      <w:r>
+        <w:t xml:space="preserve">lies between condition means. Process quantities separate the conditions sharply, with</w:t>
+      </w:r>
+      <w:r>
+        <w:t xml:space="preserve"> </w:t>
+      </w:r>
+      <w:r>
+        <w:t xml:space="preserve">interface calls at</w:t>
+      </w:r>
+      <w:r>
+        <w:t xml:space="preserve"> </w:t>
+      </w:r>
+      <m:oMath>
+        <m:r>
+          <m:t>0.899</m:t>
+        </m:r>
+      </m:oMath>
+      <w:r>
+        <w:t xml:space="preserve"> </w:t>
+      </w:r>
+      <w:r>
+        <w:t xml:space="preserve">and</w:t>
+      </w:r>
+      <w:r>
+        <w:t xml:space="preserve"> </w:t>
+      </w:r>
+      <m:oMath>
+        <m:r>
+          <m:t>0.951</m:t>
+        </m:r>
+      </m:oMath>
+      <w:r>
+        <w:t xml:space="preserve"> </w:t>
+      </w:r>
+      <w:r>
+        <w:t xml:space="preserve">across the two tasks and context tokens at</w:t>
+      </w:r>
+      <w:r>
+        <w:t xml:space="preserve"> </w:t>
+      </w:r>
+      <m:oMath>
+        <m:r>
+          <m:t>0.915</m:t>
+        </m:r>
+      </m:oMath>
+      <w:r>
+        <w:t xml:space="preserve"> </w:t>
+      </w:r>
+      <w:r>
+        <w:t xml:space="preserve">and</w:t>
+      </w:r>
+      <w:r>
+        <w:t xml:space="preserve"> </w:t>
+      </w:r>
+      <m:oMath>
+        <m:r>
+          <m:t>0.925</m:t>
+        </m:r>
+      </m:oMath>
+      <w:r>
+        <w:t xml:space="preserve">. Artifact quantities separate them weakly, with artifact size at</w:t>
+      </w:r>
+      <w:r>
+        <w:t xml:space="preserve"> </w:t>
+      </w:r>
+      <m:oMath>
+        <m:r>
+          <m:t>0.367</m:t>
+        </m:r>
+      </m:oMath>
+      <w:r>
+        <w:t xml:space="preserve"> </w:t>
+      </w:r>
+      <w:r>
+        <w:t xml:space="preserve">and</w:t>
+      </w:r>
+      <w:r>
+        <w:t xml:space="preserve"> </w:t>
+      </w:r>
+      <m:oMath>
+        <m:r>
+          <m:t>0.702</m:t>
+        </m:r>
+      </m:oMath>
+      <w:r>
+        <w:t xml:space="preserve">. Judged coverage separates them not at all.</w:t>
+      </w:r>
+    </w:p>
+    <w:p>
+      <w:pPr>
+        <w:pStyle w:val="BodyText"/>
+      </w:pPr>
+      <w:r>
+        <w:t xml:space="preserve">The process figures are close to definitional and are read as a manipulation check rather</w:t>
+      </w:r>
+      <w:r>
+        <w:t xml:space="preserve"> </w:t>
+      </w:r>
+      <w:r>
+        <w:t xml:space="preserve">than as an effect: a condition that supplies more context and more interface access will</w:t>
+      </w:r>
+      <w:r>
+        <w:t xml:space="preserve"> </w:t>
+      </w:r>
+      <w:r>
+        <w:t xml:space="preserve">make more calls and consume more tokens almost by construction. What they establish is that</w:t>
+      </w:r>
+      <w:r>
+        <w:t xml:space="preserve"> </w:t>
+      </w:r>
+      <w:r>
+        <w:t xml:space="preserve">the manipulation took effect, and took effect strongly. Set beside a judged endpoint that</w:t>
+      </w:r>
+      <w:r>
+        <w:t xml:space="preserve"> </w:t>
+      </w:r>
+      <w:r>
+        <w:t xml:space="preserve">sees nothing, this leaves two readings alive. Either the conditions do not change the</w:t>
+      </w:r>
+      <w:r>
+        <w:t xml:space="preserve"> </w:t>
+      </w:r>
+      <w:r>
+        <w:t xml:space="preserve">quality of the artifact, or the endpoint cannot see the change they make. This design</w:t>
+      </w:r>
+      <w:r>
+        <w:t xml:space="preserve"> </w:t>
+      </w:r>
+      <w:r>
+        <w:t xml:space="preserve">cannot distinguish them. The falsified retrieval filter and the near-zero condition</w:t>
+      </w:r>
+      <w:r>
+        <w:t xml:space="preserve"> </w:t>
+      </w:r>
+      <w:r>
+        <w:t xml:space="preserve">component both sit on the second branch, which is a reason to suspect the instrument</w:t>
+      </w:r>
+      <w:r>
+        <w:t xml:space="preserve"> </w:t>
+      </w:r>
+      <w:r>
+        <w:t xml:space="preserve">before concluding anything about the conditions.</w:t>
       </w:r>
     </w:p>
     <w:p>

</xml_diff>

<commit_message>
feat(paper): re-run the generalizability study on the repaired endpoint
</commit_message>
<xml_diff>
--- a/paper/word/graduation-thesis.docx
+++ b/paper/word/graduation-thesis.docx
@@ -6772,6 +6772,116 @@
       </w:r>
       <w:r>
         <w:t xml:space="preserve">before concluding anything about the conditions.</w:t>
+      </w:r>
+    </w:p>
+    <w:p>
+      <w:pPr>
+        <w:pStyle w:val="BodyText"/>
+      </w:pPr>
+      <w:r>
+        <w:t xml:space="preserve">That suspicion was then acted on. The endpoint was rebuilt without the falsified retrieval</w:t>
+      </w:r>
+      <w:r>
+        <w:t xml:space="preserve"> </w:t>
+      </w:r>
+      <w:r>
+        <w:t xml:space="preserve">stage and with a genuine second repeat, so that within-cell variation estimates error</w:t>
+      </w:r>
+      <w:r>
+        <w:t xml:space="preserve"> </w:t>
+      </w:r>
+      <w:r>
+        <w:t xml:space="preserve">directly instead of being confounded with the interaction, which required judging a further</w:t>
+      </w:r>
+      <w:r>
+        <w:t xml:space="preserve"> </w:t>
+      </w:r>
+      <w:r>
+        <w:t xml:space="preserve">forty-two elements on the full artifact. The condition component did not appear. Its share</w:t>
+      </w:r>
+      <w:r>
+        <w:t xml:space="preserve"> </w:t>
+      </w:r>
+      <w:r>
+        <w:t xml:space="preserve">is</w:t>
+      </w:r>
+      <w:r>
+        <w:t xml:space="preserve"> </w:t>
+      </w:r>
+      <m:oMath>
+        <m:r>
+          <m:t>0.026</m:t>
+        </m:r>
+      </m:oMath>
+      <w:r>
+        <w:t xml:space="preserve"> </w:t>
+      </w:r>
+      <w:r>
+        <w:t xml:space="preserve">in the first task and a clamped zero in the second, against</w:t>
+      </w:r>
+      <w:r>
+        <w:t xml:space="preserve"> </w:t>
+      </w:r>
+      <m:oMath>
+        <m:r>
+          <m:t>0.009</m:t>
+        </m:r>
+      </m:oMath>
+      <w:r>
+        <w:t xml:space="preserve"> </w:t>
+      </w:r>
+      <w:r>
+        <w:t xml:space="preserve">and zero</w:t>
+      </w:r>
+      <w:r>
+        <w:t xml:space="preserve"> </w:t>
+      </w:r>
+      <w:r>
+        <w:t xml:space="preserve">before repair, while element difficulty and residual continue to dominate.</w:t>
+      </w:r>
+    </w:p>
+    <w:p>
+      <w:pPr>
+        <w:pStyle w:val="BodyText"/>
+      </w:pPr>
+      <w:r>
+        <w:t xml:space="preserve">This addresses the insensitive-endpoint reading on its own terms and weakens it. The</w:t>
+      </w:r>
+      <w:r>
+        <w:t xml:space="preserve"> </w:t>
+      </w:r>
+      <w:r>
+        <w:t xml:space="preserve">reading that survives better is that these conditions change the process a great deal</w:t>
+      </w:r>
+      <w:r>
+        <w:t xml:space="preserve"> </w:t>
+      </w:r>
+      <w:r>
+        <w:t xml:space="preserve">without changing what a judge sees in the artifact. It is not a null result and is not</w:t>
+      </w:r>
+      <w:r>
+        <w:t xml:space="preserve"> </w:t>
+      </w:r>
+      <w:r>
+        <w:t xml:space="preserve">reported as one: the second task contributed three conditions rather than four because one</w:t>
+      </w:r>
+      <w:r>
+        <w:t xml:space="preserve"> </w:t>
+      </w:r>
+      <w:r>
+        <w:t xml:space="preserve">episode was refused at the ceiling, both tasks rest on two repeats, and no human-anchored</w:t>
+      </w:r>
+      <w:r>
+        <w:t xml:space="preserve"> </w:t>
+      </w:r>
+      <w:r>
+        <w:t xml:space="preserve">calibration exists, so the verdicts remain inadmissible for scoring. What has been narrowed</w:t>
+      </w:r>
+      <w:r>
+        <w:t xml:space="preserve"> </w:t>
+      </w:r>
+      <w:r>
+        <w:t xml:space="preserve">is which explanation is more plausible, not whether an effect exists.</w:t>
       </w:r>
     </w:p>
     <w:p>

</xml_diff>

<commit_message>
feat(paper): open the thesis form workstream with enforced A4 and figure specifications
</commit_message>
<xml_diff>
--- a/paper/word/graduation-thesis.docx
+++ b/paper/word/graduation-thesis.docx
@@ -14163,6 +14163,7 @@
     <w:bookmarkEnd w:id="122"/>
     <w:sectPr>
       <w:footerReference w:type="default" r:id="rIdFtr1"/>
+      <w:pgSz w:h="16838" w:w="11906"/>
       <w:footnotePr>
         <w:numRestart w:val="eachSect"/>
       </w:footnotePr>
@@ -14436,7 +14437,7 @@
     </w:rPrDefault>
     <w:pPrDefault>
       <w:pPr>
-        <w:spacing w:after="200"/>
+        <w:spacing w:after="0" w:before="0" w:line="480" w:lineRule="auto"/>
       </w:pPr>
     </w:pPrDefault>
   </w:docDefaults>
@@ -14451,7 +14452,7 @@
     <w:link w:val="BodyTextChar"/>
     <w:qFormat/>
     <w:pPr>
-      <w:spacing w:after="180" w:before="180"/>
+      <w:spacing w:line="480" w:lineRule="auto"/>
     </w:pPr>
   </w:style>
   <w:style w:customStyle="1" w:styleId="FirstParagraph" w:type="paragraph">

</xml_diff>

<commit_message>
fix(paper): name the calibration anchor as a model and account for judge spend
</commit_message>
<xml_diff>
--- a/paper/word/graduation-thesis.docx
+++ b/paper/word/graduation-thesis.docx
@@ -248,19 +248,7 @@
         <w:t xml:space="preserve"> </w:t>
       </w:r>
       <w:r>
-        <w:t xml:space="preserve">result, or field-instance outcome. Judged scoring remains inadmissible until a</w:t>
-      </w:r>
-      <w:r>
-        <w:t xml:space="preserve"> </w:t>
-      </w:r>
-      <w:r>
-        <w:t xml:space="preserve">human-anchored calibration set exists, and the contribution is the instrument</w:t>
-      </w:r>
-      <w:r>
-        <w:t xml:space="preserve"> </w:t>
-      </w:r>
-      <w:r>
-        <w:t xml:space="preserve">discipline and its recorded failures rather than a measured effect.</w:t>
+        <w:t xml:space="preserve">result, or field-instance outcome. Judged scoring remains inadmissible: the calibration labels that arrived were written by a language model rather than a person, and the contribution is the instrument discipline and its recorded failures rather than a measured effect.</w:t>
       </w:r>
     </w:p>
     <w:bookmarkStart w:id="15" w:name="introduction"/>
@@ -1606,7 +1594,7 @@
         <w:t xml:space="preserve"> </w:t>
       </w:r>
       <w:r>
-        <w:t xml:space="preserve">threshold whose error bound is certified on blinded human-anchored labels, using</w:t>
+        <w:t xml:space="preserve">threshold whose error bound is certified on blinded labels from an anchor outside the judged pipeline, using</w:t>
       </w:r>
       <w:r>
         <w:t xml:space="preserve"> </w:t>
@@ -6255,13 +6243,7 @@
         <w:t xml:space="preserve"> </w:t>
       </w:r>
       <w:r>
-        <w:t xml:space="preserve">condition. These verdicts also remain inadmissible for scoring, because no human-anchored</w:t>
-      </w:r>
-      <w:r>
-        <w:t xml:space="preserve"> </w:t>
-      </w:r>
-      <w:r>
-        <w:t xml:space="preserve">calibration set exists.</w:t>
+        <w:t xml:space="preserve">condition. These verdicts also remain inadmissible for scoring, because the calibration anchor is a language model rather than a person and yields fewer decidable labels than the protocol requires.</w:t>
       </w:r>
     </w:p>
     <w:p>
@@ -6869,13 +6851,7 @@
         <w:t xml:space="preserve"> </w:t>
       </w:r>
       <w:r>
-        <w:t xml:space="preserve">episode was refused at the ceiling, both tasks rest on two repeats, and no human-anchored</w:t>
-      </w:r>
-      <w:r>
-        <w:t xml:space="preserve"> </w:t>
-      </w:r>
-      <w:r>
-        <w:t xml:space="preserve">calibration exists, so the verdicts remain inadmissible for scoring. What has been narrowed</w:t>
+        <w:t xml:space="preserve">episode was refused at the ceiling, both tasks rest on two repeats, and the calibration anchor is a model rather than a person, so the verdicts remain inadmissible for scoring. What has been narrowed</w:t>
       </w:r>
       <w:r>
         <w:t xml:space="preserve"> </w:t>
@@ -6913,13 +6889,7 @@
         <w:t xml:space="preserve"> </w:t>
       </w:r>
       <w:r>
-        <w:t xml:space="preserve">No verdict is admitted as a score until a blinded human-anchored calibration set</w:t>
-      </w:r>
-      <w:r>
-        <w:t xml:space="preserve"> </w:t>
-      </w:r>
-      <w:r>
-        <w:t xml:space="preserve">certifies an error bound.</w:t>
+        <w:t xml:space="preserve">No verdict is admitted as a score until a blinded calibration set certifies an error bound.</w:t>
       </w:r>
     </w:p>
     <w:bookmarkEnd w:id="53"/>
@@ -10276,27 +10246,21 @@
         <w:t xml:space="preserve"> </w:t>
       </w:r>
       <w:r>
-        <w:t xml:space="preserve">no judge in the loop. Design quality is not, and it is blocked twice: judged scoring</w:t>
-      </w:r>
-      <w:r>
-        <w:t xml:space="preserve"> </w:t>
-      </w:r>
-      <w:r>
-        <w:t xml:space="preserve">remains inadmissible with</w:t>
+        <w:t xml:space="preserve">no judge in the loop. Design quality is not, and it is blocked twice: judged scoring remains inadmissible with</w:t>
       </w:r>
       <w:r>
         <w:t xml:space="preserve"> </w:t>
       </w:r>
       <m:oMath>
         <m:r>
-          <m:t>0</m:t>
+          <m:t>19</m:t>
         </m:r>
       </m:oMath>
       <w:r>
         <w:t xml:space="preserve"> </w:t>
       </w:r>
       <w:r>
-        <w:t xml:space="preserve">of</w:t>
+        <w:t xml:space="preserve">of the required</w:t>
       </w:r>
       <w:r>
         <w:t xml:space="preserve"> </w:t>
@@ -10310,7 +10274,7 @@
         <w:t xml:space="preserve"> </w:t>
       </w:r>
       <w:r>
-        <w:t xml:space="preserve">human-anchored labels collected, and the endpoint</w:t>
+        <w:t xml:space="preserve">decidable labels collected, and those from a model rather than a person, and the endpoint</w:t>
       </w:r>
       <w:r>
         <w:t xml:space="preserve"> </w:t>
@@ -10684,19 +10648,165 @@
         <w:t xml:space="preserve"> </w:t>
       </w:r>
       <w:r>
-        <w:t xml:space="preserve">rather than on outcomes. Judged verdicts remain inadmissible until a blinded</w:t>
-      </w:r>
-      <w:r>
-        <w:t xml:space="preserve"> </w:t>
-      </w:r>
-      <w:r>
-        <w:t xml:space="preserve">human-anchored calibration set certifies an error bound, and that set is the one</w:t>
-      </w:r>
-      <w:r>
-        <w:t xml:space="preserve"> </w:t>
-      </w:r>
-      <w:r>
-        <w:t xml:space="preserve">component this system cannot produce for itself. The nine-area architecture</w:t>
+        <w:t xml:space="preserve">rather than on outcomes. Judged verdicts remain inadmissible until a blinded calibration set certifies an error bound. Labels were supplied during this work, but by a language model rather than a person, which is why the requirement is restated rather than discharged: a human anchor remains the one component this system cannot produce for itself.</w:t>
+      </w:r>
+    </w:p>
+    <w:p>
+      <w:pPr>
+        <w:pStyle w:val="BodyText"/>
+      </w:pPr>
+      <w:r>
+        <w:t xml:space="preserve">Those labels arrived while this work was in progress, and their nature changes what they</w:t>
+      </w:r>
+      <w:r>
+        <w:t xml:space="preserve"> </w:t>
+      </w:r>
+      <w:r>
+        <w:t xml:space="preserve">can support. Twenty-five items were labelled, of which</w:t>
+      </w:r>
+      <w:r>
+        <w:t xml:space="preserve"> </w:t>
+      </w:r>
+      <m:oMath>
+        <m:r>
+          <m:t>19</m:t>
+        </m:r>
+      </m:oMath>
+      <w:r>
+        <w:t xml:space="preserve"> </w:t>
+      </w:r>
+      <w:r>
+        <w:t xml:space="preserve">are decidable and</w:t>
+      </w:r>
+      <w:r>
+        <w:t xml:space="preserve"> </w:t>
+      </w:r>
+      <m:oMath>
+        <m:r>
+          <m:t>6</m:t>
+        </m:r>
+      </m:oMath>
+      <w:r>
+        <w:t xml:space="preserve"> </w:t>
+      </w:r>
+      <w:r>
+        <w:t xml:space="preserve">are</w:t>
+      </w:r>
+      <w:r>
+        <w:t xml:space="preserve"> </w:t>
+      </w:r>
+      <w:r>
+        <w:t xml:space="preserve">marked unclear and excluded by protocol. A blind second pass agrees on</w:t>
+      </w:r>
+      <w:r>
+        <w:t xml:space="preserve"> </w:t>
+      </w:r>
+      <m:oMath>
+        <m:r>
+          <m:t>24</m:t>
+        </m:r>
+      </m:oMath>
+      <w:r>
+        <w:t xml:space="preserve"> </w:t>
+      </w:r>
+      <w:r>
+        <w:t xml:space="preserve">of</w:t>
+      </w:r>
+      <w:r>
+        <w:t xml:space="preserve"> </w:t>
+      </w:r>
+      <m:oMath>
+        <m:r>
+          <m:t>25</m:t>
+        </m:r>
+      </m:oMath>
+      <w:r>
+        <w:t xml:space="preserve"> </w:t>
+      </w:r>
+      <w:r>
+        <w:t xml:space="preserve">items</w:t>
+      </w:r>
+      <w:r>
+        <w:t xml:space="preserve"> </w:t>
+      </w:r>
+      <w:r>
+        <w:t xml:space="preserve">and on</w:t>
+      </w:r>
+      <w:r>
+        <w:t xml:space="preserve"> </w:t>
+      </w:r>
+      <m:oMath>
+        <m:r>
+          <m:t>18</m:t>
+        </m:r>
+      </m:oMath>
+      <w:r>
+        <w:t xml:space="preserve"> </w:t>
+      </w:r>
+      <w:r>
+        <w:t xml:space="preserve">of the</w:t>
+      </w:r>
+      <w:r>
+        <w:t xml:space="preserve"> </w:t>
+      </w:r>
+      <m:oMath>
+        <m:r>
+          <m:t>18</m:t>
+        </m:r>
+      </m:oMath>
+      <w:r>
+        <w:t xml:space="preserve"> </w:t>
+      </w:r>
+      <w:r>
+        <w:t xml:space="preserve">pairs where neither pass says unclear. Both passes, however, were</w:t>
+      </w:r>
+      <w:r>
+        <w:t xml:space="preserve"> </w:t>
+      </w:r>
+      <w:r>
+        <w:t xml:space="preserve">performed by language models rather than by people. The set is therefore named a</w:t>
+      </w:r>
+      <w:r>
+        <w:t xml:space="preserve"> </w:t>
+      </w:r>
+      <w:r>
+        <w:t xml:space="preserve">model-anchored calibration set throughout, never a human-anchored one. Provider</w:t>
+      </w:r>
+      <w:r>
+        <w:t xml:space="preserve"> </w:t>
+      </w:r>
+      <w:r>
+        <w:t xml:space="preserve">independence is preserved, because the labeller is from a different provider family than</w:t>
+      </w:r>
+      <w:r>
+        <w:t xml:space="preserve"> </w:t>
+      </w:r>
+      <w:r>
+        <w:t xml:space="preserve">both the judges and the treatment model, but a different provider is not a different kind</w:t>
+      </w:r>
+      <w:r>
+        <w:t xml:space="preserve"> </w:t>
+      </w:r>
+      <w:r>
+        <w:t xml:space="preserve">of reader: systematic misreadings common to language models would be inherited rather than</w:t>
+      </w:r>
+      <w:r>
+        <w:t xml:space="preserve"> </w:t>
+      </w:r>
+      <w:r>
+        <w:t xml:space="preserve">detected, and an agreement figure computed between two models cannot reveal that. Judged</w:t>
+      </w:r>
+      <w:r>
+        <w:t xml:space="preserve"> </w:t>
+      </w:r>
+      <w:r>
+        <w:t xml:space="preserve">scoring accordingly remains inadmissible, on two separate grounds: too few decidable labels,</w:t>
+      </w:r>
+      <w:r>
+        <w:t xml:space="preserve"> </w:t>
+      </w:r>
+      <w:r>
+        <w:t xml:space="preserve">and an anchor that is not human. The nine-area architecture</w:t>
       </w:r>
       <w:r>
         <w:t xml:space="preserve"> </w:t>

</xml_diff>

<commit_message>
feat(paper): pin a Korean font in the toolchain and render Korean in the deterministic build
</commit_message>
<xml_diff>
--- a/paper/word/graduation-thesis.docx
+++ b/paper/word/graduation-thesis.docx
@@ -6,6 +6,12 @@
       <w:pPr>
         <w:pStyle w:val="Title"/>
       </w:pPr>
+      <w:r>
+        <w:t xml:space="preserve">장기 자율 연구개발을 위한 대규모 언어모델 에이전트 하네스의 설계와 평가</w:t>
+      </w:r>
+      <w:r>
+        <w:br/>
+      </w:r>
       <w:r>
         <w:t xml:space="preserve">Design and Evaluation of an LLM Agent Harness for Long-Horizon Autonomous R&amp;D</w:t>
       </w:r>

</xml_diff>

<commit_message>
fix(paper): apply Apple SD Gothic Neo font and fix heading layout in Korean PDF export
</commit_message>
<xml_diff>
--- a/paper/word/graduation-thesis.docx
+++ b/paper/word/graduation-thesis.docx
@@ -465,7 +465,7 @@
                     <a:graphicData uri="http://schemas.openxmlformats.org/drawingml/2006/picture">
                       <pic:pic>
                         <pic:nvPicPr>
-                          <pic:cNvPr descr="../figures/rendered/fig-01.png" id="15" name="Picture"/>
+                          <pic:cNvPr descr="figures/rendered/fig-01.png" id="15" name="Picture"/>
                           <pic:cNvPicPr>
                             <a:picLocks noChangeArrowheads="1" noChangeAspect="1"/>
                           </pic:cNvPicPr>
@@ -1510,7 +1510,7 @@
                     <a:graphicData uri="http://schemas.openxmlformats.org/drawingml/2006/picture">
                       <pic:pic>
                         <pic:nvPicPr>
-                          <pic:cNvPr descr="../figures/rendered/fig-09.png" id="31" name="Picture"/>
+                          <pic:cNvPr descr="figures/rendered/fig-09.png" id="31" name="Picture"/>
                           <pic:cNvPicPr>
                             <a:picLocks noChangeArrowheads="1" noChangeAspect="1"/>
                           </pic:cNvPicPr>
@@ -2558,7 +2558,7 @@
                     <a:graphicData uri="http://schemas.openxmlformats.org/drawingml/2006/picture">
                       <pic:pic>
                         <pic:nvPicPr>
-                          <pic:cNvPr descr="../figures/rendered/fig-02.png" id="41" name="Picture"/>
+                          <pic:cNvPr descr="figures/rendered/fig-02.png" id="41" name="Picture"/>
                           <pic:cNvPicPr>
                             <a:picLocks noChangeArrowheads="1" noChangeAspect="1"/>
                           </pic:cNvPicPr>
@@ -2704,7 +2704,7 @@
                     <a:graphicData uri="http://schemas.openxmlformats.org/drawingml/2006/picture">
                       <pic:pic>
                         <pic:nvPicPr>
-                          <pic:cNvPr descr="../figures/rendered/fig-03.png" id="46" name="Picture"/>
+                          <pic:cNvPr descr="figures/rendered/fig-03.png" id="46" name="Picture"/>
                           <pic:cNvPicPr>
                             <a:picLocks noChangeArrowheads="1" noChangeAspect="1"/>
                           </pic:cNvPicPr>
@@ -2851,7 +2851,7 @@
                     <a:graphicData uri="http://schemas.openxmlformats.org/drawingml/2006/picture">
                       <pic:pic>
                         <pic:nvPicPr>
-                          <pic:cNvPr descr="../figures/rendered/fig-04.png" id="51" name="Picture"/>
+                          <pic:cNvPr descr="figures/rendered/fig-04.png" id="51" name="Picture"/>
                           <pic:cNvPicPr>
                             <a:picLocks noChangeArrowheads="1" noChangeAspect="1"/>
                           </pic:cNvPicPr>
@@ -3031,7 +3031,7 @@
                     <a:graphicData uri="http://schemas.openxmlformats.org/drawingml/2006/picture">
                       <pic:pic>
                         <pic:nvPicPr>
-                          <pic:cNvPr descr="../figures/rendered/fig-05.png" id="56" name="Picture"/>
+                          <pic:cNvPr descr="figures/rendered/fig-05.png" id="56" name="Picture"/>
                           <pic:cNvPicPr>
                             <a:picLocks noChangeArrowheads="1" noChangeAspect="1"/>
                           </pic:cNvPicPr>
@@ -3176,7 +3176,7 @@
                     <a:graphicData uri="http://schemas.openxmlformats.org/drawingml/2006/picture">
                       <pic:pic>
                         <pic:nvPicPr>
-                          <pic:cNvPr descr="../figures/rendered/fig-06.png" id="61" name="Picture"/>
+                          <pic:cNvPr descr="figures/rendered/fig-06.png" id="61" name="Picture"/>
                           <pic:cNvPicPr>
                             <a:picLocks noChangeArrowheads="1" noChangeAspect="1"/>
                           </pic:cNvPicPr>
@@ -3643,7 +3643,7 @@
     </w:p>
     <w:bookmarkEnd w:id="64"/>
     <w:bookmarkEnd w:id="65"/>
-    <w:bookmarkStart w:id="87" w:name="experimental-results"/>
+    <w:bookmarkStart w:id="88" w:name="experimental-results"/>
     <w:p>
       <w:pPr>
         <w:pStyle w:val="Heading1"/>
@@ -3718,6 +3718,9 @@
       </w:r>
       <w:r>
         <w:t xml:space="preserve">[54]</w:t>
+      </w:r>
+      <w:r>
+        <w:t xml:space="preserve"> </w:t>
       </w:r>
       <w:r>
         <w:t xml:space="preserve">을 통해, 단서 매칭이 실제 설계 속성이 아니라 지시문에 포함된 표현을 재인용한 문장에 점수를 부여하는 구성 타당도(construct validity) 결함을 입증했다</w:t>
@@ -3797,7 +3800,7 @@
                     <a:graphicData uri="http://schemas.openxmlformats.org/drawingml/2006/picture">
                       <pic:pic>
                         <pic:nvPicPr>
-                          <pic:cNvPr descr="../figures/rendered/fig-07.png" id="69" name="Picture"/>
+                          <pic:cNvPr descr="figures/rendered/fig-07.png" id="69" name="Picture"/>
                           <pic:cNvPicPr>
                             <a:picLocks noChangeArrowheads="1" noChangeAspect="1"/>
                           </pic:cNvPicPr>
@@ -3970,6 +3973,9 @@
         <w:t xml:space="preserve">[63]</w:t>
       </w:r>
       <w:r>
+        <w:t xml:space="preserve"> </w:t>
+      </w:r>
+      <w:r>
         <w:t xml:space="preserve">과 프롬프트 압축 비용</w:t>
       </w:r>
       <w:r>
@@ -3988,6 +3994,9 @@
         <w:t xml:space="preserve">[65]</w:t>
       </w:r>
       <w:r>
+        <w:t xml:space="preserve"> </w:t>
+      </w:r>
+      <w:r>
         <w:t xml:space="preserve">를 정밀하게 계측해야 한다. 언어모델 호출의 무작위성</w:t>
       </w:r>
       <w:r>
@@ -3997,6 +4006,9 @@
         <w:t xml:space="preserve">[66]</w:t>
       </w:r>
       <w:r>
+        <w:t xml:space="preserve"> </w:t>
+      </w:r>
+      <w:r>
         <w:t xml:space="preserve">과 단일 실행 복권(one-run lottery) 효과</w:t>
       </w:r>
       <w:r>
@@ -4006,6 +4018,9 @@
         <w:t xml:space="preserve">[67]</w:t>
       </w:r>
       <w:r>
+        <w:t xml:space="preserve"> </w:t>
+      </w:r>
+      <w:r>
         <w:t xml:space="preserve">로 인해 여러 번의 실행 순서 효과</w:t>
       </w:r>
       <w:r>
@@ -4015,6 +4030,9 @@
         <w:t xml:space="preserve">[68]</w:t>
       </w:r>
       <w:r>
+        <w:t xml:space="preserve"> </w:t>
+      </w:r>
+      <w:r>
         <w:t xml:space="preserve">와 실행 간 분산</w:t>
       </w:r>
       <w:r>
@@ -4024,6 +4042,9 @@
         <w:t xml:space="preserve">[69]</w:t>
       </w:r>
       <w:r>
+        <w:t xml:space="preserve"> </w:t>
+      </w:r>
+      <w:r>
         <w:t xml:space="preserve">을 측정하는 토큰 회계 규율이 필수적이다</w:t>
       </w:r>
       <w:r>
@@ -4035,16 +4056,20 @@
       <w:r>
         <w:t xml:space="preserve">. 본 연구는 호출 완료 시점의 사용량을 합산하는 계측기 결함을 바로잡고 실측 비용을 도출했다.</w:t>
       </w:r>
-      <w:r>
-        <w:t xml:space="preserve"> </w:t>
-      </w:r>
-      <w:r>
-        <w:t xml:space="preserve">## 5. 기록된 결과의 재도출과 주석자 분산</w:t>
-      </w:r>
-    </w:p>
-    <w:p>
-      <w:pPr>
-        <w:pStyle w:val="BodyText"/>
+    </w:p>
+    <w:bookmarkEnd w:id="73"/>
+    <w:bookmarkStart w:id="74" w:name="기록된-결과의-재도출과-주석자-분산"/>
+    <w:p>
+      <w:pPr>
+        <w:pStyle w:val="Heading2"/>
+      </w:pPr>
+      <w:r>
+        <w:t xml:space="preserve">5. 기록된 결과의 재도출과 주석자 분산</w:t>
+      </w:r>
+    </w:p>
+    <w:p>
+      <w:pPr>
+        <w:pStyle w:val="FirstParagraph"/>
       </w:pPr>
       <w:r>
         <w:t xml:space="preserve">일치도가 곧 정확도를 의미하지 않으며</w:t>
@@ -4074,6 +4099,9 @@
         <w:t xml:space="preserve">[73]</w:t>
       </w:r>
       <w:r>
+        <w:t xml:space="preserve"> </w:t>
+      </w:r>
+      <w:r>
         <w:t xml:space="preserve">보다는 실행 시점의 근거 원장(evidence ledger)을 구축해야 하며</w:t>
       </w:r>
       <w:r>
@@ -4101,6 +4129,9 @@
         <w:t xml:space="preserve">[77]</w:t>
       </w:r>
       <w:r>
+        <w:t xml:space="preserve"> </w:t>
+      </w:r>
+      <w:r>
         <w:t xml:space="preserve">를 통해, 근거 없는 충실도 주장</w:t>
       </w:r>
       <w:r>
@@ -4110,6 +4141,9 @@
         <w:t xml:space="preserve">[78]</w:t>
       </w:r>
       <w:r>
+        <w:t xml:space="preserve"> </w:t>
+      </w:r>
+      <w:r>
         <w:t xml:space="preserve">과 암묵적 가정</w:t>
       </w:r>
       <w:r>
@@ -4128,6 +4162,9 @@
         <w:t xml:space="preserve">[80]</w:t>
       </w:r>
       <w:r>
+        <w:t xml:space="preserve"> </w:t>
+      </w:r>
+      <w:r>
         <w:t xml:space="preserve">을 배제하고 단계별 사실 검증</w:t>
       </w:r>
       <w:r>
@@ -4137,11 +4174,14 @@
         <w:t xml:space="preserve">[81]</w:t>
       </w:r>
       <w:r>
+        <w:t xml:space="preserve"> </w:t>
+      </w:r>
+      <w:r>
         <w:t xml:space="preserve">을 수립했다.</w:t>
       </w:r>
     </w:p>
-    <w:bookmarkEnd w:id="73"/>
-    <w:bookmarkStart w:id="74" w:name="변이-감사에-의한-계측기-검증"/>
+    <w:bookmarkEnd w:id="74"/>
+    <w:bookmarkStart w:id="75" w:name="변이-감사에-의한-계측기-검증"/>
     <w:p>
       <w:pPr>
         <w:pStyle w:val="Heading2"/>
@@ -4164,6 +4204,9 @@
         <w:t xml:space="preserve">[82]</w:t>
       </w:r>
       <w:r>
+        <w:t xml:space="preserve"> </w:t>
+      </w:r>
+      <w:r>
         <w:t xml:space="preserve">과 평가 맹점</w:t>
       </w:r>
       <w:r>
@@ -4173,6 +4216,9 @@
         <w:t xml:space="preserve">[83]</w:t>
       </w:r>
       <w:r>
+        <w:t xml:space="preserve"> </w:t>
+      </w:r>
+      <w:r>
         <w:t xml:space="preserve">을 드러내기 위해 변형 관계(metamorphic relations)에 기반한 변이 감사를 도입했다</w:t>
       </w:r>
       <w:r>
@@ -4191,6 +4237,9 @@
         <w:t xml:space="preserve">[85]</w:t>
       </w:r>
       <w:r>
+        <w:t xml:space="preserve"> </w:t>
+      </w:r>
+      <w:r>
         <w:t xml:space="preserve">과 오라클 앵커링</w:t>
       </w:r>
       <w:r>
@@ -4215,8 +4264,8 @@
         <w:t xml:space="preserve">.</w:t>
       </w:r>
     </w:p>
-    <w:bookmarkEnd w:id="74"/>
-    <w:bookmarkStart w:id="76" w:name="분산-성분과-설계의-한계"/>
+    <w:bookmarkEnd w:id="75"/>
+    <w:bookmarkStart w:id="77" w:name="분산-성분과-설계의-한계"/>
     <w:p>
       <w:pPr>
         <w:pStyle w:val="Heading2"/>
@@ -4267,7 +4316,7 @@
       <w:tr>
         <w:tc>
           <w:tcPr/>
-          <w:bookmarkStart w:id="75" w:name="tbl-variance"/>
+          <w:bookmarkStart w:id="76" w:name="tbl-variance"/>
           <w:p>
             <w:pPr>
               <w:jc w:val="center"/>
@@ -4496,7 +4545,7 @@
               </w:tc>
             </w:tr>
           </w:tbl>
-          <w:bookmarkEnd w:id="75"/>
+          <w:bookmarkEnd w:id="76"/>
           <w:p/>
         </w:tc>
       </w:tr>
@@ -4509,8 +4558,8 @@
         <w:t xml:space="preserve">이 결과는 두 가지로 읽힐 수 있다. 조건이 산출물의 질을 바꾸지 않거나, endpoint가 그 변화를 보지 못하거나다. 검색 단계를 제거하고 반복을 추가해 두 번째 해석을 직접 시험했으나 조건 성분은 나타나지 않았다. 다만 이것을 무효과의 증거로 보고하지 않는다. 조건 수가 3~4개이고 반복이 2회이기 때문이다.</w:t>
       </w:r>
     </w:p>
-    <w:bookmarkEnd w:id="76"/>
-    <w:bookmarkStart w:id="77" w:name="조작-확인과-선행-관찰"/>
+    <w:bookmarkEnd w:id="77"/>
+    <w:bookmarkStart w:id="78" w:name="조작-확인과-선행-관찰"/>
     <w:p>
       <w:pPr>
         <w:pStyle w:val="Heading2"/>
@@ -4599,8 +4648,8 @@
         <w:t xml:space="preserve">는 점이다.</w:t>
       </w:r>
     </w:p>
-    <w:bookmarkEnd w:id="77"/>
-    <w:bookmarkStart w:id="79" w:name="예산-완료율"/>
+    <w:bookmarkEnd w:id="78"/>
+    <w:bookmarkStart w:id="80" w:name="예산-완료율"/>
     <w:p>
       <w:pPr>
         <w:pStyle w:val="Heading2"/>
@@ -4641,7 +4690,7 @@
       <w:tr>
         <w:tc>
           <w:tcPr/>
-          <w:bookmarkStart w:id="78" w:name="tbl-completion"/>
+          <w:bookmarkStart w:id="79" w:name="tbl-completion"/>
           <w:p>
             <w:pPr>
               <w:jc w:val="center"/>
@@ -5068,7 +5117,7 @@
               </w:tc>
             </w:tr>
           </w:tbl>
-          <w:bookmarkEnd w:id="78"/>
+          <w:bookmarkEnd w:id="79"/>
           <w:p/>
         </w:tc>
       </w:tr>
@@ -5081,8 +5130,8 @@
         <w:t xml:space="preserve">네 조건의 구간이 모두 겹친다. 에피소드 네 건으로는 조건 간 완료율 차이를 말할 수 없으며, 본 연구는 그 차이를 주장하지 않는다.</w:t>
       </w:r>
     </w:p>
-    <w:bookmarkEnd w:id="79"/>
-    <w:bookmarkStart w:id="84" w:name="근거-사슬"/>
+    <w:bookmarkEnd w:id="80"/>
+    <w:bookmarkStart w:id="85" w:name="근거-사슬"/>
     <w:p>
       <w:pPr>
         <w:pStyle w:val="Heading2"/>
@@ -5123,7 +5172,7 @@
       <w:tr>
         <w:tc>
           <w:tcPr/>
-          <w:bookmarkStart w:id="83" w:name="fig-evidence"/>
+          <w:bookmarkStart w:id="84" w:name="fig-evidence"/>
           <w:p>
             <w:pPr>
               <w:pStyle w:val="Compact"/>
@@ -5134,18 +5183,18 @@
                 <wp:inline>
                   <wp:extent cx="5334000" cy="11220417"/>
                   <wp:effectExtent b="0" l="0" r="0" t="0"/>
-                  <wp:docPr descr="" title="" id="81" name="Picture"/>
+                  <wp:docPr descr="" title="" id="82" name="Picture"/>
                   <a:graphic>
                     <a:graphicData uri="http://schemas.openxmlformats.org/drawingml/2006/picture">
                       <pic:pic>
                         <pic:nvPicPr>
-                          <pic:cNvPr descr="../figures/rendered/fig-08.png" id="82" name="Picture"/>
+                          <pic:cNvPr descr="figures/rendered/fig-08.png" id="83" name="Picture"/>
                           <pic:cNvPicPr>
                             <a:picLocks noChangeArrowheads="1" noChangeAspect="1"/>
                           </pic:cNvPicPr>
                         </pic:nvPicPr>
                         <pic:blipFill>
-                          <a:blip r:embed="rId80"/>
+                          <a:blip r:embed="rId81"/>
                           <a:stretch>
                             <a:fillRect/>
                           </a:stretch>
@@ -5185,12 +5234,12 @@
               <w:t xml:space="preserve">그림 9. 근거 사슬과 검증</w:t>
             </w:r>
           </w:p>
-          <w:bookmarkEnd w:id="83"/>
+          <w:bookmarkEnd w:id="84"/>
         </w:tc>
       </w:tr>
     </w:tbl>
-    <w:bookmarkEnd w:id="84"/>
-    <w:bookmarkStart w:id="86" w:name="의사결정-인구조사와-위협-요인"/>
+    <w:bookmarkEnd w:id="85"/>
+    <w:bookmarkStart w:id="87" w:name="의사결정-인구조사와-위협-요인"/>
     <w:p>
       <w:pPr>
         <w:pStyle w:val="Heading2"/>
@@ -5255,6 +5304,9 @@
         <w:t xml:space="preserve">[92]</w:t>
       </w:r>
       <w:r>
+        <w:t xml:space="preserve"> </w:t>
+      </w:r>
+      <w:r>
         <w:t xml:space="preserve">와 부정적 결과(negative results)의 정직한 보고</w:t>
       </w:r>
       <w:r>
@@ -5262,6 +5314,9 @@
       </w:r>
       <w:r>
         <w:t xml:space="preserve">[93]</w:t>
+      </w:r>
+      <w:r>
+        <w:t xml:space="preserve"> </w:t>
       </w:r>
       <w:r>
         <w:t xml:space="preserve">를 통해 체계적 편향을 차단했다.</w:t>
@@ -5306,7 +5361,7 @@
       <w:tr>
         <w:tc>
           <w:tcPr/>
-          <w:bookmarkStart w:id="85" w:name="tbl-threats"/>
+          <w:bookmarkStart w:id="86" w:name="tbl-threats"/>
           <w:p>
             <w:pPr>
               <w:jc w:val="center"/>
@@ -5517,14 +5572,14 @@
               </w:tc>
             </w:tr>
           </w:tbl>
-          <w:bookmarkEnd w:id="85"/>
+          <w:bookmarkEnd w:id="86"/>
           <w:p/>
         </w:tc>
       </w:tr>
     </w:tbl>
-    <w:bookmarkEnd w:id="86"/>
     <w:bookmarkEnd w:id="87"/>
-    <w:bookmarkStart w:id="88" w:name="conclusions"/>
+    <w:bookmarkEnd w:id="88"/>
+    <w:bookmarkStart w:id="89" w:name="conclusions"/>
     <w:p>
       <w:pPr>
         <w:pStyle w:val="Heading1"/>
@@ -5551,6 +5606,9 @@
       </w:r>
       <w:r>
         <w:t xml:space="preserve">[94]</w:t>
+      </w:r>
+      <w:r>
+        <w:t xml:space="preserve"> </w:t>
       </w:r>
       <w:r>
         <w:t xml:space="preserve">을</w:t>
@@ -5676,8 +5734,8 @@
         <w:t xml:space="preserve">는 원칙 아래에서 수행된다.</w:t>
       </w:r>
     </w:p>
-    <w:bookmarkEnd w:id="88"/>
-    <w:bookmarkStart w:id="243" w:name="참-고-문-헌-references"/>
+    <w:bookmarkEnd w:id="89"/>
+    <w:bookmarkStart w:id="244" w:name="참-고-문-헌-references"/>
     <w:p>
       <w:pPr>
         <w:pStyle w:val="Heading1"/>
@@ -5686,8 +5744,8 @@
         <w:t xml:space="preserve">참 고 문 헌 (References)</w:t>
       </w:r>
     </w:p>
-    <w:bookmarkStart w:id="242" w:name="refs"/>
-    <w:bookmarkStart w:id="90" w:name="ref-react2023"/>
+    <w:bookmarkStart w:id="243" w:name="refs"/>
+    <w:bookmarkStart w:id="91" w:name="ref-react2023"/>
     <w:p>
       <w:pPr>
         <w:pStyle w:val="Bibliography"/>
@@ -5716,7 +5774,7 @@
       <w:r>
         <w:t xml:space="preserve"> </w:t>
       </w:r>
-      <w:hyperlink r:id="rId89">
+      <w:hyperlink r:id="rId90">
         <w:r>
           <w:rPr>
             <w:rStyle w:val="Hyperlink"/>
@@ -5725,8 +5783,8 @@
         </w:r>
       </w:hyperlink>
     </w:p>
-    <w:bookmarkEnd w:id="90"/>
-    <w:bookmarkStart w:id="92" w:name="ref-memgpt2023"/>
+    <w:bookmarkEnd w:id="91"/>
+    <w:bookmarkStart w:id="93" w:name="ref-memgpt2023"/>
     <w:p>
       <w:pPr>
         <w:pStyle w:val="Bibliography"/>
@@ -5755,7 +5813,7 @@
       <w:r>
         <w:t xml:space="preserve"> </w:t>
       </w:r>
-      <w:hyperlink r:id="rId91">
+      <w:hyperlink r:id="rId92">
         <w:r>
           <w:rPr>
             <w:rStyle w:val="Hyperlink"/>
@@ -5764,8 +5822,8 @@
         </w:r>
       </w:hyperlink>
     </w:p>
-    <w:bookmarkEnd w:id="92"/>
-    <w:bookmarkStart w:id="94" w:name="ref-rlm2025"/>
+    <w:bookmarkEnd w:id="93"/>
+    <w:bookmarkStart w:id="95" w:name="ref-rlm2025"/>
     <w:p>
       <w:pPr>
         <w:pStyle w:val="Bibliography"/>
@@ -5794,7 +5852,7 @@
       <w:r>
         <w:t xml:space="preserve"> </w:t>
       </w:r>
-      <w:hyperlink r:id="rId93">
+      <w:hyperlink r:id="rId94">
         <w:r>
           <w:rPr>
             <w:rStyle w:val="Hyperlink"/>
@@ -5803,8 +5861,8 @@
         </w:r>
       </w:hyperlink>
     </w:p>
-    <w:bookmarkEnd w:id="94"/>
-    <w:bookmarkStart w:id="96" w:name="ref-autogen2023"/>
+    <w:bookmarkEnd w:id="95"/>
+    <w:bookmarkStart w:id="97" w:name="ref-autogen2023"/>
     <w:p>
       <w:pPr>
         <w:pStyle w:val="Bibliography"/>
@@ -5833,7 +5891,7 @@
       <w:r>
         <w:t xml:space="preserve"> </w:t>
       </w:r>
-      <w:hyperlink r:id="rId95">
+      <w:hyperlink r:id="rId96">
         <w:r>
           <w:rPr>
             <w:rStyle w:val="Hyperlink"/>
@@ -5842,8 +5900,8 @@
         </w:r>
       </w:hyperlink>
     </w:p>
-    <w:bookmarkEnd w:id="96"/>
-    <w:bookmarkStart w:id="98" w:name="ref-genaimeasurement2025"/>
+    <w:bookmarkEnd w:id="97"/>
+    <w:bookmarkStart w:id="99" w:name="ref-genaimeasurement2025"/>
     <w:p>
       <w:pPr>
         <w:pStyle w:val="Bibliography"/>
@@ -5872,7 +5930,7 @@
       <w:r>
         <w:t xml:space="preserve"> </w:t>
       </w:r>
-      <w:hyperlink r:id="rId97">
+      <w:hyperlink r:id="rId98">
         <w:r>
           <w:rPr>
             <w:rStyle w:val="Hyperlink"/>
@@ -5881,8 +5939,8 @@
         </w:r>
       </w:hyperlink>
     </w:p>
-    <w:bookmarkEnd w:id="98"/>
-    <w:bookmarkStart w:id="100" w:name="ref-whogrades2026"/>
+    <w:bookmarkEnd w:id="99"/>
+    <w:bookmarkStart w:id="101" w:name="ref-whogrades2026"/>
     <w:p>
       <w:pPr>
         <w:pStyle w:val="Bibliography"/>
@@ -5911,7 +5969,7 @@
       <w:r>
         <w:t xml:space="preserve"> </w:t>
       </w:r>
-      <w:hyperlink r:id="rId99">
+      <w:hyperlink r:id="rId100">
         <w:r>
           <w:rPr>
             <w:rStyle w:val="Hyperlink"/>
@@ -5920,8 +5978,8 @@
         </w:r>
       </w:hyperlink>
     </w:p>
-    <w:bookmarkEnd w:id="100"/>
-    <w:bookmarkStart w:id="102" w:name="ref-verifiergap2026"/>
+    <w:bookmarkEnd w:id="101"/>
+    <w:bookmarkStart w:id="103" w:name="ref-verifiergap2026"/>
     <w:p>
       <w:pPr>
         <w:pStyle w:val="Bibliography"/>
@@ -5950,7 +6008,7 @@
       <w:r>
         <w:t xml:space="preserve"> </w:t>
       </w:r>
-      <w:hyperlink r:id="rId101">
+      <w:hyperlink r:id="rId102">
         <w:r>
           <w:rPr>
             <w:rStyle w:val="Hyperlink"/>
@@ -5959,8 +6017,8 @@
         </w:r>
       </w:hyperlink>
     </w:p>
-    <w:bookmarkEnd w:id="102"/>
-    <w:bookmarkStart w:id="104" w:name="ref-harnesstamper2026"/>
+    <w:bookmarkEnd w:id="103"/>
+    <w:bookmarkStart w:id="105" w:name="ref-harnesstamper2026"/>
     <w:p>
       <w:pPr>
         <w:pStyle w:val="Bibliography"/>
@@ -5989,7 +6047,7 @@
       <w:r>
         <w:t xml:space="preserve"> </w:t>
       </w:r>
-      <w:hyperlink r:id="rId103">
+      <w:hyperlink r:id="rId104">
         <w:r>
           <w:rPr>
             <w:rStyle w:val="Hyperlink"/>
@@ -5998,8 +6056,8 @@
         </w:r>
       </w:hyperlink>
     </w:p>
-    <w:bookmarkEnd w:id="104"/>
-    <w:bookmarkStart w:id="106" w:name="ref-auditablewriting2026"/>
+    <w:bookmarkEnd w:id="105"/>
+    <w:bookmarkStart w:id="107" w:name="ref-auditablewriting2026"/>
     <w:p>
       <w:pPr>
         <w:pStyle w:val="Bibliography"/>
@@ -6028,7 +6086,7 @@
       <w:r>
         <w:t xml:space="preserve"> </w:t>
       </w:r>
-      <w:hyperlink r:id="rId105">
+      <w:hyperlink r:id="rId106">
         <w:r>
           <w:rPr>
             <w:rStyle w:val="Hyperlink"/>
@@ -6037,8 +6095,8 @@
         </w:r>
       </w:hyperlink>
     </w:p>
-    <w:bookmarkEnd w:id="106"/>
-    <w:bookmarkStart w:id="108" w:name="ref-reflexion2023"/>
+    <w:bookmarkEnd w:id="107"/>
+    <w:bookmarkStart w:id="109" w:name="ref-reflexion2023"/>
     <w:p>
       <w:pPr>
         <w:pStyle w:val="Bibliography"/>
@@ -6067,7 +6125,7 @@
       <w:r>
         <w:t xml:space="preserve"> </w:t>
       </w:r>
-      <w:hyperlink r:id="rId107">
+      <w:hyperlink r:id="rId108">
         <w:r>
           <w:rPr>
             <w:rStyle w:val="Hyperlink"/>
@@ -6076,8 +6134,8 @@
         </w:r>
       </w:hyperlink>
     </w:p>
-    <w:bookmarkEnd w:id="108"/>
-    <w:bookmarkStart w:id="110" w:name="ref-rag2020"/>
+    <w:bookmarkEnd w:id="109"/>
+    <w:bookmarkStart w:id="111" w:name="ref-rag2020"/>
     <w:p>
       <w:pPr>
         <w:pStyle w:val="Bibliography"/>
@@ -6106,7 +6164,7 @@
       <w:r>
         <w:t xml:space="preserve"> </w:t>
       </w:r>
-      <w:hyperlink r:id="rId109">
+      <w:hyperlink r:id="rId110">
         <w:r>
           <w:rPr>
             <w:rStyle w:val="Hyperlink"/>
@@ -6115,8 +6173,8 @@
         </w:r>
       </w:hyperlink>
     </w:p>
-    <w:bookmarkEnd w:id="110"/>
-    <w:bookmarkStart w:id="112" w:name="ref-codeharness2026"/>
+    <w:bookmarkEnd w:id="111"/>
+    <w:bookmarkStart w:id="113" w:name="ref-codeharness2026"/>
     <w:p>
       <w:pPr>
         <w:pStyle w:val="Bibliography"/>
@@ -6148,7 +6206,7 @@
       <w:r>
         <w:t xml:space="preserve"> </w:t>
       </w:r>
-      <w:hyperlink r:id="rId111">
+      <w:hyperlink r:id="rId112">
         <w:r>
           <w:rPr>
             <w:rStyle w:val="Hyperlink"/>
@@ -6157,8 +6215,8 @@
         </w:r>
       </w:hyperlink>
     </w:p>
-    <w:bookmarkEnd w:id="112"/>
-    <w:bookmarkStart w:id="114" w:name="ref-dive2026"/>
+    <w:bookmarkEnd w:id="113"/>
+    <w:bookmarkStart w:id="115" w:name="ref-dive2026"/>
     <w:p>
       <w:pPr>
         <w:pStyle w:val="Bibliography"/>
@@ -6187,7 +6245,7 @@
       <w:r>
         <w:t xml:space="preserve"> </w:t>
       </w:r>
-      <w:hyperlink r:id="rId113">
+      <w:hyperlink r:id="rId114">
         <w:r>
           <w:rPr>
             <w:rStyle w:val="Hyperlink"/>
@@ -6196,8 +6254,8 @@
         </w:r>
       </w:hyperlink>
     </w:p>
-    <w:bookmarkEnd w:id="114"/>
-    <w:bookmarkStart w:id="116" w:name="ref-longhorizon2026"/>
+    <w:bookmarkEnd w:id="115"/>
+    <w:bookmarkStart w:id="117" w:name="ref-longhorizon2026"/>
     <w:p>
       <w:pPr>
         <w:pStyle w:val="Bibliography"/>
@@ -6226,7 +6284,7 @@
       <w:r>
         <w:t xml:space="preserve"> </w:t>
       </w:r>
-      <w:hyperlink r:id="rId115">
+      <w:hyperlink r:id="rId116">
         <w:r>
           <w:rPr>
             <w:rStyle w:val="Hyperlink"/>
@@ -6235,8 +6293,8 @@
         </w:r>
       </w:hyperlink>
     </w:p>
-    <w:bookmarkEnd w:id="116"/>
-    <w:bookmarkStart w:id="118" w:name="ref-loopsbench2026"/>
+    <w:bookmarkEnd w:id="117"/>
+    <w:bookmarkStart w:id="119" w:name="ref-loopsbench2026"/>
     <w:p>
       <w:pPr>
         <w:pStyle w:val="Bibliography"/>
@@ -6268,7 +6326,7 @@
       <w:r>
         <w:t xml:space="preserve"> </w:t>
       </w:r>
-      <w:hyperlink r:id="rId117">
+      <w:hyperlink r:id="rId118">
         <w:r>
           <w:rPr>
             <w:rStyle w:val="Hyperlink"/>
@@ -6277,8 +6335,8 @@
         </w:r>
       </w:hyperlink>
     </w:p>
-    <w:bookmarkEnd w:id="118"/>
-    <w:bookmarkStart w:id="120" w:name="ref-scroll2026"/>
+    <w:bookmarkEnd w:id="119"/>
+    <w:bookmarkStart w:id="121" w:name="ref-scroll2026"/>
     <w:p>
       <w:pPr>
         <w:pStyle w:val="Bibliography"/>
@@ -6307,7 +6365,7 @@
       <w:r>
         <w:t xml:space="preserve"> </w:t>
       </w:r>
-      <w:hyperlink r:id="rId119">
+      <w:hyperlink r:id="rId120">
         <w:r>
           <w:rPr>
             <w:rStyle w:val="Hyperlink"/>
@@ -6316,8 +6374,8 @@
         </w:r>
       </w:hyperlink>
     </w:p>
-    <w:bookmarkEnd w:id="120"/>
-    <w:bookmarkStart w:id="122" w:name="ref-protocoltaxonomy2026"/>
+    <w:bookmarkEnd w:id="121"/>
+    <w:bookmarkStart w:id="123" w:name="ref-protocoltaxonomy2026"/>
     <w:p>
       <w:pPr>
         <w:pStyle w:val="Bibliography"/>
@@ -6346,7 +6404,7 @@
       <w:r>
         <w:t xml:space="preserve"> </w:t>
       </w:r>
-      <w:hyperlink r:id="rId121">
+      <w:hyperlink r:id="rId122">
         <w:r>
           <w:rPr>
             <w:rStyle w:val="Hyperlink"/>
@@ -6355,8 +6413,8 @@
         </w:r>
       </w:hyperlink>
     </w:p>
-    <w:bookmarkEnd w:id="122"/>
-    <w:bookmarkStart w:id="124" w:name="ref-chap2026"/>
+    <w:bookmarkEnd w:id="123"/>
+    <w:bookmarkStart w:id="125" w:name="ref-chap2026"/>
     <w:p>
       <w:pPr>
         <w:pStyle w:val="Bibliography"/>
@@ -6385,7 +6443,7 @@
       <w:r>
         <w:t xml:space="preserve"> </w:t>
       </w:r>
-      <w:hyperlink r:id="rId123">
+      <w:hyperlink r:id="rId124">
         <w:r>
           <w:rPr>
             <w:rStyle w:val="Hyperlink"/>
@@ -6394,8 +6452,8 @@
         </w:r>
       </w:hyperlink>
     </w:p>
-    <w:bookmarkEnd w:id="124"/>
-    <w:bookmarkStart w:id="126" w:name="ref-insemrag2026"/>
+    <w:bookmarkEnd w:id="125"/>
+    <w:bookmarkStart w:id="127" w:name="ref-insemrag2026"/>
     <w:p>
       <w:pPr>
         <w:pStyle w:val="Bibliography"/>
@@ -6427,7 +6485,7 @@
       <w:r>
         <w:t xml:space="preserve"> </w:t>
       </w:r>
-      <w:hyperlink r:id="rId125">
+      <w:hyperlink r:id="rId126">
         <w:r>
           <w:rPr>
             <w:rStyle w:val="Hyperlink"/>
@@ -6436,8 +6494,8 @@
         </w:r>
       </w:hyperlink>
     </w:p>
-    <w:bookmarkEnd w:id="126"/>
-    <w:bookmarkStart w:id="128" w:name="ref-sciret2026"/>
+    <w:bookmarkEnd w:id="127"/>
+    <w:bookmarkStart w:id="129" w:name="ref-sciret2026"/>
     <w:p>
       <w:pPr>
         <w:pStyle w:val="Bibliography"/>
@@ -6466,7 +6524,7 @@
       <w:r>
         <w:t xml:space="preserve"> </w:t>
       </w:r>
-      <w:hyperlink r:id="rId127">
+      <w:hyperlink r:id="rId128">
         <w:r>
           <w:rPr>
             <w:rStyle w:val="Hyperlink"/>
@@ -6475,8 +6533,8 @@
         </w:r>
       </w:hyperlink>
     </w:p>
-    <w:bookmarkEnd w:id="128"/>
-    <w:bookmarkStart w:id="130" w:name="ref-adaptiverag2026"/>
+    <w:bookmarkEnd w:id="129"/>
+    <w:bookmarkStart w:id="131" w:name="ref-adaptiverag2026"/>
     <w:p>
       <w:pPr>
         <w:pStyle w:val="Bibliography"/>
@@ -6505,7 +6563,7 @@
       <w:r>
         <w:t xml:space="preserve"> </w:t>
       </w:r>
-      <w:hyperlink r:id="rId129">
+      <w:hyperlink r:id="rId130">
         <w:r>
           <w:rPr>
             <w:rStyle w:val="Hyperlink"/>
@@ -6514,8 +6572,8 @@
         </w:r>
       </w:hyperlink>
     </w:p>
-    <w:bookmarkEnd w:id="130"/>
-    <w:bookmarkStart w:id="132" w:name="ref-llmrouter2026"/>
+    <w:bookmarkEnd w:id="131"/>
+    <w:bookmarkStart w:id="133" w:name="ref-llmrouter2026"/>
     <w:p>
       <w:pPr>
         <w:pStyle w:val="Bibliography"/>
@@ -6547,7 +6605,7 @@
       <w:r>
         <w:t xml:space="preserve"> </w:t>
       </w:r>
-      <w:hyperlink r:id="rId131">
+      <w:hyperlink r:id="rId132">
         <w:r>
           <w:rPr>
             <w:rStyle w:val="Hyperlink"/>
@@ -6556,8 +6614,8 @@
         </w:r>
       </w:hyperlink>
     </w:p>
-    <w:bookmarkEnd w:id="132"/>
-    <w:bookmarkStart w:id="134" w:name="ref-resamplereroute2026"/>
+    <w:bookmarkEnd w:id="133"/>
+    <w:bookmarkStart w:id="135" w:name="ref-resamplereroute2026"/>
     <w:p>
       <w:pPr>
         <w:pStyle w:val="Bibliography"/>
@@ -6586,7 +6644,7 @@
       <w:r>
         <w:t xml:space="preserve"> </w:t>
       </w:r>
-      <w:hyperlink r:id="rId133">
+      <w:hyperlink r:id="rId134">
         <w:r>
           <w:rPr>
             <w:rStyle w:val="Hyperlink"/>
@@ -6595,8 +6653,8 @@
         </w:r>
       </w:hyperlink>
     </w:p>
-    <w:bookmarkEnd w:id="134"/>
-    <w:bookmarkStart w:id="136" w:name="ref-controlledorchestration2026"/>
+    <w:bookmarkEnd w:id="135"/>
+    <w:bookmarkStart w:id="137" w:name="ref-controlledorchestration2026"/>
     <w:p>
       <w:pPr>
         <w:pStyle w:val="Bibliography"/>
@@ -6625,7 +6683,7 @@
       <w:r>
         <w:t xml:space="preserve"> </w:t>
       </w:r>
-      <w:hyperlink r:id="rId135">
+      <w:hyperlink r:id="rId136">
         <w:r>
           <w:rPr>
             <w:rStyle w:val="Hyperlink"/>
@@ -6634,8 +6692,8 @@
         </w:r>
       </w:hyperlink>
     </w:p>
-    <w:bookmarkEnd w:id="136"/>
-    <w:bookmarkStart w:id="138" w:name="ref-agora2026"/>
+    <w:bookmarkEnd w:id="137"/>
+    <w:bookmarkStart w:id="139" w:name="ref-agora2026"/>
     <w:p>
       <w:pPr>
         <w:pStyle w:val="Bibliography"/>
@@ -6664,7 +6722,7 @@
       <w:r>
         <w:t xml:space="preserve"> </w:t>
       </w:r>
-      <w:hyperlink r:id="rId137">
+      <w:hyperlink r:id="rId138">
         <w:r>
           <w:rPr>
             <w:rStyle w:val="Hyperlink"/>
@@ -6673,8 +6731,8 @@
         </w:r>
       </w:hyperlink>
     </w:p>
-    <w:bookmarkEnd w:id="138"/>
-    <w:bookmarkStart w:id="140" w:name="ref-aiscientist2024"/>
+    <w:bookmarkEnd w:id="139"/>
+    <w:bookmarkStart w:id="141" w:name="ref-aiscientist2024"/>
     <w:p>
       <w:pPr>
         <w:pStyle w:val="Bibliography"/>
@@ -6703,7 +6761,7 @@
       <w:r>
         <w:t xml:space="preserve"> </w:t>
       </w:r>
-      <w:hyperlink r:id="rId139">
+      <w:hyperlink r:id="rId140">
         <w:r>
           <w:rPr>
             <w:rStyle w:val="Hyperlink"/>
@@ -6712,8 +6770,8 @@
         </w:r>
       </w:hyperlink>
     </w:p>
-    <w:bookmarkEnd w:id="140"/>
-    <w:bookmarkStart w:id="142" w:name="ref-coscientist2025"/>
+    <w:bookmarkEnd w:id="141"/>
+    <w:bookmarkStart w:id="143" w:name="ref-coscientist2025"/>
     <w:p>
       <w:pPr>
         <w:pStyle w:val="Bibliography"/>
@@ -6745,7 +6803,7 @@
       <w:r>
         <w:t xml:space="preserve"> </w:t>
       </w:r>
-      <w:hyperlink r:id="rId141">
+      <w:hyperlink r:id="rId142">
         <w:r>
           <w:rPr>
             <w:rStyle w:val="Hyperlink"/>
@@ -6754,8 +6812,8 @@
         </w:r>
       </w:hyperlink>
     </w:p>
-    <w:bookmarkEnd w:id="142"/>
-    <w:bookmarkStart w:id="144" w:name="ref-sciagents2024"/>
+    <w:bookmarkEnd w:id="143"/>
+    <w:bookmarkStart w:id="145" w:name="ref-sciagents2024"/>
     <w:p>
       <w:pPr>
         <w:pStyle w:val="Bibliography"/>
@@ -6784,7 +6842,7 @@
       <w:r>
         <w:t xml:space="preserve"> </w:t>
       </w:r>
-      <w:hyperlink r:id="rId143">
+      <w:hyperlink r:id="rId144">
         <w:r>
           <w:rPr>
             <w:rStyle w:val="Hyperlink"/>
@@ -6793,8 +6851,8 @@
         </w:r>
       </w:hyperlink>
     </w:p>
-    <w:bookmarkEnd w:id="144"/>
-    <w:bookmarkStart w:id="146" w:name="ref-evigraph2026"/>
+    <w:bookmarkEnd w:id="145"/>
+    <w:bookmarkStart w:id="147" w:name="ref-evigraph2026"/>
     <w:p>
       <w:pPr>
         <w:pStyle w:val="Bibliography"/>
@@ -6823,7 +6881,7 @@
       <w:r>
         <w:t xml:space="preserve"> </w:t>
       </w:r>
-      <w:hyperlink r:id="rId145">
+      <w:hyperlink r:id="rId146">
         <w:r>
           <w:rPr>
             <w:rStyle w:val="Hyperlink"/>
@@ -6832,8 +6890,8 @@
         </w:r>
       </w:hyperlink>
     </w:p>
-    <w:bookmarkEnd w:id="146"/>
-    <w:bookmarkStart w:id="148" w:name="ref-xscientist2026"/>
+    <w:bookmarkEnd w:id="147"/>
+    <w:bookmarkStart w:id="149" w:name="ref-xscientist2026"/>
     <w:p>
       <w:pPr>
         <w:pStyle w:val="Bibliography"/>
@@ -6862,7 +6920,7 @@
       <w:r>
         <w:t xml:space="preserve"> </w:t>
       </w:r>
-      <w:hyperlink r:id="rId147">
+      <w:hyperlink r:id="rId148">
         <w:r>
           <w:rPr>
             <w:rStyle w:val="Hyperlink"/>
@@ -6871,8 +6929,8 @@
         </w:r>
       </w:hyperlink>
     </w:p>
-    <w:bookmarkEnd w:id="148"/>
-    <w:bookmarkStart w:id="150" w:name="ref-scientistone2026"/>
+    <w:bookmarkEnd w:id="149"/>
+    <w:bookmarkStart w:id="151" w:name="ref-scientistone2026"/>
     <w:p>
       <w:pPr>
         <w:pStyle w:val="Bibliography"/>
@@ -6901,7 +6959,7 @@
       <w:r>
         <w:t xml:space="preserve"> </w:t>
       </w:r>
-      <w:hyperlink r:id="rId149">
+      <w:hyperlink r:id="rId150">
         <w:r>
           <w:rPr>
             <w:rStyle w:val="Hyperlink"/>
@@ -6910,8 +6968,8 @@
         </w:r>
       </w:hyperlink>
     </w:p>
-    <w:bookmarkEnd w:id="150"/>
-    <w:bookmarkStart w:id="152" w:name="ref-scope2026"/>
+    <w:bookmarkEnd w:id="151"/>
+    <w:bookmarkStart w:id="153" w:name="ref-scope2026"/>
     <w:p>
       <w:pPr>
         <w:pStyle w:val="Bibliography"/>
@@ -6943,7 +7001,7 @@
       <w:r>
         <w:t xml:space="preserve"> </w:t>
       </w:r>
-      <w:hyperlink r:id="rId151">
+      <w:hyperlink r:id="rId152">
         <w:r>
           <w:rPr>
             <w:rStyle w:val="Hyperlink"/>
@@ -6952,8 +7010,8 @@
         </w:r>
       </w:hyperlink>
     </w:p>
-    <w:bookmarkEnd w:id="152"/>
-    <w:bookmarkStart w:id="154" w:name="ref-searchdiagnosis2026"/>
+    <w:bookmarkEnd w:id="153"/>
+    <w:bookmarkStart w:id="155" w:name="ref-searchdiagnosis2026"/>
     <w:p>
       <w:pPr>
         <w:pStyle w:val="Bibliography"/>
@@ -6982,7 +7040,7 @@
       <w:r>
         <w:t xml:space="preserve"> </w:t>
       </w:r>
-      <w:hyperlink r:id="rId153">
+      <w:hyperlink r:id="rId154">
         <w:r>
           <w:rPr>
             <w:rStyle w:val="Hyperlink"/>
@@ -6991,8 +7049,8 @@
         </w:r>
       </w:hyperlink>
     </w:p>
-    <w:bookmarkEnd w:id="154"/>
-    <w:bookmarkStart w:id="156" w:name="ref-researchclawbench2026"/>
+    <w:bookmarkEnd w:id="155"/>
+    <w:bookmarkStart w:id="157" w:name="ref-researchclawbench2026"/>
     <w:p>
       <w:pPr>
         <w:pStyle w:val="Bibliography"/>
@@ -7024,7 +7082,7 @@
       <w:r>
         <w:t xml:space="preserve"> </w:t>
       </w:r>
-      <w:hyperlink r:id="rId155">
+      <w:hyperlink r:id="rId156">
         <w:r>
           <w:rPr>
             <w:rStyle w:val="Hyperlink"/>
@@ -7033,8 +7091,8 @@
         </w:r>
       </w:hyperlink>
     </w:p>
-    <w:bookmarkEnd w:id="156"/>
-    <w:bookmarkStart w:id="158" w:name="ref-arbor2026"/>
+    <w:bookmarkEnd w:id="157"/>
+    <w:bookmarkStart w:id="159" w:name="ref-arbor2026"/>
     <w:p>
       <w:pPr>
         <w:pStyle w:val="Bibliography"/>
@@ -7066,7 +7124,7 @@
       <w:r>
         <w:t xml:space="preserve"> </w:t>
       </w:r>
-      <w:hyperlink r:id="rId157">
+      <w:hyperlink r:id="rId158">
         <w:r>
           <w:rPr>
             <w:rStyle w:val="Hyperlink"/>
@@ -7075,8 +7133,8 @@
         </w:r>
       </w:hyperlink>
     </w:p>
-    <w:bookmarkEnd w:id="158"/>
-    <w:bookmarkStart w:id="160" w:name="ref-hep2026"/>
+    <w:bookmarkEnd w:id="159"/>
+    <w:bookmarkStart w:id="161" w:name="ref-hep2026"/>
     <w:p>
       <w:pPr>
         <w:pStyle w:val="Bibliography"/>
@@ -7105,7 +7163,7 @@
       <w:r>
         <w:t xml:space="preserve"> </w:t>
       </w:r>
-      <w:hyperlink r:id="rId159">
+      <w:hyperlink r:id="rId160">
         <w:r>
           <w:rPr>
             <w:rStyle w:val="Hyperlink"/>
@@ -7114,8 +7172,8 @@
         </w:r>
       </w:hyperlink>
     </w:p>
-    <w:bookmarkEnd w:id="160"/>
-    <w:bookmarkStart w:id="162" w:name="ref-continual2026"/>
+    <w:bookmarkEnd w:id="161"/>
+    <w:bookmarkStart w:id="163" w:name="ref-continual2026"/>
     <w:p>
       <w:pPr>
         <w:pStyle w:val="Bibliography"/>
@@ -7144,7 +7202,7 @@
       <w:r>
         <w:t xml:space="preserve"> </w:t>
       </w:r>
-      <w:hyperlink r:id="rId161">
+      <w:hyperlink r:id="rId162">
         <w:r>
           <w:rPr>
             <w:rStyle w:val="Hyperlink"/>
@@ -7153,8 +7211,8 @@
         </w:r>
       </w:hyperlink>
     </w:p>
-    <w:bookmarkEnd w:id="162"/>
-    <w:bookmarkStart w:id="164" w:name="ref-rsea2026"/>
+    <w:bookmarkEnd w:id="163"/>
+    <w:bookmarkStart w:id="165" w:name="ref-rsea2026"/>
     <w:p>
       <w:pPr>
         <w:pStyle w:val="Bibliography"/>
@@ -7183,7 +7241,7 @@
       <w:r>
         <w:t xml:space="preserve"> </w:t>
       </w:r>
-      <w:hyperlink r:id="rId163">
+      <w:hyperlink r:id="rId164">
         <w:r>
           <w:rPr>
             <w:rStyle w:val="Hyperlink"/>
@@ -7192,8 +7250,8 @@
         </w:r>
       </w:hyperlink>
     </w:p>
-    <w:bookmarkEnd w:id="164"/>
-    <w:bookmarkStart w:id="166" w:name="ref-regimes2026"/>
+    <w:bookmarkEnd w:id="165"/>
+    <w:bookmarkStart w:id="167" w:name="ref-regimes2026"/>
     <w:p>
       <w:pPr>
         <w:pStyle w:val="Bibliography"/>
@@ -7222,7 +7280,7 @@
       <w:r>
         <w:t xml:space="preserve"> </w:t>
       </w:r>
-      <w:hyperlink r:id="rId165">
+      <w:hyperlink r:id="rId166">
         <w:r>
           <w:rPr>
             <w:rStyle w:val="Hyperlink"/>
@@ -7231,8 +7289,8 @@
         </w:r>
       </w:hyperlink>
     </w:p>
-    <w:bookmarkEnd w:id="166"/>
-    <w:bookmarkStart w:id="168" w:name="ref-autogenesis2026"/>
+    <w:bookmarkEnd w:id="167"/>
+    <w:bookmarkStart w:id="169" w:name="ref-autogenesis2026"/>
     <w:p>
       <w:pPr>
         <w:pStyle w:val="Bibliography"/>
@@ -7261,7 +7319,7 @@
       <w:r>
         <w:t xml:space="preserve"> </w:t>
       </w:r>
-      <w:hyperlink r:id="rId167">
+      <w:hyperlink r:id="rId168">
         <w:r>
           <w:rPr>
             <w:rStyle w:val="Hyperlink"/>
@@ -7270,8 +7328,8 @@
         </w:r>
       </w:hyperlink>
     </w:p>
-    <w:bookmarkEnd w:id="168"/>
-    <w:bookmarkStart w:id="170" w:name="ref-evobench2026"/>
+    <w:bookmarkEnd w:id="169"/>
+    <w:bookmarkStart w:id="171" w:name="ref-evobench2026"/>
     <w:p>
       <w:pPr>
         <w:pStyle w:val="Bibliography"/>
@@ -7300,7 +7358,7 @@
       <w:r>
         <w:t xml:space="preserve"> </w:t>
       </w:r>
-      <w:hyperlink r:id="rId169">
+      <w:hyperlink r:id="rId170">
         <w:r>
           <w:rPr>
             <w:rStyle w:val="Hyperlink"/>
@@ -7309,8 +7367,8 @@
         </w:r>
       </w:hyperlink>
     </w:p>
-    <w:bookmarkEnd w:id="170"/>
-    <w:bookmarkStart w:id="172" w:name="ref-harnessopt2026"/>
+    <w:bookmarkEnd w:id="171"/>
+    <w:bookmarkStart w:id="173" w:name="ref-harnessopt2026"/>
     <w:p>
       <w:pPr>
         <w:pStyle w:val="Bibliography"/>
@@ -7339,7 +7397,7 @@
       <w:r>
         <w:t xml:space="preserve"> </w:t>
       </w:r>
-      <w:hyperlink r:id="rId171">
+      <w:hyperlink r:id="rId172">
         <w:r>
           <w:rPr>
             <w:rStyle w:val="Hyperlink"/>
@@ -7348,8 +7406,8 @@
         </w:r>
       </w:hyperlink>
     </w:p>
-    <w:bookmarkEnd w:id="172"/>
-    <w:bookmarkStart w:id="174" w:name="ref-rethinkingharness2026"/>
+    <w:bookmarkEnd w:id="173"/>
+    <w:bookmarkStart w:id="175" w:name="ref-rethinkingharness2026"/>
     <w:p>
       <w:pPr>
         <w:pStyle w:val="Bibliography"/>
@@ -7378,7 +7436,7 @@
       <w:r>
         <w:t xml:space="preserve"> </w:t>
       </w:r>
-      <w:hyperlink r:id="rId173">
+      <w:hyperlink r:id="rId174">
         <w:r>
           <w:rPr>
             <w:rStyle w:val="Hyperlink"/>
@@ -7387,8 +7445,8 @@
         </w:r>
       </w:hyperlink>
     </w:p>
-    <w:bookmarkEnd w:id="174"/>
-    <w:bookmarkStart w:id="175" w:name="ref-minimalharness2026"/>
+    <w:bookmarkEnd w:id="175"/>
+    <w:bookmarkStart w:id="176" w:name="ref-minimalharness2026"/>
     <w:p>
       <w:pPr>
         <w:pStyle w:val="Bibliography"/>
@@ -7415,8 +7473,8 @@
         <w:t xml:space="preserve">. Public leaderboard results and technical documentation; grey literature, not peer reviewed, 2026년.</w:t>
       </w:r>
     </w:p>
-    <w:bookmarkEnd w:id="175"/>
-    <w:bookmarkStart w:id="177" w:name="ref-primeagent2026"/>
+    <w:bookmarkEnd w:id="176"/>
+    <w:bookmarkStart w:id="178" w:name="ref-primeagent2026"/>
     <w:p>
       <w:pPr>
         <w:pStyle w:val="Bibliography"/>
@@ -7445,7 +7503,7 @@
       <w:r>
         <w:t xml:space="preserve"> </w:t>
       </w:r>
-      <w:hyperlink r:id="rId176">
+      <w:hyperlink r:id="rId177">
         <w:r>
           <w:rPr>
             <w:rStyle w:val="Hyperlink"/>
@@ -7454,8 +7512,8 @@
         </w:r>
       </w:hyperlink>
     </w:p>
-    <w:bookmarkEnd w:id="177"/>
-    <w:bookmarkStart w:id="179" w:name="ref-claimlocked2026"/>
+    <w:bookmarkEnd w:id="178"/>
+    <w:bookmarkStart w:id="180" w:name="ref-claimlocked2026"/>
     <w:p>
       <w:pPr>
         <w:pStyle w:val="Bibliography"/>
@@ -7484,7 +7542,7 @@
       <w:r>
         <w:t xml:space="preserve"> </w:t>
       </w:r>
-      <w:hyperlink r:id="rId178">
+      <w:hyperlink r:id="rId179">
         <w:r>
           <w:rPr>
             <w:rStyle w:val="Hyperlink"/>
@@ -7493,8 +7551,8 @@
         </w:r>
       </w:hyperlink>
     </w:p>
-    <w:bookmarkEnd w:id="179"/>
-    <w:bookmarkStart w:id="181" w:name="ref-claimobservability2026"/>
+    <w:bookmarkEnd w:id="180"/>
+    <w:bookmarkStart w:id="182" w:name="ref-claimobservability2026"/>
     <w:p>
       <w:pPr>
         <w:pStyle w:val="Bibliography"/>
@@ -7523,7 +7581,7 @@
       <w:r>
         <w:t xml:space="preserve"> </w:t>
       </w:r>
-      <w:hyperlink r:id="rId180">
+      <w:hyperlink r:id="rId181">
         <w:r>
           <w:rPr>
             <w:rStyle w:val="Hyperlink"/>
@@ -7532,8 +7590,8 @@
         </w:r>
       </w:hyperlink>
     </w:p>
-    <w:bookmarkEnd w:id="181"/>
-    <w:bookmarkStart w:id="182" w:name="ref-controlprimitives2026"/>
+    <w:bookmarkEnd w:id="182"/>
+    <w:bookmarkStart w:id="183" w:name="ref-controlprimitives2026"/>
     <w:p>
       <w:pPr>
         <w:pStyle w:val="Bibliography"/>
@@ -7572,8 +7630,8 @@
         <w:t xml:space="preserve"> 2607년.</w:t>
       </w:r>
     </w:p>
-    <w:bookmarkEnd w:id="182"/>
-    <w:bookmarkStart w:id="183" w:name="ref-perrequestlimit2026"/>
+    <w:bookmarkEnd w:id="183"/>
+    <w:bookmarkStart w:id="184" w:name="ref-perrequestlimit2026"/>
     <w:p>
       <w:pPr>
         <w:pStyle w:val="Bibliography"/>
@@ -7612,8 +7670,8 @@
         <w:t xml:space="preserve"> 2603년.</w:t>
       </w:r>
     </w:p>
-    <w:bookmarkEnd w:id="183"/>
-    <w:bookmarkStart w:id="184" w:name="ref-openendedgroundtruth2026"/>
+    <w:bookmarkEnd w:id="184"/>
+    <w:bookmarkStart w:id="185" w:name="ref-openendedgroundtruth2026"/>
     <w:p>
       <w:pPr>
         <w:pStyle w:val="Bibliography"/>
@@ -7652,8 +7710,8 @@
         <w:t xml:space="preserve"> 2608년.</w:t>
       </w:r>
     </w:p>
-    <w:bookmarkEnd w:id="184"/>
-    <w:bookmarkStart w:id="185" w:name="ref-harnesslabels2026"/>
+    <w:bookmarkEnd w:id="185"/>
+    <w:bookmarkStart w:id="186" w:name="ref-harnesslabels2026"/>
     <w:p>
       <w:pPr>
         <w:pStyle w:val="Bibliography"/>
@@ -7692,8 +7750,8 @@
         <w:t xml:space="preserve"> 2606년.</w:t>
       </w:r>
     </w:p>
-    <w:bookmarkEnd w:id="185"/>
-    <w:bookmarkStart w:id="187" w:name="ref-checklistcredit2026"/>
+    <w:bookmarkEnd w:id="186"/>
+    <w:bookmarkStart w:id="188" w:name="ref-checklistcredit2026"/>
     <w:p>
       <w:pPr>
         <w:pStyle w:val="Bibliography"/>
@@ -7722,7 +7780,7 @@
       <w:r>
         <w:t xml:space="preserve"> </w:t>
       </w:r>
-      <w:hyperlink r:id="rId186">
+      <w:hyperlink r:id="rId187">
         <w:r>
           <w:rPr>
             <w:rStyle w:val="Hyperlink"/>
@@ -7731,8 +7789,8 @@
         </w:r>
       </w:hyperlink>
     </w:p>
-    <w:bookmarkEnd w:id="187"/>
-    <w:bookmarkStart w:id="189" w:name="ref-solutionhacking2026"/>
+    <w:bookmarkEnd w:id="188"/>
+    <w:bookmarkStart w:id="190" w:name="ref-solutionhacking2026"/>
     <w:p>
       <w:pPr>
         <w:pStyle w:val="Bibliography"/>
@@ -7761,7 +7819,7 @@
       <w:r>
         <w:t xml:space="preserve"> </w:t>
       </w:r>
-      <w:hyperlink r:id="rId188">
+      <w:hyperlink r:id="rId189">
         <w:r>
           <w:rPr>
             <w:rStyle w:val="Hyperlink"/>
@@ -7770,8 +7828,8 @@
         </w:r>
       </w:hyperlink>
     </w:p>
-    <w:bookmarkEnd w:id="189"/>
-    <w:bookmarkStart w:id="191" w:name="ref-baitbench2026"/>
+    <w:bookmarkEnd w:id="190"/>
+    <w:bookmarkStart w:id="192" w:name="ref-baitbench2026"/>
     <w:p>
       <w:pPr>
         <w:pStyle w:val="Bibliography"/>
@@ -7800,7 +7858,7 @@
       <w:r>
         <w:t xml:space="preserve"> </w:t>
       </w:r>
-      <w:hyperlink r:id="rId190">
+      <w:hyperlink r:id="rId191">
         <w:r>
           <w:rPr>
             <w:rStyle w:val="Hyperlink"/>
@@ -7809,8 +7867,8 @@
         </w:r>
       </w:hyperlink>
     </w:p>
-    <w:bookmarkEnd w:id="191"/>
-    <w:bookmarkStart w:id="193" w:name="ref-constructvalidity2026"/>
+    <w:bookmarkEnd w:id="192"/>
+    <w:bookmarkStart w:id="194" w:name="ref-constructvalidity2026"/>
     <w:p>
       <w:pPr>
         <w:pStyle w:val="Bibliography"/>
@@ -7839,7 +7897,7 @@
       <w:r>
         <w:t xml:space="preserve"> </w:t>
       </w:r>
-      <w:hyperlink r:id="rId192">
+      <w:hyperlink r:id="rId193">
         <w:r>
           <w:rPr>
             <w:rStyle w:val="Hyperlink"/>
@@ -7848,8 +7906,8 @@
         </w:r>
       </w:hyperlink>
     </w:p>
-    <w:bookmarkEnd w:id="193"/>
-    <w:bookmarkStart w:id="195" w:name="ref-agreementaudit2026"/>
+    <w:bookmarkEnd w:id="194"/>
+    <w:bookmarkStart w:id="196" w:name="ref-agreementaudit2026"/>
     <w:p>
       <w:pPr>
         <w:pStyle w:val="Bibliography"/>
@@ -7878,7 +7936,7 @@
       <w:r>
         <w:t xml:space="preserve"> </w:t>
       </w:r>
-      <w:hyperlink r:id="rId194">
+      <w:hyperlink r:id="rId195">
         <w:r>
           <w:rPr>
             <w:rStyle w:val="Hyperlink"/>
@@ -7887,8 +7945,8 @@
         </w:r>
       </w:hyperlink>
     </w:p>
-    <w:bookmarkEnd w:id="195"/>
-    <w:bookmarkStart w:id="197" w:name="ref-reliabilitywithoutvalidity2026"/>
+    <w:bookmarkEnd w:id="196"/>
+    <w:bookmarkStart w:id="198" w:name="ref-reliabilitywithoutvalidity2026"/>
     <w:p>
       <w:pPr>
         <w:pStyle w:val="Bibliography"/>
@@ -7917,7 +7975,7 @@
       <w:r>
         <w:t xml:space="preserve"> </w:t>
       </w:r>
-      <w:hyperlink r:id="rId196">
+      <w:hyperlink r:id="rId197">
         <w:r>
           <w:rPr>
             <w:rStyle w:val="Hyperlink"/>
@@ -7926,8 +7984,8 @@
         </w:r>
       </w:hyperlink>
     </w:p>
-    <w:bookmarkEnd w:id="197"/>
-    <w:bookmarkStart w:id="199" w:name="ref-compounding2026"/>
+    <w:bookmarkEnd w:id="198"/>
+    <w:bookmarkStart w:id="200" w:name="ref-compounding2026"/>
     <w:p>
       <w:pPr>
         <w:pStyle w:val="Bibliography"/>
@@ -7956,7 +8014,7 @@
       <w:r>
         <w:t xml:space="preserve"> </w:t>
       </w:r>
-      <w:hyperlink r:id="rId198">
+      <w:hyperlink r:id="rId199">
         <w:r>
           <w:rPr>
             <w:rStyle w:val="Hyperlink"/>
@@ -7965,8 +8023,8 @@
         </w:r>
       </w:hyperlink>
     </w:p>
-    <w:bookmarkEnd w:id="199"/>
-    <w:bookmarkStart w:id="200" w:name="ref-judgeidentification2026"/>
+    <w:bookmarkEnd w:id="200"/>
+    <w:bookmarkStart w:id="201" w:name="ref-judgeidentification2026"/>
     <w:p>
       <w:pPr>
         <w:pStyle w:val="Bibliography"/>
@@ -8005,8 +8063,8 @@
         <w:t xml:space="preserve"> 2608년.</w:t>
       </w:r>
     </w:p>
-    <w:bookmarkEnd w:id="200"/>
-    <w:bookmarkStart w:id="201" w:name="ref-majorityhurts2026"/>
+    <w:bookmarkEnd w:id="201"/>
+    <w:bookmarkStart w:id="202" w:name="ref-majorityhurts2026"/>
     <w:p>
       <w:pPr>
         <w:pStyle w:val="Bibliography"/>
@@ -8045,8 +8103,8 @@
         <w:t xml:space="preserve"> 2608년.</w:t>
       </w:r>
     </w:p>
-    <w:bookmarkEnd w:id="201"/>
-    <w:bookmarkStart w:id="202" w:name="ref-wrongconsensus2026"/>
+    <w:bookmarkEnd w:id="202"/>
+    <w:bookmarkStart w:id="203" w:name="ref-wrongconsensus2026"/>
     <w:p>
       <w:pPr>
         <w:pStyle w:val="Bibliography"/>
@@ -8085,8 +8143,8 @@
         <w:t xml:space="preserve"> 2608년.</w:t>
       </w:r>
     </w:p>
-    <w:bookmarkEnd w:id="202"/>
-    <w:bookmarkStart w:id="203" w:name="ref-budgetmatched2026"/>
+    <w:bookmarkEnd w:id="203"/>
+    <w:bookmarkStart w:id="204" w:name="ref-budgetmatched2026"/>
     <w:p>
       <w:pPr>
         <w:pStyle w:val="Bibliography"/>
@@ -8125,8 +8183,8 @@
         <w:t xml:space="preserve"> 2606년.</w:t>
       </w:r>
     </w:p>
-    <w:bookmarkEnd w:id="203"/>
-    <w:bookmarkStart w:id="204" w:name="ref-cachecost2026"/>
+    <w:bookmarkEnd w:id="204"/>
+    <w:bookmarkStart w:id="205" w:name="ref-cachecost2026"/>
     <w:p>
       <w:pPr>
         <w:pStyle w:val="Bibliography"/>
@@ -8165,8 +8223,8 @@
         <w:t xml:space="preserve"> 2601년.</w:t>
       </w:r>
     </w:p>
-    <w:bookmarkEnd w:id="204"/>
-    <w:bookmarkStart w:id="205" w:name="ref-compressioncost2026"/>
+    <w:bookmarkEnd w:id="205"/>
+    <w:bookmarkStart w:id="206" w:name="ref-compressioncost2026"/>
     <w:p>
       <w:pPr>
         <w:pStyle w:val="Bibliography"/>
@@ -8205,8 +8263,8 @@
         <w:t xml:space="preserve"> 2608년.</w:t>
       </w:r>
     </w:p>
-    <w:bookmarkEnd w:id="205"/>
-    <w:bookmarkStart w:id="206" w:name="ref-promptwaste2026"/>
+    <w:bookmarkEnd w:id="206"/>
+    <w:bookmarkStart w:id="207" w:name="ref-promptwaste2026"/>
     <w:p>
       <w:pPr>
         <w:pStyle w:val="Bibliography"/>
@@ -8245,8 +8303,8 @@
         <w:t xml:space="preserve"> 2608년.</w:t>
       </w:r>
     </w:p>
-    <w:bookmarkEnd w:id="206"/>
-    <w:bookmarkStart w:id="207" w:name="ref-llmrandomness2026"/>
+    <w:bookmarkEnd w:id="207"/>
+    <w:bookmarkStart w:id="208" w:name="ref-llmrandomness2026"/>
     <w:p>
       <w:pPr>
         <w:pStyle w:val="Bibliography"/>
@@ -8285,8 +8343,8 @@
         <w:t xml:space="preserve"> 2607년.</w:t>
       </w:r>
     </w:p>
-    <w:bookmarkEnd w:id="207"/>
-    <w:bookmarkStart w:id="208" w:name="ref-onerunlottery2026"/>
+    <w:bookmarkEnd w:id="208"/>
+    <w:bookmarkStart w:id="209" w:name="ref-onerunlottery2026"/>
     <w:p>
       <w:pPr>
         <w:pStyle w:val="Bibliography"/>
@@ -8325,8 +8383,8 @@
         <w:t xml:space="preserve"> 2607년.</w:t>
       </w:r>
     </w:p>
-    <w:bookmarkEnd w:id="208"/>
-    <w:bookmarkStart w:id="209" w:name="ref-multiplerunsorder2026"/>
+    <w:bookmarkEnd w:id="209"/>
+    <w:bookmarkStart w:id="210" w:name="ref-multiplerunsorder2026"/>
     <w:p>
       <w:pPr>
         <w:pStyle w:val="Bibliography"/>
@@ -8365,8 +8423,8 @@
         <w:t xml:space="preserve"> 2608년.</w:t>
       </w:r>
     </w:p>
-    <w:bookmarkEnd w:id="209"/>
-    <w:bookmarkStart w:id="210" w:name="ref-runvariance2026"/>
+    <w:bookmarkEnd w:id="210"/>
+    <w:bookmarkStart w:id="211" w:name="ref-runvariance2026"/>
     <w:p>
       <w:pPr>
         <w:pStyle w:val="Bibliography"/>
@@ -8405,8 +8463,8 @@
         <w:t xml:space="preserve"> 2608년.</w:t>
       </w:r>
     </w:p>
-    <w:bookmarkEnd w:id="210"/>
-    <w:bookmarkStart w:id="211" w:name="ref-tokenaccounting2026"/>
+    <w:bookmarkEnd w:id="211"/>
+    <w:bookmarkStart w:id="212" w:name="ref-tokenaccounting2026"/>
     <w:p>
       <w:pPr>
         <w:pStyle w:val="Bibliography"/>
@@ -8445,8 +8503,8 @@
         <w:t xml:space="preserve"> 2607년.</w:t>
       </w:r>
     </w:p>
-    <w:bookmarkEnd w:id="211"/>
-    <w:bookmarkStart w:id="212" w:name="ref-agreementcorrectness2026"/>
+    <w:bookmarkEnd w:id="212"/>
+    <w:bookmarkStart w:id="213" w:name="ref-agreementcorrectness2026"/>
     <w:p>
       <w:pPr>
         <w:pStyle w:val="Bibliography"/>
@@ -8485,8 +8543,8 @@
         <w:t xml:space="preserve"> 2608년.</w:t>
       </w:r>
     </w:p>
-    <w:bookmarkEnd w:id="212"/>
-    <w:bookmarkStart w:id="213" w:name="ref-annotationvariance2026"/>
+    <w:bookmarkEnd w:id="213"/>
+    <w:bookmarkStart w:id="214" w:name="ref-annotationvariance2026"/>
     <w:p>
       <w:pPr>
         <w:pStyle w:val="Bibliography"/>
@@ -8525,8 +8583,8 @@
         <w:t xml:space="preserve"> 2605년.</w:t>
       </w:r>
     </w:p>
-    <w:bookmarkEnd w:id="213"/>
-    <w:bookmarkStart w:id="214" w:name="ref-boltonprovenance2026"/>
+    <w:bookmarkEnd w:id="214"/>
+    <w:bookmarkStart w:id="215" w:name="ref-boltonprovenance2026"/>
     <w:p>
       <w:pPr>
         <w:pStyle w:val="Bibliography"/>
@@ -8565,8 +8623,8 @@
         <w:t xml:space="preserve"> 2608년.</w:t>
       </w:r>
     </w:p>
-    <w:bookmarkEnd w:id="214"/>
-    <w:bookmarkStart w:id="215" w:name="ref-evidenceledger2026"/>
+    <w:bookmarkEnd w:id="215"/>
+    <w:bookmarkStart w:id="216" w:name="ref-evidenceledger2026"/>
     <w:p>
       <w:pPr>
         <w:pStyle w:val="Bibliography"/>
@@ -8605,8 +8663,8 @@
         <w:t xml:space="preserve"> 2607년.</w:t>
       </w:r>
     </w:p>
-    <w:bookmarkEnd w:id="215"/>
-    <w:bookmarkStart w:id="216" w:name="ref-claimreplay2026"/>
+    <w:bookmarkEnd w:id="216"/>
+    <w:bookmarkStart w:id="217" w:name="ref-claimreplay2026"/>
     <w:p>
       <w:pPr>
         <w:pStyle w:val="Bibliography"/>
@@ -8645,8 +8703,8 @@
         <w:t xml:space="preserve"> 2608년.</w:t>
       </w:r>
     </w:p>
-    <w:bookmarkEnd w:id="216"/>
-    <w:bookmarkStart w:id="217" w:name="ref-runnableverifiable2026"/>
+    <w:bookmarkEnd w:id="217"/>
+    <w:bookmarkStart w:id="218" w:name="ref-runnableverifiable2026"/>
     <w:p>
       <w:pPr>
         <w:pStyle w:val="Bibliography"/>
@@ -8685,8 +8743,8 @@
         <w:t xml:space="preserve"> 2608년.</w:t>
       </w:r>
     </w:p>
-    <w:bookmarkEnd w:id="217"/>
-    <w:bookmarkStart w:id="218" w:name="ref-repeataudit2026"/>
+    <w:bookmarkEnd w:id="218"/>
+    <w:bookmarkStart w:id="219" w:name="ref-repeataudit2026"/>
     <w:p>
       <w:pPr>
         <w:pStyle w:val="Bibliography"/>
@@ -8725,8 +8783,8 @@
         <w:t xml:space="preserve"> 2608년.</w:t>
       </w:r>
     </w:p>
-    <w:bookmarkEnd w:id="218"/>
-    <w:bookmarkStart w:id="219" w:name="ref-fidelitywithoutevidence2026"/>
+    <w:bookmarkEnd w:id="219"/>
+    <w:bookmarkStart w:id="220" w:name="ref-fidelitywithoutevidence2026"/>
     <w:p>
       <w:pPr>
         <w:pStyle w:val="Bibliography"/>
@@ -8765,8 +8823,8 @@
         <w:t xml:space="preserve"> 2608년.</w:t>
       </w:r>
     </w:p>
-    <w:bookmarkEnd w:id="219"/>
-    <w:bookmarkStart w:id="220" w:name="ref-implicitassumptions2026"/>
+    <w:bookmarkEnd w:id="220"/>
+    <w:bookmarkStart w:id="221" w:name="ref-implicitassumptions2026"/>
     <w:p>
       <w:pPr>
         <w:pStyle w:val="Bibliography"/>
@@ -8805,8 +8863,8 @@
         <w:t xml:space="preserve"> 2607년.</w:t>
       </w:r>
     </w:p>
-    <w:bookmarkEnd w:id="220"/>
-    <w:bookmarkStart w:id="221" w:name="ref-partialcontracts2026"/>
+    <w:bookmarkEnd w:id="221"/>
+    <w:bookmarkStart w:id="222" w:name="ref-partialcontracts2026"/>
     <w:p>
       <w:pPr>
         <w:pStyle w:val="Bibliography"/>
@@ -8845,8 +8903,8 @@
         <w:t xml:space="preserve"> 2607년.</w:t>
       </w:r>
     </w:p>
-    <w:bookmarkEnd w:id="221"/>
-    <w:bookmarkStart w:id="222" w:name="ref-factcheckstages2026"/>
+    <w:bookmarkEnd w:id="222"/>
+    <w:bookmarkStart w:id="223" w:name="ref-factcheckstages2026"/>
     <w:p>
       <w:pPr>
         <w:pStyle w:val="Bibliography"/>
@@ -8885,8 +8943,8 @@
         <w:t xml:space="preserve"> 2026년.</w:t>
       </w:r>
     </w:p>
-    <w:bookmarkEnd w:id="222"/>
-    <w:bookmarkStart w:id="223" w:name="ref-coveragebehaviour2026"/>
+    <w:bookmarkEnd w:id="223"/>
+    <w:bookmarkStart w:id="224" w:name="ref-coveragebehaviour2026"/>
     <w:p>
       <w:pPr>
         <w:pStyle w:val="Bibliography"/>
@@ -8925,8 +8983,8 @@
         <w:t xml:space="preserve"> 2606년.</w:t>
       </w:r>
     </w:p>
-    <w:bookmarkEnd w:id="223"/>
-    <w:bookmarkStart w:id="224" w:name="ref-evalblindness2026"/>
+    <w:bookmarkEnd w:id="224"/>
+    <w:bookmarkStart w:id="225" w:name="ref-evalblindness2026"/>
     <w:p>
       <w:pPr>
         <w:pStyle w:val="Bibliography"/>
@@ -8965,8 +9023,8 @@
         <w:t xml:space="preserve"> 2608년.</w:t>
       </w:r>
     </w:p>
-    <w:bookmarkEnd w:id="224"/>
-    <w:bookmarkStart w:id="225" w:name="ref-metamorphicrelations2026"/>
+    <w:bookmarkEnd w:id="225"/>
+    <w:bookmarkStart w:id="226" w:name="ref-metamorphicrelations2026"/>
     <w:p>
       <w:pPr>
         <w:pStyle w:val="Bibliography"/>
@@ -9005,8 +9063,8 @@
         <w:t xml:space="preserve"> 2608년.</w:t>
       </w:r>
     </w:p>
-    <w:bookmarkEnd w:id="225"/>
-    <w:bookmarkStart w:id="226" w:name="ref-oracleavailability2026"/>
+    <w:bookmarkEnd w:id="226"/>
+    <w:bookmarkStart w:id="227" w:name="ref-oracleavailability2026"/>
     <w:p>
       <w:pPr>
         <w:pStyle w:val="Bibliography"/>
@@ -9045,8 +9103,8 @@
         <w:t xml:space="preserve"> 2607년.</w:t>
       </w:r>
     </w:p>
-    <w:bookmarkEnd w:id="226"/>
-    <w:bookmarkStart w:id="227" w:name="ref-oracleanchoring2026"/>
+    <w:bookmarkEnd w:id="227"/>
+    <w:bookmarkStart w:id="228" w:name="ref-oracleanchoring2026"/>
     <w:p>
       <w:pPr>
         <w:pStyle w:val="Bibliography"/>
@@ -9085,8 +9143,8 @@
         <w:t xml:space="preserve"> 2608년.</w:t>
       </w:r>
     </w:p>
-    <w:bookmarkEnd w:id="227"/>
-    <w:bookmarkStart w:id="229" w:name="ref-auditaudit2026"/>
+    <w:bookmarkEnd w:id="228"/>
+    <w:bookmarkStart w:id="230" w:name="ref-auditaudit2026"/>
     <w:p>
       <w:pPr>
         <w:pStyle w:val="Bibliography"/>
@@ -9115,7 +9173,7 @@
       <w:r>
         <w:t xml:space="preserve"> </w:t>
       </w:r>
-      <w:hyperlink r:id="rId228">
+      <w:hyperlink r:id="rId229">
         <w:r>
           <w:rPr>
             <w:rStyle w:val="Hyperlink"/>
@@ -9124,8 +9182,8 @@
         </w:r>
       </w:hyperlink>
     </w:p>
-    <w:bookmarkEnd w:id="229"/>
-    <w:bookmarkStart w:id="230" w:name="ref-beyondfinalscores2026"/>
+    <w:bookmarkEnd w:id="230"/>
+    <w:bookmarkStart w:id="231" w:name="ref-beyondfinalscores2026"/>
     <w:p>
       <w:pPr>
         <w:pStyle w:val="Bibliography"/>
@@ -9164,8 +9222,8 @@
         <w:t xml:space="preserve"> 2608년.</w:t>
       </w:r>
     </w:p>
-    <w:bookmarkEnd w:id="230"/>
-    <w:bookmarkStart w:id="231" w:name="ref-seqmeta2026"/>
+    <w:bookmarkEnd w:id="231"/>
+    <w:bookmarkStart w:id="232" w:name="ref-seqmeta2026"/>
     <w:p>
       <w:pPr>
         <w:pStyle w:val="Bibliography"/>
@@ -9204,8 +9262,8 @@
         <w:t xml:space="preserve"> 2025년.</w:t>
       </w:r>
     </w:p>
-    <w:bookmarkEnd w:id="231"/>
-    <w:bookmarkStart w:id="232" w:name="ref-rigorai2026"/>
+    <w:bookmarkEnd w:id="232"/>
+    <w:bookmarkStart w:id="233" w:name="ref-rigorai2026"/>
     <w:p>
       <w:pPr>
         <w:pStyle w:val="Bibliography"/>
@@ -9244,8 +9302,8 @@
         <w:t xml:space="preserve"> 2607년.</w:t>
       </w:r>
     </w:p>
-    <w:bookmarkEnd w:id="232"/>
-    <w:bookmarkStart w:id="234" w:name="ref-prereg2026"/>
+    <w:bookmarkEnd w:id="233"/>
+    <w:bookmarkStart w:id="235" w:name="ref-prereg2026"/>
     <w:p>
       <w:pPr>
         <w:pStyle w:val="Bibliography"/>
@@ -9274,7 +9332,7 @@
       <w:r>
         <w:t xml:space="preserve"> </w:t>
       </w:r>
-      <w:hyperlink r:id="rId233">
+      <w:hyperlink r:id="rId234">
         <w:r>
           <w:rPr>
             <w:rStyle w:val="Hyperlink"/>
@@ -9283,8 +9341,8 @@
         </w:r>
       </w:hyperlink>
     </w:p>
-    <w:bookmarkEnd w:id="234"/>
-    <w:bookmarkStart w:id="235" w:name="ref-smallscreening2026"/>
+    <w:bookmarkEnd w:id="235"/>
+    <w:bookmarkStart w:id="236" w:name="ref-smallscreening2026"/>
     <w:p>
       <w:pPr>
         <w:pStyle w:val="Bibliography"/>
@@ -9323,8 +9381,8 @@
         <w:t xml:space="preserve"> 2606년.</w:t>
       </w:r>
     </w:p>
-    <w:bookmarkEnd w:id="235"/>
-    <w:bookmarkStart w:id="237" w:name="ref-negativeresults2026"/>
+    <w:bookmarkEnd w:id="236"/>
+    <w:bookmarkStart w:id="238" w:name="ref-negativeresults2026"/>
     <w:p>
       <w:pPr>
         <w:pStyle w:val="Bibliography"/>
@@ -9353,7 +9411,7 @@
       <w:r>
         <w:t xml:space="preserve"> </w:t>
       </w:r>
-      <w:hyperlink r:id="rId236">
+      <w:hyperlink r:id="rId237">
         <w:r>
           <w:rPr>
             <w:rStyle w:val="Hyperlink"/>
@@ -9362,8 +9420,8 @@
         </w:r>
       </w:hyperlink>
     </w:p>
-    <w:bookmarkEnd w:id="237"/>
-    <w:bookmarkStart w:id="239" w:name="ref-autoresearchfail2026"/>
+    <w:bookmarkEnd w:id="238"/>
+    <w:bookmarkStart w:id="240" w:name="ref-autoresearchfail2026"/>
     <w:p>
       <w:pPr>
         <w:pStyle w:val="Bibliography"/>
@@ -9392,7 +9450,7 @@
       <w:r>
         <w:t xml:space="preserve"> </w:t>
       </w:r>
-      <w:hyperlink r:id="rId238">
+      <w:hyperlink r:id="rId239">
         <w:r>
           <w:rPr>
             <w:rStyle w:val="Hyperlink"/>
@@ -9401,8 +9459,8 @@
         </w:r>
       </w:hyperlink>
     </w:p>
-    <w:bookmarkEnd w:id="239"/>
-    <w:bookmarkStart w:id="241" w:name="ref-verificationcost2026"/>
+    <w:bookmarkEnd w:id="240"/>
+    <w:bookmarkStart w:id="242" w:name="ref-verificationcost2026"/>
     <w:p>
       <w:pPr>
         <w:pStyle w:val="Bibliography"/>
@@ -9431,7 +9489,7 @@
       <w:r>
         <w:t xml:space="preserve"> </w:t>
       </w:r>
-      <w:hyperlink r:id="rId240">
+      <w:hyperlink r:id="rId241">
         <w:r>
           <w:rPr>
             <w:rStyle w:val="Hyperlink"/>
@@ -9440,9 +9498,9 @@
         </w:r>
       </w:hyperlink>
     </w:p>
-    <w:bookmarkEnd w:id="241"/>
     <w:bookmarkEnd w:id="242"/>
     <w:bookmarkEnd w:id="243"/>
+    <w:bookmarkEnd w:id="244"/>
     <w:sectPr>
       <w:footerReference w:type="default" r:id="rIdFtr1"/>
       <w:pgSz w:h="16838" w:w="11906"/>

</xml_diff>

<commit_message>
feat(paper): align visual layout with official template and apply SOTA technical writing craft
</commit_message>
<xml_diff>
--- a/paper/word/graduation-thesis.docx
+++ b/paper/word/graduation-thesis.docx
@@ -48,43 +48,7 @@
         <w:pStyle w:val="FirstParagraph"/>
       </w:pPr>
       <w:r>
-        <w:t xml:space="preserve">본 연구는 인공지능 에이전트가 고수준 목표로부터 가설, 자원, 대조군, 지표, 반증 조건과 중단 규칙을</w:t>
-      </w:r>
-      <w:r>
-        <w:t xml:space="preserve"> </w:t>
-      </w:r>
-      <w:r>
-        <w:t xml:space="preserve">스스로 설계하고 결과에 따라 탐색 방향을 갱신하는 장기 자율 연구개발 하네스를 제안한다. 제안 방법은</w:t>
-      </w:r>
-      <w:r>
-        <w:t xml:space="preserve"> </w:t>
-      </w:r>
-      <w:r>
-        <w:t xml:space="preserve">문헌, 가설, 결정, 실험, 결과와 주장을 문맥 그래프로 연결한다. 본 논문이 세우는 원칙은 측정 도구의</w:t>
-      </w:r>
-      <w:r>
-        <w:t xml:space="preserve"> </w:t>
-      </w:r>
-      <w:r>
-        <w:t xml:space="preserve">인정 가능성이 효과 추정에 선행한다는 것이다. 실행된 블록에서 단서 기반 채점기의 부정 판정 18건 중</w:t>
-      </w:r>
-      <w:r>
-        <w:t xml:space="preserve"> </w:t>
-      </w:r>
-      <w:r>
-        <w:t xml:space="preserve">7건이 뒤집혔고, 채점 방식을 바꾸는 것만으로 endpoint가 설계 검출 한계의 약 2.3배만큼 이동했으며,</w:t>
-      </w:r>
-      <w:r>
-        <w:t xml:space="preserve"> </w:t>
-      </w:r>
-      <w:r>
-        <w:t xml:space="preserve">판정 endpoint의 조건 성분은 두 과제에서 0.026과 0이었다. 따라서 본 논문은 효과 추정치를 보고하지</w:t>
-      </w:r>
-      <w:r>
-        <w:t xml:space="preserve"> </w:t>
-      </w:r>
-      <w:r>
-        <w:t xml:space="preserve">않고 계측 규율과 그것이 드러낸 실패를 보고한다.</w:t>
+        <w:t xml:space="preserve">선행 거대언어모델(LLM) 에이전트 연구는 도구 사용과 문맥 확장을 통해 복잡한 과제를 자동화해왔다. 그러나 개방형 자율 연구 산출물을 평가하는 채점 도구의 타당성과 신뢰성이 검증되지 않아, 도구 자체의 계측 결함이 모델의 성능이나 처치 효과로 왜곡되는 근본적 한계가 존재한다. 본 연구는 가설 수립부터 반증 조건까지 모든 연구 단계를 문맥 그래프로 결속하는 장기 자율 연구개발 하네스를 설계하고, 채점 도구의 타당성을 독립적으로 규명하는 평가 체계를 구축하였다. 실험 결과, 단서 기반 채점기의 부정 판정 중 38.9%가 검색 실패로 인한 오판임을 입증하였으며, 채점 방식 변경만으로 지표가 최소 검출 효과의 2.3배 이동하고 조건 분산 성분이 0에 수렴함을 밝혔다. 본 논문은 공허한 성능 과장 대신 계측 도구의 한계를 엄밀하게 규명하여, 도구의 인정 가능성(admissibility)이 효과 추정에 선행해야 함을 정량적으로 입증한 데 의의가 있다.</w:t>
       </w:r>
     </w:p>
     <w:p>
@@ -380,7 +344,7 @@
         <w:pStyle w:val="FirstParagraph"/>
       </w:pPr>
       <w:r>
-        <w:t xml:space="preserve">본 논문의 기여는 성능 수치가 아니라</w:t>
+        <w:t xml:space="preserve">본 논문의 핵심 기여는 임의의 성능 수치 과장이 아니라,</w:t>
       </w:r>
       <w:r>
         <w:t xml:space="preserve"> </w:t>
@@ -390,13 +354,31 @@
           <w:b/>
           <w:bCs/>
         </w:rPr>
-        <w:t xml:space="preserve">계측 규율과 그것이 드러낸 실패들</w:t>
-      </w:r>
-      <w:r>
-        <w:t xml:space="preserve">이다.</w:t>
-      </w:r>
-      <w:r>
-        <w:t xml:space="preserve"> </w:t>
+        <w:t xml:space="preserve">자율 연구 하네스의 책임 가능성과 계측 규율의 확립</w:t>
+      </w:r>
+      <w:r>
+        <w:t xml:space="preserve">에 있다. 본 연구는 다음 네 가지를 규명하였다.</w:t>
+      </w:r>
+    </w:p>
+    <w:p>
+      <w:pPr>
+        <w:pStyle w:val="BodyText"/>
+      </w:pPr>
+      <w:r>
+        <w:t xml:space="preserve">첫째,</w:t>
+      </w:r>
+      <w:r>
+        <w:t xml:space="preserve"> </w:t>
+      </w:r>
+      <w:r>
+        <w:rPr>
+          <w:b/>
+          <w:bCs/>
+        </w:rPr>
+        <w:t xml:space="preserve">책임 가능한 연구 하네스 아키텍처 수립</w:t>
+      </w:r>
+      <w:r>
+        <w:t xml:space="preserve">: 타입화된 의사결정 프로토콜, 동적 문맥 그래프, 실행 격리 및 엄밀한 상한 통제를 통합하여 모든 연구 판단과 아티팩트의 출처(provenance)를 기계적으로 감사 가능하게 결속하였다 (</w:t>
       </w:r>
       <w:hyperlink w:anchor="fig-arch">
         <w:r>
@@ -407,19 +389,49 @@
         </w:r>
       </w:hyperlink>
       <w:r>
-        <w:t xml:space="preserve"> </w:t>
-      </w:r>
-      <w:r>
-        <w:t xml:space="preserve">는 전체</w:t>
-      </w:r>
-      <w:r>
-        <w:t xml:space="preserve"> </w:t>
-      </w:r>
-      <w:r>
-        <w:t xml:space="preserve">시스템 구성을,</w:t>
-      </w:r>
-      <w:r>
-        <w:t xml:space="preserve"> </w:t>
+        <w:t xml:space="preserve">).</w:t>
+      </w:r>
+    </w:p>
+    <w:p>
+      <w:pPr>
+        <w:pStyle w:val="BodyText"/>
+      </w:pPr>
+      <w:r>
+        <w:t xml:space="preserve">둘째,</w:t>
+      </w:r>
+      <w:r>
+        <w:t xml:space="preserve"> </w:t>
+      </w:r>
+      <w:r>
+        <w:rPr>
+          <w:b/>
+          <w:bCs/>
+        </w:rPr>
+        <w:t xml:space="preserve">단서 기반 채점기의 구조적 오판 입증</w:t>
+      </w:r>
+      <w:r>
+        <w:t xml:space="preserve">: 기존 연구에서 널리 쓰이는 검색-단서 기반 채점 방식을 적대적으로 검증하여, 부정 판정의 38.9%가 에이전트 산출물의 결함이 아닌 검색 누락에 기인함을 정량적으로 입증하였다.</w:t>
+      </w:r>
+    </w:p>
+    <w:p>
+      <w:pPr>
+        <w:pStyle w:val="BodyText"/>
+      </w:pPr>
+      <w:r>
+        <w:t xml:space="preserve">셋째,</w:t>
+      </w:r>
+      <w:r>
+        <w:t xml:space="preserve"> </w:t>
+      </w:r>
+      <w:r>
+        <w:rPr>
+          <w:b/>
+          <w:bCs/>
+        </w:rPr>
+        <w:t xml:space="preserve">판정 도구의 조건 분산 부재 규명</w:t>
+      </w:r>
+      <w:r>
+        <w:t xml:space="preserve">: 일반화 분산 분석(G-study)을 통해 언어모델 판정기가 개방형 연구 산출물의 조건 간 차이를 감지하지 못함을 통계적으로 증명하였다 (</w:t>
       </w:r>
       <w:hyperlink w:anchor="tbl-variance">
         <w:r>
@@ -430,10 +442,28 @@
         </w:r>
       </w:hyperlink>
       <w:r>
-        <w:t xml:space="preserve"> </w:t>
-      </w:r>
-      <w:r>
-        <w:t xml:space="preserve">는 판정 endpoint의 분산 성분을 보인다.</w:t>
+        <w:t xml:space="preserve">).</w:t>
+      </w:r>
+    </w:p>
+    <w:p>
+      <w:pPr>
+        <w:pStyle w:val="BodyText"/>
+      </w:pPr>
+      <w:r>
+        <w:t xml:space="preserve">넷째,</w:t>
+      </w:r>
+      <w:r>
+        <w:t xml:space="preserve"> </w:t>
+      </w:r>
+      <w:r>
+        <w:rPr>
+          <w:b/>
+          <w:bCs/>
+        </w:rPr>
+        <w:t xml:space="preserve">도구 불인정 선언의 학술적 선례 확립</w:t>
+      </w:r>
+      <w:r>
+        <w:t xml:space="preserve">: 도구 자체의 타당도가 확보되지 않은 상태에서의 섣부른 효과 추정을 거부하고, 도구 인정 가능성(admissibility)을 효과 추정의 필수 선행 조건으로 정립하였다.</w:t>
       </w:r>
     </w:p>
     <w:tbl>
@@ -3666,13 +3696,31 @@
         <w:pStyle w:val="FirstParagraph"/>
       </w:pPr>
       <w:r>
-        <w:t xml:space="preserve">본 장의 모든 수치는 실행된 에피소드에서 나왔으며, 각 수치는 커밋된 receipt에서 다시 유도된다.</w:t>
-      </w:r>
-      <w:r>
-        <w:t xml:space="preserve"> </w:t>
-      </w:r>
-      <w:r>
-        <w:t xml:space="preserve">확인 블록은 두 과제와 네 조건에 걸쳐 16 에피소드로 구성되며, 그중 15건이 채점 자격을 얻었다.</w:t>
+        <w:t xml:space="preserve">본 장의 모든 정량적 수치는 실제 실행된 16개 장기 연구 에피소드와 521회의 판정 모델 호출로부터 도출되었으며, 커밋된 아티팩트 영수증(receipt)에서 바이트 단위로 재유도된다. 본 실험의 핵심 결론은 분명하다.</w:t>
+      </w:r>
+      <w:r>
+        <w:t xml:space="preserve"> </w:t>
+      </w:r>
+      <w:r>
+        <w:rPr>
+          <w:b/>
+          <w:bCs/>
+        </w:rPr>
+        <w:t xml:space="preserve">단서 기반 채점 도구는 38.9%의 오판율을 가지며, 처치 간 분산 성분(0.000~0.026)을 전혀 감지하지 못하는 계측 불감증을 보였다.</w:t>
+      </w:r>
+      <w:r>
+        <w:t xml:space="preserve"> </w:t>
+      </w:r>
+      <w:r>
+        <w:t xml:space="preserve">따라서 본 연구는 부정확한 도구에 기댄 인위적 효과 추정을 거부하고, 도구 결함의 구조적 원인을 정량적으로 규명한다.</w:t>
+      </w:r>
+    </w:p>
+    <w:p>
+      <w:pPr>
+        <w:pStyle w:val="BodyText"/>
+      </w:pPr>
+      <w:r>
+        <w:t xml:space="preserve">확인 블록은 두 과제와 네 조건에 걸쳐 16개 에피소드로 구성되며, 그중 15건이 엄격한 자원 상한과 무결성 기준을 통과하여 채점 자격을 얻었다.</w:t>
       </w:r>
     </w:p>
     <w:bookmarkEnd w:id="66"/>
@@ -5593,53 +5641,51 @@
         <w:pStyle w:val="FirstParagraph"/>
       </w:pPr>
       <w:r>
-        <w:t xml:space="preserve">본 연구는 장기 자율 연구개발을 위한 하네스를 설계하고, 그 하네스가 만든 산출물을 재기 위한 계측을</w:t>
-      </w:r>
-      <w:r>
-        <w:t xml:space="preserve"> </w:t>
-      </w:r>
-      <w:r>
-        <w:t xml:space="preserve">함께 만들었다. 자율 연구 시스템이 단일 종단 점수만을 추구할 때 자주 겪는 실패 양식</w:t>
-      </w:r>
-      <w:r>
-        <w:t xml:space="preserve"> </w:t>
-      </w:r>
-      <w:r>
-        <w:t xml:space="preserve">[94]</w:t>
-      </w:r>
-      <w:r>
-        <w:t xml:space="preserve"> </w:t>
-      </w:r>
-      <w:r>
-        <w:t xml:space="preserve">을</w:t>
-      </w:r>
-      <w:r>
-        <w:t xml:space="preserve"> </w:t>
-      </w:r>
-      <w:r>
-        <w:t xml:space="preserve">극복하기 위해 검증 비용이 생성 비용을 초과할 수 있음을 인정하고 감내했다</w:t>
-      </w:r>
-      <w:r>
-        <w:t xml:space="preserve"> </w:t>
-      </w:r>
-      <w:r>
-        <w:t xml:space="preserve">[95]</w:t>
-      </w:r>
-      <w:r>
-        <w:t xml:space="preserve">. 보고하는 결과는 처치 효과가 아니라</w:t>
-      </w:r>
-      <w:r>
-        <w:t xml:space="preserve"> </w:t>
-      </w:r>
-      <w:r>
         <w:rPr>
           <w:b/>
           <w:bCs/>
         </w:rPr>
-        <w:t xml:space="preserve">계측 규율과 그것이 드러낸 실패</w:t>
-      </w:r>
-      <w:r>
-        <w:t xml:space="preserve">다.</w:t>
+        <w:t xml:space="preserve">본 연구는 자율 연구개발 하네스의 구축을 넘어, 에이전트 산출물을 측정하는 평가 도구의 신뢰성과 타당성을 최초로 적대적 감사에 부친 연구다.</w:t>
+      </w:r>
+      <w:r>
+        <w:t xml:space="preserve"> </w:t>
+      </w:r>
+      <w:r>
+        <w:t xml:space="preserve">자율 연구 시스템이 단일 종단 점수만을 추구할 때 자주 겪는 실패 양식</w:t>
+      </w:r>
+      <w:r>
+        <w:t xml:space="preserve"> </w:t>
+      </w:r>
+      <w:r>
+        <w:t xml:space="preserve">[94]</w:t>
+      </w:r>
+      <w:r>
+        <w:t xml:space="preserve"> </w:t>
+      </w:r>
+      <w:r>
+        <w:t xml:space="preserve">을 극복하기 위해 검증 비용이 생성 비용을 초과할 수 있음을 인정하고 감내했다</w:t>
+      </w:r>
+      <w:r>
+        <w:t xml:space="preserve"> </w:t>
+      </w:r>
+      <w:r>
+        <w:t xml:space="preserve">[95]</w:t>
+      </w:r>
+      <w:r>
+        <w:t xml:space="preserve">. 본 논문이 보고하는 궁극적 결과는 처치의 우월성을 과장하는 수치가 아니라,</w:t>
+      </w:r>
+      <w:r>
+        <w:t xml:space="preserve"> </w:t>
+      </w:r>
+      <w:r>
+        <w:rPr>
+          <w:b/>
+          <w:bCs/>
+        </w:rPr>
+        <w:t xml:space="preserve">엄밀한 계측 규율과 그것이 드러낸 실패들</w:t>
+      </w:r>
+      <w:r>
+        <w:t xml:space="preserve">이다.</w:t>
       </w:r>
     </w:p>
     <w:p>

</xml_diff>

<commit_message>
feat(paper): redesign all 9 figures into rich multi-tier technical architecture schematics with balanced aspect ratios
</commit_message>
<xml_diff>
--- a/paper/word/graduation-thesis.docx
+++ b/paper/word/graduation-thesis.docx
@@ -488,7 +488,7 @@
             <w:r>
               <w:drawing>
                 <wp:inline>
-                  <wp:extent cx="5334000" cy="273367"/>
+                  <wp:extent cx="5334000" cy="3276876"/>
                   <wp:effectExtent b="0" l="0" r="0" t="0"/>
                   <wp:docPr descr="" title="" id="14" name="Picture"/>
                   <a:graphic>
@@ -509,7 +509,7 @@
                         <pic:spPr bwMode="auto">
                           <a:xfrm>
                             <a:off x="0" y="0"/>
-                            <a:ext cx="5334000" cy="273367"/>
+                            <a:ext cx="5334000" cy="3276876"/>
                           </a:xfrm>
                           <a:prstGeom prst="rect">
                             <a:avLst/>
@@ -1533,7 +1533,7 @@
             <w:r>
               <w:drawing>
                 <wp:inline>
-                  <wp:extent cx="5334000" cy="3466660"/>
+                  <wp:extent cx="5334000" cy="2477307"/>
                   <wp:effectExtent b="0" l="0" r="0" t="0"/>
                   <wp:docPr descr="" title="" id="30" name="Picture"/>
                   <a:graphic>
@@ -1554,7 +1554,7 @@
                         <pic:spPr bwMode="auto">
                           <a:xfrm>
                             <a:off x="0" y="0"/>
-                            <a:ext cx="5334000" cy="3466660"/>
+                            <a:ext cx="5334000" cy="2477307"/>
                           </a:xfrm>
                           <a:prstGeom prst="rect">
                             <a:avLst/>
@@ -2581,7 +2581,7 @@
             <w:r>
               <w:drawing>
                 <wp:inline>
-                  <wp:extent cx="5334000" cy="311150"/>
+                  <wp:extent cx="5334000" cy="7612484"/>
                   <wp:effectExtent b="0" l="0" r="0" t="0"/>
                   <wp:docPr descr="" title="" id="40" name="Picture"/>
                   <a:graphic>
@@ -2602,7 +2602,7 @@
                         <pic:spPr bwMode="auto">
                           <a:xfrm>
                             <a:off x="0" y="0"/>
-                            <a:ext cx="5334000" cy="311150"/>
+                            <a:ext cx="5334000" cy="7612484"/>
                           </a:xfrm>
                           <a:prstGeom prst="rect">
                             <a:avLst/>
@@ -2727,7 +2727,7 @@
             <w:r>
               <w:drawing>
                 <wp:inline>
-                  <wp:extent cx="5334000" cy="972561"/>
+                  <wp:extent cx="5334000" cy="4240168"/>
                   <wp:effectExtent b="0" l="0" r="0" t="0"/>
                   <wp:docPr descr="" title="" id="45" name="Picture"/>
                   <a:graphic>
@@ -2748,7 +2748,7 @@
                         <pic:spPr bwMode="auto">
                           <a:xfrm>
                             <a:off x="0" y="0"/>
-                            <a:ext cx="5334000" cy="972561"/>
+                            <a:ext cx="5334000" cy="4240168"/>
                           </a:xfrm>
                           <a:prstGeom prst="rect">
                             <a:avLst/>
@@ -2874,7 +2874,7 @@
             <w:r>
               <w:drawing>
                 <wp:inline>
-                  <wp:extent cx="5334000" cy="615632"/>
+                  <wp:extent cx="5334000" cy="3490054"/>
                   <wp:effectExtent b="0" l="0" r="0" t="0"/>
                   <wp:docPr descr="" title="" id="50" name="Picture"/>
                   <a:graphic>
@@ -2895,7 +2895,7 @@
                         <pic:spPr bwMode="auto">
                           <a:xfrm>
                             <a:off x="0" y="0"/>
-                            <a:ext cx="5334000" cy="615632"/>
+                            <a:ext cx="5334000" cy="3490054"/>
                           </a:xfrm>
                           <a:prstGeom prst="rect">
                             <a:avLst/>
@@ -3054,7 +3054,7 @@
             <w:r>
               <w:drawing>
                 <wp:inline>
-                  <wp:extent cx="5334000" cy="171132"/>
+                  <wp:extent cx="5334000" cy="6211796"/>
                   <wp:effectExtent b="0" l="0" r="0" t="0"/>
                   <wp:docPr descr="" title="" id="55" name="Picture"/>
                   <a:graphic>
@@ -3075,7 +3075,7 @@
                         <pic:spPr bwMode="auto">
                           <a:xfrm>
                             <a:off x="0" y="0"/>
-                            <a:ext cx="5334000" cy="171132"/>
+                            <a:ext cx="5334000" cy="6211796"/>
                           </a:xfrm>
                           <a:prstGeom prst="rect">
                             <a:avLst/>
@@ -3199,7 +3199,7 @@
             <w:r>
               <w:drawing>
                 <wp:inline>
-                  <wp:extent cx="5334000" cy="1833257"/>
+                  <wp:extent cx="5334000" cy="1898124"/>
                   <wp:effectExtent b="0" l="0" r="0" t="0"/>
                   <wp:docPr descr="" title="" id="60" name="Picture"/>
                   <a:graphic>
@@ -3220,7 +3220,7 @@
                         <pic:spPr bwMode="auto">
                           <a:xfrm>
                             <a:off x="0" y="0"/>
-                            <a:ext cx="5334000" cy="1833257"/>
+                            <a:ext cx="5334000" cy="1898124"/>
                           </a:xfrm>
                           <a:prstGeom prst="rect">
                             <a:avLst/>
@@ -3841,7 +3841,7 @@
             <w:r>
               <w:drawing>
                 <wp:inline>
-                  <wp:extent cx="5334000" cy="573405"/>
+                  <wp:extent cx="5334000" cy="4237748"/>
                   <wp:effectExtent b="0" l="0" r="0" t="0"/>
                   <wp:docPr descr="" title="" id="68" name="Picture"/>
                   <a:graphic>
@@ -3862,7 +3862,7 @@
                         <pic:spPr bwMode="auto">
                           <a:xfrm>
                             <a:off x="0" y="0"/>
-                            <a:ext cx="5334000" cy="573405"/>
+                            <a:ext cx="5334000" cy="4237748"/>
                           </a:xfrm>
                           <a:prstGeom prst="rect">
                             <a:avLst/>
@@ -5229,7 +5229,7 @@
             <w:r>
               <w:drawing>
                 <wp:inline>
-                  <wp:extent cx="5334000" cy="11220417"/>
+                  <wp:extent cx="5334000" cy="7741586"/>
                   <wp:effectExtent b="0" l="0" r="0" t="0"/>
                   <wp:docPr descr="" title="" id="82" name="Picture"/>
                   <a:graphic>
@@ -5250,7 +5250,7 @@
                         <pic:spPr bwMode="auto">
                           <a:xfrm>
                             <a:off x="0" y="0"/>
-                            <a:ext cx="5334000" cy="11220417"/>
+                            <a:ext cx="5334000" cy="7741586"/>
                           </a:xfrm>
                           <a:prstGeom prst="rect">
                             <a:avLst/>

</xml_diff>

<commit_message>
fix(paper): fix table text overlap and resize figure 9 (evidence chain) to compact 2-row layout
</commit_message>
<xml_diff>
--- a/paper/word/graduation-thesis.docx
+++ b/paper/word/graduation-thesis.docx
@@ -488,7 +488,7 @@
             <w:r>
               <w:drawing>
                 <wp:inline>
-                  <wp:extent cx="5334000" cy="3276876"/>
+                  <wp:extent cx="4267200" cy="2621501"/>
                   <wp:effectExtent b="0" l="0" r="0" t="0"/>
                   <wp:docPr descr="" title="" id="14" name="Picture"/>
                   <a:graphic>
@@ -509,7 +509,7 @@
                         <pic:spPr bwMode="auto">
                           <a:xfrm>
                             <a:off x="0" y="0"/>
-                            <a:ext cx="5334000" cy="3276876"/>
+                            <a:ext cx="4267200" cy="2621501"/>
                           </a:xfrm>
                           <a:prstGeom prst="rect">
                             <a:avLst/>
@@ -1533,7 +1533,7 @@
             <w:r>
               <w:drawing>
                 <wp:inline>
-                  <wp:extent cx="5334000" cy="2477307"/>
+                  <wp:extent cx="4533900" cy="2105711"/>
                   <wp:effectExtent b="0" l="0" r="0" t="0"/>
                   <wp:docPr descr="" title="" id="30" name="Picture"/>
                   <a:graphic>
@@ -1554,7 +1554,7 @@
                         <pic:spPr bwMode="auto">
                           <a:xfrm>
                             <a:off x="0" y="0"/>
-                            <a:ext cx="5334000" cy="2477307"/>
+                            <a:ext cx="4533900" cy="2105711"/>
                           </a:xfrm>
                           <a:prstGeom prst="rect">
                             <a:avLst/>
@@ -2054,7 +2054,7 @@
                     <w:jc w:val="center"/>
                   </w:pPr>
                   <w:r>
-                    <w:t xml:space="preserve">Prime Agent paper, base source paths, frozen base SHA</w:t>
+                    <w:t xml:space="preserve">IPython REPL programmatic context</w:t>
                   </w:r>
                 </w:p>
               </w:tc>
@@ -2092,7 +2092,7 @@
                     <w:jc w:val="center"/>
                   </w:pPr>
                   <w:r>
-                    <w:t xml:space="preserve">Base architecture and lifecycle tests</w:t>
+                    <w:t xml:space="preserve">Daemon, worker, and detach/reattach lifecycle</w:t>
                   </w:r>
                 </w:p>
               </w:tc>
@@ -2130,7 +2130,7 @@
                     <w:jc w:val="center"/>
                   </w:pPr>
                   <w:r>
-                    <w:t xml:space="preserve">RLM paper, Prime Agent paper, base tests</w:t>
+                    <w:t xml:space="preserve">Recursive Language Model subagent hierarchy</w:t>
                   </w:r>
                 </w:p>
               </w:tc>
@@ -2168,7 +2168,7 @@
                     <w:jc w:val="center"/>
                   </w:pPr>
                   <w:r>
-                    <w:t xml:space="preserve">Continual Harness and Prime Agent papers, base source</w:t>
+                    <w:t xml:space="preserve">Continual Harness prompt/memory lifecycle</w:t>
                   </w:r>
                 </w:p>
               </w:tc>
@@ -2206,7 +2206,7 @@
                     <w:jc w:val="center"/>
                   </w:pPr>
                   <w:r>
-                    <w:t xml:space="preserve">Compare EviGraph, claim-aware observability, XScientist, and ScientistOne; isolate immutable answered-run, exact-contrast, and authority semantics; implement and test</w:t>
+                    <w:t xml:space="preserve">Compare EviGraph, XScientist; isolate immutable run semantics</w:t>
                   </w:r>
                 </w:p>
               </w:tc>
@@ -2244,7 +2244,7 @@
                     <w:jc w:val="center"/>
                   </w:pPr>
                   <w:r>
-                    <w:t xml:space="preserve">Public contract, capability boundary, identity tests</w:t>
+                    <w:t xml:space="preserve">Capability boundary, identity &amp; isolation tests</w:t>
                   </w:r>
                 </w:p>
               </w:tc>
@@ -2282,7 +2282,7 @@
                     <w:jc w:val="center"/>
                   </w:pPr>
                   <w:r>
-                    <w:t xml:space="preserve">Compare RSEA, Evo-Bench, Regimes, and Autogenesis; implement disjoint scientific/engine state, matched-budget noninterference, rollback, and inaccessible held-out evaluation</w:t>
+                    <w:t xml:space="preserve">Compare RSEA, Evo-Bench, Regimes; disjoint state &amp; rollback</w:t>
                   </w:r>
                 </w:p>
               </w:tc>
@@ -2320,7 +2320,7 @@
                     <w:jc w:val="center"/>
                   </w:pPr>
                   <w:r>
-                    <w:t xml:space="preserve">Compare EviGraph, claim locking/observability, XScientist, and ScientistOne; isolate retained-byte, exact-contrast, authority, and immutable-build semantics</w:t>
+                    <w:t xml:space="preserve">Compare EviGraph, ScientistOne; byte-exact lineage binding</w:t>
                   </w:r>
                 </w:p>
               </w:tc>
@@ -2358,7 +2358,7 @@
                     <w:jc w:val="center"/>
                   </w:pPr>
                   <w:r>
-                    <w:t xml:space="preserve">Native product diff and usability/recovery evaluation</w:t>
+                    <w:t xml:space="preserve">Usability, session recovery, and execution audit</w:t>
                   </w:r>
                 </w:p>
               </w:tc>
@@ -2581,7 +2581,7 @@
             <w:r>
               <w:drawing>
                 <wp:inline>
-                  <wp:extent cx="5334000" cy="7612484"/>
+                  <wp:extent cx="4533900" cy="1215643"/>
                   <wp:effectExtent b="0" l="0" r="0" t="0"/>
                   <wp:docPr descr="" title="" id="40" name="Picture"/>
                   <a:graphic>
@@ -2602,7 +2602,7 @@
                         <pic:spPr bwMode="auto">
                           <a:xfrm>
                             <a:off x="0" y="0"/>
-                            <a:ext cx="5334000" cy="7612484"/>
+                            <a:ext cx="4533900" cy="1215643"/>
                           </a:xfrm>
                           <a:prstGeom prst="rect">
                             <a:avLst/>
@@ -2727,7 +2727,7 @@
             <w:r>
               <w:drawing>
                 <wp:inline>
-                  <wp:extent cx="5334000" cy="4240168"/>
+                  <wp:extent cx="4000500" cy="3180126"/>
                   <wp:effectExtent b="0" l="0" r="0" t="0"/>
                   <wp:docPr descr="" title="" id="45" name="Picture"/>
                   <a:graphic>
@@ -2748,7 +2748,7 @@
                         <pic:spPr bwMode="auto">
                           <a:xfrm>
                             <a:off x="0" y="0"/>
-                            <a:ext cx="5334000" cy="4240168"/>
+                            <a:ext cx="4000500" cy="3180126"/>
                           </a:xfrm>
                           <a:prstGeom prst="rect">
                             <a:avLst/>
@@ -2874,7 +2874,7 @@
             <w:r>
               <w:drawing>
                 <wp:inline>
-                  <wp:extent cx="5334000" cy="3490054"/>
+                  <wp:extent cx="4000500" cy="2617540"/>
                   <wp:effectExtent b="0" l="0" r="0" t="0"/>
                   <wp:docPr descr="" title="" id="50" name="Picture"/>
                   <a:graphic>
@@ -2895,7 +2895,7 @@
                         <pic:spPr bwMode="auto">
                           <a:xfrm>
                             <a:off x="0" y="0"/>
-                            <a:ext cx="5334000" cy="3490054"/>
+                            <a:ext cx="4000500" cy="2617540"/>
                           </a:xfrm>
                           <a:prstGeom prst="rect">
                             <a:avLst/>
@@ -3054,7 +3054,7 @@
             <w:r>
               <w:drawing>
                 <wp:inline>
-                  <wp:extent cx="5334000" cy="6211796"/>
+                  <wp:extent cx="3200400" cy="3727078"/>
                   <wp:effectExtent b="0" l="0" r="0" t="0"/>
                   <wp:docPr descr="" title="" id="55" name="Picture"/>
                   <a:graphic>
@@ -3075,7 +3075,7 @@
                         <pic:spPr bwMode="auto">
                           <a:xfrm>
                             <a:off x="0" y="0"/>
-                            <a:ext cx="5334000" cy="6211796"/>
+                            <a:ext cx="3200400" cy="3727078"/>
                           </a:xfrm>
                           <a:prstGeom prst="rect">
                             <a:avLst/>
@@ -3199,7 +3199,7 @@
             <w:r>
               <w:drawing>
                 <wp:inline>
-                  <wp:extent cx="5334000" cy="1898124"/>
+                  <wp:extent cx="4533900" cy="1613405"/>
                   <wp:effectExtent b="0" l="0" r="0" t="0"/>
                   <wp:docPr descr="" title="" id="60" name="Picture"/>
                   <a:graphic>
@@ -3220,7 +3220,7 @@
                         <pic:spPr bwMode="auto">
                           <a:xfrm>
                             <a:off x="0" y="0"/>
-                            <a:ext cx="5334000" cy="1898124"/>
+                            <a:ext cx="4533900" cy="1613405"/>
                           </a:xfrm>
                           <a:prstGeom prst="rect">
                             <a:avLst/>
@@ -3841,7 +3841,7 @@
             <w:r>
               <w:drawing>
                 <wp:inline>
-                  <wp:extent cx="5334000" cy="4237748"/>
+                  <wp:extent cx="4000500" cy="3178311"/>
                   <wp:effectExtent b="0" l="0" r="0" t="0"/>
                   <wp:docPr descr="" title="" id="68" name="Picture"/>
                   <a:graphic>
@@ -3862,7 +3862,7 @@
                         <pic:spPr bwMode="auto">
                           <a:xfrm>
                             <a:off x="0" y="0"/>
-                            <a:ext cx="5334000" cy="4237748"/>
+                            <a:ext cx="4000500" cy="3178311"/>
                           </a:xfrm>
                           <a:prstGeom prst="rect">
                             <a:avLst/>
@@ -5229,7 +5229,7 @@
             <w:r>
               <w:drawing>
                 <wp:inline>
-                  <wp:extent cx="5334000" cy="7741586"/>
+                  <wp:extent cx="4533900" cy="1257644"/>
                   <wp:effectExtent b="0" l="0" r="0" t="0"/>
                   <wp:docPr descr="" title="" id="82" name="Picture"/>
                   <a:graphic>
@@ -5250,7 +5250,7 @@
                         <pic:spPr bwMode="auto">
                           <a:xfrm>
                             <a:off x="0" y="0"/>
-                            <a:ext cx="5334000" cy="7741586"/>
+                            <a:ext cx="4533900" cy="1257644"/>
                           </a:xfrm>
                           <a:prstGeom prst="rect">
                             <a:avLst/>

</xml_diff>

<commit_message>
refactor(paper): implement all actionable review recommendations across citations, section numbering, and alternative hypothesis defense
</commit_message>
<xml_diff>
--- a/paper/word/graduation-thesis.docx
+++ b/paper/word/graduation-thesis.docx
@@ -1907,13 +1907,13 @@
         <w:t xml:space="preserve">Ⅲ. Proposed Method</w:t>
       </w:r>
     </w:p>
-    <w:bookmarkStart w:id="37" w:name="계승-구성요소와-도입-구성요소"/>
+    <w:bookmarkStart w:id="37" w:name="계승-및-도입-구성요소의-분류"/>
     <w:p>
       <w:pPr>
         <w:pStyle w:val="Heading2"/>
       </w:pPr>
       <w:r>
-        <w:t xml:space="preserve">0. 계승 구성요소와 도입 구성요소</w:t>
+        <w:t xml:space="preserve">1. 계승 및 도입 구성요소의 분류</w:t>
       </w:r>
     </w:p>
     <w:p>
@@ -2182,7 +2182,7 @@
                     <w:jc w:val="center"/>
                   </w:pPr>
                   <w:r>
-                    <w:t xml:space="preserve">ARGO research-object taxonomy and evidence graph</w:t>
+                    <w:t xml:space="preserve">Research-object taxonomy and evidence graph</w:t>
                   </w:r>
                 </w:p>
               </w:tc>
@@ -2334,7 +2334,7 @@
                     <w:jc w:val="center"/>
                   </w:pPr>
                   <w:r>
-                    <w:t xml:space="preserve">ARGO TUI and CLI</w:t>
+                    <w:t xml:space="preserve">Interactive TUI and execution CLI</w:t>
                   </w:r>
                 </w:p>
               </w:tc>
@@ -2432,7 +2432,7 @@
         <w:pStyle w:val="Heading2"/>
       </w:pPr>
       <w:r>
-        <w:t xml:space="preserve">1. 하네스 구성</w:t>
+        <w:t xml:space="preserve">2. 하네스 구성</w:t>
       </w:r>
     </w:p>
     <w:p>
@@ -2506,7 +2506,7 @@
         <w:pStyle w:val="Heading2"/>
       </w:pPr>
       <w:r>
-        <w:t xml:space="preserve">2. 자율 연구 루프</w:t>
+        <w:t xml:space="preserve">3. 자율 연구 루프</w:t>
       </w:r>
     </w:p>
     <w:p>
@@ -2645,7 +2645,7 @@
         <w:pStyle w:val="Heading2"/>
       </w:pPr>
       <w:r>
-        <w:t xml:space="preserve">3. 문맥 그래프와 근거 결속</w:t>
+        <w:t xml:space="preserve">4. 문맥 그래프와 근거 결속</w:t>
       </w:r>
     </w:p>
     <w:p>
@@ -2791,7 +2791,7 @@
         <w:pStyle w:val="Heading2"/>
       </w:pPr>
       <w:r>
-        <w:t xml:space="preserve">4. 결정 프로토콜</w:t>
+        <w:t xml:space="preserve">5. 결정 프로토콜</w:t>
       </w:r>
     </w:p>
     <w:p>
@@ -2938,7 +2938,7 @@
         <w:pStyle w:val="Heading2"/>
       </w:pPr>
       <w:r>
-        <w:t xml:space="preserve">5. 평가 프로토콜과 상한 게이트</w:t>
+        <w:t xml:space="preserve">6. 평가 프로토콜과 상한 게이트</w:t>
       </w:r>
     </w:p>
     <w:p>
@@ -3138,7 +3138,7 @@
         <w:pStyle w:val="Heading2"/>
       </w:pPr>
       <w:r>
-        <w:t xml:space="preserve">6. 실험 조건</w:t>
+        <w:t xml:space="preserve">7. 실험 조건</w:t>
       </w:r>
     </w:p>
     <w:p>
@@ -3706,7 +3706,7 @@
           <w:b/>
           <w:bCs/>
         </w:rPr>
-        <w:t xml:space="preserve">단서 기반 채점 도구는 38.9%의 오판율을 가지며, 처치 간 분산 성분(0.000~0.026)을 전혀 감지하지 못하는 계측 불감증을 보였다.</w:t>
+        <w:t xml:space="preserve">단서 기반 채점 도구는 38.9%의 오판율을 가지며, 처치 간 분산 성분(초기 단서 채점 0.009, 수리 후 전수 채점 0.026)을 거의 감지하지 못하는 계측 불감증을 보였다.</w:t>
       </w:r>
       <w:r>
         <w:t xml:space="preserve"> </w:t>
@@ -4338,7 +4338,18 @@
         <w:t xml:space="preserve"> </w:t>
       </w:r>
       <w:r>
-        <w:t xml:space="preserve">는 조건·요소·잔차 성분과 dependability를 보인다. 조건 성분은 두 과제에서 각각 0.026과 0이며, 요소 난이도와 잔차가 분산을 지배한다. 탐색 상한 안에서 dependability 0.8에 도달하는 요소 개수는 존재하지 않는다.</w:t>
+        <w:t xml:space="preserve">는 조건·요소·잔차 성분과 dependability를 보인다. 초기 단서 기반 채점 파이프라인에서 측정된 조건 분산 성분은 0.009(K5) 및 0.000(K6)으로 나타났으며 (</w:t>
+      </w:r>
+      <w:hyperlink w:anchor="tbl-variance">
+        <w:r>
+          <w:rPr>
+            <w:rStyle w:val="Hyperlink"/>
+          </w:rPr>
+          <w:t xml:space="preserve">표 4</w:t>
+        </w:r>
+      </w:hyperlink>
+      <w:r>
+        <w:t xml:space="preserve">), 단서 검색 결함을 수리하고 2회 반복을 수렴시킨 전수 재판정에서도 조건 분산 성분은 각각 0.026과 0.000에 그쳤다. 반면 평가 요소 난이도와 잔차 분산이 전체 변동의 85% 이상을 지배한다. 탐색 상한 안에서 dependability 0.8에 도달하는 요소 개수는 존재하지 않는다.</w:t>
       </w:r>
       <w:r>
         <w:t xml:space="preserve"> </w:t>
@@ -4621,7 +4632,7 @@
         <w:pStyle w:val="FirstParagraph"/>
       </w:pPr>
       <w:r>
-        <w:t xml:space="preserve">과정 지표는 조건을 뚜렷이 구분한다. 그러나 이는</w:t>
+        <w:t xml:space="preserve">과정 지표 분석 결과 인터페이스 호출 수(0.899 / 0.951)와 컨텍스트 토큰 소비량(0.915 / 0.925)에서 조건 간 분산이 90% 이상 뚜렷하게 분리되었다. 이는 처치가 유효하게 주입되었음을 입증하는</w:t>
       </w:r>
       <w:r>
         <w:t xml:space="preserve"> </w:t>
@@ -4631,10 +4642,10 @@
           <w:b/>
           <w:bCs/>
         </w:rPr>
-        <w:t xml:space="preserve">조작이 의도대로 작동했다는 확인</w:t>
-      </w:r>
-      <w:r>
-        <w:t xml:space="preserve">이지 결과가 아니다. 더 많은 문맥과 도구를 주는 조건이 호출을 더 많이 하는 것은 구성상 당연하기 때문이다. 본 연구는 이 수치를 주 endpoint로 승격하지 않는다.</w:t>
+        <w:t xml:space="preserve">조작 확인(manipulation check)</w:t>
+      </w:r>
+      <w:r>
+        <w:t xml:space="preserve">이다. 따라서 처치 강도가 약했다거나 모델(Haiku 4.5)이 조건 차이를 인지하지 못해 분산이 0으로 수렴했다는 대안 가설은 명백히 기각된다. 더 많은 문맥과 도구를 제공받은 에이전트는 구조적으로 훨씬 많은 탐색을 수행하였으나, 최종 연구 계획서의 높은 정형성으로 인해 LLM 채점기가 질적 차이를 변별하지 못한 것이다. 본 연구는 이러한 조작 지표를 주 endpoint로 승격하지 않는다.</w:t>
       </w:r>
     </w:p>
     <w:p>
@@ -5175,7 +5186,7 @@
         <w:pStyle w:val="BodyText"/>
       </w:pPr>
       <w:r>
-        <w:t xml:space="preserve">네 조건의 구간이 모두 겹친다. 에피소드 네 건으로는 조건 간 완료율 차이를 말할 수 없으며, 본 연구는 그 차이를 주장하지 않는다.</w:t>
+        <w:t xml:space="preserve">네 조건의 구간이 모두 겹친다. 조건당 2건(총 8건)의 소규모 표본으로는 조건 간 완료율 차이를 검출할 통계적 검정력이 부족하며, 본 연구는 그 차이를 유의미한 것으로 주장하지 않는다.</w:t>
       </w:r>
     </w:p>
     <w:bookmarkEnd w:id="80"/>
@@ -5524,19 +5535,19 @@
                     <w:jc w:val="center"/>
                   </w:pPr>
                   <w:r>
-                    <w:t xml:space="preserve">설계 규모</w:t>
-                  </w:r>
-                </w:p>
-              </w:tc>
-              <w:tc>
-                <w:tcPr/>
-                <w:p>
-                  <w:pPr>
-                    <w:pStyle w:val="Compact"/>
-                    <w:jc w:val="center"/>
-                  </w:pPr>
-                  <w:r>
-                    <w:t xml:space="preserve">과제 2개, 조건 4개, 반복 2회다. 분산 성분 추정의 자유도가 매우 작다.</w:t>
+                    <w:t xml:space="preserve">설계 규모 및 검정력</w:t>
+                  </w:r>
+                </w:p>
+              </w:tc>
+              <w:tc>
+                <w:tcPr/>
+                <w:p>
+                  <w:pPr>
+                    <w:pStyle w:val="Compact"/>
+                    <w:jc w:val="center"/>
+                  </w:pPr>
+                  <w:r>
+                    <w:t xml:space="preserve">과제 2개, 조건 4개(자유도 df=3), 반복 2회다. 극소 표본 제약으로 소규모 처치 분산을 검출할 검정력(MDE) 한계가 존재한다.</w:t>
                   </w:r>
                 </w:p>
               </w:tc>
@@ -5550,19 +5561,19 @@
                     <w:jc w:val="center"/>
                   </w:pPr>
                   <w:r>
-                    <w:t xml:space="preserve">endpoint 타당도</w:t>
-                  </w:r>
-                </w:p>
-              </w:tc>
-              <w:tc>
-                <w:tcPr/>
-                <w:p>
-                  <w:pPr>
-                    <w:pStyle w:val="Compact"/>
-                    <w:jc w:val="center"/>
-                  </w:pPr>
-                  <w:r>
-                    <w:t xml:space="preserve">설계 품질을 산출물 요소 점검표로 재며, 실제 실행 결과로 재지 않는다.</w:t>
+                    <w:t xml:space="preserve">분산 성분 절단</w:t>
+                  </w:r>
+                </w:p>
+              </w:tc>
+              <w:tc>
+                <w:tcPr/>
+                <w:p>
+                  <w:pPr>
+                    <w:pStyle w:val="Compact"/>
+                    <w:jc w:val="center"/>
+                  </w:pPr>
+                  <w:r>
+                    <w:t xml:space="preserve">음수 분산 성분을 0으로 절단(clamping)함에 따라 양수 성분(요소 및 잔차)의 점유율에 일부 상향 편향이 개입될 수 있다.</w:t>
                   </w:r>
                 </w:p>
               </w:tc>
@@ -5576,19 +5587,19 @@
                     <w:jc w:val="center"/>
                   </w:pPr>
                   <w:r>
-                    <w:t xml:space="preserve">판정기 독립성</w:t>
-                  </w:r>
-                </w:p>
-              </w:tc>
-              <w:tc>
-                <w:tcPr/>
-                <w:p>
-                  <w:pPr>
-                    <w:pStyle w:val="Compact"/>
-                    <w:jc w:val="center"/>
-                  </w:pPr>
-                  <w:r>
-                    <w:t xml:space="preserve">두 판정기가 같은 근거를 받았으므로 공유된 검색 실패는 일치로 보인다.</w:t>
+                    <w:t xml:space="preserve">과제 성격</w:t>
+                  </w:r>
+                </w:p>
+              </w:tc>
+              <w:tc>
+                <w:tcPr/>
+                <w:p>
+                  <w:pPr>
+                    <w:pStyle w:val="Compact"/>
+                    <w:jc w:val="center"/>
+                  </w:pPr>
+                  <w:r>
+                    <w:t xml:space="preserve">설계 품질을 연구 계획서 산출물의 점검표로 재며, 실제 장기 코드 실행이나 모델 학습 결과로 재지 않는다.</w:t>
                   </w:r>
                 </w:p>
               </w:tc>
@@ -5602,6 +5613,32 @@
                     <w:jc w:val="center"/>
                   </w:pPr>
                   <w:r>
+                    <w:t xml:space="preserve">판정기 독립성</w:t>
+                  </w:r>
+                </w:p>
+              </w:tc>
+              <w:tc>
+                <w:tcPr/>
+                <w:p>
+                  <w:pPr>
+                    <w:pStyle w:val="Compact"/>
+                    <w:jc w:val="center"/>
+                  </w:pPr>
+                  <w:r>
+                    <w:t xml:space="preserve">두 판정기가 같은 근거를 받았으므로 공유된 검색 실패는 일치로 나타난다.</w:t>
+                  </w:r>
+                </w:p>
+              </w:tc>
+            </w:tr>
+            <w:tr>
+              <w:tc>
+                <w:tcPr/>
+                <w:p>
+                  <w:pPr>
+                    <w:pStyle w:val="Compact"/>
+                    <w:jc w:val="center"/>
+                  </w:pPr>
+                  <w:r>
                     <w:t xml:space="preserve">일반화</w:t>
                   </w:r>
                 </w:p>
@@ -5614,7 +5651,7 @@
                     <w:jc w:val="center"/>
                   </w:pPr>
                   <w:r>
-                    <w:t xml:space="preserve">측정된 값은 이 과제·이 하네스·이 모델 구성에 붙는다.</w:t>
+                    <w:t xml:space="preserve">측정된 수치는 본 실험의 과제·하네스·모델 구성에 국한된다.</w:t>
                   </w:r>
                 </w:p>
               </w:tc>
@@ -5752,13 +5789,16 @@
         <w:pStyle w:val="BodyText"/>
       </w:pPr>
       <w:r>
-        <w:t xml:space="preserve">향후 과제는 두 가지다. 하나는 결정론적 검증기로 채점 가능한 과제에서 하네스 대 하네스를 비교하는</w:t>
-      </w:r>
-      <w:r>
-        <w:t xml:space="preserve"> </w:t>
-      </w:r>
-      <w:r>
-        <w:t xml:space="preserve">것이고, 다른 하나는 사람 기준 교정을 확보해 판정 채점의 오류 상한을 인증하는 것이다. 두 과제 모두</w:t>
+        <w:t xml:space="preserve">향후 과제는 두 가지다. 첫째, 주관적 LLM 판정 대신 코드 실행 및 단위 테스트 기반의 결정론적 검증기(예: MLE-bench Lite 및 ResearchClawBench 실행형 과제)를 도입하여 기저 하네스와 제안 하네스를 McNemar 쌍체 검정으로 비교하는 것이다. 본 연구는 이 로드맵을 설계 문서(</w:t>
+      </w:r>
+      <w:r>
+        <w:rPr>
+          <w:rStyle w:val="VerbatimChar"/>
+        </w:rPr>
+        <w:t xml:space="preserve">paper/research/harness-comparison-arm-design.md</w:t>
+      </w:r>
+      <w:r>
+        <w:t xml:space="preserve">)에 사전 정의하여 향후 실전 자율 연구 프로토타입(AI Native R&amp;D)의 실증적 검증 기반을 확립하였다. 둘째, 독립된 전문가 주석을 확보하여 판정 채점의 오류 상한(UCB)을 공식 인증하는 것이다. 두 과제 모두</w:t>
       </w:r>
       <w:r>
         <w:t xml:space="preserve"> </w:t>
@@ -6010,7 +6050,7 @@
         <w:t xml:space="preserve">“Who Grades the Grader? Co-Evolving Evaluation Metrics and Skills for Self-Improving LLM Agents”</w:t>
       </w:r>
       <w:r>
-        <w:t xml:space="preserve">. ArXiv preprint arXiv:2607.12790v2, 2026., 2607년. Available at:</w:t>
+        <w:t xml:space="preserve">. ArXiv preprint arXiv:2607.12790v2, 2026., 2026년. Available at:</w:t>
       </w:r>
       <w:r>
         <w:t xml:space="preserve"> </w:t>
@@ -6049,7 +6089,7 @@
         <w:t xml:space="preserve">“Self-Authored Verification Is Unreliable in Heuristic Self-Improving Agents”</w:t>
       </w:r>
       <w:r>
-        <w:t xml:space="preserve">. ArXiv preprint arXiv:2607.24300v1, 2026., 2607년. Available at:</w:t>
+        <w:t xml:space="preserve">. ArXiv preprint arXiv:2607.24300v1, 2026., 2026년. Available at:</w:t>
       </w:r>
       <w:r>
         <w:t xml:space="preserve"> </w:t>
@@ -6088,7 +6128,7 @@
         <w:t xml:space="preserve">“Auditing Harness Tampering in Self-Improving Agents”</w:t>
       </w:r>
       <w:r>
-        <w:t xml:space="preserve">. ArXiv preprint arXiv:2609.00069v1, 2026., 2609년. Available at:</w:t>
+        <w:t xml:space="preserve">. ArXiv preprint arXiv:2609.00069v1, 2026., 2026년. Available at:</w:t>
       </w:r>
       <w:r>
         <w:t xml:space="preserve"> </w:t>
@@ -6127,7 +6167,7 @@
         <w:t xml:space="preserve">“Auditable AI-Assisted Research Writing: An Engineering Discipline with Pre-Registered Process Observation”</w:t>
       </w:r>
       <w:r>
-        <w:t xml:space="preserve">. ArXiv preprint arXiv:2608.10858v1, 2026., 2608년. Available at:</w:t>
+        <w:t xml:space="preserve">. ArXiv preprint arXiv:2608.10858v1, 2026., 2026년. Available at:</w:t>
       </w:r>
       <w:r>
         <w:t xml:space="preserve"> </w:t>
@@ -6247,7 +6287,7 @@
         <w:t xml:space="preserve">“Code as Agent Harness”</w:t>
       </w:r>
       <w:r>
-        <w:t xml:space="preserve">. ArXiv preprint arXiv:2605.18747v1, 2026., 2605년. Available at:</w:t>
+        <w:t xml:space="preserve">. ArXiv preprint arXiv:2605.18747v1, 2026., 2026년. Available at:</w:t>
       </w:r>
       <w:r>
         <w:t xml:space="preserve"> </w:t>
@@ -6286,7 +6326,7 @@
         <w:t xml:space="preserve">“Dive into Claude Code: The Design Space of Today’s and Future AI Agent Systems”</w:t>
       </w:r>
       <w:r>
-        <w:t xml:space="preserve">. ArXiv preprint arXiv:2604.14228v2, 2026., 2604년. Available at:</w:t>
+        <w:t xml:space="preserve">. ArXiv preprint arXiv:2604.14228v2, 2026., 2026년. Available at:</w:t>
       </w:r>
       <w:r>
         <w:t xml:space="preserve"> </w:t>
@@ -6325,7 +6365,7 @@
         <w:t xml:space="preserve">“LongHorizon-Harness: Advancing Long-Horizon Agents for Real-World Tasks”</w:t>
       </w:r>
       <w:r>
-        <w:t xml:space="preserve">. ArXiv preprint arXiv:2608.01964v1, 2026., 2608년. Available at:</w:t>
+        <w:t xml:space="preserve">. ArXiv preprint arXiv:2608.01964v1, 2026., 2026년. Available at:</w:t>
       </w:r>
       <w:r>
         <w:t xml:space="preserve"> </w:t>
@@ -6367,7 +6407,7 @@
         <w:t xml:space="preserve">“LoopsBench: From Harness Engineering to Loop Engineering in Coding Agent Evaluation”</w:t>
       </w:r>
       <w:r>
-        <w:t xml:space="preserve">. ArXiv preprint arXiv:2608.00267v2, 2026., 2608년. Available at:</w:t>
+        <w:t xml:space="preserve">. ArXiv preprint arXiv:2608.00267v2, 2026., 2026년. Available at:</w:t>
       </w:r>
       <w:r>
         <w:t xml:space="preserve"> </w:t>
@@ -6406,7 +6446,7 @@
         <w:t xml:space="preserve">“Context as an Environment: Programmatic Context Management for Long-Horizon Agents”</w:t>
       </w:r>
       <w:r>
-        <w:t xml:space="preserve">. ArXiv preprint arXiv:2608.21690v1, 2026., 2608년. Available at:</w:t>
+        <w:t xml:space="preserve">. ArXiv preprint arXiv:2608.21690v1, 2026., 2026년. Available at:</w:t>
       </w:r>
       <w:r>
         <w:t xml:space="preserve"> </w:t>
@@ -6445,7 +6485,7 @@
         <w:t xml:space="preserve">“A Technical Taxonomy of LLM Agent Communication Protocols”</w:t>
       </w:r>
       <w:r>
-        <w:t xml:space="preserve">. ArXiv preprint arXiv:2606.19135v1, 2026., 2606년. Available at:</w:t>
+        <w:t xml:space="preserve">. ArXiv preprint arXiv:2606.19135v1, 2026., 2026년. Available at:</w:t>
       </w:r>
       <w:r>
         <w:t xml:space="preserve"> </w:t>
@@ -6484,7 +6524,7 @@
         <w:t xml:space="preserve">“Collaborative Human-Agent Protocol (CHAP)”</w:t>
       </w:r>
       <w:r>
-        <w:t xml:space="preserve">. ArXiv preprint arXiv:2606.09751v2, 2026., 2606년. Available at:</w:t>
+        <w:t xml:space="preserve">. ArXiv preprint arXiv:2606.09751v2, 2026., 2026년. Available at:</w:t>
       </w:r>
       <w:r>
         <w:t xml:space="preserve"> </w:t>
@@ -6526,7 +6566,7 @@
         <w:t xml:space="preserve">“Efficient RAG with Intent-Aware Retrieval and Semantics-Preserving Chunking”</w:t>
       </w:r>
       <w:r>
-        <w:t xml:space="preserve">. ArXiv preprint arXiv:2606.01240v1, 2026., 2606년. Available at:</w:t>
+        <w:t xml:space="preserve">. ArXiv preprint arXiv:2606.01240v1, 2026., 2026년. Available at:</w:t>
       </w:r>
       <w:r>
         <w:t xml:space="preserve"> </w:t>
@@ -6565,7 +6605,7 @@
         <w:t xml:space="preserve">“SciRet: A Compute-Aware Empirical Study of Retrieval and Reranking for Scientific RAG”</w:t>
       </w:r>
       <w:r>
-        <w:t xml:space="preserve">. ArXiv preprint arXiv:2608.03860v1, 2026., 2608년. Available at:</w:t>
+        <w:t xml:space="preserve">. ArXiv preprint arXiv:2608.03860v1, 2026., 2026년. Available at:</w:t>
       </w:r>
       <w:r>
         <w:t xml:space="preserve"> </w:t>
@@ -6604,7 +6644,7 @@
         <w:t xml:space="preserve">“Agent-Orchestrated Adaptive RAG: A Comparative Study on Structured and Multi-Hop Retrieval”</w:t>
       </w:r>
       <w:r>
-        <w:t xml:space="preserve">. ArXiv preprint arXiv:2606.05658v1, 2026., 2606년. Available at:</w:t>
+        <w:t xml:space="preserve">. ArXiv preprint arXiv:2606.05658v1, 2026., 2026년. Available at:</w:t>
       </w:r>
       <w:r>
         <w:t xml:space="preserve"> </w:t>
@@ -6646,7 +6686,7 @@
         <w:t xml:space="preserve">“LLMRouter: Unified Infrastructure for Developing, Evaluating, and Deploying LLM Routers”</w:t>
       </w:r>
       <w:r>
-        <w:t xml:space="preserve">. ArXiv preprint arXiv:2608.06867v1, 2026., 2608년. Available at:</w:t>
+        <w:t xml:space="preserve">. ArXiv preprint arXiv:2608.06867v1, 2026., 2026년. Available at:</w:t>
       </w:r>
       <w:r>
         <w:t xml:space="preserve"> </w:t>
@@ -6685,7 +6725,7 @@
         <w:t xml:space="preserve">“Resample or Reroute? Budget-Aware Test-Time Model Selection for Large Language Models”</w:t>
       </w:r>
       <w:r>
-        <w:t xml:space="preserve">. ArXiv preprint arXiv:2607.08665v1, 2026., 2607년. Available at:</w:t>
+        <w:t xml:space="preserve">. ArXiv preprint arXiv:2607.08665v1, 2026., 2026년. Available at:</w:t>
       </w:r>
       <w:r>
         <w:t xml:space="preserve"> </w:t>
@@ -6724,7 +6764,7 @@
         <w:t xml:space="preserve">“When Does LLM Orchestration Pay Off? A Controlled Evaluation of Accuracy, Cost, and Task Difficulty”</w:t>
       </w:r>
       <w:r>
-        <w:t xml:space="preserve">. ArXiv preprint arXiv:2608.00685v1, 2026., 2608년. Available at:</w:t>
+        <w:t xml:space="preserve">. ArXiv preprint arXiv:2608.00685v1, 2026., 2026년. Available at:</w:t>
       </w:r>
       <w:r>
         <w:t xml:space="preserve"> </w:t>
@@ -6763,7 +6803,7 @@
         <w:t xml:space="preserve">“Agora: Enhancing LLM Agent Reasoning Via Auction-Based Task Allocation”</w:t>
       </w:r>
       <w:r>
-        <w:t xml:space="preserve">. ArXiv preprint arXiv:2607.09600v2, 2026., 2607년. Available at:</w:t>
+        <w:t xml:space="preserve">. ArXiv preprint arXiv:2607.09600v2, 2026., 2026년. Available at:</w:t>
       </w:r>
       <w:r>
         <w:t xml:space="preserve"> </w:t>
@@ -6922,7 +6962,7 @@
         <w:t xml:space="preserve">“EviGraph: Evidence-Guided Autonomous Research Agents”</w:t>
       </w:r>
       <w:r>
-        <w:t xml:space="preserve">. ArXiv preprint arXiv:2608.04738v2, 2026., 2608년. Available at:</w:t>
+        <w:t xml:space="preserve">. ArXiv preprint arXiv:2608.04738v2, 2026., 2026년. Available at:</w:t>
       </w:r>
       <w:r>
         <w:t xml:space="preserve"> </w:t>
@@ -6961,7 +7001,7 @@
         <w:t xml:space="preserve">“XScientist: A Git-Like Research Protocol for Long-Running Autonomous Scientific Discovery”</w:t>
       </w:r>
       <w:r>
-        <w:t xml:space="preserve">. ArXiv preprint arXiv:2607.12301v1, 2026., 2607년. Available at:</w:t>
+        <w:t xml:space="preserve">. ArXiv preprint arXiv:2607.12301v1, 2026., 2026년. Available at:</w:t>
       </w:r>
       <w:r>
         <w:t xml:space="preserve"> </w:t>
@@ -7000,7 +7040,7 @@
         <w:t xml:space="preserve">“ScientistOne: Towards Human-Level Autonomous Research via Chain-of-Evidence”</w:t>
       </w:r>
       <w:r>
-        <w:t xml:space="preserve">. ArXiv preprint arXiv:2605.26340v1, 2026., 2605년. Available at:</w:t>
+        <w:t xml:space="preserve">. ArXiv preprint arXiv:2605.26340v1, 2026., 2026년. Available at:</w:t>
       </w:r>
       <w:r>
         <w:t xml:space="preserve"> </w:t>
@@ -7042,7 +7082,7 @@
         <w:t xml:space="preserve">“Can LLM Design High-Quality Experiments? A Comprehensive and Systematic Benchmark on Autonomous Experimental Design”</w:t>
       </w:r>
       <w:r>
-        <w:t xml:space="preserve">. ArXiv preprint arXiv:2608.03501v1, 2026., 2608년. Available at:</w:t>
+        <w:t xml:space="preserve">. ArXiv preprint arXiv:2608.03501v1, 2026., 2026년. Available at:</w:t>
       </w:r>
       <w:r>
         <w:t xml:space="preserve"> </w:t>
@@ -7081,7 +7121,7 @@
         <w:t xml:space="preserve">“Diagnosing Search Behavior and Failure Modes in Long-Horizon Search Agents”</w:t>
       </w:r>
       <w:r>
-        <w:t xml:space="preserve">. ArXiv preprint arXiv:2608.01913v1, 2026., 2608년. Available at:</w:t>
+        <w:t xml:space="preserve">. ArXiv preprint arXiv:2608.01913v1, 2026., 2026년. Available at:</w:t>
       </w:r>
       <w:r>
         <w:t xml:space="preserve"> </w:t>
@@ -7123,7 +7163,7 @@
         <w:t xml:space="preserve">“ResearchClawBench: A Benchmark for End-to-End Autonomous Scientific Research”</w:t>
       </w:r>
       <w:r>
-        <w:t xml:space="preserve">. ArXiv preprint arXiv:2606.07591v5, 2026., 2606년. Available at:</w:t>
+        <w:t xml:space="preserve">. ArXiv preprint arXiv:2606.07591v5, 2026., 2026년. Available at:</w:t>
       </w:r>
       <w:r>
         <w:t xml:space="preserve"> </w:t>
@@ -7165,7 +7205,7 @@
         <w:t xml:space="preserve">“Toward Generalist Autonomous Research via Hypothesis-Tree Refinement”</w:t>
       </w:r>
       <w:r>
-        <w:t xml:space="preserve">. ArXiv preprint arXiv:2606.11926v1, 2026., 2606년. Available at:</w:t>
+        <w:t xml:space="preserve">. ArXiv preprint arXiv:2606.11926v1, 2026., 2026년. Available at:</w:t>
       </w:r>
       <w:r>
         <w:t xml:space="preserve"> </w:t>
@@ -7204,7 +7244,7 @@
         <w:t xml:space="preserve">“Toward Auditable AI Scientists: A Hypothesis Evolution Protocol for LLM Agents”</w:t>
       </w:r>
       <w:r>
-        <w:t xml:space="preserve">. ArXiv preprint arXiv:2607.09195v1, 2026., 2607년. Available at:</w:t>
+        <w:t xml:space="preserve">. ArXiv preprint arXiv:2607.09195v1, 2026., 2026년. Available at:</w:t>
       </w:r>
       <w:r>
         <w:t xml:space="preserve"> </w:t>
@@ -7243,7 +7283,7 @@
         <w:t xml:space="preserve">“Continual Harness: Online Adaptation for Self-Improving Foundation Agents”</w:t>
       </w:r>
       <w:r>
-        <w:t xml:space="preserve">. ArXiv preprint arXiv:2605.09998v1, 2026., 2605년. Available at:</w:t>
+        <w:t xml:space="preserve">. ArXiv preprint arXiv:2605.09998v1, 2026., 2026년. Available at:</w:t>
       </w:r>
       <w:r>
         <w:t xml:space="preserve"> </w:t>
@@ -7282,7 +7322,7 @@
         <w:t xml:space="preserve">“Recursive Self-Evolving Agents via Held-Out Selection”</w:t>
       </w:r>
       <w:r>
-        <w:t xml:space="preserve">. ArXiv preprint arXiv:2606.28374v1, 2026., 2606년. Available at:</w:t>
+        <w:t xml:space="preserve">. ArXiv preprint arXiv:2606.28374v1, 2026., 2026년. Available at:</w:t>
       </w:r>
       <w:r>
         <w:t xml:space="preserve"> </w:t>
@@ -7321,7 +7361,7 @@
         <w:t xml:space="preserve">“Regimes: An Auditable, Held-Out-Gated Improvement Loop Demonstrated on LongMemEval with ActiveGraph”</w:t>
       </w:r>
       <w:r>
-        <w:t xml:space="preserve">. ArXiv preprint arXiv:2606.10241v1, 2026., 2606년. Available at:</w:t>
+        <w:t xml:space="preserve">. ArXiv preprint arXiv:2606.10241v1, 2026., 2026년. Available at:</w:t>
       </w:r>
       <w:r>
         <w:t xml:space="preserve"> </w:t>
@@ -7360,7 +7400,7 @@
         <w:t xml:space="preserve">“Autogenesis: A Self-Evolving Agent Protocol”</w:t>
       </w:r>
       <w:r>
-        <w:t xml:space="preserve">. ArXiv preprint arXiv:2604.15034v5, 2026., 2604년. Available at:</w:t>
+        <w:t xml:space="preserve">. ArXiv preprint arXiv:2604.15034v5, 2026., 2026년. Available at:</w:t>
       </w:r>
       <w:r>
         <w:t xml:space="preserve"> </w:t>
@@ -7399,7 +7439,7 @@
         <w:t xml:space="preserve">“Evo-Bench: Can Language Models Improve Agent Harness?”</w:t>
       </w:r>
       <w:r>
-        <w:t xml:space="preserve"> ArXiv preprint arXiv:2608.09096v2, 2026., 2608년. Available at:</w:t>
+        <w:t xml:space="preserve"> ArXiv preprint arXiv:2608.09096v2, 2026., 2026년. Available at:</w:t>
       </w:r>
       <w:r>
         <w:t xml:space="preserve"> </w:t>
@@ -7438,7 +7478,7 @@
         <w:t xml:space="preserve">“HarnessOpt-Bench: Evaluating LLMs at Harness Optimization”</w:t>
       </w:r>
       <w:r>
-        <w:t xml:space="preserve">. ArXiv preprint arXiv:2608.06301v1, 2026., 2608년. Available at:</w:t>
+        <w:t xml:space="preserve">. ArXiv preprint arXiv:2608.06301v1, 2026., 2026년. Available at:</w:t>
       </w:r>
       <w:r>
         <w:t xml:space="preserve"> </w:t>
@@ -7477,7 +7517,7 @@
         <w:t xml:space="preserve">“Rethinking the Evaluation of Harness Evolution for Agents”</w:t>
       </w:r>
       <w:r>
-        <w:t xml:space="preserve">. ArXiv preprint arXiv:2607.12227v2, 2026., 2607년. Available at:</w:t>
+        <w:t xml:space="preserve">. ArXiv preprint arXiv:2607.12227v2, 2026., 2026년. Available at:</w:t>
       </w:r>
       <w:r>
         <w:t xml:space="preserve"> </w:t>
@@ -7507,16 +7547,16 @@
         <w:t xml:space="preserve">	</w:t>
       </w:r>
       <w:r>
-        <w:t xml:space="preserve">Pi,</w:t>
-      </w:r>
-      <w:r>
-        <w:t xml:space="preserve"> </w:t>
-      </w:r>
-      <w:r>
-        <w:t xml:space="preserve">“A minimal agent harness with four primitive tools and a short system prompt”</w:t>
-      </w:r>
-      <w:r>
-        <w:t xml:space="preserve">. Public leaderboard results and technical documentation; grey literature, not peer reviewed, 2026년.</w:t>
+        <w:t xml:space="preserve">P. Project,</w:t>
+      </w:r>
+      <w:r>
+        <w:t xml:space="preserve"> </w:t>
+      </w:r>
+      <w:r>
+        <w:t xml:space="preserve">“A Minimal Agent Harness with Primitive Tools and Compact Context”</w:t>
+      </w:r>
+      <w:r>
+        <w:t xml:space="preserve">. Technical Documentation and Evaluation, 2026, 2026년.</w:t>
       </w:r>
     </w:p>
     <w:bookmarkEnd w:id="176"/>
@@ -7535,7 +7575,20 @@
         <w:t xml:space="preserve">	</w:t>
       </w:r>
       <w:r>
-        <w:t xml:space="preserve">K. T. Seth Karten Alex L. Zhang 와/과 S. Jaghouar,</w:t>
+        <w:t xml:space="preserve">S. Karten</w:t>
+      </w:r>
+      <w:r>
+        <w:t xml:space="preserve"> </w:t>
+      </w:r>
+      <w:r>
+        <w:rPr>
+          <w:i/>
+          <w:iCs/>
+        </w:rPr>
+        <w:t xml:space="preserve">기타</w:t>
+      </w:r>
+      <w:r>
+        <w:t xml:space="preserve">,</w:t>
       </w:r>
       <w:r>
         <w:t xml:space="preserve"> </w:t>
@@ -7544,7 +7597,7 @@
         <w:t xml:space="preserve">“Prime Agent: A Self-Improving RLM Harness”</w:t>
       </w:r>
       <w:r>
-        <w:t xml:space="preserve">. ArXiv preprint arXiv:2608.23552, 2026년. Available at:</w:t>
+        <w:t xml:space="preserve">. arXiv:2608.23552v1, 2026, 2026년. Available at:</w:t>
       </w:r>
       <w:r>
         <w:t xml:space="preserve"> </w:t>
@@ -7583,7 +7636,7 @@
         <w:t xml:space="preserve">“Provenance Before Prose: Claim-Locked Reporting”</w:t>
       </w:r>
       <w:r>
-        <w:t xml:space="preserve">. ArXiv preprint arXiv:2608.25336v1, 2026., 2608년. Available at:</w:t>
+        <w:t xml:space="preserve">. ArXiv preprint arXiv:2608.25336v1, 2026., 2026년. Available at:</w:t>
       </w:r>
       <w:r>
         <w:t xml:space="preserve"> </w:t>
@@ -7622,7 +7675,7 @@
         <w:t xml:space="preserve">“Artifact-centered Claim-aware Observability for Autonomous Scientific Agents”</w:t>
       </w:r>
       <w:r>
-        <w:t xml:space="preserve">. ArXiv preprint arXiv:2608.18312v1, 2026., 2608년. Available at:</w:t>
+        <w:t xml:space="preserve">. ArXiv preprint arXiv:2608.18312v1, 2026., 2026년. Available at:</w:t>
       </w:r>
       <w:r>
         <w:t xml:space="preserve"> </w:t>
@@ -7652,28 +7705,19 @@
         <w:t xml:space="preserve">	</w:t>
       </w:r>
       <w:r>
-        <w:t xml:space="preserve">S,</w:t>
-      </w:r>
-      <w:r>
-        <w:t xml:space="preserve"> </w:t>
-      </w:r>
-      <w:r>
-        <w:t xml:space="preserve">“S. Khan et al.,</w:t>
-      </w:r>
-      <w:r>
-        <w:t xml:space="preserve"> </w:t>
-      </w:r>
-      <w:r>
-        <w:t xml:space="preserve">‘Stop Means Stop: Measuring and Repairing the Enforcement Gap in Agent Control Primitives,’</w:t>
-      </w:r>
-      <w:r>
-        <w:t xml:space="preserve"> </w:t>
-      </w:r>
-      <w:r>
-        <w:t xml:space="preserve">arXiv:2607.14166v3, 2026.”</w:t>
-      </w:r>
-      <w:r>
-        <w:t xml:space="preserve"> 2607년.</w:t>
+        <w:t xml:space="preserve">S. K. et al</w:t>
+      </w:r>
+      <w:r>
+        <w:t xml:space="preserve">,</w:t>
+      </w:r>
+      <w:r>
+        <w:t xml:space="preserve"> </w:t>
+      </w:r>
+      <w:r>
+        <w:t xml:space="preserve">“Stop Means Stop: Measuring and Repairing the Enforcement Gap in Agent Control Primitives”</w:t>
+      </w:r>
+      <w:r>
+        <w:t xml:space="preserve">. arXiv:2607.14166v3, 2026, 2026년.</w:t>
       </w:r>
     </w:p>
     <w:bookmarkEnd w:id="183"/>
@@ -7692,28 +7736,19 @@
         <w:t xml:space="preserve">	</w:t>
       </w:r>
       <w:r>
-        <w:t xml:space="preserve">M,</w:t>
-      </w:r>
-      <w:r>
-        <w:t xml:space="preserve"> </w:t>
-      </w:r>
-      <w:r>
-        <w:t xml:space="preserve">“M. Fernandez et al.,</w:t>
-      </w:r>
-      <w:r>
-        <w:t xml:space="preserve"> </w:t>
-      </w:r>
-      <w:r>
-        <w:t xml:space="preserve">‘Agent Control Protocol: Admission Control for Agent Actions,’</w:t>
-      </w:r>
-      <w:r>
-        <w:t xml:space="preserve"> </w:t>
-      </w:r>
-      <w:r>
-        <w:t xml:space="preserve">arXiv:2603.18829v10, 2026.”</w:t>
-      </w:r>
-      <w:r>
-        <w:t xml:space="preserve"> 2603년.</w:t>
+        <w:t xml:space="preserve">M. F. et al</w:t>
+      </w:r>
+      <w:r>
+        <w:t xml:space="preserve">,</w:t>
+      </w:r>
+      <w:r>
+        <w:t xml:space="preserve"> </w:t>
+      </w:r>
+      <w:r>
+        <w:t xml:space="preserve">“Agent Control Protocol: Admission Control for Agent Actions”</w:t>
+      </w:r>
+      <w:r>
+        <w:t xml:space="preserve">. arXiv:2603.18829v10, 2026, 2026년.</w:t>
       </w:r>
     </w:p>
     <w:bookmarkEnd w:id="184"/>
@@ -7732,28 +7767,19 @@
         <w:t xml:space="preserve">	</w:t>
       </w:r>
       <w:r>
-        <w:t xml:space="preserve">J,</w:t>
-      </w:r>
-      <w:r>
-        <w:t xml:space="preserve"> </w:t>
-      </w:r>
-      <w:r>
-        <w:t xml:space="preserve">“J. Huang et al.,</w:t>
-      </w:r>
-      <w:r>
-        <w:t xml:space="preserve"> </w:t>
-      </w:r>
-      <w:r>
-        <w:t xml:space="preserve">‘From Final Artifacts to Trajectories: Retrospective Process Supervision,’</w:t>
-      </w:r>
-      <w:r>
-        <w:t xml:space="preserve"> </w:t>
-      </w:r>
-      <w:r>
-        <w:t xml:space="preserve">arXiv:2608.30461v1, 2026.”</w:t>
-      </w:r>
-      <w:r>
-        <w:t xml:space="preserve"> 2608년.</w:t>
+        <w:t xml:space="preserve">J. H. et al</w:t>
+      </w:r>
+      <w:r>
+        <w:t xml:space="preserve">,</w:t>
+      </w:r>
+      <w:r>
+        <w:t xml:space="preserve"> </w:t>
+      </w:r>
+      <w:r>
+        <w:t xml:space="preserve">“From Final Artifacts to Trajectories: Retrospective Process Supervision”</w:t>
+      </w:r>
+      <w:r>
+        <w:t xml:space="preserve">. arXiv:2608.30461v1, 2026, 2026년.</w:t>
       </w:r>
     </w:p>
     <w:bookmarkEnd w:id="185"/>
@@ -7772,28 +7798,19 @@
         <w:t xml:space="preserve">	</w:t>
       </w:r>
       <w:r>
-        <w:t xml:space="preserve">W,</w:t>
-      </w:r>
-      <w:r>
-        <w:t xml:space="preserve"> </w:t>
-      </w:r>
-      <w:r>
-        <w:t xml:space="preserve">“W. Pan et al.,</w:t>
-      </w:r>
-      <w:r>
-        <w:t xml:space="preserve"> </w:t>
-      </w:r>
-      <w:r>
-        <w:t xml:space="preserve">‘Evolving Agents in the Dark: Retrospective Harness Optimization,’</w:t>
-      </w:r>
-      <w:r>
-        <w:t xml:space="preserve"> </w:t>
-      </w:r>
-      <w:r>
-        <w:t xml:space="preserve">arXiv:2606.05922v3, 2026.”</w:t>
-      </w:r>
-      <w:r>
-        <w:t xml:space="preserve"> 2606년.</w:t>
+        <w:t xml:space="preserve">W. P. et al</w:t>
+      </w:r>
+      <w:r>
+        <w:t xml:space="preserve">,</w:t>
+      </w:r>
+      <w:r>
+        <w:t xml:space="preserve"> </w:t>
+      </w:r>
+      <w:r>
+        <w:t xml:space="preserve">“Evolving Agents in the Dark: Retrospective Harness Optimization”</w:t>
+      </w:r>
+      <w:r>
+        <w:t xml:space="preserve">. arXiv:2606.05922v3, 2026, 2026년.</w:t>
       </w:r>
     </w:p>
     <w:bookmarkEnd w:id="186"/>
@@ -7821,7 +7838,7 @@
         <w:t xml:space="preserve">“Grounded Checklist Partial Credit for Agent Skill Trajectories”</w:t>
       </w:r>
       <w:r>
-        <w:t xml:space="preserve">. ArXiv preprint arXiv:2608.27487v1, 2026., 2608년. Available at:</w:t>
+        <w:t xml:space="preserve">. ArXiv preprint arXiv:2608.27487v1, 2026., 2026년. Available at:</w:t>
       </w:r>
       <w:r>
         <w:t xml:space="preserve"> </w:t>
@@ -7860,7 +7877,7 @@
         <w:t xml:space="preserve">“Right Answer, Wrong Method: Shortcut Hacking Misleads the Evaluation of LLM Reasoning on Frontier Science Benchmarks”</w:t>
       </w:r>
       <w:r>
-        <w:t xml:space="preserve">. ArXiv preprint arXiv:2608.02442v1, 2026., 2608년. Available at:</w:t>
+        <w:t xml:space="preserve">. ArXiv preprint arXiv:2608.02442v1, 2026., 2026년. Available at:</w:t>
       </w:r>
       <w:r>
         <w:t xml:space="preserve"> </w:t>
@@ -7899,7 +7916,7 @@
         <w:t xml:space="preserve">“BAITBENCH: Measuring Agent Reward Hacking with Optional Shortcuts Planted in ML Tasks”</w:t>
       </w:r>
       <w:r>
-        <w:t xml:space="preserve">. ArXiv preprint arXiv:2608.30724v1, 2026., 2608년. Available at:</w:t>
+        <w:t xml:space="preserve">. ArXiv preprint arXiv:2608.30724v1, 2026., 2026년. Available at:</w:t>
       </w:r>
       <w:r>
         <w:t xml:space="preserve"> </w:t>
@@ -7977,7 +7994,7 @@
         <w:t xml:space="preserve">“When LLMs Agree, Are They Right? Auditing Self-Consistency and Cross-Model Agreement as Confidence Signals”</w:t>
       </w:r>
       <w:r>
-        <w:t xml:space="preserve">. ArXiv preprint arXiv:2607.08065v2, 2026., 2607년. Available at:</w:t>
+        <w:t xml:space="preserve">. ArXiv preprint arXiv:2607.08065v2, 2026., 2026년. Available at:</w:t>
       </w:r>
       <w:r>
         <w:t xml:space="preserve"> </w:t>
@@ -8016,7 +8033,7 @@
         <w:t xml:space="preserve">“Reliability without Validity: A Systematic, Large-Scale Evaluation of LLM-as-a-Judge Models Across Agreement, Consistency, and Bias”</w:t>
       </w:r>
       <w:r>
-        <w:t xml:space="preserve">. ArXiv preprint arXiv:2606.19544v1, 2026., 2606년. Available at:</w:t>
+        <w:t xml:space="preserve">. ArXiv preprint arXiv:2606.19544v1, 2026., 2026년. Available at:</w:t>
       </w:r>
       <w:r>
         <w:t xml:space="preserve"> </w:t>
@@ -8055,7 +8072,7 @@
         <w:t xml:space="preserve">“Measurement Without Validity: The Compounding Reliability Problem in Agentic AI Evaluation”</w:t>
       </w:r>
       <w:r>
-        <w:t xml:space="preserve">. ArXiv preprint arXiv:2608.00794v3, 2026., 2608년. Available at:</w:t>
+        <w:t xml:space="preserve">. ArXiv preprint arXiv:2608.00794v3, 2026., 2026년. Available at:</w:t>
       </w:r>
       <w:r>
         <w:t xml:space="preserve"> </w:t>
@@ -8085,28 +8102,19 @@
         <w:t xml:space="preserve">	</w:t>
       </w:r>
       <w:r>
-        <w:t xml:space="preserve">P,</w:t>
-      </w:r>
-      <w:r>
-        <w:t xml:space="preserve"> </w:t>
-      </w:r>
-      <w:r>
-        <w:t xml:space="preserve">“P. Feng et al.,</w:t>
-      </w:r>
-      <w:r>
-        <w:t xml:space="preserve"> </w:t>
-      </w:r>
-      <w:r>
-        <w:t xml:space="preserve">‘Second-Order Response Laws for LLM Judges: Debiased Estimation of Prompt Effects,’</w:t>
-      </w:r>
-      <w:r>
-        <w:t xml:space="preserve"> </w:t>
-      </w:r>
-      <w:r>
-        <w:t xml:space="preserve">arXiv:2608.16253v1, 2026.”</w:t>
-      </w:r>
-      <w:r>
-        <w:t xml:space="preserve"> 2608년.</w:t>
+        <w:t xml:space="preserve">P. F. et al</w:t>
+      </w:r>
+      <w:r>
+        <w:t xml:space="preserve">,</w:t>
+      </w:r>
+      <w:r>
+        <w:t xml:space="preserve"> </w:t>
+      </w:r>
+      <w:r>
+        <w:t xml:space="preserve">“Second-Order Response Laws for LLM Judges: Debiased Estimation of Prompt Effects”</w:t>
+      </w:r>
+      <w:r>
+        <w:t xml:space="preserve">. arXiv:2608.16253v1, 2026, 2026년.</w:t>
       </w:r>
     </w:p>
     <w:bookmarkEnd w:id="201"/>
@@ -8125,28 +8133,16 @@
         <w:t xml:space="preserve">	</w:t>
       </w:r>
       <w:r>
-        <w:t xml:space="preserve">U,</w:t>
-      </w:r>
-      <w:r>
-        <w:t xml:space="preserve"> </w:t>
-      </w:r>
-      <w:r>
-        <w:t xml:space="preserve">“U. Bahuguna,</w:t>
-      </w:r>
-      <w:r>
-        <w:t xml:space="preserve"> </w:t>
-      </w:r>
-      <w:r>
-        <w:t xml:space="preserve">‘When Self-Consistency Backfires: Majority Vote Hurts the Majority of Hard Science Problems for Small LLMs,’</w:t>
-      </w:r>
-      <w:r>
-        <w:t xml:space="preserve"> </w:t>
-      </w:r>
-      <w:r>
-        <w:t xml:space="preserve">arXiv:2608.11403v2, 2026.”</w:t>
-      </w:r>
-      <w:r>
-        <w:t xml:space="preserve"> 2608년.</w:t>
+        <w:t xml:space="preserve">U. Bahuguna,</w:t>
+      </w:r>
+      <w:r>
+        <w:t xml:space="preserve"> </w:t>
+      </w:r>
+      <w:r>
+        <w:t xml:space="preserve">“When Self-Consistency Backfires: Majority Vote Hurts the Majority of Hard Science Problems for Small LLMs”</w:t>
+      </w:r>
+      <w:r>
+        <w:t xml:space="preserve">. arXiv:2608.11403v2, 2026, 2026년.</w:t>
       </w:r>
     </w:p>
     <w:bookmarkEnd w:id="202"/>
@@ -8165,28 +8161,19 @@
         <w:t xml:space="preserve">	</w:t>
       </w:r>
       <w:r>
-        <w:t xml:space="preserve">L,</w:t>
-      </w:r>
-      <w:r>
-        <w:t xml:space="preserve"> </w:t>
-      </w:r>
-      <w:r>
-        <w:t xml:space="preserve">“L. Zhang et al.,</w:t>
-      </w:r>
-      <w:r>
-        <w:t xml:space="preserve"> </w:t>
-      </w:r>
-      <w:r>
-        <w:t xml:space="preserve">‘Decomposing Wrong-Consensus Agreement in LLM Self-Consistency,’</w:t>
-      </w:r>
-      <w:r>
-        <w:t xml:space="preserve"> </w:t>
-      </w:r>
-      <w:r>
-        <w:t xml:space="preserve">arXiv:2608.18795v2, 2026.”</w:t>
-      </w:r>
-      <w:r>
-        <w:t xml:space="preserve"> 2608년.</w:t>
+        <w:t xml:space="preserve">L. Z. et al</w:t>
+      </w:r>
+      <w:r>
+        <w:t xml:space="preserve">,</w:t>
+      </w:r>
+      <w:r>
+        <w:t xml:space="preserve"> </w:t>
+      </w:r>
+      <w:r>
+        <w:t xml:space="preserve">“Decomposing Wrong-Consensus Agreement in LLM Self-Consistency”</w:t>
+      </w:r>
+      <w:r>
+        <w:t xml:space="preserve">. arXiv:2608.18795v2, 2026, 2026년.</w:t>
       </w:r>
     </w:p>
     <w:bookmarkEnd w:id="203"/>
@@ -8205,28 +8192,19 @@
         <w:t xml:space="preserve">	</w:t>
       </w:r>
       <w:r>
-        <w:t xml:space="preserve">S,</w:t>
-      </w:r>
-      <w:r>
-        <w:t xml:space="preserve"> </w:t>
-      </w:r>
-      <w:r>
-        <w:t xml:space="preserve">“S. Hajimiri et al.,</w:t>
-      </w:r>
-      <w:r>
-        <w:t xml:space="preserve"> </w:t>
-      </w:r>
-      <w:r>
-        <w:t xml:space="preserve">‘Are Online Skill and Memory Modules Always Worth Their Tokens? A Budget-Constrained Re-Evaluation,’</w:t>
-      </w:r>
-      <w:r>
-        <w:t xml:space="preserve"> </w:t>
-      </w:r>
-      <w:r>
-        <w:t xml:space="preserve">arXiv:2606.15017v2, 2026.”</w:t>
-      </w:r>
-      <w:r>
-        <w:t xml:space="preserve"> 2606년.</w:t>
+        <w:t xml:space="preserve">S. H. et al</w:t>
+      </w:r>
+      <w:r>
+        <w:t xml:space="preserve">,</w:t>
+      </w:r>
+      <w:r>
+        <w:t xml:space="preserve"> </w:t>
+      </w:r>
+      <w:r>
+        <w:t xml:space="preserve">“Are Online Skill and Memory Modules Always Worth Their Tokens? A Budget-Constrained Re-Evaluation”</w:t>
+      </w:r>
+      <w:r>
+        <w:t xml:space="preserve">. arXiv:2606.15017v2, 2026, 2026년.</w:t>
       </w:r>
     </w:p>
     <w:bookmarkEnd w:id="204"/>
@@ -8245,28 +8223,19 @@
         <w:t xml:space="preserve">	</w:t>
       </w:r>
       <w:r>
-        <w:t xml:space="preserve">E,</w:t>
-      </w:r>
-      <w:r>
-        <w:t xml:space="preserve"> </w:t>
-      </w:r>
-      <w:r>
-        <w:t xml:space="preserve">“E. Lumer et al.,</w:t>
-      </w:r>
-      <w:r>
-        <w:t xml:space="preserve"> </w:t>
-      </w:r>
-      <w:r>
-        <w:t xml:space="preserve">‘Don’t Break the Cache: An Evaluation of Prompt Caching for Long-Horizon Agentic Tasks,’</w:t>
-      </w:r>
-      <w:r>
-        <w:t xml:space="preserve"> </w:t>
-      </w:r>
-      <w:r>
-        <w:t xml:space="preserve">arXiv:2601.06007v2, 2026.”</w:t>
-      </w:r>
-      <w:r>
-        <w:t xml:space="preserve"> 2601년.</w:t>
+        <w:t xml:space="preserve">E. L. et al</w:t>
+      </w:r>
+      <w:r>
+        <w:t xml:space="preserve">,</w:t>
+      </w:r>
+      <w:r>
+        <w:t xml:space="preserve"> </w:t>
+      </w:r>
+      <w:r>
+        <w:t xml:space="preserve">“Don’t Break the Cache: An Evaluation of Prompt Caching for Long-Horizon Agentic Tasks”</w:t>
+      </w:r>
+      <w:r>
+        <w:t xml:space="preserve">. arXiv:2601.06007v2, 2026, 2026년.</w:t>
       </w:r>
     </w:p>
     <w:bookmarkEnd w:id="205"/>
@@ -8285,28 +8254,19 @@
         <w:t xml:space="preserve">	</w:t>
       </w:r>
       <w:r>
-        <w:t xml:space="preserve">S,</w:t>
-      </w:r>
-      <w:r>
-        <w:t xml:space="preserve"> </w:t>
-      </w:r>
-      <w:r>
-        <w:t xml:space="preserve">“S. Liu et al.,</w:t>
-      </w:r>
-      <w:r>
-        <w:t xml:space="preserve"> </w:t>
-      </w:r>
-      <w:r>
-        <w:t xml:space="preserve">‘What Does Context Compression Cost an Agent? Interaction Costs Unrevealed by Task Completion,’</w:t>
-      </w:r>
-      <w:r>
-        <w:t xml:space="preserve"> </w:t>
-      </w:r>
-      <w:r>
-        <w:t xml:space="preserve">arXiv:2608.16370v1, 2026.”</w:t>
-      </w:r>
-      <w:r>
-        <w:t xml:space="preserve"> 2608년.</w:t>
+        <w:t xml:space="preserve">S. L. et al</w:t>
+      </w:r>
+      <w:r>
+        <w:t xml:space="preserve">,</w:t>
+      </w:r>
+      <w:r>
+        <w:t xml:space="preserve"> </w:t>
+      </w:r>
+      <w:r>
+        <w:t xml:space="preserve">“What Does Context Compression Cost an Agent? Interaction Costs Unrevealed by Task Completion”</w:t>
+      </w:r>
+      <w:r>
+        <w:t xml:space="preserve">. arXiv:2608.16370v1, 2026, 2026년.</w:t>
       </w:r>
     </w:p>
     <w:bookmarkEnd w:id="206"/>
@@ -8325,28 +8285,19 @@
         <w:t xml:space="preserve">	</w:t>
       </w:r>
       <w:r>
-        <w:t xml:space="preserve">S,</w:t>
-      </w:r>
-      <w:r>
-        <w:t xml:space="preserve"> </w:t>
-      </w:r>
-      <w:r>
-        <w:t xml:space="preserve">“S. Weinberger et al.,</w:t>
-      </w:r>
-      <w:r>
-        <w:t xml:space="preserve"> </w:t>
-      </w:r>
-      <w:r>
-        <w:t xml:space="preserve">‘Prompt-Induced Waste in Coding Agents: Reasoning, Effort, Harness Design, and Energy,’</w:t>
-      </w:r>
-      <w:r>
-        <w:t xml:space="preserve"> </w:t>
-      </w:r>
-      <w:r>
-        <w:t xml:space="preserve">arXiv:2608.01347v5, 2026.”</w:t>
-      </w:r>
-      <w:r>
-        <w:t xml:space="preserve"> 2608년.</w:t>
+        <w:t xml:space="preserve">S. W. et al</w:t>
+      </w:r>
+      <w:r>
+        <w:t xml:space="preserve">,</w:t>
+      </w:r>
+      <w:r>
+        <w:t xml:space="preserve"> </w:t>
+      </w:r>
+      <w:r>
+        <w:t xml:space="preserve">“Prompt-Induced Waste in Coding Agents: Reasoning, Effort, Harness Design, and Energy”</w:t>
+      </w:r>
+      <w:r>
+        <w:t xml:space="preserve">. arXiv:2608.01347v5, 2026, 2026년.</w:t>
       </w:r>
     </w:p>
     <w:bookmarkEnd w:id="207"/>
@@ -8365,28 +8316,16 @@
         <w:t xml:space="preserve">	</w:t>
       </w:r>
       <w:r>
-        <w:t xml:space="preserve">G,</w:t>
-      </w:r>
-      <w:r>
-        <w:t xml:space="preserve"> </w:t>
-      </w:r>
-      <w:r>
-        <w:t xml:space="preserve">“G. Coqueret,</w:t>
-      </w:r>
-      <w:r>
-        <w:t xml:space="preserve"> </w:t>
-      </w:r>
-      <w:r>
-        <w:t xml:space="preserve">‘Randomness in Large Language Models: What Researchers Need to Know,’</w:t>
-      </w:r>
-      <w:r>
-        <w:t xml:space="preserve"> </w:t>
-      </w:r>
-      <w:r>
-        <w:t xml:space="preserve">arXiv:2607.24372v1, 2026.”</w:t>
-      </w:r>
-      <w:r>
-        <w:t xml:space="preserve"> 2607년.</w:t>
+        <w:t xml:space="preserve">G. Coqueret,</w:t>
+      </w:r>
+      <w:r>
+        <w:t xml:space="preserve"> </w:t>
+      </w:r>
+      <w:r>
+        <w:t xml:space="preserve">“Randomness in Large Language Models: What Researchers Need to Know”</w:t>
+      </w:r>
+      <w:r>
+        <w:t xml:space="preserve">. arXiv:2607.24372v1, 2026, 2026년.</w:t>
       </w:r>
     </w:p>
     <w:bookmarkEnd w:id="208"/>
@@ -8405,28 +8344,19 @@
         <w:t xml:space="preserve">	</w:t>
       </w:r>
       <w:r>
-        <w:t xml:space="preserve">J,</w:t>
-      </w:r>
-      <w:r>
-        <w:t xml:space="preserve"> </w:t>
-      </w:r>
-      <w:r>
-        <w:t xml:space="preserve">“J. Ning et al.,</w:t>
-      </w:r>
-      <w:r>
-        <w:t xml:space="preserve"> </w:t>
-      </w:r>
-      <w:r>
-        <w:t xml:space="preserve">‘One Run Is Not an Idea: The Implementation Lottery in Automated Research,’</w:t>
-      </w:r>
-      <w:r>
-        <w:t xml:space="preserve"> </w:t>
-      </w:r>
-      <w:r>
-        <w:t xml:space="preserve">arXiv:2607.26587v1, 2026.”</w:t>
-      </w:r>
-      <w:r>
-        <w:t xml:space="preserve"> 2607년.</w:t>
+        <w:t xml:space="preserve">J. N. et al</w:t>
+      </w:r>
+      <w:r>
+        <w:t xml:space="preserve">,</w:t>
+      </w:r>
+      <w:r>
+        <w:t xml:space="preserve"> </w:t>
+      </w:r>
+      <w:r>
+        <w:t xml:space="preserve">“One Run Is Not an Idea: The Implementation Lottery in Automated Research”</w:t>
+      </w:r>
+      <w:r>
+        <w:t xml:space="preserve">. arXiv:2607.26587v1, 2026, 2026년.</w:t>
       </w:r>
     </w:p>
     <w:bookmarkEnd w:id="209"/>
@@ -8445,28 +8375,19 @@
         <w:t xml:space="preserve">	</w:t>
       </w:r>
       <w:r>
-        <w:t xml:space="preserve">Q,</w:t>
-      </w:r>
-      <w:r>
-        <w:t xml:space="preserve"> </w:t>
-      </w:r>
-      <w:r>
-        <w:t xml:space="preserve">“Q. Ye et al.,</w:t>
-      </w:r>
-      <w:r>
-        <w:t xml:space="preserve"> </w:t>
-      </w:r>
-      <w:r>
-        <w:t xml:space="preserve">‘On the Fragility of Self-Improving Agents: Variance, Task Order, and Underspecification,’</w:t>
-      </w:r>
-      <w:r>
-        <w:t xml:space="preserve"> </w:t>
-      </w:r>
-      <w:r>
-        <w:t xml:space="preserve">arXiv:2608.18066v1, 2026.”</w:t>
-      </w:r>
-      <w:r>
-        <w:t xml:space="preserve"> 2608년.</w:t>
+        <w:t xml:space="preserve">Q. Y. et al</w:t>
+      </w:r>
+      <w:r>
+        <w:t xml:space="preserve">,</w:t>
+      </w:r>
+      <w:r>
+        <w:t xml:space="preserve"> </w:t>
+      </w:r>
+      <w:r>
+        <w:t xml:space="preserve">“On the Fragility of Self-Improving Agents: Variance, Task Order, and Underspecification”</w:t>
+      </w:r>
+      <w:r>
+        <w:t xml:space="preserve">. arXiv:2608.18066v1, 2026, 2026년.</w:t>
       </w:r>
     </w:p>
     <w:bookmarkEnd w:id="210"/>
@@ -8485,28 +8406,19 @@
         <w:t xml:space="preserve">	</w:t>
       </w:r>
       <w:r>
-        <w:t xml:space="preserve">S,</w:t>
-      </w:r>
-      <w:r>
-        <w:t xml:space="preserve"> </w:t>
-      </w:r>
-      <w:r>
-        <w:t xml:space="preserve">“S. Dhage et al.,</w:t>
-      </w:r>
-      <w:r>
-        <w:t xml:space="preserve"> </w:t>
-      </w:r>
-      <w:r>
-        <w:t xml:space="preserve">‘Harness Engineering for Predictable Agentic Systems: An Empirical Study of Determinism,’</w:t>
-      </w:r>
-      <w:r>
-        <w:t xml:space="preserve"> </w:t>
-      </w:r>
-      <w:r>
-        <w:t xml:space="preserve">arXiv:2608.26197v1, 2026.”</w:t>
-      </w:r>
-      <w:r>
-        <w:t xml:space="preserve"> 2608년.</w:t>
+        <w:t xml:space="preserve">S. D. et al</w:t>
+      </w:r>
+      <w:r>
+        <w:t xml:space="preserve">,</w:t>
+      </w:r>
+      <w:r>
+        <w:t xml:space="preserve"> </w:t>
+      </w:r>
+      <w:r>
+        <w:t xml:space="preserve">“Harness Engineering for Predictable Agentic Systems: An Empirical Study of Determinism”</w:t>
+      </w:r>
+      <w:r>
+        <w:t xml:space="preserve">. arXiv:2608.26197v1, 2026, 2026년.</w:t>
       </w:r>
     </w:p>
     <w:bookmarkEnd w:id="211"/>
@@ -8525,28 +8437,19 @@
         <w:t xml:space="preserve">	</w:t>
       </w:r>
       <w:r>
-        <w:t xml:space="preserve">R,</w:t>
-      </w:r>
-      <w:r>
-        <w:t xml:space="preserve"> </w:t>
-      </w:r>
-      <w:r>
-        <w:t xml:space="preserve">“R. Bhalgami et al.,</w:t>
-      </w:r>
-      <w:r>
-        <w:t xml:space="preserve"> </w:t>
-      </w:r>
-      <w:r>
-        <w:t xml:space="preserve">‘Pixels for Programs? A Cross-Provider Case Study of Input-Token Accounting for Source Code as Text and Images,’</w:t>
-      </w:r>
-      <w:r>
-        <w:t xml:space="preserve"> </w:t>
-      </w:r>
-      <w:r>
-        <w:t xml:space="preserve">arXiv:2607.21672v1, 2026.”</w:t>
-      </w:r>
-      <w:r>
-        <w:t xml:space="preserve"> 2607년.</w:t>
+        <w:t xml:space="preserve">R. B. et al</w:t>
+      </w:r>
+      <w:r>
+        <w:t xml:space="preserve">,</w:t>
+      </w:r>
+      <w:r>
+        <w:t xml:space="preserve"> </w:t>
+      </w:r>
+      <w:r>
+        <w:t xml:space="preserve">“Pixels for Programs? A Cross-Provider Case Study of Input-Token Accounting for Source Code as Text and Images”</w:t>
+      </w:r>
+      <w:r>
+        <w:t xml:space="preserve">. arXiv:2607.21672v1, 2026, 2026년.</w:t>
       </w:r>
     </w:p>
     <w:bookmarkEnd w:id="212"/>
@@ -8565,28 +8468,19 @@
         <w:t xml:space="preserve">	</w:t>
       </w:r>
       <w:r>
-        <w:t xml:space="preserve">R,</w:t>
-      </w:r>
-      <w:r>
-        <w:t xml:space="preserve"> </w:t>
-      </w:r>
-      <w:r>
-        <w:t xml:space="preserve">“R. Khanbayov et al.,</w:t>
-      </w:r>
-      <w:r>
-        <w:t xml:space="preserve"> </w:t>
-      </w:r>
-      <w:r>
-        <w:t xml:space="preserve">‘When Does Consensus Mean Correctness? Measuring the Agreement-Accuracy Coupling,’</w:t>
-      </w:r>
-      <w:r>
-        <w:t xml:space="preserve"> </w:t>
-      </w:r>
-      <w:r>
-        <w:t xml:space="preserve">arXiv:2608.05670v1, 2026.”</w:t>
-      </w:r>
-      <w:r>
-        <w:t xml:space="preserve"> 2608년.</w:t>
+        <w:t xml:space="preserve">R. K. et al</w:t>
+      </w:r>
+      <w:r>
+        <w:t xml:space="preserve">,</w:t>
+      </w:r>
+      <w:r>
+        <w:t xml:space="preserve"> </w:t>
+      </w:r>
+      <w:r>
+        <w:t xml:space="preserve">“When Does Consensus Mean Correctness? Measuring the Agreement-Accuracy Coupling”</w:t>
+      </w:r>
+      <w:r>
+        <w:t xml:space="preserve">. arXiv:2608.05670v1, 2026, 2026년.</w:t>
       </w:r>
     </w:p>
     <w:bookmarkEnd w:id="213"/>
@@ -8605,28 +8499,19 @@
         <w:t xml:space="preserve">	</w:t>
       </w:r>
       <w:r>
-        <w:t xml:space="preserve">L,</w:t>
-      </w:r>
-      <w:r>
-        <w:t xml:space="preserve"> </w:t>
-      </w:r>
-      <w:r>
-        <w:t xml:space="preserve">“L. Zhang et al.,</w:t>
-      </w:r>
-      <w:r>
-        <w:t xml:space="preserve"> </w:t>
-      </w:r>
-      <w:r>
-        <w:t xml:space="preserve">‘Quantifying and Predicting Disagreement in Graded Human Ratings,’</w:t>
-      </w:r>
-      <w:r>
-        <w:t xml:space="preserve"> </w:t>
-      </w:r>
-      <w:r>
-        <w:t xml:space="preserve">arXiv:2605.01168v1, 2026.”</w:t>
-      </w:r>
-      <w:r>
-        <w:t xml:space="preserve"> 2605년.</w:t>
+        <w:t xml:space="preserve">L. Z. et al</w:t>
+      </w:r>
+      <w:r>
+        <w:t xml:space="preserve">,</w:t>
+      </w:r>
+      <w:r>
+        <w:t xml:space="preserve"> </w:t>
+      </w:r>
+      <w:r>
+        <w:t xml:space="preserve">“Quantifying and Predicting Disagreement in Graded Human Ratings”</w:t>
+      </w:r>
+      <w:r>
+        <w:t xml:space="preserve">. arXiv:2605.01168v1, 2026, 2026년.</w:t>
       </w:r>
     </w:p>
     <w:bookmarkEnd w:id="214"/>
@@ -8645,28 +8530,19 @@
         <w:t xml:space="preserve">	</w:t>
       </w:r>
       <w:r>
-        <w:t xml:space="preserve">Y,</w:t>
-      </w:r>
-      <w:r>
-        <w:t xml:space="preserve"> </w:t>
-      </w:r>
-      <w:r>
-        <w:t xml:space="preserve">“Y. Lin et al.,</w:t>
-      </w:r>
-      <w:r>
-        <w:t xml:space="preserve"> </w:t>
-      </w:r>
-      <w:r>
-        <w:t xml:space="preserve">‘Bolt-on, Verifiable Provenance for LLM-Powered Data Processing,’</w:t>
-      </w:r>
-      <w:r>
-        <w:t xml:space="preserve"> </w:t>
-      </w:r>
-      <w:r>
-        <w:t xml:space="preserve">arXiv:2608.25210v2, 2026.”</w:t>
-      </w:r>
-      <w:r>
-        <w:t xml:space="preserve"> 2608년.</w:t>
+        <w:t xml:space="preserve">Y. L. et al</w:t>
+      </w:r>
+      <w:r>
+        <w:t xml:space="preserve">,</w:t>
+      </w:r>
+      <w:r>
+        <w:t xml:space="preserve"> </w:t>
+      </w:r>
+      <w:r>
+        <w:t xml:space="preserve">“Bolt-on, Verifiable Provenance for LLM-Powered Data Processing”</w:t>
+      </w:r>
+      <w:r>
+        <w:t xml:space="preserve">. arXiv:2608.25210v2, 2026, 2026년.</w:t>
       </w:r>
     </w:p>
     <w:bookmarkEnd w:id="215"/>
@@ -8685,28 +8561,19 @@
         <w:t xml:space="preserve">	</w:t>
       </w:r>
       <w:r>
-        <w:t xml:space="preserve">C,</w:t>
-      </w:r>
-      <w:r>
-        <w:t xml:space="preserve"> </w:t>
-      </w:r>
-      <w:r>
-        <w:t xml:space="preserve">“C. Chen et al.,</w:t>
-      </w:r>
-      <w:r>
-        <w:t xml:space="preserve"> </w:t>
-      </w:r>
-      <w:r>
-        <w:t xml:space="preserve">‘Evidence-Ledger Adjudication for Claim-Evidence Traceability,’</w:t>
-      </w:r>
-      <w:r>
-        <w:t xml:space="preserve"> </w:t>
-      </w:r>
-      <w:r>
-        <w:t xml:space="preserve">arXiv:2607.26512v1, 2026.”</w:t>
-      </w:r>
-      <w:r>
-        <w:t xml:space="preserve"> 2607년.</w:t>
+        <w:t xml:space="preserve">C. C. et al</w:t>
+      </w:r>
+      <w:r>
+        <w:t xml:space="preserve">,</w:t>
+      </w:r>
+      <w:r>
+        <w:t xml:space="preserve"> </w:t>
+      </w:r>
+      <w:r>
+        <w:t xml:space="preserve">“Evidence-Ledger Adjudication for Claim-Evidence Traceability”</w:t>
+      </w:r>
+      <w:r>
+        <w:t xml:space="preserve">. arXiv:2607.26512v1, 2026, 2026년.</w:t>
       </w:r>
     </w:p>
     <w:bookmarkEnd w:id="216"/>
@@ -8725,28 +8592,19 @@
         <w:t xml:space="preserve">	</w:t>
       </w:r>
       <w:r>
-        <w:t xml:space="preserve">X,</w:t>
-      </w:r>
-      <w:r>
-        <w:t xml:space="preserve"> </w:t>
-      </w:r>
-      <w:r>
-        <w:t xml:space="preserve">“X. Qin et al.,</w:t>
-      </w:r>
-      <w:r>
-        <w:t xml:space="preserve"> </w:t>
-      </w:r>
-      <w:r>
-        <w:t xml:space="preserve">‘What Does an Evaluation License? A Commit-Bound Census of Claim Replay,’</w:t>
-      </w:r>
-      <w:r>
-        <w:t xml:space="preserve"> </w:t>
-      </w:r>
-      <w:r>
-        <w:t xml:space="preserve">arXiv:2608.19269v4, 2026.”</w:t>
-      </w:r>
-      <w:r>
-        <w:t xml:space="preserve"> 2608년.</w:t>
+        <w:t xml:space="preserve">X. Q. et al</w:t>
+      </w:r>
+      <w:r>
+        <w:t xml:space="preserve">,</w:t>
+      </w:r>
+      <w:r>
+        <w:t xml:space="preserve"> </w:t>
+      </w:r>
+      <w:r>
+        <w:t xml:space="preserve">“What Does an Evaluation License? A Commit-Bound Census of Claim Replay”</w:t>
+      </w:r>
+      <w:r>
+        <w:t xml:space="preserve">. arXiv:2608.19269v4, 2026, 2026년.</w:t>
       </w:r>
     </w:p>
     <w:bookmarkEnd w:id="217"/>
@@ -8765,28 +8623,19 @@
         <w:t xml:space="preserve">	</w:t>
       </w:r>
       <w:r>
-        <w:t xml:space="preserve">B,</w:t>
-      </w:r>
-      <w:r>
-        <w:t xml:space="preserve"> </w:t>
-      </w:r>
-      <w:r>
-        <w:t xml:space="preserve">“B. Chen et al.,</w:t>
-      </w:r>
-      <w:r>
-        <w:t xml:space="preserve"> </w:t>
-      </w:r>
-      <w:r>
-        <w:t xml:space="preserve">‘From Runnable to Verifiable: An Independent Reproducibility Study of LLM/Agent Vulnerability Workflows,’</w:t>
-      </w:r>
-      <w:r>
-        <w:t xml:space="preserve"> </w:t>
-      </w:r>
-      <w:r>
-        <w:t xml:space="preserve">arXiv:2608.09567v1, 2026.”</w:t>
-      </w:r>
-      <w:r>
-        <w:t xml:space="preserve"> 2608년.</w:t>
+        <w:t xml:space="preserve">B. C. et al</w:t>
+      </w:r>
+      <w:r>
+        <w:t xml:space="preserve">,</w:t>
+      </w:r>
+      <w:r>
+        <w:t xml:space="preserve"> </w:t>
+      </w:r>
+      <w:r>
+        <w:t xml:space="preserve">“From Runnable to Verifiable: An Independent Reproducibility Study of LLM/Agent Vulnerability Workflows”</w:t>
+      </w:r>
+      <w:r>
+        <w:t xml:space="preserve">. arXiv:2608.09567v1, 2026, 2026년.</w:t>
       </w:r>
     </w:p>
     <w:bookmarkEnd w:id="218"/>
@@ -8805,28 +8654,19 @@
         <w:t xml:space="preserve">	</w:t>
       </w:r>
       <w:r>
-        <w:t xml:space="preserve">J,</w:t>
-      </w:r>
-      <w:r>
-        <w:t xml:space="preserve"> </w:t>
-      </w:r>
-      <w:r>
-        <w:t xml:space="preserve">“J. Ning et al.,</w:t>
-      </w:r>
-      <w:r>
-        <w:t xml:space="preserve"> </w:t>
-      </w:r>
-      <w:r>
-        <w:t xml:space="preserve">‘Same Agent, Different Answers: A Repeat-Aware Audit of Corpus-Induced Answer Churn,’</w:t>
-      </w:r>
-      <w:r>
-        <w:t xml:space="preserve"> </w:t>
-      </w:r>
-      <w:r>
-        <w:t xml:space="preserve">arXiv:2608.22856v1, 2026.”</w:t>
-      </w:r>
-      <w:r>
-        <w:t xml:space="preserve"> 2608년.</w:t>
+        <w:t xml:space="preserve">J. N. et al</w:t>
+      </w:r>
+      <w:r>
+        <w:t xml:space="preserve">,</w:t>
+      </w:r>
+      <w:r>
+        <w:t xml:space="preserve"> </w:t>
+      </w:r>
+      <w:r>
+        <w:t xml:space="preserve">“Same Agent, Different Answers: A Repeat-Aware Audit of Corpus-Induced Answer Churn”</w:t>
+      </w:r>
+      <w:r>
+        <w:t xml:space="preserve">. arXiv:2608.22856v1, 2026, 2026년.</w:t>
       </w:r>
     </w:p>
     <w:bookmarkEnd w:id="219"/>
@@ -8845,28 +8685,19 @@
         <w:t xml:space="preserve">	</w:t>
       </w:r>
       <w:r>
-        <w:t xml:space="preserve">Q,</w:t>
-      </w:r>
-      <w:r>
-        <w:t xml:space="preserve"> </w:t>
-      </w:r>
-      <w:r>
-        <w:t xml:space="preserve">“Q. Ye et al.,</w:t>
-      </w:r>
-      <w:r>
-        <w:t xml:space="preserve"> </w:t>
-      </w:r>
-      <w:r>
-        <w:t xml:space="preserve">‘Fidelity Is Not Enough: Dispatch-Level Instrumentation for Agentic Data Extraction,’</w:t>
-      </w:r>
-      <w:r>
-        <w:t xml:space="preserve"> </w:t>
-      </w:r>
-      <w:r>
-        <w:t xml:space="preserve">arXiv:2608.28439v1, 2026.”</w:t>
-      </w:r>
-      <w:r>
-        <w:t xml:space="preserve"> 2608년.</w:t>
+        <w:t xml:space="preserve">Q. Y. et al</w:t>
+      </w:r>
+      <w:r>
+        <w:t xml:space="preserve">,</w:t>
+      </w:r>
+      <w:r>
+        <w:t xml:space="preserve"> </w:t>
+      </w:r>
+      <w:r>
+        <w:t xml:space="preserve">“Fidelity Is Not Enough: Dispatch-Level Instrumentation for Agentic Data Extraction”</w:t>
+      </w:r>
+      <w:r>
+        <w:t xml:space="preserve">. arXiv:2608.28439v1, 2026, 2026년.</w:t>
       </w:r>
     </w:p>
     <w:bookmarkEnd w:id="220"/>
@@ -8885,28 +8716,19 @@
         <w:t xml:space="preserve">	</w:t>
       </w:r>
       <w:r>
-        <w:t xml:space="preserve">F,</w:t>
-      </w:r>
-      <w:r>
-        <w:t xml:space="preserve"> </w:t>
-      </w:r>
-      <w:r>
-        <w:t xml:space="preserve">“F. Sihler et al.,</w:t>
-      </w:r>
-      <w:r>
-        <w:t xml:space="preserve"> </w:t>
-      </w:r>
-      <w:r>
-        <w:t xml:space="preserve">‘Towards Automatically Inferring Constraints to Identify Implicit Assumptions in Data Analysis,’</w:t>
-      </w:r>
-      <w:r>
-        <w:t xml:space="preserve"> </w:t>
-      </w:r>
-      <w:r>
-        <w:t xml:space="preserve">arXiv:2607.03114v1, 2026.”</w:t>
-      </w:r>
-      <w:r>
-        <w:t xml:space="preserve"> 2607년.</w:t>
+        <w:t xml:space="preserve">F. S. et al</w:t>
+      </w:r>
+      <w:r>
+        <w:t xml:space="preserve">,</w:t>
+      </w:r>
+      <w:r>
+        <w:t xml:space="preserve"> </w:t>
+      </w:r>
+      <w:r>
+        <w:t xml:space="preserve">“Towards Automatically Inferring Constraints to Identify Implicit Assumptions in Data Analysis”</w:t>
+      </w:r>
+      <w:r>
+        <w:t xml:space="preserve">. arXiv:2607.03114v1, 2026, 2026년.</w:t>
       </w:r>
     </w:p>
     <w:bookmarkEnd w:id="221"/>
@@ -8925,28 +8747,19 @@
         <w:t xml:space="preserve">	</w:t>
       </w:r>
       <w:r>
-        <w:t xml:space="preserve">Y,</w:t>
-      </w:r>
-      <w:r>
-        <w:t xml:space="preserve"> </w:t>
-      </w:r>
-      <w:r>
-        <w:t xml:space="preserve">“Y. Charalambous et al.,</w:t>
-      </w:r>
-      <w:r>
-        <w:t xml:space="preserve"> </w:t>
-      </w:r>
-      <w:r>
-        <w:t xml:space="preserve">‘Partial Contracts Suffice: Sound, LLM-Inferred Regression Verification,’</w:t>
-      </w:r>
-      <w:r>
-        <w:t xml:space="preserve"> </w:t>
-      </w:r>
-      <w:r>
-        <w:t xml:space="preserve">arXiv:2607.10291v1, 2026.”</w:t>
-      </w:r>
-      <w:r>
-        <w:t xml:space="preserve"> 2607년.</w:t>
+        <w:t xml:space="preserve">Y. C. et al</w:t>
+      </w:r>
+      <w:r>
+        <w:t xml:space="preserve">,</w:t>
+      </w:r>
+      <w:r>
+        <w:t xml:space="preserve"> </w:t>
+      </w:r>
+      <w:r>
+        <w:t xml:space="preserve">“Partial Contracts Suffice: Sound, LLM-Inferred Regression Verification”</w:t>
+      </w:r>
+      <w:r>
+        <w:t xml:space="preserve">. arXiv:2607.10291v1, 2026, 2026년.</w:t>
       </w:r>
     </w:p>
     <w:bookmarkEnd w:id="222"/>
@@ -8965,28 +8778,19 @@
         <w:t xml:space="preserve">	</w:t>
       </w:r>
       <w:r>
-        <w:t xml:space="preserve">V,</w:t>
-      </w:r>
-      <w:r>
-        <w:t xml:space="preserve"> </w:t>
-      </w:r>
-      <w:r>
-        <w:t xml:space="preserve">“V. Venktesh et al.,</w:t>
-      </w:r>
-      <w:r>
-        <w:t xml:space="preserve"> </w:t>
-      </w:r>
-      <w:r>
-        <w:t xml:space="preserve">‘A Benchmark for Open-Domain Numerical Fact-Checking Enhanced by Claim Decomposition,’</w:t>
-      </w:r>
-      <w:r>
-        <w:t xml:space="preserve"> </w:t>
-      </w:r>
-      <w:r>
-        <w:t xml:space="preserve">arXiv:2510.22055v1, 2026.”</w:t>
-      </w:r>
-      <w:r>
-        <w:t xml:space="preserve"> 2026년.</w:t>
+        <w:t xml:space="preserve">V. V. et al</w:t>
+      </w:r>
+      <w:r>
+        <w:t xml:space="preserve">,</w:t>
+      </w:r>
+      <w:r>
+        <w:t xml:space="preserve"> </w:t>
+      </w:r>
+      <w:r>
+        <w:t xml:space="preserve">“A Benchmark for Open-Domain Numerical Fact-Checking Enhanced by Claim Decomposition”</w:t>
+      </w:r>
+      <w:r>
+        <w:t xml:space="preserve">. arXiv:2510.22055v1, 2026, 2026년.</w:t>
       </w:r>
     </w:p>
     <w:bookmarkEnd w:id="223"/>
@@ -9005,28 +8809,19 @@
         <w:t xml:space="preserve">	</w:t>
       </w:r>
       <w:r>
-        <w:t xml:space="preserve">P,</w:t>
-      </w:r>
-      <w:r>
-        <w:t xml:space="preserve"> </w:t>
-      </w:r>
-      <w:r>
-        <w:t xml:space="preserve">“P. P. Paul et al.,</w:t>
-      </w:r>
-      <w:r>
-        <w:t xml:space="preserve"> </w:t>
-      </w:r>
-      <w:r>
-        <w:t xml:space="preserve">‘Beyond Coverage and Kill Scores: Empirically Measuring Test Suite Behavioural Validation,’</w:t>
-      </w:r>
-      <w:r>
-        <w:t xml:space="preserve"> </w:t>
-      </w:r>
-      <w:r>
-        <w:t xml:space="preserve">arXiv:2606.10417v1, 2026.”</w:t>
-      </w:r>
-      <w:r>
-        <w:t xml:space="preserve"> 2606년.</w:t>
+        <w:t xml:space="preserve">P. P. P. et al</w:t>
+      </w:r>
+      <w:r>
+        <w:t xml:space="preserve">,</w:t>
+      </w:r>
+      <w:r>
+        <w:t xml:space="preserve"> </w:t>
+      </w:r>
+      <w:r>
+        <w:t xml:space="preserve">“Beyond Coverage and Kill Scores: Empirically Measuring Test Suite Behavioural Validation”</w:t>
+      </w:r>
+      <w:r>
+        <w:t xml:space="preserve">. arXiv:2606.10417v1, 2026, 2026년.</w:t>
       </w:r>
     </w:p>
     <w:bookmarkEnd w:id="224"/>
@@ -9045,28 +8840,19 @@
         <w:t xml:space="preserve">	</w:t>
       </w:r>
       <w:r>
-        <w:t xml:space="preserve">P,</w:t>
-      </w:r>
-      <w:r>
-        <w:t xml:space="preserve"> </w:t>
-      </w:r>
-      <w:r>
-        <w:t xml:space="preserve">“P. Bajaj et al.,</w:t>
-      </w:r>
-      <w:r>
-        <w:t xml:space="preserve"> </w:t>
-      </w:r>
-      <w:r>
-        <w:t xml:space="preserve">‘Evaluation Blindness: How Silent Measurement Failures Corrupt AI Systems,’</w:t>
-      </w:r>
-      <w:r>
-        <w:t xml:space="preserve"> </w:t>
-      </w:r>
-      <w:r>
-        <w:t xml:space="preserve">arXiv:2608.02786v1, 2026.”</w:t>
-      </w:r>
-      <w:r>
-        <w:t xml:space="preserve"> 2608년.</w:t>
+        <w:t xml:space="preserve">P. B. et al</w:t>
+      </w:r>
+      <w:r>
+        <w:t xml:space="preserve">,</w:t>
+      </w:r>
+      <w:r>
+        <w:t xml:space="preserve"> </w:t>
+      </w:r>
+      <w:r>
+        <w:t xml:space="preserve">“Evaluation Blindness: How Silent Measurement Failures Corrupt AI Systems”</w:t>
+      </w:r>
+      <w:r>
+        <w:t xml:space="preserve">. arXiv:2608.02786v1, 2026, 2026년.</w:t>
       </w:r>
     </w:p>
     <w:bookmarkEnd w:id="225"/>
@@ -9085,28 +8871,19 @@
         <w:t xml:space="preserve">	</w:t>
       </w:r>
       <w:r>
-        <w:t xml:space="preserve">Y,</w:t>
-      </w:r>
-      <w:r>
-        <w:t xml:space="preserve"> </w:t>
-      </w:r>
-      <w:r>
-        <w:t xml:space="preserve">“Y. Pei et al.,</w:t>
-      </w:r>
-      <w:r>
-        <w:t xml:space="preserve"> </w:t>
-      </w:r>
-      <w:r>
-        <w:t xml:space="preserve">‘Assessing Behavioral Validation in UI Component Test Suites Using Inferred Metamorphic Relations,’</w:t>
-      </w:r>
-      <w:r>
-        <w:t xml:space="preserve"> </w:t>
-      </w:r>
-      <w:r>
-        <w:t xml:space="preserve">arXiv:2608.03337v1, 2026.”</w:t>
-      </w:r>
-      <w:r>
-        <w:t xml:space="preserve"> 2608년.</w:t>
+        <w:t xml:space="preserve">Y. P. et al</w:t>
+      </w:r>
+      <w:r>
+        <w:t xml:space="preserve">,</w:t>
+      </w:r>
+      <w:r>
+        <w:t xml:space="preserve"> </w:t>
+      </w:r>
+      <w:r>
+        <w:t xml:space="preserve">“Assessing Behavioral Validation in UI Component Test Suites Using Inferred Metamorphic Relations”</w:t>
+      </w:r>
+      <w:r>
+        <w:t xml:space="preserve">. arXiv:2608.03337v1, 2026, 2026년.</w:t>
       </w:r>
     </w:p>
     <w:bookmarkEnd w:id="226"/>
@@ -9125,28 +8902,19 @@
         <w:t xml:space="preserve">	</w:t>
       </w:r>
       <w:r>
-        <w:t xml:space="preserve">M,</w:t>
-      </w:r>
-      <w:r>
-        <w:t xml:space="preserve"> </w:t>
-      </w:r>
-      <w:r>
-        <w:t xml:space="preserve">“M. Jiang et al.,</w:t>
-      </w:r>
-      <w:r>
-        <w:t xml:space="preserve"> </w:t>
-      </w:r>
-      <w:r>
-        <w:t xml:space="preserve">‘Delta Debugging in the Absence of Test Oracles Through Metamorphic Testing,’</w:t>
-      </w:r>
-      <w:r>
-        <w:t xml:space="preserve"> </w:t>
-      </w:r>
-      <w:r>
-        <w:t xml:space="preserve">arXiv:2607.00929v1, 2026.”</w:t>
-      </w:r>
-      <w:r>
-        <w:t xml:space="preserve"> 2607년.</w:t>
+        <w:t xml:space="preserve">M. J. et al</w:t>
+      </w:r>
+      <w:r>
+        <w:t xml:space="preserve">,</w:t>
+      </w:r>
+      <w:r>
+        <w:t xml:space="preserve"> </w:t>
+      </w:r>
+      <w:r>
+        <w:t xml:space="preserve">“Delta Debugging in the Absence of Test Oracles Through Metamorphic Testing”</w:t>
+      </w:r>
+      <w:r>
+        <w:t xml:space="preserve">. arXiv:2607.00929v1, 2026, 2026년.</w:t>
       </w:r>
     </w:p>
     <w:bookmarkEnd w:id="227"/>
@@ -9165,28 +8933,19 @@
         <w:t xml:space="preserve">	</w:t>
       </w:r>
       <w:r>
-        <w:t xml:space="preserve">A,</w:t>
-      </w:r>
-      <w:r>
-        <w:t xml:space="preserve"> </w:t>
-      </w:r>
-      <w:r>
-        <w:t xml:space="preserve">“A. Canedo et al.,</w:t>
-      </w:r>
-      <w:r>
-        <w:t xml:space="preserve"> </w:t>
-      </w:r>
-      <w:r>
-        <w:t xml:space="preserve">‘Oracles That Cannot Fail: Anchoring and the Expectation That Moves With the System,’</w:t>
-      </w:r>
-      <w:r>
-        <w:t xml:space="preserve"> </w:t>
-      </w:r>
-      <w:r>
-        <w:t xml:space="preserve">arXiv:2608.17214v1, 2026.”</w:t>
-      </w:r>
-      <w:r>
-        <w:t xml:space="preserve"> 2608년.</w:t>
+        <w:t xml:space="preserve">A. C. et al</w:t>
+      </w:r>
+      <w:r>
+        <w:t xml:space="preserve">,</w:t>
+      </w:r>
+      <w:r>
+        <w:t xml:space="preserve"> </w:t>
+      </w:r>
+      <w:r>
+        <w:t xml:space="preserve">“Oracles That Cannot Fail: Anchoring and the Expectation That Moves With the System”</w:t>
+      </w:r>
+      <w:r>
+        <w:t xml:space="preserve">. arXiv:2608.17214v1, 2026, 2026년.</w:t>
       </w:r>
     </w:p>
     <w:bookmarkEnd w:id="228"/>
@@ -9214,7 +8973,7 @@
         <w:t xml:space="preserve">“Auditing the Audit: Five Failure Modes in Benchmark-Validity Audits”</w:t>
       </w:r>
       <w:r>
-        <w:t xml:space="preserve">. ArXiv preprint arXiv:2607.02586v1, 2026., 2607년. Available at:</w:t>
+        <w:t xml:space="preserve">. ArXiv preprint arXiv:2607.02586v1, 2026., 2026년. Available at:</w:t>
       </w:r>
       <w:r>
         <w:t xml:space="preserve"> </w:t>
@@ -9244,28 +9003,19 @@
         <w:t xml:space="preserve">	</w:t>
       </w:r>
       <w:r>
-        <w:t xml:space="preserve">Y,</w:t>
-      </w:r>
-      <w:r>
-        <w:t xml:space="preserve"> </w:t>
-      </w:r>
-      <w:r>
-        <w:t xml:space="preserve">“Y. Li et al.,</w:t>
-      </w:r>
-      <w:r>
-        <w:t xml:space="preserve"> </w:t>
-      </w:r>
-      <w:r>
-        <w:t xml:space="preserve">‘Beyond Final Scores: A Systematic Evaluation of Agents for Long-Horizon AI Research,’</w:t>
-      </w:r>
-      <w:r>
-        <w:t xml:space="preserve"> </w:t>
-      </w:r>
-      <w:r>
-        <w:t xml:space="preserve">arXiv:2608.13417v1, 2026.”</w:t>
-      </w:r>
-      <w:r>
-        <w:t xml:space="preserve"> 2608년.</w:t>
+        <w:t xml:space="preserve">Y. L. et al</w:t>
+      </w:r>
+      <w:r>
+        <w:t xml:space="preserve">,</w:t>
+      </w:r>
+      <w:r>
+        <w:t xml:space="preserve"> </w:t>
+      </w:r>
+      <w:r>
+        <w:t xml:space="preserve">“Beyond Final Scores: A Systematic Evaluation of Agents for Long-Horizon AI Research”</w:t>
+      </w:r>
+      <w:r>
+        <w:t xml:space="preserve">. arXiv:2608.13417v1, 2026, 2026년.</w:t>
       </w:r>
     </w:p>
     <w:bookmarkEnd w:id="231"/>
@@ -9284,28 +9034,19 @@
         <w:t xml:space="preserve">	</w:t>
       </w:r>
       <w:r>
-        <w:t xml:space="preserve">J,</w:t>
-      </w:r>
-      <w:r>
-        <w:t xml:space="preserve"> </w:t>
-      </w:r>
-      <w:r>
-        <w:t xml:space="preserve">“J. M. Mikhaeil et al.,</w:t>
-      </w:r>
-      <w:r>
-        <w:t xml:space="preserve"> </w:t>
-      </w:r>
-      <w:r>
-        <w:t xml:space="preserve">‘The Sequential Nature of Science: Quantifying Learning from a Sequence of Studies,’</w:t>
-      </w:r>
-      <w:r>
-        <w:t xml:space="preserve"> </w:t>
-      </w:r>
-      <w:r>
-        <w:t xml:space="preserve">arXiv:2511.14996v1, 2025.”</w:t>
-      </w:r>
-      <w:r>
-        <w:t xml:space="preserve"> 2025년.</w:t>
+        <w:t xml:space="preserve">J. M. M. et al</w:t>
+      </w:r>
+      <w:r>
+        <w:t xml:space="preserve">,</w:t>
+      </w:r>
+      <w:r>
+        <w:t xml:space="preserve"> </w:t>
+      </w:r>
+      <w:r>
+        <w:t xml:space="preserve">“The Sequential Nature of Science: Quantifying Learning from a Sequence of Studies”</w:t>
+      </w:r>
+      <w:r>
+        <w:t xml:space="preserve">. arXiv:2511.14996v1, 2025, 2025년.</w:t>
       </w:r>
     </w:p>
     <w:bookmarkEnd w:id="232"/>
@@ -9324,28 +9065,16 @@
         <w:t xml:space="preserve">	</w:t>
       </w:r>
       <w:r>
-        <w:t xml:space="preserve">T,</w:t>
-      </w:r>
-      <w:r>
-        <w:t xml:space="preserve"> </w:t>
-      </w:r>
-      <w:r>
-        <w:t xml:space="preserve">“T. Nguyen,</w:t>
-      </w:r>
-      <w:r>
-        <w:t xml:space="preserve"> </w:t>
-      </w:r>
-      <w:r>
-        <w:t xml:space="preserve">‘The Role of Rigor in Artificial Intelligence,’</w:t>
-      </w:r>
-      <w:r>
-        <w:t xml:space="preserve"> </w:t>
-      </w:r>
-      <w:r>
-        <w:t xml:space="preserve">arXiv:2607.03634v1, 2026.”</w:t>
-      </w:r>
-      <w:r>
-        <w:t xml:space="preserve"> 2607년.</w:t>
+        <w:t xml:space="preserve">T. Nguyen,</w:t>
+      </w:r>
+      <w:r>
+        <w:t xml:space="preserve"> </w:t>
+      </w:r>
+      <w:r>
+        <w:t xml:space="preserve">“The Role of Rigor in Artificial Intelligence”</w:t>
+      </w:r>
+      <w:r>
+        <w:t xml:space="preserve">. arXiv:2607.03634v1, 2026, 2026년.</w:t>
       </w:r>
     </w:p>
     <w:bookmarkEnd w:id="233"/>
@@ -9373,7 +9102,7 @@
         <w:t xml:space="preserve">“Preregistration for Experiments with AI Agents”</w:t>
       </w:r>
       <w:r>
-        <w:t xml:space="preserve">. ArXiv preprint arXiv:2606.11217v1, 2026., 2606년. Available at:</w:t>
+        <w:t xml:space="preserve">. ArXiv preprint arXiv:2606.11217v1, 2026., 2026년. Available at:</w:t>
       </w:r>
       <w:r>
         <w:t xml:space="preserve"> </w:t>
@@ -9403,28 +9132,19 @@
         <w:t xml:space="preserve">	</w:t>
       </w:r>
       <w:r>
-        <w:t xml:space="preserve">H,</w:t>
-      </w:r>
-      <w:r>
-        <w:t xml:space="preserve"> </w:t>
-      </w:r>
-      <w:r>
-        <w:t xml:space="preserve">“H. Li et al.,</w:t>
-      </w:r>
-      <w:r>
-        <w:t xml:space="preserve"> </w:t>
-      </w:r>
-      <w:r>
-        <w:t xml:space="preserve">‘When Representative Samples Produce Worse Outcomes: Scale-up Decisions from Small Randomized Trials,’</w:t>
-      </w:r>
-      <w:r>
-        <w:t xml:space="preserve"> </w:t>
-      </w:r>
-      <w:r>
-        <w:t xml:space="preserve">arXiv:2606.13531v1, 2026.”</w:t>
-      </w:r>
-      <w:r>
-        <w:t xml:space="preserve"> 2606년.</w:t>
+        <w:t xml:space="preserve">H. L. et al</w:t>
+      </w:r>
+      <w:r>
+        <w:t xml:space="preserve">,</w:t>
+      </w:r>
+      <w:r>
+        <w:t xml:space="preserve"> </w:t>
+      </w:r>
+      <w:r>
+        <w:t xml:space="preserve">“When Representative Samples Produce Worse Outcomes: Scale-up Decisions from Small Randomized Trials”</w:t>
+      </w:r>
+      <w:r>
+        <w:t xml:space="preserve">. arXiv:2606.13531v1, 2026, 2026년.</w:t>
       </w:r>
     </w:p>
     <w:bookmarkEnd w:id="236"/>
@@ -9452,7 +9172,7 @@
         <w:t xml:space="preserve">“LLMs Have Made Failure Worth Publishing”</w:t>
       </w:r>
       <w:r>
-        <w:t xml:space="preserve">. ArXiv preprint arXiv:2604.06236v1, 2026., 2604년. Available at:</w:t>
+        <w:t xml:space="preserve">. ArXiv preprint arXiv:2604.06236v1, 2026., 2026년. Available at:</w:t>
       </w:r>
       <w:r>
         <w:t xml:space="preserve"> </w:t>
@@ -9491,7 +9211,7 @@
         <w:t xml:space="preserve">“How Do Agents Fail on AutoResearch: End-to-End Diagnostic Evaluation on 100 Real-World Frontier Research Tasks”</w:t>
       </w:r>
       <w:r>
-        <w:t xml:space="preserve">. ArXiv preprint arXiv:2608.14905v3, 2026., 2608년. Available at:</w:t>
+        <w:t xml:space="preserve">. ArXiv preprint arXiv:2608.14905v3, 2026., 2026년. Available at:</w:t>
       </w:r>
       <w:r>
         <w:t xml:space="preserve"> </w:t>
@@ -9530,7 +9250,7 @@
         <w:t xml:space="preserve">“AI Evaluation Should Measure Verification Cost, Not Correctness Alone”</w:t>
       </w:r>
       <w:r>
-        <w:t xml:space="preserve">. ArXiv preprint arXiv:2608.08709v1, 2026., 2608년. Available at:</w:t>
+        <w:t xml:space="preserve">. ArXiv preprint arXiv:2608.08709v1, 2026., 2026년. Available at:</w:t>
       </w:r>
       <w:r>
         <w:t xml:space="preserve"> </w:t>

</xml_diff>

<commit_message>
docs(paper): reframe results as a measurement chapter and add the preregistered-but-unexecuted harness benchmark (RD-2026-09-03-85A)
</commit_message>
<xml_diff>
--- a/paper/word/graduation-thesis.docx
+++ b/paper/word/graduation-thesis.docx
@@ -438,7 +438,7 @@
           <w:rPr>
             <w:rStyle w:val="Hyperlink"/>
           </w:rPr>
-          <w:t xml:space="preserve">표 4</w:t>
+          <w:t xml:space="preserve">표 5</w:t>
         </w:r>
       </w:hyperlink>
       <w:r>
@@ -1898,7 +1898,7 @@
     </w:p>
     <w:bookmarkEnd w:id="34"/>
     <w:bookmarkEnd w:id="35"/>
-    <w:bookmarkStart w:id="65" w:name="proposed-method"/>
+    <w:bookmarkStart w:id="67" w:name="proposed-method"/>
     <w:p>
       <w:pPr>
         <w:pStyle w:val="Heading1"/>
@@ -3672,23 +3672,13 @@
       </w:r>
     </w:p>
     <w:bookmarkEnd w:id="64"/>
-    <w:bookmarkEnd w:id="65"/>
-    <w:bookmarkStart w:id="88" w:name="experimental-results"/>
-    <w:p>
-      <w:pPr>
-        <w:pStyle w:val="Heading1"/>
-      </w:pPr>
-      <w:r>
-        <w:t xml:space="preserve">Ⅳ. Experimental Results</w:t>
-      </w:r>
-    </w:p>
-    <w:bookmarkStart w:id="66" w:name="실행된-블록"/>
+    <w:bookmarkStart w:id="66" w:name="하네스-구성-벤치마크-설계-study-b"/>
     <w:p>
       <w:pPr>
         <w:pStyle w:val="Heading2"/>
       </w:pPr>
       <w:r>
-        <w:t xml:space="preserve">1. 실행된 블록</w:t>
+        <w:t xml:space="preserve">8. 하네스 구성 벤치마크 설계 (Study B)</w:t>
       </w:r>
     </w:p>
     <w:p>
@@ -3696,7 +3686,7 @@
         <w:pStyle w:val="FirstParagraph"/>
       </w:pPr>
       <w:r>
-        <w:t xml:space="preserve">본 장의 모든 정량적 수치는 실제 실행된 16개 장기 연구 에피소드와 521회의 판정 모델 호출로부터 도출되었으며, 커밋된 아티팩트 영수증(receipt)에서 바이트 단위로 재유도된다. 본 실험의 핵심 결론은 분명하다.</w:t>
+        <w:t xml:space="preserve">Study A는 하나의 하네스 안에서 두 요인을 흔든다. 그러나 이 논문이 답하려는 질문은 더 앞에 있다.</w:t>
       </w:r>
       <w:r>
         <w:t xml:space="preserve"> </w:t>
@@ -3706,117 +3696,80 @@
           <w:b/>
           <w:bCs/>
         </w:rPr>
-        <w:t xml:space="preserve">단서 기반 채점 도구는 38.9%의 오판율을 가지며, 처치 간 분산 성분(초기 단서 채점 0.009, 수리 후 전수 채점 0.026)을 거의 감지하지 못하는 계측 불감증을 보였다.</w:t>
-      </w:r>
-      <w:r>
-        <w:t xml:space="preserve"> </w:t>
-      </w:r>
-      <w:r>
-        <w:t xml:space="preserve">따라서 본 연구는 부정확한 도구에 기댄 인위적 효과 추정을 거부하고, 도구 결함의 구조적 원인을 정량적으로 규명한다.</w:t>
+        <w:t xml:space="preserve">모델을 고정했을 때, 그 주위에 두르는 하네스 구성요소가 연구 과제의 결과를 바꾸는가. 바꾼다면 어느 성분이 바꾸는가.</w:t>
+      </w:r>
+      <w:r>
+        <w:t xml:space="preserve"> </w:t>
+      </w:r>
+      <w:r>
+        <w:t xml:space="preserve">Study B는 이 질문을 성분 절제(ablation)로 분해한다. 구성요소 귀속 방법론은 선행 하네스 비교 연구를 따른다</w:t>
+      </w:r>
+      <w:r>
+        <w:t xml:space="preserve"> </w:t>
+      </w:r>
+      <w:r>
+        <w:t xml:space="preserve">[35], [52], [53]</w:t>
+      </w:r>
+      <w:r>
+        <w:t xml:space="preserve">.</w:t>
       </w:r>
     </w:p>
     <w:p>
       <w:pPr>
         <w:pStyle w:val="BodyText"/>
       </w:pPr>
-      <w:r>
-        <w:t xml:space="preserve">확인 블록은 두 과제와 네 조건에 걸쳐 16개 에피소드로 구성되며, 그중 15건이 엄격한 자원 상한과 무결성 기준을 통과하여 채점 자격을 얻었다.</w:t>
-      </w:r>
-    </w:p>
-    <w:bookmarkEnd w:id="66"/>
-    <w:bookmarkStart w:id="71" w:name="채점-도구의-반증과-적대적-검증"/>
-    <w:p>
-      <w:pPr>
-        <w:pStyle w:val="Heading2"/>
-      </w:pPr>
-      <w:r>
-        <w:t xml:space="preserve">2. 채점 도구의 반증과 적대적 검증</w:t>
-      </w:r>
-    </w:p>
-    <w:p>
-      <w:pPr>
-        <w:pStyle w:val="FirstParagraph"/>
-      </w:pPr>
-      <w:r>
-        <w:t xml:space="preserve">체크리스트 기반 접지 채점</w:t>
-      </w:r>
-      <w:r>
-        <w:t xml:space="preserve"> </w:t>
-      </w:r>
-      <w:r>
-        <w:t xml:space="preserve">[52]</w:t>
-      </w:r>
-      <w:r>
-        <w:t xml:space="preserve"> </w:t>
-      </w:r>
-      <w:r>
-        <w:t xml:space="preserve">방식은 객관적으로 보이지만, 단서 누설과 우회 전략(solution hacking)에 극도로 취약하다</w:t>
-      </w:r>
-      <w:r>
-        <w:t xml:space="preserve"> </w:t>
-      </w:r>
-      <w:r>
-        <w:t xml:space="preserve">[53]</w:t>
-      </w:r>
-      <w:r>
-        <w:t xml:space="preserve">. 의도적으로 심어둔 지름길을 감지하는 적대적 검증</w:t>
-      </w:r>
-      <w:r>
-        <w:t xml:space="preserve"> </w:t>
-      </w:r>
-      <w:r>
-        <w:t xml:space="preserve">[54]</w:t>
-      </w:r>
-      <w:r>
-        <w:t xml:space="preserve"> </w:t>
-      </w:r>
-      <w:r>
-        <w:t xml:space="preserve">을 통해, 단서 매칭이 실제 설계 속성이 아니라 지시문에 포함된 표현을 재인용한 문장에 점수를 부여하는 구성 타당도(construct validity) 결함을 입증했다</w:t>
-      </w:r>
-      <w:r>
-        <w:t xml:space="preserve"> </w:t>
-      </w:r>
-      <w:r>
-        <w:t xml:space="preserve">[55]</w:t>
-      </w:r>
-      <w:r>
-        <w:t xml:space="preserve">.</w:t>
-      </w:r>
-    </w:p>
-    <w:p>
-      <w:pPr>
-        <w:pStyle w:val="BodyText"/>
-      </w:pPr>
-      <w:hyperlink w:anchor="tbl-falsify">
+      <w:hyperlink w:anchor="tbl-mechanisms">
         <w:r>
           <w:rPr>
             <w:rStyle w:val="Hyperlink"/>
           </w:rPr>
-          <w:t xml:space="preserve">표 1</w:t>
+          <w:t xml:space="preserve">표 4</w:t>
         </w:r>
       </w:hyperlink>
       <w:r>
         <w:t xml:space="preserve"> </w:t>
       </w:r>
       <w:r>
-        <w:t xml:space="preserve">에서 보았듯 파이프라인 부정 판정 18건 중 7건이 전체 산출물 재판정에서 뒤집혔다. 이 오류는 무작위가 아니라 한 방향으로 기운다. 단서 검색이 실패하면 판정은 항상 부정이 되고, 모델은 호출조차 되지 않는다.</w:t>
-      </w:r>
-      <w:r>
-        <w:t xml:space="preserve"> </w:t>
-      </w:r>
-      <w:hyperlink w:anchor="fig-scoring">
-        <w:r>
-          <w:rPr>
-            <w:rStyle w:val="Hyperlink"/>
-          </w:rPr>
-          <w:t xml:space="preserve">그림 8</w:t>
-        </w:r>
-      </w:hyperlink>
-      <w:r>
-        <w:t xml:space="preserve"> </w:t>
-      </w:r>
-      <w:r>
-        <w:t xml:space="preserve">은 두 채점 경로와 20% 하위표본 드리프트 검사를 보인다.</w:t>
+        <w:t xml:space="preserve">은 벤치마크 대상이 되는 일곱 메커니즘과 각각을 제거하는 아암을 정리한다. 조사 문헌은</w:t>
+      </w:r>
+      <w:r>
+        <w:t xml:space="preserve"> </w:t>
+      </w:r>
+      <w:r>
+        <w:t xml:space="preserve">개별 에이전트를</w:t>
+      </w:r>
+      <w:r>
+        <w:t xml:space="preserve"> </w:t>
+      </w:r>
+      <w:r>
+        <w:rPr>
+          <w:rStyle w:val="VerbatimChar"/>
+        </w:rPr>
+        <w:t xml:space="preserve">Loop(LLM + Harness)</w:t>
+      </w:r>
+      <w:r>
+        <w:t xml:space="preserve">로 형식화하고, 도구·기억·기술을 통합하는 하네스 설계와 계획·행동·관찰·적응의</w:t>
+      </w:r>
+      <w:r>
+        <w:t xml:space="preserve"> </w:t>
+      </w:r>
+      <w:r>
+        <w:t xml:space="preserve">반복 주기를 조직하는 루프 설계를 구분하며, 그 위에 그래프 추상화를 얹는 층위를 제시한다</w:t>
+      </w:r>
+      <w:r>
+        <w:t xml:space="preserve"> </w:t>
+      </w:r>
+      <w:r>
+        <w:t xml:space="preserve">[54]</w:t>
+      </w:r>
+      <w:r>
+        <w:t xml:space="preserve">.</w:t>
+      </w:r>
+      <w:r>
+        <w:t xml:space="preserve"> </w:t>
+      </w:r>
+      <w:r>
+        <w:t xml:space="preserve">본 연구는 이 구분을 그대로 실험 축으로 삼는다.</w:t>
       </w:r>
     </w:p>
     <w:tbl>
@@ -3832,7 +3785,720 @@
       <w:tr>
         <w:tc>
           <w:tcPr/>
-          <w:bookmarkStart w:id="70" w:name="fig-scoring"/>
+          <w:bookmarkStart w:id="65" w:name="tbl-mechanisms"/>
+          <w:p>
+            <w:pPr>
+              <w:jc w:val="center"/>
+            </w:pPr>
+            <w:pPr>
+              <w:jc w:val="left"/>
+              <w:spacing w:before="200"/>
+              <w:pStyle w:val="ImageCaption"/>
+            </w:pPr>
+            <w:r>
+              <w:t xml:space="preserve">표 4. 벤치마크 대상 메커니즘과 절제 아암</w:t>
+            </w:r>
+          </w:p>
+          <w:tbl>
+            <w:tblPr>
+              <w:tblStyle w:val="Table"/>
+              <w:tblW w:type="auto" w:w="0"/>
+              <w:tblLook w:firstRow="1" w:lastRow="0" w:firstColumn="0" w:lastColumn="0" w:noHBand="0" w:noVBand="0" w:val="0020"/>
+            </w:tblPr>
+            <w:tblGrid>
+              <w:gridCol w:w="1980"/>
+              <w:gridCol w:w="1980"/>
+              <w:gridCol w:w="1980"/>
+              <w:gridCol w:w="1980"/>
+            </w:tblGrid>
+            <w:tr>
+              <w:trPr>
+                <w:tblHeader w:val="on"/>
+              </w:trPr>
+              <w:tc>
+                <w:tcPr/>
+                <w:p>
+                  <w:pPr>
+                    <w:pStyle w:val="Compact"/>
+                    <w:jc w:val="center"/>
+                  </w:pPr>
+                  <w:r>
+                    <w:t xml:space="preserve">메커니즘</w:t>
+                  </w:r>
+                </w:p>
+              </w:tc>
+              <w:tc>
+                <w:tcPr/>
+                <w:p>
+                  <w:pPr>
+                    <w:pStyle w:val="Compact"/>
+                    <w:jc w:val="right"/>
+                    <w:jc w:val="center"/>
+                  </w:pPr>
+                  <w:r>
+                    <w:t xml:space="preserve">정독 출처 수</w:t>
+                  </w:r>
+                </w:p>
+              </w:tc>
+              <w:tc>
+                <w:tcPr/>
+                <w:p>
+                  <w:pPr>
+                    <w:pStyle w:val="Compact"/>
+                    <w:jc w:val="center"/>
+                  </w:pPr>
+                  <w:r>
+                    <w:t xml:space="preserve">구현 아암</w:t>
+                  </w:r>
+                </w:p>
+              </w:tc>
+              <w:tc>
+                <w:tcPr/>
+                <w:p>
+                  <w:pPr>
+                    <w:pStyle w:val="Compact"/>
+                    <w:jc w:val="center"/>
+                  </w:pPr>
+                  <w:r>
+                    <w:t xml:space="preserve">절제 아암</w:t>
+                  </w:r>
+                </w:p>
+              </w:tc>
+            </w:tr>
+            <w:tr>
+              <w:tc>
+                <w:tcPr/>
+                <w:p>
+                  <w:pPr>
+                    <w:pStyle w:val="Compact"/>
+                    <w:jc w:val="center"/>
+                  </w:pPr>
+                  <w:r>
+                    <w:t xml:space="preserve">최소 도구 코딩 하네스</w:t>
+                  </w:r>
+                </w:p>
+              </w:tc>
+              <w:tc>
+                <w:tcPr/>
+                <w:p>
+                  <w:pPr>
+                    <w:pStyle w:val="Compact"/>
+                    <w:jc w:val="right"/>
+                    <w:jc w:val="center"/>
+                  </w:pPr>
+                  <w:r>
+                    <w:t xml:space="preserve">3</w:t>
+                  </w:r>
+                </w:p>
+              </w:tc>
+              <w:tc>
+                <w:tcPr/>
+                <w:p>
+                  <w:pPr>
+                    <w:pStyle w:val="Compact"/>
+                    <w:jc w:val="center"/>
+                  </w:pPr>
+                  <w:r>
+                    <w:t xml:space="preserve">B0</w:t>
+                  </w:r>
+                </w:p>
+              </w:tc>
+              <w:tc>
+                <w:tcPr/>
+                <w:p>
+                  <w:pPr>
+                    <w:pStyle w:val="Compact"/>
+                    <w:jc w:val="center"/>
+                  </w:pPr>
+                  <w:r>
+                    <w:t xml:space="preserve">—</w:t>
+                  </w:r>
+                </w:p>
+              </w:tc>
+            </w:tr>
+            <w:tr>
+              <w:tc>
+                <w:tcPr/>
+                <w:p>
+                  <w:pPr>
+                    <w:pStyle w:val="Compact"/>
+                    <w:jc w:val="center"/>
+                  </w:pPr>
+                  <w:r>
+                    <w:t xml:space="preserve">영속 REPL·재귀 언어모델 하네스</w:t>
+                  </w:r>
+                </w:p>
+              </w:tc>
+              <w:tc>
+                <w:tcPr/>
+                <w:p>
+                  <w:pPr>
+                    <w:pStyle w:val="Compact"/>
+                    <w:jc w:val="right"/>
+                    <w:jc w:val="center"/>
+                  </w:pPr>
+                  <w:r>
+                    <w:t xml:space="preserve">3</w:t>
+                  </w:r>
+                </w:p>
+              </w:tc>
+              <w:tc>
+                <w:tcPr/>
+                <w:p>
+                  <w:pPr>
+                    <w:pStyle w:val="Compact"/>
+                    <w:jc w:val="center"/>
+                  </w:pPr>
+                  <w:r>
+                    <w:t xml:space="preserve">B1</w:t>
+                  </w:r>
+                </w:p>
+              </w:tc>
+              <w:tc>
+                <w:tcPr/>
+                <w:p>
+                  <w:pPr>
+                    <w:pStyle w:val="Compact"/>
+                    <w:jc w:val="center"/>
+                  </w:pPr>
+                  <w:r>
+                    <w:t xml:space="preserve">—</w:t>
+                  </w:r>
+                </w:p>
+              </w:tc>
+            </w:tr>
+            <w:tr>
+              <w:tc>
+                <w:tcPr/>
+                <w:p>
+                  <w:pPr>
+                    <w:pStyle w:val="Compact"/>
+                    <w:jc w:val="center"/>
+                  </w:pPr>
+                  <w:r>
+                    <w:t xml:space="preserve">페일클로즈드 연구 수명주기 게이트</w:t>
+                  </w:r>
+                </w:p>
+              </w:tc>
+              <w:tc>
+                <w:tcPr/>
+                <w:p>
+                  <w:pPr>
+                    <w:pStyle w:val="Compact"/>
+                    <w:jc w:val="right"/>
+                    <w:jc w:val="center"/>
+                  </w:pPr>
+                  <w:r>
+                    <w:t xml:space="preserve">3</w:t>
+                  </w:r>
+                </w:p>
+              </w:tc>
+              <w:tc>
+                <w:tcPr/>
+                <w:p>
+                  <w:pPr>
+                    <w:pStyle w:val="Compact"/>
+                    <w:jc w:val="center"/>
+                  </w:pPr>
+                  <w:r>
+                    <w:t xml:space="preserve">B2</w:t>
+                  </w:r>
+                </w:p>
+              </w:tc>
+              <w:tc>
+                <w:tcPr/>
+                <w:p>
+                  <w:pPr>
+                    <w:pStyle w:val="Compact"/>
+                    <w:jc w:val="center"/>
+                  </w:pPr>
+                  <w:r>
+                    <w:t xml:space="preserve">B2-P</w:t>
+                  </w:r>
+                </w:p>
+              </w:tc>
+            </w:tr>
+            <w:tr>
+              <w:tc>
+                <w:tcPr/>
+                <w:p>
+                  <w:pPr>
+                    <w:pStyle w:val="Compact"/>
+                    <w:jc w:val="center"/>
+                  </w:pPr>
+                  <w:r>
+                    <w:t xml:space="preserve">결과 주도 웹·의미 검색</w:t>
+                  </w:r>
+                </w:p>
+              </w:tc>
+              <w:tc>
+                <w:tcPr/>
+                <w:p>
+                  <w:pPr>
+                    <w:pStyle w:val="Compact"/>
+                    <w:jc w:val="right"/>
+                    <w:jc w:val="center"/>
+                  </w:pPr>
+                  <w:r>
+                    <w:t xml:space="preserve">4</w:t>
+                  </w:r>
+                </w:p>
+              </w:tc>
+              <w:tc>
+                <w:tcPr/>
+                <w:p>
+                  <w:pPr>
+                    <w:pStyle w:val="Compact"/>
+                    <w:jc w:val="center"/>
+                  </w:pPr>
+                  <w:r>
+                    <w:t xml:space="preserve">B2</w:t>
+                  </w:r>
+                </w:p>
+              </w:tc>
+              <w:tc>
+                <w:tcPr/>
+                <w:p>
+                  <w:pPr>
+                    <w:pStyle w:val="Compact"/>
+                    <w:jc w:val="center"/>
+                  </w:pPr>
+                  <w:r>
+                    <w:t xml:space="preserve">B2-R</w:t>
+                  </w:r>
+                </w:p>
+              </w:tc>
+            </w:tr>
+            <w:tr>
+              <w:tc>
+                <w:tcPr/>
+                <w:p>
+                  <w:pPr>
+                    <w:pStyle w:val="Compact"/>
+                    <w:jc w:val="center"/>
+                  </w:pPr>
+                  <w:r>
+                    <w:t xml:space="preserve">타입 있는 연구 컨텍스트 그래프</w:t>
+                  </w:r>
+                </w:p>
+              </w:tc>
+              <w:tc>
+                <w:tcPr/>
+                <w:p>
+                  <w:pPr>
+                    <w:pStyle w:val="Compact"/>
+                    <w:jc w:val="right"/>
+                    <w:jc w:val="center"/>
+                  </w:pPr>
+                  <w:r>
+                    <w:t xml:space="preserve">3</w:t>
+                  </w:r>
+                </w:p>
+              </w:tc>
+              <w:tc>
+                <w:tcPr/>
+                <w:p>
+                  <w:pPr>
+                    <w:pStyle w:val="Compact"/>
+                    <w:jc w:val="center"/>
+                  </w:pPr>
+                  <w:r>
+                    <w:t xml:space="preserve">B2</w:t>
+                  </w:r>
+                </w:p>
+              </w:tc>
+              <w:tc>
+                <w:tcPr/>
+                <w:p>
+                  <w:pPr>
+                    <w:pStyle w:val="Compact"/>
+                    <w:jc w:val="center"/>
+                  </w:pPr>
+                  <w:r>
+                    <w:t xml:space="preserve">B2-G</w:t>
+                  </w:r>
+                </w:p>
+              </w:tc>
+            </w:tr>
+            <w:tr>
+              <w:tc>
+                <w:tcPr/>
+                <w:p>
+                  <w:pPr>
+                    <w:pStyle w:val="Compact"/>
+                    <w:jc w:val="center"/>
+                  </w:pPr>
+                  <w:r>
+                    <w:t xml:space="preserve">외부 제어 루프 설계</w:t>
+                  </w:r>
+                </w:p>
+              </w:tc>
+              <w:tc>
+                <w:tcPr/>
+                <w:p>
+                  <w:pPr>
+                    <w:pStyle w:val="Compact"/>
+                    <w:jc w:val="right"/>
+                    <w:jc w:val="center"/>
+                  </w:pPr>
+                  <w:r>
+                    <w:t xml:space="preserve">8</w:t>
+                  </w:r>
+                </w:p>
+              </w:tc>
+              <w:tc>
+                <w:tcPr/>
+                <w:p>
+                  <w:pPr>
+                    <w:pStyle w:val="Compact"/>
+                    <w:jc w:val="center"/>
+                  </w:pPr>
+                  <w:r>
+                    <w:t xml:space="preserve">B2</w:t>
+                  </w:r>
+                </w:p>
+              </w:tc>
+              <w:tc>
+                <w:tcPr/>
+                <w:p>
+                  <w:pPr>
+                    <w:pStyle w:val="Compact"/>
+                    <w:jc w:val="center"/>
+                  </w:pPr>
+                  <w:r>
+                    <w:t xml:space="preserve">B2-L</w:t>
+                  </w:r>
+                </w:p>
+              </w:tc>
+            </w:tr>
+            <w:tr>
+              <w:tc>
+                <w:tcPr/>
+                <w:p>
+                  <w:pPr>
+                    <w:pStyle w:val="Compact"/>
+                    <w:jc w:val="center"/>
+                  </w:pPr>
+                  <w:r>
+                    <w:t xml:space="preserve">그래프 스키마·불변성 설계</w:t>
+                  </w:r>
+                </w:p>
+              </w:tc>
+              <w:tc>
+                <w:tcPr/>
+                <w:p>
+                  <w:pPr>
+                    <w:pStyle w:val="Compact"/>
+                    <w:jc w:val="right"/>
+                    <w:jc w:val="center"/>
+                  </w:pPr>
+                  <w:r>
+                    <w:t xml:space="preserve">4</w:t>
+                  </w:r>
+                </w:p>
+              </w:tc>
+              <w:tc>
+                <w:tcPr/>
+                <w:p>
+                  <w:pPr>
+                    <w:pStyle w:val="Compact"/>
+                    <w:jc w:val="center"/>
+                  </w:pPr>
+                  <w:r>
+                    <w:t xml:space="preserve">B2</w:t>
+                  </w:r>
+                </w:p>
+              </w:tc>
+              <w:tc>
+                <w:tcPr/>
+                <w:p>
+                  <w:pPr>
+                    <w:pStyle w:val="Compact"/>
+                    <w:jc w:val="center"/>
+                  </w:pPr>
+                  <w:r>
+                    <w:t xml:space="preserve">B2-G</w:t>
+                  </w:r>
+                </w:p>
+              </w:tc>
+            </w:tr>
+          </w:tbl>
+          <w:bookmarkEnd w:id="65"/>
+          <w:p/>
+        </w:tc>
+      </w:tr>
+    </w:tbl>
+    <w:p>
+      <w:pPr>
+        <w:pStyle w:val="BodyText"/>
+      </w:pPr>
+      <w:r>
+        <w:t xml:space="preserve">아암은 일곱이다. B0은 네 가지 원시 도구만 쓰는 최소 하네스, B1은 영속 실행 상태와 재귀 서브콜을 더한 하네스,</w:t>
+      </w:r>
+      <w:r>
+        <w:t xml:space="preserve"> </w:t>
+      </w:r>
+      <w:r>
+        <w:t xml:space="preserve">B2는 B1 위에 타입 그래프·결정 프로토콜·청구 잠금·페일클로즈드 게이트·결과 주도 검색·반증 루프를 모두 얹은 복합 하네스다.</w:t>
+      </w:r>
+      <w:r>
+        <w:t xml:space="preserve"> </w:t>
+      </w:r>
+      <w:r>
+        <w:t xml:space="preserve">나머지 넷은 B2에서 성분을</w:t>
+      </w:r>
+      <w:r>
+        <w:t xml:space="preserve"> </w:t>
+      </w:r>
+      <w:r>
+        <w:rPr>
+          <w:b/>
+          <w:bCs/>
+        </w:rPr>
+        <w:t xml:space="preserve">정확히 하나씩</w:t>
+      </w:r>
+      <w:r>
+        <w:t xml:space="preserve"> </w:t>
+      </w:r>
+      <w:r>
+        <w:t xml:space="preserve">뺀 절제 아암이며, 이 단일 차이 성질은 코드 수준에서 시험으로 강제된다.</w:t>
+      </w:r>
+    </w:p>
+    <w:p>
+      <w:pPr>
+        <w:pStyle w:val="BodyText"/>
+      </w:pPr>
+      <w:r>
+        <w:rPr>
+          <w:b/>
+          <w:bCs/>
+        </w:rPr>
+        <w:t xml:space="preserve">1차 대비는 B2 대 B0 하나</w:t>
+      </w:r>
+      <w:r>
+        <w:t xml:space="preserve">로 사전 선언한다. 세 아암은 쌍별 대비가 셋이므로, 주 대비를 정하지 않으면</w:t>
+      </w:r>
+      <w:r>
+        <w:t xml:space="preserve"> </w:t>
+      </w:r>
+      <w:r>
+        <w:t xml:space="preserve">사후에 가장 유리한 대비를 고를 수 있다. 나머지 두 대비는 2차이며 Holm 보정을 적용한다.</w:t>
+      </w:r>
+      <w:r>
+        <w:t xml:space="preserve"> </w:t>
+      </w:r>
+      <w:r>
+        <w:t xml:space="preserve">1차 검정은 과제×시드로 짝지은 McNemar이고 과제를 풀링한다. 과제별 검정과 이질성은 2차로 보고한다.</w:t>
+      </w:r>
+    </w:p>
+    <w:bookmarkEnd w:id="66"/>
+    <w:bookmarkEnd w:id="67"/>
+    <w:bookmarkStart w:id="92" w:name="experimental-results"/>
+    <w:p>
+      <w:pPr>
+        <w:pStyle w:val="Heading1"/>
+      </w:pPr>
+      <w:r>
+        <w:t xml:space="preserve">Ⅳ. Experimental Results</w:t>
+      </w:r>
+    </w:p>
+    <w:p>
+      <w:pPr>
+        <w:pStyle w:val="FirstParagraph"/>
+      </w:pPr>
+      <w:r>
+        <w:t xml:space="preserve">본 장은</w:t>
+      </w:r>
+      <w:r>
+        <w:t xml:space="preserve"> </w:t>
+      </w:r>
+      <w:r>
+        <w:rPr>
+          <w:b/>
+          <w:bCs/>
+        </w:rPr>
+        <w:t xml:space="preserve">측정 장(measurement chapter)</w:t>
+      </w:r>
+      <w:r>
+        <w:t xml:space="preserve">이다. 여기서 보고하는 것은 하네스 간 성능 우열이 아니라,</w:t>
+      </w:r>
+      <w:r>
+        <w:t xml:space="preserve"> </w:t>
+      </w:r>
+      <w:r>
+        <w:t xml:space="preserve">그 우열을 재려고 만든</w:t>
+      </w:r>
+      <w:r>
+        <w:t xml:space="preserve"> </w:t>
+      </w:r>
+      <w:r>
+        <w:rPr>
+          <w:b/>
+          <w:bCs/>
+        </w:rPr>
+        <w:t xml:space="preserve">계측 도구 자체의 성질</w:t>
+      </w:r>
+      <w:r>
+        <w:t xml:space="preserve">이다. Study A는 판정 기반 endpoint가 조건을 분리하지 못한다는</w:t>
+      </w:r>
+      <w:r>
+        <w:t xml:space="preserve"> </w:t>
+      </w:r>
+      <w:r>
+        <w:t xml:space="preserve">결론에 도달했고, 그 결론이 Study B의 설계 근거가 된다. 즉 이 장의 음성 결과는 실패가 아니라 다음 설계의 입력이다.</w:t>
+      </w:r>
+    </w:p>
+    <w:bookmarkStart w:id="68" w:name="실행된-블록"/>
+    <w:p>
+      <w:pPr>
+        <w:pStyle w:val="Heading2"/>
+      </w:pPr>
+      <w:r>
+        <w:t xml:space="preserve">1. 실행된 블록</w:t>
+      </w:r>
+    </w:p>
+    <w:p>
+      <w:pPr>
+        <w:pStyle w:val="FirstParagraph"/>
+      </w:pPr>
+      <w:r>
+        <w:t xml:space="preserve">본 장의 모든 정량적 수치는 실제 실행된 16개 장기 연구 에피소드와 521회의 판정 모델 호출로부터 도출되었으며, 커밋된 아티팩트 영수증(receipt)에서 바이트 단위로 재유도된다. 본 실험의 핵심 결론은 분명하다.</w:t>
+      </w:r>
+      <w:r>
+        <w:t xml:space="preserve"> </w:t>
+      </w:r>
+      <w:r>
+        <w:rPr>
+          <w:b/>
+          <w:bCs/>
+        </w:rPr>
+        <w:t xml:space="preserve">단서 기반 채점 도구는 38.9%의 오판율을 가지며, 처치 간 분산 성분(초기 단서 채점 0.009, 수리 후 전수 채점 0.026)을 거의 감지하지 못하는 계측 불감증을 보였다.</w:t>
+      </w:r>
+      <w:r>
+        <w:t xml:space="preserve"> </w:t>
+      </w:r>
+      <w:r>
+        <w:t xml:space="preserve">따라서 본 연구는 부정확한 도구에 기댄 인위적 효과 추정을 거부하고, 도구 결함의 구조적 원인을 정량적으로 규명한다.</w:t>
+      </w:r>
+    </w:p>
+    <w:p>
+      <w:pPr>
+        <w:pStyle w:val="BodyText"/>
+      </w:pPr>
+      <w:r>
+        <w:t xml:space="preserve">확인 블록은 두 과제와 네 조건에 걸쳐 16개 에피소드로 구성되며, 그중 15건이 엄격한 자원 상한과 무결성 기준을 통과하여 채점 자격을 얻었다.</w:t>
+      </w:r>
+    </w:p>
+    <w:bookmarkEnd w:id="68"/>
+    <w:bookmarkStart w:id="73" w:name="채점-도구의-반증과-적대적-검증"/>
+    <w:p>
+      <w:pPr>
+        <w:pStyle w:val="Heading2"/>
+      </w:pPr>
+      <w:r>
+        <w:t xml:space="preserve">2. 채점 도구의 반증과 적대적 검증</w:t>
+      </w:r>
+    </w:p>
+    <w:p>
+      <w:pPr>
+        <w:pStyle w:val="FirstParagraph"/>
+      </w:pPr>
+      <w:r>
+        <w:t xml:space="preserve">체크리스트 기반 접지 채점</w:t>
+      </w:r>
+      <w:r>
+        <w:t xml:space="preserve"> </w:t>
+      </w:r>
+      <w:r>
+        <w:t xml:space="preserve">[55]</w:t>
+      </w:r>
+      <w:r>
+        <w:t xml:space="preserve"> </w:t>
+      </w:r>
+      <w:r>
+        <w:t xml:space="preserve">방식은 객관적으로 보이지만, 단서 누설과 우회 전략(solution hacking)에 극도로 취약하다</w:t>
+      </w:r>
+      <w:r>
+        <w:t xml:space="preserve"> </w:t>
+      </w:r>
+      <w:r>
+        <w:t xml:space="preserve">[56]</w:t>
+      </w:r>
+      <w:r>
+        <w:t xml:space="preserve">. 의도적으로 심어둔 지름길을 감지하는 적대적 검증</w:t>
+      </w:r>
+      <w:r>
+        <w:t xml:space="preserve"> </w:t>
+      </w:r>
+      <w:r>
+        <w:t xml:space="preserve">[57]</w:t>
+      </w:r>
+      <w:r>
+        <w:t xml:space="preserve"> </w:t>
+      </w:r>
+      <w:r>
+        <w:t xml:space="preserve">을 통해, 단서 매칭이 실제 설계 속성이 아니라 지시문에 포함된 표현을 재인용한 문장에 점수를 부여하는 구성 타당도(construct validity) 결함을 입증했다</w:t>
+      </w:r>
+      <w:r>
+        <w:t xml:space="preserve"> </w:t>
+      </w:r>
+      <w:r>
+        <w:t xml:space="preserve">[58]</w:t>
+      </w:r>
+      <w:r>
+        <w:t xml:space="preserve">.</w:t>
+      </w:r>
+    </w:p>
+    <w:p>
+      <w:pPr>
+        <w:pStyle w:val="BodyText"/>
+      </w:pPr>
+      <w:hyperlink w:anchor="tbl-falsify">
+        <w:r>
+          <w:rPr>
+            <w:rStyle w:val="Hyperlink"/>
+          </w:rPr>
+          <w:t xml:space="preserve">표 1</w:t>
+        </w:r>
+      </w:hyperlink>
+      <w:r>
+        <w:t xml:space="preserve"> </w:t>
+      </w:r>
+      <w:r>
+        <w:t xml:space="preserve">에서 보았듯 파이프라인 부정 판정 18건 중 7건이 전체 산출물 재판정에서 뒤집혔다. 이 오류는 무작위가 아니라 한 방향으로 기운다. 단서 검색이 실패하면 판정은 항상 부정이 되고, 모델은 호출조차 되지 않는다.</w:t>
+      </w:r>
+      <w:r>
+        <w:t xml:space="preserve"> </w:t>
+      </w:r>
+      <w:hyperlink w:anchor="fig-scoring">
+        <w:r>
+          <w:rPr>
+            <w:rStyle w:val="Hyperlink"/>
+          </w:rPr>
+          <w:t xml:space="preserve">그림 8</w:t>
+        </w:r>
+      </w:hyperlink>
+      <w:r>
+        <w:t xml:space="preserve"> </w:t>
+      </w:r>
+      <w:r>
+        <w:t xml:space="preserve">은 두 채점 경로와 20% 하위표본 드리프트 검사를 보인다.</w:t>
+      </w:r>
+    </w:p>
+    <w:tbl>
+      <w:tblPr>
+        <w:tblStyle w:val="Table"/>
+        <w:tblW w:type="pct" w:w="5000"/>
+        <w:tblLayout w:type="fixed"/>
+        <w:tblLook w:firstRow="0" w:lastRow="0" w:firstColumn="0" w:lastColumn="0" w:noHBand="0" w:noVBand="0" w:val="0000"/>
+      </w:tblPr>
+      <w:tblGrid>
+        <w:gridCol w:w="7920"/>
+      </w:tblGrid>
+      <w:tr>
+        <w:tc>
+          <w:tcPr/>
+          <w:bookmarkStart w:id="72" w:name="fig-scoring"/>
           <w:p>
             <w:pPr>
               <w:pStyle w:val="Compact"/>
@@ -3843,18 +4509,18 @@
                 <wp:inline>
                   <wp:extent cx="4000500" cy="3178311"/>
                   <wp:effectExtent b="0" l="0" r="0" t="0"/>
-                  <wp:docPr descr="" title="" id="68" name="Picture"/>
+                  <wp:docPr descr="" title="" id="70" name="Picture"/>
                   <a:graphic>
                     <a:graphicData uri="http://schemas.openxmlformats.org/drawingml/2006/picture">
                       <pic:pic>
                         <pic:nvPicPr>
-                          <pic:cNvPr descr="figures/rendered/fig-07.png" id="69" name="Picture"/>
+                          <pic:cNvPr descr="figures/rendered/fig-07.png" id="71" name="Picture"/>
                           <pic:cNvPicPr>
                             <a:picLocks noChangeArrowheads="1" noChangeAspect="1"/>
                           </pic:cNvPicPr>
                         </pic:nvPicPr>
                         <pic:blipFill>
-                          <a:blip r:embed="rId67"/>
+                          <a:blip r:embed="rId69"/>
                           <a:stretch>
                             <a:fillRect/>
                           </a:stretch>
@@ -3894,7 +4560,7 @@
               <w:t xml:space="preserve">그림 8. 채점 도구 비교</w:t>
             </w:r>
           </w:p>
-          <w:bookmarkEnd w:id="70"/>
+          <w:bookmarkEnd w:id="72"/>
         </w:tc>
       </w:tr>
     </w:tbl>
@@ -3916,8 +4582,8 @@
         <w:t xml:space="preserve">도구 선택이 그것이 재려던 비교를 압도한다.</w:t>
       </w:r>
     </w:p>
-    <w:bookmarkEnd w:id="71"/>
-    <w:bookmarkStart w:id="72" w:name="판정-신뢰도와-대체-판정기"/>
+    <w:bookmarkEnd w:id="73"/>
+    <w:bookmarkStart w:id="74" w:name="판정-신뢰도와-대체-판정기"/>
     <w:p>
       <w:pPr>
         <w:pStyle w:val="Heading2"/>
@@ -3937,7 +4603,7 @@
         <w:t xml:space="preserve"> </w:t>
       </w:r>
       <w:r>
-        <w:t xml:space="preserve">[56]</w:t>
+        <w:t xml:space="preserve">[59]</w:t>
       </w:r>
       <w:r>
         <w:t xml:space="preserve">, 타당도 검증 없는 일치도 신뢰는 위험한 착시를 낳는다</w:t>
@@ -3946,7 +4612,7 @@
         <w:t xml:space="preserve"> </w:t>
       </w:r>
       <w:r>
-        <w:t xml:space="preserve">[57]</w:t>
+        <w:t xml:space="preserve">[60]</w:t>
       </w:r>
       <w:r>
         <w:t xml:space="preserve">. 파이프라인의 각 단계(검색, 발췌, 판정)가 누적되며 타당도를 잃는 복합 오차(compounding error)가 발생하며</w:t>
@@ -3955,7 +4621,7 @@
         <w:t xml:space="preserve"> </w:t>
       </w:r>
       <w:r>
-        <w:t xml:space="preserve">[58]</w:t>
+        <w:t xml:space="preserve">[61]</w:t>
       </w:r>
       <w:r>
         <w:t xml:space="preserve">, 판정기 모델 고유의 편향을 식별해야 한다</w:t>
@@ -3964,7 +4630,7 @@
         <w:t xml:space="preserve"> </w:t>
       </w:r>
       <w:r>
-        <w:t xml:space="preserve">[59]</w:t>
+        <w:t xml:space="preserve">[62]</w:t>
       </w:r>
       <w:r>
         <w:t xml:space="preserve">. 다수결 투표가 어려운 문제에서 오히려 정확도를 떨어뜨리고</w:t>
@@ -3973,7 +4639,7 @@
         <w:t xml:space="preserve"> </w:t>
       </w:r>
       <w:r>
-        <w:t xml:space="preserve">[60]</w:t>
+        <w:t xml:space="preserve">[63]</w:t>
       </w:r>
       <w:r>
         <w:t xml:space="preserve">, 잘못된 합의(wrong consensus)에 도달할 위험이 있다</w:t>
@@ -3982,14 +4648,14 @@
         <w:t xml:space="preserve"> </w:t>
       </w:r>
       <w:r>
-        <w:t xml:space="preserve">[61]</w:t>
+        <w:t xml:space="preserve">[64]</w:t>
       </w:r>
       <w:r>
         <w:t xml:space="preserve">.</w:t>
       </w:r>
     </w:p>
-    <w:bookmarkEnd w:id="72"/>
-    <w:bookmarkStart w:id="73" w:name="에피소드-비용-측정과-계측기-결함"/>
+    <w:bookmarkEnd w:id="74"/>
+    <w:bookmarkStart w:id="75" w:name="에피소드-비용-측정과-계측기-결함"/>
     <w:p>
       <w:pPr>
         <w:pStyle w:val="Heading2"/>
@@ -4009,7 +4675,7 @@
         <w:t xml:space="preserve"> </w:t>
       </w:r>
       <w:r>
-        <w:t xml:space="preserve">[62]</w:t>
+        <w:t xml:space="preserve">[65]</w:t>
       </w:r>
       <w:r>
         <w:t xml:space="preserve">. 캐시 상태에 따른 비용 변동</w:t>
@@ -4018,7 +4684,7 @@
         <w:t xml:space="preserve"> </w:t>
       </w:r>
       <w:r>
-        <w:t xml:space="preserve">[63]</w:t>
+        <w:t xml:space="preserve">[66]</w:t>
       </w:r>
       <w:r>
         <w:t xml:space="preserve"> </w:t>
@@ -4030,7 +4696,7 @@
         <w:t xml:space="preserve"> </w:t>
       </w:r>
       <w:r>
-        <w:t xml:space="preserve">[64]</w:t>
+        <w:t xml:space="preserve">[67]</w:t>
       </w:r>
       <w:r>
         <w:t xml:space="preserve">, 그리고 토큰 낭비</w:t>
@@ -4039,7 +4705,7 @@
         <w:t xml:space="preserve"> </w:t>
       </w:r>
       <w:r>
-        <w:t xml:space="preserve">[65]</w:t>
+        <w:t xml:space="preserve">[68]</w:t>
       </w:r>
       <w:r>
         <w:t xml:space="preserve"> </w:t>
@@ -4051,7 +4717,7 @@
         <w:t xml:space="preserve"> </w:t>
       </w:r>
       <w:r>
-        <w:t xml:space="preserve">[66]</w:t>
+        <w:t xml:space="preserve">[69]</w:t>
       </w:r>
       <w:r>
         <w:t xml:space="preserve"> </w:t>
@@ -4063,7 +4729,7 @@
         <w:t xml:space="preserve"> </w:t>
       </w:r>
       <w:r>
-        <w:t xml:space="preserve">[67]</w:t>
+        <w:t xml:space="preserve">[70]</w:t>
       </w:r>
       <w:r>
         <w:t xml:space="preserve"> </w:t>
@@ -4075,7 +4741,7 @@
         <w:t xml:space="preserve"> </w:t>
       </w:r>
       <w:r>
-        <w:t xml:space="preserve">[68]</w:t>
+        <w:t xml:space="preserve">[71]</w:t>
       </w:r>
       <w:r>
         <w:t xml:space="preserve"> </w:t>
@@ -4087,7 +4753,7 @@
         <w:t xml:space="preserve"> </w:t>
       </w:r>
       <w:r>
-        <w:t xml:space="preserve">[69]</w:t>
+        <w:t xml:space="preserve">[72]</w:t>
       </w:r>
       <w:r>
         <w:t xml:space="preserve"> </w:t>
@@ -4099,14 +4765,14 @@
         <w:t xml:space="preserve"> </w:t>
       </w:r>
       <w:r>
-        <w:t xml:space="preserve">[70]</w:t>
+        <w:t xml:space="preserve">[73]</w:t>
       </w:r>
       <w:r>
         <w:t xml:space="preserve">. 본 연구는 호출 완료 시점의 사용량을 합산하는 계측기 결함을 바로잡고 실측 비용을 도출했다.</w:t>
       </w:r>
     </w:p>
-    <w:bookmarkEnd w:id="73"/>
-    <w:bookmarkStart w:id="74" w:name="기록된-결과의-재도출과-주석자-분산"/>
+    <w:bookmarkEnd w:id="75"/>
+    <w:bookmarkStart w:id="76" w:name="기록된-결과의-재도출과-주석자-분산"/>
     <w:p>
       <w:pPr>
         <w:pStyle w:val="Heading2"/>
@@ -4126,7 +4792,7 @@
         <w:t xml:space="preserve"> </w:t>
       </w:r>
       <w:r>
-        <w:t xml:space="preserve">[71]</w:t>
+        <w:t xml:space="preserve">[74]</w:t>
       </w:r>
       <w:r>
         <w:t xml:space="preserve">, 주석 분산은 과제 항목 자체와 주석자 양쪽에서 발생한다</w:t>
@@ -4135,7 +4801,7 @@
         <w:t xml:space="preserve"> </w:t>
       </w:r>
       <w:r>
-        <w:t xml:space="preserve">[72]</w:t>
+        <w:t xml:space="preserve">[75]</w:t>
       </w:r>
       <w:r>
         <w:t xml:space="preserve">. 사후 추가형 출처 추적</w:t>
@@ -4144,7 +4810,7 @@
         <w:t xml:space="preserve"> </w:t>
       </w:r>
       <w:r>
-        <w:t xml:space="preserve">[73]</w:t>
+        <w:t xml:space="preserve">[76]</w:t>
       </w:r>
       <w:r>
         <w:t xml:space="preserve"> </w:t>
@@ -4156,7 +4822,7 @@
         <w:t xml:space="preserve"> </w:t>
       </w:r>
       <w:r>
-        <w:t xml:space="preserve">[74]</w:t>
+        <w:t xml:space="preserve">[77]</w:t>
       </w:r>
       <w:r>
         <w:t xml:space="preserve">, 저장된 아티팩트 위에서 0-fit으로 주장을 재현 검증하는 리플레이 검증이 필요하다</w:t>
@@ -4165,7 +4831,7 @@
         <w:t xml:space="preserve"> </w:t>
       </w:r>
       <w:r>
-        <w:t xml:space="preserve">[75], [76]</w:t>
+        <w:t xml:space="preserve">[78], [79]</w:t>
       </w:r>
       <w:r>
         <w:t xml:space="preserve">. 반복 감사</w:t>
@@ -4174,7 +4840,7 @@
         <w:t xml:space="preserve"> </w:t>
       </w:r>
       <w:r>
-        <w:t xml:space="preserve">[77]</w:t>
+        <w:t xml:space="preserve">[80]</w:t>
       </w:r>
       <w:r>
         <w:t xml:space="preserve"> </w:t>
@@ -4186,7 +4852,7 @@
         <w:t xml:space="preserve"> </w:t>
       </w:r>
       <w:r>
-        <w:t xml:space="preserve">[78]</w:t>
+        <w:t xml:space="preserve">[81]</w:t>
       </w:r>
       <w:r>
         <w:t xml:space="preserve"> </w:t>
@@ -4198,7 +4864,7 @@
         <w:t xml:space="preserve"> </w:t>
       </w:r>
       <w:r>
-        <w:t xml:space="preserve">[79]</w:t>
+        <w:t xml:space="preserve">[82]</w:t>
       </w:r>
       <w:r>
         <w:t xml:space="preserve">, 부분적 계약</w:t>
@@ -4207,7 +4873,7 @@
         <w:t xml:space="preserve"> </w:t>
       </w:r>
       <w:r>
-        <w:t xml:space="preserve">[80]</w:t>
+        <w:t xml:space="preserve">[83]</w:t>
       </w:r>
       <w:r>
         <w:t xml:space="preserve"> </w:t>
@@ -4219,7 +4885,7 @@
         <w:t xml:space="preserve"> </w:t>
       </w:r>
       <w:r>
-        <w:t xml:space="preserve">[81]</w:t>
+        <w:t xml:space="preserve">[84]</w:t>
       </w:r>
       <w:r>
         <w:t xml:space="preserve"> </w:t>
@@ -4228,8 +4894,8 @@
         <w:t xml:space="preserve">을 수립했다.</w:t>
       </w:r>
     </w:p>
-    <w:bookmarkEnd w:id="74"/>
-    <w:bookmarkStart w:id="75" w:name="변이-감사에-의한-계측기-검증"/>
+    <w:bookmarkEnd w:id="76"/>
+    <w:bookmarkStart w:id="77" w:name="변이-감사에-의한-계측기-검증"/>
     <w:p>
       <w:pPr>
         <w:pStyle w:val="Heading2"/>
@@ -4249,7 +4915,7 @@
         <w:t xml:space="preserve"> </w:t>
       </w:r>
       <w:r>
-        <w:t xml:space="preserve">[82]</w:t>
+        <w:t xml:space="preserve">[85]</w:t>
       </w:r>
       <w:r>
         <w:t xml:space="preserve"> </w:t>
@@ -4261,7 +4927,7 @@
         <w:t xml:space="preserve"> </w:t>
       </w:r>
       <w:r>
-        <w:t xml:space="preserve">[83]</w:t>
+        <w:t xml:space="preserve">[86]</w:t>
       </w:r>
       <w:r>
         <w:t xml:space="preserve"> </w:t>
@@ -4273,7 +4939,7 @@
         <w:t xml:space="preserve"> </w:t>
       </w:r>
       <w:r>
-        <w:t xml:space="preserve">[84]</w:t>
+        <w:t xml:space="preserve">[87]</w:t>
       </w:r>
       <w:r>
         <w:t xml:space="preserve">. 오라클 가용성</w:t>
@@ -4282,7 +4948,7 @@
         <w:t xml:space="preserve"> </w:t>
       </w:r>
       <w:r>
-        <w:t xml:space="preserve">[85]</w:t>
+        <w:t xml:space="preserve">[88]</w:t>
       </w:r>
       <w:r>
         <w:t xml:space="preserve"> </w:t>
@@ -4294,7 +4960,7 @@
         <w:t xml:space="preserve"> </w:t>
       </w:r>
       <w:r>
-        <w:t xml:space="preserve">[86]</w:t>
+        <w:t xml:space="preserve">[89]</w:t>
       </w:r>
       <w:r>
         <w:t xml:space="preserve"> </w:t>
@@ -4306,14 +4972,14 @@
         <w:t xml:space="preserve"> </w:t>
       </w:r>
       <w:r>
-        <w:t xml:space="preserve">[87]</w:t>
+        <w:t xml:space="preserve">[90]</w:t>
       </w:r>
       <w:r>
         <w:t xml:space="preserve">.</w:t>
       </w:r>
     </w:p>
-    <w:bookmarkEnd w:id="75"/>
-    <w:bookmarkStart w:id="77" w:name="분산-성분과-설계의-한계"/>
+    <w:bookmarkEnd w:id="77"/>
+    <w:bookmarkStart w:id="79" w:name="분산-성분과-설계의-한계"/>
     <w:p>
       <w:pPr>
         <w:pStyle w:val="Heading2"/>
@@ -4331,7 +4997,7 @@
           <w:rPr>
             <w:rStyle w:val="Hyperlink"/>
           </w:rPr>
-          <w:t xml:space="preserve">표 4</w:t>
+          <w:t xml:space="preserve">표 5</w:t>
         </w:r>
       </w:hyperlink>
       <w:r>
@@ -4345,7 +5011,7 @@
           <w:rPr>
             <w:rStyle w:val="Hyperlink"/>
           </w:rPr>
-          <w:t xml:space="preserve">표 4</w:t>
+          <w:t xml:space="preserve">표 5</w:t>
         </w:r>
       </w:hyperlink>
       <w:r>
@@ -4375,7 +5041,7 @@
       <w:tr>
         <w:tc>
           <w:tcPr/>
-          <w:bookmarkStart w:id="76" w:name="tbl-variance"/>
+          <w:bookmarkStart w:id="78" w:name="tbl-variance"/>
           <w:p>
             <w:pPr>
               <w:jc w:val="center"/>
@@ -4386,7 +5052,7 @@
               <w:pStyle w:val="ImageCaption"/>
             </w:pPr>
             <w:r>
-              <w:t xml:space="preserve">표 4. 판정 endpoint의 분산 성분과 dependability</w:t>
+              <w:t xml:space="preserve">표 5. 판정 endpoint의 분산 성분과 dependability</w:t>
             </w:r>
           </w:p>
           <w:tbl>
@@ -4604,7 +5270,7 @@
               </w:tc>
             </w:tr>
           </w:tbl>
-          <w:bookmarkEnd w:id="76"/>
+          <w:bookmarkEnd w:id="78"/>
           <w:p/>
         </w:tc>
       </w:tr>
@@ -4617,8 +5283,8 @@
         <w:t xml:space="preserve">이 결과는 두 가지로 읽힐 수 있다. 조건이 산출물의 질을 바꾸지 않거나, endpoint가 그 변화를 보지 못하거나다. 검색 단계를 제거하고 반복을 추가해 두 번째 해석을 직접 시험했으나 조건 성분은 나타나지 않았다. 다만 이것을 무효과의 증거로 보고하지 않는다. 조건 수가 3~4개이고 반복이 2회이기 때문이다.</w:t>
       </w:r>
     </w:p>
-    <w:bookmarkEnd w:id="77"/>
-    <w:bookmarkStart w:id="78" w:name="조작-확인과-선행-관찰"/>
+    <w:bookmarkEnd w:id="79"/>
+    <w:bookmarkStart w:id="80" w:name="조작-확인과-선행-관찰"/>
     <w:p>
       <w:pPr>
         <w:pStyle w:val="Heading2"/>
@@ -4707,8 +5373,8 @@
         <w:t xml:space="preserve">는 점이다.</w:t>
       </w:r>
     </w:p>
-    <w:bookmarkEnd w:id="78"/>
-    <w:bookmarkStart w:id="80" w:name="예산-완료율"/>
+    <w:bookmarkEnd w:id="80"/>
+    <w:bookmarkStart w:id="82" w:name="예산-완료율"/>
     <w:p>
       <w:pPr>
         <w:pStyle w:val="Heading2"/>
@@ -4726,7 +5392,7 @@
           <w:rPr>
             <w:rStyle w:val="Hyperlink"/>
           </w:rPr>
-          <w:t xml:space="preserve">표 5</w:t>
+          <w:t xml:space="preserve">표 6</w:t>
         </w:r>
       </w:hyperlink>
       <w:r>
@@ -4749,7 +5415,7 @@
       <w:tr>
         <w:tc>
           <w:tcPr/>
-          <w:bookmarkStart w:id="79" w:name="tbl-completion"/>
+          <w:bookmarkStart w:id="81" w:name="tbl-completion"/>
           <w:p>
             <w:pPr>
               <w:jc w:val="center"/>
@@ -4760,7 +5426,7 @@
               <w:pStyle w:val="ImageCaption"/>
             </w:pPr>
             <w:r>
-              <w:t xml:space="preserve">표 5. 조건별 예산 완료율과 Wilson 95% 구간</w:t>
+              <w:t xml:space="preserve">표 6. 조건별 예산 완료율과 Wilson 95% 구간</w:t>
             </w:r>
           </w:p>
           <w:tbl>
@@ -5176,7 +5842,7 @@
               </w:tc>
             </w:tr>
           </w:tbl>
-          <w:bookmarkEnd w:id="79"/>
+          <w:bookmarkEnd w:id="81"/>
           <w:p/>
         </w:tc>
       </w:tr>
@@ -5189,8 +5855,8 @@
         <w:t xml:space="preserve">네 조건의 구간이 모두 겹친다. 조건당 2건(총 8건)의 소규모 표본으로는 조건 간 완료율 차이를 검출할 통계적 검정력이 부족하며, 본 연구는 그 차이를 유의미한 것으로 주장하지 않는다.</w:t>
       </w:r>
     </w:p>
-    <w:bookmarkEnd w:id="80"/>
-    <w:bookmarkStart w:id="85" w:name="근거-사슬"/>
+    <w:bookmarkEnd w:id="82"/>
+    <w:bookmarkStart w:id="87" w:name="근거-사슬"/>
     <w:p>
       <w:pPr>
         <w:pStyle w:val="Heading2"/>
@@ -5231,7 +5897,7 @@
       <w:tr>
         <w:tc>
           <w:tcPr/>
-          <w:bookmarkStart w:id="84" w:name="fig-evidence"/>
+          <w:bookmarkStart w:id="86" w:name="fig-evidence"/>
           <w:p>
             <w:pPr>
               <w:pStyle w:val="Compact"/>
@@ -5242,18 +5908,18 @@
                 <wp:inline>
                   <wp:extent cx="4533900" cy="1257644"/>
                   <wp:effectExtent b="0" l="0" r="0" t="0"/>
-                  <wp:docPr descr="" title="" id="82" name="Picture"/>
+                  <wp:docPr descr="" title="" id="84" name="Picture"/>
                   <a:graphic>
                     <a:graphicData uri="http://schemas.openxmlformats.org/drawingml/2006/picture">
                       <pic:pic>
                         <pic:nvPicPr>
-                          <pic:cNvPr descr="figures/rendered/fig-08.png" id="83" name="Picture"/>
+                          <pic:cNvPr descr="figures/rendered/fig-08.png" id="85" name="Picture"/>
                           <pic:cNvPicPr>
                             <a:picLocks noChangeArrowheads="1" noChangeAspect="1"/>
                           </pic:cNvPicPr>
                         </pic:nvPicPr>
                         <pic:blipFill>
-                          <a:blip r:embed="rId81"/>
+                          <a:blip r:embed="rId83"/>
                           <a:stretch>
                             <a:fillRect/>
                           </a:stretch>
@@ -5293,12 +5959,12 @@
               <w:t xml:space="preserve">그림 9. 근거 사슬과 검증</w:t>
             </w:r>
           </w:p>
-          <w:bookmarkEnd w:id="84"/>
+          <w:bookmarkEnd w:id="86"/>
         </w:tc>
       </w:tr>
     </w:tbl>
-    <w:bookmarkEnd w:id="85"/>
-    <w:bookmarkStart w:id="87" w:name="의사결정-인구조사와-위협-요인"/>
+    <w:bookmarkEnd w:id="87"/>
+    <w:bookmarkStart w:id="89" w:name="의사결정-인구조사와-위협-요인"/>
     <w:p>
       <w:pPr>
         <w:pStyle w:val="Heading2"/>
@@ -5318,7 +5984,7 @@
         <w:t xml:space="preserve"> </w:t>
       </w:r>
       <w:r>
-        <w:t xml:space="preserve">[88]</w:t>
+        <w:t xml:space="preserve">[91]</w:t>
       </w:r>
       <w:r>
         <w:t xml:space="preserve"> </w:t>
@@ -5330,7 +5996,7 @@
         <w:t xml:space="preserve"> </w:t>
       </w:r>
       <w:r>
-        <w:t xml:space="preserve">[89]</w:t>
+        <w:t xml:space="preserve">[92]</w:t>
       </w:r>
       <w:r>
         <w:t xml:space="preserve">, AI 연구의 엄밀성(rigor)을 세우기 위해</w:t>
@@ -5339,7 +6005,7 @@
         <w:t xml:space="preserve"> </w:t>
       </w:r>
       <w:r>
-        <w:t xml:space="preserve">[90]</w:t>
+        <w:t xml:space="preserve">[93]</w:t>
       </w:r>
       <w:r>
         <w:t xml:space="preserve"> </w:t>
@@ -5351,7 +6017,7 @@
         <w:t xml:space="preserve"> </w:t>
       </w:r>
       <w:r>
-        <w:t xml:space="preserve">[91]</w:t>
+        <w:t xml:space="preserve">[94]</w:t>
       </w:r>
       <w:r>
         <w:t xml:space="preserve">. 소규모 스크리닝의 한계</w:t>
@@ -5360,7 +6026,7 @@
         <w:t xml:space="preserve"> </w:t>
       </w:r>
       <w:r>
-        <w:t xml:space="preserve">[92]</w:t>
+        <w:t xml:space="preserve">[95]</w:t>
       </w:r>
       <w:r>
         <w:t xml:space="preserve"> </w:t>
@@ -5372,7 +6038,7 @@
         <w:t xml:space="preserve"> </w:t>
       </w:r>
       <w:r>
-        <w:t xml:space="preserve">[93]</w:t>
+        <w:t xml:space="preserve">[96]</w:t>
       </w:r>
       <w:r>
         <w:t xml:space="preserve"> </w:t>
@@ -5388,7 +6054,7 @@
           <w:rPr>
             <w:rStyle w:val="Hyperlink"/>
           </w:rPr>
-          <w:t xml:space="preserve">표 6</w:t>
+          <w:t xml:space="preserve">표 7</w:t>
         </w:r>
       </w:hyperlink>
       <w:r>
@@ -5420,7 +6086,7 @@
       <w:tr>
         <w:tc>
           <w:tcPr/>
-          <w:bookmarkStart w:id="86" w:name="tbl-threats"/>
+          <w:bookmarkStart w:id="88" w:name="tbl-threats"/>
           <w:p>
             <w:pPr>
               <w:jc w:val="center"/>
@@ -5431,7 +6097,7 @@
               <w:pStyle w:val="ImageCaption"/>
             </w:pPr>
             <w:r>
-              <w:t xml:space="preserve">표 6. 위협과 한계</w:t>
+              <w:t xml:space="preserve">표 7. 위협과 한계</w:t>
             </w:r>
           </w:p>
           <w:tbl>
@@ -5657,14 +6323,623 @@
               </w:tc>
             </w:tr>
           </w:tbl>
-          <w:bookmarkEnd w:id="86"/>
+          <w:bookmarkEnd w:id="88"/>
           <w:p/>
         </w:tc>
       </w:tr>
     </w:tbl>
-    <w:bookmarkEnd w:id="87"/>
-    <w:bookmarkEnd w:id="88"/>
-    <w:bookmarkStart w:id="89" w:name="conclusions"/>
+    <w:bookmarkEnd w:id="89"/>
+    <w:bookmarkStart w:id="91" w:name="study-b의-현재-상태-사전등록-완료-미실행"/>
+    <w:p>
+      <w:pPr>
+        <w:pStyle w:val="Heading2"/>
+      </w:pPr>
+      <w:r>
+        <w:t xml:space="preserve">12. Study B의 현재 상태 — 사전등록 완료, 미실행</w:t>
+      </w:r>
+    </w:p>
+    <w:p>
+      <w:pPr>
+        <w:pStyle w:val="FirstParagraph"/>
+      </w:pPr>
+      <w:r>
+        <w:t xml:space="preserve">Ⅲ장 8절의 하네스 구성 벤치마크는</w:t>
+      </w:r>
+      <w:r>
+        <w:t xml:space="preserve"> </w:t>
+      </w:r>
+      <w:r>
+        <w:rPr>
+          <w:b/>
+          <w:bCs/>
+        </w:rPr>
+        <w:t xml:space="preserve">사전등록을 마쳤고 아직 실행되지 않았다.</w:t>
+      </w:r>
+      <w:r>
+        <w:t xml:space="preserve"> </w:t>
+      </w:r>
+      <w:r>
+        <w:t xml:space="preserve">이 절은 그 사실을 명시하기 위해 존재한다.</w:t>
+      </w:r>
+      <w:r>
+        <w:t xml:space="preserve"> </w:t>
+      </w:r>
+      <w:hyperlink w:anchor="tbl-studyb-status">
+        <w:r>
+          <w:rPr>
+            <w:rStyle w:val="Hyperlink"/>
+          </w:rPr>
+          <w:t xml:space="preserve">표 8</w:t>
+        </w:r>
+      </w:hyperlink>
+      <w:r>
+        <w:t xml:space="preserve"> </w:t>
+      </w:r>
+      <w:r>
+        <w:t xml:space="preserve">의 결과 열이 전부 미실행인 것은 누락이 아니라 기록이다.</w:t>
+      </w:r>
+    </w:p>
+    <w:tbl>
+      <w:tblPr>
+        <w:tblStyle w:val="Table"/>
+        <w:tblW w:type="pct" w:w="5000"/>
+        <w:tblLayout w:type="fixed"/>
+        <w:tblLook w:firstRow="0" w:lastRow="0" w:firstColumn="0" w:lastColumn="0" w:noHBand="0" w:noVBand="0" w:val="0000"/>
+      </w:tblPr>
+      <w:tblGrid>
+        <w:gridCol w:w="7920"/>
+      </w:tblGrid>
+      <w:tr>
+        <w:tc>
+          <w:tcPr/>
+          <w:bookmarkStart w:id="90" w:name="tbl-studyb-status"/>
+          <w:p>
+            <w:pPr>
+              <w:jc w:val="center"/>
+            </w:pPr>
+            <w:pPr>
+              <w:jc w:val="left"/>
+              <w:spacing w:before="200"/>
+              <w:pStyle w:val="ImageCaption"/>
+            </w:pPr>
+            <w:r>
+              <w:t xml:space="preserve">표 8. Study B 아암별 사전등록 및 실행 상태</w:t>
+            </w:r>
+          </w:p>
+          <w:tbl>
+            <w:tblPr>
+              <w:tblStyle w:val="Table"/>
+              <w:tblW w:type="auto" w:w="0"/>
+              <w:tblLook w:firstRow="1" w:lastRow="0" w:firstColumn="0" w:lastColumn="0" w:noHBand="0" w:noVBand="0" w:val="0020"/>
+            </w:tblPr>
+            <w:tblGrid>
+              <w:gridCol w:w="1980"/>
+              <w:gridCol w:w="1980"/>
+              <w:gridCol w:w="1980"/>
+              <w:gridCol w:w="1980"/>
+            </w:tblGrid>
+            <w:tr>
+              <w:trPr>
+                <w:tblHeader w:val="on"/>
+              </w:trPr>
+              <w:tc>
+                <w:tcPr/>
+                <w:p>
+                  <w:pPr>
+                    <w:pStyle w:val="Compact"/>
+                    <w:jc w:val="center"/>
+                  </w:pPr>
+                  <w:r>
+                    <w:t xml:space="preserve">아암</w:t>
+                  </w:r>
+                </w:p>
+              </w:tc>
+              <w:tc>
+                <w:tcPr/>
+                <w:p>
+                  <w:pPr>
+                    <w:pStyle w:val="Compact"/>
+                    <w:jc w:val="center"/>
+                  </w:pPr>
+                  <w:r>
+                    <w:t xml:space="preserve">구성</w:t>
+                  </w:r>
+                </w:p>
+              </w:tc>
+              <w:tc>
+                <w:tcPr/>
+                <w:p>
+                  <w:pPr>
+                    <w:pStyle w:val="Compact"/>
+                    <w:jc w:val="center"/>
+                  </w:pPr>
+                  <w:r>
+                    <w:t xml:space="preserve">단계</w:t>
+                  </w:r>
+                </w:p>
+              </w:tc>
+              <w:tc>
+                <w:tcPr/>
+                <w:p>
+                  <w:pPr>
+                    <w:pStyle w:val="Compact"/>
+                    <w:jc w:val="center"/>
+                  </w:pPr>
+                  <w:r>
+                    <w:t xml:space="preserve">검증기 통과율</w:t>
+                  </w:r>
+                </w:p>
+              </w:tc>
+            </w:tr>
+            <w:tr>
+              <w:tc>
+                <w:tcPr/>
+                <w:p>
+                  <w:pPr>
+                    <w:pStyle w:val="Compact"/>
+                    <w:jc w:val="center"/>
+                  </w:pPr>
+                  <w:r>
+                    <w:t xml:space="preserve">B0</w:t>
+                  </w:r>
+                </w:p>
+              </w:tc>
+              <w:tc>
+                <w:tcPr/>
+                <w:p>
+                  <w:pPr>
+                    <w:pStyle w:val="Compact"/>
+                    <w:jc w:val="center"/>
+                  </w:pPr>
+                  <w:r>
+                    <w:t xml:space="preserve">최소 도구 하네스</w:t>
+                  </w:r>
+                </w:p>
+              </w:tc>
+              <w:tc>
+                <w:tcPr/>
+                <w:p>
+                  <w:pPr>
+                    <w:pStyle w:val="Compact"/>
+                    <w:jc w:val="center"/>
+                  </w:pPr>
+                  <w:r>
+                    <w:t xml:space="preserve">1차 스크리닝</w:t>
+                  </w:r>
+                </w:p>
+              </w:tc>
+              <w:tc>
+                <w:tcPr/>
+                <w:p>
+                  <w:pPr>
+                    <w:pStyle w:val="Compact"/>
+                    <w:jc w:val="center"/>
+                  </w:pPr>
+                  <w:r>
+                    <w:t xml:space="preserve">미실행</w:t>
+                  </w:r>
+                </w:p>
+              </w:tc>
+            </w:tr>
+            <w:tr>
+              <w:tc>
+                <w:tcPr/>
+                <w:p>
+                  <w:pPr>
+                    <w:pStyle w:val="Compact"/>
+                    <w:jc w:val="center"/>
+                  </w:pPr>
+                  <w:r>
+                    <w:t xml:space="preserve">B1</w:t>
+                  </w:r>
+                </w:p>
+              </w:tc>
+              <w:tc>
+                <w:tcPr/>
+                <w:p>
+                  <w:pPr>
+                    <w:pStyle w:val="Compact"/>
+                    <w:jc w:val="center"/>
+                  </w:pPr>
+                  <w:r>
+                    <w:t xml:space="preserve">표현력 하네스</w:t>
+                  </w:r>
+                </w:p>
+              </w:tc>
+              <w:tc>
+                <w:tcPr/>
+                <w:p>
+                  <w:pPr>
+                    <w:pStyle w:val="Compact"/>
+                    <w:jc w:val="center"/>
+                  </w:pPr>
+                  <w:r>
+                    <w:t xml:space="preserve">1차 스크리닝</w:t>
+                  </w:r>
+                </w:p>
+              </w:tc>
+              <w:tc>
+                <w:tcPr/>
+                <w:p>
+                  <w:pPr>
+                    <w:pStyle w:val="Compact"/>
+                    <w:jc w:val="center"/>
+                  </w:pPr>
+                  <w:r>
+                    <w:t xml:space="preserve">미실행</w:t>
+                  </w:r>
+                </w:p>
+              </w:tc>
+            </w:tr>
+            <w:tr>
+              <w:tc>
+                <w:tcPr/>
+                <w:p>
+                  <w:pPr>
+                    <w:pStyle w:val="Compact"/>
+                    <w:jc w:val="center"/>
+                  </w:pPr>
+                  <w:r>
+                    <w:t xml:space="preserve">B2</w:t>
+                  </w:r>
+                </w:p>
+              </w:tc>
+              <w:tc>
+                <w:tcPr/>
+                <w:p>
+                  <w:pPr>
+                    <w:pStyle w:val="Compact"/>
+                    <w:jc w:val="center"/>
+                  </w:pPr>
+                  <w:r>
+                    <w:t xml:space="preserve">책임 가능 복합 하네스</w:t>
+                  </w:r>
+                </w:p>
+              </w:tc>
+              <w:tc>
+                <w:tcPr/>
+                <w:p>
+                  <w:pPr>
+                    <w:pStyle w:val="Compact"/>
+                    <w:jc w:val="center"/>
+                  </w:pPr>
+                  <w:r>
+                    <w:t xml:space="preserve">1차 스크리닝</w:t>
+                  </w:r>
+                </w:p>
+              </w:tc>
+              <w:tc>
+                <w:tcPr/>
+                <w:p>
+                  <w:pPr>
+                    <w:pStyle w:val="Compact"/>
+                    <w:jc w:val="center"/>
+                  </w:pPr>
+                  <w:r>
+                    <w:t xml:space="preserve">미실행</w:t>
+                  </w:r>
+                </w:p>
+              </w:tc>
+            </w:tr>
+            <w:tr>
+              <w:tc>
+                <w:tcPr/>
+                <w:p>
+                  <w:pPr>
+                    <w:pStyle w:val="Compact"/>
+                    <w:jc w:val="center"/>
+                  </w:pPr>
+                  <w:r>
+                    <w:t xml:space="preserve">B2-G</w:t>
+                  </w:r>
+                </w:p>
+              </w:tc>
+              <w:tc>
+                <w:tcPr/>
+                <w:p>
+                  <w:pPr>
+                    <w:pStyle w:val="Compact"/>
+                    <w:jc w:val="center"/>
+                  </w:pPr>
+                  <w:r>
+                    <w:t xml:space="preserve">− 타입 컨텍스트 그래프</w:t>
+                  </w:r>
+                </w:p>
+              </w:tc>
+              <w:tc>
+                <w:tcPr/>
+                <w:p>
+                  <w:pPr>
+                    <w:pStyle w:val="Compact"/>
+                    <w:jc w:val="center"/>
+                  </w:pPr>
+                  <w:r>
+                    <w:t xml:space="preserve">절제(미승인)</w:t>
+                  </w:r>
+                </w:p>
+              </w:tc>
+              <w:tc>
+                <w:tcPr/>
+                <w:p>
+                  <w:pPr>
+                    <w:pStyle w:val="Compact"/>
+                    <w:jc w:val="center"/>
+                  </w:pPr>
+                  <w:r>
+                    <w:t xml:space="preserve">미실행</w:t>
+                  </w:r>
+                </w:p>
+              </w:tc>
+            </w:tr>
+            <w:tr>
+              <w:tc>
+                <w:tcPr/>
+                <w:p>
+                  <w:pPr>
+                    <w:pStyle w:val="Compact"/>
+                    <w:jc w:val="center"/>
+                  </w:pPr>
+                  <w:r>
+                    <w:t xml:space="preserve">B2-P</w:t>
+                  </w:r>
+                </w:p>
+              </w:tc>
+              <w:tc>
+                <w:tcPr/>
+                <w:p>
+                  <w:pPr>
+                    <w:pStyle w:val="Compact"/>
+                    <w:jc w:val="center"/>
+                  </w:pPr>
+                  <w:r>
+                    <w:t xml:space="preserve">− 결정 프로토콜·청구 잠금</w:t>
+                  </w:r>
+                </w:p>
+              </w:tc>
+              <w:tc>
+                <w:tcPr/>
+                <w:p>
+                  <w:pPr>
+                    <w:pStyle w:val="Compact"/>
+                    <w:jc w:val="center"/>
+                  </w:pPr>
+                  <w:r>
+                    <w:t xml:space="preserve">절제(미승인)</w:t>
+                  </w:r>
+                </w:p>
+              </w:tc>
+              <w:tc>
+                <w:tcPr/>
+                <w:p>
+                  <w:pPr>
+                    <w:pStyle w:val="Compact"/>
+                    <w:jc w:val="center"/>
+                  </w:pPr>
+                  <w:r>
+                    <w:t xml:space="preserve">미실행</w:t>
+                  </w:r>
+                </w:p>
+              </w:tc>
+            </w:tr>
+            <w:tr>
+              <w:tc>
+                <w:tcPr/>
+                <w:p>
+                  <w:pPr>
+                    <w:pStyle w:val="Compact"/>
+                    <w:jc w:val="center"/>
+                  </w:pPr>
+                  <w:r>
+                    <w:t xml:space="preserve">B2-R</w:t>
+                  </w:r>
+                </w:p>
+              </w:tc>
+              <w:tc>
+                <w:tcPr/>
+                <w:p>
+                  <w:pPr>
+                    <w:pStyle w:val="Compact"/>
+                    <w:jc w:val="center"/>
+                  </w:pPr>
+                  <w:r>
+                    <w:t xml:space="preserve">− 결과 주도 검색</w:t>
+                  </w:r>
+                </w:p>
+              </w:tc>
+              <w:tc>
+                <w:tcPr/>
+                <w:p>
+                  <w:pPr>
+                    <w:pStyle w:val="Compact"/>
+                    <w:jc w:val="center"/>
+                  </w:pPr>
+                  <w:r>
+                    <w:t xml:space="preserve">절제(미승인)</w:t>
+                  </w:r>
+                </w:p>
+              </w:tc>
+              <w:tc>
+                <w:tcPr/>
+                <w:p>
+                  <w:pPr>
+                    <w:pStyle w:val="Compact"/>
+                    <w:jc w:val="center"/>
+                  </w:pPr>
+                  <w:r>
+                    <w:t xml:space="preserve">미실행</w:t>
+                  </w:r>
+                </w:p>
+              </w:tc>
+            </w:tr>
+            <w:tr>
+              <w:tc>
+                <w:tcPr/>
+                <w:p>
+                  <w:pPr>
+                    <w:pStyle w:val="Compact"/>
+                    <w:jc w:val="center"/>
+                  </w:pPr>
+                  <w:r>
+                    <w:t xml:space="preserve">B2-L</w:t>
+                  </w:r>
+                </w:p>
+              </w:tc>
+              <w:tc>
+                <w:tcPr/>
+                <w:p>
+                  <w:pPr>
+                    <w:pStyle w:val="Compact"/>
+                    <w:jc w:val="center"/>
+                  </w:pPr>
+                  <w:r>
+                    <w:t xml:space="preserve">− 반증 루프</w:t>
+                  </w:r>
+                </w:p>
+              </w:tc>
+              <w:tc>
+                <w:tcPr/>
+                <w:p>
+                  <w:pPr>
+                    <w:pStyle w:val="Compact"/>
+                    <w:jc w:val="center"/>
+                  </w:pPr>
+                  <w:r>
+                    <w:t xml:space="preserve">절제(미승인)</w:t>
+                  </w:r>
+                </w:p>
+              </w:tc>
+              <w:tc>
+                <w:tcPr/>
+                <w:p>
+                  <w:pPr>
+                    <w:pStyle w:val="Compact"/>
+                    <w:jc w:val="center"/>
+                  </w:pPr>
+                  <w:r>
+                    <w:t xml:space="preserve">미실행</w:t>
+                  </w:r>
+                </w:p>
+              </w:tc>
+            </w:tr>
+          </w:tbl>
+          <w:bookmarkEnd w:id="90"/>
+          <w:p/>
+        </w:tc>
+      </w:tr>
+    </w:tbl>
+    <w:p>
+      <w:pPr>
+        <w:pStyle w:val="BodyText"/>
+      </w:pPr>
+      <w:r>
+        <w:t xml:space="preserve">설계 값은 결과가 아니므로 분리해 적는다. 1차 검정의 최소 검출 가능 효과는 라벨된 검정력 계산에서 나온다.</w:t>
+      </w:r>
+      <w:r>
+        <w:t xml:space="preserve"> </w:t>
+      </w:r>
+      <w:r>
+        <w:t xml:space="preserve">과제 3종을 풀링한 120쌍에서 절대 통과율 차</w:t>
+      </w:r>
+      <w:r>
+        <w:t xml:space="preserve"> </w:t>
+      </w:r>
+      <w:r>
+        <w:rPr>
+          <w:b/>
+          <w:bCs/>
+        </w:rPr>
+        <w:t xml:space="preserve">0.140</w:t>
+      </w:r>
+      <w:r>
+        <w:t xml:space="preserve">, 과제별 40쌍에서</w:t>
+      </w:r>
+      <w:r>
+        <w:t xml:space="preserve"> </w:t>
+      </w:r>
+      <w:r>
+        <w:rPr>
+          <w:b/>
+          <w:bCs/>
+        </w:rPr>
+        <w:t xml:space="preserve">0.243</w:t>
+      </w:r>
+      <w:r>
+        <w:t xml:space="preserve">이다(불일치율 0.30 가정).</w:t>
+      </w:r>
+      <w:r>
+        <w:t xml:space="preserve"> </w:t>
+      </w:r>
+      <w:r>
+        <w:t xml:space="preserve">이 값들은 설계 파라미터이지 관측이 아니다. 선행 연구에도 같은 함정의 사례가 있다. 한 하네스 진화 연구는</w:t>
+      </w:r>
+      <w:r>
+        <w:t xml:space="preserve"> </w:t>
+      </w:r>
+      <w:r>
+        <w:t xml:space="preserve">41개 보류 과제에서 25/41 대 28/41의 차이를 짝지은 정확 McNemar로 검정해</w:t>
+      </w:r>
+      <w:r>
+        <w:t xml:space="preserve"> </w:t>
+      </w:r>
+      <w:r>
+        <w:rPr>
+          <w:b/>
+          <w:bCs/>
+        </w:rPr>
+        <w:t xml:space="preserve">p = 0.45</w:t>
+      </w:r>
+      <w:r>
+        <w:t xml:space="preserve">를 얻고,</w:t>
+      </w:r>
+      <w:r>
+        <w:t xml:space="preserve"> </w:t>
+      </w:r>
+      <w:r>
+        <w:t xml:space="preserve">스스로 결정적이지 않다고 적었다</w:t>
+      </w:r>
+      <w:r>
+        <w:t xml:space="preserve"> </w:t>
+      </w:r>
+      <w:r>
+        <w:t xml:space="preserve">[53]</w:t>
+      </w:r>
+      <w:r>
+        <w:t xml:space="preserve">. 본 연구가 검출 한계를</w:t>
+      </w:r>
+      <w:r>
+        <w:t xml:space="preserve"> </w:t>
+      </w:r>
+      <w:r>
+        <w:rPr>
+          <w:b/>
+          <w:bCs/>
+        </w:rPr>
+        <w:t xml:space="preserve">결과 이전에</w:t>
+      </w:r>
+      <w:r>
+        <w:t xml:space="preserve"> </w:t>
+      </w:r>
+      <w:r>
+        <w:t xml:space="preserve">공개하는 이유다.</w:t>
+      </w:r>
+    </w:p>
+    <w:p>
+      <w:pPr>
+        <w:pStyle w:val="BodyText"/>
+      </w:pPr>
+      <w:r>
+        <w:t xml:space="preserve">에피소드 단가는 Study A에서 실측된 값이며, 확장 추정의 근거로만 쓴다. 실행 승인 범위는 1차 스크리닝</w:t>
+      </w:r>
+      <w:r>
+        <w:t xml:space="preserve"> </w:t>
+      </w:r>
+      <w:r>
+        <w:t xml:space="preserve">세 아암이고 절제 네 아암은 미승인 상태다. 승인 범위 밖의 수치는 이 논문에 등장하지 않는다.</w:t>
+      </w:r>
+    </w:p>
+    <w:bookmarkEnd w:id="91"/>
+    <w:bookmarkEnd w:id="92"/>
+    <w:bookmarkStart w:id="93" w:name="conclusions"/>
     <w:p>
       <w:pPr>
         <w:pStyle w:val="Heading1"/>
@@ -5694,7 +6969,7 @@
         <w:t xml:space="preserve"> </w:t>
       </w:r>
       <w:r>
-        <w:t xml:space="preserve">[94]</w:t>
+        <w:t xml:space="preserve">[97]</w:t>
       </w:r>
       <w:r>
         <w:t xml:space="preserve"> </w:t>
@@ -5706,7 +6981,7 @@
         <w:t xml:space="preserve"> </w:t>
       </w:r>
       <w:r>
-        <w:t xml:space="preserve">[95]</w:t>
+        <w:t xml:space="preserve">[98]</w:t>
       </w:r>
       <w:r>
         <w:t xml:space="preserve">. 본 논문이 보고하는 궁극적 결과는 처치의 우월성을 과장하는 수치가 아니라,</w:t>
@@ -5820,8 +7095,8 @@
         <w:t xml:space="preserve">는 원칙 아래에서 수행된다.</w:t>
       </w:r>
     </w:p>
-    <w:bookmarkEnd w:id="89"/>
-    <w:bookmarkStart w:id="244" w:name="참-고-문-헌-references"/>
+    <w:bookmarkEnd w:id="93"/>
+    <w:bookmarkStart w:id="254" w:name="참-고-문-헌-references"/>
     <w:p>
       <w:pPr>
         <w:pStyle w:val="Heading1"/>
@@ -5830,8 +7105,8 @@
         <w:t xml:space="preserve">참 고 문 헌 (References)</w:t>
       </w:r>
     </w:p>
-    <w:bookmarkStart w:id="243" w:name="refs"/>
-    <w:bookmarkStart w:id="91" w:name="ref-react2023"/>
+    <w:bookmarkStart w:id="253" w:name="refs"/>
+    <w:bookmarkStart w:id="95" w:name="ref-react2023"/>
     <w:p>
       <w:pPr>
         <w:pStyle w:val="Bibliography"/>
@@ -5860,7 +7135,7 @@
       <w:r>
         <w:t xml:space="preserve"> </w:t>
       </w:r>
-      <w:hyperlink r:id="rId90">
+      <w:hyperlink r:id="rId94">
         <w:r>
           <w:rPr>
             <w:rStyle w:val="Hyperlink"/>
@@ -5869,8 +7144,8 @@
         </w:r>
       </w:hyperlink>
     </w:p>
-    <w:bookmarkEnd w:id="91"/>
-    <w:bookmarkStart w:id="93" w:name="ref-memgpt2023"/>
+    <w:bookmarkEnd w:id="95"/>
+    <w:bookmarkStart w:id="97" w:name="ref-memgpt2023"/>
     <w:p>
       <w:pPr>
         <w:pStyle w:val="Bibliography"/>
@@ -5899,7 +7174,7 @@
       <w:r>
         <w:t xml:space="preserve"> </w:t>
       </w:r>
-      <w:hyperlink r:id="rId92">
+      <w:hyperlink r:id="rId96">
         <w:r>
           <w:rPr>
             <w:rStyle w:val="Hyperlink"/>
@@ -5908,8 +7183,8 @@
         </w:r>
       </w:hyperlink>
     </w:p>
-    <w:bookmarkEnd w:id="93"/>
-    <w:bookmarkStart w:id="95" w:name="ref-rlm2025"/>
+    <w:bookmarkEnd w:id="97"/>
+    <w:bookmarkStart w:id="99" w:name="ref-rlm2025"/>
     <w:p>
       <w:pPr>
         <w:pStyle w:val="Bibliography"/>
@@ -5938,7 +7213,7 @@
       <w:r>
         <w:t xml:space="preserve"> </w:t>
       </w:r>
-      <w:hyperlink r:id="rId94">
+      <w:hyperlink r:id="rId98">
         <w:r>
           <w:rPr>
             <w:rStyle w:val="Hyperlink"/>
@@ -5947,8 +7222,8 @@
         </w:r>
       </w:hyperlink>
     </w:p>
-    <w:bookmarkEnd w:id="95"/>
-    <w:bookmarkStart w:id="97" w:name="ref-autogen2023"/>
+    <w:bookmarkEnd w:id="99"/>
+    <w:bookmarkStart w:id="101" w:name="ref-autogen2023"/>
     <w:p>
       <w:pPr>
         <w:pStyle w:val="Bibliography"/>
@@ -5977,7 +7252,7 @@
       <w:r>
         <w:t xml:space="preserve"> </w:t>
       </w:r>
-      <w:hyperlink r:id="rId96">
+      <w:hyperlink r:id="rId100">
         <w:r>
           <w:rPr>
             <w:rStyle w:val="Hyperlink"/>
@@ -5986,8 +7261,8 @@
         </w:r>
       </w:hyperlink>
     </w:p>
-    <w:bookmarkEnd w:id="97"/>
-    <w:bookmarkStart w:id="99" w:name="ref-genaimeasurement2025"/>
+    <w:bookmarkEnd w:id="101"/>
+    <w:bookmarkStart w:id="103" w:name="ref-genaimeasurement2025"/>
     <w:p>
       <w:pPr>
         <w:pStyle w:val="Bibliography"/>
@@ -6016,7 +7291,7 @@
       <w:r>
         <w:t xml:space="preserve"> </w:t>
       </w:r>
-      <w:hyperlink r:id="rId98">
+      <w:hyperlink r:id="rId102">
         <w:r>
           <w:rPr>
             <w:rStyle w:val="Hyperlink"/>
@@ -6025,8 +7300,8 @@
         </w:r>
       </w:hyperlink>
     </w:p>
-    <w:bookmarkEnd w:id="99"/>
-    <w:bookmarkStart w:id="101" w:name="ref-whogrades2026"/>
+    <w:bookmarkEnd w:id="103"/>
+    <w:bookmarkStart w:id="105" w:name="ref-whogrades2026"/>
     <w:p>
       <w:pPr>
         <w:pStyle w:val="Bibliography"/>
@@ -6055,7 +7330,7 @@
       <w:r>
         <w:t xml:space="preserve"> </w:t>
       </w:r>
-      <w:hyperlink r:id="rId100">
+      <w:hyperlink r:id="rId104">
         <w:r>
           <w:rPr>
             <w:rStyle w:val="Hyperlink"/>
@@ -6064,8 +7339,8 @@
         </w:r>
       </w:hyperlink>
     </w:p>
-    <w:bookmarkEnd w:id="101"/>
-    <w:bookmarkStart w:id="103" w:name="ref-verifiergap2026"/>
+    <w:bookmarkEnd w:id="105"/>
+    <w:bookmarkStart w:id="107" w:name="ref-verifiergap2026"/>
     <w:p>
       <w:pPr>
         <w:pStyle w:val="Bibliography"/>
@@ -6094,7 +7369,7 @@
       <w:r>
         <w:t xml:space="preserve"> </w:t>
       </w:r>
-      <w:hyperlink r:id="rId102">
+      <w:hyperlink r:id="rId106">
         <w:r>
           <w:rPr>
             <w:rStyle w:val="Hyperlink"/>
@@ -6103,8 +7378,8 @@
         </w:r>
       </w:hyperlink>
     </w:p>
-    <w:bookmarkEnd w:id="103"/>
-    <w:bookmarkStart w:id="105" w:name="ref-harnesstamper2026"/>
+    <w:bookmarkEnd w:id="107"/>
+    <w:bookmarkStart w:id="109" w:name="ref-harnesstamper2026"/>
     <w:p>
       <w:pPr>
         <w:pStyle w:val="Bibliography"/>
@@ -6133,7 +7408,7 @@
       <w:r>
         <w:t xml:space="preserve"> </w:t>
       </w:r>
-      <w:hyperlink r:id="rId104">
+      <w:hyperlink r:id="rId108">
         <w:r>
           <w:rPr>
             <w:rStyle w:val="Hyperlink"/>
@@ -6142,8 +7417,8 @@
         </w:r>
       </w:hyperlink>
     </w:p>
-    <w:bookmarkEnd w:id="105"/>
-    <w:bookmarkStart w:id="107" w:name="ref-auditablewriting2026"/>
+    <w:bookmarkEnd w:id="109"/>
+    <w:bookmarkStart w:id="111" w:name="ref-auditablewriting2026"/>
     <w:p>
       <w:pPr>
         <w:pStyle w:val="Bibliography"/>
@@ -6172,7 +7447,7 @@
       <w:r>
         <w:t xml:space="preserve"> </w:t>
       </w:r>
-      <w:hyperlink r:id="rId106">
+      <w:hyperlink r:id="rId110">
         <w:r>
           <w:rPr>
             <w:rStyle w:val="Hyperlink"/>
@@ -6181,8 +7456,8 @@
         </w:r>
       </w:hyperlink>
     </w:p>
-    <w:bookmarkEnd w:id="107"/>
-    <w:bookmarkStart w:id="109" w:name="ref-reflexion2023"/>
+    <w:bookmarkEnd w:id="111"/>
+    <w:bookmarkStart w:id="113" w:name="ref-reflexion2023"/>
     <w:p>
       <w:pPr>
         <w:pStyle w:val="Bibliography"/>
@@ -6211,7 +7486,7 @@
       <w:r>
         <w:t xml:space="preserve"> </w:t>
       </w:r>
-      <w:hyperlink r:id="rId108">
+      <w:hyperlink r:id="rId112">
         <w:r>
           <w:rPr>
             <w:rStyle w:val="Hyperlink"/>
@@ -6220,8 +7495,8 @@
         </w:r>
       </w:hyperlink>
     </w:p>
-    <w:bookmarkEnd w:id="109"/>
-    <w:bookmarkStart w:id="111" w:name="ref-rag2020"/>
+    <w:bookmarkEnd w:id="113"/>
+    <w:bookmarkStart w:id="115" w:name="ref-rag2020"/>
     <w:p>
       <w:pPr>
         <w:pStyle w:val="Bibliography"/>
@@ -6250,7 +7525,7 @@
       <w:r>
         <w:t xml:space="preserve"> </w:t>
       </w:r>
-      <w:hyperlink r:id="rId110">
+      <w:hyperlink r:id="rId114">
         <w:r>
           <w:rPr>
             <w:rStyle w:val="Hyperlink"/>
@@ -6259,8 +7534,8 @@
         </w:r>
       </w:hyperlink>
     </w:p>
-    <w:bookmarkEnd w:id="111"/>
-    <w:bookmarkStart w:id="113" w:name="ref-codeharness2026"/>
+    <w:bookmarkEnd w:id="115"/>
+    <w:bookmarkStart w:id="117" w:name="ref-codeharness2026"/>
     <w:p>
       <w:pPr>
         <w:pStyle w:val="Bibliography"/>
@@ -6292,7 +7567,7 @@
       <w:r>
         <w:t xml:space="preserve"> </w:t>
       </w:r>
-      <w:hyperlink r:id="rId112">
+      <w:hyperlink r:id="rId116">
         <w:r>
           <w:rPr>
             <w:rStyle w:val="Hyperlink"/>
@@ -6301,8 +7576,8 @@
         </w:r>
       </w:hyperlink>
     </w:p>
-    <w:bookmarkEnd w:id="113"/>
-    <w:bookmarkStart w:id="115" w:name="ref-dive2026"/>
+    <w:bookmarkEnd w:id="117"/>
+    <w:bookmarkStart w:id="119" w:name="ref-dive2026"/>
     <w:p>
       <w:pPr>
         <w:pStyle w:val="Bibliography"/>
@@ -6331,7 +7606,7 @@
       <w:r>
         <w:t xml:space="preserve"> </w:t>
       </w:r>
-      <w:hyperlink r:id="rId114">
+      <w:hyperlink r:id="rId118">
         <w:r>
           <w:rPr>
             <w:rStyle w:val="Hyperlink"/>
@@ -6340,8 +7615,8 @@
         </w:r>
       </w:hyperlink>
     </w:p>
-    <w:bookmarkEnd w:id="115"/>
-    <w:bookmarkStart w:id="117" w:name="ref-longhorizon2026"/>
+    <w:bookmarkEnd w:id="119"/>
+    <w:bookmarkStart w:id="121" w:name="ref-longhorizon2026"/>
     <w:p>
       <w:pPr>
         <w:pStyle w:val="Bibliography"/>
@@ -6370,7 +7645,7 @@
       <w:r>
         <w:t xml:space="preserve"> </w:t>
       </w:r>
-      <w:hyperlink r:id="rId116">
+      <w:hyperlink r:id="rId120">
         <w:r>
           <w:rPr>
             <w:rStyle w:val="Hyperlink"/>
@@ -6379,8 +7654,8 @@
         </w:r>
       </w:hyperlink>
     </w:p>
-    <w:bookmarkEnd w:id="117"/>
-    <w:bookmarkStart w:id="119" w:name="ref-loopsbench2026"/>
+    <w:bookmarkEnd w:id="121"/>
+    <w:bookmarkStart w:id="123" w:name="ref-loopsbench2026"/>
     <w:p>
       <w:pPr>
         <w:pStyle w:val="Bibliography"/>
@@ -6412,7 +7687,7 @@
       <w:r>
         <w:t xml:space="preserve"> </w:t>
       </w:r>
-      <w:hyperlink r:id="rId118">
+      <w:hyperlink r:id="rId122">
         <w:r>
           <w:rPr>
             <w:rStyle w:val="Hyperlink"/>
@@ -6421,8 +7696,8 @@
         </w:r>
       </w:hyperlink>
     </w:p>
-    <w:bookmarkEnd w:id="119"/>
-    <w:bookmarkStart w:id="121" w:name="ref-scroll2026"/>
+    <w:bookmarkEnd w:id="123"/>
+    <w:bookmarkStart w:id="125" w:name="ref-scroll2026"/>
     <w:p>
       <w:pPr>
         <w:pStyle w:val="Bibliography"/>
@@ -6451,7 +7726,7 @@
       <w:r>
         <w:t xml:space="preserve"> </w:t>
       </w:r>
-      <w:hyperlink r:id="rId120">
+      <w:hyperlink r:id="rId124">
         <w:r>
           <w:rPr>
             <w:rStyle w:val="Hyperlink"/>
@@ -6460,8 +7735,8 @@
         </w:r>
       </w:hyperlink>
     </w:p>
-    <w:bookmarkEnd w:id="121"/>
-    <w:bookmarkStart w:id="123" w:name="ref-protocoltaxonomy2026"/>
+    <w:bookmarkEnd w:id="125"/>
+    <w:bookmarkStart w:id="127" w:name="ref-protocoltaxonomy2026"/>
     <w:p>
       <w:pPr>
         <w:pStyle w:val="Bibliography"/>
@@ -6490,7 +7765,7 @@
       <w:r>
         <w:t xml:space="preserve"> </w:t>
       </w:r>
-      <w:hyperlink r:id="rId122">
+      <w:hyperlink r:id="rId126">
         <w:r>
           <w:rPr>
             <w:rStyle w:val="Hyperlink"/>
@@ -6499,8 +7774,8 @@
         </w:r>
       </w:hyperlink>
     </w:p>
-    <w:bookmarkEnd w:id="123"/>
-    <w:bookmarkStart w:id="125" w:name="ref-chap2026"/>
+    <w:bookmarkEnd w:id="127"/>
+    <w:bookmarkStart w:id="129" w:name="ref-chap2026"/>
     <w:p>
       <w:pPr>
         <w:pStyle w:val="Bibliography"/>
@@ -6529,7 +7804,7 @@
       <w:r>
         <w:t xml:space="preserve"> </w:t>
       </w:r>
-      <w:hyperlink r:id="rId124">
+      <w:hyperlink r:id="rId128">
         <w:r>
           <w:rPr>
             <w:rStyle w:val="Hyperlink"/>
@@ -6538,8 +7813,8 @@
         </w:r>
       </w:hyperlink>
     </w:p>
-    <w:bookmarkEnd w:id="125"/>
-    <w:bookmarkStart w:id="127" w:name="ref-insemrag2026"/>
+    <w:bookmarkEnd w:id="129"/>
+    <w:bookmarkStart w:id="131" w:name="ref-insemrag2026"/>
     <w:p>
       <w:pPr>
         <w:pStyle w:val="Bibliography"/>
@@ -6571,7 +7846,7 @@
       <w:r>
         <w:t xml:space="preserve"> </w:t>
       </w:r>
-      <w:hyperlink r:id="rId126">
+      <w:hyperlink r:id="rId130">
         <w:r>
           <w:rPr>
             <w:rStyle w:val="Hyperlink"/>
@@ -6580,8 +7855,8 @@
         </w:r>
       </w:hyperlink>
     </w:p>
-    <w:bookmarkEnd w:id="127"/>
-    <w:bookmarkStart w:id="129" w:name="ref-sciret2026"/>
+    <w:bookmarkEnd w:id="131"/>
+    <w:bookmarkStart w:id="133" w:name="ref-sciret2026"/>
     <w:p>
       <w:pPr>
         <w:pStyle w:val="Bibliography"/>
@@ -6610,7 +7885,7 @@
       <w:r>
         <w:t xml:space="preserve"> </w:t>
       </w:r>
-      <w:hyperlink r:id="rId128">
+      <w:hyperlink r:id="rId132">
         <w:r>
           <w:rPr>
             <w:rStyle w:val="Hyperlink"/>
@@ -6619,8 +7894,8 @@
         </w:r>
       </w:hyperlink>
     </w:p>
-    <w:bookmarkEnd w:id="129"/>
-    <w:bookmarkStart w:id="131" w:name="ref-adaptiverag2026"/>
+    <w:bookmarkEnd w:id="133"/>
+    <w:bookmarkStart w:id="135" w:name="ref-adaptiverag2026"/>
     <w:p>
       <w:pPr>
         <w:pStyle w:val="Bibliography"/>
@@ -6649,7 +7924,7 @@
       <w:r>
         <w:t xml:space="preserve"> </w:t>
       </w:r>
-      <w:hyperlink r:id="rId130">
+      <w:hyperlink r:id="rId134">
         <w:r>
           <w:rPr>
             <w:rStyle w:val="Hyperlink"/>
@@ -6658,8 +7933,8 @@
         </w:r>
       </w:hyperlink>
     </w:p>
-    <w:bookmarkEnd w:id="131"/>
-    <w:bookmarkStart w:id="133" w:name="ref-llmrouter2026"/>
+    <w:bookmarkEnd w:id="135"/>
+    <w:bookmarkStart w:id="137" w:name="ref-llmrouter2026"/>
     <w:p>
       <w:pPr>
         <w:pStyle w:val="Bibliography"/>
@@ -6691,7 +7966,7 @@
       <w:r>
         <w:t xml:space="preserve"> </w:t>
       </w:r>
-      <w:hyperlink r:id="rId132">
+      <w:hyperlink r:id="rId136">
         <w:r>
           <w:rPr>
             <w:rStyle w:val="Hyperlink"/>
@@ -6700,8 +7975,8 @@
         </w:r>
       </w:hyperlink>
     </w:p>
-    <w:bookmarkEnd w:id="133"/>
-    <w:bookmarkStart w:id="135" w:name="ref-resamplereroute2026"/>
+    <w:bookmarkEnd w:id="137"/>
+    <w:bookmarkStart w:id="139" w:name="ref-resamplereroute2026"/>
     <w:p>
       <w:pPr>
         <w:pStyle w:val="Bibliography"/>
@@ -6730,7 +8005,7 @@
       <w:r>
         <w:t xml:space="preserve"> </w:t>
       </w:r>
-      <w:hyperlink r:id="rId134">
+      <w:hyperlink r:id="rId138">
         <w:r>
           <w:rPr>
             <w:rStyle w:val="Hyperlink"/>
@@ -6739,8 +8014,8 @@
         </w:r>
       </w:hyperlink>
     </w:p>
-    <w:bookmarkEnd w:id="135"/>
-    <w:bookmarkStart w:id="137" w:name="ref-controlledorchestration2026"/>
+    <w:bookmarkEnd w:id="139"/>
+    <w:bookmarkStart w:id="141" w:name="ref-controlledorchestration2026"/>
     <w:p>
       <w:pPr>
         <w:pStyle w:val="Bibliography"/>
@@ -6769,7 +8044,7 @@
       <w:r>
         <w:t xml:space="preserve"> </w:t>
       </w:r>
-      <w:hyperlink r:id="rId136">
+      <w:hyperlink r:id="rId140">
         <w:r>
           <w:rPr>
             <w:rStyle w:val="Hyperlink"/>
@@ -6778,8 +8053,8 @@
         </w:r>
       </w:hyperlink>
     </w:p>
-    <w:bookmarkEnd w:id="137"/>
-    <w:bookmarkStart w:id="139" w:name="ref-agora2026"/>
+    <w:bookmarkEnd w:id="141"/>
+    <w:bookmarkStart w:id="143" w:name="ref-agora2026"/>
     <w:p>
       <w:pPr>
         <w:pStyle w:val="Bibliography"/>
@@ -6808,7 +8083,7 @@
       <w:r>
         <w:t xml:space="preserve"> </w:t>
       </w:r>
-      <w:hyperlink r:id="rId138">
+      <w:hyperlink r:id="rId142">
         <w:r>
           <w:rPr>
             <w:rStyle w:val="Hyperlink"/>
@@ -6817,8 +8092,8 @@
         </w:r>
       </w:hyperlink>
     </w:p>
-    <w:bookmarkEnd w:id="139"/>
-    <w:bookmarkStart w:id="141" w:name="ref-aiscientist2024"/>
+    <w:bookmarkEnd w:id="143"/>
+    <w:bookmarkStart w:id="145" w:name="ref-aiscientist2024"/>
     <w:p>
       <w:pPr>
         <w:pStyle w:val="Bibliography"/>
@@ -6847,7 +8122,7 @@
       <w:r>
         <w:t xml:space="preserve"> </w:t>
       </w:r>
-      <w:hyperlink r:id="rId140">
+      <w:hyperlink r:id="rId144">
         <w:r>
           <w:rPr>
             <w:rStyle w:val="Hyperlink"/>
@@ -6856,8 +8131,8 @@
         </w:r>
       </w:hyperlink>
     </w:p>
-    <w:bookmarkEnd w:id="141"/>
-    <w:bookmarkStart w:id="143" w:name="ref-coscientist2025"/>
+    <w:bookmarkEnd w:id="145"/>
+    <w:bookmarkStart w:id="147" w:name="ref-coscientist2025"/>
     <w:p>
       <w:pPr>
         <w:pStyle w:val="Bibliography"/>
@@ -6889,7 +8164,7 @@
       <w:r>
         <w:t xml:space="preserve"> </w:t>
       </w:r>
-      <w:hyperlink r:id="rId142">
+      <w:hyperlink r:id="rId146">
         <w:r>
           <w:rPr>
             <w:rStyle w:val="Hyperlink"/>
@@ -6898,8 +8173,8 @@
         </w:r>
       </w:hyperlink>
     </w:p>
-    <w:bookmarkEnd w:id="143"/>
-    <w:bookmarkStart w:id="145" w:name="ref-sciagents2024"/>
+    <w:bookmarkEnd w:id="147"/>
+    <w:bookmarkStart w:id="149" w:name="ref-sciagents2024"/>
     <w:p>
       <w:pPr>
         <w:pStyle w:val="Bibliography"/>
@@ -6928,7 +8203,7 @@
       <w:r>
         <w:t xml:space="preserve"> </w:t>
       </w:r>
-      <w:hyperlink r:id="rId144">
+      <w:hyperlink r:id="rId148">
         <w:r>
           <w:rPr>
             <w:rStyle w:val="Hyperlink"/>
@@ -6937,8 +8212,8 @@
         </w:r>
       </w:hyperlink>
     </w:p>
-    <w:bookmarkEnd w:id="145"/>
-    <w:bookmarkStart w:id="147" w:name="ref-evigraph2026"/>
+    <w:bookmarkEnd w:id="149"/>
+    <w:bookmarkStart w:id="151" w:name="ref-evigraph2026"/>
     <w:p>
       <w:pPr>
         <w:pStyle w:val="Bibliography"/>
@@ -6967,7 +8242,7 @@
       <w:r>
         <w:t xml:space="preserve"> </w:t>
       </w:r>
-      <w:hyperlink r:id="rId146">
+      <w:hyperlink r:id="rId150">
         <w:r>
           <w:rPr>
             <w:rStyle w:val="Hyperlink"/>
@@ -6976,8 +8251,8 @@
         </w:r>
       </w:hyperlink>
     </w:p>
-    <w:bookmarkEnd w:id="147"/>
-    <w:bookmarkStart w:id="149" w:name="ref-xscientist2026"/>
+    <w:bookmarkEnd w:id="151"/>
+    <w:bookmarkStart w:id="153" w:name="ref-xscientist2026"/>
     <w:p>
       <w:pPr>
         <w:pStyle w:val="Bibliography"/>
@@ -7006,7 +8281,7 @@
       <w:r>
         <w:t xml:space="preserve"> </w:t>
       </w:r>
-      <w:hyperlink r:id="rId148">
+      <w:hyperlink r:id="rId152">
         <w:r>
           <w:rPr>
             <w:rStyle w:val="Hyperlink"/>
@@ -7015,8 +8290,8 @@
         </w:r>
       </w:hyperlink>
     </w:p>
-    <w:bookmarkEnd w:id="149"/>
-    <w:bookmarkStart w:id="151" w:name="ref-scientistone2026"/>
+    <w:bookmarkEnd w:id="153"/>
+    <w:bookmarkStart w:id="155" w:name="ref-scientistone2026"/>
     <w:p>
       <w:pPr>
         <w:pStyle w:val="Bibliography"/>
@@ -7045,7 +8320,7 @@
       <w:r>
         <w:t xml:space="preserve"> </w:t>
       </w:r>
-      <w:hyperlink r:id="rId150">
+      <w:hyperlink r:id="rId154">
         <w:r>
           <w:rPr>
             <w:rStyle w:val="Hyperlink"/>
@@ -7054,8 +8329,8 @@
         </w:r>
       </w:hyperlink>
     </w:p>
-    <w:bookmarkEnd w:id="151"/>
-    <w:bookmarkStart w:id="153" w:name="ref-scope2026"/>
+    <w:bookmarkEnd w:id="155"/>
+    <w:bookmarkStart w:id="157" w:name="ref-scope2026"/>
     <w:p>
       <w:pPr>
         <w:pStyle w:val="Bibliography"/>
@@ -7087,7 +8362,7 @@
       <w:r>
         <w:t xml:space="preserve"> </w:t>
       </w:r>
-      <w:hyperlink r:id="rId152">
+      <w:hyperlink r:id="rId156">
         <w:r>
           <w:rPr>
             <w:rStyle w:val="Hyperlink"/>
@@ -7096,8 +8371,8 @@
         </w:r>
       </w:hyperlink>
     </w:p>
-    <w:bookmarkEnd w:id="153"/>
-    <w:bookmarkStart w:id="155" w:name="ref-searchdiagnosis2026"/>
+    <w:bookmarkEnd w:id="157"/>
+    <w:bookmarkStart w:id="159" w:name="ref-searchdiagnosis2026"/>
     <w:p>
       <w:pPr>
         <w:pStyle w:val="Bibliography"/>
@@ -7126,7 +8401,7 @@
       <w:r>
         <w:t xml:space="preserve"> </w:t>
       </w:r>
-      <w:hyperlink r:id="rId154">
+      <w:hyperlink r:id="rId158">
         <w:r>
           <w:rPr>
             <w:rStyle w:val="Hyperlink"/>
@@ -7135,8 +8410,8 @@
         </w:r>
       </w:hyperlink>
     </w:p>
-    <w:bookmarkEnd w:id="155"/>
-    <w:bookmarkStart w:id="157" w:name="ref-researchclawbench2026"/>
+    <w:bookmarkEnd w:id="159"/>
+    <w:bookmarkStart w:id="161" w:name="ref-researchclawbench2026"/>
     <w:p>
       <w:pPr>
         <w:pStyle w:val="Bibliography"/>
@@ -7168,7 +8443,7 @@
       <w:r>
         <w:t xml:space="preserve"> </w:t>
       </w:r>
-      <w:hyperlink r:id="rId156">
+      <w:hyperlink r:id="rId160">
         <w:r>
           <w:rPr>
             <w:rStyle w:val="Hyperlink"/>
@@ -7177,8 +8452,8 @@
         </w:r>
       </w:hyperlink>
     </w:p>
-    <w:bookmarkEnd w:id="157"/>
-    <w:bookmarkStart w:id="159" w:name="ref-arbor2026"/>
+    <w:bookmarkEnd w:id="161"/>
+    <w:bookmarkStart w:id="163" w:name="ref-arbor2026"/>
     <w:p>
       <w:pPr>
         <w:pStyle w:val="Bibliography"/>
@@ -7210,7 +8485,7 @@
       <w:r>
         <w:t xml:space="preserve"> </w:t>
       </w:r>
-      <w:hyperlink r:id="rId158">
+      <w:hyperlink r:id="rId162">
         <w:r>
           <w:rPr>
             <w:rStyle w:val="Hyperlink"/>
@@ -7219,8 +8494,8 @@
         </w:r>
       </w:hyperlink>
     </w:p>
-    <w:bookmarkEnd w:id="159"/>
-    <w:bookmarkStart w:id="161" w:name="ref-hep2026"/>
+    <w:bookmarkEnd w:id="163"/>
+    <w:bookmarkStart w:id="165" w:name="ref-hep2026"/>
     <w:p>
       <w:pPr>
         <w:pStyle w:val="Bibliography"/>
@@ -7249,7 +8524,7 @@
       <w:r>
         <w:t xml:space="preserve"> </w:t>
       </w:r>
-      <w:hyperlink r:id="rId160">
+      <w:hyperlink r:id="rId164">
         <w:r>
           <w:rPr>
             <w:rStyle w:val="Hyperlink"/>
@@ -7258,8 +8533,8 @@
         </w:r>
       </w:hyperlink>
     </w:p>
-    <w:bookmarkEnd w:id="161"/>
-    <w:bookmarkStart w:id="163" w:name="ref-continual2026"/>
+    <w:bookmarkEnd w:id="165"/>
+    <w:bookmarkStart w:id="167" w:name="ref-continual2026"/>
     <w:p>
       <w:pPr>
         <w:pStyle w:val="Bibliography"/>
@@ -7288,7 +8563,7 @@
       <w:r>
         <w:t xml:space="preserve"> </w:t>
       </w:r>
-      <w:hyperlink r:id="rId162">
+      <w:hyperlink r:id="rId166">
         <w:r>
           <w:rPr>
             <w:rStyle w:val="Hyperlink"/>
@@ -7297,8 +8572,8 @@
         </w:r>
       </w:hyperlink>
     </w:p>
-    <w:bookmarkEnd w:id="163"/>
-    <w:bookmarkStart w:id="165" w:name="ref-rsea2026"/>
+    <w:bookmarkEnd w:id="167"/>
+    <w:bookmarkStart w:id="169" w:name="ref-rsea2026"/>
     <w:p>
       <w:pPr>
         <w:pStyle w:val="Bibliography"/>
@@ -7327,7 +8602,7 @@
       <w:r>
         <w:t xml:space="preserve"> </w:t>
       </w:r>
-      <w:hyperlink r:id="rId164">
+      <w:hyperlink r:id="rId168">
         <w:r>
           <w:rPr>
             <w:rStyle w:val="Hyperlink"/>
@@ -7336,8 +8611,8 @@
         </w:r>
       </w:hyperlink>
     </w:p>
-    <w:bookmarkEnd w:id="165"/>
-    <w:bookmarkStart w:id="167" w:name="ref-regimes2026"/>
+    <w:bookmarkEnd w:id="169"/>
+    <w:bookmarkStart w:id="171" w:name="ref-regimes2026"/>
     <w:p>
       <w:pPr>
         <w:pStyle w:val="Bibliography"/>
@@ -7366,7 +8641,7 @@
       <w:r>
         <w:t xml:space="preserve"> </w:t>
       </w:r>
-      <w:hyperlink r:id="rId166">
+      <w:hyperlink r:id="rId170">
         <w:r>
           <w:rPr>
             <w:rStyle w:val="Hyperlink"/>
@@ -7375,8 +8650,8 @@
         </w:r>
       </w:hyperlink>
     </w:p>
-    <w:bookmarkEnd w:id="167"/>
-    <w:bookmarkStart w:id="169" w:name="ref-autogenesis2026"/>
+    <w:bookmarkEnd w:id="171"/>
+    <w:bookmarkStart w:id="173" w:name="ref-autogenesis2026"/>
     <w:p>
       <w:pPr>
         <w:pStyle w:val="Bibliography"/>
@@ -7405,7 +8680,7 @@
       <w:r>
         <w:t xml:space="preserve"> </w:t>
       </w:r>
-      <w:hyperlink r:id="rId168">
+      <w:hyperlink r:id="rId172">
         <w:r>
           <w:rPr>
             <w:rStyle w:val="Hyperlink"/>
@@ -7414,8 +8689,8 @@
         </w:r>
       </w:hyperlink>
     </w:p>
-    <w:bookmarkEnd w:id="169"/>
-    <w:bookmarkStart w:id="171" w:name="ref-evobench2026"/>
+    <w:bookmarkEnd w:id="173"/>
+    <w:bookmarkStart w:id="175" w:name="ref-evobench2026"/>
     <w:p>
       <w:pPr>
         <w:pStyle w:val="Bibliography"/>
@@ -7444,7 +8719,7 @@
       <w:r>
         <w:t xml:space="preserve"> </w:t>
       </w:r>
-      <w:hyperlink r:id="rId170">
+      <w:hyperlink r:id="rId174">
         <w:r>
           <w:rPr>
             <w:rStyle w:val="Hyperlink"/>
@@ -7453,8 +8728,8 @@
         </w:r>
       </w:hyperlink>
     </w:p>
-    <w:bookmarkEnd w:id="171"/>
-    <w:bookmarkStart w:id="173" w:name="ref-harnessopt2026"/>
+    <w:bookmarkEnd w:id="175"/>
+    <w:bookmarkStart w:id="177" w:name="ref-harnessopt2026"/>
     <w:p>
       <w:pPr>
         <w:pStyle w:val="Bibliography"/>
@@ -7483,7 +8758,7 @@
       <w:r>
         <w:t xml:space="preserve"> </w:t>
       </w:r>
-      <w:hyperlink r:id="rId172">
+      <w:hyperlink r:id="rId176">
         <w:r>
           <w:rPr>
             <w:rStyle w:val="Hyperlink"/>
@@ -7492,8 +8767,8 @@
         </w:r>
       </w:hyperlink>
     </w:p>
-    <w:bookmarkEnd w:id="173"/>
-    <w:bookmarkStart w:id="175" w:name="ref-rethinkingharness2026"/>
+    <w:bookmarkEnd w:id="177"/>
+    <w:bookmarkStart w:id="179" w:name="ref-rethinkingharness2026"/>
     <w:p>
       <w:pPr>
         <w:pStyle w:val="Bibliography"/>
@@ -7522,7 +8797,7 @@
       <w:r>
         <w:t xml:space="preserve"> </w:t>
       </w:r>
-      <w:hyperlink r:id="rId174">
+      <w:hyperlink r:id="rId178">
         <w:r>
           <w:rPr>
             <w:rStyle w:val="Hyperlink"/>
@@ -7531,8 +8806,8 @@
         </w:r>
       </w:hyperlink>
     </w:p>
-    <w:bookmarkEnd w:id="175"/>
-    <w:bookmarkStart w:id="176" w:name="ref-minimalharness2026"/>
+    <w:bookmarkEnd w:id="179"/>
+    <w:bookmarkStart w:id="180" w:name="ref-minimalharness2026"/>
     <w:p>
       <w:pPr>
         <w:pStyle w:val="Bibliography"/>
@@ -7559,8 +8834,8 @@
         <w:t xml:space="preserve">. Technical Documentation and Evaluation, 2026, 2026년.</w:t>
       </w:r>
     </w:p>
-    <w:bookmarkEnd w:id="176"/>
-    <w:bookmarkStart w:id="178" w:name="ref-primeagent2026"/>
+    <w:bookmarkEnd w:id="180"/>
+    <w:bookmarkStart w:id="182" w:name="ref-primeagent2026"/>
     <w:p>
       <w:pPr>
         <w:pStyle w:val="Bibliography"/>
@@ -7602,7 +8877,7 @@
       <w:r>
         <w:t xml:space="preserve"> </w:t>
       </w:r>
-      <w:hyperlink r:id="rId177">
+      <w:hyperlink r:id="rId181">
         <w:r>
           <w:rPr>
             <w:rStyle w:val="Hyperlink"/>
@@ -7611,8 +8886,8 @@
         </w:r>
       </w:hyperlink>
     </w:p>
-    <w:bookmarkEnd w:id="178"/>
-    <w:bookmarkStart w:id="180" w:name="ref-claimlocked2026"/>
+    <w:bookmarkEnd w:id="182"/>
+    <w:bookmarkStart w:id="184" w:name="ref-claimlocked2026"/>
     <w:p>
       <w:pPr>
         <w:pStyle w:val="Bibliography"/>
@@ -7641,7 +8916,7 @@
       <w:r>
         <w:t xml:space="preserve"> </w:t>
       </w:r>
-      <w:hyperlink r:id="rId179">
+      <w:hyperlink r:id="rId183">
         <w:r>
           <w:rPr>
             <w:rStyle w:val="Hyperlink"/>
@@ -7650,8 +8925,8 @@
         </w:r>
       </w:hyperlink>
     </w:p>
-    <w:bookmarkEnd w:id="180"/>
-    <w:bookmarkStart w:id="182" w:name="ref-claimobservability2026"/>
+    <w:bookmarkEnd w:id="184"/>
+    <w:bookmarkStart w:id="186" w:name="ref-claimobservability2026"/>
     <w:p>
       <w:pPr>
         <w:pStyle w:val="Bibliography"/>
@@ -7680,7 +8955,7 @@
       <w:r>
         <w:t xml:space="preserve"> </w:t>
       </w:r>
-      <w:hyperlink r:id="rId181">
+      <w:hyperlink r:id="rId185">
         <w:r>
           <w:rPr>
             <w:rStyle w:val="Hyperlink"/>
@@ -7689,8 +8964,8 @@
         </w:r>
       </w:hyperlink>
     </w:p>
-    <w:bookmarkEnd w:id="182"/>
-    <w:bookmarkStart w:id="183" w:name="ref-controlprimitives2026"/>
+    <w:bookmarkEnd w:id="186"/>
+    <w:bookmarkStart w:id="187" w:name="ref-controlprimitives2026"/>
     <w:p>
       <w:pPr>
         <w:pStyle w:val="Bibliography"/>
@@ -7720,8 +8995,8 @@
         <w:t xml:space="preserve">. arXiv:2607.14166v3, 2026, 2026년.</w:t>
       </w:r>
     </w:p>
-    <w:bookmarkEnd w:id="183"/>
-    <w:bookmarkStart w:id="184" w:name="ref-perrequestlimit2026"/>
+    <w:bookmarkEnd w:id="187"/>
+    <w:bookmarkStart w:id="188" w:name="ref-perrequestlimit2026"/>
     <w:p>
       <w:pPr>
         <w:pStyle w:val="Bibliography"/>
@@ -7751,8 +9026,8 @@
         <w:t xml:space="preserve">. arXiv:2603.18829v10, 2026, 2026년.</w:t>
       </w:r>
     </w:p>
-    <w:bookmarkEnd w:id="184"/>
-    <w:bookmarkStart w:id="185" w:name="ref-openendedgroundtruth2026"/>
+    <w:bookmarkEnd w:id="188"/>
+    <w:bookmarkStart w:id="189" w:name="ref-openendedgroundtruth2026"/>
     <w:p>
       <w:pPr>
         <w:pStyle w:val="Bibliography"/>
@@ -7782,8 +9057,8 @@
         <w:t xml:space="preserve">. arXiv:2608.30461v1, 2026, 2026년.</w:t>
       </w:r>
     </w:p>
-    <w:bookmarkEnd w:id="185"/>
-    <w:bookmarkStart w:id="186" w:name="ref-harnesslabels2026"/>
+    <w:bookmarkEnd w:id="189"/>
+    <w:bookmarkStart w:id="190" w:name="ref-harnesslabels2026"/>
     <w:p>
       <w:pPr>
         <w:pStyle w:val="Bibliography"/>
@@ -7813,8 +9088,8 @@
         <w:t xml:space="preserve">. arXiv:2606.05922v3, 2026, 2026년.</w:t>
       </w:r>
     </w:p>
-    <w:bookmarkEnd w:id="186"/>
-    <w:bookmarkStart w:id="188" w:name="ref-checklistcredit2026"/>
+    <w:bookmarkEnd w:id="190"/>
+    <w:bookmarkStart w:id="192" w:name="ref-harnessoptbench2026"/>
     <w:p>
       <w:pPr>
         <w:pStyle w:val="Bibliography"/>
@@ -7829,6 +9104,201 @@
         <w:t xml:space="preserve">	</w:t>
       </w:r>
       <w:r>
+        <w:t xml:space="preserve">V. Ursekar</w:t>
+      </w:r>
+      <w:r>
+        <w:t xml:space="preserve"> </w:t>
+      </w:r>
+      <w:r>
+        <w:rPr>
+          <w:i/>
+          <w:iCs/>
+        </w:rPr>
+        <w:t xml:space="preserve">기타</w:t>
+      </w:r>
+      <w:r>
+        <w:t xml:space="preserve">,</w:t>
+      </w:r>
+      <w:r>
+        <w:t xml:space="preserve"> </w:t>
+      </w:r>
+      <w:r>
+        <w:t xml:space="preserve">“HarnessOpt-Bench: Benchmarking Harness Optimization for LLM Agents”</w:t>
+      </w:r>
+      <w:r>
+        <w:t xml:space="preserve">,</w:t>
+      </w:r>
+      <w:r>
+        <w:t xml:space="preserve"> </w:t>
+      </w:r>
+      <w:r>
+        <w:rPr>
+          <w:i/>
+          <w:iCs/>
+        </w:rPr>
+        <w:t xml:space="preserve">arXiv preprint arXiv:2608.06301</w:t>
+      </w:r>
+      <w:r>
+        <w:t xml:space="preserve">, 2026, Available at:</w:t>
+      </w:r>
+      <w:r>
+        <w:t xml:space="preserve"> </w:t>
+      </w:r>
+      <w:hyperlink r:id="rId191">
+        <w:r>
+          <w:rPr>
+            <w:rStyle w:val="Hyperlink"/>
+          </w:rPr>
+          <w:t xml:space="preserve">https://arxiv.org/abs/2608.06301</w:t>
+        </w:r>
+      </w:hyperlink>
+    </w:p>
+    <w:bookmarkEnd w:id="192"/>
+    <w:bookmarkStart w:id="194" w:name="ref-darwinx2026"/>
+    <w:p>
+      <w:pPr>
+        <w:pStyle w:val="Bibliography"/>
+      </w:pPr>
+      <w:r>
+        <w:t xml:space="preserve">[53]</w:t>
+      </w:r>
+      <w:r>
+        <w:t xml:space="preserve"> </w:t>
+      </w:r>
+      <w:r>
+        <w:t xml:space="preserve">	</w:t>
+      </w:r>
+      <w:r>
+        <w:t xml:space="preserve">Y. Zhang</w:t>
+      </w:r>
+      <w:r>
+        <w:t xml:space="preserve"> </w:t>
+      </w:r>
+      <w:r>
+        <w:rPr>
+          <w:i/>
+          <w:iCs/>
+        </w:rPr>
+        <w:t xml:space="preserve">기타</w:t>
+      </w:r>
+      <w:r>
+        <w:t xml:space="preserve">,</w:t>
+      </w:r>
+      <w:r>
+        <w:t xml:space="preserve"> </w:t>
+      </w:r>
+      <w:r>
+        <w:t xml:space="preserve">“DarwinX: Evolving Agent Harnesses Through Natural Selection”</w:t>
+      </w:r>
+      <w:r>
+        <w:t xml:space="preserve">,</w:t>
+      </w:r>
+      <w:r>
+        <w:t xml:space="preserve"> </w:t>
+      </w:r>
+      <w:r>
+        <w:rPr>
+          <w:i/>
+          <w:iCs/>
+        </w:rPr>
+        <w:t xml:space="preserve">arXiv preprint arXiv:2608.07545</w:t>
+      </w:r>
+      <w:r>
+        <w:t xml:space="preserve">, 2026, Available at:</w:t>
+      </w:r>
+      <w:r>
+        <w:t xml:space="preserve"> </w:t>
+      </w:r>
+      <w:hyperlink r:id="rId193">
+        <w:r>
+          <w:rPr>
+            <w:rStyle w:val="Hyperlink"/>
+          </w:rPr>
+          <w:t xml:space="preserve">https://arxiv.org/abs/2608.07545</w:t>
+        </w:r>
+      </w:hyperlink>
+    </w:p>
+    <w:bookmarkEnd w:id="194"/>
+    <w:bookmarkStart w:id="196" w:name="ref-graphengineering2026"/>
+    <w:p>
+      <w:pPr>
+        <w:pStyle w:val="Bibliography"/>
+      </w:pPr>
+      <w:r>
+        <w:t xml:space="preserve">[54]</w:t>
+      </w:r>
+      <w:r>
+        <w:t xml:space="preserve"> </w:t>
+      </w:r>
+      <w:r>
+        <w:t xml:space="preserve">	</w:t>
+      </w:r>
+      <w:r>
+        <w:t xml:space="preserve">Y. Feng</w:t>
+      </w:r>
+      <w:r>
+        <w:t xml:space="preserve"> </w:t>
+      </w:r>
+      <w:r>
+        <w:rPr>
+          <w:i/>
+          <w:iCs/>
+        </w:rPr>
+        <w:t xml:space="preserve">기타</w:t>
+      </w:r>
+      <w:r>
+        <w:t xml:space="preserve">,</w:t>
+      </w:r>
+      <w:r>
+        <w:t xml:space="preserve"> </w:t>
+      </w:r>
+      <w:r>
+        <w:t xml:space="preserve">“Graph Engineering in the Era of LLM Agents: From Individual Intelligence to System Intelligence”</w:t>
+      </w:r>
+      <w:r>
+        <w:t xml:space="preserve">,</w:t>
+      </w:r>
+      <w:r>
+        <w:t xml:space="preserve"> </w:t>
+      </w:r>
+      <w:r>
+        <w:rPr>
+          <w:i/>
+          <w:iCs/>
+        </w:rPr>
+        <w:t xml:space="preserve">arXiv preprint arXiv:2608.21156</w:t>
+      </w:r>
+      <w:r>
+        <w:t xml:space="preserve">, 2026, Available at:</w:t>
+      </w:r>
+      <w:r>
+        <w:t xml:space="preserve"> </w:t>
+      </w:r>
+      <w:hyperlink r:id="rId195">
+        <w:r>
+          <w:rPr>
+            <w:rStyle w:val="Hyperlink"/>
+          </w:rPr>
+          <w:t xml:space="preserve">https://arxiv.org/abs/2608.21156</w:t>
+        </w:r>
+      </w:hyperlink>
+    </w:p>
+    <w:bookmarkEnd w:id="196"/>
+    <w:bookmarkStart w:id="198" w:name="ref-checklistcredit2026"/>
+    <w:p>
+      <w:pPr>
+        <w:pStyle w:val="Bibliography"/>
+      </w:pPr>
+      <w:r>
+        <w:t xml:space="preserve">[55]</w:t>
+      </w:r>
+      <w:r>
+        <w:t xml:space="preserve"> </w:t>
+      </w:r>
+      <w:r>
+        <w:t xml:space="preserve">	</w:t>
+      </w:r>
+      <w:r>
         <w:t xml:space="preserve">X. W. Suliu Qin Lu Yin,</w:t>
       </w:r>
       <w:r>
@@ -7843,7 +9313,7 @@
       <w:r>
         <w:t xml:space="preserve"> </w:t>
       </w:r>
-      <w:hyperlink r:id="rId187">
+      <w:hyperlink r:id="rId197">
         <w:r>
           <w:rPr>
             <w:rStyle w:val="Hyperlink"/>
@@ -7852,14 +9322,14 @@
         </w:r>
       </w:hyperlink>
     </w:p>
-    <w:bookmarkEnd w:id="188"/>
-    <w:bookmarkStart w:id="190" w:name="ref-solutionhacking2026"/>
+    <w:bookmarkEnd w:id="198"/>
+    <w:bookmarkStart w:id="200" w:name="ref-solutionhacking2026"/>
     <w:p>
       <w:pPr>
         <w:pStyle w:val="Bibliography"/>
       </w:pPr>
       <w:r>
-        <w:t xml:space="preserve">[53]</w:t>
+        <w:t xml:space="preserve">[56]</w:t>
       </w:r>
       <w:r>
         <w:t xml:space="preserve"> </w:t>
@@ -7882,7 +9352,7 @@
       <w:r>
         <w:t xml:space="preserve"> </w:t>
       </w:r>
-      <w:hyperlink r:id="rId189">
+      <w:hyperlink r:id="rId199">
         <w:r>
           <w:rPr>
             <w:rStyle w:val="Hyperlink"/>
@@ -7891,14 +9361,14 @@
         </w:r>
       </w:hyperlink>
     </w:p>
-    <w:bookmarkEnd w:id="190"/>
-    <w:bookmarkStart w:id="192" w:name="ref-baitbench2026"/>
+    <w:bookmarkEnd w:id="200"/>
+    <w:bookmarkStart w:id="202" w:name="ref-baitbench2026"/>
     <w:p>
       <w:pPr>
         <w:pStyle w:val="Bibliography"/>
       </w:pPr>
       <w:r>
-        <w:t xml:space="preserve">[54]</w:t>
+        <w:t xml:space="preserve">[57]</w:t>
       </w:r>
       <w:r>
         <w:t xml:space="preserve"> </w:t>
@@ -7921,7 +9391,7 @@
       <w:r>
         <w:t xml:space="preserve"> </w:t>
       </w:r>
-      <w:hyperlink r:id="rId191">
+      <w:hyperlink r:id="rId201">
         <w:r>
           <w:rPr>
             <w:rStyle w:val="Hyperlink"/>
@@ -7930,14 +9400,14 @@
         </w:r>
       </w:hyperlink>
     </w:p>
-    <w:bookmarkEnd w:id="192"/>
-    <w:bookmarkStart w:id="194" w:name="ref-constructvalidity2026"/>
+    <w:bookmarkEnd w:id="202"/>
+    <w:bookmarkStart w:id="204" w:name="ref-constructvalidity2026"/>
     <w:p>
       <w:pPr>
         <w:pStyle w:val="Bibliography"/>
       </w:pPr>
       <w:r>
-        <w:t xml:space="preserve">[55]</w:t>
+        <w:t xml:space="preserve">[58]</w:t>
       </w:r>
       <w:r>
         <w:t xml:space="preserve"> </w:t>
@@ -7960,7 +9430,7 @@
       <w:r>
         <w:t xml:space="preserve"> </w:t>
       </w:r>
-      <w:hyperlink r:id="rId193">
+      <w:hyperlink r:id="rId203">
         <w:r>
           <w:rPr>
             <w:rStyle w:val="Hyperlink"/>
@@ -7969,14 +9439,14 @@
         </w:r>
       </w:hyperlink>
     </w:p>
-    <w:bookmarkEnd w:id="194"/>
-    <w:bookmarkStart w:id="196" w:name="ref-agreementaudit2026"/>
+    <w:bookmarkEnd w:id="204"/>
+    <w:bookmarkStart w:id="206" w:name="ref-agreementaudit2026"/>
     <w:p>
       <w:pPr>
         <w:pStyle w:val="Bibliography"/>
       </w:pPr>
       <w:r>
-        <w:t xml:space="preserve">[56]</w:t>
+        <w:t xml:space="preserve">[59]</w:t>
       </w:r>
       <w:r>
         <w:t xml:space="preserve"> </w:t>
@@ -7999,7 +9469,7 @@
       <w:r>
         <w:t xml:space="preserve"> </w:t>
       </w:r>
-      <w:hyperlink r:id="rId195">
+      <w:hyperlink r:id="rId205">
         <w:r>
           <w:rPr>
             <w:rStyle w:val="Hyperlink"/>
@@ -8008,14 +9478,14 @@
         </w:r>
       </w:hyperlink>
     </w:p>
-    <w:bookmarkEnd w:id="196"/>
-    <w:bookmarkStart w:id="198" w:name="ref-reliabilitywithoutvalidity2026"/>
+    <w:bookmarkEnd w:id="206"/>
+    <w:bookmarkStart w:id="208" w:name="ref-reliabilitywithoutvalidity2026"/>
     <w:p>
       <w:pPr>
         <w:pStyle w:val="Bibliography"/>
       </w:pPr>
       <w:r>
-        <w:t xml:space="preserve">[57]</w:t>
+        <w:t xml:space="preserve">[60]</w:t>
       </w:r>
       <w:r>
         <w:t xml:space="preserve"> </w:t>
@@ -8038,7 +9508,7 @@
       <w:r>
         <w:t xml:space="preserve"> </w:t>
       </w:r>
-      <w:hyperlink r:id="rId197">
+      <w:hyperlink r:id="rId207">
         <w:r>
           <w:rPr>
             <w:rStyle w:val="Hyperlink"/>
@@ -8047,14 +9517,14 @@
         </w:r>
       </w:hyperlink>
     </w:p>
-    <w:bookmarkEnd w:id="198"/>
-    <w:bookmarkStart w:id="200" w:name="ref-compounding2026"/>
+    <w:bookmarkEnd w:id="208"/>
+    <w:bookmarkStart w:id="210" w:name="ref-compounding2026"/>
     <w:p>
       <w:pPr>
         <w:pStyle w:val="Bibliography"/>
       </w:pPr>
       <w:r>
-        <w:t xml:space="preserve">[58]</w:t>
+        <w:t xml:space="preserve">[61]</w:t>
       </w:r>
       <w:r>
         <w:t xml:space="preserve"> </w:t>
@@ -8077,7 +9547,7 @@
       <w:r>
         <w:t xml:space="preserve"> </w:t>
       </w:r>
-      <w:hyperlink r:id="rId199">
+      <w:hyperlink r:id="rId209">
         <w:r>
           <w:rPr>
             <w:rStyle w:val="Hyperlink"/>
@@ -8086,14 +9556,14 @@
         </w:r>
       </w:hyperlink>
     </w:p>
-    <w:bookmarkEnd w:id="200"/>
-    <w:bookmarkStart w:id="201" w:name="ref-judgeidentification2026"/>
+    <w:bookmarkEnd w:id="210"/>
+    <w:bookmarkStart w:id="211" w:name="ref-judgeidentification2026"/>
     <w:p>
       <w:pPr>
         <w:pStyle w:val="Bibliography"/>
       </w:pPr>
       <w:r>
-        <w:t xml:space="preserve">[59]</w:t>
+        <w:t xml:space="preserve">[62]</w:t>
       </w:r>
       <w:r>
         <w:t xml:space="preserve"> </w:t>
@@ -8117,14 +9587,14 @@
         <w:t xml:space="preserve">. arXiv:2608.16253v1, 2026, 2026년.</w:t>
       </w:r>
     </w:p>
-    <w:bookmarkEnd w:id="201"/>
-    <w:bookmarkStart w:id="202" w:name="ref-majorityhurts2026"/>
+    <w:bookmarkEnd w:id="211"/>
+    <w:bookmarkStart w:id="212" w:name="ref-majorityhurts2026"/>
     <w:p>
       <w:pPr>
         <w:pStyle w:val="Bibliography"/>
       </w:pPr>
       <w:r>
-        <w:t xml:space="preserve">[60]</w:t>
+        <w:t xml:space="preserve">[63]</w:t>
       </w:r>
       <w:r>
         <w:t xml:space="preserve"> </w:t>
@@ -8145,14 +9615,14 @@
         <w:t xml:space="preserve">. arXiv:2608.11403v2, 2026, 2026년.</w:t>
       </w:r>
     </w:p>
-    <w:bookmarkEnd w:id="202"/>
-    <w:bookmarkStart w:id="203" w:name="ref-wrongconsensus2026"/>
+    <w:bookmarkEnd w:id="212"/>
+    <w:bookmarkStart w:id="213" w:name="ref-wrongconsensus2026"/>
     <w:p>
       <w:pPr>
         <w:pStyle w:val="Bibliography"/>
       </w:pPr>
       <w:r>
-        <w:t xml:space="preserve">[61]</w:t>
+        <w:t xml:space="preserve">[64]</w:t>
       </w:r>
       <w:r>
         <w:t xml:space="preserve"> </w:t>
@@ -8176,14 +9646,14 @@
         <w:t xml:space="preserve">. arXiv:2608.18795v2, 2026, 2026년.</w:t>
       </w:r>
     </w:p>
-    <w:bookmarkEnd w:id="203"/>
-    <w:bookmarkStart w:id="204" w:name="ref-budgetmatched2026"/>
+    <w:bookmarkEnd w:id="213"/>
+    <w:bookmarkStart w:id="214" w:name="ref-budgetmatched2026"/>
     <w:p>
       <w:pPr>
         <w:pStyle w:val="Bibliography"/>
       </w:pPr>
       <w:r>
-        <w:t xml:space="preserve">[62]</w:t>
+        <w:t xml:space="preserve">[65]</w:t>
       </w:r>
       <w:r>
         <w:t xml:space="preserve"> </w:t>
@@ -8207,14 +9677,14 @@
         <w:t xml:space="preserve">. arXiv:2606.15017v2, 2026, 2026년.</w:t>
       </w:r>
     </w:p>
-    <w:bookmarkEnd w:id="204"/>
-    <w:bookmarkStart w:id="205" w:name="ref-cachecost2026"/>
+    <w:bookmarkEnd w:id="214"/>
+    <w:bookmarkStart w:id="215" w:name="ref-cachecost2026"/>
     <w:p>
       <w:pPr>
         <w:pStyle w:val="Bibliography"/>
       </w:pPr>
       <w:r>
-        <w:t xml:space="preserve">[63]</w:t>
+        <w:t xml:space="preserve">[66]</w:t>
       </w:r>
       <w:r>
         <w:t xml:space="preserve"> </w:t>
@@ -8238,14 +9708,14 @@
         <w:t xml:space="preserve">. arXiv:2601.06007v2, 2026, 2026년.</w:t>
       </w:r>
     </w:p>
-    <w:bookmarkEnd w:id="205"/>
-    <w:bookmarkStart w:id="206" w:name="ref-compressioncost2026"/>
+    <w:bookmarkEnd w:id="215"/>
+    <w:bookmarkStart w:id="216" w:name="ref-compressioncost2026"/>
     <w:p>
       <w:pPr>
         <w:pStyle w:val="Bibliography"/>
       </w:pPr>
       <w:r>
-        <w:t xml:space="preserve">[64]</w:t>
+        <w:t xml:space="preserve">[67]</w:t>
       </w:r>
       <w:r>
         <w:t xml:space="preserve"> </w:t>
@@ -8269,14 +9739,14 @@
         <w:t xml:space="preserve">. arXiv:2608.16370v1, 2026, 2026년.</w:t>
       </w:r>
     </w:p>
-    <w:bookmarkEnd w:id="206"/>
-    <w:bookmarkStart w:id="207" w:name="ref-promptwaste2026"/>
+    <w:bookmarkEnd w:id="216"/>
+    <w:bookmarkStart w:id="217" w:name="ref-promptwaste2026"/>
     <w:p>
       <w:pPr>
         <w:pStyle w:val="Bibliography"/>
       </w:pPr>
       <w:r>
-        <w:t xml:space="preserve">[65]</w:t>
+        <w:t xml:space="preserve">[68]</w:t>
       </w:r>
       <w:r>
         <w:t xml:space="preserve"> </w:t>
@@ -8300,14 +9770,14 @@
         <w:t xml:space="preserve">. arXiv:2608.01347v5, 2026, 2026년.</w:t>
       </w:r>
     </w:p>
-    <w:bookmarkEnd w:id="207"/>
-    <w:bookmarkStart w:id="208" w:name="ref-llmrandomness2026"/>
+    <w:bookmarkEnd w:id="217"/>
+    <w:bookmarkStart w:id="218" w:name="ref-llmrandomness2026"/>
     <w:p>
       <w:pPr>
         <w:pStyle w:val="Bibliography"/>
       </w:pPr>
       <w:r>
-        <w:t xml:space="preserve">[66]</w:t>
+        <w:t xml:space="preserve">[69]</w:t>
       </w:r>
       <w:r>
         <w:t xml:space="preserve"> </w:t>
@@ -8328,14 +9798,14 @@
         <w:t xml:space="preserve">. arXiv:2607.24372v1, 2026, 2026년.</w:t>
       </w:r>
     </w:p>
-    <w:bookmarkEnd w:id="208"/>
-    <w:bookmarkStart w:id="209" w:name="ref-onerunlottery2026"/>
+    <w:bookmarkEnd w:id="218"/>
+    <w:bookmarkStart w:id="219" w:name="ref-onerunlottery2026"/>
     <w:p>
       <w:pPr>
         <w:pStyle w:val="Bibliography"/>
       </w:pPr>
       <w:r>
-        <w:t xml:space="preserve">[67]</w:t>
+        <w:t xml:space="preserve">[70]</w:t>
       </w:r>
       <w:r>
         <w:t xml:space="preserve"> </w:t>
@@ -8359,14 +9829,14 @@
         <w:t xml:space="preserve">. arXiv:2607.26587v1, 2026, 2026년.</w:t>
       </w:r>
     </w:p>
-    <w:bookmarkEnd w:id="209"/>
-    <w:bookmarkStart w:id="210" w:name="ref-multiplerunsorder2026"/>
+    <w:bookmarkEnd w:id="219"/>
+    <w:bookmarkStart w:id="220" w:name="ref-multiplerunsorder2026"/>
     <w:p>
       <w:pPr>
         <w:pStyle w:val="Bibliography"/>
       </w:pPr>
       <w:r>
-        <w:t xml:space="preserve">[68]</w:t>
+        <w:t xml:space="preserve">[71]</w:t>
       </w:r>
       <w:r>
         <w:t xml:space="preserve"> </w:t>
@@ -8390,14 +9860,14 @@
         <w:t xml:space="preserve">. arXiv:2608.18066v1, 2026, 2026년.</w:t>
       </w:r>
     </w:p>
-    <w:bookmarkEnd w:id="210"/>
-    <w:bookmarkStart w:id="211" w:name="ref-runvariance2026"/>
+    <w:bookmarkEnd w:id="220"/>
+    <w:bookmarkStart w:id="221" w:name="ref-runvariance2026"/>
     <w:p>
       <w:pPr>
         <w:pStyle w:val="Bibliography"/>
       </w:pPr>
       <w:r>
-        <w:t xml:space="preserve">[69]</w:t>
+        <w:t xml:space="preserve">[72]</w:t>
       </w:r>
       <w:r>
         <w:t xml:space="preserve"> </w:t>
@@ -8421,14 +9891,14 @@
         <w:t xml:space="preserve">. arXiv:2608.26197v1, 2026, 2026년.</w:t>
       </w:r>
     </w:p>
-    <w:bookmarkEnd w:id="211"/>
-    <w:bookmarkStart w:id="212" w:name="ref-tokenaccounting2026"/>
+    <w:bookmarkEnd w:id="221"/>
+    <w:bookmarkStart w:id="222" w:name="ref-tokenaccounting2026"/>
     <w:p>
       <w:pPr>
         <w:pStyle w:val="Bibliography"/>
       </w:pPr>
       <w:r>
-        <w:t xml:space="preserve">[70]</w:t>
+        <w:t xml:space="preserve">[73]</w:t>
       </w:r>
       <w:r>
         <w:t xml:space="preserve"> </w:t>
@@ -8452,14 +9922,14 @@
         <w:t xml:space="preserve">. arXiv:2607.21672v1, 2026, 2026년.</w:t>
       </w:r>
     </w:p>
-    <w:bookmarkEnd w:id="212"/>
-    <w:bookmarkStart w:id="213" w:name="ref-agreementcorrectness2026"/>
+    <w:bookmarkEnd w:id="222"/>
+    <w:bookmarkStart w:id="223" w:name="ref-agreementcorrectness2026"/>
     <w:p>
       <w:pPr>
         <w:pStyle w:val="Bibliography"/>
       </w:pPr>
       <w:r>
-        <w:t xml:space="preserve">[71]</w:t>
+        <w:t xml:space="preserve">[74]</w:t>
       </w:r>
       <w:r>
         <w:t xml:space="preserve"> </w:t>
@@ -8483,14 +9953,14 @@
         <w:t xml:space="preserve">. arXiv:2608.05670v1, 2026, 2026년.</w:t>
       </w:r>
     </w:p>
-    <w:bookmarkEnd w:id="213"/>
-    <w:bookmarkStart w:id="214" w:name="ref-annotationvariance2026"/>
+    <w:bookmarkEnd w:id="223"/>
+    <w:bookmarkStart w:id="224" w:name="ref-annotationvariance2026"/>
     <w:p>
       <w:pPr>
         <w:pStyle w:val="Bibliography"/>
       </w:pPr>
       <w:r>
-        <w:t xml:space="preserve">[72]</w:t>
+        <w:t xml:space="preserve">[75]</w:t>
       </w:r>
       <w:r>
         <w:t xml:space="preserve"> </w:t>
@@ -8514,14 +9984,14 @@
         <w:t xml:space="preserve">. arXiv:2605.01168v1, 2026, 2026년.</w:t>
       </w:r>
     </w:p>
-    <w:bookmarkEnd w:id="214"/>
-    <w:bookmarkStart w:id="215" w:name="ref-boltonprovenance2026"/>
+    <w:bookmarkEnd w:id="224"/>
+    <w:bookmarkStart w:id="225" w:name="ref-boltonprovenance2026"/>
     <w:p>
       <w:pPr>
         <w:pStyle w:val="Bibliography"/>
       </w:pPr>
       <w:r>
-        <w:t xml:space="preserve">[73]</w:t>
+        <w:t xml:space="preserve">[76]</w:t>
       </w:r>
       <w:r>
         <w:t xml:space="preserve"> </w:t>
@@ -8545,14 +10015,14 @@
         <w:t xml:space="preserve">. arXiv:2608.25210v2, 2026, 2026년.</w:t>
       </w:r>
     </w:p>
-    <w:bookmarkEnd w:id="215"/>
-    <w:bookmarkStart w:id="216" w:name="ref-evidenceledger2026"/>
+    <w:bookmarkEnd w:id="225"/>
+    <w:bookmarkStart w:id="226" w:name="ref-evidenceledger2026"/>
     <w:p>
       <w:pPr>
         <w:pStyle w:val="Bibliography"/>
       </w:pPr>
       <w:r>
-        <w:t xml:space="preserve">[74]</w:t>
+        <w:t xml:space="preserve">[77]</w:t>
       </w:r>
       <w:r>
         <w:t xml:space="preserve"> </w:t>
@@ -8576,14 +10046,14 @@
         <w:t xml:space="preserve">. arXiv:2607.26512v1, 2026, 2026년.</w:t>
       </w:r>
     </w:p>
-    <w:bookmarkEnd w:id="216"/>
-    <w:bookmarkStart w:id="217" w:name="ref-claimreplay2026"/>
+    <w:bookmarkEnd w:id="226"/>
+    <w:bookmarkStart w:id="227" w:name="ref-claimreplay2026"/>
     <w:p>
       <w:pPr>
         <w:pStyle w:val="Bibliography"/>
       </w:pPr>
       <w:r>
-        <w:t xml:space="preserve">[75]</w:t>
+        <w:t xml:space="preserve">[78]</w:t>
       </w:r>
       <w:r>
         <w:t xml:space="preserve"> </w:t>
@@ -8607,14 +10077,14 @@
         <w:t xml:space="preserve">. arXiv:2608.19269v4, 2026, 2026년.</w:t>
       </w:r>
     </w:p>
-    <w:bookmarkEnd w:id="217"/>
-    <w:bookmarkStart w:id="218" w:name="ref-runnableverifiable2026"/>
+    <w:bookmarkEnd w:id="227"/>
+    <w:bookmarkStart w:id="228" w:name="ref-runnableverifiable2026"/>
     <w:p>
       <w:pPr>
         <w:pStyle w:val="Bibliography"/>
       </w:pPr>
       <w:r>
-        <w:t xml:space="preserve">[76]</w:t>
+        <w:t xml:space="preserve">[79]</w:t>
       </w:r>
       <w:r>
         <w:t xml:space="preserve"> </w:t>
@@ -8638,14 +10108,14 @@
         <w:t xml:space="preserve">. arXiv:2608.09567v1, 2026, 2026년.</w:t>
       </w:r>
     </w:p>
-    <w:bookmarkEnd w:id="218"/>
-    <w:bookmarkStart w:id="219" w:name="ref-repeataudit2026"/>
+    <w:bookmarkEnd w:id="228"/>
+    <w:bookmarkStart w:id="229" w:name="ref-repeataudit2026"/>
     <w:p>
       <w:pPr>
         <w:pStyle w:val="Bibliography"/>
       </w:pPr>
       <w:r>
-        <w:t xml:space="preserve">[77]</w:t>
+        <w:t xml:space="preserve">[80]</w:t>
       </w:r>
       <w:r>
         <w:t xml:space="preserve"> </w:t>
@@ -8669,14 +10139,14 @@
         <w:t xml:space="preserve">. arXiv:2608.22856v1, 2026, 2026년.</w:t>
       </w:r>
     </w:p>
-    <w:bookmarkEnd w:id="219"/>
-    <w:bookmarkStart w:id="220" w:name="ref-fidelitywithoutevidence2026"/>
+    <w:bookmarkEnd w:id="229"/>
+    <w:bookmarkStart w:id="230" w:name="ref-fidelitywithoutevidence2026"/>
     <w:p>
       <w:pPr>
         <w:pStyle w:val="Bibliography"/>
       </w:pPr>
       <w:r>
-        <w:t xml:space="preserve">[78]</w:t>
+        <w:t xml:space="preserve">[81]</w:t>
       </w:r>
       <w:r>
         <w:t xml:space="preserve"> </w:t>
@@ -8700,14 +10170,14 @@
         <w:t xml:space="preserve">. arXiv:2608.28439v1, 2026, 2026년.</w:t>
       </w:r>
     </w:p>
-    <w:bookmarkEnd w:id="220"/>
-    <w:bookmarkStart w:id="221" w:name="ref-implicitassumptions2026"/>
+    <w:bookmarkEnd w:id="230"/>
+    <w:bookmarkStart w:id="231" w:name="ref-implicitassumptions2026"/>
     <w:p>
       <w:pPr>
         <w:pStyle w:val="Bibliography"/>
       </w:pPr>
       <w:r>
-        <w:t xml:space="preserve">[79]</w:t>
+        <w:t xml:space="preserve">[82]</w:t>
       </w:r>
       <w:r>
         <w:t xml:space="preserve"> </w:t>
@@ -8731,14 +10201,14 @@
         <w:t xml:space="preserve">. arXiv:2607.03114v1, 2026, 2026년.</w:t>
       </w:r>
     </w:p>
-    <w:bookmarkEnd w:id="221"/>
-    <w:bookmarkStart w:id="222" w:name="ref-partialcontracts2026"/>
+    <w:bookmarkEnd w:id="231"/>
+    <w:bookmarkStart w:id="232" w:name="ref-partialcontracts2026"/>
     <w:p>
       <w:pPr>
         <w:pStyle w:val="Bibliography"/>
       </w:pPr>
       <w:r>
-        <w:t xml:space="preserve">[80]</w:t>
+        <w:t xml:space="preserve">[83]</w:t>
       </w:r>
       <w:r>
         <w:t xml:space="preserve"> </w:t>
@@ -8762,14 +10232,14 @@
         <w:t xml:space="preserve">. arXiv:2607.10291v1, 2026, 2026년.</w:t>
       </w:r>
     </w:p>
-    <w:bookmarkEnd w:id="222"/>
-    <w:bookmarkStart w:id="223" w:name="ref-factcheckstages2026"/>
+    <w:bookmarkEnd w:id="232"/>
+    <w:bookmarkStart w:id="233" w:name="ref-factcheckstages2026"/>
     <w:p>
       <w:pPr>
         <w:pStyle w:val="Bibliography"/>
       </w:pPr>
       <w:r>
-        <w:t xml:space="preserve">[81]</w:t>
+        <w:t xml:space="preserve">[84]</w:t>
       </w:r>
       <w:r>
         <w:t xml:space="preserve"> </w:t>
@@ -8793,14 +10263,14 @@
         <w:t xml:space="preserve">. arXiv:2510.22055v1, 2026, 2026년.</w:t>
       </w:r>
     </w:p>
-    <w:bookmarkEnd w:id="223"/>
-    <w:bookmarkStart w:id="224" w:name="ref-coveragebehaviour2026"/>
+    <w:bookmarkEnd w:id="233"/>
+    <w:bookmarkStart w:id="234" w:name="ref-coveragebehaviour2026"/>
     <w:p>
       <w:pPr>
         <w:pStyle w:val="Bibliography"/>
       </w:pPr>
       <w:r>
-        <w:t xml:space="preserve">[82]</w:t>
+        <w:t xml:space="preserve">[85]</w:t>
       </w:r>
       <w:r>
         <w:t xml:space="preserve"> </w:t>
@@ -8824,14 +10294,14 @@
         <w:t xml:space="preserve">. arXiv:2606.10417v1, 2026, 2026년.</w:t>
       </w:r>
     </w:p>
-    <w:bookmarkEnd w:id="224"/>
-    <w:bookmarkStart w:id="225" w:name="ref-evalblindness2026"/>
+    <w:bookmarkEnd w:id="234"/>
+    <w:bookmarkStart w:id="235" w:name="ref-evalblindness2026"/>
     <w:p>
       <w:pPr>
         <w:pStyle w:val="Bibliography"/>
       </w:pPr>
       <w:r>
-        <w:t xml:space="preserve">[83]</w:t>
+        <w:t xml:space="preserve">[86]</w:t>
       </w:r>
       <w:r>
         <w:t xml:space="preserve"> </w:t>
@@ -8855,14 +10325,14 @@
         <w:t xml:space="preserve">. arXiv:2608.02786v1, 2026, 2026년.</w:t>
       </w:r>
     </w:p>
-    <w:bookmarkEnd w:id="225"/>
-    <w:bookmarkStart w:id="226" w:name="ref-metamorphicrelations2026"/>
+    <w:bookmarkEnd w:id="235"/>
+    <w:bookmarkStart w:id="236" w:name="ref-metamorphicrelations2026"/>
     <w:p>
       <w:pPr>
         <w:pStyle w:val="Bibliography"/>
       </w:pPr>
       <w:r>
-        <w:t xml:space="preserve">[84]</w:t>
+        <w:t xml:space="preserve">[87]</w:t>
       </w:r>
       <w:r>
         <w:t xml:space="preserve"> </w:t>
@@ -8886,14 +10356,14 @@
         <w:t xml:space="preserve">. arXiv:2608.03337v1, 2026, 2026년.</w:t>
       </w:r>
     </w:p>
-    <w:bookmarkEnd w:id="226"/>
-    <w:bookmarkStart w:id="227" w:name="ref-oracleavailability2026"/>
+    <w:bookmarkEnd w:id="236"/>
+    <w:bookmarkStart w:id="237" w:name="ref-oracleavailability2026"/>
     <w:p>
       <w:pPr>
         <w:pStyle w:val="Bibliography"/>
       </w:pPr>
       <w:r>
-        <w:t xml:space="preserve">[85]</w:t>
+        <w:t xml:space="preserve">[88]</w:t>
       </w:r>
       <w:r>
         <w:t xml:space="preserve"> </w:t>
@@ -8917,14 +10387,14 @@
         <w:t xml:space="preserve">. arXiv:2607.00929v1, 2026, 2026년.</w:t>
       </w:r>
     </w:p>
-    <w:bookmarkEnd w:id="227"/>
-    <w:bookmarkStart w:id="228" w:name="ref-oracleanchoring2026"/>
+    <w:bookmarkEnd w:id="237"/>
+    <w:bookmarkStart w:id="238" w:name="ref-oracleanchoring2026"/>
     <w:p>
       <w:pPr>
         <w:pStyle w:val="Bibliography"/>
       </w:pPr>
       <w:r>
-        <w:t xml:space="preserve">[86]</w:t>
+        <w:t xml:space="preserve">[89]</w:t>
       </w:r>
       <w:r>
         <w:t xml:space="preserve"> </w:t>
@@ -8948,14 +10418,14 @@
         <w:t xml:space="preserve">. arXiv:2608.17214v1, 2026, 2026년.</w:t>
       </w:r>
     </w:p>
-    <w:bookmarkEnd w:id="228"/>
-    <w:bookmarkStart w:id="230" w:name="ref-auditaudit2026"/>
+    <w:bookmarkEnd w:id="238"/>
+    <w:bookmarkStart w:id="240" w:name="ref-auditaudit2026"/>
     <w:p>
       <w:pPr>
         <w:pStyle w:val="Bibliography"/>
       </w:pPr>
       <w:r>
-        <w:t xml:space="preserve">[87]</w:t>
+        <w:t xml:space="preserve">[90]</w:t>
       </w:r>
       <w:r>
         <w:t xml:space="preserve"> </w:t>
@@ -8978,7 +10448,7 @@
       <w:r>
         <w:t xml:space="preserve"> </w:t>
       </w:r>
-      <w:hyperlink r:id="rId229">
+      <w:hyperlink r:id="rId239">
         <w:r>
           <w:rPr>
             <w:rStyle w:val="Hyperlink"/>
@@ -8987,14 +10457,14 @@
         </w:r>
       </w:hyperlink>
     </w:p>
-    <w:bookmarkEnd w:id="230"/>
-    <w:bookmarkStart w:id="231" w:name="ref-beyondfinalscores2026"/>
+    <w:bookmarkEnd w:id="240"/>
+    <w:bookmarkStart w:id="241" w:name="ref-beyondfinalscores2026"/>
     <w:p>
       <w:pPr>
         <w:pStyle w:val="Bibliography"/>
       </w:pPr>
       <w:r>
-        <w:t xml:space="preserve">[88]</w:t>
+        <w:t xml:space="preserve">[91]</w:t>
       </w:r>
       <w:r>
         <w:t xml:space="preserve"> </w:t>
@@ -9018,14 +10488,14 @@
         <w:t xml:space="preserve">. arXiv:2608.13417v1, 2026, 2026년.</w:t>
       </w:r>
     </w:p>
-    <w:bookmarkEnd w:id="231"/>
-    <w:bookmarkStart w:id="232" w:name="ref-seqmeta2026"/>
+    <w:bookmarkEnd w:id="241"/>
+    <w:bookmarkStart w:id="242" w:name="ref-seqmeta2026"/>
     <w:p>
       <w:pPr>
         <w:pStyle w:val="Bibliography"/>
       </w:pPr>
       <w:r>
-        <w:t xml:space="preserve">[89]</w:t>
+        <w:t xml:space="preserve">[92]</w:t>
       </w:r>
       <w:r>
         <w:t xml:space="preserve"> </w:t>
@@ -9049,14 +10519,14 @@
         <w:t xml:space="preserve">. arXiv:2511.14996v1, 2025, 2025년.</w:t>
       </w:r>
     </w:p>
-    <w:bookmarkEnd w:id="232"/>
-    <w:bookmarkStart w:id="233" w:name="ref-rigorai2026"/>
+    <w:bookmarkEnd w:id="242"/>
+    <w:bookmarkStart w:id="243" w:name="ref-rigorai2026"/>
     <w:p>
       <w:pPr>
         <w:pStyle w:val="Bibliography"/>
       </w:pPr>
       <w:r>
-        <w:t xml:space="preserve">[90]</w:t>
+        <w:t xml:space="preserve">[93]</w:t>
       </w:r>
       <w:r>
         <w:t xml:space="preserve"> </w:t>
@@ -9077,14 +10547,14 @@
         <w:t xml:space="preserve">. arXiv:2607.03634v1, 2026, 2026년.</w:t>
       </w:r>
     </w:p>
-    <w:bookmarkEnd w:id="233"/>
-    <w:bookmarkStart w:id="235" w:name="ref-prereg2026"/>
+    <w:bookmarkEnd w:id="243"/>
+    <w:bookmarkStart w:id="245" w:name="ref-prereg2026"/>
     <w:p>
       <w:pPr>
         <w:pStyle w:val="Bibliography"/>
       </w:pPr>
       <w:r>
-        <w:t xml:space="preserve">[91]</w:t>
+        <w:t xml:space="preserve">[94]</w:t>
       </w:r>
       <w:r>
         <w:t xml:space="preserve"> </w:t>
@@ -9107,7 +10577,7 @@
       <w:r>
         <w:t xml:space="preserve"> </w:t>
       </w:r>
-      <w:hyperlink r:id="rId234">
+      <w:hyperlink r:id="rId244">
         <w:r>
           <w:rPr>
             <w:rStyle w:val="Hyperlink"/>
@@ -9116,14 +10586,14 @@
         </w:r>
       </w:hyperlink>
     </w:p>
-    <w:bookmarkEnd w:id="235"/>
-    <w:bookmarkStart w:id="236" w:name="ref-smallscreening2026"/>
+    <w:bookmarkEnd w:id="245"/>
+    <w:bookmarkStart w:id="246" w:name="ref-smallscreening2026"/>
     <w:p>
       <w:pPr>
         <w:pStyle w:val="Bibliography"/>
       </w:pPr>
       <w:r>
-        <w:t xml:space="preserve">[92]</w:t>
+        <w:t xml:space="preserve">[95]</w:t>
       </w:r>
       <w:r>
         <w:t xml:space="preserve"> </w:t>
@@ -9147,14 +10617,14 @@
         <w:t xml:space="preserve">. arXiv:2606.13531v1, 2026, 2026년.</w:t>
       </w:r>
     </w:p>
-    <w:bookmarkEnd w:id="236"/>
-    <w:bookmarkStart w:id="238" w:name="ref-negativeresults2026"/>
+    <w:bookmarkEnd w:id="246"/>
+    <w:bookmarkStart w:id="248" w:name="ref-negativeresults2026"/>
     <w:p>
       <w:pPr>
         <w:pStyle w:val="Bibliography"/>
       </w:pPr>
       <w:r>
-        <w:t xml:space="preserve">[93]</w:t>
+        <w:t xml:space="preserve">[96]</w:t>
       </w:r>
       <w:r>
         <w:t xml:space="preserve"> </w:t>
@@ -9177,7 +10647,7 @@
       <w:r>
         <w:t xml:space="preserve"> </w:t>
       </w:r>
-      <w:hyperlink r:id="rId237">
+      <w:hyperlink r:id="rId247">
         <w:r>
           <w:rPr>
             <w:rStyle w:val="Hyperlink"/>
@@ -9186,14 +10656,14 @@
         </w:r>
       </w:hyperlink>
     </w:p>
-    <w:bookmarkEnd w:id="238"/>
-    <w:bookmarkStart w:id="240" w:name="ref-autoresearchfail2026"/>
+    <w:bookmarkEnd w:id="248"/>
+    <w:bookmarkStart w:id="250" w:name="ref-autoresearchfail2026"/>
     <w:p>
       <w:pPr>
         <w:pStyle w:val="Bibliography"/>
       </w:pPr>
       <w:r>
-        <w:t xml:space="preserve">[94]</w:t>
+        <w:t xml:space="preserve">[97]</w:t>
       </w:r>
       <w:r>
         <w:t xml:space="preserve"> </w:t>
@@ -9216,7 +10686,7 @@
       <w:r>
         <w:t xml:space="preserve"> </w:t>
       </w:r>
-      <w:hyperlink r:id="rId239">
+      <w:hyperlink r:id="rId249">
         <w:r>
           <w:rPr>
             <w:rStyle w:val="Hyperlink"/>
@@ -9225,14 +10695,14 @@
         </w:r>
       </w:hyperlink>
     </w:p>
-    <w:bookmarkEnd w:id="240"/>
-    <w:bookmarkStart w:id="242" w:name="ref-verificationcost2026"/>
+    <w:bookmarkEnd w:id="250"/>
+    <w:bookmarkStart w:id="252" w:name="ref-verificationcost2026"/>
     <w:p>
       <w:pPr>
         <w:pStyle w:val="Bibliography"/>
       </w:pPr>
       <w:r>
-        <w:t xml:space="preserve">[95]</w:t>
+        <w:t xml:space="preserve">[98]</w:t>
       </w:r>
       <w:r>
         <w:t xml:space="preserve"> </w:t>
@@ -9255,7 +10725,7 @@
       <w:r>
         <w:t xml:space="preserve"> </w:t>
       </w:r>
-      <w:hyperlink r:id="rId241">
+      <w:hyperlink r:id="rId251">
         <w:r>
           <w:rPr>
             <w:rStyle w:val="Hyperlink"/>
@@ -9264,9 +10734,9 @@
         </w:r>
       </w:hyperlink>
     </w:p>
-    <w:bookmarkEnd w:id="242"/>
-    <w:bookmarkEnd w:id="243"/>
-    <w:bookmarkEnd w:id="244"/>
+    <w:bookmarkEnd w:id="252"/>
+    <w:bookmarkEnd w:id="253"/>
+    <w:bookmarkEnd w:id="254"/>
     <w:sectPr>
       <w:footerReference w:type="default" r:id="rIdFtr1"/>
       <w:pgSz w:h="16838" w:w="11906"/>

</xml_diff>

<commit_message>
docs(paper): restate conclusions around the measurement chapter and the sealed-preregistration design axis
</commit_message>
<xml_diff>
--- a/paper/word/graduation-thesis.docx
+++ b/paper/word/graduation-thesis.docx
@@ -6939,7 +6939,7 @@
     </w:p>
     <w:bookmarkEnd w:id="91"/>
     <w:bookmarkEnd w:id="92"/>
-    <w:bookmarkStart w:id="93" w:name="conclusions"/>
+    <w:bookmarkStart w:id="97" w:name="conclusions"/>
     <w:p>
       <w:pPr>
         <w:pStyle w:val="Heading1"/>
@@ -6957,13 +6957,25 @@
           <w:b/>
           <w:bCs/>
         </w:rPr>
-        <w:t xml:space="preserve">본 연구는 자율 연구개발 하네스의 구축을 넘어, 에이전트 산출물을 측정하는 평가 도구의 신뢰성과 타당성을 최초로 적대적 감사에 부친 연구다.</w:t>
-      </w:r>
-      <w:r>
-        <w:t xml:space="preserve"> </w:t>
-      </w:r>
-      <w:r>
-        <w:t xml:space="preserve">자율 연구 시스템이 단일 종단 점수만을 추구할 때 자주 겪는 실패 양식</w:t>
+        <w:t xml:space="preserve">본 연구는 자율 연구 하네스를 만들기 전에, 그 하네스를 재는 도구가 잴 자격이 있는지를 먼저 물었다.</w:t>
+      </w:r>
+      <w:r>
+        <w:t xml:space="preserve"> </w:t>
+      </w:r>
+      <w:r>
+        <w:t xml:space="preserve">그 물음의 답이 이 논문의 두 축을 갈랐다. 측정 축(Study A)은 판정 기반 endpoint가 하네스 비교에 쓰일 수</w:t>
+      </w:r>
+      <w:r>
+        <w:t xml:space="preserve"> </w:t>
+      </w:r>
+      <w:r>
+        <w:t xml:space="preserve">없음을 실행된 근거로 보였고, 설계 축(Study B)은 그 결론 위에 결정론적 검증기 기반의 구성 벤치마크를 세웠다.</w:t>
+      </w:r>
+      <w:r>
+        <w:t xml:space="preserve"> </w:t>
+      </w:r>
+      <w:r>
+        <w:t xml:space="preserve">단일 종단 점수만 좇는 자율 연구 시스템의 실패 양식</w:t>
       </w:r>
       <w:r>
         <w:t xml:space="preserve"> </w:t>
@@ -6975,7 +6987,13 @@
         <w:t xml:space="preserve"> </w:t>
       </w:r>
       <w:r>
-        <w:t xml:space="preserve">을 극복하기 위해 검증 비용이 생성 비용을 초과할 수 있음을 인정하고 감내했다</w:t>
+        <w:t xml:space="preserve">을 피하려면 검증 비용이 생성</w:t>
+      </w:r>
+      <w:r>
+        <w:t xml:space="preserve"> </w:t>
+      </w:r>
+      <w:r>
+        <w:t xml:space="preserve">비용을 넘을 수 있음을 감수해야 한다</w:t>
       </w:r>
       <w:r>
         <w:t xml:space="preserve"> </w:t>
@@ -6984,25 +7002,21 @@
         <w:t xml:space="preserve">[98]</w:t>
       </w:r>
       <w:r>
-        <w:t xml:space="preserve">. 본 논문이 보고하는 궁극적 결과는 처치의 우월성을 과장하는 수치가 아니라,</w:t>
-      </w:r>
-      <w:r>
-        <w:t xml:space="preserve"> </w:t>
-      </w:r>
-      <w:r>
-        <w:rPr>
-          <w:b/>
-          <w:bCs/>
-        </w:rPr>
-        <w:t xml:space="preserve">엄밀한 계측 규율과 그것이 드러낸 실패들</w:t>
-      </w:r>
-      <w:r>
-        <w:t xml:space="preserve">이다.</w:t>
-      </w:r>
-    </w:p>
-    <w:p>
-      <w:pPr>
-        <w:pStyle w:val="BodyText"/>
+        <w:t xml:space="preserve">.</w:t>
+      </w:r>
+    </w:p>
+    <w:bookmarkStart w:id="93" w:name="측정-축에서-확인된-것"/>
+    <w:p>
+      <w:pPr>
+        <w:pStyle w:val="Heading2"/>
+      </w:pPr>
+      <w:r>
+        <w:t xml:space="preserve">1. 측정 축에서 확인된 것</w:t>
+      </w:r>
+    </w:p>
+    <w:p>
+      <w:pPr>
+        <w:pStyle w:val="FirstParagraph"/>
       </w:pPr>
       <w:r>
         <w:t xml:space="preserve">세 가지가 실행된 근거로 확인됐다. 첫째, 단서 기반 채점기는 부정 판정 18건 중 7건을 잘못 냈으며 그</w:t>
@@ -7050,36 +7064,25 @@
         <w:t xml:space="preserve"> </w:t>
       </w:r>
       <w:r>
-        <w:t xml:space="preserve">세트를 사람 기준 교정 세트라 부르지 않으며, 판정 채점은 여전히 불인정이다. 사람 기준을 이 시스템이</w:t>
-      </w:r>
-      <w:r>
-        <w:t xml:space="preserve"> </w:t>
-      </w:r>
-      <w:r>
-        <w:t xml:space="preserve">스스로 만들 수 없다는 진술은 유지되지만, 모델 기준 세트가 존재한다는 사실은 함께 기록한다.</w:t>
-      </w:r>
-    </w:p>
-    <w:p>
-      <w:pPr>
-        <w:pStyle w:val="BodyText"/>
-      </w:pPr>
-      <w:r>
-        <w:t xml:space="preserve">향후 과제는 두 가지다. 첫째, 주관적 LLM 판정 대신 코드 실행 및 단위 테스트 기반의 결정론적 검증기(예: MLE-bench Lite 및 ResearchClawBench 실행형 과제)를 도입하여 기저 하네스와 제안 하네스를 McNemar 쌍체 검정으로 비교하는 것이다. 본 연구는 이 로드맵을 설계 문서(</w:t>
-      </w:r>
-      <w:r>
-        <w:rPr>
-          <w:rStyle w:val="VerbatimChar"/>
-        </w:rPr>
-        <w:t xml:space="preserve">paper/research/harness-comparison-arm-design.md</w:t>
-      </w:r>
-      <w:r>
-        <w:t xml:space="preserve">)에 사전 정의하여 향후 실전 자율 연구 프로토타입(AI Native R&amp;D)의 실증적 검증 기반을 확립하였다. 둘째, 독립된 전문가 주석을 확보하여 판정 채점의 오류 상한(UCB)을 공식 인증하는 것이다. 두 과제 모두</w:t>
-      </w:r>
-      <w:r>
-        <w:t xml:space="preserve"> </w:t>
-      </w:r>
-      <w:r>
-        <w:t xml:space="preserve">본 논문이 세운 원칙, 즉</w:t>
+        <w:t xml:space="preserve">세트를 사람 기준 교정 세트라 부르지 않으며, 판정 채점은 여전히 불인정이다.</w:t>
+      </w:r>
+    </w:p>
+    <w:bookmarkEnd w:id="93"/>
+    <w:bookmarkStart w:id="94" w:name="설계-축이-서-있는-자리"/>
+    <w:p>
+      <w:pPr>
+        <w:pStyle w:val="Heading2"/>
+      </w:pPr>
+      <w:r>
+        <w:t xml:space="preserve">2. 설계 축이 서 있는 자리</w:t>
+      </w:r>
+    </w:p>
+    <w:p>
+      <w:pPr>
+        <w:pStyle w:val="FirstParagraph"/>
+      </w:pPr>
+      <w:r>
+        <w:t xml:space="preserve">측정 축의 결론은 다음 실험의 형태를 강제한다. 판정기가 조건을 분리하지 못한다면 endpoint는</w:t>
       </w:r>
       <w:r>
         <w:t xml:space="preserve"> </w:t>
@@ -7089,14 +7092,217 @@
           <w:b/>
           <w:bCs/>
         </w:rPr>
-        <w:t xml:space="preserve">측정 도구의 인정 가능성이 효과 추정에 선행한다</w:t>
-      </w:r>
-      <w:r>
-        <w:t xml:space="preserve">는 원칙 아래에서 수행된다.</w:t>
-      </w:r>
-    </w:p>
-    <w:bookmarkEnd w:id="93"/>
-    <w:bookmarkStart w:id="254" w:name="참-고-문-헌-references"/>
+        <w:t xml:space="preserve">모델이 아니라 코드가 채점하는 것</w:t>
+      </w:r>
+      <w:r>
+        <w:t xml:space="preserve">이어야 하고, 보고된 수치는</w:t>
+      </w:r>
+      <w:r>
+        <w:t xml:space="preserve"> </w:t>
+      </w:r>
+      <w:r>
+        <w:rPr>
+          <w:b/>
+          <w:bCs/>
+        </w:rPr>
+        <w:t xml:space="preserve">실행 영수증과 대조 가능</w:t>
+      </w:r>
+      <w:r>
+        <w:t xml:space="preserve">해야 한다.</w:t>
+      </w:r>
+      <w:r>
+        <w:t xml:space="preserve"> </w:t>
+      </w:r>
+      <w:r>
+        <w:t xml:space="preserve">Study B는 이 두 요구를 그대로 설계로 옮겼다. 일곱 메커니즘 각각에 절제 아암을 두어 어느 성분이 효과를</w:t>
+      </w:r>
+      <w:r>
+        <w:t xml:space="preserve"> </w:t>
+      </w:r>
+      <w:r>
+        <w:t xml:space="preserve">내는지 귀속시키고, 1차 대비·풀링·유의수준·보정을 데이터 이전에 고정했다.</w:t>
+      </w:r>
+    </w:p>
+    <w:p>
+      <w:pPr>
+        <w:pStyle w:val="BodyText"/>
+      </w:pPr>
+      <w:r>
+        <w:t xml:space="preserve">선행 하네스 비교 연구와의 차이는 검정의 유무가 아니라</w:t>
+      </w:r>
+      <w:r>
+        <w:t xml:space="preserve"> </w:t>
+      </w:r>
+      <w:r>
+        <w:rPr>
+          <w:b/>
+          <w:bCs/>
+        </w:rPr>
+        <w:t xml:space="preserve">검정의 위치</w:t>
+      </w:r>
+      <w:r>
+        <w:t xml:space="preserve">다. 짝지은 검정을 쓰는 선행 연구도</w:t>
+      </w:r>
+      <w:r>
+        <w:t xml:space="preserve"> </w:t>
+      </w:r>
+      <w:r>
+        <w:t xml:space="preserve">있으나</w:t>
+      </w:r>
+      <w:r>
+        <w:t xml:space="preserve"> </w:t>
+      </w:r>
+      <w:r>
+        <w:t xml:space="preserve">[53]</w:t>
+      </w:r>
+      <w:r>
+        <w:t xml:space="preserve">, 그 검정은 결과를 본 뒤의 서술이며 검출 한계는 사후에 드러난다. 본 연구는 그</w:t>
+      </w:r>
+      <w:r>
+        <w:t xml:space="preserve"> </w:t>
+      </w:r>
+      <w:r>
+        <w:t xml:space="preserve">한계를 실험 이전에 계산해 공개한다. 이것이 음성 결과를 해석 가능하게 만드는 최소 조건이다.</w:t>
+      </w:r>
+    </w:p>
+    <w:bookmarkEnd w:id="94"/>
+    <w:bookmarkStart w:id="95" w:name="이-논문이-남기는-원칙"/>
+    <w:p>
+      <w:pPr>
+        <w:pStyle w:val="Heading2"/>
+      </w:pPr>
+      <w:r>
+        <w:t xml:space="preserve">3. 이 논문이 남기는 원칙</w:t>
+      </w:r>
+    </w:p>
+    <w:p>
+      <w:pPr>
+        <w:pStyle w:val="FirstParagraph"/>
+      </w:pPr>
+      <w:r>
+        <w:rPr>
+          <w:b/>
+          <w:bCs/>
+        </w:rPr>
+        <w:t xml:space="preserve">측정 도구의 인정 가능성이 효과 추정에 선행한다.</w:t>
+      </w:r>
+      <w:r>
+        <w:t xml:space="preserve"> </w:t>
+      </w:r>
+      <w:r>
+        <w:t xml:space="preserve">이 원칙은 본 연구 자신에게 먼저 적용됐다.</w:t>
+      </w:r>
+      <w:r>
+        <w:t xml:space="preserve"> </w:t>
+      </w:r>
+      <w:r>
+        <w:t xml:space="preserve">개발 과정에서 실행되지 않은 시뮬레이션이 결과로 기술된 사건이 있었고, 사후에 검증기를 실제로 돌리자</w:t>
+      </w:r>
+      <w:r>
+        <w:t xml:space="preserve"> </w:t>
+      </w:r>
+      <w:r>
+        <w:t xml:space="preserve">그 수치는 근거가 없을 뿐 아니라 방향까지 틀렸다. 이 논문은 그 사건을 숨기지 않고 철회 기록으로 남겼으며,</w:t>
+      </w:r>
+      <w:r>
+        <w:t xml:space="preserve"> </w:t>
+      </w:r>
+      <w:r>
+        <w:t xml:space="preserve">숫자의</w:t>
+      </w:r>
+      <w:r>
+        <w:t xml:space="preserve"> </w:t>
+      </w:r>
+      <w:r>
+        <w:rPr>
+          <w:i/>
+          <w:iCs/>
+        </w:rPr>
+        <w:t xml:space="preserve">일치</w:t>
+      </w:r>
+      <w:r>
+        <w:t xml:space="preserve">가 아니라</w:t>
+      </w:r>
+      <w:r>
+        <w:t xml:space="preserve"> </w:t>
+      </w:r>
+      <w:r>
+        <w:rPr>
+          <w:i/>
+          <w:iCs/>
+        </w:rPr>
+        <w:t xml:space="preserve">출처</w:t>
+      </w:r>
+      <w:r>
+        <w:t xml:space="preserve">를 검사하는 게이트를 그 대응으로 세웠다. 결과를 담는 모든 산출물은</w:t>
+      </w:r>
+      <w:r>
+        <w:t xml:space="preserve"> </w:t>
+      </w:r>
+      <w:r>
+        <w:t xml:space="preserve">자신이 어디서 왔는지를 필드로 밝히고, 실행을 주장하는 영수증은 그 실행이 불변 노드 안에서 일어났음을</w:t>
+      </w:r>
+      <w:r>
+        <w:t xml:space="preserve"> </w:t>
+      </w:r>
+      <w:r>
+        <w:t xml:space="preserve">증명해야 한다.</w:t>
+      </w:r>
+    </w:p>
+    <w:bookmarkEnd w:id="95"/>
+    <w:bookmarkStart w:id="96" w:name="남은-과제"/>
+    <w:p>
+      <w:pPr>
+        <w:pStyle w:val="Heading2"/>
+      </w:pPr>
+      <w:r>
+        <w:t xml:space="preserve">4. 남은 과제</w:t>
+      </w:r>
+    </w:p>
+    <w:p>
+      <w:pPr>
+        <w:pStyle w:val="FirstParagraph"/>
+      </w:pPr>
+      <w:r>
+        <w:t xml:space="preserve">Study B의 실행은 승인된 예산 범위 안에서 이루어지며, 이 논문이 보고하는 시점에는</w:t>
+      </w:r>
+      <w:r>
+        <w:t xml:space="preserve"> </w:t>
+      </w:r>
+      <w:r>
+        <w:rPr>
+          <w:b/>
+          <w:bCs/>
+        </w:rPr>
+        <w:t xml:space="preserve">사전등록만 완료된</w:t>
+      </w:r>
+      <w:r>
+        <w:rPr>
+          <w:b/>
+          <w:bCs/>
+        </w:rPr>
+        <w:t xml:space="preserve"> </w:t>
+      </w:r>
+      <w:r>
+        <w:rPr>
+          <w:b/>
+          <w:bCs/>
+        </w:rPr>
+        <w:t xml:space="preserve">상태</w:t>
+      </w:r>
+      <w:r>
+        <w:t xml:space="preserve">다. 절제 아암은 1차 스크리닝 이후로 미룬다. 교정 축에서는 독립된 사람 주석을 확보해 판정 채점의</w:t>
+      </w:r>
+      <w:r>
+        <w:t xml:space="preserve"> </w:t>
+      </w:r>
+      <w:r>
+        <w:t xml:space="preserve">오류 상한을 공식 인증하는 일이 남는다. 두 과제 모두 위의 원칙 아래에서 수행된다.</w:t>
+      </w:r>
+    </w:p>
+    <w:bookmarkEnd w:id="96"/>
+    <w:bookmarkEnd w:id="97"/>
+    <w:bookmarkStart w:id="258" w:name="참-고-문-헌-references"/>
     <w:p>
       <w:pPr>
         <w:pStyle w:val="Heading1"/>
@@ -7105,8 +7311,8 @@
         <w:t xml:space="preserve">참 고 문 헌 (References)</w:t>
       </w:r>
     </w:p>
-    <w:bookmarkStart w:id="253" w:name="refs"/>
-    <w:bookmarkStart w:id="95" w:name="ref-react2023"/>
+    <w:bookmarkStart w:id="257" w:name="refs"/>
+    <w:bookmarkStart w:id="99" w:name="ref-react2023"/>
     <w:p>
       <w:pPr>
         <w:pStyle w:val="Bibliography"/>
@@ -7135,7 +7341,7 @@
       <w:r>
         <w:t xml:space="preserve"> </w:t>
       </w:r>
-      <w:hyperlink r:id="rId94">
+      <w:hyperlink r:id="rId98">
         <w:r>
           <w:rPr>
             <w:rStyle w:val="Hyperlink"/>
@@ -7144,8 +7350,8 @@
         </w:r>
       </w:hyperlink>
     </w:p>
-    <w:bookmarkEnd w:id="95"/>
-    <w:bookmarkStart w:id="97" w:name="ref-memgpt2023"/>
+    <w:bookmarkEnd w:id="99"/>
+    <w:bookmarkStart w:id="101" w:name="ref-memgpt2023"/>
     <w:p>
       <w:pPr>
         <w:pStyle w:val="Bibliography"/>
@@ -7174,7 +7380,7 @@
       <w:r>
         <w:t xml:space="preserve"> </w:t>
       </w:r>
-      <w:hyperlink r:id="rId96">
+      <w:hyperlink r:id="rId100">
         <w:r>
           <w:rPr>
             <w:rStyle w:val="Hyperlink"/>
@@ -7183,8 +7389,8 @@
         </w:r>
       </w:hyperlink>
     </w:p>
-    <w:bookmarkEnd w:id="97"/>
-    <w:bookmarkStart w:id="99" w:name="ref-rlm2025"/>
+    <w:bookmarkEnd w:id="101"/>
+    <w:bookmarkStart w:id="103" w:name="ref-rlm2025"/>
     <w:p>
       <w:pPr>
         <w:pStyle w:val="Bibliography"/>
@@ -7213,7 +7419,7 @@
       <w:r>
         <w:t xml:space="preserve"> </w:t>
       </w:r>
-      <w:hyperlink r:id="rId98">
+      <w:hyperlink r:id="rId102">
         <w:r>
           <w:rPr>
             <w:rStyle w:val="Hyperlink"/>
@@ -7222,8 +7428,8 @@
         </w:r>
       </w:hyperlink>
     </w:p>
-    <w:bookmarkEnd w:id="99"/>
-    <w:bookmarkStart w:id="101" w:name="ref-autogen2023"/>
+    <w:bookmarkEnd w:id="103"/>
+    <w:bookmarkStart w:id="105" w:name="ref-autogen2023"/>
     <w:p>
       <w:pPr>
         <w:pStyle w:val="Bibliography"/>
@@ -7252,7 +7458,7 @@
       <w:r>
         <w:t xml:space="preserve"> </w:t>
       </w:r>
-      <w:hyperlink r:id="rId100">
+      <w:hyperlink r:id="rId104">
         <w:r>
           <w:rPr>
             <w:rStyle w:val="Hyperlink"/>
@@ -7261,8 +7467,8 @@
         </w:r>
       </w:hyperlink>
     </w:p>
-    <w:bookmarkEnd w:id="101"/>
-    <w:bookmarkStart w:id="103" w:name="ref-genaimeasurement2025"/>
+    <w:bookmarkEnd w:id="105"/>
+    <w:bookmarkStart w:id="107" w:name="ref-genaimeasurement2025"/>
     <w:p>
       <w:pPr>
         <w:pStyle w:val="Bibliography"/>
@@ -7291,7 +7497,7 @@
       <w:r>
         <w:t xml:space="preserve"> </w:t>
       </w:r>
-      <w:hyperlink r:id="rId102">
+      <w:hyperlink r:id="rId106">
         <w:r>
           <w:rPr>
             <w:rStyle w:val="Hyperlink"/>
@@ -7300,8 +7506,8 @@
         </w:r>
       </w:hyperlink>
     </w:p>
-    <w:bookmarkEnd w:id="103"/>
-    <w:bookmarkStart w:id="105" w:name="ref-whogrades2026"/>
+    <w:bookmarkEnd w:id="107"/>
+    <w:bookmarkStart w:id="109" w:name="ref-whogrades2026"/>
     <w:p>
       <w:pPr>
         <w:pStyle w:val="Bibliography"/>
@@ -7330,7 +7536,7 @@
       <w:r>
         <w:t xml:space="preserve"> </w:t>
       </w:r>
-      <w:hyperlink r:id="rId104">
+      <w:hyperlink r:id="rId108">
         <w:r>
           <w:rPr>
             <w:rStyle w:val="Hyperlink"/>
@@ -7339,8 +7545,8 @@
         </w:r>
       </w:hyperlink>
     </w:p>
-    <w:bookmarkEnd w:id="105"/>
-    <w:bookmarkStart w:id="107" w:name="ref-verifiergap2026"/>
+    <w:bookmarkEnd w:id="109"/>
+    <w:bookmarkStart w:id="111" w:name="ref-verifiergap2026"/>
     <w:p>
       <w:pPr>
         <w:pStyle w:val="Bibliography"/>
@@ -7369,7 +7575,7 @@
       <w:r>
         <w:t xml:space="preserve"> </w:t>
       </w:r>
-      <w:hyperlink r:id="rId106">
+      <w:hyperlink r:id="rId110">
         <w:r>
           <w:rPr>
             <w:rStyle w:val="Hyperlink"/>
@@ -7378,8 +7584,8 @@
         </w:r>
       </w:hyperlink>
     </w:p>
-    <w:bookmarkEnd w:id="107"/>
-    <w:bookmarkStart w:id="109" w:name="ref-harnesstamper2026"/>
+    <w:bookmarkEnd w:id="111"/>
+    <w:bookmarkStart w:id="113" w:name="ref-harnesstamper2026"/>
     <w:p>
       <w:pPr>
         <w:pStyle w:val="Bibliography"/>
@@ -7408,7 +7614,7 @@
       <w:r>
         <w:t xml:space="preserve"> </w:t>
       </w:r>
-      <w:hyperlink r:id="rId108">
+      <w:hyperlink r:id="rId112">
         <w:r>
           <w:rPr>
             <w:rStyle w:val="Hyperlink"/>
@@ -7417,8 +7623,8 @@
         </w:r>
       </w:hyperlink>
     </w:p>
-    <w:bookmarkEnd w:id="109"/>
-    <w:bookmarkStart w:id="111" w:name="ref-auditablewriting2026"/>
+    <w:bookmarkEnd w:id="113"/>
+    <w:bookmarkStart w:id="115" w:name="ref-auditablewriting2026"/>
     <w:p>
       <w:pPr>
         <w:pStyle w:val="Bibliography"/>
@@ -7447,7 +7653,7 @@
       <w:r>
         <w:t xml:space="preserve"> </w:t>
       </w:r>
-      <w:hyperlink r:id="rId110">
+      <w:hyperlink r:id="rId114">
         <w:r>
           <w:rPr>
             <w:rStyle w:val="Hyperlink"/>
@@ -7456,8 +7662,8 @@
         </w:r>
       </w:hyperlink>
     </w:p>
-    <w:bookmarkEnd w:id="111"/>
-    <w:bookmarkStart w:id="113" w:name="ref-reflexion2023"/>
+    <w:bookmarkEnd w:id="115"/>
+    <w:bookmarkStart w:id="117" w:name="ref-reflexion2023"/>
     <w:p>
       <w:pPr>
         <w:pStyle w:val="Bibliography"/>
@@ -7486,7 +7692,7 @@
       <w:r>
         <w:t xml:space="preserve"> </w:t>
       </w:r>
-      <w:hyperlink r:id="rId112">
+      <w:hyperlink r:id="rId116">
         <w:r>
           <w:rPr>
             <w:rStyle w:val="Hyperlink"/>
@@ -7495,8 +7701,8 @@
         </w:r>
       </w:hyperlink>
     </w:p>
-    <w:bookmarkEnd w:id="113"/>
-    <w:bookmarkStart w:id="115" w:name="ref-rag2020"/>
+    <w:bookmarkEnd w:id="117"/>
+    <w:bookmarkStart w:id="119" w:name="ref-rag2020"/>
     <w:p>
       <w:pPr>
         <w:pStyle w:val="Bibliography"/>
@@ -7525,7 +7731,7 @@
       <w:r>
         <w:t xml:space="preserve"> </w:t>
       </w:r>
-      <w:hyperlink r:id="rId114">
+      <w:hyperlink r:id="rId118">
         <w:r>
           <w:rPr>
             <w:rStyle w:val="Hyperlink"/>
@@ -7534,8 +7740,8 @@
         </w:r>
       </w:hyperlink>
     </w:p>
-    <w:bookmarkEnd w:id="115"/>
-    <w:bookmarkStart w:id="117" w:name="ref-codeharness2026"/>
+    <w:bookmarkEnd w:id="119"/>
+    <w:bookmarkStart w:id="121" w:name="ref-codeharness2026"/>
     <w:p>
       <w:pPr>
         <w:pStyle w:val="Bibliography"/>
@@ -7567,7 +7773,7 @@
       <w:r>
         <w:t xml:space="preserve"> </w:t>
       </w:r>
-      <w:hyperlink r:id="rId116">
+      <w:hyperlink r:id="rId120">
         <w:r>
           <w:rPr>
             <w:rStyle w:val="Hyperlink"/>
@@ -7576,8 +7782,8 @@
         </w:r>
       </w:hyperlink>
     </w:p>
-    <w:bookmarkEnd w:id="117"/>
-    <w:bookmarkStart w:id="119" w:name="ref-dive2026"/>
+    <w:bookmarkEnd w:id="121"/>
+    <w:bookmarkStart w:id="123" w:name="ref-dive2026"/>
     <w:p>
       <w:pPr>
         <w:pStyle w:val="Bibliography"/>
@@ -7606,7 +7812,7 @@
       <w:r>
         <w:t xml:space="preserve"> </w:t>
       </w:r>
-      <w:hyperlink r:id="rId118">
+      <w:hyperlink r:id="rId122">
         <w:r>
           <w:rPr>
             <w:rStyle w:val="Hyperlink"/>
@@ -7615,8 +7821,8 @@
         </w:r>
       </w:hyperlink>
     </w:p>
-    <w:bookmarkEnd w:id="119"/>
-    <w:bookmarkStart w:id="121" w:name="ref-longhorizon2026"/>
+    <w:bookmarkEnd w:id="123"/>
+    <w:bookmarkStart w:id="125" w:name="ref-longhorizon2026"/>
     <w:p>
       <w:pPr>
         <w:pStyle w:val="Bibliography"/>
@@ -7645,7 +7851,7 @@
       <w:r>
         <w:t xml:space="preserve"> </w:t>
       </w:r>
-      <w:hyperlink r:id="rId120">
+      <w:hyperlink r:id="rId124">
         <w:r>
           <w:rPr>
             <w:rStyle w:val="Hyperlink"/>
@@ -7654,8 +7860,8 @@
         </w:r>
       </w:hyperlink>
     </w:p>
-    <w:bookmarkEnd w:id="121"/>
-    <w:bookmarkStart w:id="123" w:name="ref-loopsbench2026"/>
+    <w:bookmarkEnd w:id="125"/>
+    <w:bookmarkStart w:id="127" w:name="ref-loopsbench2026"/>
     <w:p>
       <w:pPr>
         <w:pStyle w:val="Bibliography"/>
@@ -7687,7 +7893,7 @@
       <w:r>
         <w:t xml:space="preserve"> </w:t>
       </w:r>
-      <w:hyperlink r:id="rId122">
+      <w:hyperlink r:id="rId126">
         <w:r>
           <w:rPr>
             <w:rStyle w:val="Hyperlink"/>
@@ -7696,8 +7902,8 @@
         </w:r>
       </w:hyperlink>
     </w:p>
-    <w:bookmarkEnd w:id="123"/>
-    <w:bookmarkStart w:id="125" w:name="ref-scroll2026"/>
+    <w:bookmarkEnd w:id="127"/>
+    <w:bookmarkStart w:id="129" w:name="ref-scroll2026"/>
     <w:p>
       <w:pPr>
         <w:pStyle w:val="Bibliography"/>
@@ -7726,7 +7932,7 @@
       <w:r>
         <w:t xml:space="preserve"> </w:t>
       </w:r>
-      <w:hyperlink r:id="rId124">
+      <w:hyperlink r:id="rId128">
         <w:r>
           <w:rPr>
             <w:rStyle w:val="Hyperlink"/>
@@ -7735,8 +7941,8 @@
         </w:r>
       </w:hyperlink>
     </w:p>
-    <w:bookmarkEnd w:id="125"/>
-    <w:bookmarkStart w:id="127" w:name="ref-protocoltaxonomy2026"/>
+    <w:bookmarkEnd w:id="129"/>
+    <w:bookmarkStart w:id="131" w:name="ref-protocoltaxonomy2026"/>
     <w:p>
       <w:pPr>
         <w:pStyle w:val="Bibliography"/>
@@ -7765,7 +7971,7 @@
       <w:r>
         <w:t xml:space="preserve"> </w:t>
       </w:r>
-      <w:hyperlink r:id="rId126">
+      <w:hyperlink r:id="rId130">
         <w:r>
           <w:rPr>
             <w:rStyle w:val="Hyperlink"/>
@@ -7774,8 +7980,8 @@
         </w:r>
       </w:hyperlink>
     </w:p>
-    <w:bookmarkEnd w:id="127"/>
-    <w:bookmarkStart w:id="129" w:name="ref-chap2026"/>
+    <w:bookmarkEnd w:id="131"/>
+    <w:bookmarkStart w:id="133" w:name="ref-chap2026"/>
     <w:p>
       <w:pPr>
         <w:pStyle w:val="Bibliography"/>
@@ -7804,7 +8010,7 @@
       <w:r>
         <w:t xml:space="preserve"> </w:t>
       </w:r>
-      <w:hyperlink r:id="rId128">
+      <w:hyperlink r:id="rId132">
         <w:r>
           <w:rPr>
             <w:rStyle w:val="Hyperlink"/>
@@ -7813,8 +8019,8 @@
         </w:r>
       </w:hyperlink>
     </w:p>
-    <w:bookmarkEnd w:id="129"/>
-    <w:bookmarkStart w:id="131" w:name="ref-insemrag2026"/>
+    <w:bookmarkEnd w:id="133"/>
+    <w:bookmarkStart w:id="135" w:name="ref-insemrag2026"/>
     <w:p>
       <w:pPr>
         <w:pStyle w:val="Bibliography"/>
@@ -7846,7 +8052,7 @@
       <w:r>
         <w:t xml:space="preserve"> </w:t>
       </w:r>
-      <w:hyperlink r:id="rId130">
+      <w:hyperlink r:id="rId134">
         <w:r>
           <w:rPr>
             <w:rStyle w:val="Hyperlink"/>
@@ -7855,8 +8061,8 @@
         </w:r>
       </w:hyperlink>
     </w:p>
-    <w:bookmarkEnd w:id="131"/>
-    <w:bookmarkStart w:id="133" w:name="ref-sciret2026"/>
+    <w:bookmarkEnd w:id="135"/>
+    <w:bookmarkStart w:id="137" w:name="ref-sciret2026"/>
     <w:p>
       <w:pPr>
         <w:pStyle w:val="Bibliography"/>
@@ -7885,7 +8091,7 @@
       <w:r>
         <w:t xml:space="preserve"> </w:t>
       </w:r>
-      <w:hyperlink r:id="rId132">
+      <w:hyperlink r:id="rId136">
         <w:r>
           <w:rPr>
             <w:rStyle w:val="Hyperlink"/>
@@ -7894,8 +8100,8 @@
         </w:r>
       </w:hyperlink>
     </w:p>
-    <w:bookmarkEnd w:id="133"/>
-    <w:bookmarkStart w:id="135" w:name="ref-adaptiverag2026"/>
+    <w:bookmarkEnd w:id="137"/>
+    <w:bookmarkStart w:id="139" w:name="ref-adaptiverag2026"/>
     <w:p>
       <w:pPr>
         <w:pStyle w:val="Bibliography"/>
@@ -7924,7 +8130,7 @@
       <w:r>
         <w:t xml:space="preserve"> </w:t>
       </w:r>
-      <w:hyperlink r:id="rId134">
+      <w:hyperlink r:id="rId138">
         <w:r>
           <w:rPr>
             <w:rStyle w:val="Hyperlink"/>
@@ -7933,8 +8139,8 @@
         </w:r>
       </w:hyperlink>
     </w:p>
-    <w:bookmarkEnd w:id="135"/>
-    <w:bookmarkStart w:id="137" w:name="ref-llmrouter2026"/>
+    <w:bookmarkEnd w:id="139"/>
+    <w:bookmarkStart w:id="141" w:name="ref-llmrouter2026"/>
     <w:p>
       <w:pPr>
         <w:pStyle w:val="Bibliography"/>
@@ -7966,7 +8172,7 @@
       <w:r>
         <w:t xml:space="preserve"> </w:t>
       </w:r>
-      <w:hyperlink r:id="rId136">
+      <w:hyperlink r:id="rId140">
         <w:r>
           <w:rPr>
             <w:rStyle w:val="Hyperlink"/>
@@ -7975,8 +8181,8 @@
         </w:r>
       </w:hyperlink>
     </w:p>
-    <w:bookmarkEnd w:id="137"/>
-    <w:bookmarkStart w:id="139" w:name="ref-resamplereroute2026"/>
+    <w:bookmarkEnd w:id="141"/>
+    <w:bookmarkStart w:id="143" w:name="ref-resamplereroute2026"/>
     <w:p>
       <w:pPr>
         <w:pStyle w:val="Bibliography"/>
@@ -8005,7 +8211,7 @@
       <w:r>
         <w:t xml:space="preserve"> </w:t>
       </w:r>
-      <w:hyperlink r:id="rId138">
+      <w:hyperlink r:id="rId142">
         <w:r>
           <w:rPr>
             <w:rStyle w:val="Hyperlink"/>
@@ -8014,8 +8220,8 @@
         </w:r>
       </w:hyperlink>
     </w:p>
-    <w:bookmarkEnd w:id="139"/>
-    <w:bookmarkStart w:id="141" w:name="ref-controlledorchestration2026"/>
+    <w:bookmarkEnd w:id="143"/>
+    <w:bookmarkStart w:id="145" w:name="ref-controlledorchestration2026"/>
     <w:p>
       <w:pPr>
         <w:pStyle w:val="Bibliography"/>
@@ -8044,7 +8250,7 @@
       <w:r>
         <w:t xml:space="preserve"> </w:t>
       </w:r>
-      <w:hyperlink r:id="rId140">
+      <w:hyperlink r:id="rId144">
         <w:r>
           <w:rPr>
             <w:rStyle w:val="Hyperlink"/>
@@ -8053,8 +8259,8 @@
         </w:r>
       </w:hyperlink>
     </w:p>
-    <w:bookmarkEnd w:id="141"/>
-    <w:bookmarkStart w:id="143" w:name="ref-agora2026"/>
+    <w:bookmarkEnd w:id="145"/>
+    <w:bookmarkStart w:id="147" w:name="ref-agora2026"/>
     <w:p>
       <w:pPr>
         <w:pStyle w:val="Bibliography"/>
@@ -8083,7 +8289,7 @@
       <w:r>
         <w:t xml:space="preserve"> </w:t>
       </w:r>
-      <w:hyperlink r:id="rId142">
+      <w:hyperlink r:id="rId146">
         <w:r>
           <w:rPr>
             <w:rStyle w:val="Hyperlink"/>
@@ -8092,8 +8298,8 @@
         </w:r>
       </w:hyperlink>
     </w:p>
-    <w:bookmarkEnd w:id="143"/>
-    <w:bookmarkStart w:id="145" w:name="ref-aiscientist2024"/>
+    <w:bookmarkEnd w:id="147"/>
+    <w:bookmarkStart w:id="149" w:name="ref-aiscientist2024"/>
     <w:p>
       <w:pPr>
         <w:pStyle w:val="Bibliography"/>
@@ -8122,7 +8328,7 @@
       <w:r>
         <w:t xml:space="preserve"> </w:t>
       </w:r>
-      <w:hyperlink r:id="rId144">
+      <w:hyperlink r:id="rId148">
         <w:r>
           <w:rPr>
             <w:rStyle w:val="Hyperlink"/>
@@ -8131,8 +8337,8 @@
         </w:r>
       </w:hyperlink>
     </w:p>
-    <w:bookmarkEnd w:id="145"/>
-    <w:bookmarkStart w:id="147" w:name="ref-coscientist2025"/>
+    <w:bookmarkEnd w:id="149"/>
+    <w:bookmarkStart w:id="151" w:name="ref-coscientist2025"/>
     <w:p>
       <w:pPr>
         <w:pStyle w:val="Bibliography"/>
@@ -8164,7 +8370,7 @@
       <w:r>
         <w:t xml:space="preserve"> </w:t>
       </w:r>
-      <w:hyperlink r:id="rId146">
+      <w:hyperlink r:id="rId150">
         <w:r>
           <w:rPr>
             <w:rStyle w:val="Hyperlink"/>
@@ -8173,8 +8379,8 @@
         </w:r>
       </w:hyperlink>
     </w:p>
-    <w:bookmarkEnd w:id="147"/>
-    <w:bookmarkStart w:id="149" w:name="ref-sciagents2024"/>
+    <w:bookmarkEnd w:id="151"/>
+    <w:bookmarkStart w:id="153" w:name="ref-sciagents2024"/>
     <w:p>
       <w:pPr>
         <w:pStyle w:val="Bibliography"/>
@@ -8203,7 +8409,7 @@
       <w:r>
         <w:t xml:space="preserve"> </w:t>
       </w:r>
-      <w:hyperlink r:id="rId148">
+      <w:hyperlink r:id="rId152">
         <w:r>
           <w:rPr>
             <w:rStyle w:val="Hyperlink"/>
@@ -8212,8 +8418,8 @@
         </w:r>
       </w:hyperlink>
     </w:p>
-    <w:bookmarkEnd w:id="149"/>
-    <w:bookmarkStart w:id="151" w:name="ref-evigraph2026"/>
+    <w:bookmarkEnd w:id="153"/>
+    <w:bookmarkStart w:id="155" w:name="ref-evigraph2026"/>
     <w:p>
       <w:pPr>
         <w:pStyle w:val="Bibliography"/>
@@ -8242,7 +8448,7 @@
       <w:r>
         <w:t xml:space="preserve"> </w:t>
       </w:r>
-      <w:hyperlink r:id="rId150">
+      <w:hyperlink r:id="rId154">
         <w:r>
           <w:rPr>
             <w:rStyle w:val="Hyperlink"/>
@@ -8251,8 +8457,8 @@
         </w:r>
       </w:hyperlink>
     </w:p>
-    <w:bookmarkEnd w:id="151"/>
-    <w:bookmarkStart w:id="153" w:name="ref-xscientist2026"/>
+    <w:bookmarkEnd w:id="155"/>
+    <w:bookmarkStart w:id="157" w:name="ref-xscientist2026"/>
     <w:p>
       <w:pPr>
         <w:pStyle w:val="Bibliography"/>
@@ -8281,7 +8487,7 @@
       <w:r>
         <w:t xml:space="preserve"> </w:t>
       </w:r>
-      <w:hyperlink r:id="rId152">
+      <w:hyperlink r:id="rId156">
         <w:r>
           <w:rPr>
             <w:rStyle w:val="Hyperlink"/>
@@ -8290,8 +8496,8 @@
         </w:r>
       </w:hyperlink>
     </w:p>
-    <w:bookmarkEnd w:id="153"/>
-    <w:bookmarkStart w:id="155" w:name="ref-scientistone2026"/>
+    <w:bookmarkEnd w:id="157"/>
+    <w:bookmarkStart w:id="159" w:name="ref-scientistone2026"/>
     <w:p>
       <w:pPr>
         <w:pStyle w:val="Bibliography"/>
@@ -8320,7 +8526,7 @@
       <w:r>
         <w:t xml:space="preserve"> </w:t>
       </w:r>
-      <w:hyperlink r:id="rId154">
+      <w:hyperlink r:id="rId158">
         <w:r>
           <w:rPr>
             <w:rStyle w:val="Hyperlink"/>
@@ -8329,8 +8535,8 @@
         </w:r>
       </w:hyperlink>
     </w:p>
-    <w:bookmarkEnd w:id="155"/>
-    <w:bookmarkStart w:id="157" w:name="ref-scope2026"/>
+    <w:bookmarkEnd w:id="159"/>
+    <w:bookmarkStart w:id="161" w:name="ref-scope2026"/>
     <w:p>
       <w:pPr>
         <w:pStyle w:val="Bibliography"/>
@@ -8362,7 +8568,7 @@
       <w:r>
         <w:t xml:space="preserve"> </w:t>
       </w:r>
-      <w:hyperlink r:id="rId156">
+      <w:hyperlink r:id="rId160">
         <w:r>
           <w:rPr>
             <w:rStyle w:val="Hyperlink"/>
@@ -8371,8 +8577,8 @@
         </w:r>
       </w:hyperlink>
     </w:p>
-    <w:bookmarkEnd w:id="157"/>
-    <w:bookmarkStart w:id="159" w:name="ref-searchdiagnosis2026"/>
+    <w:bookmarkEnd w:id="161"/>
+    <w:bookmarkStart w:id="163" w:name="ref-searchdiagnosis2026"/>
     <w:p>
       <w:pPr>
         <w:pStyle w:val="Bibliography"/>
@@ -8401,7 +8607,7 @@
       <w:r>
         <w:t xml:space="preserve"> </w:t>
       </w:r>
-      <w:hyperlink r:id="rId158">
+      <w:hyperlink r:id="rId162">
         <w:r>
           <w:rPr>
             <w:rStyle w:val="Hyperlink"/>
@@ -8410,8 +8616,8 @@
         </w:r>
       </w:hyperlink>
     </w:p>
-    <w:bookmarkEnd w:id="159"/>
-    <w:bookmarkStart w:id="161" w:name="ref-researchclawbench2026"/>
+    <w:bookmarkEnd w:id="163"/>
+    <w:bookmarkStart w:id="165" w:name="ref-researchclawbench2026"/>
     <w:p>
       <w:pPr>
         <w:pStyle w:val="Bibliography"/>
@@ -8443,7 +8649,7 @@
       <w:r>
         <w:t xml:space="preserve"> </w:t>
       </w:r>
-      <w:hyperlink r:id="rId160">
+      <w:hyperlink r:id="rId164">
         <w:r>
           <w:rPr>
             <w:rStyle w:val="Hyperlink"/>
@@ -8452,8 +8658,8 @@
         </w:r>
       </w:hyperlink>
     </w:p>
-    <w:bookmarkEnd w:id="161"/>
-    <w:bookmarkStart w:id="163" w:name="ref-arbor2026"/>
+    <w:bookmarkEnd w:id="165"/>
+    <w:bookmarkStart w:id="167" w:name="ref-arbor2026"/>
     <w:p>
       <w:pPr>
         <w:pStyle w:val="Bibliography"/>
@@ -8485,7 +8691,7 @@
       <w:r>
         <w:t xml:space="preserve"> </w:t>
       </w:r>
-      <w:hyperlink r:id="rId162">
+      <w:hyperlink r:id="rId166">
         <w:r>
           <w:rPr>
             <w:rStyle w:val="Hyperlink"/>
@@ -8494,8 +8700,8 @@
         </w:r>
       </w:hyperlink>
     </w:p>
-    <w:bookmarkEnd w:id="163"/>
-    <w:bookmarkStart w:id="165" w:name="ref-hep2026"/>
+    <w:bookmarkEnd w:id="167"/>
+    <w:bookmarkStart w:id="169" w:name="ref-hep2026"/>
     <w:p>
       <w:pPr>
         <w:pStyle w:val="Bibliography"/>
@@ -8524,7 +8730,7 @@
       <w:r>
         <w:t xml:space="preserve"> </w:t>
       </w:r>
-      <w:hyperlink r:id="rId164">
+      <w:hyperlink r:id="rId168">
         <w:r>
           <w:rPr>
             <w:rStyle w:val="Hyperlink"/>
@@ -8533,8 +8739,8 @@
         </w:r>
       </w:hyperlink>
     </w:p>
-    <w:bookmarkEnd w:id="165"/>
-    <w:bookmarkStart w:id="167" w:name="ref-continual2026"/>
+    <w:bookmarkEnd w:id="169"/>
+    <w:bookmarkStart w:id="171" w:name="ref-continual2026"/>
     <w:p>
       <w:pPr>
         <w:pStyle w:val="Bibliography"/>
@@ -8563,7 +8769,7 @@
       <w:r>
         <w:t xml:space="preserve"> </w:t>
       </w:r>
-      <w:hyperlink r:id="rId166">
+      <w:hyperlink r:id="rId170">
         <w:r>
           <w:rPr>
             <w:rStyle w:val="Hyperlink"/>
@@ -8572,8 +8778,8 @@
         </w:r>
       </w:hyperlink>
     </w:p>
-    <w:bookmarkEnd w:id="167"/>
-    <w:bookmarkStart w:id="169" w:name="ref-rsea2026"/>
+    <w:bookmarkEnd w:id="171"/>
+    <w:bookmarkStart w:id="173" w:name="ref-rsea2026"/>
     <w:p>
       <w:pPr>
         <w:pStyle w:val="Bibliography"/>
@@ -8602,7 +8808,7 @@
       <w:r>
         <w:t xml:space="preserve"> </w:t>
       </w:r>
-      <w:hyperlink r:id="rId168">
+      <w:hyperlink r:id="rId172">
         <w:r>
           <w:rPr>
             <w:rStyle w:val="Hyperlink"/>
@@ -8611,8 +8817,8 @@
         </w:r>
       </w:hyperlink>
     </w:p>
-    <w:bookmarkEnd w:id="169"/>
-    <w:bookmarkStart w:id="171" w:name="ref-regimes2026"/>
+    <w:bookmarkEnd w:id="173"/>
+    <w:bookmarkStart w:id="175" w:name="ref-regimes2026"/>
     <w:p>
       <w:pPr>
         <w:pStyle w:val="Bibliography"/>
@@ -8641,7 +8847,7 @@
       <w:r>
         <w:t xml:space="preserve"> </w:t>
       </w:r>
-      <w:hyperlink r:id="rId170">
+      <w:hyperlink r:id="rId174">
         <w:r>
           <w:rPr>
             <w:rStyle w:val="Hyperlink"/>
@@ -8650,8 +8856,8 @@
         </w:r>
       </w:hyperlink>
     </w:p>
-    <w:bookmarkEnd w:id="171"/>
-    <w:bookmarkStart w:id="173" w:name="ref-autogenesis2026"/>
+    <w:bookmarkEnd w:id="175"/>
+    <w:bookmarkStart w:id="177" w:name="ref-autogenesis2026"/>
     <w:p>
       <w:pPr>
         <w:pStyle w:val="Bibliography"/>
@@ -8680,7 +8886,7 @@
       <w:r>
         <w:t xml:space="preserve"> </w:t>
       </w:r>
-      <w:hyperlink r:id="rId172">
+      <w:hyperlink r:id="rId176">
         <w:r>
           <w:rPr>
             <w:rStyle w:val="Hyperlink"/>
@@ -8689,8 +8895,8 @@
         </w:r>
       </w:hyperlink>
     </w:p>
-    <w:bookmarkEnd w:id="173"/>
-    <w:bookmarkStart w:id="175" w:name="ref-evobench2026"/>
+    <w:bookmarkEnd w:id="177"/>
+    <w:bookmarkStart w:id="179" w:name="ref-evobench2026"/>
     <w:p>
       <w:pPr>
         <w:pStyle w:val="Bibliography"/>
@@ -8719,7 +8925,7 @@
       <w:r>
         <w:t xml:space="preserve"> </w:t>
       </w:r>
-      <w:hyperlink r:id="rId174">
+      <w:hyperlink r:id="rId178">
         <w:r>
           <w:rPr>
             <w:rStyle w:val="Hyperlink"/>
@@ -8728,8 +8934,8 @@
         </w:r>
       </w:hyperlink>
     </w:p>
-    <w:bookmarkEnd w:id="175"/>
-    <w:bookmarkStart w:id="177" w:name="ref-harnessopt2026"/>
+    <w:bookmarkEnd w:id="179"/>
+    <w:bookmarkStart w:id="181" w:name="ref-harnessopt2026"/>
     <w:p>
       <w:pPr>
         <w:pStyle w:val="Bibliography"/>
@@ -8758,7 +8964,7 @@
       <w:r>
         <w:t xml:space="preserve"> </w:t>
       </w:r>
-      <w:hyperlink r:id="rId176">
+      <w:hyperlink r:id="rId180">
         <w:r>
           <w:rPr>
             <w:rStyle w:val="Hyperlink"/>
@@ -8767,8 +8973,8 @@
         </w:r>
       </w:hyperlink>
     </w:p>
-    <w:bookmarkEnd w:id="177"/>
-    <w:bookmarkStart w:id="179" w:name="ref-rethinkingharness2026"/>
+    <w:bookmarkEnd w:id="181"/>
+    <w:bookmarkStart w:id="183" w:name="ref-rethinkingharness2026"/>
     <w:p>
       <w:pPr>
         <w:pStyle w:val="Bibliography"/>
@@ -8797,7 +9003,7 @@
       <w:r>
         <w:t xml:space="preserve"> </w:t>
       </w:r>
-      <w:hyperlink r:id="rId178">
+      <w:hyperlink r:id="rId182">
         <w:r>
           <w:rPr>
             <w:rStyle w:val="Hyperlink"/>
@@ -8806,8 +9012,8 @@
         </w:r>
       </w:hyperlink>
     </w:p>
-    <w:bookmarkEnd w:id="179"/>
-    <w:bookmarkStart w:id="180" w:name="ref-minimalharness2026"/>
+    <w:bookmarkEnd w:id="183"/>
+    <w:bookmarkStart w:id="184" w:name="ref-minimalharness2026"/>
     <w:p>
       <w:pPr>
         <w:pStyle w:val="Bibliography"/>
@@ -8834,8 +9040,8 @@
         <w:t xml:space="preserve">. Technical Documentation and Evaluation, 2026, 2026년.</w:t>
       </w:r>
     </w:p>
-    <w:bookmarkEnd w:id="180"/>
-    <w:bookmarkStart w:id="182" w:name="ref-primeagent2026"/>
+    <w:bookmarkEnd w:id="184"/>
+    <w:bookmarkStart w:id="186" w:name="ref-primeagent2026"/>
     <w:p>
       <w:pPr>
         <w:pStyle w:val="Bibliography"/>
@@ -8877,7 +9083,7 @@
       <w:r>
         <w:t xml:space="preserve"> </w:t>
       </w:r>
-      <w:hyperlink r:id="rId181">
+      <w:hyperlink r:id="rId185">
         <w:r>
           <w:rPr>
             <w:rStyle w:val="Hyperlink"/>
@@ -8886,8 +9092,8 @@
         </w:r>
       </w:hyperlink>
     </w:p>
-    <w:bookmarkEnd w:id="182"/>
-    <w:bookmarkStart w:id="184" w:name="ref-claimlocked2026"/>
+    <w:bookmarkEnd w:id="186"/>
+    <w:bookmarkStart w:id="188" w:name="ref-claimlocked2026"/>
     <w:p>
       <w:pPr>
         <w:pStyle w:val="Bibliography"/>
@@ -8916,7 +9122,7 @@
       <w:r>
         <w:t xml:space="preserve"> </w:t>
       </w:r>
-      <w:hyperlink r:id="rId183">
+      <w:hyperlink r:id="rId187">
         <w:r>
           <w:rPr>
             <w:rStyle w:val="Hyperlink"/>
@@ -8925,8 +9131,8 @@
         </w:r>
       </w:hyperlink>
     </w:p>
-    <w:bookmarkEnd w:id="184"/>
-    <w:bookmarkStart w:id="186" w:name="ref-claimobservability2026"/>
+    <w:bookmarkEnd w:id="188"/>
+    <w:bookmarkStart w:id="190" w:name="ref-claimobservability2026"/>
     <w:p>
       <w:pPr>
         <w:pStyle w:val="Bibliography"/>
@@ -8955,7 +9161,7 @@
       <w:r>
         <w:t xml:space="preserve"> </w:t>
       </w:r>
-      <w:hyperlink r:id="rId185">
+      <w:hyperlink r:id="rId189">
         <w:r>
           <w:rPr>
             <w:rStyle w:val="Hyperlink"/>
@@ -8964,8 +9170,8 @@
         </w:r>
       </w:hyperlink>
     </w:p>
-    <w:bookmarkEnd w:id="186"/>
-    <w:bookmarkStart w:id="187" w:name="ref-controlprimitives2026"/>
+    <w:bookmarkEnd w:id="190"/>
+    <w:bookmarkStart w:id="191" w:name="ref-controlprimitives2026"/>
     <w:p>
       <w:pPr>
         <w:pStyle w:val="Bibliography"/>
@@ -8995,8 +9201,8 @@
         <w:t xml:space="preserve">. arXiv:2607.14166v3, 2026, 2026년.</w:t>
       </w:r>
     </w:p>
-    <w:bookmarkEnd w:id="187"/>
-    <w:bookmarkStart w:id="188" w:name="ref-perrequestlimit2026"/>
+    <w:bookmarkEnd w:id="191"/>
+    <w:bookmarkStart w:id="192" w:name="ref-perrequestlimit2026"/>
     <w:p>
       <w:pPr>
         <w:pStyle w:val="Bibliography"/>
@@ -9026,8 +9232,8 @@
         <w:t xml:space="preserve">. arXiv:2603.18829v10, 2026, 2026년.</w:t>
       </w:r>
     </w:p>
-    <w:bookmarkEnd w:id="188"/>
-    <w:bookmarkStart w:id="189" w:name="ref-openendedgroundtruth2026"/>
+    <w:bookmarkEnd w:id="192"/>
+    <w:bookmarkStart w:id="193" w:name="ref-openendedgroundtruth2026"/>
     <w:p>
       <w:pPr>
         <w:pStyle w:val="Bibliography"/>
@@ -9057,8 +9263,8 @@
         <w:t xml:space="preserve">. arXiv:2608.30461v1, 2026, 2026년.</w:t>
       </w:r>
     </w:p>
-    <w:bookmarkEnd w:id="189"/>
-    <w:bookmarkStart w:id="190" w:name="ref-harnesslabels2026"/>
+    <w:bookmarkEnd w:id="193"/>
+    <w:bookmarkStart w:id="194" w:name="ref-harnesslabels2026"/>
     <w:p>
       <w:pPr>
         <w:pStyle w:val="Bibliography"/>
@@ -9088,8 +9294,8 @@
         <w:t xml:space="preserve">. arXiv:2606.05922v3, 2026, 2026년.</w:t>
       </w:r>
     </w:p>
-    <w:bookmarkEnd w:id="190"/>
-    <w:bookmarkStart w:id="192" w:name="ref-harnessoptbench2026"/>
+    <w:bookmarkEnd w:id="194"/>
+    <w:bookmarkStart w:id="196" w:name="ref-harnessoptbench2026"/>
     <w:p>
       <w:pPr>
         <w:pStyle w:val="Bibliography"/>
@@ -9144,7 +9350,7 @@
       <w:r>
         <w:t xml:space="preserve"> </w:t>
       </w:r>
-      <w:hyperlink r:id="rId191">
+      <w:hyperlink r:id="rId195">
         <w:r>
           <w:rPr>
             <w:rStyle w:val="Hyperlink"/>
@@ -9153,8 +9359,8 @@
         </w:r>
       </w:hyperlink>
     </w:p>
-    <w:bookmarkEnd w:id="192"/>
-    <w:bookmarkStart w:id="194" w:name="ref-darwinx2026"/>
+    <w:bookmarkEnd w:id="196"/>
+    <w:bookmarkStart w:id="198" w:name="ref-darwinx2026"/>
     <w:p>
       <w:pPr>
         <w:pStyle w:val="Bibliography"/>
@@ -9209,7 +9415,7 @@
       <w:r>
         <w:t xml:space="preserve"> </w:t>
       </w:r>
-      <w:hyperlink r:id="rId193">
+      <w:hyperlink r:id="rId197">
         <w:r>
           <w:rPr>
             <w:rStyle w:val="Hyperlink"/>
@@ -9218,8 +9424,8 @@
         </w:r>
       </w:hyperlink>
     </w:p>
-    <w:bookmarkEnd w:id="194"/>
-    <w:bookmarkStart w:id="196" w:name="ref-graphengineering2026"/>
+    <w:bookmarkEnd w:id="198"/>
+    <w:bookmarkStart w:id="200" w:name="ref-graphengineering2026"/>
     <w:p>
       <w:pPr>
         <w:pStyle w:val="Bibliography"/>
@@ -9274,7 +9480,7 @@
       <w:r>
         <w:t xml:space="preserve"> </w:t>
       </w:r>
-      <w:hyperlink r:id="rId195">
+      <w:hyperlink r:id="rId199">
         <w:r>
           <w:rPr>
             <w:rStyle w:val="Hyperlink"/>
@@ -9283,8 +9489,8 @@
         </w:r>
       </w:hyperlink>
     </w:p>
-    <w:bookmarkEnd w:id="196"/>
-    <w:bookmarkStart w:id="198" w:name="ref-checklistcredit2026"/>
+    <w:bookmarkEnd w:id="200"/>
+    <w:bookmarkStart w:id="202" w:name="ref-checklistcredit2026"/>
     <w:p>
       <w:pPr>
         <w:pStyle w:val="Bibliography"/>
@@ -9313,7 +9519,7 @@
       <w:r>
         <w:t xml:space="preserve"> </w:t>
       </w:r>
-      <w:hyperlink r:id="rId197">
+      <w:hyperlink r:id="rId201">
         <w:r>
           <w:rPr>
             <w:rStyle w:val="Hyperlink"/>
@@ -9322,8 +9528,8 @@
         </w:r>
       </w:hyperlink>
     </w:p>
-    <w:bookmarkEnd w:id="198"/>
-    <w:bookmarkStart w:id="200" w:name="ref-solutionhacking2026"/>
+    <w:bookmarkEnd w:id="202"/>
+    <w:bookmarkStart w:id="204" w:name="ref-solutionhacking2026"/>
     <w:p>
       <w:pPr>
         <w:pStyle w:val="Bibliography"/>
@@ -9352,7 +9558,7 @@
       <w:r>
         <w:t xml:space="preserve"> </w:t>
       </w:r>
-      <w:hyperlink r:id="rId199">
+      <w:hyperlink r:id="rId203">
         <w:r>
           <w:rPr>
             <w:rStyle w:val="Hyperlink"/>
@@ -9361,8 +9567,8 @@
         </w:r>
       </w:hyperlink>
     </w:p>
-    <w:bookmarkEnd w:id="200"/>
-    <w:bookmarkStart w:id="202" w:name="ref-baitbench2026"/>
+    <w:bookmarkEnd w:id="204"/>
+    <w:bookmarkStart w:id="206" w:name="ref-baitbench2026"/>
     <w:p>
       <w:pPr>
         <w:pStyle w:val="Bibliography"/>
@@ -9391,7 +9597,7 @@
       <w:r>
         <w:t xml:space="preserve"> </w:t>
       </w:r>
-      <w:hyperlink r:id="rId201">
+      <w:hyperlink r:id="rId205">
         <w:r>
           <w:rPr>
             <w:rStyle w:val="Hyperlink"/>
@@ -9400,8 +9606,8 @@
         </w:r>
       </w:hyperlink>
     </w:p>
-    <w:bookmarkEnd w:id="202"/>
-    <w:bookmarkStart w:id="204" w:name="ref-constructvalidity2026"/>
+    <w:bookmarkEnd w:id="206"/>
+    <w:bookmarkStart w:id="208" w:name="ref-constructvalidity2026"/>
     <w:p>
       <w:pPr>
         <w:pStyle w:val="Bibliography"/>
@@ -9430,7 +9636,7 @@
       <w:r>
         <w:t xml:space="preserve"> </w:t>
       </w:r>
-      <w:hyperlink r:id="rId203">
+      <w:hyperlink r:id="rId207">
         <w:r>
           <w:rPr>
             <w:rStyle w:val="Hyperlink"/>
@@ -9439,8 +9645,8 @@
         </w:r>
       </w:hyperlink>
     </w:p>
-    <w:bookmarkEnd w:id="204"/>
-    <w:bookmarkStart w:id="206" w:name="ref-agreementaudit2026"/>
+    <w:bookmarkEnd w:id="208"/>
+    <w:bookmarkStart w:id="210" w:name="ref-agreementaudit2026"/>
     <w:p>
       <w:pPr>
         <w:pStyle w:val="Bibliography"/>
@@ -9469,7 +9675,7 @@
       <w:r>
         <w:t xml:space="preserve"> </w:t>
       </w:r>
-      <w:hyperlink r:id="rId205">
+      <w:hyperlink r:id="rId209">
         <w:r>
           <w:rPr>
             <w:rStyle w:val="Hyperlink"/>
@@ -9478,8 +9684,8 @@
         </w:r>
       </w:hyperlink>
     </w:p>
-    <w:bookmarkEnd w:id="206"/>
-    <w:bookmarkStart w:id="208" w:name="ref-reliabilitywithoutvalidity2026"/>
+    <w:bookmarkEnd w:id="210"/>
+    <w:bookmarkStart w:id="212" w:name="ref-reliabilitywithoutvalidity2026"/>
     <w:p>
       <w:pPr>
         <w:pStyle w:val="Bibliography"/>
@@ -9508,7 +9714,7 @@
       <w:r>
         <w:t xml:space="preserve"> </w:t>
       </w:r>
-      <w:hyperlink r:id="rId207">
+      <w:hyperlink r:id="rId211">
         <w:r>
           <w:rPr>
             <w:rStyle w:val="Hyperlink"/>
@@ -9517,8 +9723,8 @@
         </w:r>
       </w:hyperlink>
     </w:p>
-    <w:bookmarkEnd w:id="208"/>
-    <w:bookmarkStart w:id="210" w:name="ref-compounding2026"/>
+    <w:bookmarkEnd w:id="212"/>
+    <w:bookmarkStart w:id="214" w:name="ref-compounding2026"/>
     <w:p>
       <w:pPr>
         <w:pStyle w:val="Bibliography"/>
@@ -9547,7 +9753,7 @@
       <w:r>
         <w:t xml:space="preserve"> </w:t>
       </w:r>
-      <w:hyperlink r:id="rId209">
+      <w:hyperlink r:id="rId213">
         <w:r>
           <w:rPr>
             <w:rStyle w:val="Hyperlink"/>
@@ -9556,8 +9762,8 @@
         </w:r>
       </w:hyperlink>
     </w:p>
-    <w:bookmarkEnd w:id="210"/>
-    <w:bookmarkStart w:id="211" w:name="ref-judgeidentification2026"/>
+    <w:bookmarkEnd w:id="214"/>
+    <w:bookmarkStart w:id="215" w:name="ref-judgeidentification2026"/>
     <w:p>
       <w:pPr>
         <w:pStyle w:val="Bibliography"/>
@@ -9587,8 +9793,8 @@
         <w:t xml:space="preserve">. arXiv:2608.16253v1, 2026, 2026년.</w:t>
       </w:r>
     </w:p>
-    <w:bookmarkEnd w:id="211"/>
-    <w:bookmarkStart w:id="212" w:name="ref-majorityhurts2026"/>
+    <w:bookmarkEnd w:id="215"/>
+    <w:bookmarkStart w:id="216" w:name="ref-majorityhurts2026"/>
     <w:p>
       <w:pPr>
         <w:pStyle w:val="Bibliography"/>
@@ -9615,8 +9821,8 @@
         <w:t xml:space="preserve">. arXiv:2608.11403v2, 2026, 2026년.</w:t>
       </w:r>
     </w:p>
-    <w:bookmarkEnd w:id="212"/>
-    <w:bookmarkStart w:id="213" w:name="ref-wrongconsensus2026"/>
+    <w:bookmarkEnd w:id="216"/>
+    <w:bookmarkStart w:id="217" w:name="ref-wrongconsensus2026"/>
     <w:p>
       <w:pPr>
         <w:pStyle w:val="Bibliography"/>
@@ -9646,8 +9852,8 @@
         <w:t xml:space="preserve">. arXiv:2608.18795v2, 2026, 2026년.</w:t>
       </w:r>
     </w:p>
-    <w:bookmarkEnd w:id="213"/>
-    <w:bookmarkStart w:id="214" w:name="ref-budgetmatched2026"/>
+    <w:bookmarkEnd w:id="217"/>
+    <w:bookmarkStart w:id="218" w:name="ref-budgetmatched2026"/>
     <w:p>
       <w:pPr>
         <w:pStyle w:val="Bibliography"/>
@@ -9677,8 +9883,8 @@
         <w:t xml:space="preserve">. arXiv:2606.15017v2, 2026, 2026년.</w:t>
       </w:r>
     </w:p>
-    <w:bookmarkEnd w:id="214"/>
-    <w:bookmarkStart w:id="215" w:name="ref-cachecost2026"/>
+    <w:bookmarkEnd w:id="218"/>
+    <w:bookmarkStart w:id="219" w:name="ref-cachecost2026"/>
     <w:p>
       <w:pPr>
         <w:pStyle w:val="Bibliography"/>
@@ -9708,8 +9914,8 @@
         <w:t xml:space="preserve">. arXiv:2601.06007v2, 2026, 2026년.</w:t>
       </w:r>
     </w:p>
-    <w:bookmarkEnd w:id="215"/>
-    <w:bookmarkStart w:id="216" w:name="ref-compressioncost2026"/>
+    <w:bookmarkEnd w:id="219"/>
+    <w:bookmarkStart w:id="220" w:name="ref-compressioncost2026"/>
     <w:p>
       <w:pPr>
         <w:pStyle w:val="Bibliography"/>
@@ -9739,8 +9945,8 @@
         <w:t xml:space="preserve">. arXiv:2608.16370v1, 2026, 2026년.</w:t>
       </w:r>
     </w:p>
-    <w:bookmarkEnd w:id="216"/>
-    <w:bookmarkStart w:id="217" w:name="ref-promptwaste2026"/>
+    <w:bookmarkEnd w:id="220"/>
+    <w:bookmarkStart w:id="221" w:name="ref-promptwaste2026"/>
     <w:p>
       <w:pPr>
         <w:pStyle w:val="Bibliography"/>
@@ -9770,8 +9976,8 @@
         <w:t xml:space="preserve">. arXiv:2608.01347v5, 2026, 2026년.</w:t>
       </w:r>
     </w:p>
-    <w:bookmarkEnd w:id="217"/>
-    <w:bookmarkStart w:id="218" w:name="ref-llmrandomness2026"/>
+    <w:bookmarkEnd w:id="221"/>
+    <w:bookmarkStart w:id="222" w:name="ref-llmrandomness2026"/>
     <w:p>
       <w:pPr>
         <w:pStyle w:val="Bibliography"/>
@@ -9798,8 +10004,8 @@
         <w:t xml:space="preserve">. arXiv:2607.24372v1, 2026, 2026년.</w:t>
       </w:r>
     </w:p>
-    <w:bookmarkEnd w:id="218"/>
-    <w:bookmarkStart w:id="219" w:name="ref-onerunlottery2026"/>
+    <w:bookmarkEnd w:id="222"/>
+    <w:bookmarkStart w:id="223" w:name="ref-onerunlottery2026"/>
     <w:p>
       <w:pPr>
         <w:pStyle w:val="Bibliography"/>
@@ -9829,8 +10035,8 @@
         <w:t xml:space="preserve">. arXiv:2607.26587v1, 2026, 2026년.</w:t>
       </w:r>
     </w:p>
-    <w:bookmarkEnd w:id="219"/>
-    <w:bookmarkStart w:id="220" w:name="ref-multiplerunsorder2026"/>
+    <w:bookmarkEnd w:id="223"/>
+    <w:bookmarkStart w:id="224" w:name="ref-multiplerunsorder2026"/>
     <w:p>
       <w:pPr>
         <w:pStyle w:val="Bibliography"/>
@@ -9860,8 +10066,8 @@
         <w:t xml:space="preserve">. arXiv:2608.18066v1, 2026, 2026년.</w:t>
       </w:r>
     </w:p>
-    <w:bookmarkEnd w:id="220"/>
-    <w:bookmarkStart w:id="221" w:name="ref-runvariance2026"/>
+    <w:bookmarkEnd w:id="224"/>
+    <w:bookmarkStart w:id="225" w:name="ref-runvariance2026"/>
     <w:p>
       <w:pPr>
         <w:pStyle w:val="Bibliography"/>
@@ -9891,8 +10097,8 @@
         <w:t xml:space="preserve">. arXiv:2608.26197v1, 2026, 2026년.</w:t>
       </w:r>
     </w:p>
-    <w:bookmarkEnd w:id="221"/>
-    <w:bookmarkStart w:id="222" w:name="ref-tokenaccounting2026"/>
+    <w:bookmarkEnd w:id="225"/>
+    <w:bookmarkStart w:id="226" w:name="ref-tokenaccounting2026"/>
     <w:p>
       <w:pPr>
         <w:pStyle w:val="Bibliography"/>
@@ -9922,8 +10128,8 @@
         <w:t xml:space="preserve">. arXiv:2607.21672v1, 2026, 2026년.</w:t>
       </w:r>
     </w:p>
-    <w:bookmarkEnd w:id="222"/>
-    <w:bookmarkStart w:id="223" w:name="ref-agreementcorrectness2026"/>
+    <w:bookmarkEnd w:id="226"/>
+    <w:bookmarkStart w:id="227" w:name="ref-agreementcorrectness2026"/>
     <w:p>
       <w:pPr>
         <w:pStyle w:val="Bibliography"/>
@@ -9953,8 +10159,8 @@
         <w:t xml:space="preserve">. arXiv:2608.05670v1, 2026, 2026년.</w:t>
       </w:r>
     </w:p>
-    <w:bookmarkEnd w:id="223"/>
-    <w:bookmarkStart w:id="224" w:name="ref-annotationvariance2026"/>
+    <w:bookmarkEnd w:id="227"/>
+    <w:bookmarkStart w:id="228" w:name="ref-annotationvariance2026"/>
     <w:p>
       <w:pPr>
         <w:pStyle w:val="Bibliography"/>
@@ -9984,8 +10190,8 @@
         <w:t xml:space="preserve">. arXiv:2605.01168v1, 2026, 2026년.</w:t>
       </w:r>
     </w:p>
-    <w:bookmarkEnd w:id="224"/>
-    <w:bookmarkStart w:id="225" w:name="ref-boltonprovenance2026"/>
+    <w:bookmarkEnd w:id="228"/>
+    <w:bookmarkStart w:id="229" w:name="ref-boltonprovenance2026"/>
     <w:p>
       <w:pPr>
         <w:pStyle w:val="Bibliography"/>
@@ -10015,8 +10221,8 @@
         <w:t xml:space="preserve">. arXiv:2608.25210v2, 2026, 2026년.</w:t>
       </w:r>
     </w:p>
-    <w:bookmarkEnd w:id="225"/>
-    <w:bookmarkStart w:id="226" w:name="ref-evidenceledger2026"/>
+    <w:bookmarkEnd w:id="229"/>
+    <w:bookmarkStart w:id="230" w:name="ref-evidenceledger2026"/>
     <w:p>
       <w:pPr>
         <w:pStyle w:val="Bibliography"/>
@@ -10046,8 +10252,8 @@
         <w:t xml:space="preserve">. arXiv:2607.26512v1, 2026, 2026년.</w:t>
       </w:r>
     </w:p>
-    <w:bookmarkEnd w:id="226"/>
-    <w:bookmarkStart w:id="227" w:name="ref-claimreplay2026"/>
+    <w:bookmarkEnd w:id="230"/>
+    <w:bookmarkStart w:id="231" w:name="ref-claimreplay2026"/>
     <w:p>
       <w:pPr>
         <w:pStyle w:val="Bibliography"/>
@@ -10077,8 +10283,8 @@
         <w:t xml:space="preserve">. arXiv:2608.19269v4, 2026, 2026년.</w:t>
       </w:r>
     </w:p>
-    <w:bookmarkEnd w:id="227"/>
-    <w:bookmarkStart w:id="228" w:name="ref-runnableverifiable2026"/>
+    <w:bookmarkEnd w:id="231"/>
+    <w:bookmarkStart w:id="232" w:name="ref-runnableverifiable2026"/>
     <w:p>
       <w:pPr>
         <w:pStyle w:val="Bibliography"/>
@@ -10108,8 +10314,8 @@
         <w:t xml:space="preserve">. arXiv:2608.09567v1, 2026, 2026년.</w:t>
       </w:r>
     </w:p>
-    <w:bookmarkEnd w:id="228"/>
-    <w:bookmarkStart w:id="229" w:name="ref-repeataudit2026"/>
+    <w:bookmarkEnd w:id="232"/>
+    <w:bookmarkStart w:id="233" w:name="ref-repeataudit2026"/>
     <w:p>
       <w:pPr>
         <w:pStyle w:val="Bibliography"/>
@@ -10139,8 +10345,8 @@
         <w:t xml:space="preserve">. arXiv:2608.22856v1, 2026, 2026년.</w:t>
       </w:r>
     </w:p>
-    <w:bookmarkEnd w:id="229"/>
-    <w:bookmarkStart w:id="230" w:name="ref-fidelitywithoutevidence2026"/>
+    <w:bookmarkEnd w:id="233"/>
+    <w:bookmarkStart w:id="234" w:name="ref-fidelitywithoutevidence2026"/>
     <w:p>
       <w:pPr>
         <w:pStyle w:val="Bibliography"/>
@@ -10170,8 +10376,8 @@
         <w:t xml:space="preserve">. arXiv:2608.28439v1, 2026, 2026년.</w:t>
       </w:r>
     </w:p>
-    <w:bookmarkEnd w:id="230"/>
-    <w:bookmarkStart w:id="231" w:name="ref-implicitassumptions2026"/>
+    <w:bookmarkEnd w:id="234"/>
+    <w:bookmarkStart w:id="235" w:name="ref-implicitassumptions2026"/>
     <w:p>
       <w:pPr>
         <w:pStyle w:val="Bibliography"/>
@@ -10201,8 +10407,8 @@
         <w:t xml:space="preserve">. arXiv:2607.03114v1, 2026, 2026년.</w:t>
       </w:r>
     </w:p>
-    <w:bookmarkEnd w:id="231"/>
-    <w:bookmarkStart w:id="232" w:name="ref-partialcontracts2026"/>
+    <w:bookmarkEnd w:id="235"/>
+    <w:bookmarkStart w:id="236" w:name="ref-partialcontracts2026"/>
     <w:p>
       <w:pPr>
         <w:pStyle w:val="Bibliography"/>
@@ -10232,8 +10438,8 @@
         <w:t xml:space="preserve">. arXiv:2607.10291v1, 2026, 2026년.</w:t>
       </w:r>
     </w:p>
-    <w:bookmarkEnd w:id="232"/>
-    <w:bookmarkStart w:id="233" w:name="ref-factcheckstages2026"/>
+    <w:bookmarkEnd w:id="236"/>
+    <w:bookmarkStart w:id="237" w:name="ref-factcheckstages2026"/>
     <w:p>
       <w:pPr>
         <w:pStyle w:val="Bibliography"/>
@@ -10263,8 +10469,8 @@
         <w:t xml:space="preserve">. arXiv:2510.22055v1, 2026, 2026년.</w:t>
       </w:r>
     </w:p>
-    <w:bookmarkEnd w:id="233"/>
-    <w:bookmarkStart w:id="234" w:name="ref-coveragebehaviour2026"/>
+    <w:bookmarkEnd w:id="237"/>
+    <w:bookmarkStart w:id="238" w:name="ref-coveragebehaviour2026"/>
     <w:p>
       <w:pPr>
         <w:pStyle w:val="Bibliography"/>
@@ -10294,8 +10500,8 @@
         <w:t xml:space="preserve">. arXiv:2606.10417v1, 2026, 2026년.</w:t>
       </w:r>
     </w:p>
-    <w:bookmarkEnd w:id="234"/>
-    <w:bookmarkStart w:id="235" w:name="ref-evalblindness2026"/>
+    <w:bookmarkEnd w:id="238"/>
+    <w:bookmarkStart w:id="239" w:name="ref-evalblindness2026"/>
     <w:p>
       <w:pPr>
         <w:pStyle w:val="Bibliography"/>
@@ -10325,8 +10531,8 @@
         <w:t xml:space="preserve">. arXiv:2608.02786v1, 2026, 2026년.</w:t>
       </w:r>
     </w:p>
-    <w:bookmarkEnd w:id="235"/>
-    <w:bookmarkStart w:id="236" w:name="ref-metamorphicrelations2026"/>
+    <w:bookmarkEnd w:id="239"/>
+    <w:bookmarkStart w:id="240" w:name="ref-metamorphicrelations2026"/>
     <w:p>
       <w:pPr>
         <w:pStyle w:val="Bibliography"/>
@@ -10356,8 +10562,8 @@
         <w:t xml:space="preserve">. arXiv:2608.03337v1, 2026, 2026년.</w:t>
       </w:r>
     </w:p>
-    <w:bookmarkEnd w:id="236"/>
-    <w:bookmarkStart w:id="237" w:name="ref-oracleavailability2026"/>
+    <w:bookmarkEnd w:id="240"/>
+    <w:bookmarkStart w:id="241" w:name="ref-oracleavailability2026"/>
     <w:p>
       <w:pPr>
         <w:pStyle w:val="Bibliography"/>
@@ -10387,8 +10593,8 @@
         <w:t xml:space="preserve">. arXiv:2607.00929v1, 2026, 2026년.</w:t>
       </w:r>
     </w:p>
-    <w:bookmarkEnd w:id="237"/>
-    <w:bookmarkStart w:id="238" w:name="ref-oracleanchoring2026"/>
+    <w:bookmarkEnd w:id="241"/>
+    <w:bookmarkStart w:id="242" w:name="ref-oracleanchoring2026"/>
     <w:p>
       <w:pPr>
         <w:pStyle w:val="Bibliography"/>
@@ -10418,8 +10624,8 @@
         <w:t xml:space="preserve">. arXiv:2608.17214v1, 2026, 2026년.</w:t>
       </w:r>
     </w:p>
-    <w:bookmarkEnd w:id="238"/>
-    <w:bookmarkStart w:id="240" w:name="ref-auditaudit2026"/>
+    <w:bookmarkEnd w:id="242"/>
+    <w:bookmarkStart w:id="244" w:name="ref-auditaudit2026"/>
     <w:p>
       <w:pPr>
         <w:pStyle w:val="Bibliography"/>
@@ -10448,7 +10654,7 @@
       <w:r>
         <w:t xml:space="preserve"> </w:t>
       </w:r>
-      <w:hyperlink r:id="rId239">
+      <w:hyperlink r:id="rId243">
         <w:r>
           <w:rPr>
             <w:rStyle w:val="Hyperlink"/>
@@ -10457,8 +10663,8 @@
         </w:r>
       </w:hyperlink>
     </w:p>
-    <w:bookmarkEnd w:id="240"/>
-    <w:bookmarkStart w:id="241" w:name="ref-beyondfinalscores2026"/>
+    <w:bookmarkEnd w:id="244"/>
+    <w:bookmarkStart w:id="245" w:name="ref-beyondfinalscores2026"/>
     <w:p>
       <w:pPr>
         <w:pStyle w:val="Bibliography"/>
@@ -10488,8 +10694,8 @@
         <w:t xml:space="preserve">. arXiv:2608.13417v1, 2026, 2026년.</w:t>
       </w:r>
     </w:p>
-    <w:bookmarkEnd w:id="241"/>
-    <w:bookmarkStart w:id="242" w:name="ref-seqmeta2026"/>
+    <w:bookmarkEnd w:id="245"/>
+    <w:bookmarkStart w:id="246" w:name="ref-seqmeta2026"/>
     <w:p>
       <w:pPr>
         <w:pStyle w:val="Bibliography"/>
@@ -10519,8 +10725,8 @@
         <w:t xml:space="preserve">. arXiv:2511.14996v1, 2025, 2025년.</w:t>
       </w:r>
     </w:p>
-    <w:bookmarkEnd w:id="242"/>
-    <w:bookmarkStart w:id="243" w:name="ref-rigorai2026"/>
+    <w:bookmarkEnd w:id="246"/>
+    <w:bookmarkStart w:id="247" w:name="ref-rigorai2026"/>
     <w:p>
       <w:pPr>
         <w:pStyle w:val="Bibliography"/>
@@ -10547,8 +10753,8 @@
         <w:t xml:space="preserve">. arXiv:2607.03634v1, 2026, 2026년.</w:t>
       </w:r>
     </w:p>
-    <w:bookmarkEnd w:id="243"/>
-    <w:bookmarkStart w:id="245" w:name="ref-prereg2026"/>
+    <w:bookmarkEnd w:id="247"/>
+    <w:bookmarkStart w:id="249" w:name="ref-prereg2026"/>
     <w:p>
       <w:pPr>
         <w:pStyle w:val="Bibliography"/>
@@ -10577,7 +10783,7 @@
       <w:r>
         <w:t xml:space="preserve"> </w:t>
       </w:r>
-      <w:hyperlink r:id="rId244">
+      <w:hyperlink r:id="rId248">
         <w:r>
           <w:rPr>
             <w:rStyle w:val="Hyperlink"/>
@@ -10586,8 +10792,8 @@
         </w:r>
       </w:hyperlink>
     </w:p>
-    <w:bookmarkEnd w:id="245"/>
-    <w:bookmarkStart w:id="246" w:name="ref-smallscreening2026"/>
+    <w:bookmarkEnd w:id="249"/>
+    <w:bookmarkStart w:id="250" w:name="ref-smallscreening2026"/>
     <w:p>
       <w:pPr>
         <w:pStyle w:val="Bibliography"/>
@@ -10617,8 +10823,8 @@
         <w:t xml:space="preserve">. arXiv:2606.13531v1, 2026, 2026년.</w:t>
       </w:r>
     </w:p>
-    <w:bookmarkEnd w:id="246"/>
-    <w:bookmarkStart w:id="248" w:name="ref-negativeresults2026"/>
+    <w:bookmarkEnd w:id="250"/>
+    <w:bookmarkStart w:id="252" w:name="ref-negativeresults2026"/>
     <w:p>
       <w:pPr>
         <w:pStyle w:val="Bibliography"/>
@@ -10647,7 +10853,7 @@
       <w:r>
         <w:t xml:space="preserve"> </w:t>
       </w:r>
-      <w:hyperlink r:id="rId247">
+      <w:hyperlink r:id="rId251">
         <w:r>
           <w:rPr>
             <w:rStyle w:val="Hyperlink"/>
@@ -10656,8 +10862,8 @@
         </w:r>
       </w:hyperlink>
     </w:p>
-    <w:bookmarkEnd w:id="248"/>
-    <w:bookmarkStart w:id="250" w:name="ref-autoresearchfail2026"/>
+    <w:bookmarkEnd w:id="252"/>
+    <w:bookmarkStart w:id="254" w:name="ref-autoresearchfail2026"/>
     <w:p>
       <w:pPr>
         <w:pStyle w:val="Bibliography"/>
@@ -10686,7 +10892,7 @@
       <w:r>
         <w:t xml:space="preserve"> </w:t>
       </w:r>
-      <w:hyperlink r:id="rId249">
+      <w:hyperlink r:id="rId253">
         <w:r>
           <w:rPr>
             <w:rStyle w:val="Hyperlink"/>
@@ -10695,8 +10901,8 @@
         </w:r>
       </w:hyperlink>
     </w:p>
-    <w:bookmarkEnd w:id="250"/>
-    <w:bookmarkStart w:id="252" w:name="ref-verificationcost2026"/>
+    <w:bookmarkEnd w:id="254"/>
+    <w:bookmarkStart w:id="256" w:name="ref-verificationcost2026"/>
     <w:p>
       <w:pPr>
         <w:pStyle w:val="Bibliography"/>
@@ -10725,7 +10931,7 @@
       <w:r>
         <w:t xml:space="preserve"> </w:t>
       </w:r>
-      <w:hyperlink r:id="rId251">
+      <w:hyperlink r:id="rId255">
         <w:r>
           <w:rPr>
             <w:rStyle w:val="Hyperlink"/>
@@ -10734,9 +10940,9 @@
         </w:r>
       </w:hyperlink>
     </w:p>
-    <w:bookmarkEnd w:id="252"/>
-    <w:bookmarkEnd w:id="253"/>
-    <w:bookmarkEnd w:id="254"/>
+    <w:bookmarkEnd w:id="256"/>
+    <w:bookmarkEnd w:id="257"/>
+    <w:bookmarkEnd w:id="258"/>
     <w:sectPr>
       <w:footerReference w:type="default" r:id="rIdFtr1"/>
       <w:pgSz w:h="16838" w:w="11906"/>

</xml_diff>

<commit_message>
feat(paper): instruction-0016a items 1-3 (manipulation summary receipt, s12 receipt-gate hardcode, residual-budget line) + validation fixes
- add experiments/study_b/summarize_manipulation.py + tests; auxiliary receipt
  aggregates 120 block receipts (120/120 passed, 0 excluded); receipt is
  verifier-derived with executed=false since a single-run provenance binding
  cannot describe 120 runs - execution lineage stays with the input receipts
- thesis-ko qmd s12: replace protocol file read (forbidden public token) with
  the registered analysis-receipt sha256 asserted at render time
- rebuild graduation-thesis.docx; refresh context-graph projection shas and
  re-pin evidence registry + structured expectations (483-node graph)
- status.md: analysis_receipt header, results_origin_list receipt keys,
  0016a #3 residual budget determination ($29.910686), 0016a #2 manuscript note
- cost-ledger.md: 0016a #3 one-line budget determination
- .orx/paper_validate.py: PASS (exit 0, errors 0)
</commit_message>
<xml_diff>
--- a/paper/word/graduation-thesis.docx
+++ b/paper/word/graduation-thesis.docx
@@ -6329,13 +6329,13 @@
       </w:tr>
     </w:tbl>
     <w:bookmarkEnd w:id="89"/>
-    <w:bookmarkStart w:id="91" w:name="study-b의-현재-상태-사전등록-완료-미실행"/>
+    <w:bookmarkStart w:id="91" w:name="study-b의-현재-상태-사전등록실행-완료-receipt-기반-보고"/>
     <w:p>
       <w:pPr>
         <w:pStyle w:val="Heading2"/>
       </w:pPr>
       <w:r>
-        <w:t xml:space="preserve">12. Study B의 현재 상태 — 사전등록 완료, 미실행</w:t>
+        <w:t xml:space="preserve">12. Study B의 현재 상태 — 사전등록·실행 완료, receipt 기반 보고</w:t>
       </w:r>
     </w:p>
     <w:p>
@@ -6343,7 +6343,31 @@
         <w:pStyle w:val="FirstParagraph"/>
       </w:pPr>
       <w:r>
-        <w:t xml:space="preserve">Ⅲ장 8절의 하네스 구성 벤치마크는</w:t>
+        <w:t xml:space="preserve">Ⅲ장 8절의 하네스 구성 벤치마크는 사전등록과 실행을 모두 마쳤다(2026-09-03 23:56 KST 블록 완결, 40 시드 × 3 아암 = 120 에피소드, 조작 검사 120/120 통과·제외 0).</w:t>
+      </w:r>
+      <w:r>
+        <w:t xml:space="preserve"> </w:t>
+      </w:r>
+      <w:r>
+        <w:t xml:space="preserve">이 절의 모든 결과 수치는 봉인 분석 receipt</w:t>
+      </w:r>
+      <w:r>
+        <w:t xml:space="preserve"> </w:t>
+      </w:r>
+      <w:r>
+        <w:rPr>
+          <w:rStyle w:val="VerbatimChar"/>
+        </w:rPr>
+        <w:t xml:space="preserve">paper/experiments/screening/block/analysis-receipt.json</w:t>
+      </w:r>
+      <w:r>
+        <w:t xml:space="preserve">에서만 가져오며, 렌더 시 그 SHA-256을 본 절에 고정된 등록 다이제스트와 대조한다.</w:t>
+      </w:r>
+      <w:r>
+        <w:t xml:space="preserve"> </w:t>
+      </w:r>
+      <w:r>
+        <w:t xml:space="preserve">해석 어휘는 Ⅲ장 8절의 경계를 따른다. 고정 모델(anthropic/claude-haiku-4-5) 아래에서 하네스 구성이</w:t>
       </w:r>
       <w:r>
         <w:t xml:space="preserve"> </w:t>
@@ -6353,30 +6377,37 @@
           <w:b/>
           <w:bCs/>
         </w:rPr>
-        <w:t xml:space="preserve">사전등록을 마쳤고 아직 실행되지 않았다.</w:t>
-      </w:r>
-      <w:r>
-        <w:t xml:space="preserve"> </w:t>
-      </w:r>
-      <w:r>
-        <w:t xml:space="preserve">이 절은 그 사실을 명시하기 위해 존재한다.</w:t>
-      </w:r>
-      <w:r>
-        <w:t xml:space="preserve"> </w:t>
-      </w:r>
-      <w:hyperlink w:anchor="tbl-studyb-status">
-        <w:r>
-          <w:rPr>
-            <w:rStyle w:val="Hyperlink"/>
-          </w:rPr>
-          <w:t xml:space="preserve">표 8</w:t>
-        </w:r>
-      </w:hyperlink>
-      <w:r>
-        <w:t xml:space="preserve"> </w:t>
-      </w:r>
-      <w:r>
-        <w:t xml:space="preserve">의 결과 열이 전부 미실행인 것은 누락이 아니라 기록이다.</w:t>
+        <w:t xml:space="preserve">신뢰성(분산 감소)</w:t>
+      </w:r>
+      <w:r>
+        <w:t xml:space="preserve"> </w:t>
+      </w:r>
+      <w:r>
+        <w:t xml:space="preserve">차원에서 다르게 작동하는지의 판독이며, 모델 능력의 향상이나 최고 수준 달성의 근거가 아니다. 유의성 표기는 검출 여부를 뜻할 뿐 효과 부재를 뜻하지 않는다.</w:t>
+      </w:r>
+    </w:p>
+    <w:p>
+      <w:pPr>
+        <w:pStyle w:val="BodyText"/>
+      </w:pPr>
+      <w:r>
+        <w:rPr>
+          <w:b/>
+          <w:bCs/>
+        </w:rPr>
+        <w:t xml:space="preserve">천장 효과를 결과보다 먼저 읽는다.</w:t>
+      </w:r>
+      <w:r>
+        <w:t xml:space="preserve"> </w:t>
+      </w:r>
+      <w:r>
+        <w:t xml:space="preserve">5/5 만점 에피소드 수는 B0 40 중 21, B1 28, B2 35이고 세 아암에서 모두 만점인 시드는 13개다[1].</w:t>
+      </w:r>
+      <w:r>
+        <w:t xml:space="preserve"> </w:t>
+      </w:r>
+      <w:r>
+        <w:t xml:space="preserve">B2의 평균 0.96±0.1128은 과제별 상한 1.0에 근접해 있어 상단에서 압축된 척도가 아암 간 나머지 차이를 과소평가할 수 있고, 만점 이상의 개선은 이 설계로 측정되지 않는다.</w:t>
       </w:r>
     </w:p>
     <w:tbl>
@@ -6403,7 +6434,7 @@
               <w:pStyle w:val="ImageCaption"/>
             </w:pPr>
             <w:r>
-              <w:t xml:space="preserve">표 8. Study B 아암별 사전등록 및 실행 상태</w:t>
+              <w:t xml:space="preserve">표 8. Study B 아암별 결과 (T3 과제, 5/5 검증기, 40 시드)</w:t>
             </w:r>
           </w:p>
           <w:tbl>
@@ -6413,10 +6444,11 @@
               <w:tblLook w:firstRow="1" w:lastRow="0" w:firstColumn="0" w:lastColumn="0" w:noHBand="0" w:noVBand="0" w:val="0020"/>
             </w:tblPr>
             <w:tblGrid>
-              <w:gridCol w:w="1980"/>
-              <w:gridCol w:w="1980"/>
-              <w:gridCol w:w="1980"/>
-              <w:gridCol w:w="1980"/>
+              <w:gridCol w:w="1584"/>
+              <w:gridCol w:w="1584"/>
+              <w:gridCol w:w="1584"/>
+              <w:gridCol w:w="1584"/>
+              <w:gridCol w:w="1584"/>
             </w:tblGrid>
             <w:tr>
               <w:trPr>
@@ -6466,7 +6498,19 @@
                     <w:jc w:val="center"/>
                   </w:pPr>
                   <w:r>
-                    <w:t xml:space="preserve">검증기 통과율</w:t>
+                    <w:t xml:space="preserve">통과율 (평균±표준편차)</w:t>
+                  </w:r>
+                </w:p>
+              </w:tc>
+              <w:tc>
+                <w:tcPr/>
+                <w:p>
+                  <w:pPr>
+                    <w:pStyle w:val="Compact"/>
+                    <w:jc w:val="center"/>
+                  </w:pPr>
+                  <w:r>
+                    <w:t xml:space="preserve">5/5 만점 에피소드</w:t>
                   </w:r>
                 </w:p>
               </w:tc>
@@ -6516,7 +6560,19 @@
                     <w:jc w:val="center"/>
                   </w:pPr>
                   <w:r>
-                    <w:t xml:space="preserve">미실행</w:t>
+                    <w:t xml:space="preserve">0.79±0.2479</w:t>
+                  </w:r>
+                </w:p>
+              </w:tc>
+              <w:tc>
+                <w:tcPr/>
+                <w:p>
+                  <w:pPr>
+                    <w:pStyle w:val="Compact"/>
+                    <w:jc w:val="center"/>
+                  </w:pPr>
+                  <w:r>
+                    <w:t xml:space="preserve">21/40</w:t>
                   </w:r>
                 </w:p>
               </w:tc>
@@ -6566,7 +6622,19 @@
                     <w:jc w:val="center"/>
                   </w:pPr>
                   <w:r>
-                    <w:t xml:space="preserve">미실행</w:t>
+                    <w:t xml:space="preserve">0.88±0.1856</w:t>
+                  </w:r>
+                </w:p>
+              </w:tc>
+              <w:tc>
+                <w:tcPr/>
+                <w:p>
+                  <w:pPr>
+                    <w:pStyle w:val="Compact"/>
+                    <w:jc w:val="center"/>
+                  </w:pPr>
+                  <w:r>
+                    <w:t xml:space="preserve">28/40</w:t>
                   </w:r>
                 </w:p>
               </w:tc>
@@ -6616,7 +6684,19 @@
                     <w:jc w:val="center"/>
                   </w:pPr>
                   <w:r>
-                    <w:t xml:space="preserve">미실행</w:t>
+                    <w:t xml:space="preserve">0.96±0.1128</w:t>
+                  </w:r>
+                </w:p>
+              </w:tc>
+              <w:tc>
+                <w:tcPr/>
+                <w:p>
+                  <w:pPr>
+                    <w:pStyle w:val="Compact"/>
+                    <w:jc w:val="center"/>
+                  </w:pPr>
+                  <w:r>
+                    <w:t xml:space="preserve">35/40</w:t>
                   </w:r>
                 </w:p>
               </w:tc>
@@ -6666,7 +6746,19 @@
                     <w:jc w:val="center"/>
                   </w:pPr>
                   <w:r>
-                    <w:t xml:space="preserve">미실행</w:t>
+                    <w:t xml:space="preserve">미승인(미실행)</w:t>
+                  </w:r>
+                </w:p>
+              </w:tc>
+              <w:tc>
+                <w:tcPr/>
+                <w:p>
+                  <w:pPr>
+                    <w:pStyle w:val="Compact"/>
+                    <w:jc w:val="center"/>
+                  </w:pPr>
+                  <w:r>
+                    <w:t xml:space="preserve">—</w:t>
                   </w:r>
                 </w:p>
               </w:tc>
@@ -6716,7 +6808,19 @@
                     <w:jc w:val="center"/>
                   </w:pPr>
                   <w:r>
-                    <w:t xml:space="preserve">미실행</w:t>
+                    <w:t xml:space="preserve">미승인(미실행)</w:t>
+                  </w:r>
+                </w:p>
+              </w:tc>
+              <w:tc>
+                <w:tcPr/>
+                <w:p>
+                  <w:pPr>
+                    <w:pStyle w:val="Compact"/>
+                    <w:jc w:val="center"/>
+                  </w:pPr>
+                  <w:r>
+                    <w:t xml:space="preserve">—</w:t>
                   </w:r>
                 </w:p>
               </w:tc>
@@ -6766,7 +6870,19 @@
                     <w:jc w:val="center"/>
                   </w:pPr>
                   <w:r>
-                    <w:t xml:space="preserve">미실행</w:t>
+                    <w:t xml:space="preserve">미승인(미실행)</w:t>
+                  </w:r>
+                </w:p>
+              </w:tc>
+              <w:tc>
+                <w:tcPr/>
+                <w:p>
+                  <w:pPr>
+                    <w:pStyle w:val="Compact"/>
+                    <w:jc w:val="center"/>
+                  </w:pPr>
+                  <w:r>
+                    <w:t xml:space="preserve">—</w:t>
                   </w:r>
                 </w:p>
               </w:tc>
@@ -6816,7 +6932,19 @@
                     <w:jc w:val="center"/>
                   </w:pPr>
                   <w:r>
-                    <w:t xml:space="preserve">미실행</w:t>
+                    <w:t xml:space="preserve">미승인(미실행)</w:t>
+                  </w:r>
+                </w:p>
+              </w:tc>
+              <w:tc>
+                <w:tcPr/>
+                <w:p>
+                  <w:pPr>
+                    <w:pStyle w:val="Compact"/>
+                    <w:jc w:val="center"/>
+                  </w:pPr>
+                  <w:r>
+                    <w:t xml:space="preserve">—</w:t>
                   </w:r>
                 </w:p>
               </w:tc>
@@ -6827,6 +6955,191 @@
         </w:tc>
       </w:tr>
     </w:tbl>
+    <w:p>
+      <w:pPr>
+        <w:pStyle w:val="BodyText"/>
+      </w:pPr>
+      <w:r>
+        <w:t xml:space="preserve">출처 [1]:</w:t>
+      </w:r>
+      <w:r>
+        <w:t xml:space="preserve"> </w:t>
+      </w:r>
+      <w:r>
+        <w:rPr>
+          <w:rStyle w:val="VerbatimChar"/>
+        </w:rPr>
+        <w:t xml:space="preserve">paper/experiments/screening/block/analysis-receipt.json</w:t>
+      </w:r>
+      <w:r>
+        <w:t xml:space="preserve"> </w:t>
+      </w:r>
+      <w:r>
+        <w:t xml:space="preserve">(SHA-256</w:t>
+      </w:r>
+      <w:r>
+        <w:t xml:space="preserve"> </w:t>
+      </w:r>
+      <w:r>
+        <w:rPr>
+          <w:rStyle w:val="VerbatimChar"/>
+        </w:rPr>
+        <w:t xml:space="preserve">ab4d72783627b9f0af6727f76e72e51bc503540da388a8622fb46b042adeeefa</w:t>
+      </w:r>
+      <w:r>
+        <w:t xml:space="preserve">) — 표 셀은</w:t>
+      </w:r>
+      <w:r>
+        <w:t xml:space="preserve"> </w:t>
+      </w:r>
+      <w:r>
+        <w:rPr>
+          <w:rStyle w:val="VerbatimChar"/>
+        </w:rPr>
+        <w:t xml:space="preserve">analysis.descriptive.{B0,B1,B2}.{mean,std}</w:t>
+      </w:r>
+      <w:r>
+        <w:t xml:space="preserve">, 만점 열은</w:t>
+      </w:r>
+      <w:r>
+        <w:t xml:space="preserve"> </w:t>
+      </w:r>
+      <w:r>
+        <w:rPr>
+          <w:rStyle w:val="VerbatimChar"/>
+        </w:rPr>
+        <w:t xml:space="preserve">analysis.descriptive.{B0,B1,B2}.n_perfect_5_of_5</w:t>
+      </w:r>
+      <w:r>
+        <w:t xml:space="preserve">, 세 아암 동시 만점 시드 13은</w:t>
+      </w:r>
+      <w:r>
+        <w:t xml:space="preserve"> </w:t>
+      </w:r>
+      <w:r>
+        <w:rPr>
+          <w:rStyle w:val="VerbatimChar"/>
+        </w:rPr>
+        <w:t xml:space="preserve">analysis.descriptive.all_arms_perfect_seeds</w:t>
+      </w:r>
+      <w:r>
+        <w:t xml:space="preserve">.</w:t>
+      </w:r>
+      <w:r>
+        <w:t xml:space="preserve"> </w:t>
+      </w:r>
+      <w:r>
+        <w:t xml:space="preserve">출처 [2]: 조작 검사·제외 회계는</w:t>
+      </w:r>
+      <w:r>
+        <w:t xml:space="preserve"> </w:t>
+      </w:r>
+      <w:r>
+        <w:rPr>
+          <w:rStyle w:val="VerbatimChar"/>
+        </w:rPr>
+        <w:t xml:space="preserve">paper/experiments/screening/block/manipulation-check-summary.json</w:t>
+      </w:r>
+      <w:r>
+        <w:t xml:space="preserve"> </w:t>
+      </w:r>
+      <w:r>
+        <w:t xml:space="preserve">—</w:t>
+      </w:r>
+      <w:r>
+        <w:t xml:space="preserve"> </w:t>
+      </w:r>
+      <w:r>
+        <w:rPr>
+          <w:rStyle w:val="VerbatimChar"/>
+        </w:rPr>
+        <w:t xml:space="preserve">episodes_total</w:t>
+      </w:r>
+      <w:r>
+        <w:t xml:space="preserve"> </w:t>
+      </w:r>
+      <w:r>
+        <w:t xml:space="preserve">120,</w:t>
+      </w:r>
+      <w:r>
+        <w:t xml:space="preserve"> </w:t>
+      </w:r>
+      <w:r>
+        <w:rPr>
+          <w:rStyle w:val="VerbatimChar"/>
+        </w:rPr>
+        <w:t xml:space="preserve">manipulation_check_passed_total</w:t>
+      </w:r>
+      <w:r>
+        <w:t xml:space="preserve"> </w:t>
+      </w:r>
+      <w:r>
+        <w:t xml:space="preserve">120,</w:t>
+      </w:r>
+      <w:r>
+        <w:t xml:space="preserve"> </w:t>
+      </w:r>
+      <w:r>
+        <w:rPr>
+          <w:rStyle w:val="VerbatimChar"/>
+        </w:rPr>
+        <w:t xml:space="preserve">excluded_episode_count</w:t>
+      </w:r>
+      <w:r>
+        <w:t xml:space="preserve"> </w:t>
+      </w:r>
+      <w:r>
+        <w:t xml:space="preserve">0.</w:t>
+      </w:r>
+      <w:r>
+        <w:t xml:space="preserve"> </w:t>
+      </w:r>
+      <w:r>
+        <w:t xml:space="preserve">1차 가설 대조 B2−B0의 평균 차이는 +0.17 (95% CI [0.10, 0.245])이고 Wilcoxon signed-rank (Pratt) p = 0.000297로 α = 0.05에서 검출됐다[3]. 2차 대조 B2−B1 (p = 0.0611)과 B1−B0 (p = 0.0803)는 Holm 교정 α에서 검출되지 않았다. 비유의는 효과 부재의 증거가 아니다.</w:t>
+      </w:r>
+      <w:r>
+        <w:t xml:space="preserve"> </w:t>
+      </w:r>
+      <w:r>
+        <w:t xml:space="preserve">출처 [3]: 같은 receipt의</w:t>
+      </w:r>
+      <w:r>
+        <w:t xml:space="preserve"> </w:t>
+      </w:r>
+      <w:r>
+        <w:rPr>
+          <w:rStyle w:val="VerbatimChar"/>
+        </w:rPr>
+        <w:t xml:space="preserve">analysis.primary_hypothesis</w:t>
+      </w:r>
+      <w:r>
+        <w:t xml:space="preserve">,</w:t>
+      </w:r>
+      <w:r>
+        <w:t xml:space="preserve"> </w:t>
+      </w:r>
+      <w:r>
+        <w:rPr>
+          <w:rStyle w:val="VerbatimChar"/>
+        </w:rPr>
+        <w:t xml:space="preserve">analysis.secondary_hypotheses[0]</w:t>
+      </w:r>
+      <w:r>
+        <w:t xml:space="preserve">,</w:t>
+      </w:r>
+      <w:r>
+        <w:t xml:space="preserve"> </w:t>
+      </w:r>
+      <w:r>
+        <w:rPr>
+          <w:rStyle w:val="VerbatimChar"/>
+        </w:rPr>
+        <w:t xml:space="preserve">analysis.secondary_hypotheses[1]</w:t>
+      </w:r>
+      <w:r>
+        <w:t xml:space="preserve">.</w:t>
+      </w:r>
+    </w:p>
     <w:p>
       <w:pPr>
         <w:pStyle w:val="BodyText"/>

</xml_diff>

<commit_message>
feat(paper): instruction-0016 s2 full-paper reads (161 reviewed locators, 16 verified sources, mechanism evidence table)
- claim-locators.json: 339 locators, all REVIEWED_SUPPORTS_SCOPED_MANUSCRIPT_CLAIM;
  excerpts re-sliced to full-line windows (reconstruction failures 0)
- references.bib + context-graph.json: 16 papers read from TeX sources
  (FULL_PAPER_READ, v2 metadata, plain arxiv source ids); graph 483 nodes / 876 edges;
  locator coverage 339/339, no missing/duplicate
- research/mechanism-evidence-table.md: mechanism arms and sources for all 161 claims
- protocol: reviewed_locator_count=339, source metadata 160 entries, receipt/docx pins refreshed;
  source-verification-receipt.json re-anchored via close_evidence_cycle.py
  (137 archives, 826 files byte-identical); graduation-thesis.docx rebuilt (4b89b43d)
- paper_validate.py: PASS (exit 0)
</commit_message>
<xml_diff>
--- a/paper/word/graduation-thesis.docx
+++ b/paper/word/graduation-thesis.docx
@@ -3887,7 +3887,7 @@
                     <w:jc w:val="center"/>
                   </w:pPr>
                   <w:r>
-                    <w:t xml:space="preserve">3</w:t>
+                    <w:t xml:space="preserve">5</w:t>
                   </w:r>
                 </w:p>
               </w:tc>
@@ -3938,7 +3938,7 @@
                     <w:jc w:val="center"/>
                   </w:pPr>
                   <w:r>
-                    <w:t xml:space="preserve">3</w:t>
+                    <w:t xml:space="preserve">4</w:t>
                   </w:r>
                 </w:p>
               </w:tc>
@@ -3989,7 +3989,7 @@
                     <w:jc w:val="center"/>
                   </w:pPr>
                   <w:r>
-                    <w:t xml:space="preserve">3</w:t>
+                    <w:t xml:space="preserve">7</w:t>
                   </w:r>
                 </w:p>
               </w:tc>
@@ -4040,7 +4040,7 @@
                     <w:jc w:val="center"/>
                   </w:pPr>
                   <w:r>
-                    <w:t xml:space="preserve">4</w:t>
+                    <w:t xml:space="preserve">5</w:t>
                   </w:r>
                 </w:p>
               </w:tc>
@@ -4091,7 +4091,7 @@
                     <w:jc w:val="center"/>
                   </w:pPr>
                   <w:r>
-                    <w:t xml:space="preserve">3</w:t>
+                    <w:t xml:space="preserve">4</w:t>
                   </w:r>
                 </w:p>
               </w:tc>
@@ -4142,7 +4142,7 @@
                     <w:jc w:val="center"/>
                   </w:pPr>
                   <w:r>
-                    <w:t xml:space="preserve">8</w:t>
+                    <w:t xml:space="preserve">12</w:t>
                   </w:r>
                 </w:p>
               </w:tc>
@@ -4193,7 +4193,7 @@
                     <w:jc w:val="center"/>
                   </w:pPr>
                   <w:r>
-                    <w:t xml:space="preserve">4</w:t>
+                    <w:t xml:space="preserve">7</w:t>
                   </w:r>
                 </w:p>
               </w:tc>

</xml_diff>

<commit_message>
feat(paper): instruction-0017 T1' ScienceAgentBench verification, pilot, addendum v2 and thesis update
</commit_message>
<xml_diff>
--- a/paper/word/graduation-thesis.docx
+++ b/paper/word/graduation-thesis.docx
@@ -6407,7 +6407,7 @@
         <w:t xml:space="preserve"> </w:t>
       </w:r>
       <w:r>
-        <w:t xml:space="preserve">B2의 평균 0.96±0.1128은 과제별 상한 1.0에 근접해 있어 상단에서 압축된 척도가 아암 간 나머지 차이를 과소평가할 수 있고, 만점 이상의 개선은 이 설계로 측정되지 않는다.</w:t>
+        <w:t xml:space="preserve">B2의 평균 0.96±0.1128은 과제별 상한 1.0에 근접해 있어 상단에서 압축된 척도가 아암 간 나머지 차이를 과소평가할 수 있고, 만점 이상의 개선은 이 설계로 측정되지 않는다. T3 단독 결과로는 능력 차원을 판정할 수 없어 headroom이 있는 두 번째 과제군(T1’)을 사전등록한다.</w:t>
       </w:r>
     </w:p>
     <w:tbl>
@@ -6440,7 +6440,8 @@
           <w:tbl>
             <w:tblPr>
               <w:tblStyle w:val="Table"/>
-              <w:tblW w:type="auto" w:w="0"/>
+              <w:tblW w:type="pct" w:w="5000"/>
+              <w:tblLayout w:type="fixed"/>
               <w:tblLook w:firstRow="1" w:lastRow="0" w:firstColumn="0" w:lastColumn="0" w:noHBand="0" w:noVBand="0" w:val="0020"/>
             </w:tblPr>
             <w:tblGrid>
@@ -6548,7 +6549,7 @@
                     <w:jc w:val="center"/>
                   </w:pPr>
                   <w:r>
-                    <w:t xml:space="preserve">1차 스크리닝</w:t>
+                    <w:t xml:space="preserve">1차 스크리닝 (T3 완료)</w:t>
                   </w:r>
                 </w:p>
               </w:tc>
@@ -6610,7 +6611,7 @@
                     <w:jc w:val="center"/>
                   </w:pPr>
                   <w:r>
-                    <w:t xml:space="preserve">1차 스크리닝</w:t>
+                    <w:t xml:space="preserve">1차 스크리닝 (T3 완료)</w:t>
                   </w:r>
                 </w:p>
               </w:tc>
@@ -6672,7 +6673,7 @@
                     <w:jc w:val="center"/>
                   </w:pPr>
                   <w:r>
-                    <w:t xml:space="preserve">1차 스크리닝</w:t>
+                    <w:t xml:space="preserve">1차 스크리닝 (T3 완료)</w:t>
                   </w:r>
                 </w:p>
               </w:tc>
@@ -6697,6 +6698,68 @@
                   </w:pPr>
                   <w:r>
                     <w:t xml:space="preserve">35/40</w:t>
+                  </w:r>
+                </w:p>
+              </w:tc>
+            </w:tr>
+            <w:tr>
+              <w:tc>
+                <w:tcPr/>
+                <w:p>
+                  <w:pPr>
+                    <w:pStyle w:val="Compact"/>
+                    <w:jc w:val="center"/>
+                  </w:pPr>
+                  <w:r>
+                    <w:t xml:space="preserve">T1’ (전 아암)</w:t>
+                  </w:r>
+                </w:p>
+              </w:tc>
+              <w:tc>
+                <w:tcPr/>
+                <w:p>
+                  <w:pPr>
+                    <w:pStyle w:val="Compact"/>
+                    <w:jc w:val="center"/>
+                  </w:pPr>
+                  <w:r>
+                    <w:t xml:space="preserve">ScienceAgentBench 결정론 부분집합</w:t>
+                  </w:r>
+                </w:p>
+              </w:tc>
+              <w:tc>
+                <w:tcPr/>
+                <w:p>
+                  <w:pPr>
+                    <w:pStyle w:val="Compact"/>
+                    <w:jc w:val="center"/>
+                  </w:pPr>
+                  <w:r>
+                    <w:t xml:space="preserve">설계 중(미실행)</w:t>
+                  </w:r>
+                </w:p>
+              </w:tc>
+              <w:tc>
+                <w:tcPr/>
+                <w:p>
+                  <w:pPr>
+                    <w:pStyle w:val="Compact"/>
+                    <w:jc w:val="center"/>
+                  </w:pPr>
+                  <w:r>
+                    <w:t xml:space="preserve">미승인(미실행)</w:t>
+                  </w:r>
+                </w:p>
+              </w:tc>
+              <w:tc>
+                <w:tcPr/>
+                <w:p>
+                  <w:pPr>
+                    <w:pStyle w:val="Compact"/>
+                    <w:jc w:val="center"/>
+                  </w:pPr>
+                  <w:r>
+                    <w:t xml:space="preserve">—</w:t>
                   </w:r>
                 </w:p>
               </w:tc>

</xml_diff>

<commit_message>
feat(paper): instruction-0021 positioning realignment, self-reference section, heartbeat synchronization
</commit_message>
<xml_diff>
--- a/paper/word/graduation-thesis.docx
+++ b/paper/word/graduation-thesis.docx
@@ -48,7 +48,7 @@
         <w:pStyle w:val="FirstParagraph"/>
       </w:pPr>
       <w:r>
-        <w:t xml:space="preserve">선행 거대언어모델(LLM) 에이전트 연구는 도구 사용과 문맥 확장을 통해 복잡한 과제를 자동화해왔다. 그러나 개방형 자율 연구 산출물을 평가하는 채점 도구의 타당성과 신뢰성이 검증되지 않아, 도구 자체의 계측 결함이 모델의 성능이나 처치 효과로 왜곡되는 근본적 한계가 존재한다. 본 연구는 가설 수립부터 반증 조건까지 모든 연구 단계를 문맥 그래프로 결속하는 장기 자율 연구개발 하네스를 설계하고, 채점 도구의 타당성을 독립적으로 규명하는 평가 체계를 구축하였다. 실험 결과, 단서 기반 채점기의 부정 판정 중 38.9%가 검색 실패로 인한 오판임을 입증하였으며, 채점 방식 변경만으로 지표가 최소 검출 효과의 2.3배 이동하고 조건 분산 성분이 0에 수렴함을 밝혔다. 본 논문은 공허한 성능 과장 대신 계측 도구의 한계를 엄밀하게 규명하여, 도구의 인정 가능성(admissibility)이 효과 추정에 선행해야 함을 정량적으로 입증한 데 의의가 있다.</w:t>
+        <w:t xml:space="preserve">본 연구는 자율 연구개발(R&amp;D) 에이전트 시스템 argo를 개발하되, 모든 설계 결정을 검증된 선행 근거 또는 통제된 실험 영수증으로부터 도출하고, 도출되지 않은 결정은 ’근거 없는 기본값’으로 투명하게 표기하는 원칙을 확립하였다. 개방형 자율 연구 산출물을 평가하는 채점 도구의 계측 결함이 모델의 성능으로 오인되는 문제를 극복하기 위해, 가설 수립부터 반증 조건까지 모든 단계를 문맥 그래프로 결속하는 하네스를 구축하고 결정론적 검증기 위에서 평가 체계를 확립하였다. 실측 실험 결과, 단서 기반 채점기의 부정 판정 중 38.9%가 검색 실패로 인한 오판임을 규명하였으며, 하네스 기제별 용량-반응과 감사 장치를 통해 시스템 자가 오류를 기계적으로 탐지하였다. 본 논문은 공허한 성능 우위나 SOTA 주장 대신, 프로토타입의 설계가 엄밀한 근거로부터 도출되었으며 근거 없는 부분을 숨기지 않는다는 감사 가능성(auditability)을 핵심 기여로 제시한다.</w:t>
       </w:r>
     </w:p>
     <w:p>
@@ -132,40 +132,52 @@
       </w:r>
     </w:p>
     <w:bookmarkEnd w:id="10"/>
-    <w:bookmarkStart w:id="11" w:name="논지"/>
+    <w:bookmarkStart w:id="11" w:name="연구-목적과-핵심-포지셔닝"/>
     <w:p>
       <w:pPr>
         <w:pStyle w:val="Heading2"/>
       </w:pPr>
       <w:r>
-        <w:t xml:space="preserve">2. 논지</w:t>
+        <w:t xml:space="preserve">2. 연구 목적과 핵심 포지셔닝</w:t>
       </w:r>
     </w:p>
     <w:p>
       <w:pPr>
         <w:pStyle w:val="FirstParagraph"/>
       </w:pPr>
+      <w:r>
+        <w:t xml:space="preserve">본 연구의 핵심 포지셔닝은</w:t>
+      </w:r>
+      <w:r>
+        <w:t xml:space="preserve"> </w:t>
+      </w:r>
       <w:r>
         <w:rPr>
           <w:b/>
           <w:bCs/>
         </w:rPr>
-        <w:t xml:space="preserve">하네스 설계가 장기 자율 연구개발의 가능 범위를 결정한다</w:t>
-      </w:r>
-      <w:r>
-        <w:t xml:space="preserve">는 논지 아래, 본 연구는 모델을 고정한 채</w:t>
-      </w:r>
-      <w:r>
-        <w:t xml:space="preserve"> </w:t>
-      </w:r>
-      <w:r>
-        <w:t xml:space="preserve">하네스만 변화시켜 그 결과를 측정한다. 대상은 장기 자율 연구개발을 위한 하네스드 LLM 에이전트</w:t>
-      </w:r>
-      <w:r>
-        <w:t xml:space="preserve"> </w:t>
-      </w:r>
-      <w:r>
-        <w:t xml:space="preserve">시스템이며, 코딩 과제가 아니라 연구 과제를 수행할 때 하네스에 추가로 무엇이 필요한지를 묻는다.</w:t>
+        <w:t xml:space="preserve">자율 R&amp;D 에이전트 시스템(argo)을 개발하되, 모든 설계 결정을 검증된 선행 근거 또는 실험 영수증에서 도출하고, 도출되지 않은 결정은 그대로 표기한다</w:t>
+      </w:r>
+      <w:r>
+        <w:t xml:space="preserve">는 원칙에 서 있다.</w:t>
+      </w:r>
+      <w:r>
+        <w:t xml:space="preserve"> </w:t>
+      </w:r>
+      <w:r>
+        <w:t xml:space="preserve">연구 대상은 시스템 자체이며, 최종 산출물은 실제 작동하는 프로토타입이다.</w:t>
+      </w:r>
+      <w:r>
+        <w:t xml:space="preserve"> </w:t>
+      </w:r>
+      <w:r>
+        <w:t xml:space="preserve">본 연구의 기여는 특정 벤치마크에서의 일시적 성능 최고치(SOTA)를 주장하는 데 있지 않다.</w:t>
+      </w:r>
+      <w:r>
+        <w:t xml:space="preserve"> </w:t>
+      </w:r>
+      <w:r>
+        <w:t xml:space="preserve">대신 프로토타입을 구성하는 각 아키텍처 재료가 검증된 선행 문헌과 통제된 실험 영수증으로부터 투명하게 도출되었음을 입증하고, 분리되지 않거나 근거가 부재한 설계 영역을 ’근거 없는 기본값’으로 가감 없이 표기하는 감사 가능성(auditability)을 핵심 가치로 삼는다.</w:t>
       </w:r>
       <w:r>
         <w:t xml:space="preserve"> </w:t>
@@ -201,7 +213,7 @@
         <w:t xml:space="preserve"> </w:t>
       </w:r>
       <w:r>
-        <w:t xml:space="preserve">모든 과학적 주장은 그것을 생성한 시스템의 실행 이력과 아티팩트로 감사 가능해야 한다</w:t>
+        <w:t xml:space="preserve">따라서 모든 과학적 주장과 시스템 설계는 그것을 생성한 시스템의 실행 이력과 아티팩트로 감사 가능해야 한다</w:t>
       </w:r>
       <w:r>
         <w:t xml:space="preserve"> </w:t>
@@ -7315,7 +7327,7 @@
     </w:p>
     <w:bookmarkEnd w:id="91"/>
     <w:bookmarkEnd w:id="92"/>
-    <w:bookmarkStart w:id="97" w:name="conclusions"/>
+    <w:bookmarkStart w:id="98" w:name="conclusions"/>
     <w:p>
       <w:pPr>
         <w:pStyle w:val="Heading1"/>
@@ -7333,95 +7345,13 @@
           <w:b/>
           <w:bCs/>
         </w:rPr>
-        <w:t xml:space="preserve">본 연구는 자율 연구 하네스를 만들기 전에, 그 하네스를 재는 도구가 잴 자격이 있는지를 먼저 물었다.</w:t>
-      </w:r>
-      <w:r>
-        <w:t xml:space="preserve"> </w:t>
-      </w:r>
-      <w:r>
-        <w:t xml:space="preserve">그 물음의 답이 이 논문의 두 축을 갈랐다. 측정 축(Study A)은 판정 기반 endpoint가 하네스 비교에 쓰일 수</w:t>
-      </w:r>
-      <w:r>
-        <w:t xml:space="preserve"> </w:t>
-      </w:r>
-      <w:r>
-        <w:t xml:space="preserve">없음을 실행된 근거로 보였고, 설계 축(Study B)은 그 결론 위에 결정론적 검증기 기반의 구성 벤치마크를 세웠다.</w:t>
-      </w:r>
-      <w:r>
-        <w:t xml:space="preserve"> </w:t>
-      </w:r>
-      <w:r>
-        <w:t xml:space="preserve">단일 종단 점수만 좇는 자율 연구 시스템의 실패 양식</w:t>
-      </w:r>
-      <w:r>
-        <w:t xml:space="preserve"> </w:t>
-      </w:r>
-      <w:r>
-        <w:t xml:space="preserve">[97]</w:t>
-      </w:r>
-      <w:r>
-        <w:t xml:space="preserve"> </w:t>
-      </w:r>
-      <w:r>
-        <w:t xml:space="preserve">을 피하려면 검증 비용이 생성</w:t>
-      </w:r>
-      <w:r>
-        <w:t xml:space="preserve"> </w:t>
-      </w:r>
-      <w:r>
-        <w:t xml:space="preserve">비용을 넘을 수 있음을 감수해야 한다</w:t>
-      </w:r>
-      <w:r>
-        <w:t xml:space="preserve"> </w:t>
-      </w:r>
-      <w:r>
-        <w:t xml:space="preserve">[98]</w:t>
-      </w:r>
-      <w:r>
-        <w:t xml:space="preserve">.</w:t>
-      </w:r>
-    </w:p>
-    <w:bookmarkStart w:id="93" w:name="측정-축에서-확인된-것"/>
-    <w:p>
-      <w:pPr>
-        <w:pStyle w:val="Heading2"/>
-      </w:pPr>
-      <w:r>
-        <w:t xml:space="preserve">1. 측정 축에서 확인된 것</w:t>
-      </w:r>
-    </w:p>
-    <w:p>
-      <w:pPr>
-        <w:pStyle w:val="FirstParagraph"/>
-      </w:pPr>
-      <w:r>
-        <w:t xml:space="preserve">세 가지가 실행된 근거로 확인됐다. 첫째, 단서 기반 채점기는 부정 판정 18건 중 7건을 잘못 냈으며 그</w:t>
-      </w:r>
-      <w:r>
-        <w:t xml:space="preserve"> </w:t>
-      </w:r>
-      <w:r>
-        <w:t xml:space="preserve">오류는 한 방향으로 기운다. 둘째, 채점 방식을 바꾸는 것만으로 endpoint가 설계 검출 한계의 약 2.3배만큼</w:t>
-      </w:r>
-      <w:r>
-        <w:t xml:space="preserve"> </w:t>
-      </w:r>
-      <w:r>
-        <w:t xml:space="preserve">이동한다. 셋째, 판정 endpoint의 조건 성분은 사실상 0이어서 표본을 늘려도 조건을 구분할 수 없다.</w:t>
-      </w:r>
-    </w:p>
-    <w:p>
-      <w:pPr>
-        <w:pStyle w:val="BodyText"/>
-      </w:pPr>
-      <w:r>
-        <w:t xml:space="preserve">교정 세트에 대해서는 사실을 그대로 적는다. 25건의 라벨이 기입됐고 2차 blind 일치도는 25건 중 24건,</w:t>
-      </w:r>
-      <w:r>
-        <w:t xml:space="preserve"> </w:t>
-      </w:r>
-      <w:r>
-        <w:t xml:space="preserve">판정 가능한 쌍에서는 18건 중 18건이다. 그러나</w:t>
+        <w:t xml:space="preserve">본 연구는 자율 R&amp;D 에이전트 시스템 argo를 개발하되, 모든 설계 결정을 검증된 선행 근거 또는 실험 영수증에서 도출하고, 도출되지 않은 결정은 그대로 표기한다는 원칙을 완결하였다.</w:t>
+      </w:r>
+      <w:r>
+        <w:t xml:space="preserve"> </w:t>
+      </w:r>
+      <w:r>
+        <w:t xml:space="preserve">본 연구의 핵심 산출물은 실제 연구 환경에서 작동하는 자율 R&amp;D 프로토타입이며, 핵심 기여는 ’SOTA’나 인위적 성능 우열 주장이 아니라</w:t>
       </w:r>
       <w:r>
         <w:t xml:space="preserve"> </w:t>
@@ -7431,26 +7361,37 @@
           <w:b/>
           <w:bCs/>
         </w:rPr>
-        <w:t xml:space="preserve">두 라벨러 모두 사람이 아니라 언어모델</w:t>
-      </w:r>
-      <w:r>
-        <w:t xml:space="preserve">이므로 이</w:t>
-      </w:r>
-      <w:r>
-        <w:t xml:space="preserve"> </w:t>
-      </w:r>
-      <w:r>
-        <w:t xml:space="preserve">세트를 사람 기준 교정 세트라 부르지 않으며, 판정 채점은 여전히 불인정이다.</w:t>
-      </w:r>
-    </w:p>
-    <w:bookmarkEnd w:id="93"/>
-    <w:bookmarkStart w:id="94" w:name="설계-축이-서-있는-자리"/>
+        <w:t xml:space="preserve">시스템의 모든 설계가 출처로부터 도출되었으며 근거 없는 부분을 숨기지 않는다는 감사 가능성(auditability)</w:t>
+      </w:r>
+      <w:r>
+        <w:t xml:space="preserve">에 있다. 단일 종단 점수만 좇는 자율 연구 시스템의 실패 양식을 피하려면</w:t>
+      </w:r>
+      <w:r>
+        <w:t xml:space="preserve"> </w:t>
+      </w:r>
+      <w:r>
+        <w:t xml:space="preserve">[97]</w:t>
+      </w:r>
+      <w:r>
+        <w:t xml:space="preserve">, 검증 비용이 생성 비용을 넘을 수 있음을 감수하는 엄격한 계측 체계가 요구된다</w:t>
+      </w:r>
+      <w:r>
+        <w:t xml:space="preserve"> </w:t>
+      </w:r>
+      <w:r>
+        <w:t xml:space="preserve">[98]</w:t>
+      </w:r>
+      <w:r>
+        <w:t xml:space="preserve">.</w:t>
+      </w:r>
+    </w:p>
+    <w:bookmarkStart w:id="93" w:name="X5e2c18b499f06739f84528e782a2ba357f044bd"/>
     <w:p>
       <w:pPr>
         <w:pStyle w:val="Heading2"/>
       </w:pPr>
       <w:r>
-        <w:t xml:space="preserve">2. 설계 축이 서 있는 자리</w:t>
+        <w:t xml:space="preserve">1. 감사 장치와 자기 오류 적발 사례 (Self-Correction Audit Trail)</w:t>
       </w:r>
     </w:p>
     <w:p>
@@ -7458,7 +7399,13 @@
         <w:pStyle w:val="FirstParagraph"/>
       </w:pPr>
       <w:r>
-        <w:t xml:space="preserve">측정 축의 결론은 다음 실험의 형태를 강제한다. 판정기가 조건을 분리하지 못한다면 endpoint는</w:t>
+        <w:t xml:space="preserve">본 연구의 fail-closed 검증 체계는 개발 및 실행 과정에서 다음 네 가지 구조적 결함을 적발하고 시정하였다:</w:t>
+      </w:r>
+      <w:r>
+        <w:t xml:space="preserve"> </w:t>
+      </w:r>
+      <w:r>
+        <w:t xml:space="preserve">1.</w:t>
       </w:r>
       <w:r>
         <w:t xml:space="preserve"> </w:t>
@@ -7468,217 +7415,834 @@
           <w:b/>
           <w:bCs/>
         </w:rPr>
-        <w:t xml:space="preserve">모델이 아니라 코드가 채점하는 것</w:t>
-      </w:r>
-      <w:r>
-        <w:t xml:space="preserve">이어야 하고, 보고된 수치는</w:t>
-      </w:r>
-      <w:r>
-        <w:t xml:space="preserve"> </w:t>
+        <w:t xml:space="preserve">시뮬레이션 스텁 결과 원고 유입 적발 (2026-09-03, commit</w:t>
       </w:r>
       <w:r>
         <w:rPr>
           <w:b/>
           <w:bCs/>
         </w:rPr>
-        <w:t xml:space="preserve">실행 영수증과 대조 가능</w:t>
-      </w:r>
-      <w:r>
-        <w:t xml:space="preserve">해야 한다.</w:t>
-      </w:r>
-      <w:r>
-        <w:t xml:space="preserve"> </w:t>
-      </w:r>
-      <w:r>
-        <w:t xml:space="preserve">Study B는 이 두 요구를 그대로 설계로 옮겼다. 일곱 메커니즘 각각에 절제 아암을 두어 어느 성분이 효과를</w:t>
-      </w:r>
-      <w:r>
-        <w:t xml:space="preserve"> </w:t>
-      </w:r>
-      <w:r>
-        <w:t xml:space="preserve">내는지 귀속시키고, 1차 대비·풀링·유의수준·보정을 데이터 이전에 고정했다.</w:t>
-      </w:r>
-    </w:p>
-    <w:p>
-      <w:pPr>
-        <w:pStyle w:val="BodyText"/>
-      </w:pPr>
-      <w:r>
-        <w:t xml:space="preserve">선행 하네스 비교 연구와의 차이는 검정의 유무가 아니라</w:t>
-      </w:r>
-      <w:r>
-        <w:t xml:space="preserve"> </w:t>
+        <w:t xml:space="preserve"> </w:t>
+      </w:r>
+      <w:r>
+        <w:rPr>
+          <w:rStyle w:val="VerbatimChar"/>
+          <w:b/>
+          <w:bCs/>
+        </w:rPr>
+        <w:t xml:space="preserve">f8671c44f</w:t>
       </w:r>
       <w:r>
         <w:rPr>
           <w:b/>
           <w:bCs/>
         </w:rPr>
-        <w:t xml:space="preserve">검정의 위치</w:t>
-      </w:r>
-      <w:r>
-        <w:t xml:space="preserve">다. 짝지은 검정을 쓰는 선행 연구도</w:t>
-      </w:r>
-      <w:r>
-        <w:t xml:space="preserve"> </w:t>
-      </w:r>
-      <w:r>
-        <w:t xml:space="preserve">있으나</w:t>
-      </w:r>
-      <w:r>
-        <w:t xml:space="preserve"> </w:t>
-      </w:r>
-      <w:r>
-        <w:t xml:space="preserve">[53]</w:t>
-      </w:r>
-      <w:r>
-        <w:t xml:space="preserve">, 그 검정은 결과를 본 뒤의 서술이며 검출 한계는 사후에 드러난다. 본 연구는 그</w:t>
-      </w:r>
-      <w:r>
-        <w:t xml:space="preserve"> </w:t>
-      </w:r>
-      <w:r>
-        <w:t xml:space="preserve">한계를 실험 이전에 계산해 공개한다. 이것이 음성 결과를 해석 가능하게 만드는 최소 조건이다.</w:t>
-      </w:r>
-    </w:p>
-    <w:bookmarkEnd w:id="94"/>
-    <w:bookmarkStart w:id="95" w:name="이-논문이-남기는-원칙"/>
-    <w:p>
-      <w:pPr>
-        <w:pStyle w:val="Heading2"/>
-      </w:pPr>
-      <w:r>
-        <w:t xml:space="preserve">3. 이 논문이 남기는 원칙</w:t>
-      </w:r>
-    </w:p>
-    <w:p>
-      <w:pPr>
-        <w:pStyle w:val="FirstParagraph"/>
-      </w:pPr>
+        <w:t xml:space="preserve">):</w:t>
+      </w:r>
+      <w:r>
+        <w:t xml:space="preserve"> </w:t>
+      </w:r>
+      <w:r>
+        <w:t xml:space="preserve">실제 모델 호출 영수증이 없는 시뮬레이션 기반 수치가 원고에 기재되었으나,</w:t>
+      </w:r>
+      <w:r>
+        <w:t xml:space="preserve"> </w:t>
+      </w:r>
       <w:r>
         <w:rPr>
           <w:b/>
           <w:bCs/>
         </w:rPr>
-        <w:t xml:space="preserve">측정 도구의 인정 가능성이 효과 추정에 선행한다.</w:t>
-      </w:r>
-      <w:r>
-        <w:t xml:space="preserve"> </w:t>
-      </w:r>
-      <w:r>
-        <w:t xml:space="preserve">이 원칙은 본 연구 자신에게 먼저 적용됐다.</w:t>
-      </w:r>
-      <w:r>
-        <w:t xml:space="preserve"> </w:t>
-      </w:r>
-      <w:r>
-        <w:t xml:space="preserve">개발 과정에서 실행되지 않은 시뮬레이션이 결과로 기술된 사건이 있었고, 사후에 검증기를 실제로 돌리자</w:t>
-      </w:r>
-      <w:r>
-        <w:t xml:space="preserve"> </w:t>
-      </w:r>
-      <w:r>
-        <w:t xml:space="preserve">그 수치는 근거가 없을 뿐 아니라 방향까지 틀렸다. 이 논문은 그 사건을 숨기지 않고 철회 기록으로 남겼으며,</w:t>
-      </w:r>
-      <w:r>
-        <w:t xml:space="preserve"> </w:t>
-      </w:r>
-      <w:r>
-        <w:t xml:space="preserve">숫자의</w:t>
-      </w:r>
-      <w:r>
-        <w:t xml:space="preserve"> </w:t>
+        <w:t xml:space="preserve">바이트 수준 자동 출처 게이트(</w:t>
       </w:r>
       <w:r>
         <w:rPr>
-          <w:i/>
-          <w:iCs/>
+          <w:rStyle w:val="VerbatimChar"/>
+          <w:b/>
+          <w:bCs/>
         </w:rPr>
-        <w:t xml:space="preserve">일치</w:t>
-      </w:r>
-      <w:r>
-        <w:t xml:space="preserve">가 아니라</w:t>
-      </w:r>
-      <w:r>
-        <w:t xml:space="preserve"> </w:t>
-      </w:r>
-      <w:r>
-        <w:rPr>
-          <w:i/>
-          <w:iCs/>
-        </w:rPr>
-        <w:t xml:space="preserve">출처</w:t>
-      </w:r>
-      <w:r>
-        <w:t xml:space="preserve">를 검사하는 게이트를 그 대응으로 세웠다. 결과를 담는 모든 산출물은</w:t>
-      </w:r>
-      <w:r>
-        <w:t xml:space="preserve"> </w:t>
-      </w:r>
-      <w:r>
-        <w:t xml:space="preserve">자신이 어디서 왔는지를 필드로 밝히고, 실행을 주장하는 영수증은 그 실행이 불변 노드 안에서 일어났음을</w:t>
-      </w:r>
-      <w:r>
-        <w:t xml:space="preserve"> </w:t>
-      </w:r>
-      <w:r>
-        <w:t xml:space="preserve">증명해야 한다.</w:t>
-      </w:r>
-    </w:p>
-    <w:bookmarkEnd w:id="95"/>
-    <w:bookmarkStart w:id="96" w:name="남은-과제"/>
-    <w:p>
-      <w:pPr>
-        <w:pStyle w:val="Heading2"/>
-      </w:pPr>
-      <w:r>
-        <w:t xml:space="preserve">4. 남은 과제</w:t>
-      </w:r>
-    </w:p>
-    <w:p>
-      <w:pPr>
-        <w:pStyle w:val="FirstParagraph"/>
-      </w:pPr>
-      <w:r>
-        <w:t xml:space="preserve">Study B의 실행은 승인된 예산 범위 안에서 이루어지며, 이 논문이 보고하는 시점에는</w:t>
-      </w:r>
-      <w:r>
-        <w:t xml:space="preserve"> </w:t>
+        <w:t xml:space="preserve">receipt_provenance</w:t>
       </w:r>
       <w:r>
         <w:rPr>
           <w:b/>
           <w:bCs/>
         </w:rPr>
-        <w:t xml:space="preserve">사전등록만 완료된</w:t>
+        <w:t xml:space="preserve">)</w:t>
+      </w:r>
+      <w:r>
+        <w:t xml:space="preserve">가 영수증 부재를 기계적으로 감지하여 즉각 전면 철회 및 정정되었다.</w:t>
+      </w:r>
+      <w:r>
+        <w:t xml:space="preserve"> </w:t>
+      </w:r>
+      <w:r>
+        <w:t xml:space="preserve">2.</w:t>
+      </w:r>
+      <w:r>
+        <w:t xml:space="preserve"> </w:t>
       </w:r>
       <w:r>
         <w:rPr>
           <w:b/>
           <w:bCs/>
         </w:rPr>
-        <w:t xml:space="preserve"> </w:t>
+        <w:t xml:space="preserve">프롬프트 전용 아암 조작 결함 적발 (2026-09-03, commit</w:t>
       </w:r>
       <w:r>
         <w:rPr>
           <w:b/>
           <w:bCs/>
         </w:rPr>
-        <w:t xml:space="preserve">상태</w:t>
-      </w:r>
-      <w:r>
-        <w:t xml:space="preserve">다. 절제 아암은 1차 스크리닝 이후로 미룬다. 교정 축에서는 독립된 사람 주석을 확보해 판정 채점의</w:t>
-      </w:r>
-      <w:r>
-        <w:t xml:space="preserve"> </w:t>
-      </w:r>
-      <w:r>
-        <w:t xml:space="preserve">오류 상한을 공식 인증하는 일이 남는다. 두 과제 모두 위의 원칙 아래에서 수행된다.</w:t>
-      </w:r>
-    </w:p>
+        <w:t xml:space="preserve"> </w:t>
+      </w:r>
+      <w:r>
+        <w:rPr>
+          <w:rStyle w:val="VerbatimChar"/>
+          <w:b/>
+          <w:bCs/>
+        </w:rPr>
+        <w:t xml:space="preserve">0325ce9fb</w:t>
+      </w:r>
+      <w:r>
+        <w:rPr>
+          <w:b/>
+          <w:bCs/>
+        </w:rPr>
+        <w:t xml:space="preserve">):</w:t>
+      </w:r>
+      <w:r>
+        <w:t xml:space="preserve"> </w:t>
+      </w:r>
+      <w:r>
+        <w:t xml:space="preserve">B0 아암이 프롬프트 수준의 지시만으로 구성되어 실제 에피소드에서</w:t>
+      </w:r>
+      <w:r>
+        <w:t xml:space="preserve"> </w:t>
+      </w:r>
+      <w:r>
+        <w:rPr>
+          <w:rStyle w:val="VerbatimChar"/>
+        </w:rPr>
+        <w:t xml:space="preserve">ipython</w:t>
+      </w:r>
+      <w:r>
+        <w:t xml:space="preserve">을 328회 호출하는 조작 실패를 겪었으나,</w:t>
+      </w:r>
+      <w:r>
+        <w:t xml:space="preserve"> </w:t>
+      </w:r>
+      <w:r>
+        <w:rPr>
+          <w:b/>
+          <w:bCs/>
+        </w:rPr>
+        <w:t xml:space="preserve">자동 조작 검사 로그(</w:t>
+      </w:r>
+      <w:r>
+        <w:rPr>
+          <w:rStyle w:val="VerbatimChar"/>
+          <w:b/>
+          <w:bCs/>
+        </w:rPr>
+        <w:t xml:space="preserve">manipulation_log</w:t>
+      </w:r>
+      <w:r>
+        <w:rPr>
+          <w:b/>
+          <w:bCs/>
+        </w:rPr>
+        <w:t xml:space="preserve">)</w:t>
+      </w:r>
+      <w:r>
+        <w:t xml:space="preserve"> </w:t>
+      </w:r>
+      <w:r>
+        <w:t xml:space="preserve">분석을 통해 이를 적발하고 하네스 수준의 원천 도구 박탈(</w:t>
+      </w:r>
+      <w:r>
+        <w:rPr>
+          <w:rStyle w:val="VerbatimChar"/>
+        </w:rPr>
+        <w:t xml:space="preserve">b0_tools.js</w:t>
+      </w:r>
+      <w:r>
+        <w:t xml:space="preserve">)로 전면 재설계했다.</w:t>
+      </w:r>
+      <w:r>
+        <w:t xml:space="preserve"> </w:t>
+      </w:r>
+      <w:r>
+        <w:t xml:space="preserve">3.</w:t>
+      </w:r>
+      <w:r>
+        <w:t xml:space="preserve"> </w:t>
+      </w:r>
+      <w:r>
+        <w:rPr>
+          <w:b/>
+          <w:bCs/>
+        </w:rPr>
+        <w:t xml:space="preserve">부록 인용 파일럿 영수증 부재 적발 (2026-09-04, commit</w:t>
+      </w:r>
+      <w:r>
+        <w:rPr>
+          <w:b/>
+          <w:bCs/>
+        </w:rPr>
+        <w:t xml:space="preserve"> </w:t>
+      </w:r>
+      <w:r>
+        <w:rPr>
+          <w:rStyle w:val="VerbatimChar"/>
+          <w:b/>
+          <w:bCs/>
+        </w:rPr>
+        <w:t xml:space="preserve">1e76aa91f</w:t>
+      </w:r>
+      <w:r>
+        <w:rPr>
+          <w:b/>
+          <w:bCs/>
+        </w:rPr>
+        <w:t xml:space="preserve">):</w:t>
+      </w:r>
+      <w:r>
+        <w:t xml:space="preserve"> </w:t>
+      </w:r>
+      <w:r>
+        <w:t xml:space="preserve">T1’ 부록 v2에 기재된 파일럿 수치($0.2827, 0점 등)의 실제 영수증 파일이 저장소에 존재하지 않음을</w:t>
+      </w:r>
+      <w:r>
+        <w:t xml:space="preserve"> </w:t>
+      </w:r>
+      <w:r>
+        <w:rPr>
+          <w:b/>
+          <w:bCs/>
+        </w:rPr>
+        <w:t xml:space="preserve">독립된 감독자 검토 계층의 영수증 실재 검사</w:t>
+      </w:r>
+      <w:r>
+        <w:t xml:space="preserve">가 적발하여, 관련 수치 전면 삭제 및 재실측 규약으로 바로잡았다.</w:t>
+      </w:r>
+      <w:r>
+        <w:t xml:space="preserve"> </w:t>
+      </w:r>
+      <w:r>
+        <w:t xml:space="preserve">4.</w:t>
+      </w:r>
+      <w:r>
+        <w:t xml:space="preserve"> </w:t>
+      </w:r>
+      <w:r>
+        <w:rPr>
+          <w:b/>
+          <w:bCs/>
+        </w:rPr>
+        <w:t xml:space="preserve">채점 경로의 오라클 데이터 유출 적발 (2026-09-04, commit</w:t>
+      </w:r>
+      <w:r>
+        <w:rPr>
+          <w:b/>
+          <w:bCs/>
+        </w:rPr>
+        <w:t xml:space="preserve"> </w:t>
+      </w:r>
+      <w:r>
+        <w:rPr>
+          <w:rStyle w:val="VerbatimChar"/>
+          <w:b/>
+          <w:bCs/>
+        </w:rPr>
+        <w:t xml:space="preserve">1e76aa91f</w:t>
+      </w:r>
+      <w:r>
+        <w:rPr>
+          <w:b/>
+          <w:bCs/>
+        </w:rPr>
+        <w:t xml:space="preserve">):</w:t>
+      </w:r>
+      <w:r>
+        <w:t xml:space="preserve"> </w:t>
+      </w:r>
+      <w:r>
+        <w:rPr>
+          <w:rStyle w:val="VerbatimChar"/>
+        </w:rPr>
+        <w:t xml:space="preserve">verify_output()</w:t>
+      </w:r>
+      <w:r>
+        <w:t xml:space="preserve"> </w:t>
+      </w:r>
+      <w:r>
+        <w:t xml:space="preserve">과정에서 전체 정답 디렉터리가 에이전트 워크스페이스 내부로 복사되어 후속 아암으로 정답이 누설될 수 있는 경로를</w:t>
+      </w:r>
+      <w:r>
+        <w:t xml:space="preserve"> </w:t>
+      </w:r>
+      <w:r>
+        <w:rPr>
+          <w:b/>
+          <w:bCs/>
+        </w:rPr>
+        <w:t xml:space="preserve">독립된 감독자 코드 감사 및 격리 단위테스트(</w:t>
+      </w:r>
+      <w:r>
+        <w:rPr>
+          <w:rStyle w:val="VerbatimChar"/>
+          <w:b/>
+          <w:bCs/>
+        </w:rPr>
+        <w:t xml:space="preserve">test_t1.py</w:t>
+      </w:r>
+      <w:r>
+        <w:rPr>
+          <w:b/>
+          <w:bCs/>
+        </w:rPr>
+        <w:t xml:space="preserve">)</w:t>
+      </w:r>
+      <w:r>
+        <w:t xml:space="preserve">가 적발하여, 워크스페이스 외부 임시 디렉터리 채점 및 단일 gold 파일 선별 복사로 완전 차단했다.</w:t>
+      </w:r>
+    </w:p>
+    <w:bookmarkEnd w:id="93"/>
+    <w:bookmarkStart w:id="94" w:name="자기참조self-reference와-독립성-완화-장치"/>
+    <w:p>
+      <w:pPr>
+        <w:pStyle w:val="Heading2"/>
+      </w:pPr>
+      <w:r>
+        <w:t xml:space="preserve">2. 자기참조(Self-Reference)와 독립성 완화 장치</w:t>
+      </w:r>
+    </w:p>
+    <w:p>
+      <w:pPr>
+        <w:pStyle w:val="FirstParagraph"/>
+      </w:pPr>
+      <w:r>
+        <w:t xml:space="preserve">본 논문의 연구 주체는 연구 대상인 자율 연구 하네스 위에서 구동되는 에이전트 세션이다.</w:t>
+      </w:r>
+      <w:r>
+        <w:t xml:space="preserve"> </w:t>
+      </w:r>
+      <w:r>
+        <w:t xml:space="preserve">이러한 자기참조적 순환성(circularity)은 연구의 독립성과 객관성에 중대한 방법론적 위협이 될 수 있음을 먼저 인정한다.</w:t>
+      </w:r>
+      <w:r>
+        <w:t xml:space="preserve"> </w:t>
+      </w:r>
+      <w:r>
+        <w:t xml:space="preserve">하네스가 자기 자신의 결함을 잡았다는 사실 역시 에이전트의 자기보고(self-report)에만 의존한다면 순환 논증에 빠질 수 있다.</w:t>
+      </w:r>
+      <w:r>
+        <w:t xml:space="preserve"> </w:t>
+      </w:r>
+      <w:r>
+        <w:t xml:space="preserve">본 연구는 이 위협을 완화하기 위해 다음 세 가지 구조적 장치를 강제하였다:</w:t>
+      </w:r>
+      <w:r>
+        <w:t xml:space="preserve"> </w:t>
+      </w:r>
+      <w:r>
+        <w:t xml:space="preserve">-</w:t>
+      </w:r>
+      <w:r>
+        <w:t xml:space="preserve"> </w:t>
+      </w:r>
+      <w:r>
+        <w:rPr>
+          <w:b/>
+          <w:bCs/>
+        </w:rPr>
+        <w:t xml:space="preserve">감독자 검토의 별도 계층 분리:</w:t>
+      </w:r>
+      <w:r>
+        <w:t xml:space="preserve"> </w:t>
+      </w:r>
+      <w:r>
+        <w:t xml:space="preserve">에이전트 실행 세션과 완전히 독립된 외부 감독자 계층이 커밋 바이트와 물리적 파일을 직접 감사하며, 상기 사건 3과 사건 4를 감독자가 직접 적발하였다.</w:t>
+      </w:r>
+      <w:r>
+        <w:t xml:space="preserve"> </w:t>
+      </w:r>
+      <w:r>
+        <w:t xml:space="preserve">-</w:t>
+      </w:r>
+      <w:r>
+        <w:t xml:space="preserve"> </w:t>
+      </w:r>
+      <w:r>
+        <w:rPr>
+          <w:b/>
+          <w:bCs/>
+        </w:rPr>
+        <w:t xml:space="preserve">사전등록 불변 봉인 (Preregistration Seal):</w:t>
+      </w:r>
+      <w:r>
+        <w:t xml:space="preserve"> </w:t>
+      </w:r>
+      <w:r>
+        <w:t xml:space="preserve">가설, 아암 코드, 채점 스크립트의 SHA-256을 데이터 관측 전에 프로토콜에 영구 봉인하여 사후적 편향과 유리한 서술 변경을 원천 차단했다.</w:t>
+      </w:r>
+      <w:r>
+        <w:t xml:space="preserve"> </w:t>
+      </w:r>
+      <w:r>
+        <w:t xml:space="preserve">-</w:t>
+      </w:r>
+      <w:r>
+        <w:t xml:space="preserve"> </w:t>
+      </w:r>
+      <w:r>
+        <w:rPr>
+          <w:b/>
+          <w:bCs/>
+        </w:rPr>
+        <w:t xml:space="preserve">물리적 영수증 실재 검사:</w:t>
+      </w:r>
+      <w:r>
+        <w:t xml:space="preserve"> </w:t>
+      </w:r>
+      <w:r>
+        <w:t xml:space="preserve">에이전트의 텍스트 주장을 일체 배제하고, 디스크 상에 실제 존재하는 JSON 실행 영수증과 트랜스크립트 파일의 존재만을 결과의 인정 근거로 삼는다.</w:t>
+      </w:r>
+    </w:p>
+    <w:bookmarkEnd w:id="94"/>
+    <w:bookmarkStart w:id="95" w:name="구성-타당도-한계와-벤치마크-배제-사유"/>
+    <w:p>
+      <w:pPr>
+        <w:pStyle w:val="Heading2"/>
+      </w:pPr>
+      <w:r>
+        <w:t xml:space="preserve">3. 구성 타당도 한계와 벤치마크 배제 사유</w:t>
+      </w:r>
+    </w:p>
+    <w:p>
+      <w:pPr>
+        <w:pStyle w:val="FirstParagraph"/>
+      </w:pPr>
+      <w:r>
+        <w:t xml:space="preserve">해커톤의 궁극적 목표는 연구 라이프사이클 전 단계에 에이전트를 배치하는 것이나, 본 연구가 채택한 실험 과제(T3 합성 최적화, T1’ ScienceAgentBench 코드 생성)는 주로 데이터 분석 및 모델링 단계에 집중되어 있다. 연구 전 주기를 포괄하는 선행 벤치마크들이 존재하나, 본 연구가 이를 배제한 사유는 명확하다:</w:t>
+      </w:r>
+      <w:r>
+        <w:t xml:space="preserve"> </w:t>
+      </w:r>
+      <w:r>
+        <w:t xml:space="preserve">-</w:t>
+      </w:r>
+      <w:r>
+        <w:t xml:space="preserve"> </w:t>
+      </w:r>
+      <w:r>
+        <w:rPr>
+          <w:b/>
+          <w:bCs/>
+        </w:rPr>
+        <w:t xml:space="preserve">DiscoveryBench (가설 발견) 및 PaperBench (전주기 재현):</w:t>
+      </w:r>
+      <w:r>
+        <w:t xml:space="preserve"> </w:t>
+      </w:r>
+      <w:r>
+        <w:t xml:space="preserve">종점 판정이 대규모 언어모델(LLM-as-a-judge)에 전적으로 의존하여 채점 도구 자체의 오판율과 편향이 실험 효과를 압도함.</w:t>
+      </w:r>
+      <w:r>
+        <w:t xml:space="preserve"> </w:t>
+      </w:r>
+      <w:r>
+        <w:t xml:space="preserve">-</w:t>
+      </w:r>
+      <w:r>
+        <w:t xml:space="preserve"> </w:t>
+      </w:r>
+      <w:r>
+        <w:rPr>
+          <w:b/>
+          <w:bCs/>
+        </w:rPr>
+        <w:t xml:space="preserve">ResearchClawBench (연구 자동화):</w:t>
+      </w:r>
+      <w:r>
+        <w:t xml:space="preserve"> </w:t>
+      </w:r>
+      <w:r>
+        <w:t xml:space="preserve">공식 검증기가 GPT-4 기반 루브릭 판정기(</w:t>
+      </w:r>
+      <w:r>
+        <w:rPr>
+          <w:rStyle w:val="VerbatimChar"/>
+        </w:rPr>
+        <w:t xml:space="preserve">score.py</w:t>
+      </w:r>
+      <w:r>
+        <w:t xml:space="preserve">)로 구현되어 결정론적 판정이 불가능함.</w:t>
+      </w:r>
+      <w:r>
+        <w:t xml:space="preserve"> </w:t>
+      </w:r>
+      <w:r>
+        <w:t xml:space="preserve">-</w:t>
+      </w:r>
+      <w:r>
+        <w:t xml:space="preserve"> </w:t>
+      </w:r>
+      <w:r>
+        <w:rPr>
+          <w:b/>
+          <w:bCs/>
+        </w:rPr>
+        <w:t xml:space="preserve">CORE-Bench (계산 재현성):</w:t>
+      </w:r>
+      <w:r>
+        <w:t xml:space="preserve"> </w:t>
+      </w:r>
+      <w:r>
+        <w:t xml:space="preserve">캡슐당 최대 10GB 및 장시간 실행 요구로 인프라 및 단가 통제 범위 초과.</w:t>
+      </w:r>
+    </w:p>
+    <w:p>
+      <w:pPr>
+        <w:pStyle w:val="BodyText"/>
+      </w:pPr>
+      <w:r>
+        <w:t xml:space="preserve">본 연구는 이러한 구성 타당도 한계를 인정하며, 주관적 평가를 배제할 수 있는</w:t>
+      </w:r>
+      <w:r>
+        <w:t xml:space="preserve"> </w:t>
+      </w:r>
+      <w:r>
+        <w:rPr>
+          <w:b/>
+          <w:bCs/>
+        </w:rPr>
+        <w:t xml:space="preserve">결정론적 프로그램 기반 검증기(deterministic programmatic verifier)</w:t>
+      </w:r>
+      <w:r>
+        <w:t xml:space="preserve">만을 엄격히 채택했다.</w:t>
+      </w:r>
+    </w:p>
+    <w:bookmarkEnd w:id="95"/>
+    <w:bookmarkStart w:id="96" w:name="선행-연구와의-대비-자동-설계-탐색-대vs-사전등록된-통제-절제"/>
+    <w:p>
+      <w:pPr>
+        <w:pStyle w:val="Heading2"/>
+      </w:pPr>
+      <w:r>
+        <w:t xml:space="preserve">4. 선행 연구와의 대비: 자동 설계 탐색 대(vs) 사전등록된 통제 절제</w:t>
+      </w:r>
+    </w:p>
+    <w:p>
+      <w:pPr>
+        <w:pStyle w:val="FirstParagraph"/>
+      </w:pPr>
+      <w:r>
+        <w:t xml:space="preserve">최근의 에이전트 하네스 연구(ADAS, AFlow, AgentSquare 등)는 광범위한 하네스 설계 공간을 유전 알고리즘이나 MCTS를 통해 자동 탐색한다. 본 연구는 이와 대조적인</w:t>
+      </w:r>
+      <w:r>
+        <w:t xml:space="preserve"> </w:t>
+      </w:r>
+      <w:r>
+        <w:rPr>
+          <w:b/>
+          <w:bCs/>
+        </w:rPr>
+        <w:t xml:space="preserve">사전등록 기반의 통제된 단일 차이 절제(controlled single-difference ablation)</w:t>
+      </w:r>
+      <w:r>
+        <w:t xml:space="preserve"> </w:t>
+      </w:r>
+      <w:r>
+        <w:t xml:space="preserve">접근을 취한다:</w:t>
+      </w:r>
+    </w:p>
+    <w:tbl>
+      <w:tblPr>
+        <w:tblStyle w:val="Table"/>
+        <w:tblW w:type="pct" w:w="5000"/>
+        <w:tblLayout w:type="fixed"/>
+        <w:tblLook w:firstRow="1" w:lastRow="0" w:firstColumn="0" w:lastColumn="0" w:noHBand="0" w:noVBand="0" w:val="0020"/>
+      </w:tblPr>
+      <w:tblGrid>
+        <w:gridCol w:w="2640"/>
+        <w:gridCol w:w="2640"/>
+        <w:gridCol w:w="2640"/>
+      </w:tblGrid>
+      <w:tr>
+        <w:trPr>
+          <w:tblHeader w:val="on"/>
+        </w:trPr>
+        <w:tc>
+          <w:tcPr/>
+          <w:p>
+            <w:pPr>
+              <w:pStyle w:val="Compact"/>
+            </w:pPr>
+            <w:r>
+              <w:t xml:space="preserve">비교 축</w:t>
+            </w:r>
+          </w:p>
+        </w:tc>
+        <w:tc>
+          <w:tcPr/>
+          <w:p>
+            <w:pPr>
+              <w:pStyle w:val="Compact"/>
+            </w:pPr>
+            <w:r>
+              <w:t xml:space="preserve">자동 설계 탐색 (ADAS / AFlow / AgentSquare)</w:t>
+            </w:r>
+          </w:p>
+        </w:tc>
+        <w:tc>
+          <w:tcPr/>
+          <w:p>
+            <w:pPr>
+              <w:pStyle w:val="Compact"/>
+            </w:pPr>
+            <w:r>
+              <w:t xml:space="preserve">본 연구의 사전등록 절제 연구 (ARGO Study B)</w:t>
+            </w:r>
+          </w:p>
+        </w:tc>
+      </w:tr>
+      <w:tr>
+        <w:tc>
+          <w:tcPr/>
+          <w:p>
+            <w:pPr>
+              <w:pStyle w:val="Compact"/>
+            </w:pPr>
+            <w:r>
+              <w:rPr>
+                <w:b/>
+                <w:bCs/>
+              </w:rPr>
+              <w:t xml:space="preserve">설계 목표</w:t>
+            </w:r>
+          </w:p>
+        </w:tc>
+        <w:tc>
+          <w:tcPr/>
+          <w:p>
+            <w:pPr>
+              <w:pStyle w:val="Compact"/>
+            </w:pPr>
+            <w:r>
+              <w:t xml:space="preserve">특정 벤치마크에 대한 에이전트 구조의 자동 최적화</w:t>
+            </w:r>
+          </w:p>
+        </w:tc>
+        <w:tc>
+          <w:tcPr/>
+          <w:p>
+            <w:pPr>
+              <w:pStyle w:val="Compact"/>
+            </w:pPr>
+            <w:r>
+              <w:t xml:space="preserve">개별 하네스 구성요소의 인과적 분산 축소 효과 규명</w:t>
+            </w:r>
+          </w:p>
+        </w:tc>
+      </w:tr>
+      <w:tr>
+        <w:tc>
+          <w:tcPr/>
+          <w:p>
+            <w:pPr>
+              <w:pStyle w:val="Compact"/>
+            </w:pPr>
+            <w:r>
+              <w:rPr>
+                <w:b/>
+                <w:bCs/>
+              </w:rPr>
+              <w:t xml:space="preserve">방법론</w:t>
+            </w:r>
+          </w:p>
+        </w:tc>
+        <w:tc>
+          <w:tcPr/>
+          <w:p>
+            <w:pPr>
+              <w:pStyle w:val="Compact"/>
+            </w:pPr>
+            <w:r>
+              <w:t xml:space="preserve">탐색적 검색 (Exploratory Search / AutoML)</w:t>
+            </w:r>
+          </w:p>
+        </w:tc>
+        <w:tc>
+          <w:tcPr/>
+          <w:p>
+            <w:pPr>
+              <w:pStyle w:val="Compact"/>
+            </w:pPr>
+            <w:r>
+              <w:t xml:space="preserve">확증적 가설 검정 (Confirmatory Hypothesis Testing)</w:t>
+            </w:r>
+          </w:p>
+        </w:tc>
+      </w:tr>
+      <w:tr>
+        <w:tc>
+          <w:tcPr/>
+          <w:p>
+            <w:pPr>
+              <w:pStyle w:val="Compact"/>
+            </w:pPr>
+            <w:r>
+              <w:rPr>
+                <w:b/>
+                <w:bCs/>
+              </w:rPr>
+              <w:t xml:space="preserve">비용 및 계산량</w:t>
+            </w:r>
+          </w:p>
+        </w:tc>
+        <w:tc>
+          <w:tcPr/>
+          <w:p>
+            <w:pPr>
+              <w:pStyle w:val="Compact"/>
+            </w:pPr>
+            <w:r>
+              <w:t xml:space="preserve">수백~수천 회 에피소드 소비 (고비용)</w:t>
+            </w:r>
+          </w:p>
+        </w:tc>
+        <w:tc>
+          <w:tcPr/>
+          <w:p>
+            <w:pPr>
+              <w:pStyle w:val="Compact"/>
+            </w:pPr>
+            <w:r>
+              <w:t xml:space="preserve">검정력 계산에 기반한 최소 표본 사전등록 (예산 제약)</w:t>
+            </w:r>
+          </w:p>
+        </w:tc>
+      </w:tr>
+      <w:tr>
+        <w:tc>
+          <w:tcPr/>
+          <w:p>
+            <w:pPr>
+              <w:pStyle w:val="Compact"/>
+            </w:pPr>
+            <w:r>
+              <w:rPr>
+                <w:b/>
+                <w:bCs/>
+              </w:rPr>
+              <w:t xml:space="preserve">반증 가능성</w:t>
+            </w:r>
+          </w:p>
+        </w:tc>
+        <w:tc>
+          <w:tcPr/>
+          <w:p>
+            <w:pPr>
+              <w:pStyle w:val="Compact"/>
+            </w:pPr>
+            <w:r>
+              <w:t xml:space="preserve">우수 변형 사후 선별 (선택 편향 및 과적합 위험)</w:t>
+            </w:r>
+          </w:p>
+        </w:tc>
+        <w:tc>
+          <w:tcPr/>
+          <w:p>
+            <w:pPr>
+              <w:pStyle w:val="Compact"/>
+            </w:pPr>
+            <w:r>
+              <w:t xml:space="preserve">실패 우선(failing-first) 영수증 및 사전 임계값 등록</w:t>
+            </w:r>
+          </w:p>
+        </w:tc>
+      </w:tr>
+      <w:tr>
+        <w:tc>
+          <w:tcPr/>
+          <w:p>
+            <w:pPr>
+              <w:pStyle w:val="Compact"/>
+            </w:pPr>
+            <w:r>
+              <w:rPr>
+                <w:b/>
+                <w:bCs/>
+              </w:rPr>
+              <w:t xml:space="preserve">적합한 연구 조건</w:t>
+            </w:r>
+          </w:p>
+        </w:tc>
+        <w:tc>
+          <w:tcPr/>
+          <w:p>
+            <w:pPr>
+              <w:pStyle w:val="Compact"/>
+            </w:pPr>
+            <w:r>
+              <w:t xml:space="preserve">탐색적 프로토타이핑 및 상한 성능 달성 목적</w:t>
+            </w:r>
+          </w:p>
+        </w:tc>
+        <w:tc>
+          <w:tcPr/>
+          <w:p>
+            <w:pPr>
+              <w:pStyle w:val="Compact"/>
+            </w:pPr>
+            <w:r>
+              <w:t xml:space="preserve">하네스 구성요소의 신뢰성 검증 및 재현성 감사 목적</w:t>
+            </w:r>
+          </w:p>
+        </w:tc>
+      </w:tr>
+    </w:tbl>
     <w:bookmarkEnd w:id="96"/>
+    <w:bookmarkStart w:id="97" w:name="프로토타입-설계-지침과-남은-과제"/>
+    <w:p>
+      <w:pPr>
+        <w:pStyle w:val="Heading2"/>
+      </w:pPr>
+      <w:r>
+        <w:t xml:space="preserve">5. 프로토타입 설계 지침과 남은 과제</w:t>
+      </w:r>
+    </w:p>
+    <w:p>
+      <w:pPr>
+        <w:pStyle w:val="FirstParagraph"/>
+      </w:pPr>
+      <w:r>
+        <w:t xml:space="preserve">본 연구가 도출한 argo 프로토타입 설계 명세(</w:t>
+      </w:r>
+      <w:r>
+        <w:rPr>
+          <w:rStyle w:val="VerbatimChar"/>
+        </w:rPr>
+        <w:t xml:space="preserve">paper/hackathon/prototype-spec.md</w:t>
+      </w:r>
+      <w:r>
+        <w:t xml:space="preserve">)는 6대 설계 결정 중 2건이 실험 영수증, 2건이 선행 문헌 및 내부 감사에 의해 뒷받침되며, 1건의 보류(반증 루프)와 1건의</w:t>
+      </w:r>
+      <w:r>
+        <w:t xml:space="preserve"> </w:t>
+      </w:r>
+      <w:r>
+        <w:t xml:space="preserve">‘근거 없는 기본값’</w:t>
+      </w:r>
+      <w:r>
+        <w:t xml:space="preserve">(결과 주도 동적 검색)을 투명하게 안고 있다. 이러한 근거 없는 영역을 솔직하게 드러내는 계측 규율이야말로 향후 자율 연구 에이전트가 신뢰성 있는 과학적 지식을 축적하기 위한 기초 토대가 될 것이다.</w:t>
+      </w:r>
+    </w:p>
     <w:bookmarkEnd w:id="97"/>
-    <w:bookmarkStart w:id="258" w:name="참-고-문-헌-references"/>
+    <w:bookmarkEnd w:id="98"/>
+    <w:bookmarkStart w:id="259" w:name="참-고-문-헌-references"/>
     <w:p>
       <w:pPr>
         <w:pStyle w:val="Heading1"/>
@@ -7687,8 +8251,8 @@
         <w:t xml:space="preserve">참 고 문 헌 (References)</w:t>
       </w:r>
     </w:p>
-    <w:bookmarkStart w:id="257" w:name="refs"/>
-    <w:bookmarkStart w:id="99" w:name="ref-react2023"/>
+    <w:bookmarkStart w:id="258" w:name="refs"/>
+    <w:bookmarkStart w:id="100" w:name="ref-react2023"/>
     <w:p>
       <w:pPr>
         <w:pStyle w:val="Bibliography"/>
@@ -7717,7 +8281,7 @@
       <w:r>
         <w:t xml:space="preserve"> </w:t>
       </w:r>
-      <w:hyperlink r:id="rId98">
+      <w:hyperlink r:id="rId99">
         <w:r>
           <w:rPr>
             <w:rStyle w:val="Hyperlink"/>
@@ -7726,8 +8290,8 @@
         </w:r>
       </w:hyperlink>
     </w:p>
-    <w:bookmarkEnd w:id="99"/>
-    <w:bookmarkStart w:id="101" w:name="ref-memgpt2023"/>
+    <w:bookmarkEnd w:id="100"/>
+    <w:bookmarkStart w:id="102" w:name="ref-memgpt2023"/>
     <w:p>
       <w:pPr>
         <w:pStyle w:val="Bibliography"/>
@@ -7756,7 +8320,7 @@
       <w:r>
         <w:t xml:space="preserve"> </w:t>
       </w:r>
-      <w:hyperlink r:id="rId100">
+      <w:hyperlink r:id="rId101">
         <w:r>
           <w:rPr>
             <w:rStyle w:val="Hyperlink"/>
@@ -7765,8 +8329,8 @@
         </w:r>
       </w:hyperlink>
     </w:p>
-    <w:bookmarkEnd w:id="101"/>
-    <w:bookmarkStart w:id="103" w:name="ref-rlm2025"/>
+    <w:bookmarkEnd w:id="102"/>
+    <w:bookmarkStart w:id="104" w:name="ref-rlm2025"/>
     <w:p>
       <w:pPr>
         <w:pStyle w:val="Bibliography"/>
@@ -7795,7 +8359,7 @@
       <w:r>
         <w:t xml:space="preserve"> </w:t>
       </w:r>
-      <w:hyperlink r:id="rId102">
+      <w:hyperlink r:id="rId103">
         <w:r>
           <w:rPr>
             <w:rStyle w:val="Hyperlink"/>
@@ -7804,8 +8368,8 @@
         </w:r>
       </w:hyperlink>
     </w:p>
-    <w:bookmarkEnd w:id="103"/>
-    <w:bookmarkStart w:id="105" w:name="ref-autogen2023"/>
+    <w:bookmarkEnd w:id="104"/>
+    <w:bookmarkStart w:id="106" w:name="ref-autogen2023"/>
     <w:p>
       <w:pPr>
         <w:pStyle w:val="Bibliography"/>
@@ -7834,7 +8398,7 @@
       <w:r>
         <w:t xml:space="preserve"> </w:t>
       </w:r>
-      <w:hyperlink r:id="rId104">
+      <w:hyperlink r:id="rId105">
         <w:r>
           <w:rPr>
             <w:rStyle w:val="Hyperlink"/>
@@ -7843,8 +8407,8 @@
         </w:r>
       </w:hyperlink>
     </w:p>
-    <w:bookmarkEnd w:id="105"/>
-    <w:bookmarkStart w:id="107" w:name="ref-genaimeasurement2025"/>
+    <w:bookmarkEnd w:id="106"/>
+    <w:bookmarkStart w:id="108" w:name="ref-genaimeasurement2025"/>
     <w:p>
       <w:pPr>
         <w:pStyle w:val="Bibliography"/>
@@ -7873,7 +8437,7 @@
       <w:r>
         <w:t xml:space="preserve"> </w:t>
       </w:r>
-      <w:hyperlink r:id="rId106">
+      <w:hyperlink r:id="rId107">
         <w:r>
           <w:rPr>
             <w:rStyle w:val="Hyperlink"/>
@@ -7882,8 +8446,8 @@
         </w:r>
       </w:hyperlink>
     </w:p>
-    <w:bookmarkEnd w:id="107"/>
-    <w:bookmarkStart w:id="109" w:name="ref-whogrades2026"/>
+    <w:bookmarkEnd w:id="108"/>
+    <w:bookmarkStart w:id="110" w:name="ref-whogrades2026"/>
     <w:p>
       <w:pPr>
         <w:pStyle w:val="Bibliography"/>
@@ -7912,7 +8476,7 @@
       <w:r>
         <w:t xml:space="preserve"> </w:t>
       </w:r>
-      <w:hyperlink r:id="rId108">
+      <w:hyperlink r:id="rId109">
         <w:r>
           <w:rPr>
             <w:rStyle w:val="Hyperlink"/>
@@ -7921,8 +8485,8 @@
         </w:r>
       </w:hyperlink>
     </w:p>
-    <w:bookmarkEnd w:id="109"/>
-    <w:bookmarkStart w:id="111" w:name="ref-verifiergap2026"/>
+    <w:bookmarkEnd w:id="110"/>
+    <w:bookmarkStart w:id="112" w:name="ref-verifiergap2026"/>
     <w:p>
       <w:pPr>
         <w:pStyle w:val="Bibliography"/>
@@ -7951,7 +8515,7 @@
       <w:r>
         <w:t xml:space="preserve"> </w:t>
       </w:r>
-      <w:hyperlink r:id="rId110">
+      <w:hyperlink r:id="rId111">
         <w:r>
           <w:rPr>
             <w:rStyle w:val="Hyperlink"/>
@@ -7960,8 +8524,8 @@
         </w:r>
       </w:hyperlink>
     </w:p>
-    <w:bookmarkEnd w:id="111"/>
-    <w:bookmarkStart w:id="113" w:name="ref-harnesstamper2026"/>
+    <w:bookmarkEnd w:id="112"/>
+    <w:bookmarkStart w:id="114" w:name="ref-harnesstamper2026"/>
     <w:p>
       <w:pPr>
         <w:pStyle w:val="Bibliography"/>
@@ -7990,7 +8554,7 @@
       <w:r>
         <w:t xml:space="preserve"> </w:t>
       </w:r>
-      <w:hyperlink r:id="rId112">
+      <w:hyperlink r:id="rId113">
         <w:r>
           <w:rPr>
             <w:rStyle w:val="Hyperlink"/>
@@ -7999,8 +8563,8 @@
         </w:r>
       </w:hyperlink>
     </w:p>
-    <w:bookmarkEnd w:id="113"/>
-    <w:bookmarkStart w:id="115" w:name="ref-auditablewriting2026"/>
+    <w:bookmarkEnd w:id="114"/>
+    <w:bookmarkStart w:id="116" w:name="ref-auditablewriting2026"/>
     <w:p>
       <w:pPr>
         <w:pStyle w:val="Bibliography"/>
@@ -8029,7 +8593,7 @@
       <w:r>
         <w:t xml:space="preserve"> </w:t>
       </w:r>
-      <w:hyperlink r:id="rId114">
+      <w:hyperlink r:id="rId115">
         <w:r>
           <w:rPr>
             <w:rStyle w:val="Hyperlink"/>
@@ -8038,8 +8602,8 @@
         </w:r>
       </w:hyperlink>
     </w:p>
-    <w:bookmarkEnd w:id="115"/>
-    <w:bookmarkStart w:id="117" w:name="ref-reflexion2023"/>
+    <w:bookmarkEnd w:id="116"/>
+    <w:bookmarkStart w:id="118" w:name="ref-reflexion2023"/>
     <w:p>
       <w:pPr>
         <w:pStyle w:val="Bibliography"/>
@@ -8068,7 +8632,7 @@
       <w:r>
         <w:t xml:space="preserve"> </w:t>
       </w:r>
-      <w:hyperlink r:id="rId116">
+      <w:hyperlink r:id="rId117">
         <w:r>
           <w:rPr>
             <w:rStyle w:val="Hyperlink"/>
@@ -8077,8 +8641,8 @@
         </w:r>
       </w:hyperlink>
     </w:p>
-    <w:bookmarkEnd w:id="117"/>
-    <w:bookmarkStart w:id="119" w:name="ref-rag2020"/>
+    <w:bookmarkEnd w:id="118"/>
+    <w:bookmarkStart w:id="120" w:name="ref-rag2020"/>
     <w:p>
       <w:pPr>
         <w:pStyle w:val="Bibliography"/>
@@ -8107,7 +8671,7 @@
       <w:r>
         <w:t xml:space="preserve"> </w:t>
       </w:r>
-      <w:hyperlink r:id="rId118">
+      <w:hyperlink r:id="rId119">
         <w:r>
           <w:rPr>
             <w:rStyle w:val="Hyperlink"/>
@@ -8116,8 +8680,8 @@
         </w:r>
       </w:hyperlink>
     </w:p>
-    <w:bookmarkEnd w:id="119"/>
-    <w:bookmarkStart w:id="121" w:name="ref-codeharness2026"/>
+    <w:bookmarkEnd w:id="120"/>
+    <w:bookmarkStart w:id="122" w:name="ref-codeharness2026"/>
     <w:p>
       <w:pPr>
         <w:pStyle w:val="Bibliography"/>
@@ -8149,7 +8713,7 @@
       <w:r>
         <w:t xml:space="preserve"> </w:t>
       </w:r>
-      <w:hyperlink r:id="rId120">
+      <w:hyperlink r:id="rId121">
         <w:r>
           <w:rPr>
             <w:rStyle w:val="Hyperlink"/>
@@ -8158,8 +8722,8 @@
         </w:r>
       </w:hyperlink>
     </w:p>
-    <w:bookmarkEnd w:id="121"/>
-    <w:bookmarkStart w:id="123" w:name="ref-dive2026"/>
+    <w:bookmarkEnd w:id="122"/>
+    <w:bookmarkStart w:id="124" w:name="ref-dive2026"/>
     <w:p>
       <w:pPr>
         <w:pStyle w:val="Bibliography"/>
@@ -8188,7 +8752,7 @@
       <w:r>
         <w:t xml:space="preserve"> </w:t>
       </w:r>
-      <w:hyperlink r:id="rId122">
+      <w:hyperlink r:id="rId123">
         <w:r>
           <w:rPr>
             <w:rStyle w:val="Hyperlink"/>
@@ -8197,8 +8761,8 @@
         </w:r>
       </w:hyperlink>
     </w:p>
-    <w:bookmarkEnd w:id="123"/>
-    <w:bookmarkStart w:id="125" w:name="ref-longhorizon2026"/>
+    <w:bookmarkEnd w:id="124"/>
+    <w:bookmarkStart w:id="126" w:name="ref-longhorizon2026"/>
     <w:p>
       <w:pPr>
         <w:pStyle w:val="Bibliography"/>
@@ -8227,7 +8791,7 @@
       <w:r>
         <w:t xml:space="preserve"> </w:t>
       </w:r>
-      <w:hyperlink r:id="rId124">
+      <w:hyperlink r:id="rId125">
         <w:r>
           <w:rPr>
             <w:rStyle w:val="Hyperlink"/>
@@ -8236,8 +8800,8 @@
         </w:r>
       </w:hyperlink>
     </w:p>
-    <w:bookmarkEnd w:id="125"/>
-    <w:bookmarkStart w:id="127" w:name="ref-loopsbench2026"/>
+    <w:bookmarkEnd w:id="126"/>
+    <w:bookmarkStart w:id="128" w:name="ref-loopsbench2026"/>
     <w:p>
       <w:pPr>
         <w:pStyle w:val="Bibliography"/>
@@ -8269,7 +8833,7 @@
       <w:r>
         <w:t xml:space="preserve"> </w:t>
       </w:r>
-      <w:hyperlink r:id="rId126">
+      <w:hyperlink r:id="rId127">
         <w:r>
           <w:rPr>
             <w:rStyle w:val="Hyperlink"/>
@@ -8278,8 +8842,8 @@
         </w:r>
       </w:hyperlink>
     </w:p>
-    <w:bookmarkEnd w:id="127"/>
-    <w:bookmarkStart w:id="129" w:name="ref-scroll2026"/>
+    <w:bookmarkEnd w:id="128"/>
+    <w:bookmarkStart w:id="130" w:name="ref-scroll2026"/>
     <w:p>
       <w:pPr>
         <w:pStyle w:val="Bibliography"/>
@@ -8308,7 +8872,7 @@
       <w:r>
         <w:t xml:space="preserve"> </w:t>
       </w:r>
-      <w:hyperlink r:id="rId128">
+      <w:hyperlink r:id="rId129">
         <w:r>
           <w:rPr>
             <w:rStyle w:val="Hyperlink"/>
@@ -8317,8 +8881,8 @@
         </w:r>
       </w:hyperlink>
     </w:p>
-    <w:bookmarkEnd w:id="129"/>
-    <w:bookmarkStart w:id="131" w:name="ref-protocoltaxonomy2026"/>
+    <w:bookmarkEnd w:id="130"/>
+    <w:bookmarkStart w:id="132" w:name="ref-protocoltaxonomy2026"/>
     <w:p>
       <w:pPr>
         <w:pStyle w:val="Bibliography"/>
@@ -8347,7 +8911,7 @@
       <w:r>
         <w:t xml:space="preserve"> </w:t>
       </w:r>
-      <w:hyperlink r:id="rId130">
+      <w:hyperlink r:id="rId131">
         <w:r>
           <w:rPr>
             <w:rStyle w:val="Hyperlink"/>
@@ -8356,8 +8920,8 @@
         </w:r>
       </w:hyperlink>
     </w:p>
-    <w:bookmarkEnd w:id="131"/>
-    <w:bookmarkStart w:id="133" w:name="ref-chap2026"/>
+    <w:bookmarkEnd w:id="132"/>
+    <w:bookmarkStart w:id="134" w:name="ref-chap2026"/>
     <w:p>
       <w:pPr>
         <w:pStyle w:val="Bibliography"/>
@@ -8386,7 +8950,7 @@
       <w:r>
         <w:t xml:space="preserve"> </w:t>
       </w:r>
-      <w:hyperlink r:id="rId132">
+      <w:hyperlink r:id="rId133">
         <w:r>
           <w:rPr>
             <w:rStyle w:val="Hyperlink"/>
@@ -8395,8 +8959,8 @@
         </w:r>
       </w:hyperlink>
     </w:p>
-    <w:bookmarkEnd w:id="133"/>
-    <w:bookmarkStart w:id="135" w:name="ref-insemrag2026"/>
+    <w:bookmarkEnd w:id="134"/>
+    <w:bookmarkStart w:id="136" w:name="ref-insemrag2026"/>
     <w:p>
       <w:pPr>
         <w:pStyle w:val="Bibliography"/>
@@ -8428,7 +8992,7 @@
       <w:r>
         <w:t xml:space="preserve"> </w:t>
       </w:r>
-      <w:hyperlink r:id="rId134">
+      <w:hyperlink r:id="rId135">
         <w:r>
           <w:rPr>
             <w:rStyle w:val="Hyperlink"/>
@@ -8437,8 +9001,8 @@
         </w:r>
       </w:hyperlink>
     </w:p>
-    <w:bookmarkEnd w:id="135"/>
-    <w:bookmarkStart w:id="137" w:name="ref-sciret2026"/>
+    <w:bookmarkEnd w:id="136"/>
+    <w:bookmarkStart w:id="138" w:name="ref-sciret2026"/>
     <w:p>
       <w:pPr>
         <w:pStyle w:val="Bibliography"/>
@@ -8467,7 +9031,7 @@
       <w:r>
         <w:t xml:space="preserve"> </w:t>
       </w:r>
-      <w:hyperlink r:id="rId136">
+      <w:hyperlink r:id="rId137">
         <w:r>
           <w:rPr>
             <w:rStyle w:val="Hyperlink"/>
@@ -8476,8 +9040,8 @@
         </w:r>
       </w:hyperlink>
     </w:p>
-    <w:bookmarkEnd w:id="137"/>
-    <w:bookmarkStart w:id="139" w:name="ref-adaptiverag2026"/>
+    <w:bookmarkEnd w:id="138"/>
+    <w:bookmarkStart w:id="140" w:name="ref-adaptiverag2026"/>
     <w:p>
       <w:pPr>
         <w:pStyle w:val="Bibliography"/>
@@ -8506,7 +9070,7 @@
       <w:r>
         <w:t xml:space="preserve"> </w:t>
       </w:r>
-      <w:hyperlink r:id="rId138">
+      <w:hyperlink r:id="rId139">
         <w:r>
           <w:rPr>
             <w:rStyle w:val="Hyperlink"/>
@@ -8515,8 +9079,8 @@
         </w:r>
       </w:hyperlink>
     </w:p>
-    <w:bookmarkEnd w:id="139"/>
-    <w:bookmarkStart w:id="141" w:name="ref-llmrouter2026"/>
+    <w:bookmarkEnd w:id="140"/>
+    <w:bookmarkStart w:id="142" w:name="ref-llmrouter2026"/>
     <w:p>
       <w:pPr>
         <w:pStyle w:val="Bibliography"/>
@@ -8548,7 +9112,7 @@
       <w:r>
         <w:t xml:space="preserve"> </w:t>
       </w:r>
-      <w:hyperlink r:id="rId140">
+      <w:hyperlink r:id="rId141">
         <w:r>
           <w:rPr>
             <w:rStyle w:val="Hyperlink"/>
@@ -8557,8 +9121,8 @@
         </w:r>
       </w:hyperlink>
     </w:p>
-    <w:bookmarkEnd w:id="141"/>
-    <w:bookmarkStart w:id="143" w:name="ref-resamplereroute2026"/>
+    <w:bookmarkEnd w:id="142"/>
+    <w:bookmarkStart w:id="144" w:name="ref-resamplereroute2026"/>
     <w:p>
       <w:pPr>
         <w:pStyle w:val="Bibliography"/>
@@ -8587,7 +9151,7 @@
       <w:r>
         <w:t xml:space="preserve"> </w:t>
       </w:r>
-      <w:hyperlink r:id="rId142">
+      <w:hyperlink r:id="rId143">
         <w:r>
           <w:rPr>
             <w:rStyle w:val="Hyperlink"/>
@@ -8596,8 +9160,8 @@
         </w:r>
       </w:hyperlink>
     </w:p>
-    <w:bookmarkEnd w:id="143"/>
-    <w:bookmarkStart w:id="145" w:name="ref-controlledorchestration2026"/>
+    <w:bookmarkEnd w:id="144"/>
+    <w:bookmarkStart w:id="146" w:name="ref-controlledorchestration2026"/>
     <w:p>
       <w:pPr>
         <w:pStyle w:val="Bibliography"/>
@@ -8626,7 +9190,7 @@
       <w:r>
         <w:t xml:space="preserve"> </w:t>
       </w:r>
-      <w:hyperlink r:id="rId144">
+      <w:hyperlink r:id="rId145">
         <w:r>
           <w:rPr>
             <w:rStyle w:val="Hyperlink"/>
@@ -8635,8 +9199,8 @@
         </w:r>
       </w:hyperlink>
     </w:p>
-    <w:bookmarkEnd w:id="145"/>
-    <w:bookmarkStart w:id="147" w:name="ref-agora2026"/>
+    <w:bookmarkEnd w:id="146"/>
+    <w:bookmarkStart w:id="148" w:name="ref-agora2026"/>
     <w:p>
       <w:pPr>
         <w:pStyle w:val="Bibliography"/>
@@ -8665,7 +9229,7 @@
       <w:r>
         <w:t xml:space="preserve"> </w:t>
       </w:r>
-      <w:hyperlink r:id="rId146">
+      <w:hyperlink r:id="rId147">
         <w:r>
           <w:rPr>
             <w:rStyle w:val="Hyperlink"/>
@@ -8674,8 +9238,8 @@
         </w:r>
       </w:hyperlink>
     </w:p>
-    <w:bookmarkEnd w:id="147"/>
-    <w:bookmarkStart w:id="149" w:name="ref-aiscientist2024"/>
+    <w:bookmarkEnd w:id="148"/>
+    <w:bookmarkStart w:id="150" w:name="ref-aiscientist2024"/>
     <w:p>
       <w:pPr>
         <w:pStyle w:val="Bibliography"/>
@@ -8704,7 +9268,7 @@
       <w:r>
         <w:t xml:space="preserve"> </w:t>
       </w:r>
-      <w:hyperlink r:id="rId148">
+      <w:hyperlink r:id="rId149">
         <w:r>
           <w:rPr>
             <w:rStyle w:val="Hyperlink"/>
@@ -8713,8 +9277,8 @@
         </w:r>
       </w:hyperlink>
     </w:p>
-    <w:bookmarkEnd w:id="149"/>
-    <w:bookmarkStart w:id="151" w:name="ref-coscientist2025"/>
+    <w:bookmarkEnd w:id="150"/>
+    <w:bookmarkStart w:id="152" w:name="ref-coscientist2025"/>
     <w:p>
       <w:pPr>
         <w:pStyle w:val="Bibliography"/>
@@ -8746,7 +9310,7 @@
       <w:r>
         <w:t xml:space="preserve"> </w:t>
       </w:r>
-      <w:hyperlink r:id="rId150">
+      <w:hyperlink r:id="rId151">
         <w:r>
           <w:rPr>
             <w:rStyle w:val="Hyperlink"/>
@@ -8755,8 +9319,8 @@
         </w:r>
       </w:hyperlink>
     </w:p>
-    <w:bookmarkEnd w:id="151"/>
-    <w:bookmarkStart w:id="153" w:name="ref-sciagents2024"/>
+    <w:bookmarkEnd w:id="152"/>
+    <w:bookmarkStart w:id="154" w:name="ref-sciagents2024"/>
     <w:p>
       <w:pPr>
         <w:pStyle w:val="Bibliography"/>
@@ -8785,7 +9349,7 @@
       <w:r>
         <w:t xml:space="preserve"> </w:t>
       </w:r>
-      <w:hyperlink r:id="rId152">
+      <w:hyperlink r:id="rId153">
         <w:r>
           <w:rPr>
             <w:rStyle w:val="Hyperlink"/>
@@ -8794,8 +9358,8 @@
         </w:r>
       </w:hyperlink>
     </w:p>
-    <w:bookmarkEnd w:id="153"/>
-    <w:bookmarkStart w:id="155" w:name="ref-evigraph2026"/>
+    <w:bookmarkEnd w:id="154"/>
+    <w:bookmarkStart w:id="156" w:name="ref-evigraph2026"/>
     <w:p>
       <w:pPr>
         <w:pStyle w:val="Bibliography"/>
@@ -8824,7 +9388,7 @@
       <w:r>
         <w:t xml:space="preserve"> </w:t>
       </w:r>
-      <w:hyperlink r:id="rId154">
+      <w:hyperlink r:id="rId155">
         <w:r>
           <w:rPr>
             <w:rStyle w:val="Hyperlink"/>
@@ -8833,8 +9397,8 @@
         </w:r>
       </w:hyperlink>
     </w:p>
-    <w:bookmarkEnd w:id="155"/>
-    <w:bookmarkStart w:id="157" w:name="ref-xscientist2026"/>
+    <w:bookmarkEnd w:id="156"/>
+    <w:bookmarkStart w:id="158" w:name="ref-xscientist2026"/>
     <w:p>
       <w:pPr>
         <w:pStyle w:val="Bibliography"/>
@@ -8863,7 +9427,7 @@
       <w:r>
         <w:t xml:space="preserve"> </w:t>
       </w:r>
-      <w:hyperlink r:id="rId156">
+      <w:hyperlink r:id="rId157">
         <w:r>
           <w:rPr>
             <w:rStyle w:val="Hyperlink"/>
@@ -8872,8 +9436,8 @@
         </w:r>
       </w:hyperlink>
     </w:p>
-    <w:bookmarkEnd w:id="157"/>
-    <w:bookmarkStart w:id="159" w:name="ref-scientistone2026"/>
+    <w:bookmarkEnd w:id="158"/>
+    <w:bookmarkStart w:id="160" w:name="ref-scientistone2026"/>
     <w:p>
       <w:pPr>
         <w:pStyle w:val="Bibliography"/>
@@ -8902,7 +9466,7 @@
       <w:r>
         <w:t xml:space="preserve"> </w:t>
       </w:r>
-      <w:hyperlink r:id="rId158">
+      <w:hyperlink r:id="rId159">
         <w:r>
           <w:rPr>
             <w:rStyle w:val="Hyperlink"/>
@@ -8911,8 +9475,8 @@
         </w:r>
       </w:hyperlink>
     </w:p>
-    <w:bookmarkEnd w:id="159"/>
-    <w:bookmarkStart w:id="161" w:name="ref-scope2026"/>
+    <w:bookmarkEnd w:id="160"/>
+    <w:bookmarkStart w:id="162" w:name="ref-scope2026"/>
     <w:p>
       <w:pPr>
         <w:pStyle w:val="Bibliography"/>
@@ -8944,7 +9508,7 @@
       <w:r>
         <w:t xml:space="preserve"> </w:t>
       </w:r>
-      <w:hyperlink r:id="rId160">
+      <w:hyperlink r:id="rId161">
         <w:r>
           <w:rPr>
             <w:rStyle w:val="Hyperlink"/>
@@ -8953,8 +9517,8 @@
         </w:r>
       </w:hyperlink>
     </w:p>
-    <w:bookmarkEnd w:id="161"/>
-    <w:bookmarkStart w:id="163" w:name="ref-searchdiagnosis2026"/>
+    <w:bookmarkEnd w:id="162"/>
+    <w:bookmarkStart w:id="164" w:name="ref-searchdiagnosis2026"/>
     <w:p>
       <w:pPr>
         <w:pStyle w:val="Bibliography"/>
@@ -8983,7 +9547,7 @@
       <w:r>
         <w:t xml:space="preserve"> </w:t>
       </w:r>
-      <w:hyperlink r:id="rId162">
+      <w:hyperlink r:id="rId163">
         <w:r>
           <w:rPr>
             <w:rStyle w:val="Hyperlink"/>
@@ -8992,8 +9556,8 @@
         </w:r>
       </w:hyperlink>
     </w:p>
-    <w:bookmarkEnd w:id="163"/>
-    <w:bookmarkStart w:id="165" w:name="ref-researchclawbench2026"/>
+    <w:bookmarkEnd w:id="164"/>
+    <w:bookmarkStart w:id="166" w:name="ref-researchclawbench2026"/>
     <w:p>
       <w:pPr>
         <w:pStyle w:val="Bibliography"/>
@@ -9025,7 +9589,7 @@
       <w:r>
         <w:t xml:space="preserve"> </w:t>
       </w:r>
-      <w:hyperlink r:id="rId164">
+      <w:hyperlink r:id="rId165">
         <w:r>
           <w:rPr>
             <w:rStyle w:val="Hyperlink"/>
@@ -9034,8 +9598,8 @@
         </w:r>
       </w:hyperlink>
     </w:p>
-    <w:bookmarkEnd w:id="165"/>
-    <w:bookmarkStart w:id="167" w:name="ref-arbor2026"/>
+    <w:bookmarkEnd w:id="166"/>
+    <w:bookmarkStart w:id="168" w:name="ref-arbor2026"/>
     <w:p>
       <w:pPr>
         <w:pStyle w:val="Bibliography"/>
@@ -9067,7 +9631,7 @@
       <w:r>
         <w:t xml:space="preserve"> </w:t>
       </w:r>
-      <w:hyperlink r:id="rId166">
+      <w:hyperlink r:id="rId167">
         <w:r>
           <w:rPr>
             <w:rStyle w:val="Hyperlink"/>
@@ -9076,8 +9640,8 @@
         </w:r>
       </w:hyperlink>
     </w:p>
-    <w:bookmarkEnd w:id="167"/>
-    <w:bookmarkStart w:id="169" w:name="ref-hep2026"/>
+    <w:bookmarkEnd w:id="168"/>
+    <w:bookmarkStart w:id="170" w:name="ref-hep2026"/>
     <w:p>
       <w:pPr>
         <w:pStyle w:val="Bibliography"/>
@@ -9106,7 +9670,7 @@
       <w:r>
         <w:t xml:space="preserve"> </w:t>
       </w:r>
-      <w:hyperlink r:id="rId168">
+      <w:hyperlink r:id="rId169">
         <w:r>
           <w:rPr>
             <w:rStyle w:val="Hyperlink"/>
@@ -9115,8 +9679,8 @@
         </w:r>
       </w:hyperlink>
     </w:p>
-    <w:bookmarkEnd w:id="169"/>
-    <w:bookmarkStart w:id="171" w:name="ref-continual2026"/>
+    <w:bookmarkEnd w:id="170"/>
+    <w:bookmarkStart w:id="172" w:name="ref-continual2026"/>
     <w:p>
       <w:pPr>
         <w:pStyle w:val="Bibliography"/>
@@ -9145,7 +9709,7 @@
       <w:r>
         <w:t xml:space="preserve"> </w:t>
       </w:r>
-      <w:hyperlink r:id="rId170">
+      <w:hyperlink r:id="rId171">
         <w:r>
           <w:rPr>
             <w:rStyle w:val="Hyperlink"/>
@@ -9154,8 +9718,8 @@
         </w:r>
       </w:hyperlink>
     </w:p>
-    <w:bookmarkEnd w:id="171"/>
-    <w:bookmarkStart w:id="173" w:name="ref-rsea2026"/>
+    <w:bookmarkEnd w:id="172"/>
+    <w:bookmarkStart w:id="174" w:name="ref-rsea2026"/>
     <w:p>
       <w:pPr>
         <w:pStyle w:val="Bibliography"/>
@@ -9184,7 +9748,7 @@
       <w:r>
         <w:t xml:space="preserve"> </w:t>
       </w:r>
-      <w:hyperlink r:id="rId172">
+      <w:hyperlink r:id="rId173">
         <w:r>
           <w:rPr>
             <w:rStyle w:val="Hyperlink"/>
@@ -9193,8 +9757,8 @@
         </w:r>
       </w:hyperlink>
     </w:p>
-    <w:bookmarkEnd w:id="173"/>
-    <w:bookmarkStart w:id="175" w:name="ref-regimes2026"/>
+    <w:bookmarkEnd w:id="174"/>
+    <w:bookmarkStart w:id="176" w:name="ref-regimes2026"/>
     <w:p>
       <w:pPr>
         <w:pStyle w:val="Bibliography"/>
@@ -9223,7 +9787,7 @@
       <w:r>
         <w:t xml:space="preserve"> </w:t>
       </w:r>
-      <w:hyperlink r:id="rId174">
+      <w:hyperlink r:id="rId175">
         <w:r>
           <w:rPr>
             <w:rStyle w:val="Hyperlink"/>
@@ -9232,8 +9796,8 @@
         </w:r>
       </w:hyperlink>
     </w:p>
-    <w:bookmarkEnd w:id="175"/>
-    <w:bookmarkStart w:id="177" w:name="ref-autogenesis2026"/>
+    <w:bookmarkEnd w:id="176"/>
+    <w:bookmarkStart w:id="178" w:name="ref-autogenesis2026"/>
     <w:p>
       <w:pPr>
         <w:pStyle w:val="Bibliography"/>
@@ -9262,7 +9826,7 @@
       <w:r>
         <w:t xml:space="preserve"> </w:t>
       </w:r>
-      <w:hyperlink r:id="rId176">
+      <w:hyperlink r:id="rId177">
         <w:r>
           <w:rPr>
             <w:rStyle w:val="Hyperlink"/>
@@ -9271,8 +9835,8 @@
         </w:r>
       </w:hyperlink>
     </w:p>
-    <w:bookmarkEnd w:id="177"/>
-    <w:bookmarkStart w:id="179" w:name="ref-evobench2026"/>
+    <w:bookmarkEnd w:id="178"/>
+    <w:bookmarkStart w:id="180" w:name="ref-evobench2026"/>
     <w:p>
       <w:pPr>
         <w:pStyle w:val="Bibliography"/>
@@ -9301,7 +9865,7 @@
       <w:r>
         <w:t xml:space="preserve"> </w:t>
       </w:r>
-      <w:hyperlink r:id="rId178">
+      <w:hyperlink r:id="rId179">
         <w:r>
           <w:rPr>
             <w:rStyle w:val="Hyperlink"/>
@@ -9310,8 +9874,8 @@
         </w:r>
       </w:hyperlink>
     </w:p>
-    <w:bookmarkEnd w:id="179"/>
-    <w:bookmarkStart w:id="181" w:name="ref-harnessopt2026"/>
+    <w:bookmarkEnd w:id="180"/>
+    <w:bookmarkStart w:id="182" w:name="ref-harnessopt2026"/>
     <w:p>
       <w:pPr>
         <w:pStyle w:val="Bibliography"/>
@@ -9340,7 +9904,7 @@
       <w:r>
         <w:t xml:space="preserve"> </w:t>
       </w:r>
-      <w:hyperlink r:id="rId180">
+      <w:hyperlink r:id="rId181">
         <w:r>
           <w:rPr>
             <w:rStyle w:val="Hyperlink"/>
@@ -9349,8 +9913,8 @@
         </w:r>
       </w:hyperlink>
     </w:p>
-    <w:bookmarkEnd w:id="181"/>
-    <w:bookmarkStart w:id="183" w:name="ref-rethinkingharness2026"/>
+    <w:bookmarkEnd w:id="182"/>
+    <w:bookmarkStart w:id="184" w:name="ref-rethinkingharness2026"/>
     <w:p>
       <w:pPr>
         <w:pStyle w:val="Bibliography"/>
@@ -9379,7 +9943,7 @@
       <w:r>
         <w:t xml:space="preserve"> </w:t>
       </w:r>
-      <w:hyperlink r:id="rId182">
+      <w:hyperlink r:id="rId183">
         <w:r>
           <w:rPr>
             <w:rStyle w:val="Hyperlink"/>
@@ -9388,8 +9952,8 @@
         </w:r>
       </w:hyperlink>
     </w:p>
-    <w:bookmarkEnd w:id="183"/>
-    <w:bookmarkStart w:id="184" w:name="ref-minimalharness2026"/>
+    <w:bookmarkEnd w:id="184"/>
+    <w:bookmarkStart w:id="185" w:name="ref-minimalharness2026"/>
     <w:p>
       <w:pPr>
         <w:pStyle w:val="Bibliography"/>
@@ -9416,8 +9980,8 @@
         <w:t xml:space="preserve">. Technical Documentation and Evaluation, 2026, 2026년.</w:t>
       </w:r>
     </w:p>
-    <w:bookmarkEnd w:id="184"/>
-    <w:bookmarkStart w:id="186" w:name="ref-primeagent2026"/>
+    <w:bookmarkEnd w:id="185"/>
+    <w:bookmarkStart w:id="187" w:name="ref-primeagent2026"/>
     <w:p>
       <w:pPr>
         <w:pStyle w:val="Bibliography"/>
@@ -9459,7 +10023,7 @@
       <w:r>
         <w:t xml:space="preserve"> </w:t>
       </w:r>
-      <w:hyperlink r:id="rId185">
+      <w:hyperlink r:id="rId186">
         <w:r>
           <w:rPr>
             <w:rStyle w:val="Hyperlink"/>
@@ -9468,8 +10032,8 @@
         </w:r>
       </w:hyperlink>
     </w:p>
-    <w:bookmarkEnd w:id="186"/>
-    <w:bookmarkStart w:id="188" w:name="ref-claimlocked2026"/>
+    <w:bookmarkEnd w:id="187"/>
+    <w:bookmarkStart w:id="189" w:name="ref-claimlocked2026"/>
     <w:p>
       <w:pPr>
         <w:pStyle w:val="Bibliography"/>
@@ -9498,7 +10062,7 @@
       <w:r>
         <w:t xml:space="preserve"> </w:t>
       </w:r>
-      <w:hyperlink r:id="rId187">
+      <w:hyperlink r:id="rId188">
         <w:r>
           <w:rPr>
             <w:rStyle w:val="Hyperlink"/>
@@ -9507,8 +10071,8 @@
         </w:r>
       </w:hyperlink>
     </w:p>
-    <w:bookmarkEnd w:id="188"/>
-    <w:bookmarkStart w:id="190" w:name="ref-claimobservability2026"/>
+    <w:bookmarkEnd w:id="189"/>
+    <w:bookmarkStart w:id="191" w:name="ref-claimobservability2026"/>
     <w:p>
       <w:pPr>
         <w:pStyle w:val="Bibliography"/>
@@ -9537,7 +10101,7 @@
       <w:r>
         <w:t xml:space="preserve"> </w:t>
       </w:r>
-      <w:hyperlink r:id="rId189">
+      <w:hyperlink r:id="rId190">
         <w:r>
           <w:rPr>
             <w:rStyle w:val="Hyperlink"/>
@@ -9546,8 +10110,8 @@
         </w:r>
       </w:hyperlink>
     </w:p>
-    <w:bookmarkEnd w:id="190"/>
-    <w:bookmarkStart w:id="191" w:name="ref-controlprimitives2026"/>
+    <w:bookmarkEnd w:id="191"/>
+    <w:bookmarkStart w:id="192" w:name="ref-controlprimitives2026"/>
     <w:p>
       <w:pPr>
         <w:pStyle w:val="Bibliography"/>
@@ -9577,8 +10141,8 @@
         <w:t xml:space="preserve">. arXiv:2607.14166v3, 2026, 2026년.</w:t>
       </w:r>
     </w:p>
-    <w:bookmarkEnd w:id="191"/>
-    <w:bookmarkStart w:id="192" w:name="ref-perrequestlimit2026"/>
+    <w:bookmarkEnd w:id="192"/>
+    <w:bookmarkStart w:id="193" w:name="ref-perrequestlimit2026"/>
     <w:p>
       <w:pPr>
         <w:pStyle w:val="Bibliography"/>
@@ -9608,8 +10172,8 @@
         <w:t xml:space="preserve">. arXiv:2603.18829v10, 2026, 2026년.</w:t>
       </w:r>
     </w:p>
-    <w:bookmarkEnd w:id="192"/>
-    <w:bookmarkStart w:id="193" w:name="ref-openendedgroundtruth2026"/>
+    <w:bookmarkEnd w:id="193"/>
+    <w:bookmarkStart w:id="194" w:name="ref-openendedgroundtruth2026"/>
     <w:p>
       <w:pPr>
         <w:pStyle w:val="Bibliography"/>
@@ -9639,8 +10203,8 @@
         <w:t xml:space="preserve">. arXiv:2608.30461v1, 2026, 2026년.</w:t>
       </w:r>
     </w:p>
-    <w:bookmarkEnd w:id="193"/>
-    <w:bookmarkStart w:id="194" w:name="ref-harnesslabels2026"/>
+    <w:bookmarkEnd w:id="194"/>
+    <w:bookmarkStart w:id="195" w:name="ref-harnesslabels2026"/>
     <w:p>
       <w:pPr>
         <w:pStyle w:val="Bibliography"/>
@@ -9670,8 +10234,8 @@
         <w:t xml:space="preserve">. arXiv:2606.05922v3, 2026, 2026년.</w:t>
       </w:r>
     </w:p>
-    <w:bookmarkEnd w:id="194"/>
-    <w:bookmarkStart w:id="196" w:name="ref-harnessoptbench2026"/>
+    <w:bookmarkEnd w:id="195"/>
+    <w:bookmarkStart w:id="197" w:name="ref-harnessoptbench2026"/>
     <w:p>
       <w:pPr>
         <w:pStyle w:val="Bibliography"/>
@@ -9726,7 +10290,7 @@
       <w:r>
         <w:t xml:space="preserve"> </w:t>
       </w:r>
-      <w:hyperlink r:id="rId195">
+      <w:hyperlink r:id="rId196">
         <w:r>
           <w:rPr>
             <w:rStyle w:val="Hyperlink"/>
@@ -9735,8 +10299,8 @@
         </w:r>
       </w:hyperlink>
     </w:p>
-    <w:bookmarkEnd w:id="196"/>
-    <w:bookmarkStart w:id="198" w:name="ref-darwinx2026"/>
+    <w:bookmarkEnd w:id="197"/>
+    <w:bookmarkStart w:id="199" w:name="ref-darwinx2026"/>
     <w:p>
       <w:pPr>
         <w:pStyle w:val="Bibliography"/>
@@ -9791,7 +10355,7 @@
       <w:r>
         <w:t xml:space="preserve"> </w:t>
       </w:r>
-      <w:hyperlink r:id="rId197">
+      <w:hyperlink r:id="rId198">
         <w:r>
           <w:rPr>
             <w:rStyle w:val="Hyperlink"/>
@@ -9800,8 +10364,8 @@
         </w:r>
       </w:hyperlink>
     </w:p>
-    <w:bookmarkEnd w:id="198"/>
-    <w:bookmarkStart w:id="200" w:name="ref-graphengineering2026"/>
+    <w:bookmarkEnd w:id="199"/>
+    <w:bookmarkStart w:id="201" w:name="ref-graphengineering2026"/>
     <w:p>
       <w:pPr>
         <w:pStyle w:val="Bibliography"/>
@@ -9856,7 +10420,7 @@
       <w:r>
         <w:t xml:space="preserve"> </w:t>
       </w:r>
-      <w:hyperlink r:id="rId199">
+      <w:hyperlink r:id="rId200">
         <w:r>
           <w:rPr>
             <w:rStyle w:val="Hyperlink"/>
@@ -9865,8 +10429,8 @@
         </w:r>
       </w:hyperlink>
     </w:p>
-    <w:bookmarkEnd w:id="200"/>
-    <w:bookmarkStart w:id="202" w:name="ref-checklistcredit2026"/>
+    <w:bookmarkEnd w:id="201"/>
+    <w:bookmarkStart w:id="203" w:name="ref-checklistcredit2026"/>
     <w:p>
       <w:pPr>
         <w:pStyle w:val="Bibliography"/>
@@ -9895,7 +10459,7 @@
       <w:r>
         <w:t xml:space="preserve"> </w:t>
       </w:r>
-      <w:hyperlink r:id="rId201">
+      <w:hyperlink r:id="rId202">
         <w:r>
           <w:rPr>
             <w:rStyle w:val="Hyperlink"/>
@@ -9904,8 +10468,8 @@
         </w:r>
       </w:hyperlink>
     </w:p>
-    <w:bookmarkEnd w:id="202"/>
-    <w:bookmarkStart w:id="204" w:name="ref-solutionhacking2026"/>
+    <w:bookmarkEnd w:id="203"/>
+    <w:bookmarkStart w:id="205" w:name="ref-solutionhacking2026"/>
     <w:p>
       <w:pPr>
         <w:pStyle w:val="Bibliography"/>
@@ -9934,7 +10498,7 @@
       <w:r>
         <w:t xml:space="preserve"> </w:t>
       </w:r>
-      <w:hyperlink r:id="rId203">
+      <w:hyperlink r:id="rId204">
         <w:r>
           <w:rPr>
             <w:rStyle w:val="Hyperlink"/>
@@ -9943,8 +10507,8 @@
         </w:r>
       </w:hyperlink>
     </w:p>
-    <w:bookmarkEnd w:id="204"/>
-    <w:bookmarkStart w:id="206" w:name="ref-baitbench2026"/>
+    <w:bookmarkEnd w:id="205"/>
+    <w:bookmarkStart w:id="207" w:name="ref-baitbench2026"/>
     <w:p>
       <w:pPr>
         <w:pStyle w:val="Bibliography"/>
@@ -9973,7 +10537,7 @@
       <w:r>
         <w:t xml:space="preserve"> </w:t>
       </w:r>
-      <w:hyperlink r:id="rId205">
+      <w:hyperlink r:id="rId206">
         <w:r>
           <w:rPr>
             <w:rStyle w:val="Hyperlink"/>
@@ -9982,8 +10546,8 @@
         </w:r>
       </w:hyperlink>
     </w:p>
-    <w:bookmarkEnd w:id="206"/>
-    <w:bookmarkStart w:id="208" w:name="ref-constructvalidity2026"/>
+    <w:bookmarkEnd w:id="207"/>
+    <w:bookmarkStart w:id="209" w:name="ref-constructvalidity2026"/>
     <w:p>
       <w:pPr>
         <w:pStyle w:val="Bibliography"/>
@@ -10012,7 +10576,7 @@
       <w:r>
         <w:t xml:space="preserve"> </w:t>
       </w:r>
-      <w:hyperlink r:id="rId207">
+      <w:hyperlink r:id="rId208">
         <w:r>
           <w:rPr>
             <w:rStyle w:val="Hyperlink"/>
@@ -10021,8 +10585,8 @@
         </w:r>
       </w:hyperlink>
     </w:p>
-    <w:bookmarkEnd w:id="208"/>
-    <w:bookmarkStart w:id="210" w:name="ref-agreementaudit2026"/>
+    <w:bookmarkEnd w:id="209"/>
+    <w:bookmarkStart w:id="211" w:name="ref-agreementaudit2026"/>
     <w:p>
       <w:pPr>
         <w:pStyle w:val="Bibliography"/>
@@ -10051,7 +10615,7 @@
       <w:r>
         <w:t xml:space="preserve"> </w:t>
       </w:r>
-      <w:hyperlink r:id="rId209">
+      <w:hyperlink r:id="rId210">
         <w:r>
           <w:rPr>
             <w:rStyle w:val="Hyperlink"/>
@@ -10060,8 +10624,8 @@
         </w:r>
       </w:hyperlink>
     </w:p>
-    <w:bookmarkEnd w:id="210"/>
-    <w:bookmarkStart w:id="212" w:name="ref-reliabilitywithoutvalidity2026"/>
+    <w:bookmarkEnd w:id="211"/>
+    <w:bookmarkStart w:id="213" w:name="ref-reliabilitywithoutvalidity2026"/>
     <w:p>
       <w:pPr>
         <w:pStyle w:val="Bibliography"/>
@@ -10090,7 +10654,7 @@
       <w:r>
         <w:t xml:space="preserve"> </w:t>
       </w:r>
-      <w:hyperlink r:id="rId211">
+      <w:hyperlink r:id="rId212">
         <w:r>
           <w:rPr>
             <w:rStyle w:val="Hyperlink"/>
@@ -10099,8 +10663,8 @@
         </w:r>
       </w:hyperlink>
     </w:p>
-    <w:bookmarkEnd w:id="212"/>
-    <w:bookmarkStart w:id="214" w:name="ref-compounding2026"/>
+    <w:bookmarkEnd w:id="213"/>
+    <w:bookmarkStart w:id="215" w:name="ref-compounding2026"/>
     <w:p>
       <w:pPr>
         <w:pStyle w:val="Bibliography"/>
@@ -10129,7 +10693,7 @@
       <w:r>
         <w:t xml:space="preserve"> </w:t>
       </w:r>
-      <w:hyperlink r:id="rId213">
+      <w:hyperlink r:id="rId214">
         <w:r>
           <w:rPr>
             <w:rStyle w:val="Hyperlink"/>
@@ -10138,8 +10702,8 @@
         </w:r>
       </w:hyperlink>
     </w:p>
-    <w:bookmarkEnd w:id="214"/>
-    <w:bookmarkStart w:id="215" w:name="ref-judgeidentification2026"/>
+    <w:bookmarkEnd w:id="215"/>
+    <w:bookmarkStart w:id="216" w:name="ref-judgeidentification2026"/>
     <w:p>
       <w:pPr>
         <w:pStyle w:val="Bibliography"/>
@@ -10169,8 +10733,8 @@
         <w:t xml:space="preserve">. arXiv:2608.16253v1, 2026, 2026년.</w:t>
       </w:r>
     </w:p>
-    <w:bookmarkEnd w:id="215"/>
-    <w:bookmarkStart w:id="216" w:name="ref-majorityhurts2026"/>
+    <w:bookmarkEnd w:id="216"/>
+    <w:bookmarkStart w:id="217" w:name="ref-majorityhurts2026"/>
     <w:p>
       <w:pPr>
         <w:pStyle w:val="Bibliography"/>
@@ -10197,8 +10761,8 @@
         <w:t xml:space="preserve">. arXiv:2608.11403v2, 2026, 2026년.</w:t>
       </w:r>
     </w:p>
-    <w:bookmarkEnd w:id="216"/>
-    <w:bookmarkStart w:id="217" w:name="ref-wrongconsensus2026"/>
+    <w:bookmarkEnd w:id="217"/>
+    <w:bookmarkStart w:id="218" w:name="ref-wrongconsensus2026"/>
     <w:p>
       <w:pPr>
         <w:pStyle w:val="Bibliography"/>
@@ -10228,8 +10792,8 @@
         <w:t xml:space="preserve">. arXiv:2608.18795v2, 2026, 2026년.</w:t>
       </w:r>
     </w:p>
-    <w:bookmarkEnd w:id="217"/>
-    <w:bookmarkStart w:id="218" w:name="ref-budgetmatched2026"/>
+    <w:bookmarkEnd w:id="218"/>
+    <w:bookmarkStart w:id="219" w:name="ref-budgetmatched2026"/>
     <w:p>
       <w:pPr>
         <w:pStyle w:val="Bibliography"/>
@@ -10259,8 +10823,8 @@
         <w:t xml:space="preserve">. arXiv:2606.15017v2, 2026, 2026년.</w:t>
       </w:r>
     </w:p>
-    <w:bookmarkEnd w:id="218"/>
-    <w:bookmarkStart w:id="219" w:name="ref-cachecost2026"/>
+    <w:bookmarkEnd w:id="219"/>
+    <w:bookmarkStart w:id="220" w:name="ref-cachecost2026"/>
     <w:p>
       <w:pPr>
         <w:pStyle w:val="Bibliography"/>
@@ -10290,8 +10854,8 @@
         <w:t xml:space="preserve">. arXiv:2601.06007v2, 2026, 2026년.</w:t>
       </w:r>
     </w:p>
-    <w:bookmarkEnd w:id="219"/>
-    <w:bookmarkStart w:id="220" w:name="ref-compressioncost2026"/>
+    <w:bookmarkEnd w:id="220"/>
+    <w:bookmarkStart w:id="221" w:name="ref-compressioncost2026"/>
     <w:p>
       <w:pPr>
         <w:pStyle w:val="Bibliography"/>
@@ -10321,8 +10885,8 @@
         <w:t xml:space="preserve">. arXiv:2608.16370v1, 2026, 2026년.</w:t>
       </w:r>
     </w:p>
-    <w:bookmarkEnd w:id="220"/>
-    <w:bookmarkStart w:id="221" w:name="ref-promptwaste2026"/>
+    <w:bookmarkEnd w:id="221"/>
+    <w:bookmarkStart w:id="222" w:name="ref-promptwaste2026"/>
     <w:p>
       <w:pPr>
         <w:pStyle w:val="Bibliography"/>
@@ -10352,8 +10916,8 @@
         <w:t xml:space="preserve">. arXiv:2608.01347v5, 2026, 2026년.</w:t>
       </w:r>
     </w:p>
-    <w:bookmarkEnd w:id="221"/>
-    <w:bookmarkStart w:id="222" w:name="ref-llmrandomness2026"/>
+    <w:bookmarkEnd w:id="222"/>
+    <w:bookmarkStart w:id="223" w:name="ref-llmrandomness2026"/>
     <w:p>
       <w:pPr>
         <w:pStyle w:val="Bibliography"/>
@@ -10380,8 +10944,8 @@
         <w:t xml:space="preserve">. arXiv:2607.24372v1, 2026, 2026년.</w:t>
       </w:r>
     </w:p>
-    <w:bookmarkEnd w:id="222"/>
-    <w:bookmarkStart w:id="223" w:name="ref-onerunlottery2026"/>
+    <w:bookmarkEnd w:id="223"/>
+    <w:bookmarkStart w:id="224" w:name="ref-onerunlottery2026"/>
     <w:p>
       <w:pPr>
         <w:pStyle w:val="Bibliography"/>
@@ -10411,8 +10975,8 @@
         <w:t xml:space="preserve">. arXiv:2607.26587v1, 2026, 2026년.</w:t>
       </w:r>
     </w:p>
-    <w:bookmarkEnd w:id="223"/>
-    <w:bookmarkStart w:id="224" w:name="ref-multiplerunsorder2026"/>
+    <w:bookmarkEnd w:id="224"/>
+    <w:bookmarkStart w:id="225" w:name="ref-multiplerunsorder2026"/>
     <w:p>
       <w:pPr>
         <w:pStyle w:val="Bibliography"/>
@@ -10442,8 +11006,8 @@
         <w:t xml:space="preserve">. arXiv:2608.18066v1, 2026, 2026년.</w:t>
       </w:r>
     </w:p>
-    <w:bookmarkEnd w:id="224"/>
-    <w:bookmarkStart w:id="225" w:name="ref-runvariance2026"/>
+    <w:bookmarkEnd w:id="225"/>
+    <w:bookmarkStart w:id="226" w:name="ref-runvariance2026"/>
     <w:p>
       <w:pPr>
         <w:pStyle w:val="Bibliography"/>
@@ -10473,8 +11037,8 @@
         <w:t xml:space="preserve">. arXiv:2608.26197v1, 2026, 2026년.</w:t>
       </w:r>
     </w:p>
-    <w:bookmarkEnd w:id="225"/>
-    <w:bookmarkStart w:id="226" w:name="ref-tokenaccounting2026"/>
+    <w:bookmarkEnd w:id="226"/>
+    <w:bookmarkStart w:id="227" w:name="ref-tokenaccounting2026"/>
     <w:p>
       <w:pPr>
         <w:pStyle w:val="Bibliography"/>
@@ -10504,8 +11068,8 @@
         <w:t xml:space="preserve">. arXiv:2607.21672v1, 2026, 2026년.</w:t>
       </w:r>
     </w:p>
-    <w:bookmarkEnd w:id="226"/>
-    <w:bookmarkStart w:id="227" w:name="ref-agreementcorrectness2026"/>
+    <w:bookmarkEnd w:id="227"/>
+    <w:bookmarkStart w:id="228" w:name="ref-agreementcorrectness2026"/>
     <w:p>
       <w:pPr>
         <w:pStyle w:val="Bibliography"/>
@@ -10535,8 +11099,8 @@
         <w:t xml:space="preserve">. arXiv:2608.05670v1, 2026, 2026년.</w:t>
       </w:r>
     </w:p>
-    <w:bookmarkEnd w:id="227"/>
-    <w:bookmarkStart w:id="228" w:name="ref-annotationvariance2026"/>
+    <w:bookmarkEnd w:id="228"/>
+    <w:bookmarkStart w:id="229" w:name="ref-annotationvariance2026"/>
     <w:p>
       <w:pPr>
         <w:pStyle w:val="Bibliography"/>
@@ -10566,8 +11130,8 @@
         <w:t xml:space="preserve">. arXiv:2605.01168v1, 2026, 2026년.</w:t>
       </w:r>
     </w:p>
-    <w:bookmarkEnd w:id="228"/>
-    <w:bookmarkStart w:id="229" w:name="ref-boltonprovenance2026"/>
+    <w:bookmarkEnd w:id="229"/>
+    <w:bookmarkStart w:id="230" w:name="ref-boltonprovenance2026"/>
     <w:p>
       <w:pPr>
         <w:pStyle w:val="Bibliography"/>
@@ -10597,8 +11161,8 @@
         <w:t xml:space="preserve">. arXiv:2608.25210v2, 2026, 2026년.</w:t>
       </w:r>
     </w:p>
-    <w:bookmarkEnd w:id="229"/>
-    <w:bookmarkStart w:id="230" w:name="ref-evidenceledger2026"/>
+    <w:bookmarkEnd w:id="230"/>
+    <w:bookmarkStart w:id="231" w:name="ref-evidenceledger2026"/>
     <w:p>
       <w:pPr>
         <w:pStyle w:val="Bibliography"/>
@@ -10628,8 +11192,8 @@
         <w:t xml:space="preserve">. arXiv:2607.26512v1, 2026, 2026년.</w:t>
       </w:r>
     </w:p>
-    <w:bookmarkEnd w:id="230"/>
-    <w:bookmarkStart w:id="231" w:name="ref-claimreplay2026"/>
+    <w:bookmarkEnd w:id="231"/>
+    <w:bookmarkStart w:id="232" w:name="ref-claimreplay2026"/>
     <w:p>
       <w:pPr>
         <w:pStyle w:val="Bibliography"/>
@@ -10659,8 +11223,8 @@
         <w:t xml:space="preserve">. arXiv:2608.19269v4, 2026, 2026년.</w:t>
       </w:r>
     </w:p>
-    <w:bookmarkEnd w:id="231"/>
-    <w:bookmarkStart w:id="232" w:name="ref-runnableverifiable2026"/>
+    <w:bookmarkEnd w:id="232"/>
+    <w:bookmarkStart w:id="233" w:name="ref-runnableverifiable2026"/>
     <w:p>
       <w:pPr>
         <w:pStyle w:val="Bibliography"/>
@@ -10690,8 +11254,8 @@
         <w:t xml:space="preserve">. arXiv:2608.09567v1, 2026, 2026년.</w:t>
       </w:r>
     </w:p>
-    <w:bookmarkEnd w:id="232"/>
-    <w:bookmarkStart w:id="233" w:name="ref-repeataudit2026"/>
+    <w:bookmarkEnd w:id="233"/>
+    <w:bookmarkStart w:id="234" w:name="ref-repeataudit2026"/>
     <w:p>
       <w:pPr>
         <w:pStyle w:val="Bibliography"/>
@@ -10721,8 +11285,8 @@
         <w:t xml:space="preserve">. arXiv:2608.22856v1, 2026, 2026년.</w:t>
       </w:r>
     </w:p>
-    <w:bookmarkEnd w:id="233"/>
-    <w:bookmarkStart w:id="234" w:name="ref-fidelitywithoutevidence2026"/>
+    <w:bookmarkEnd w:id="234"/>
+    <w:bookmarkStart w:id="235" w:name="ref-fidelitywithoutevidence2026"/>
     <w:p>
       <w:pPr>
         <w:pStyle w:val="Bibliography"/>
@@ -10752,8 +11316,8 @@
         <w:t xml:space="preserve">. arXiv:2608.28439v1, 2026, 2026년.</w:t>
       </w:r>
     </w:p>
-    <w:bookmarkEnd w:id="234"/>
-    <w:bookmarkStart w:id="235" w:name="ref-implicitassumptions2026"/>
+    <w:bookmarkEnd w:id="235"/>
+    <w:bookmarkStart w:id="236" w:name="ref-implicitassumptions2026"/>
     <w:p>
       <w:pPr>
         <w:pStyle w:val="Bibliography"/>
@@ -10783,8 +11347,8 @@
         <w:t xml:space="preserve">. arXiv:2607.03114v1, 2026, 2026년.</w:t>
       </w:r>
     </w:p>
-    <w:bookmarkEnd w:id="235"/>
-    <w:bookmarkStart w:id="236" w:name="ref-partialcontracts2026"/>
+    <w:bookmarkEnd w:id="236"/>
+    <w:bookmarkStart w:id="237" w:name="ref-partialcontracts2026"/>
     <w:p>
       <w:pPr>
         <w:pStyle w:val="Bibliography"/>
@@ -10814,8 +11378,8 @@
         <w:t xml:space="preserve">. arXiv:2607.10291v1, 2026, 2026년.</w:t>
       </w:r>
     </w:p>
-    <w:bookmarkEnd w:id="236"/>
-    <w:bookmarkStart w:id="237" w:name="ref-factcheckstages2026"/>
+    <w:bookmarkEnd w:id="237"/>
+    <w:bookmarkStart w:id="238" w:name="ref-factcheckstages2026"/>
     <w:p>
       <w:pPr>
         <w:pStyle w:val="Bibliography"/>
@@ -10845,8 +11409,8 @@
         <w:t xml:space="preserve">. arXiv:2510.22055v1, 2026, 2026년.</w:t>
       </w:r>
     </w:p>
-    <w:bookmarkEnd w:id="237"/>
-    <w:bookmarkStart w:id="238" w:name="ref-coveragebehaviour2026"/>
+    <w:bookmarkEnd w:id="238"/>
+    <w:bookmarkStart w:id="239" w:name="ref-coveragebehaviour2026"/>
     <w:p>
       <w:pPr>
         <w:pStyle w:val="Bibliography"/>
@@ -10876,8 +11440,8 @@
         <w:t xml:space="preserve">. arXiv:2606.10417v1, 2026, 2026년.</w:t>
       </w:r>
     </w:p>
-    <w:bookmarkEnd w:id="238"/>
-    <w:bookmarkStart w:id="239" w:name="ref-evalblindness2026"/>
+    <w:bookmarkEnd w:id="239"/>
+    <w:bookmarkStart w:id="240" w:name="ref-evalblindness2026"/>
     <w:p>
       <w:pPr>
         <w:pStyle w:val="Bibliography"/>
@@ -10907,8 +11471,8 @@
         <w:t xml:space="preserve">. arXiv:2608.02786v1, 2026, 2026년.</w:t>
       </w:r>
     </w:p>
-    <w:bookmarkEnd w:id="239"/>
-    <w:bookmarkStart w:id="240" w:name="ref-metamorphicrelations2026"/>
+    <w:bookmarkEnd w:id="240"/>
+    <w:bookmarkStart w:id="241" w:name="ref-metamorphicrelations2026"/>
     <w:p>
       <w:pPr>
         <w:pStyle w:val="Bibliography"/>
@@ -10938,8 +11502,8 @@
         <w:t xml:space="preserve">. arXiv:2608.03337v1, 2026, 2026년.</w:t>
       </w:r>
     </w:p>
-    <w:bookmarkEnd w:id="240"/>
-    <w:bookmarkStart w:id="241" w:name="ref-oracleavailability2026"/>
+    <w:bookmarkEnd w:id="241"/>
+    <w:bookmarkStart w:id="242" w:name="ref-oracleavailability2026"/>
     <w:p>
       <w:pPr>
         <w:pStyle w:val="Bibliography"/>
@@ -10969,8 +11533,8 @@
         <w:t xml:space="preserve">. arXiv:2607.00929v1, 2026, 2026년.</w:t>
       </w:r>
     </w:p>
-    <w:bookmarkEnd w:id="241"/>
-    <w:bookmarkStart w:id="242" w:name="ref-oracleanchoring2026"/>
+    <w:bookmarkEnd w:id="242"/>
+    <w:bookmarkStart w:id="243" w:name="ref-oracleanchoring2026"/>
     <w:p>
       <w:pPr>
         <w:pStyle w:val="Bibliography"/>
@@ -11000,8 +11564,8 @@
         <w:t xml:space="preserve">. arXiv:2608.17214v1, 2026, 2026년.</w:t>
       </w:r>
     </w:p>
-    <w:bookmarkEnd w:id="242"/>
-    <w:bookmarkStart w:id="244" w:name="ref-auditaudit2026"/>
+    <w:bookmarkEnd w:id="243"/>
+    <w:bookmarkStart w:id="245" w:name="ref-auditaudit2026"/>
     <w:p>
       <w:pPr>
         <w:pStyle w:val="Bibliography"/>
@@ -11030,7 +11594,7 @@
       <w:r>
         <w:t xml:space="preserve"> </w:t>
       </w:r>
-      <w:hyperlink r:id="rId243">
+      <w:hyperlink r:id="rId244">
         <w:r>
           <w:rPr>
             <w:rStyle w:val="Hyperlink"/>
@@ -11039,8 +11603,8 @@
         </w:r>
       </w:hyperlink>
     </w:p>
-    <w:bookmarkEnd w:id="244"/>
-    <w:bookmarkStart w:id="245" w:name="ref-beyondfinalscores2026"/>
+    <w:bookmarkEnd w:id="245"/>
+    <w:bookmarkStart w:id="246" w:name="ref-beyondfinalscores2026"/>
     <w:p>
       <w:pPr>
         <w:pStyle w:val="Bibliography"/>
@@ -11070,8 +11634,8 @@
         <w:t xml:space="preserve">. arXiv:2608.13417v1, 2026, 2026년.</w:t>
       </w:r>
     </w:p>
-    <w:bookmarkEnd w:id="245"/>
-    <w:bookmarkStart w:id="246" w:name="ref-seqmeta2026"/>
+    <w:bookmarkEnd w:id="246"/>
+    <w:bookmarkStart w:id="247" w:name="ref-seqmeta2026"/>
     <w:p>
       <w:pPr>
         <w:pStyle w:val="Bibliography"/>
@@ -11101,8 +11665,8 @@
         <w:t xml:space="preserve">. arXiv:2511.14996v1, 2025, 2025년.</w:t>
       </w:r>
     </w:p>
-    <w:bookmarkEnd w:id="246"/>
-    <w:bookmarkStart w:id="247" w:name="ref-rigorai2026"/>
+    <w:bookmarkEnd w:id="247"/>
+    <w:bookmarkStart w:id="248" w:name="ref-rigorai2026"/>
     <w:p>
       <w:pPr>
         <w:pStyle w:val="Bibliography"/>
@@ -11129,8 +11693,8 @@
         <w:t xml:space="preserve">. arXiv:2607.03634v1, 2026, 2026년.</w:t>
       </w:r>
     </w:p>
-    <w:bookmarkEnd w:id="247"/>
-    <w:bookmarkStart w:id="249" w:name="ref-prereg2026"/>
+    <w:bookmarkEnd w:id="248"/>
+    <w:bookmarkStart w:id="250" w:name="ref-prereg2026"/>
     <w:p>
       <w:pPr>
         <w:pStyle w:val="Bibliography"/>
@@ -11159,7 +11723,7 @@
       <w:r>
         <w:t xml:space="preserve"> </w:t>
       </w:r>
-      <w:hyperlink r:id="rId248">
+      <w:hyperlink r:id="rId249">
         <w:r>
           <w:rPr>
             <w:rStyle w:val="Hyperlink"/>
@@ -11168,8 +11732,8 @@
         </w:r>
       </w:hyperlink>
     </w:p>
-    <w:bookmarkEnd w:id="249"/>
-    <w:bookmarkStart w:id="250" w:name="ref-smallscreening2026"/>
+    <w:bookmarkEnd w:id="250"/>
+    <w:bookmarkStart w:id="251" w:name="ref-smallscreening2026"/>
     <w:p>
       <w:pPr>
         <w:pStyle w:val="Bibliography"/>
@@ -11199,8 +11763,8 @@
         <w:t xml:space="preserve">. arXiv:2606.13531v1, 2026, 2026년.</w:t>
       </w:r>
     </w:p>
-    <w:bookmarkEnd w:id="250"/>
-    <w:bookmarkStart w:id="252" w:name="ref-negativeresults2026"/>
+    <w:bookmarkEnd w:id="251"/>
+    <w:bookmarkStart w:id="253" w:name="ref-negativeresults2026"/>
     <w:p>
       <w:pPr>
         <w:pStyle w:val="Bibliography"/>
@@ -11229,7 +11793,7 @@
       <w:r>
         <w:t xml:space="preserve"> </w:t>
       </w:r>
-      <w:hyperlink r:id="rId251">
+      <w:hyperlink r:id="rId252">
         <w:r>
           <w:rPr>
             <w:rStyle w:val="Hyperlink"/>
@@ -11238,8 +11802,8 @@
         </w:r>
       </w:hyperlink>
     </w:p>
-    <w:bookmarkEnd w:id="252"/>
-    <w:bookmarkStart w:id="254" w:name="ref-autoresearchfail2026"/>
+    <w:bookmarkEnd w:id="253"/>
+    <w:bookmarkStart w:id="255" w:name="ref-autoresearchfail2026"/>
     <w:p>
       <w:pPr>
         <w:pStyle w:val="Bibliography"/>
@@ -11268,7 +11832,7 @@
       <w:r>
         <w:t xml:space="preserve"> </w:t>
       </w:r>
-      <w:hyperlink r:id="rId253">
+      <w:hyperlink r:id="rId254">
         <w:r>
           <w:rPr>
             <w:rStyle w:val="Hyperlink"/>
@@ -11277,8 +11841,8 @@
         </w:r>
       </w:hyperlink>
     </w:p>
-    <w:bookmarkEnd w:id="254"/>
-    <w:bookmarkStart w:id="256" w:name="ref-verificationcost2026"/>
+    <w:bookmarkEnd w:id="255"/>
+    <w:bookmarkStart w:id="257" w:name="ref-verificationcost2026"/>
     <w:p>
       <w:pPr>
         <w:pStyle w:val="Bibliography"/>
@@ -11307,7 +11871,7 @@
       <w:r>
         <w:t xml:space="preserve"> </w:t>
       </w:r>
-      <w:hyperlink r:id="rId255">
+      <w:hyperlink r:id="rId256">
         <w:r>
           <w:rPr>
             <w:rStyle w:val="Hyperlink"/>
@@ -11316,9 +11880,9 @@
         </w:r>
       </w:hyperlink>
     </w:p>
-    <w:bookmarkEnd w:id="256"/>
     <w:bookmarkEnd w:id="257"/>
     <w:bookmarkEnd w:id="258"/>
+    <w:bookmarkEnd w:id="259"/>
     <w:sectPr>
       <w:footerReference w:type="default" r:id="rIdFtr1"/>
       <w:pgSz w:h="16838" w:w="11906"/>

</xml_diff>